<commit_message>
Rendit fjalorin dhe hiq interpretimin nga rezultatet
Fjalori renditet alfabetikisht me DECOR dhe PMD te shtuar, Kapitulli 2 merr titullin
e plote te shabllonit, dhe dy fjali interpretimi kalojne nga 5.4 te diskutimi.
VD-114.
</commit_message>
<xml_diff>
--- a/docs/thesis/Punim_Diplome_Florent_Latifi.docx
+++ b/docs/thesis/Punim_Diplome_Florent_Latifi.docx
@@ -1418,7 +1418,7 @@
           <w:caps w:val="0"/>
           <w:sz w:val="24"/>
         </w:rPr>
-        <w:t>AST - Abstract Syntax Tree, pema e sintaksës abstrakte</w:t>
+        <w:t>AMW – Average Method Weight, pesha mesatare e metodave</w:t>
       </w:r>
     </w:p>
     <w:p>
@@ -1434,7 +1434,7 @@
           <w:caps w:val="0"/>
           <w:sz w:val="24"/>
         </w:rPr>
-        <w:t>ATFD - Access To Foreign Data, qasja në të dhënat e klasave të tjera</w:t>
+        <w:t>AST – Abstract Syntax Tree, pema e sintaksës abstrakte</w:t>
       </w:r>
     </w:p>
     <w:p>
@@ -1450,7 +1450,7 @@
           <w:caps w:val="0"/>
           <w:sz w:val="24"/>
         </w:rPr>
-        <w:t>CBO - Coupling Between Objects, lidhshmëria mes objekteve</w:t>
+        <w:t>ATFD – Access To Foreign Data, qasja në të dhënat e klasave të tjera</w:t>
       </w:r>
     </w:p>
     <w:p>
@@ -1466,7 +1466,7 @@
           <w:caps w:val="0"/>
           <w:sz w:val="24"/>
         </w:rPr>
-        <w:t>CC - Cyclomatic Complexity, kompleksiteti ciklomatik</w:t>
+        <w:t>CBO – Coupling Between Objects, lidhshmëria mes objekteve</w:t>
       </w:r>
     </w:p>
     <w:p>
@@ -1482,7 +1482,7 @@
           <w:caps w:val="0"/>
           <w:sz w:val="24"/>
         </w:rPr>
-        <w:t>CK - Chidamber &amp; Kemerer, suita e metrikave të objekteve</w:t>
+        <w:t>CC – Cyclomatic Complexity, kompleksiteti ciklomatik</w:t>
       </w:r>
     </w:p>
     <w:p>
@@ -1498,7 +1498,7 @@
           <w:caps w:val="0"/>
           <w:sz w:val="24"/>
         </w:rPr>
-        <w:t>DIT - Depth of Inheritance Tree, thellësia e pemës së trashëgimisë</w:t>
+        <w:t>CINT – Coupling Intensity, intensiteti i lidhshmërisë së një metode</w:t>
       </w:r>
     </w:p>
     <w:p>
@@ -1514,7 +1514,7 @@
           <w:caps w:val="0"/>
           <w:sz w:val="24"/>
         </w:rPr>
-        <w:t>FDP - Foreign Data Providers, numri i klasave që ofrojnë të dhëna të huaja</w:t>
+        <w:t>CK – Chidamber &amp; Kemerer, suita e metrikave të objekteve</w:t>
       </w:r>
     </w:p>
     <w:p>
@@ -1530,7 +1530,7 @@
           <w:caps w:val="0"/>
           <w:sz w:val="24"/>
         </w:rPr>
-        <w:t>LAA - Locality of Attribute Accesses, lokaliteti i qasjeve në atribute</w:t>
+        <w:t>CLOC – Class Lines of Code, rreshtat efektivë të një klase</w:t>
       </w:r>
     </w:p>
     <w:p>
@@ -1546,7 +1546,7 @@
           <w:caps w:val="0"/>
           <w:sz w:val="24"/>
         </w:rPr>
-        <w:t>LCOM - Lack of Cohesion in Methods, mungesa e kohezionit në metoda</w:t>
+        <w:t>DECOR – metoda e specifikimit dhe e detektimit të code smells nga Moha et al.</w:t>
       </w:r>
     </w:p>
     <w:p>
@@ -1562,7 +1562,7 @@
           <w:caps w:val="0"/>
           <w:sz w:val="24"/>
         </w:rPr>
-        <w:t>LOC - Lines of Code, rreshtat e kodit</w:t>
+        <w:t>DIT – Depth of Inheritance Tree, thellësia e pemës së trashëgimisë</w:t>
       </w:r>
     </w:p>
     <w:p>
@@ -1578,7 +1578,7 @@
           <w:caps w:val="0"/>
           <w:sz w:val="24"/>
         </w:rPr>
-        <w:t>MLCQ - Machine Learning Code Quality, dataset i etiketuar i code smells</w:t>
+        <w:t>F1 – mesatarja harmonike e precizionit dhe recall-it</w:t>
       </w:r>
     </w:p>
     <w:p>
@@ -1594,7 +1594,7 @@
           <w:caps w:val="0"/>
           <w:sz w:val="24"/>
         </w:rPr>
-        <w:t>NOC - Number of Children, numri i nënklasave të drejtpërdrejta</w:t>
+        <w:t>FDP – Foreign Data Providers, numri i klasave që ofrojnë të dhëna të huaja</w:t>
       </w:r>
     </w:p>
     <w:p>
@@ -1610,7 +1610,7 @@
           <w:caps w:val="0"/>
           <w:sz w:val="24"/>
         </w:rPr>
-        <w:t>RFC - Response For a Class, përgjigjja e një klase</w:t>
+        <w:t>GroupKFold – ndarje me grupe, ku çdo depo bie e tëra në një fold</w:t>
       </w:r>
     </w:p>
     <w:p>
@@ -1626,7 +1626,7 @@
           <w:caps w:val="0"/>
           <w:sz w:val="24"/>
         </w:rPr>
-        <w:t>TCC - Tight Class Cohesion, kohezioni i ngushtë i klasës</w:t>
+        <w:t>LAA – Locality of Attribute Accesses, lokaliteti i qasjeve në atribute</w:t>
       </w:r>
     </w:p>
     <w:p>
@@ -1642,7 +1642,7 @@
           <w:caps w:val="0"/>
           <w:sz w:val="24"/>
         </w:rPr>
-        <w:t>WMC - Weighted Methods per Class, metodat e peshuara për klasë</w:t>
+        <w:t>LCOM – Lack of Cohesion in Methods, mungesa e kohezionit në metoda</w:t>
       </w:r>
     </w:p>
     <w:p>
@@ -1658,7 +1658,7 @@
           <w:caps w:val="0"/>
           <w:sz w:val="24"/>
         </w:rPr>
-        <w:t>WOC - Weight of Class, pesha funksionale e klasës</w:t>
+        <w:t>LOC – Lines of Code, rreshtat e kodit</w:t>
       </w:r>
     </w:p>
     <w:p>
@@ -1674,7 +1674,7 @@
           <w:caps w:val="0"/>
           <w:sz w:val="24"/>
         </w:rPr>
-        <w:t>AMW - Average Method Weight, pesha mesatare e metodave</w:t>
+        <w:t>MAXCC – kompleksiteti maksimal ciklomatik në një klasë</w:t>
       </w:r>
     </w:p>
     <w:p>
@@ -1690,7 +1690,7 @@
           <w:caps w:val="0"/>
           <w:sz w:val="24"/>
         </w:rPr>
-        <w:t>CINT - Coupling Intensity, intensiteti i lidhshmërisë së një metode</w:t>
+        <w:t>MAXNESTING – thellësia maksimale e ndërfutjes së blloqeve</w:t>
       </w:r>
     </w:p>
     <w:p>
@@ -1706,7 +1706,7 @@
           <w:caps w:val="0"/>
           <w:sz w:val="24"/>
         </w:rPr>
-        <w:t>CLOC - Class Lines of Code, rreshtat efektivë të një klase</w:t>
+        <w:t>MCC – Matthews Correlation Coefficient, koeficienti i korrelacionit i Matthews-it</w:t>
       </w:r>
     </w:p>
     <w:p>
@@ -1722,7 +1722,7 @@
           <w:caps w:val="0"/>
           <w:sz w:val="24"/>
         </w:rPr>
-        <w:t>F1 - mesatarja harmonike e precizionit dhe recall-it</w:t>
+        <w:t>MLCQ – Machine Learning Code Quality, dataset i etiketuar i code smells</w:t>
       </w:r>
     </w:p>
     <w:p>
@@ -1738,7 +1738,7 @@
           <w:caps w:val="0"/>
           <w:sz w:val="24"/>
         </w:rPr>
-        <w:t>GroupKFold - ndarje me grupe, ku çdo depo bie e tëra në një fold</w:t>
+        <w:t>MLOC – Method Lines of Code, rreshtat efektivë të një metode</w:t>
       </w:r>
     </w:p>
     <w:p>
@@ -1754,7 +1754,7 @@
           <w:caps w:val="0"/>
           <w:sz w:val="24"/>
         </w:rPr>
-        <w:t>MAXCC - kompleksiteti maksimal ciklomatik në një klasë</w:t>
+        <w:t>NOAM – Number of Accessor Methods, numri i akses-metodave</w:t>
       </w:r>
     </w:p>
     <w:p>
@@ -1770,7 +1770,7 @@
           <w:caps w:val="0"/>
           <w:sz w:val="24"/>
         </w:rPr>
-        <w:t>MAXNESTING - thellësia maksimale e ndërfutjes së blloqeve</w:t>
+        <w:t>NOAV – Number of Accessed Variables, numri i variablave të prekura</w:t>
       </w:r>
     </w:p>
     <w:p>
@@ -1786,7 +1786,7 @@
           <w:caps w:val="0"/>
           <w:sz w:val="24"/>
         </w:rPr>
-        <w:t>MCC - Matthews Correlation Coefficient, koeficienti i korrelacionit i Matthews-it</w:t>
+        <w:t>NOC – Number of Children, numri i nënklasave të drejtpërdrejta</w:t>
       </w:r>
     </w:p>
     <w:p>
@@ -1802,7 +1802,7 @@
           <w:caps w:val="0"/>
           <w:sz w:val="24"/>
         </w:rPr>
-        <w:t>MLOC - Method Lines of Code, rreshtat efektivë të një metode</w:t>
+        <w:t>NOF – Number of Fields, numri i fushave</w:t>
       </w:r>
     </w:p>
     <w:p>
@@ -1818,7 +1818,7 @@
           <w:caps w:val="0"/>
           <w:sz w:val="24"/>
         </w:rPr>
-        <w:t>NOAM - Number of Accessor Methods, numri i akses-metodave</w:t>
+        <w:t>NOM – Number of Methods, numri i metodave</w:t>
       </w:r>
     </w:p>
     <w:p>
@@ -1834,7 +1834,7 @@
           <w:caps w:val="0"/>
           <w:sz w:val="24"/>
         </w:rPr>
-        <w:t>NOAV - Number of Accessed Variables, numri i variablave të prekura</w:t>
+        <w:t>NOPA – Number of Public Attributes, numri i atributeve publike</w:t>
       </w:r>
     </w:p>
     <w:p>
@@ -1850,7 +1850,7 @@
           <w:caps w:val="0"/>
           <w:sz w:val="24"/>
         </w:rPr>
-        <w:t>NOF - Number of Fields, numri i fushave</w:t>
+        <w:t>NP – Number of Parameters, numri i parametrave</w:t>
       </w:r>
     </w:p>
     <w:p>
@@ -1866,7 +1866,7 @@
           <w:caps w:val="0"/>
           <w:sz w:val="24"/>
         </w:rPr>
-        <w:t>NOM - Number of Methods, numri i metodave</w:t>
+        <w:t>PMD – mjet i hapur i analizës statike, i përdorur si krahasim i jashtëm</w:t>
       </w:r>
     </w:p>
     <w:p>
@@ -1882,7 +1882,7 @@
           <w:caps w:val="0"/>
           <w:sz w:val="24"/>
         </w:rPr>
-        <w:t>NOPA - Number of Public Attributes, numri i atributeve publike</w:t>
+        <w:t>RFC – Response For a Class, përgjigjja e një klase</w:t>
       </w:r>
     </w:p>
     <w:p>
@@ -1898,7 +1898,7 @@
           <w:caps w:val="0"/>
           <w:sz w:val="24"/>
         </w:rPr>
-        <w:t>NP - Number of Parameters, numri i parametrave</w:t>
+        <w:t>TCC – Tight Class Cohesion, kohezioni i ngushtë i klasës</w:t>
       </w:r>
     </w:p>
     <w:p>
@@ -1914,7 +1914,39 @@
           <w:caps w:val="0"/>
           <w:sz w:val="24"/>
         </w:rPr>
-        <w:t>κ - kappa e Cohen-it, pajtimi mes dy vlerësuesve përtej rastësisë</w:t>
+        <w:t>WMC – Weighted Methods per Class, metodat e peshuara për klasë</w:t>
+      </w:r>
+    </w:p>
+    <w:p>
+      <w:pPr>
+        <w:pStyle w:val="ListBullet"/>
+        <w:spacing w:line="360" w:lineRule="auto"/>
+        <w:jc w:val="both"/>
+      </w:pPr>
+      <w:r>
+        <w:rPr>
+          <w:rFonts w:ascii="Times New Roman" w:hAnsi="Times New Roman" w:eastAsia="Times New Roman"/>
+          <w:b w:val="0"/>
+          <w:caps w:val="0"/>
+          <w:sz w:val="24"/>
+        </w:rPr>
+        <w:t>WOC – Weight of Class, pesha funksionale e klasës</w:t>
+      </w:r>
+    </w:p>
+    <w:p>
+      <w:pPr>
+        <w:pStyle w:val="ListBullet"/>
+        <w:spacing w:line="360" w:lineRule="auto"/>
+        <w:jc w:val="both"/>
+      </w:pPr>
+      <w:r>
+        <w:rPr>
+          <w:rFonts w:ascii="Times New Roman" w:hAnsi="Times New Roman" w:eastAsia="Times New Roman"/>
+          <w:b w:val="0"/>
+          <w:caps w:val="0"/>
+          <w:sz w:val="24"/>
+        </w:rPr>
+        <w:t>κ – kappa e Cohen-it, pajtimi mes dy vlerësuesve përtej rastësisë</w:t>
       </w:r>
     </w:p>
     <w:p>
@@ -2474,7 +2506,7 @@
           <w:caps/>
           <w:sz w:val="28"/>
         </w:rPr>
-        <w:t>2 Shqyrtimi i literaturës</w:t>
+        <w:t>2 Shqyrtimi i literaturës (historiku)</w:t>
       </w:r>
     </w:p>
     <w:p>
@@ -10398,7 +10430,7 @@
           <w:caps w:val="0"/>
           <w:sz w:val="24"/>
         </w:rPr>
-        <w:t>Verdikti më i fortë kalon nga 1 te 46 nga 405 rishkrime, pra nga 0.2% në 11.4%. Kjo do të thotë se pjesa dërrmuese e rasteve ku sistemi thotë vetëm «nuk shtova gabim» janë raste ku ai nuk mund të thoshte më shumë për shkak të mënyrës së kompilimit, jo për shkak të rishkrimit.</w:t>
+        <w:t>Verdikti më i fortë kalon nga 1 te 46 nga 405 rishkrime, pra nga 0.2% në 11.4%.</w:t>
       </w:r>
     </w:p>
     <w:p>
@@ -12448,7 +12480,7 @@
           <w:caps w:val="0"/>
           <w:sz w:val="24"/>
         </w:rPr>
-        <w:t>Asnjëri prej tyre nuk ishte kapur nga njëzet e një testet e shkruara me dorë për këtë transformim. I kapi korpusi. Kjo është arsyeja pse verifikimi empirik nuk zëvendësohet dot me teste njësie, sado të kujdesshme, dhe është vetë një gjetje e këtij punimi.</w:t>
+        <w:t>Asnjëri prej tyre nuk ishte kapur nga njëzet e një testet e shkruara me dorë për këtë transformim. I kapi korpusi.</w:t>
       </w:r>
     </w:p>
     <w:p>
@@ -12542,6 +12574,22 @@
           <w:sz w:val="24"/>
         </w:rPr>
         <w:t>Përparësia qëndron edhe kur matet me interval besimi, por jo pa kusht. Kur rregullit i jepet pragu i tij më i mirë nga fshirja — krahasimi më bujar që mund t'i bëhet — dallimi te Long Method e përfshin zeron. Pra pretendimi vlen përgjithësisht, dhe jo pikërisht te era ku rregulli tashmë punonte më mirë. Ky është kufizim i krahasimit, jo i njërës qasje.</w:t>
+      </w:r>
+    </w:p>
+    <w:p>
+      <w:pPr>
+        <w:spacing w:line="360" w:lineRule="auto"/>
+        <w:ind w:firstLine="360"/>
+        <w:jc w:val="both"/>
+      </w:pPr>
+      <w:r>
+        <w:rPr>
+          <w:rFonts w:ascii="Times New Roman" w:hAnsi="Times New Roman" w:eastAsia="Times New Roman"/>
+          <w:b w:val="0"/>
+          <w:caps w:val="0"/>
+          <w:sz w:val="24"/>
+        </w:rPr>
+        <w:t>Rishkrimet prishëse që i kapi korpusi, ndërsa testet e shkruara me dorë për të njëjtin transformim nuk i kapën (Nënkapitulli 5.4), tregojnë se verifikimi empirik mbi kod real nuk zëvendësohet dot me teste njësie, sado të kujdesshme. Kjo është vetë një gjetje e këtij punimi.</w:t>
       </w:r>
     </w:p>
     <w:p>
@@ -12761,7 +12809,7 @@
           <w:caps w:val="0"/>
           <w:sz w:val="24"/>
         </w:rPr>
-        <w:t>Verifikimi i refaktorimeve është më i dobët se sa do të dëshirohej. Kompilimi i izoluar nuk është i mundur për shumicën e skedarëve, ndaj për ta pretendimi kufizohet te «nuk shton lloj të ri gabimi». Verifikimi me suitat e testeve të vetë projekteve mbetet punë e ardhshme.</w:t>
+        <w:t>Verifikimi i refaktorimeve është më i dobët se sa do të dëshirohej. Kompilimi i izoluar nuk është i mundur për shumicën e skedarëve, ndaj për ta pretendimi kufizohet te «nuk shton lloj të ri gabimi». Kompilimi i të njëjtave rishkrime brenda projektit të tyre (Nënkapitulli 5.4) tregon se shumica e këtyre rasteve i detyrohen izolimit të kompilimit dhe jo rishkrimit. Verifikimi me suitat e testeve të vetë projekteve mbetet punë e ardhshme.</w:t>
       </w:r>
     </w:p>
     <w:p>

</xml_diff>

<commit_message>
Shkurto punimin nga perseritjet dhe vendos titullin e mentores
</commit_message>
<xml_diff>
--- a/docs/thesis/Punim_Diplome_Florent_Latifi.docx
+++ b/docs/thesis/Punim_Diplome_Florent_Latifi.docx
@@ -439,7 +439,7 @@
           <w:caps w:val="0"/>
           <w:sz w:val="28"/>
         </w:rPr>
-        <w:t>Mentore: Altina Salihu</w:t>
+        <w:t>Mentore: MSc. Altina Salihu</w:t>
       </w:r>
     </w:p>
     <w:p>
@@ -2427,7 +2427,7 @@
           <w:caps w:val="0"/>
           <w:sz w:val="24"/>
         </w:rPr>
-        <w:t>Korpusi mbi të cilin matet gjithçka ndërtohet duke shkarkuar depot që përmend MLCQ-ja dhe duke ruajtur prej tyre vetëm skedarët me prapashtesë «.java». Rrjedhimisht ai nuk përmban as skedarë ndërtimi, as varësi: asnjë projekt në të nuk kompilohet si i tërë dhe asnjë suitë testesh e tij nuk ekzekutohet dot pa u rishkarkuar çdo arkiv i plotë. Një pjesë e depove nuk ishte më e arritshme në kohën e shkarkimit, ndaj mbulimi i mostrave të MLCQ-së nuk është i plotë; shifra e saktë jepet te Kapitulli 5.</w:t>
+        <w:t>Korpusi ndërtohet duke ruajtur nga depot që përmend MLCQ-ja vetëm skedarët «.java», pa skedarë ndërtimi dhe pa varësi. Disa depo nuk ishin më të arritshme, ndaj mbulimi i MLCQ-së nuk është i plotë (Kapitulli 5).</w:t>
       </w:r>
     </w:p>
     <w:p>
@@ -2443,7 +2443,7 @@
           <w:caps w:val="0"/>
           <w:sz w:val="24"/>
         </w:rPr>
-        <w:t xml:space="preserve">Nga ky kufizim rrjedh drejtpërdrejt fusha e pretendimit për refaktorimet. Çdo rishkrim kontrollohet me kompilator, por kontrolli mund të thotë vetëm nëse skedari kompilon apo nëse nuk shton një lloj të ri gabimi — jo nëse programi vazhdon të sillet si më parë. Ruajtja e sjelljes, që përmendet te pyetja e tretë kërkimore, </w:t>
+        <w:t xml:space="preserve">Prandaj çdo rishkrim kontrollohet vetëm me kompilator: nëse kompilon, ose nëse nuk shton lloj të ri gabimi. Ruajtja e sjelljes, që përmend pyetja e tretë kërkimore, </w:t>
       </w:r>
       <w:r>
         <w:rPr>
@@ -2461,7 +2461,7 @@
           <w:caps w:val="0"/>
           <w:sz w:val="24"/>
         </w:rPr>
-        <w:t xml:space="preserve"> dhe mbetet e tillë me vetëdije: ajo kërkon ekzekutimin e testeve të vetë projektit para dhe pas ndryshimit, çka korpusi i përshkruar më sipër nuk e lejon. Kapitulli 6 e rimerr këtë dallim kur i përgjigjet asaj pyetjeje.</w:t>
+        <w:t>, sepse kërkon ekzekutimin e testeve të projekteve, çka korpusi nuk e lejon (Kapitulli 6).</w:t>
       </w:r>
     </w:p>
     <w:p>
@@ -3675,7 +3675,7 @@
           <w:caps w:val="0"/>
           <w:sz w:val="24"/>
         </w:rPr>
-        <w:t xml:space="preserve">Rubrika ka tri përmasa, secila me tri vlera. </w:t>
+        <w:t xml:space="preserve">Rubrika ka tri përmasa me nga tri vlera: </w:t>
       </w:r>
       <w:r>
         <w:rPr>
@@ -3684,7 +3684,7 @@
           <w:caps w:val="0"/>
           <w:sz w:val="24"/>
         </w:rPr>
-        <w:t>Sjellja</w:t>
+        <w:t>sjellja</w:t>
       </w:r>
       <w:r>
         <w:rPr>
@@ -3693,7 +3693,7 @@
           <w:caps w:val="0"/>
           <w:sz w:val="24"/>
         </w:rPr>
-        <w:t xml:space="preserve">: e ruajtur, e paqartë, e ndryshuar — «e paqartë» është përgjigje reale, sepse një rishikues që s'e dallon dot nuk do ta pranonte. </w:t>
+        <w:t xml:space="preserve"> (e ruajtur, e paqartë, e ndryshuar), </w:t>
       </w:r>
       <w:r>
         <w:rPr>
@@ -3702,7 +3702,7 @@
           <w:caps w:val="0"/>
           <w:sz w:val="24"/>
         </w:rPr>
-        <w:t>Përfitimi</w:t>
+        <w:t>përfitimi</w:t>
       </w:r>
       <w:r>
         <w:rPr>
@@ -3711,7 +3711,7 @@
           <w:caps w:val="0"/>
           <w:sz w:val="24"/>
         </w:rPr>
-        <w:t xml:space="preserve">: përmirëson, asnjanës, përkeqëson — «asnjanës» është pikërisht rasti që çdo kontroll automatik e numëron si sukses. </w:t>
+        <w:t xml:space="preserve"> (përmirëson, asnjanës, përkeqëson) dhe </w:t>
       </w:r>
       <w:r>
         <w:rPr>
@@ -3720,7 +3720,7 @@
           <w:caps w:val="0"/>
           <w:sz w:val="24"/>
         </w:rPr>
-        <w:t>Pranueshmëria</w:t>
+        <w:t>pranueshmëria</w:t>
       </w:r>
       <w:r>
         <w:rPr>
@@ -3729,7 +3729,7 @@
           <w:caps w:val="0"/>
           <w:sz w:val="24"/>
         </w:rPr>
-        <w:t>: ashtu si është, pas një ndreqjeje, e refuzuar — mesi ndahet veç sepse emërtimi është pjesa që një motor deterministik nuk e bën dhe që njeriu e ndreq për një minutë.</w:t>
+        <w:t xml:space="preserve"> (ashtu si është, pas një ndreqjeje, e refuzuar). Vlera «asnjanës» është pikërisht rasti që çdo kontroll automatik e numëron si sukses.</w:t>
       </w:r>
     </w:p>
     <w:p>
@@ -3745,7 +3745,7 @@
           <w:caps w:val="0"/>
           <w:sz w:val="24"/>
         </w:rPr>
-        <w:t>Mostra është e mbjellë me farë dhe e shtresuar sipas transformimit, jo proporcionale: ExtractMethod përbën 93% të vendeve të rishkruara, ndaj një mostër proporcionale do të mbante dy ose tre raste nga secili transformim tjetër dhe nuk do të thoshte asgjë për to. Secili transformim merret në të njëjtën thellësi dhe raportohet veç; shifra e bashkuar ripeshohet me madhësitë reale të shtresave, sepse vetë mostra është qëllimisht jopërfaqësuese e popullatës nga e cila u nxor.</w:t>
+        <w:t>Mostra është e mbjellë me farë dhe e shtresuar sipas transformimit, sepse ExtractMethod përbën 93% të vendeve të rishkruara dhe një mostër proporcionale nuk do të thoshte asgjë për transformimet e tjera; shifra e bashkuar ripeshohet me madhësitë reale të shtresave. Fleta nuk mban verdiktin e kompilatorit, që ai të mos e ndikojë gjykimin; bashkimi me të bëhet vetëm në pikëzim.</w:t>
       </w:r>
     </w:p>
     <w:p>
@@ -3761,7 +3761,7 @@
           <w:caps w:val="0"/>
           <w:sz w:val="24"/>
         </w:rPr>
-        <w:t>Fleta që plotësohet nuk mban asnjë verdikt të kompilatorit. Bashkimi me verdiktet bëhet vetëm në pikëzim, sepse një rishikues që sheh se rishkrimi kompiloi e ka marrë gjysmën e përgjigjes para se ta jepte, dhe tabela e kryqëzuar mes dy verdikteve është ndër gjërat më të dobishme që kjo matje prodhon: ajo thotë nëse kontrolli automatik është zëvendësues i pranimit apo thjesht i korreluar me të.</w:t>
+        <w:t>Intervalet janë Wilson (1927) e jo përafrimi normal, i cili me njëzet vëzhgime dhe një përpjesë pranë skajit jep kufij jashtë [0, 1] — rasti për të cilin Brown et al. (2001) e këshillojnë kundër tij.</w:t>
       </w:r>
     </w:p>
     <w:p>
@@ -3777,23 +3777,7 @@
           <w:caps w:val="0"/>
           <w:sz w:val="24"/>
         </w:rPr>
-        <w:t>Intervalet janë Wilson (1927) e jo përafrimi normal. Me njëzet vëzhgime dhe një përpjesë pranë skajit, përafrimi normal jep kufij jashtë intervalit [0, 1] dhe mbulim dukshëm nën 95% — rasti për të cilin Brown et al. (2001) e këshillojnë kundër tij, dhe pikërisht rasti këtu.</w:t>
-      </w:r>
-    </w:p>
-    <w:p>
-      <w:pPr>
-        <w:spacing w:line="360" w:lineRule="auto"/>
-        <w:ind w:firstLine="360"/>
-        <w:jc w:val="both"/>
-      </w:pPr>
-      <w:r>
-        <w:rPr>
-          <w:rFonts w:ascii="Times New Roman" w:hAnsi="Times New Roman" w:eastAsia="Times New Roman"/>
-          <w:b w:val="0"/>
-          <w:caps w:val="0"/>
-          <w:sz w:val="24"/>
-        </w:rPr>
-        <w:t>Vlerësuesi është autori i punimit, dhe kjo është kufizim e jo veçori. Një rishikues i vetëm, njëkohësisht autor i motorit që po gjykon, është forma më e dobët që kjo matje mund të marrë; është forma e disponueshme. Punimi e raporton si gjykim të një rishikuesi, me rubrikën e fiksuar para se të shihej qoftë edhe një diff dhe me fletën e komituar, që lexuesi të mund të mos pajtohet me një rresht të emërtuar e jo me një numër. Pajtimi mes rishikuesve, që Nënkapitulli 5 e mat për etiketat e MLCQ-së, këtu nuk mund të matet fare.</w:t>
+        <w:t>Vlerësuesi është autori i punimit, dhe kjo është kufizim: rubrika u fiksua para se të shihej ndonjë diff dhe fleta është e komituar, por pajtimi mes rishikuesve këtu nuk mund të matet (Nënkapitulli 6.4).</w:t>
       </w:r>
     </w:p>
     <w:p>
@@ -3951,7 +3935,7 @@
           <w:caps w:val="0"/>
           <w:sz w:val="24"/>
         </w:rPr>
-        <w:t>Krahasimi bëhet mbi të njëjtat mostra, me të njëjtin kod pikëzimi dhe të njëjtin agregim, dhe të dyja kolonat rillogariten nga i njëjti skedar në të njëjtin ekzekutim, që të mos rrëshqasin nga njëra-tjetra. Përputhja mes një shkeljeje të PMD-së dhe një entiteti të MLCQ-së bëhet me emrin e klasës dhe të metodës që raporti i PMD-së i mban vetë, e jo me numra rreshtash: numri i rreshtit do të kërkonte të merrej me mend nëse një mjet e numëron anotimin ose Javadoc-un pjesë të deklarimit.</w:t>
+        <w:t>Krahasimi bëhet mbi të njëjtat mostra, me të njëjtin kod pikëzimi dhe agregim. Një shkelje e PMD-së përputhet me një entitet të MLCQ-së sipas emrit të klasës dhe të metodës, jo sipas numrave të rreshtave.</w:t>
       </w:r>
     </w:p>
     <w:p>
@@ -3967,7 +3951,7 @@
           <w:caps w:val="0"/>
           <w:sz w:val="24"/>
         </w:rPr>
-        <w:t>Dy kufizime deklarohen para se të shihet ndonjë shifër. PMD analizon një njësi kompilimi në një kohë dhe nuk merr classpath të kompiluar, sepse korpusi nuk mban skedarë ndërtimi; ATFD-ja e GodClass-it, e përkufizuar kundrejt tipave të tjerë të projektit, i llogaritet pra nga sa duket brenda një skedari, ndërsa detektorët e këtij punimi e marrin projektin e plotë. Handikapi është real dhe e favorizon këtë punim. Së dyti, PMD nuk ka fare rregull për Feature Envy-n; rregulli i tij më i afërt, LawOfDemeter, mat zinxhirë mesazhesh e jo qasje në të dhëna të huaja, ndaj raportohet nën emrin e vet dhe kurrë si detektor i Feature Envy-së.</w:t>
+        <w:t>Dy kufizime deklarohen paraprakisht. PMD analizon një skedar në një kohë, pa classpath të kompiluar, ndaj ATFD-në e GodClass-it e llogarit vetëm brenda skedarit — handikap që e favorizon këtë punim. Po ashtu, PMD nuk ka rregull për Feature Envy-n; më i afërti, LawOfDemeter, mat zinxhirë mesazhesh dhe raportohet vetëm nën emrin e vet.</w:t>
       </w:r>
     </w:p>
     <w:p>
@@ -10055,22 +10039,6 @@
           <w:caps w:val="0"/>
           <w:sz w:val="24"/>
         </w:rPr>
-        <w:t>Kjo është e njëjta formë me paradoksin e Encapsulate Field-it të Nënkapitullit 6.2: një refaktorim i rekomanduar gjerësisht që, i matur me vetë metrikat mbi të cilat ndërtohet detektimi, nuk përmirëson domosdo atë që mat detektori. Motori nuk e fsheh: numri raportohet krahas atyre të shëruara.</w:t>
-      </w:r>
-    </w:p>
-    <w:p>
-      <w:pPr>
-        <w:spacing w:line="360" w:lineRule="auto"/>
-        <w:ind w:firstLine="360"/>
-        <w:jc w:val="both"/>
-      </w:pPr>
-      <w:r>
-        <w:rPr>
-          <w:rFonts w:ascii="Times New Roman" w:hAnsi="Times New Roman" w:eastAsia="Times New Roman"/>
-          <w:b w:val="0"/>
-          <w:caps w:val="0"/>
-          <w:sz w:val="24"/>
-        </w:rPr>
         <w:t>Pasoja praktike është se numri i vendeve të transformuara nuk duhet lexuar si numri i erërave të hequra. Të tria matjet duhen lexuar bashkë: sa raste u shëruan, sa lëvizi matja te ato që nuk u shëruan, dhe sa herë rishkrimi solli një problem të ri.</w:t>
       </w:r>
     </w:p>
@@ -10446,7 +10414,7 @@
           <w:caps w:val="0"/>
           <w:sz w:val="24"/>
         </w:rPr>
-        <w:t>Përmbysjet nuk janë zero. 1 nga 405 rishkrime e ndryshojnë verdiktin në drejtimin e keq: të izoluara nuk shtonin lloj të ri gabimi, brenda projektit të vet shtojnë. Numri është i vogël dhe pjesa dërrmuese e rishkrimeve nuk sillet kështu, por ekzistenca e tij e kufizon pretendimin që mund të bëhet. Toleranca «pa lloj të ri gabimi» mbetet dëshmi e përdorshme atje ku kompilimi i plotë nuk arrihet; ajo nuk është garanci se kompilimi me kontekstin e projektit do të pajtohej me të. Rasti u veçua. Është një Extract Method mbi AlertSummaryRenderer.finalizeResult(Result) te «AlertSummaryRenderer.java» e projektit Ambari, dhe të tria gabimet që shton janë të të njëjtit lloj: paketa të palëve të treta që nuk ekzistojnë. Shkaku nuk është transformimi por korpusi. Nxjerrja e bllokut e kalon një tip nga trupi i metodës te nënshkrimi i saj, dhe një tip te nënshkrimi duhet zgjidhur i plotë, bashkë me anotacionet e veta; ato anotacione vijnë nga një bibliotekë që korpusi nuk e mban, sepse ai ruan vetëm skedarë «.java» dhe asnjë jar (Nënkapitulli 6.4). Në një projekt me varësitë e veta i njëjti rishkrim nuk do të kishte çfarë të shtonte. 7 kompilime e kaluan kufirin kohor dhe numërohen si të pakontrolluara, kurrë si sukses.</w:t>
+        <w:t>Përmbysjet nuk janë zero: 1 nga 405 rishkrime nuk shtonin lloj të ri gabimi të izoluara, por shtojnë brenda projektit të vet. Toleranca «pa lloj të ri gabimi» mbetet dëshmi e përdorshme ku kompilimi i plotë nuk arrihet, por jo garanci se kompilimi brenda projektit do të pajtohej me të. Rasti është një Extract Method mbi AlertSummaryRenderer.finalizeResult(Result) te «AlertSummaryRenderer.java» e projektit Ambari. Të tria gabimet që shton janë paketa të palëve të treta që mungojnë: tipi që kalon te nënshkrimi i metodës së nxjerrë mban anotacione nga një bibliotekë që korpusi nuk e ka, sepse ai ruan vetëm skedarë «.java» (Nënkapitulli 6.4). 7 kompilime e kaluan kufirin kohor dhe numërohen si të pakontrolluara, kurrë si sukses.</w:t>
       </w:r>
     </w:p>
     <w:p>
@@ -10462,7 +10430,7 @@
           <w:caps w:val="0"/>
           <w:sz w:val="24"/>
         </w:rPr>
-        <w:t>Mostra është e vogël dhe e mbjellë me farë, sepse kompilimi në kontekst është i shtrenjtë: çdo rishkrim detyron kompilimin e tërë mbylljes së varësive të skedarit, dhe seanca e fundit e kësaj matjeje zgjati rreth 4 orë. Kohëzgjatja e regjistruar mbulon vetëm atë seancë e jo tërë matjen, sepse ekzekutimi është i rifillueshëm. Kostoja nuk ndahet baraz mbi skedarët: ajo paguhet një herë për çdo rishkrim, dhe skedarët janë tepër të pabarabartë — njëri në këtë mostër mban 118 rishkrime, ndërsa shumica mbajnë disa. Verdiktet e raportuara më lart mbi tërë korpusin mbeten ato të izoluara; kjo matje nuk i zëvendëson, por tregon në ç'drejtim do të lëviznin.</w:t>
+        <w:t>Mostra është e vogël dhe e mbjellë me farë, sepse kompilimi në kontekst është i shtrenjtë: çdo rishkrim kompilon tërë mbylljen e varësive të skedarit, dhe seanca e fundit zgjati rreth 4 orë. Verdiktet mbi tërë korpusin mbeten ato të izoluara; kjo matje tregon vetëm në ç'drejtim do të lëviznin.</w:t>
       </w:r>
     </w:p>
     <w:p>
@@ -11821,7 +11789,7 @@
           <w:caps w:val="0"/>
           <w:sz w:val="24"/>
         </w:rPr>
-        <w:t>Kjo tabelë nuk bashkohet mbi erërat. E bashkuar, niveli kritik del me 23.2% kundrejt 19.7% të niveleve të tjera — pra e kundërta e asaj që shohin erërat veç e veç. Është paradoks i Simpson-it, dhe shkaku është përbërja: BrainMethod ka normë 29.1% dhe 45.6% të vendeve të veta kritike, ndërsa LongParameterList ka 8.4% dhe vetëm 4.9%. Bashkimi i jep nivelit kritik peshë nga erërat që rishkruhen lehtë dhe e përmbys shenjën, ndaj shifra e bashkuar nuk raportohet askund në këtë punim.</w:t>
+        <w:t>Kjo tabelë nuk bashkohet mbi erërat. E bashkuar, niveli kritik del me 23.2% kundrejt 19.7% të niveleve të tjera, e kundërta e asaj që shohin erërat veç e veç (paradoksi i Simpson-it): BrainMethod ka normë 29.1% dhe 45.6% vende kritike, ndërsa LongParameterList ka 8.4% dhe 4.9%. Prandaj shifra e bashkuar nuk raportohet.</w:t>
       </w:r>
     </w:p>
     <w:p>
@@ -12432,7 +12400,7 @@
           <w:caps w:val="0"/>
           <w:sz w:val="24"/>
         </w:rPr>
-        <w:t>Sa më e rëndë metoda, aq më rrallë refuzimi vjen nga forma e kodit dhe aq më shpesh nga rrjedha e kontrollit. Shpjegimi është mekanik: një metodë e gjatë ose e ndërfutur thellë mban më shumë return, break e continue brenda bllokut, dhe Extract Method nuk e ngre dot një bllok nga i cili rrjedha del. Motori nuk refuzon më shpesh te rastet e rënda; refuzon për një arsye tjetër, dhe ajo arsye është ajo që zgjidhet më vështirë.</w:t>
+        <w:t>Sa më e rëndë metoda, aq më rrallë refuzimi vjen nga forma e kodit dhe aq më shpesh nga rrjedha e kontrollit: një metodë e gjatë ose e ndërfutur thellë mban më shumë return, break e continue, dhe Extract Method nuk e ngre dot një bllok nga i cili rrjedha del.</w:t>
       </w:r>
     </w:p>
     <w:p>
@@ -12448,7 +12416,7 @@
           <w:caps w:val="0"/>
           <w:sz w:val="24"/>
         </w:rPr>
-        <w:t>Ashpërsia e përdorur këtu është ajo e derivuar nga teprica mbi pragje, të cilën seksioni i mëparshëm e tregoi se nuk e riprodhon gjykimin e rishikuesve. Prandaj ky rezultat flet për motorin kundrejt renditjes së vetë mjetit, dhe jo kundrejt asaj se sa i rëndë është kodi në gjykimin e një zhvilluesi.</w:t>
+        <w:t>Ashpërsia këtu është ajo që derivon sistemi, e cila nuk e riprodhon gjykimin e rishikuesve (Shtojca 8.9).</w:t>
       </w:r>
     </w:p>
     <w:p>
@@ -12464,23 +12432,7 @@
           <w:caps w:val="0"/>
           <w:sz w:val="24"/>
         </w:rPr>
-        <w:t>Verifikimi tregoi vlerën e vet menjëherë. Mbi ekzekutimet e para u shënuan si prishëse dhjetëra rishkrime, dhe hetimi i tyre nxori tri defekte të vërteta në motor: deklarimet brenda një cikli të mëparshëm numëroheshin si të dukshme, kllapat e stilit C pas emrit nuk hynin në tip, dhe një variabël e pacaktuar kalohej si parametër. Të treja prodhonin kod që nuk kompilon.</w:t>
-      </w:r>
-    </w:p>
-    <w:p>
-      <w:pPr>
-        <w:spacing w:line="360" w:lineRule="auto"/>
-        <w:ind w:firstLine="360"/>
-        <w:jc w:val="both"/>
-      </w:pPr>
-      <w:r>
-        <w:rPr>
-          <w:rFonts w:ascii="Times New Roman" w:hAnsi="Times New Roman" w:eastAsia="Times New Roman"/>
-          <w:b w:val="0"/>
-          <w:caps w:val="0"/>
-          <w:sz w:val="24"/>
-        </w:rPr>
-        <w:t>Asnjëri prej tyre nuk ishte kapur nga njëzet e një testet e shkruara me dorë për këtë transformim. I kapi korpusi.</w:t>
+        <w:t>Verifikimi nxori edhe tri defekte të vërteta në motor, që prodhonin kod që nuk kompilon dhe që asnjëri nga njëzet e një testet e shkruara me dorë nuk i kishte kapur; i kapi korpusi.</w:t>
       </w:r>
     </w:p>
     <w:p>
@@ -12683,7 +12635,7 @@
           <w:caps w:val="0"/>
           <w:sz w:val="24"/>
         </w:rPr>
-        <w:t>E njëjta vërejtje del edhe nga ana e refaktorimit. Encapsulate Field, i cili rekomandohet gjerësisht për Data Class, e përkeqëson matjen sipas vetë përkufizimit të strategjisë: ai shndërron një fushë publike në dy akses-metoda publike, dhe të dyja kushtet e strategjisë e numërojnë këtë si përkeqësim. Fowler-i e trajton atë transformim si hap përgatitor, jo si ilaç; një mjet që aplikon vetëm hapin e parë ecën në drejtim të gabuar.</w:t>
+        <w:t>E njëjta vërejtje del edhe nga ana e refaktorimit. Encapsulate Field, i cili rekomandohet gjerësisht për Data Class, e përkeqëson matjen sipas vetë përkufizimit të strategjisë: ai shndërron një fushë publike në dy akses-metoda publike, dhe të dyja kushtet e strategjisë e numërojnë këtë si përkeqësim. Fowler-i e trajton atë transformim si hap përgatitor, jo si ilaç; një mjet që aplikon vetëm hapin e parë ecën në drejtim të gabuar. E njëjta formë del te Extract Method: rishkrimi i saktë sjell shpesh një Long Parameter List të re (Nënkapitulli 5.4), pra e zhvendos problemin në vend që ta heqë.</w:t>
       </w:r>
     </w:p>
     <w:p>
@@ -12809,7 +12761,7 @@
           <w:caps w:val="0"/>
           <w:sz w:val="24"/>
         </w:rPr>
-        <w:t>Verifikimi i refaktorimeve është më i dobët se sa do të dëshirohej. Kompilimi i izoluar nuk është i mundur për shumicën e skedarëve, ndaj për ta pretendimi kufizohet te «nuk shton lloj të ri gabimi». Kompilimi i të njëjtave rishkrime brenda projektit të tyre (Nënkapitulli 5.4) tregon se shumica e këtyre rasteve i detyrohen izolimit të kompilimit dhe jo rishkrimit. Verifikimi me suitat e testeve të vetë projekteve mbetet punë e ardhshme.</w:t>
+        <w:t>Verifikimi i refaktorimeve është më i dobët se sa do të dëshirohej. Për shumicën e skedarëve pretendimi kufizohet te «nuk shton lloj të ri gabimi», dhe kompilimi brenda projektit (Nënkapitulli 5.4) tregon se shumica e këtyre rasteve i detyrohen izolimit dhe jo rishkrimit. Testet e projekteve nuk u ekzekutuan, sepse korpusi mban vetëm skedarë «.java», pa «pom.xml», «build.gradle» dhe biblioteka të treta; ky verifikim mbetet punë e ardhshme.</w:t>
       </w:r>
     </w:p>
     <w:p>
@@ -12825,23 +12777,7 @@
           <w:caps w:val="0"/>
           <w:sz w:val="24"/>
         </w:rPr>
-        <w:t>Arsyeja pse ai verifikim nuk u bë është vetë ndërtimi i korpusit, jo mungesa e kohës. Shkarkuesi ruan me qëllim vetëm skedarët me prapashtesë «.java», sepse kjo është gjithçka që i duhet analizës dhe e mban korpusin të vogël. Pasoja është se korpusi nuk mban asnjë përkufizim ndërtimi dhe asnjë varësi: skedarët e testeve janë aty, por pa «pom.xml» ose «build.gradle» dhe pa bibliotekat e treta ata as kompilohen dhe as ekzekutohen. Ekzekutimi i tyre do të kërkonte rimarrjen e plotë të të gjitha arkivave dhe ndërtimin e secilës depo në commit-in e vet historik, ku ndërtimet e sotme dështojnë rëndom për shtojca të vjetruara.</w:t>
-      </w:r>
-    </w:p>
-    <w:p>
-      <w:pPr>
-        <w:spacing w:line="360" w:lineRule="auto"/>
-        <w:ind w:firstLine="360"/>
-        <w:jc w:val="both"/>
-      </w:pPr>
-      <w:r>
-        <w:rPr>
-          <w:rFonts w:ascii="Times New Roman" w:hAnsi="Times New Roman" w:eastAsia="Times New Roman"/>
-          <w:b w:val="0"/>
-          <w:caps w:val="0"/>
-          <w:sz w:val="24"/>
-        </w:rPr>
-        <w:t>Cilësia e rishkrimeve u vlerësua nga një rishikues i vetëm, i cili është autori i motorit. Rubrika u fiksua para se të shihej qoftë edhe një diff dhe fleta është e komituar rresht për rresht, por asnjëra prej të dyjave nuk e zëvendëson pavarësinë. Pajtimi mes rishikuesve, që për etiketat e MLCQ-së matet dhe raportohet, për këtë matje nuk mund të matet fare, ndaj ajo është e vetmja shifër e Kapitullit 5 pa tavan të njohur mbi të.</w:t>
+        <w:t>Cilësia e rishkrimeve u vlerësua nga një rishikues i vetëm, autori i motorit. Rubrika e fiksuar paraprakisht dhe fleta e komituar nuk e zëvendësojnë pavarësinë, dhe pajtimi mes rishikuesve për këtë matje nuk mund të matet.</w:t>
       </w:r>
     </w:p>
     <w:p>
@@ -12873,7 +12809,7 @@
           <w:caps w:val="0"/>
           <w:sz w:val="24"/>
         </w:rPr>
-        <w:t>Ashpërsia që sistemi e derivon nuk e riprodhon gjykimin e rishikuesve. Ajo u ndërtua në shkallën e MLCQ-së pikërisht që të krahasohej me ta pa hap përkthimi, dhe kur krahasimi u bë, pajtimi doli pranë rastësisë për tri nga katër erërat, me mbivlerësim sistematik. Pretendimi hiqet: ajo mbetet renditje e brendshme e mjetit dhe jo riprodhim i gjykimit njerëzor.</w:t>
+        <w:t>Ashpërsia që sistemi e derivon nuk e riprodhon gjykimin e rishikuesve: pajtimi doli pranë rastësisë për tri nga katër erërat, me mbivlerësim sistematik (Shtojca 8.9). Ajo mbetet renditje e brendshme e mjetit.</w:t>
       </w:r>
     </w:p>
     <w:p>
@@ -12889,7 +12825,7 @@
           <w:caps w:val="0"/>
           <w:sz w:val="24"/>
         </w:rPr>
-        <w:t>Recall-i i raportuar kundrejt MLCQ-së për Blob-in nuk mat atë që emri i tij sugjeron. Nga 315 raste që rishikuesit i quajtën Blob dhe strategjia nuk i ndezi, 65 nuk janë më të mëdha se klasa mesatare që vetë rishikuesit e quajtën të pastër, dhe shtrirja e mospërputhjeve nuk mbivendoset fare me atë të kapjeve te asnjëra prej metrikave të madhësisë. Asnjë metrikë e vetme klase nuk i ndan dot mospërputhjet nga klasat e pastra: më e mira arrin 0.773 aty ku 0.50 do të thoshte asnjë informacion. Pasoja është se shifra mat sa shpesh një strategji e madhësisë dhe e kohezionit përputhet me një gjykim njerëzor që, te shumica e rasteve të etiketuara, nuk është marrë mbi bazën e madhësisë. Kjo nuk e përmirëson detektorin dhe nuk e fajëson rishikuesin; e ndryshon atë që shifra provon.</w:t>
+        <w:t>Recall-i i Blob-it kundrejt MLCQ-së nuk mat atë që emri i tij sugjeron. Nga 315 raste që strategjia i humbi, 65 nuk janë më të mëdha se klasa mesatare e pastër, dhe asnjë metrikë e vetme klase nuk i ndan nga klasat e pastra: më e mira arrin 0.773, ku 0.50 do të thotë asnjë informacion. Shifra mat pra pajtimin e një strategjie të madhësisë dhe të kohezionit me një gjykim njerëzor që shpesh nuk mbështetet te madhësia (Shtojca 8.11).</w:t>
       </w:r>
     </w:p>
     <w:p>
@@ -12905,7 +12841,7 @@
           <w:caps w:val="0"/>
           <w:sz w:val="24"/>
         </w:rPr>
-        <w:t>Një tavan i dytë është i matjes dhe jo i etiketave, dhe u raportua në vend që të riparohej. TCC-ja është e papërcaktuar për një klasë me më pak se dy metoda publike të instancës, dhe llogaritësi e zgjidh boshllëkun me vlerën maksimale, të cilën asnjë klauzolë e God Class-it nuk e pranon. Klasat ndihmëse krejt statike e mbartin atë vlerë nga vetë ndërtimi: 17 nga 19 rastet e tilla u riparsuan dhe dolën pikërisht të asaj forme. Ndreqja do të kërkonte shkëputjen e TCC-së nga përkufizimi i botuar që e citon, ndaj u zgjodh raportimi.</w:t>
+        <w:t>Një tavan i dytë i përket matjes. TCC-ja është e papërcaktuar për klasat me më pak se dy metoda publike të instancës, dhe llogaritësi i jep vlerën maksimale, të cilën asnjë klauzolë e God Class-it nuk e pranon. Nga 19 mospërputhje që ndalen vetëm te kohezioni, 17 kanë TCC të papërcaktuar. Ndreqja do ta shkëpuste TCC-në nga përkufizimi i botuar, ndaj u zgjodh raportimi.</w:t>
       </w:r>
     </w:p>
     <w:p>
@@ -18980,7 +18916,7 @@
           <w:caps w:val="0"/>
           <w:sz w:val="24"/>
         </w:rPr>
-        <w:t>Çdo skript shkruan rezultatin si CSV ose JSON në data/results/, bashkë me commit-in, versionin e Python-it dhe platformën që e prodhuan. Interpretuesi dhe platforma janë të njëjtët për të gjithë: Python 3.13.1, Windows-11-10.0.26200-SP0. Commit-i jo. Eksperimentet u ekzekutuan sipas radhës në të cilën u shkruan, ndaj secili skedar mban commit-in e vet, dhe ai është commit-i që duhet përdorur nëse dikush do të riprodhojë pikërisht atë skedar. Një commit i vetëm i deklaruar për të gjithë punimin do të lexohej më mirë dhe do të ishte i pasaktë për të gjithë skedarët veç njërit (Tabela 22).</w:t>
+        <w:t>Çdo skript shkruan rezultatin si CSV ose JSON në data/results/, bashkë me commit-in, versionin e Python-it dhe platformën që e prodhuan. Interpretuesi dhe platforma janë të njëjtët për të gjithë: Python 3.13.1, Windows-11-10.0.26200-SP0. Commit-i jo: eksperimentet u ekzekutuan njëri pas tjetrit, ndaj secili skedar mban commit-in e vet, dhe ai duhet përdorur për ta riprodhuar (Tabela 22).</w:t>
       </w:r>
     </w:p>
     <w:p>
@@ -19723,7 +19659,7 @@
           <w:caps w:val="0"/>
           <w:sz w:val="24"/>
         </w:rPr>
-        <w:t>Ky premtim u vu në provë më 3 shtator 2026. Trembëdhjetë nga të pesëmbëdhjetë hapat u ri-ekzekutuan mbi të njëjtat hyrje, përfshirë hapin që ndërton vetë tabelën e veçorive nga korpusi — ankora prej së cilës rrjedhin të gjithë numrat e mëpasshëm. Ai skedar CSV, 4.534 rreshta, doli bajt për bajt identik me atë të komituarin. Dymbëdhjetë hapa të tjerë dhanë po ashtu skedarë identikë me ata të komituarit, përveç commit-it dhe kohëzgjatjes që secili regjistron; të katër modelet e stërvitura dolën identike bajt për bajt; dhe asnjëra prej figurave nuk ndryshoi.</w:t>
+        <w:t>Ky premtim u vu në provë më 3 shtator 2026. Trembëdhjetë nga pesëmbëdhjetë hapat u ri-ekzekutuan mbi të njëjtat hyrje, dhe të gjithë, me një përjashtim, dhanë skedarë identikë me të komituarit, veç commit-it dhe kohëzgjatjes që regjistrojnë. Tabela e veçorive, 4.534 rreshta, doli bajt për bajt identike; po ashtu të katër modelet e stërvitura, dhe asnjë figurë nuk ndryshoi.</w:t>
       </w:r>
     </w:p>
     <w:p>
@@ -19739,23 +19675,7 @@
           <w:caps w:val="0"/>
           <w:sz w:val="24"/>
         </w:rPr>
-        <w:t>Hapi i dymbëdhjetë nuk dha skedar identik, dhe arsyeja i përket vetë matjes. Numrat që mbajnë pretendimin u riprodhuan saktësisht — po aq rishkrime, po aq verdikte «kompilon», asnjë përmbysje — por pesë kompilime që në ekzekutimin e parë e kishin kaluar kufirin kohor të kompilatorit, në të dytin përfunduan brenda tij dhe morën verdikt. Ky hap, pra, varet nga ngarkesa e makinës: verdiktet e tij janë të qëndrueshme, ndërsa ndarja mes «i kontrolluar» dhe «i pakontrolluar» nuk është. Edhe kohëzgjatja e tij ndryshoi katërfish mes dy ekzekutimeve, prej të njëjtës arsye.</w:t>
-      </w:r>
-    </w:p>
-    <w:p>
-      <w:pPr>
-        <w:spacing w:line="360" w:lineRule="auto"/>
-        <w:ind w:firstLine="360"/>
-        <w:jc w:val="both"/>
-      </w:pPr>
-      <w:r>
-        <w:rPr>
-          <w:rFonts w:ascii="Times New Roman" w:hAnsi="Times New Roman" w:eastAsia="Times New Roman"/>
-          <w:b w:val="0"/>
-          <w:caps w:val="0"/>
-          <w:sz w:val="24"/>
-        </w:rPr>
-        <w:t>Riprodhimi i mësipërm i përket matjes ashtu si ishte atëherë: mostra e saj prej 30 skedarësh, ku asnjë verdikt nuk ishte përmbysur. Tri ditë më vonë ajo mostër u dyfishua, dhe pikërisht dyfishimi nxori përmbysjen e vetme që raporton Kapitulli 5. Skedari i komituar sot është ai i dytë. Pra fjalia e mësipërme thotë se hapi riprodhohet, jo se rezultati i tij nuk ndryshoi kurrë — dallim që do të humbte po të mos shkruhej këtu.</w:t>
+        <w:t>Përjashtimi është hapi i dymbëdhjetë. Ai riprodhoi numrat që mbajnë pretendimin — po aq rishkrime, po aq verdikte «kompilon», asnjë përmbysje — por pesë kompilime që herën e parë e kaluan kufirin kohor, herën e dytë morën verdikt: ndarja mes «i kontrolluar» dhe «i pakontrolluar» varet nga ngarkesa e makinës. Ai riprodhim i përket mostrës së atëhershme prej 30 skedarësh; mostra u dyfishua më vonë, dhe dyfishimi nxori përmbysjen e vetme që raporton Kapitulli 5.</w:t>
       </w:r>
     </w:p>
     <w:p>
@@ -21020,7 +20940,7 @@
           <w:caps w:val="0"/>
           <w:sz w:val="24"/>
         </w:rPr>
-        <w:t>Këto vlera nuk adoptohen. Zgjedhja e një pragu sepse jep shifrën më të mirë mbi bashkësinë e vlerësimit është përshtatje ndaj të dhënave të testimit, dhe numri që do të raportohej pas saj do të matte sa mirë u zgjodh pragu, jo sa mirë funksionon detektimi. Kalibrimi do të kërkonte një bashkësi të ndarë dhe një bashkësi tjetër të paprekur për vlerësim; kjo është pikërisht ajo që bëhet më poshtë.</w:t>
+        <w:t>Këto vlera nuk adoptohen: një prag i zgjedhur sepse jep shifrën më të mirë mbi bashkësinë e vlerësimit do të matte sa mirë u zgjodh pragu, jo sa mirë funksionon detektimi. Kalibrimi i ndershëm kërkon bashkësi të ndara, dhe kjo bëhet më poshtë.</w:t>
       </w:r>
     </w:p>
     <w:p>
@@ -22411,7 +22331,7 @@
           <w:caps w:val="0"/>
           <w:sz w:val="24"/>
         </w:rPr>
-        <w:t>Feature Envy nuk ka rresht krahasimi sepse PMD nuk ka rregull për të. LawOfDemeter është më i afërti dhe mat zinxhirë mesazhesh e jo qasje në të dhëna të huaja; shifra e tij raportohet për ta pasur të matur e jo të supozuar, dhe nuk është matje e Feature Envy-së. Mbulimi i pjesshëm i një mjeti të përhapur është vetë gjetje: tri nga katër erërat e MLCQ-së kanë një rregull të gatshme, e katërta jo.</w:t>
+        <w:t>Feature Envy nuk ka rresht krahasimi sepse PMD nuk ka rregull për të; LawOfDemeter, më i afërti, mat zinxhirë mesazhesh dhe nuk është matje e Feature Envy-së. Mungesa nuk është vetëm e PMD-së: as DesigniteJava nuk e përfshin mes erërave që dokumenton. JDeodorant e zbulon, sepse ndërtohet mbi identifikimin e mundësive për Move Method (Tsantalis &amp; Chatzigeorgiou, 2009), por është shtojcë e mjedisit të zhvillimit dhe varianti i tij në rresht komande nuk mban licencë. Pra erës që literatura e trajton më shpesh si objektiv refaktorimi i mungon mbështetja në mjetet e lira të përhapura.</w:t>
       </w:r>
     </w:p>
     <w:p>
@@ -22427,39 +22347,7 @@
           <w:caps w:val="0"/>
           <w:sz w:val="24"/>
         </w:rPr>
-        <w:t>Mungesa nuk është veti vetëm e PMD-së, dhe u kërkua një mjet i dytë para se të pranohej. Katalogu i rregullave të PMD-së për Java u numërua nga vetë shpërndarja e tij dhe nuk përmban asnjë rregull për Feature Envy. DesigniteJava, mjeti tjetër i lirë me përhapje krahasuese, dokumenton shtatëmbëdhjetë design smells dhe dhjetë implementation smells, dhe Feature Envy nuk është ndër to. Mjeti që e zbulon vërtet është JDeodorant, i cili ndërtohet mbi pikërisht identifikimin e mundësive për Move Method (Tsantalis &amp; Chatzigeorgiou, 2009), por ai është shtojcë e mjedisit të zhvillimit dhe varianti i tij në rresht komande nuk mban licencë, çka e përjashton nga kufizimi i varësive që ky punim ndjek.</w:t>
-      </w:r>
-    </w:p>
-    <w:p>
-      <w:pPr>
-        <w:spacing w:line="360" w:lineRule="auto"/>
-        <w:ind w:firstLine="360"/>
-        <w:jc w:val="both"/>
-      </w:pPr>
-      <w:r>
-        <w:rPr>
-          <w:rFonts w:ascii="Times New Roman" w:hAnsi="Times New Roman" w:eastAsia="Times New Roman"/>
-          <w:b w:val="0"/>
-          <w:caps w:val="0"/>
-          <w:sz w:val="24"/>
-        </w:rPr>
-        <w:t>Prandaj erës që literatura e trajton më shpesh si objektiv refaktorimi i mungon mbështetja në mjetet që një zhvillues i instalon lehtë. Kjo raportohet si gjendje e verifikuar e jo si supozim: dy katalogë u numëruan, dhe i treti u përjashtua për arsye licence e jo për mungesë aftësie.</w:t>
-      </w:r>
-    </w:p>
-    <w:p>
-      <w:pPr>
-        <w:spacing w:line="360" w:lineRule="auto"/>
-        <w:ind w:firstLine="360"/>
-        <w:jc w:val="both"/>
-      </w:pPr>
-      <w:r>
-        <w:rPr>
-          <w:rFonts w:ascii="Times New Roman" w:hAnsi="Times New Roman" w:eastAsia="Times New Roman"/>
-          <w:b w:val="0"/>
-          <w:caps w:val="0"/>
-          <w:sz w:val="24"/>
-        </w:rPr>
-        <w:t>Krahasimi e favorizon këtë punim në një drejtim të deklaruar që në Nënkapitullin 4.6: PMD analizon një skedar në një kohë dhe pa classpath të kompiluar, ndaj ATFD-në e llogarit nga sa duket brenda një skedari, ndërsa detektorët e këtij punimi e marrin projektin e plotë. Heqja e këtij handikapi do të kërkonte ndërtimin e 513 depove në commit-et e tyre historike, çka korpusi nuk e lejon (Nënkapitulli 6.4).</w:t>
+        <w:t>Krahasimi e favorizon këtë punim në drejtimin e deklaruar te Nënkapitulli 4.6, sepse PMD e llogarit ATFD-në vetëm brenda një skedari. Heqja e handikapit do të kërkonte ndërtimin e çdo depoje në commit-in e vet historik, çka korpusi nuk e lejon (Nënkapitulli 6.4).</w:t>
       </w:r>
     </w:p>
     <w:p>
@@ -23391,7 +23279,7 @@
           <w:caps w:val="0"/>
           <w:sz w:val="24"/>
         </w:rPr>
-        <w:t>Kjo analizë kufizohet te dy strategjitë që janë konjunksione të pastra. Long Method-i ka një klauzolë të vetme, ndaj pyetja ka një përgjigje të vetme dhe të parashikueshme; Data Class-i përzien konjunksion me disjunksion, ku «klauzola bllokuese» nuk përcaktohet pa vendosur se cila degë ishte më afër, dhe ai vendim do të prodhonte një numër që varet nga vetë vendimi.</w:t>
+        <w:t>Analiza kufizohet te dy strategjitë që janë konjunksione të pastra: Long Method-i ka një klauzolë të vetme, ndërsa Data Class-i përzien konjunksion me disjunksion, ku «klauzola bllokuese» nuk përcaktohet pa një vendim arbitrar.</w:t>
       </w:r>
     </w:p>
     <w:p>
@@ -24155,7 +24043,7 @@
           <w:caps w:val="0"/>
           <w:sz w:val="24"/>
         </w:rPr>
-        <w:t>Shpjegimi qëndron te vetë ndërtimi i pikës. Për Long Method teprica matet mbi një metrikë të vetme, ku dyfishi i pragut ka kuptim të drejtpërdrejtë. Për strategjitë me disa kushte, pika është mesatarja e tepricave mbi metrika heterogjene — një raport WMC-je, një raport kohezioni, një raport qasjesh të huaja — dhe asgjë nuk garanton se mesatarja e tyre përkon me atë që një zhvillues e quan problem të rëndë.</w:t>
+        <w:t>Shpjegimi qëndron te ndërtimi i pikës. Për Long Method teprica matet mbi një metrikë të vetme; për strategjitë me disa kushte pika është mesatare e tepricave mbi metrika heterogjene, dhe asgjë nuk garanton se ajo përkon me atë që një zhvillues e quan problem të rëndë.</w:t>
       </w:r>
     </w:p>
     <w:p>
@@ -24171,7 +24059,7 @@
           <w:caps w:val="0"/>
           <w:sz w:val="24"/>
         </w:rPr>
-        <w:t>Nuk është çështje kalibrimi. Fshirja e të dy pragjeve të ashpërsisë mbi të njëjtin brez si pragjet e detektimit e ngre kappa-n më së shumti deri në 0.308, pra edhe konfigurimi më i favorshëm i provuar mbetet pajtim i dobët. Zhvendosja e kufijve e ndryshon shpërndarjen e etiketave, jo aftësinë e pikës për t'i renditur rastet.</w:t>
+        <w:t>Nuk është çështje kalibrimi: fshirja e pragjeve të ashpërsisë e ngre kappa-n më së shumti deri në 0.308, pra pajtimi mbetet i dobët.</w:t>
       </w:r>
     </w:p>
     <w:p>
@@ -24187,7 +24075,7 @@
           <w:caps w:val="0"/>
           <w:sz w:val="24"/>
         </w:rPr>
-        <w:t>Pasoja për punimin është e drejtpërdrejtë: ashpërsia e derivuar është e përdorshme si renditje brenda vetë mjetit — cili rast të shihet i pari — por nuk pretendon të riprodhojë gjykimin e një zhvilluesi për rëndësinë. Ky pretendim hiqet, dhe ndarja e recall-it sipas ashpërsisë së rishikuesve mbetet mënyra e vetme e vlefshme në të cilën ashpërsia hyn në rezultatet e këtij punimi.</w:t>
+        <w:t>Ashpërsia e derivuar mbetet renditje brenda mjetit — cili rast të shihet i pari — dhe jo riprodhim i gjykimit të zhvilluesit. Ajo hyn në rezultatet e punimit vetëm përmes ndarjes së recall-it sipas ashpërsisë së rishikuesve.</w:t>
       </w:r>
     </w:p>
     <w:p>
@@ -25830,23 +25718,7 @@
           <w:caps w:val="0"/>
           <w:sz w:val="24"/>
         </w:rPr>
-        <w:t>Asnjë erë nuk e kalon 0.238. Kjo nuk do të thotë se sistemi i tejkalon njerëzit: shifrat e kapitullit maten kundrejt etiketës së agreguar, ndërsa kjo mat marrëveshjen mes dy individëve, dhe agregimi e heq një pjesë të zhurmës që një individ i vetëm e mbart. Të dy numrat nuk janë i njëjti tregues dhe nuk duhen vendosur në një renditje.</w:t>
-      </w:r>
-    </w:p>
-    <w:p>
-      <w:pPr>
-        <w:spacing w:line="360" w:lineRule="auto"/>
-        <w:ind w:firstLine="360"/>
-        <w:jc w:val="both"/>
-      </w:pPr>
-      <w:r>
-        <w:rPr>
-          <w:rFonts w:ascii="Times New Roman" w:hAnsi="Times New Roman" w:eastAsia="Times New Roman"/>
-          <w:b w:val="0"/>
-          <w:caps w:val="0"/>
-          <w:sz w:val="24"/>
-        </w:rPr>
-        <w:t>Ajo që tregon është sa e ashpër është vetë detyra. Kur dy zhvillues profesionistë që shohin të njëjtin kod pajtohen kaq pak, një pjesë e pareduktueshme e gabimit të çdo detektori nuk i takon detektorit por përkufizimit. Çdo shifër e Kapitullit 5 duhet lexuar mbi këtë sfond, dhe po ashtu çdo shifër e literaturës që raportohet pa të.</w:t>
+        <w:t>Asnjë erë nuk e kalon 0.238. Kjo nuk do të thotë se sistemi i tejkalon njerëzit: shifrat e kapitullit maten kundrejt etiketës së agreguar, e cila e heq një pjesë të zhurmës së një individi, ndaj të dy numrat nuk vendosen në një renditje. Ajo që tregon është sa e vështirë është vetë detyra: një pjesë e pareduktueshme e gabimit të çdo detektori i takon përkufizimit, dhe çdo shifër e Kapitullit 5 duhet lexuar mbi këtë sfond.</w:t>
       </w:r>
     </w:p>
     <w:p>
@@ -25876,7 +25748,7 @@
           <w:caps w:val="0"/>
           <w:sz w:val="24"/>
         </w:rPr>
-        <w:t>Shtojca 8.8 numëron klauzolat që ndalën secilën mospërputhje dhe e lë të hapur pyetjen që vjen menjëherë pas saj: si duket klasa që rishikuesi e quajti blob ndërsa strategjia nuk e quajti? Përgjigjja ka vetëm dy forma, dhe të dyja kërkojnë punë të kundërt. Ose klasat e humbura u ngjajnë atyre të kapura në një përmasë që strategjia nuk e lexon fare, dhe atëherë asaj i mungon një klauzolë; ose u ngjajnë klasave që rishikuesit i quajtën të pastra në çdo përmasë të matur, dhe atëherë asnjë prag e asnjë klauzolë nuk i arrin dot (Tabela 32).</w:t>
+        <w:t>Shtojca 8.8 numëron klauzolat që ndalën secilën mospërputhje, por nuk thotë si duket klasa që rishikuesi e quajti blob ndërsa strategjia jo. Ose klasat e humbura u ngjajnë atyre të kapura në një përmasë që strategjia nuk e lexon, dhe asaj i mungon një klauzolë; ose u ngjajnë klasave të pastra në çdo përmasë të matur, dhe atëherë asnjë prag nuk i arrin (Tabela 32).</w:t>
       </w:r>
     </w:p>
     <w:p>
@@ -26621,7 +26493,7 @@
           <w:caps w:val="0"/>
           <w:sz w:val="24"/>
         </w:rPr>
-        <w:t>Asnjë metrikë e vetme nuk e mban dot ndarjen. Për secilën metrikë klase u mat gjasa që një mospërputhje e marrë rastësisht të renditet mbi një klasë të pastër të marrë rastësisht, që është statistika e Mann-Whitney-t dhe lexohet si sipërfaqja nën kurbën ROC: 0.50 do të thotë asnjë informacion, 1.00 renditje e përsosur. Më e mira nga 17 metrikat e klasës është NOF me 0.773, e cila nuk mban dot as prag as klauzolë. Pra përmasa që mungon nuk gjendet mes atyre që ky sistem di të masë.</w:t>
+        <w:t>Asnjë metrikë e vetme nuk e mban dot ndarjen. Për secilën metrikë klase u mat statistika e Mann-Whitney-t, e lexuar si sipërfaqe nën kurbën ROC: 0.50 do të thotë asnjë informacion, 1.00 renditje e përsosur. Më e mira nga 17 metrikat është NOF me 0.773, pra përmasa që mungon nuk gjendet mes atyre që ky sistem di të masë.</w:t>
       </w:r>
     </w:p>
     <w:p>
@@ -26637,7 +26509,7 @@
           <w:caps w:val="0"/>
           <w:sz w:val="24"/>
         </w:rPr>
-        <w:t>Kjo renditje përputhet me një matje krejt tjetër. Veçoritë që modeli i Qasjes B zgjodhi vetë për Blob-in, të raportuara te Nënkapitulli 5.2, ndajnë 3 nga katër vendet e para me renditjen sipas ndarjes: NOF, CLOC, NOAM. As TCC-ja dhe as WMC-ja, të dy kushtet mbi të cilat është ndërtuar strategjia e botuar, nuk hyjnë te asnjëra prej dy listave. Një statistikë renditëse dhe një model i trajnuar nuk janë e njëjta llogari, ndaj pajtimi i tyre është provë më shumë se përsëritje (Tabela 33).</w:t>
+        <w:t>Kjo renditje përputhet me një matje të pavarur: veçoritë që modeli i Qasjes B zgjodhi për Blob-in (Nënkapitulli 5.2) ndajnë 3 nga katër vendet e para me të: NOF, CLOC, NOAM. As TCC-ja dhe as WMC-ja, kushtet e strategjisë së botuar, nuk hyjnë te asnjëra listë (Tabela 33).</w:t>
       </w:r>
     </w:p>
     <w:p>
@@ -27366,7 +27238,7 @@
           <w:caps w:val="0"/>
           <w:sz w:val="24"/>
         </w:rPr>
-        <w:t>Agregimi këtu është MAX e jo mesatarja e përdorur gjetiu, dhe zgjedhja është e qëllimshme. Shumica e mostrave mbajnë vetëm dy rishikime, dhe një votë «asnjë» përballë një vote të rëndë e ul mesataren për një shkallë të tërë; te mostrat me gjashtë rishikime, ku «asnjë» është vota mediane, ulja është edhe më e madhe. Pasoja matet: nën mesatare shpërndarja e pozitivëve është minor 330, major 20, critical 0, ndërsa nën MAX është minor 143, major 182, critical 132. Skaji i rëndë i shkallës zbrazet, ndaj gradienti nuk shihet dot aty ku raportohet gjetiu ky punim.</w:t>
+        <w:t>Agregimi këtu është qëllimisht MAX e jo mesatarja e përdorur gjetiu. Shumica e mostrave mbajnë vetëm dy rishikime, dhe një votë «asnjë» përballë një vote të rëndë e ul mesataren për një shkallë të tërë. Nën mesatare pozitivët ndahen minor 330, major 20, critical 0, ndërsa nën MAX minor 143, major 182, critical 132: mesatarja e zbraz skajin e rëndë të shkallës, ndaj gradienti nuk shihet nën të.</w:t>
       </w:r>
     </w:p>
     <w:p>
@@ -27398,7 +27270,7 @@
           <w:caps w:val="0"/>
           <w:sz w:val="24"/>
         </w:rPr>
-        <w:t xml:space="preserve">Një pjesë e vogël e mospërputhjeve ka shkak krejt tjetër, dhe është e vetmja pjesë ku faji bie mbi matjen e jo mbi etiketat. TCC-ja e Bieman &amp; Kang-ut (1995) mat pjesën e çifteve të metodave publike të instancës që ndajnë një fushë. Një klasë me më pak se dy metoda të tilla nuk ka çift fare, ndaj metrika është e papërcaktuar dhe llogaritësi e zgjidh boshllëkun nga ana e «plotësisht kohezive», domethënë 1.0. Çdo klauzolë e God Class-it e kërkon TCC-në </w:t>
+        <w:t xml:space="preserve">Një pjesë e vogël e mospërputhjeve i detyrohet matjes e jo etiketave. TCC-ja e Bieman &amp; Kang-ut (1995) mat pjesën e çifteve të metodave publike të instancës që ndajnë një fushë. Një klasë me më pak se dy metoda të tilla nuk ka çift, ndaj llogaritësi i jep vlerën 1.0; dhe çdo klauzolë e God Class-it e kërkon TCC-në </w:t>
       </w:r>
       <w:r>
         <w:rPr>
@@ -27416,7 +27288,7 @@
           <w:caps w:val="0"/>
           <w:sz w:val="24"/>
         </w:rPr>
-        <w:t xml:space="preserve"> një prag, ndaj një klasë që mbart atë vlerë mbetet jashtë mundësive të strategjisë sado të zhvendosen pragjet (Tabela 34).</w:t>
+        <w:t xml:space="preserve"> një prag, pra kjo klasë nuk kapet me asnjë prag (Tabela 34).</w:t>
       </w:r>
     </w:p>
     <w:p>
@@ -28339,7 +28211,7 @@
           <w:caps w:val="0"/>
           <w:sz w:val="24"/>
         </w:rPr>
-        <w:t>Janë 19 mospërputhje të tilla: klasa që e kalojnë klauzolën e kompleksitetit dhe ndalen vetëm te kohezioni. Prej tyre 19 u riparsuan nga korpusi dhe 17 dolën me më pak se dy metoda publike të instancës, pra me TCC të papërcaktuar e jo me kohezion të matur. Emrat e tregojnë vetë llojin: klasa ndihmëse krejt statike, ku kolona e fundit është zero. Këto janë pikërisht klasat që një rishikues i quan blob pa hezitim, dhe janë të paarritshme nga një strategji e ndërtuar mbi kohezionin mes metodave të instancës.</w:t>
+        <w:t>Janë 19 mospërputhje të tilla, që e kalojnë klauzolën e kompleksitetit dhe ndalen vetëm te kohezioni; 19 u riparsuan dhe 17 dolën me TCC të papërcaktuar. Emrat tregojnë klasa ndihmëse krejt statike, ku kolona e fundit është zero.</w:t>
       </w:r>
     </w:p>
     <w:p>
@@ -28355,7 +28227,7 @@
           <w:caps w:val="0"/>
           <w:sz w:val="24"/>
         </w:rPr>
-        <w:t>Numri mbetet i vogël përballë tërësisë, 19 nga 315, ndaj nuk e shpjegon recall-in e ulët dhe nuk u trajtua si defekt për t'u riparuar. Ndryshimi i TCC-së do të shkëpuste përkufizimin nga burimi i tij dhe do të detyronte rigjenerimin e çdo numri të raportuar, për një fitim që nuk e kalon 0.054 te recall-i. Kufizimi raportohet i tillë siç është te Nënkapitulli 6.4.</w:t>
+        <w:t>Numri është i vogël, 19 nga 315, ndaj nuk e shpjegon recall-in e ulët. Ndryshimi i TCC-së do ta shkëpuste përkufizimin nga burimi, për një fitim jo më të madh se 0.054 te recall-i (Nënkapitulli 6.4).</w:t>
       </w:r>
     </w:p>
     <w:p>
@@ -28371,7 +28243,7 @@
           <w:caps w:val="0"/>
           <w:sz w:val="24"/>
         </w:rPr>
-        <w:t>Përfundimi i këtij nënkapitulli është për të vërtetën bazë dhe jo për detektorin, dhe pikërisht prandaj duhet lexuar me kujdes. Ai nuk thotë se rishikuesit gabuan: një zhvillues që e njeh kodin mund ta quajë me plot të drejtë problematike një klasë të vogël, për arsye që asnjë metrikë strukturore nuk i mat. Thotë diçka më të ngushtë e më të dobishme, që recall-i i matur kundrejt MLCQ-së nuk është i njëjti krahasim që një lexues supozon: ai mat sa shpesh një strategji e madhësisë dhe e kohezionit përputhet me një gjykim njerëzor që, në shumicën e rasteve të etiketuara, nuk është marrë mbi bazën e madhësisë.</w:t>
+        <w:t>Përfundimi është për të vërtetën bazë, jo për detektorin. Ai nuk thotë se rishikuesit gabuan, por që recall-i kundrejt MLCQ-së mat sa shpesh një strategji e madhësisë dhe e kohezionit përputhet me një gjykim njerëzor që shpesh nuk mbështetet te madhësia.</w:t>
       </w:r>
     </w:p>
     <w:sectPr>

</xml_diff>

<commit_message>
Ndreq pohimet e literatures sipas burimeve
</commit_message>
<xml_diff>
--- a/docs/thesis/Punim_Diplome_Florent_Latifi.docx
+++ b/docs/thesis/Punim_Diplome_Florent_Latifi.docx
@@ -552,7 +552,7 @@
           <w:caps w:val="0"/>
           <w:sz w:val="24"/>
         </w:rPr>
-        <w:t>Code smells janë simptoma të dizajnit të dobët që nuk shkaktojnë gabime, por e rrisin koston e çdo ndryshimi të ardhshëm. Identifikimi manual i tyre nuk shkallëzohet në sisteme të mëdha, ndërsa mjetet ekzistuese të analizës statike mbështeten kryesisht në pragje fikse mbi metrika të veçuara dhe ndalen te njoftimi, pa propozuar zgjidhje.</w:t>
+        <w:t>Code smells janë simptoma të dizajnit të dobët që nuk shkaktojnë gabime, por e rrisin koston e çdo ndryshimi të ardhshëm. Identifikimi manual i tyre nuk shkallëzohet në sisteme të mëdha, ndërsa mjetet ekzistuese të analizës statike mbështeten kryesisht në pragje fikse të kalibruara gjetiu dhe rrallë propozojnë zgjidhje.</w:t>
       </w:r>
     </w:p>
     <w:p>
@@ -2035,7 +2035,7 @@
           <w:caps w:val="0"/>
           <w:sz w:val="24"/>
         </w:rPr>
-        <w:t>Termi code smell u prezantua nga Kent Beck dhe u popullarizua nga Fowler (2018) në veprën Refactoring. Një code smell nuk është gabim: programi kompilohet, testet kalojnë dhe funksionaliteti është i saktë. Ai është një simptomë sipërfaqësore që zakonisht tregon një problem më të thellë të dizajnit. Një klasë që mban shumë përgjegjësi të palidhura mes tyre, një metodë që zgjatet për qindra rreshta, ose një klasë që mban vetëm të dhëna pa asnjë sjellje, janë shembuj tipikë.</w:t>
+        <w:t>Termi code smell u prezantua nga Kent Beck dhe u popullarizua nga libri Refactoring i Martin Fowler-it, botimi i dytë i të cilit (Fowler, 2018) përdoret në këtë punim. Një code smell nuk është gabim: programi kompilohet, testet kalojnë dhe funksionaliteti është i saktë. Ai është një simptomë sipërfaqësore që zakonisht tregon një problem më të thellë të dizajnit. Një klasë që mban shumë përgjegjësi të palidhura mes tyre, një metodë që zgjatet për qindra rreshta, ose një klasë që mban vetëm të dhëna pa asnjë sjellje, janë shembuj tipikë.</w:t>
       </w:r>
     </w:p>
     <w:p>
@@ -2113,7 +2113,7 @@
           <w:caps w:val="0"/>
           <w:sz w:val="24"/>
         </w:rPr>
-        <w:t>Mjetet ekzistuese të analizës statike e automatizojnë pjesërisht këtë punë, por vuajnë nga tri kufizime të dukshme. Së pari, shumica e tyre mbështeten në pragje fikse mbi një metrikë të vetme, prandaj një metodë e gjatë por koherente shënohet njësoj si një metodë e shkurtër që përzien disa përgjegjësi. Së dyti, ato fokusohen kryesisht në probleme të nivelit të rreshtit dhe të stilit, ndërsa problemet strukturore të nivelit të dizajnit mbulohen dobët. Së treti, dhe më e rëndësishmja, ato ndalen te njoftimi: i tregojnë zhvilluesit se çfarë është e gabuar, por jo se çfarë duhet bërë konkretisht.</w:t>
+        <w:t>Mjetet ekzistuese të analizës statike e automatizojnë pjesërisht këtë punë, por kanë tri kufizime. Së pari, shumë prej tyre mbështeten në pragje fikse të kalibruara mbi korpuse të tjera; edhe strategjitë që kombinojnë disa metrika, si ato të Lanza &amp; Marinescu (2006), i përdorin këto pragje pa i verifikuar mbi projektin që analizojnë. Së dyti, shumë mjete të përhapura fokusohen kryesisht në probleme të nivelit të rreshtit dhe të stilit, ndërsa problemet strukturore të nivelit të dizajnit mbulohen dobët. Së treti, dhe më e rëndësishmja, shumica ndalen te njoftimi: i tregojnë zhvilluesit se çfarë është e gabuar, por jo se çfarë duhet bërë konkretisht. Qasjet që propozojnë edhe refaktorimin, si ajo e Tsantalis &amp; Chatzigeorgiou (2009) për Move Method, janë më të rralla dhe mbulojnë vetëm disa smells.</w:t>
       </w:r>
     </w:p>
     <w:p>
@@ -2552,7 +2552,7 @@
           <w:caps w:val="0"/>
           <w:sz w:val="24"/>
         </w:rPr>
-        <w:t>Termi u prezantua nga Kent Beck dhe u sistemua nga Fowler (2018), i cili përshkroi njëzet e dy smells bashkë me refaktorimet që i adresojnë. Përkufizimi mbetet qëllimisht cilësor: një smell është simptomë, jo gabim, dhe gjykimi nëse diçka është problem varet nga konteksti.</w:t>
+        <w:t>Katalogun kanonik e jep Fowler (2018), botimi i dytë i të cilit përshkruan njëzet e katër smells bashkë me refaktorimet që i adresojnë. Përkufizimi mbetet qëllimisht cilësor: një smell është simptomë, jo gabim, dhe gjykimi nëse diçka është problem varet nga konteksti.</w:t>
       </w:r>
     </w:p>
     <w:p>
@@ -2568,7 +2568,7 @@
           <w:caps w:val="0"/>
           <w:sz w:val="24"/>
         </w:rPr>
-        <w:t>Matja sasiore u mundësua nga suita e metrikave e Chidamber &amp; Kemerer (1994), e cila propozoi gjashtë metrika për sistemet e orientuara nga objektet, mes tyre WMC, DIT, NOC, CBO, RFC dhe LCOM. Henderson-Sellers (1996) e rishikoi LCOM-in duke propozuar një variant të normalizuar, ndërsa Bieman &amp; Kang (1995) prezantuan TCC-në, e cila e mat kohezionin përmes çifteve të metodave që ndajnë të paktën një fushë. Këto metrika janë baza mbi të cilën ndërtohet çdo detektim sasior i mëvonshëm.</w:t>
+        <w:t>Matja sasiore u mundësua nga suita e metrikave e Chidamber &amp; Kemerer (1994), e cila propozoi gjashtë metrika për sistemet e orientuara nga objektet: WMC, DIT, NOC, CBO, RFC dhe LCOM. Henderson-Sellers (1996) e rishikoi LCOM-in duke propozuar një variant të normalizuar, ndërsa Bieman &amp; Kang (1995) prezantuan TCC-në, e cila e mat kohezionin përmes çifteve të metodave që ndajnë të paktën një fushë. Këto metrika janë baza mbi të cilën ndërtohet çdo detektim sasior i mëvonshëm.</w:t>
       </w:r>
     </w:p>
     <w:p>
@@ -2584,7 +2584,7 @@
           <w:caps w:val="0"/>
           <w:sz w:val="24"/>
         </w:rPr>
-        <w:t>Sharma &amp; Spinellis (2018) ofrojnë një shqyrtim sistematik të fushës dhe vërejnë se literatura nuk ka një përkufizim të vetëm operacional për shumicën e smells, çka e bën krahasimin mes mjeteve të vështirë.</w:t>
+        <w:t>Sharma &amp; Spinellis (2018) ofrojnë një shqyrtim sistematik të fushës dhe vërejnë se literatura ka prodhuar përkufizime jokonsistente për smells, dhe se metodat e detektimit japin rezultate po aq jokonsistente, çka e bën krahasimin mes mjeteve të vështirë.</w:t>
       </w:r>
     </w:p>
     <w:p>
@@ -2614,7 +2614,7 @@
           <w:caps w:val="0"/>
           <w:sz w:val="24"/>
         </w:rPr>
-        <w:t>Marinescu (2004) prezantoi konceptin e strategjive të detektimit: rregulla që kombinojnë disa metrika me pragje, në vend që të mbështeten në një metrikë të vetme. Ideja u zhvillua në një katalog të plotë nga Lanza &amp; Marinescu (2006), ku çdo smell shprehet si konjunksion kushtesh mbi metrika, me pragje të nxjerra statistikisht nga një korpus prej dyzet e pesë sistemesh.</w:t>
+        <w:t>Marinescu (2004) prezantoi konceptin e strategjive të detektimit: rregulla që kombinojnë disa metrika me pragje, në vend që të mbështeten në një metrikë të vetme. Ideja u zhvillua në një katalog të plotë nga Lanza &amp; Marinescu (2006), ku çdo smell shprehet si kombinim logjik kushtesh mbi metrika, zakonisht si konjunksion, me pragje të nxjerra statistikisht nga një korpus prej dyzet e pesë sistemesh Java.</w:t>
       </w:r>
     </w:p>
     <w:p>
@@ -2676,7 +2676,7 @@
           <w:caps w:val="0"/>
           <w:sz w:val="24"/>
         </w:rPr>
-        <w:t>Arcelli Fontana et al. (2016) krahasuan disa teknika të mësimit të makinës për detektimin e smells dhe raportuan performancë shumë të lartë, në disa raste mbi 95% saktësi. Ky punim u bë referenca kryesore e fushës dhe motivoi një varg studimesh pasuese.</w:t>
+        <w:t>Arcelli Fontana et al. (2016) krahasuan gjashtëmbëdhjetë algoritme të mësimit të makinës mbi katër smells dhe raportuan performancë të lartë për të gjitha në validimin e kryqëzuar, me J48 dhe Random Forest si më të mirat. Ky punim u bë referenca kryesore e fushës dhe motivoi një varg studimesh pasuese.</w:t>
       </w:r>
     </w:p>
     <w:p>
@@ -2692,7 +2692,7 @@
           <w:caps w:val="0"/>
           <w:sz w:val="24"/>
         </w:rPr>
-        <w:t>Megjithatë, Di Nucci et al. (2018) e riekzaminuan atë rezultat dhe treguan se ai varej fuqishëm nga mënyra si ishte ndërtuar dataset-i. Kur bashkësia e testimit u ndërtua në mënyrë më realiste, performanca ra ndjeshëm. Përfundimi i tyre është se rezultatet e raportuara në literaturë duhen lexuar me kujdes ndaj procedurës së ndarjes së të dhënave, jo vetëm ndaj algoritmit.</w:t>
+        <w:t>Megjithatë, Di Nucci et al. (2018) vunë re se në atë studim çdo dataset përmbante raste të një lloji të vetëm smell-i. E përsëritën eksperimentin me dataset-e ku bashkëjetojnë disa lloje smells, dhe në këtë konfigurim më realist teknikat e mësimit të makinës shfaqën kufizime kritike. Rrjedhimisht, një rezultat i raportuar varet nga mënyra si ndërtohet bashkësia e vlerësimit, jo vetëm nga algoritmi.</w:t>
       </w:r>
     </w:p>
     <w:p>
@@ -2708,7 +2708,7 @@
           <w:caps w:val="0"/>
           <w:sz w:val="24"/>
         </w:rPr>
-        <w:t>Ky vëzhgim ka pasojë të drejtpërdrejtë metodologjike për këtë punim dhe përcakton njërën nga zgjedhjet e tij qendrore: ndarja mes trajnimit dhe testimit bëhet e grupuar sipas depos, kurrë e rastësishme sipas rreshtave. Mostrat e së njëjtës depo ndajnë autorë, konvencione dhe shpesh kod të kopjuar; një ndarje e rastësishme i vendos ato në të dyja anët dhe e fryn çdo shifër.</w:t>
+        <w:t>I njëjti kujdes ndaj ndërtimit të të dhënave përcakton njërën nga zgjedhjet qendrore të këtij punimi: ndarja mes trajnimit dhe testimit bëhet e grupuar sipas depos, kurrë e rastësishme sipas rreshtave. Mostrat e së njëjtës depo ndajnë autorë, konvencione dhe shpesh kod të kopjuar; një ndarje e rastësishme i vendos ato në të dyja anët dhe e fryn çdo shifër.</w:t>
       </w:r>
     </w:p>
     <w:p>
@@ -2724,7 +2724,7 @@
           <w:caps w:val="0"/>
           <w:sz w:val="24"/>
         </w:rPr>
-        <w:t>Azeem et al. (2019) ofrojnë një shqyrtim sistematik dhe meta-analizë të kësaj nënfushe, duke identifikuar mungesën e dataset-eve të përbashkëta si pengesën kryesore për krahasueshmëri.</w:t>
+        <w:t>Azeem et al. (2019), në një shqyrtim sistematik dhe meta-analizë, gjetën vetëm pesëmbëdhjetë studime që përdorin mësimin e makinës për detektimin e smells, nga një bashkësi fillestare prej më shumë se dy mijë punimesh, dhe përfundojnë se në këtë nënfushë ka ende hapësirë për përmirësim.</w:t>
       </w:r>
     </w:p>
     <w:p>
@@ -2754,7 +2754,7 @@
           <w:caps w:val="0"/>
           <w:sz w:val="24"/>
         </w:rPr>
-        <w:t>Çdo vlerësim i detektimit kërkon një të vërtetë bazë, dhe këtu literatura has një problem themelor. Mäntylä &amp; Lassenius (2006) treguan eksperimentalisht se vlerësimi i zhvilluesve për praninë e një smell është subjektiv dhe se mospajtimi mes tyre është i konsiderueshëm.</w:t>
+        <w:t>Çdo vlerësim i detektimit kërkon një të vërtetë bazë, dhe këtu literatura has një problem themelor. Mäntylä &amp; Lassenius (2006) treguan në një studim empirik se vlerësimi i zhvilluesve për praninë e një smell është subjektiv dhe se mospajtimi mes tyre është i konsiderueshëm.</w:t>
       </w:r>
     </w:p>
     <w:p>
@@ -2816,7 +2816,7 @@
           <w:caps w:val="0"/>
           <w:sz w:val="24"/>
         </w:rPr>
-        <w:t>Tsantalis &amp; Chatzigeorgiou (2009) propozuan një metodë për identifikimin e mundësive të Move Method, duke treguar se identifikimi i mundësisë dhe aplikimi i saj janë probleme të ndara me vështirësi të ndryshme.</w:t>
+        <w:t>Tsantalis &amp; Chatzigeorgiou (2009) propozuan një metodë për identifikimin e mundësive të Move Method si zgjidhje për Feature Envy: një algoritëm i bazuar te distanca mes entiteteve dhe klasave nxjerr refaktorime që ruajnë sjelljen pas kontrollit të një bashkësie parakushtesh, ndërsa vendimi përfundimtar i mbetet projektuesit.</w:t>
       </w:r>
     </w:p>
     <w:p>
@@ -2832,7 +2832,7 @@
           <w:caps w:val="0"/>
           <w:sz w:val="24"/>
         </w:rPr>
-        <w:t>Murphy-Hill et al. (2012) matën si i përdorin zhvilluesit mjetet e refaktorimit dhe gjetën se shumica e refaktorimeve bëhen me dorë, edhe kur mjeti i automatizuar është i disponueshëm. Silva et al. (2016) pyetën zhvilluesit pse refaktorojnë dhe gjetën se motivet janë kryesisht praktike, të lidhura me një ndryshim konkret që duhet bërë.</w:t>
+        <w:t>Murphy-Hill et al. (2012), mbi të dhëna nga më shumë se trembëdhjetë mijë zhvillues, gjetën se refaktorimi ndërthuret shpesh me ndryshime të tjera dhe rrallë shënohet në mesazhet e commit-eve, çka e vështirëson matjen e tij nga historiku. Silva et al. (2016) pyetën zhvilluesit pse refaktorojnë dhe gjetën se motivet janë kryesisht praktike, të lidhura me një ndryshim konkret që duhet bërë.</w:t>
       </w:r>
     </w:p>
     <w:p>
@@ -2862,7 +2862,7 @@
           <w:caps w:val="0"/>
           <w:sz w:val="24"/>
         </w:rPr>
-        <w:t>Nga sa më sipër dalin tri vërejtje. E para: qasja me rregulla dhe ajo me mësim makine rrallë vlerësohen mbi të njëjtën të vërtetë bazë me të njëjtat metrika, çka e bën krahasimin e drejtpërdrejtë të vështirë. E dyta: rezultatet e raportuara për mësimin e makinës janë të ndjeshme ndaj procedurës së ndarjes, dhe jo çdo punim e deklaron atë qartë. E treta: detektimi dhe refaktorimi trajtohen zakonisht si probleme të ndara, ndaj pyetja nëse një smell i detektuar mund edhe të rregullohet automatikisht mbetet pa përgjigje empirike.</w:t>
+        <w:t>Nga sa më sipër dalin tri vërejtje. E para: qasja me rregulla dhe ajo me mësim makine rrallë vlerësohen mbi të njëjtën të vërtetë bazë me të njëjtat metrika, çka e bën krahasimin e drejtpërdrejtë të vështirë. E dyta: rezultatet e raportuara për mësimin e makinës janë të ndjeshme ndaj mënyrës si ndërtohen dhe ndahen të dhënat e vlerësimit, dhe jo çdo punim e deklaron atë qartë. E treta: detektimi dhe refaktorimi trajtohen zakonisht si probleme të ndara, ndaj pyetja nëse një smell i detektuar mund edhe të rregullohet automatikisht mbetet pa përgjigje empirike.</w:t>
       </w:r>
     </w:p>
     <w:p>
@@ -2943,7 +2943,7 @@
           <w:caps w:val="0"/>
           <w:sz w:val="24"/>
         </w:rPr>
-        <w:t xml:space="preserve"> Identifikimi manual nuk shkallëzohet dhe varet nga shqyrtuesi (Nënkapitulli 1.2). Mjetet ekzistuese mbështeten në pragje fikse mbi metrika të veçuara dhe ndalen te njoftimi. Qasjet me rregulla dhe ato me mësim makine rrallë vlerësohen mbi të njëjtën të vërtetë bazë, dhe pyetja nëse një erë e detektuar mund edhe të ndreqet automatikisht mbetet pa përgjigje empirike (Nënkapitulli 2.6).</w:t>
+        <w:t xml:space="preserve"> Identifikimi manual nuk shkallëzohet dhe varet nga shqyrtuesi (Nënkapitulli 1.2). Mjetet ekzistuese mbështeten kryesisht në pragje fikse të kalibruara gjetiu dhe rrallë shkojnë përtej njoftimit. Qasjet me rregulla dhe ato me mësim makine rrallë vlerësohen mbi të njëjtën të vërtetë bazë, dhe pyetja nëse një erë e detektuar mund edhe të ndreqet automatikisht mbetet pa përgjigje empirike (Nënkapitulli 2.6).</w:t>
       </w:r>
     </w:p>
     <w:p>

</xml_diff>

<commit_message>
Ndreq atribuimin te 4.4 dhe drejtimin e ashpersise te 5.1
</commit_message>
<xml_diff>
--- a/docs/thesis/Punim_Diplome_Florent_Latifi.docx
+++ b/docs/thesis/Punim_Diplome_Florent_Latifi.docx
@@ -3515,7 +3515,7 @@
           <w:caps w:val="0"/>
           <w:sz w:val="24"/>
         </w:rPr>
-        <w:t>Ndarja bëhet me GroupKFold sipas depos, siç e kërkon vërejtja e Di Nucci et al. (2018). Parashikimet janë jashtë fold-it: çdo mostër parashikohet saktësisht një herë, nga një model që nuk e ka parë kurrë projektin e saj. Kjo jep të njëjtën formë që prodhojnë detektorët, ndaj dy qasjet krahasohen mostër për mostër.</w:t>
+        <w:t>Ndarja bëhet me GroupKFold sipas depos, që mostrat e një projekti të mos jenë njëherësh në trajnim dhe në testim (Nënkapitulli 2.3). Parashikimet janë jashtë fold-it: çdo mostër parashikohet saktësisht një herë, nga një model që nuk e ka parë kurrë projektin e saj. Kjo jep të njëjtën formë që prodhojnë detektorët, ndaj dy qasjet krahasohen mostër për mostër.</w:t>
       </w:r>
     </w:p>
     <w:p>
@@ -4937,7 +4937,7 @@
           <w:caps w:val="0"/>
           <w:sz w:val="24"/>
         </w:rPr>
-        <w:t>Modeli është i njëjtë kudo: precizion i lartë dhe recall i ulët. Kur strategjitë ndezin kanë kryesisht të drejtë, por i humbin shumicën e rasteve.</w:t>
+        <w:t>Te çdo erë precizioni është shumë mbi recall-in: kur strategjitë ndezin, kanë më shpesh të drejtë sesa gabim, por i humbin shumicën e rasteve.</w:t>
       </w:r>
     </w:p>
     <w:p>
@@ -5409,7 +5409,7 @@
           <w:caps w:val="0"/>
           <w:sz w:val="24"/>
         </w:rPr>
-        <w:t>Detektorët degradojnë me hijeshi: i kapin rastet e rënda dukshëm më mirë se ato të lehtat. Kjo është shifra që një F1 i vetëm e fsheh.</w:t>
+        <w:t>Te 3 nga 4 erërat, strategjia e botuar i kap rastet major më shpesh se ato minor; për Blob ndodh e kundërta. Një F1 i vetëm e fsheh këtë ndarje.</w:t>
       </w:r>
     </w:p>
     <w:p>

</xml_diff>

<commit_message>
Lexo nga rezultatet shifrat qe ishin shtypur gabim me dore
</commit_message>
<xml_diff>
--- a/docs/thesis/Punim_Diplome_Florent_Latifi.docx
+++ b/docs/thesis/Punim_Diplome_Florent_Latifi.docx
@@ -568,7 +568,7 @@
           <w:caps w:val="0"/>
           <w:sz w:val="24"/>
         </w:rPr>
-        <w:t>Ky punim ndërton një sistem që i zbulon code smells në dy mënyra të pavarura dhe i krahason mbi të njëjtën të vërtetë bazë. Qasja e parë zbaton strategjitë e publikuara të detektimit mbi 26 metrika; e dyta trajnon klasifikues mbi po ato metrika. Të dyja vlerësohen mbi 4 534 mostra nga 522 depo Java, të etiketuara nga zhvillues profesionistë, me ndarje të grupuar sipas depos dhe me të njëjtin kod pikëzimi. Sistemi përfshin edhe një motor refaktorimi që rishkruan kod vetëm kur i provon parakushtet e veta nga pema sintaksore, dhe një ndërfaqe web mbi të tria.</w:t>
+        <w:t>Ky punim ndërton një sistem që i zbulon code smells në dy mënyra të pavarura dhe i krahason mbi të njëjtën të vërtetë bazë. Qasja e parë zbaton strategjitë e publikuara të detektimit mbi 26 metrika; e dyta trajnon klasifikues mbi po ato metrika. Të dyja vlerësohen mbi 4 534 mostra nga 512 depo Java, të etiketuara nga zhvillues profesionistë, me ndarje të grupuar sipas depos dhe me të njëjtin kod pikëzimi. Sistemi përfshin edhe një motor refaktorimi që rishkruan kod vetëm kur i provon parakushtet e veta nga pema sintaksore, dhe një ndërfaqe web mbi të tria.</w:t>
       </w:r>
     </w:p>
     <w:p>
@@ -3375,7 +3375,7 @@
           <w:caps w:val="0"/>
           <w:sz w:val="24"/>
         </w:rPr>
-        <w:t>Rreshtat e kodit numërohen sipas kornizës së Park (1992): rreshtat bosh, komentet dhe rreshtat që përmbajnë vetëm një kllapë nuk janë pohime dhe nuk numërohen. Ky përkufizim ka një implementim të vetëm në kod, sepse dy implementime devijuan në heshtje njëherë dhe defekti u zbulua vetëm kur u krahasuan.</w:t>
+        <w:t>Rreshtat e kodit numërohen si rreshta logjikë, sipas dallimit që bën Park (1992) mes rreshtave fizikë dhe logjikë: rreshtat bosh, komentet dhe rreshtat me vetëm shenja ndarëse, si «}» ose «});», nuk janë pohime dhe nuk numërohen. Ky përkufizim ka një implementim të vetëm në kod, sepse dy implementime devijuan në heshtje njëherë dhe defekti u zbulua vetëm kur u krahasuan.</w:t>
       </w:r>
     </w:p>
     <w:p>
@@ -3609,7 +3609,7 @@
           <w:caps w:val="0"/>
           <w:sz w:val="24"/>
         </w:rPr>
-        <w:t>Rishkrimi bëhet mbi rangje bajtash dhe aplikohet nga fundi para, që offset-et e çdo editimi të mbeten të vlefshme kundrejt tekstit ku u matën. Dy editime që mbivendosen refuzohen, sepse nuk kanë rezultat të përcaktuar. Puna bëhet mbi bajta e jo mbi karaktere, sepse Java-ja është UTF-8 dhe prerja sipas indeksit të karakterit e pret një sekuencë shumë-bajtëshe në mes.</w:t>
+        <w:t>Rishkrimi bëhet mbi rangje bajtash dhe aplikohet nga fundi para, që offset-et e çdo editimi të mbeten të vlefshme kundrejt tekstit ku u matën. Dy editime që mbivendosen refuzohen, sepse nuk kanë rezultat të përcaktuar. Puna bëhet mbi bajta e jo mbi karaktere, sepse tree-sitter i jep pozicionet në bajta të tekstit UTF-8, dhe prerja sipas indeksit të karakterit do ta priste në mes një shkronjë si «ë», që zë dy bajta.</w:t>
       </w:r>
     </w:p>
     <w:p>
@@ -3625,7 +3625,7 @@
           <w:caps w:val="0"/>
           <w:sz w:val="24"/>
         </w:rPr>
-        <w:t>Verifikimi bëhet në tri nivele. U mat se vetëm 8% e skedarëve të korpusit kompilojnë të vetëm, sepse pjesa tjetër importon fqinjët e vet; këmbëngulja te një kompilim i pastër do të linte 92% të korpusit të paverifikueshëm. Prandaj kontrollohet së pari nëse skedari i rishkruar parsohet, pastaj nëse shton lloj të ri gabimi kompilimi, dhe së fundi — ku është e mundur — nëse kompilon.</w:t>
+        <w:t>Verifikimi bëhet në tri nivele, sepse një skedar i një depoje reale importon fqinjët e vet dhe rrallë kompilon i vetëm: nga 3633 rishkrime të aplikuara, vetëm 13 kompiluan plotësisht të izoluara. Prandaj kontrollohet së pari nëse skedari i rishkruar parsohet, pastaj nëse shton lloj të ri gabimi kompilimi, dhe së fundi — ku është e mundur — nëse kompilon.</w:t>
       </w:r>
     </w:p>
     <w:p>
@@ -3855,7 +3855,7 @@
           <w:caps w:val="0"/>
           <w:sz w:val="24"/>
         </w:rPr>
-        <w:t>Pajtimi mes dy qasjeve matet me koeficientin kappa (Cohen, 1960) dhe jo me pajtimin e papërpunuar. Kur 78% e etiketave janë negative, dy detektorë që të dy ndezin rrallë pajtohen mbi nëntë të dhjetat e bashkësisë pa mësuar asgjë nga njëri-tjetri; kappa e heq atë pajtim që pritet nga rastësia. Krahas saj raportohen të katër qelizat, sepse pyetja e punimit nuk është sa shpesh pajtohen, por çfarë kap secila vetëm.</w:t>
+        <w:t>Pajtimi mes dy qasjeve matet me koeficientin kappa (Cohen, 1960) dhe jo me pajtimin e papërpunuar. Kur 82% e etiketave janë negative, dy detektorë që të dy ndezin rrallë pajtohen mbi nëntë të dhjetat e bashkësisë pa mësuar asgjë nga njëri-tjetri; kappa e heq atë pajtim që pritet nga rastësia. Krahas saj raportohen të katër qelizat, sepse pyetja e punimit nuk është sa shpesh pajtohen, por çfarë kap secila vetëm.</w:t>
       </w:r>
     </w:p>
     <w:p>
@@ -3997,7 +3997,7 @@
           <w:caps w:val="0"/>
           <w:sz w:val="24"/>
         </w:rPr>
-        <w:t>Kalimi i shtrenjtë mbi korpusin — rreth 95 minuta për 690 mijë skedarë — bëhet një herë dhe prodhon një tabelë veçorish që komitohet. Pragjet nuk hyjnë në atë kalim, ndaj analiza e ndjeshmërisë rirendit detektorët mbi rreshtat e ruajtur në sekonda. Pa këtë ndarje, një fshirje me njëzet konfigurime do të kushtonte mbi tridhjetë orë dhe nuk do të bëhej.</w:t>
+        <w:t>Kalimi i shtrenjtë mbi korpusin, 56 minuta për 690 mijë skedarë në matjen e fundit, bëhet një herë dhe prodhon një tabelë veçorish që komitohet. Pragjet nuk hyjnë në atë kalim, ndaj analiza e ndjeshmërisë rirendit detektorët mbi rreshtat e ruajtur në sekonda. Pa këtë ndarje, një fshirje me njëzet konfigurime do të kushtonte mbi tetëmbëdhjetë orë dhe nuk do të bëhej.</w:t>
       </w:r>
     </w:p>
     <w:p>
@@ -4090,7 +4090,23 @@
           <w:caps w:val="0"/>
           <w:sz w:val="24"/>
         </w:rPr>
-        <w:t>Të gjitha shifrat e këtij kapitulli janë prodhuar mbi 4534 mostra nga 522 depo, dhe rigjenerohen me një komandë. Agregimi i etiketave është mesatarja e rrumbullakosur lart, përveç aty ku thuhet ndryshe (Figura 1).</w:t>
+        <w:t>Të gjitha shifrat e këtij kapitulli janë prodhuar mbi 4534 mostra nga 512 depo, dhe rigjenerohen me një komandë. Agregimi i etiketave është mesatarja e rrumbullakosur lart, përveç aty ku thuhet ndryshe.</w:t>
+      </w:r>
+    </w:p>
+    <w:p>
+      <w:pPr>
+        <w:spacing w:line="360" w:lineRule="auto"/>
+        <w:ind w:firstLine="360"/>
+        <w:jc w:val="both"/>
+      </w:pPr>
+      <w:r>
+        <w:rPr>
+          <w:rFonts w:ascii="Times New Roman" w:hAnsi="Times New Roman" w:eastAsia="Times New Roman"/>
+          <w:b w:val="0"/>
+          <w:caps w:val="0"/>
+          <w:sz w:val="24"/>
+        </w:rPr>
+        <w:t>MLCQ-ja përmend 4770 mostra në 522 depo, nga të cilat 10 nuk ishin më të arritshme. Jashtë vlerësimit mbetën 236 mostra: 226 sepse skedari nuk ishte në korpus, dhe 10 sepse entiteti nuk u përputh ose skedari kishte gabim sintakse (Figura 1).</w:t>
       </w:r>
     </w:p>
     <w:p>
@@ -12477,7 +12493,7 @@
           <w:caps w:val="0"/>
           <w:sz w:val="24"/>
         </w:rPr>
-        <w:t>Gjetja më e qëndrueshme e këtij punimi është se strategjitë e publikuara të detektimit kanë precizion të lartë dhe recall të ulët. Kur ato ndezin, kanë kryesisht të drejtë; por i humbin shumicën e rasteve që rishikuesit i shënojnë. Për një mjet praktik kjo nuk është domosdoshmërisht e keqe: një sinjal i rrallë por i besueshëm konsumohet më lehtë se një listë e gjatë me alarme false.</w:t>
+        <w:t>Gjetja më e qëndrueshme e këtij punimi është se te strategjitë e publikuara precizioni është shumë mbi recall-in. Kur ndezin, kanë më shpesh të drejtë sesa gabim, por i humbin shumicën e rasteve që rishikuesit i shënojnë. Për një mjet praktik kjo nuk është domosdoshmërisht e keqe: një sinjal i rrallë por i besueshëm konsumohet më lehtë se një listë e gjatë me alarme false.</w:t>
       </w:r>
     </w:p>
     <w:p>
@@ -12509,7 +12525,7 @@
           <w:caps w:val="0"/>
           <w:sz w:val="24"/>
         </w:rPr>
-        <w:t>Modelet e mësimit të makinës e tejkalojnë qartë qasjen me rregulla në çdo erë. Por krahasimi qelizë për qelizë tregon se ato nuk e zëvendësojnë atë plotësisht: te Feature Envy rregulli kap raste që modeli i humb, dhe kjo është e vetmja erë ku bashkimi i dy qasjeve do të kishte kuptim praktik.</w:t>
+        <w:t>Modelet e mësimit të makinës e tejkalojnë qartë qasjen me rregulla në çdo erë. Te Feature Envy rregulli kap raste që modeli i humb, por bashkimi i dy qasjeve nuk e ngre MCC-në as atje (Nënkapitulli 5.3). Vlerë praktike ka prerja: kur të dyja pajtohen, precizioni del mbi secilën qasje veç.</w:t>
       </w:r>
     </w:p>
     <w:p>

</xml_diff>

<commit_message>
Shkruaj VD-126 dhe perditeso punimin
</commit_message>
<xml_diff>
--- a/docs/thesis/Punim_Diplome_Florent_Latifi.docx
+++ b/docs/thesis/Punim_Diplome_Florent_Latifi.docx
@@ -3218,6 +3218,22 @@
           <w:sz w:val="24"/>
         </w:rPr>
         <w:t>ml dhe refactor: Qasja B dhe Qasja C. Të dyja përdorin daljen e detektorëve dhe modelin, por nuk importojnë njëra-tjetrën.</w:t>
+      </w:r>
+    </w:p>
+    <w:p>
+      <w:pPr>
+        <w:pStyle w:val="ListBullet"/>
+        <w:spacing w:line="360" w:lineRule="auto"/>
+        <w:jc w:val="both"/>
+      </w:pPr>
+      <w:r>
+        <w:rPr>
+          <w:rFonts w:ascii="Times New Roman" w:hAnsi="Times New Roman" w:eastAsia="Times New Roman"/>
+          <w:b w:val="0"/>
+          <w:caps w:val="0"/>
+          <w:sz w:val="24"/>
+        </w:rPr>
+        <w:t>projects: materializon te disku një depo publike të GitHub-ut, që analiza të mos kërkojë një kopje të shkarkuar më parë.</w:t>
       </w:r>
     </w:p>
     <w:p>
@@ -4733,7 +4749,7 @@
           <w:caps w:val="0"/>
           <w:sz w:val="24"/>
         </w:rPr>
-        <w:t>Shërbimi HTTP ofron nëntë pika hyrjeje. /health jep gjendjen, /analyze analizon një projekt ose skedar, /metrics jep metrikat e një entiteti dhe /source kodin e tij. Pesë të tjera janë nën /refactor: pamja paraprake e një rishkrimi (preview), diff-i i të gjitha rishkrimeve të verifikuara (patch, edhe si rrjedhë progresi), pyetja nëse shkrimi lejohet (tree) dhe shkrimi në disk (apply). Çdo pikë e validon kërkesën, thërret të njëjtat funksione si rreshti i komandës dhe e kthen përgjigjen si JSON.</w:t>
+        <w:t>Shërbimi HTTP ofron njëmbëdhjetë pika hyrjeje. /health jep gjendjen, /analyze analizon një projekt ose skedar, /metrics jep metrikat e një entiteti, /source kodin e tij, /browse nënndosjet e një shtegu dhe /projects/github importon një depo publike. Pesë të tjera janë nën /refactor: pamja paraprake e një rishkrimi (preview), diff-i i të gjitha rishkrimeve të verifikuara (patch, edhe si rrjedhë progresi), pyetja nëse shkrimi lejohet (tree) dhe shkrimi në disk (apply). Çdo pikë e validon kërkesën, thërret të njëjtat funksione si rreshti i komandës dhe e kthen përgjigjen si JSON.</w:t>
       </w:r>
     </w:p>
     <w:p>
@@ -4749,7 +4765,23 @@
           <w:caps w:val="0"/>
           <w:sz w:val="24"/>
         </w:rPr>
-        <w:t>Aplikacioni ka një përdorues dhe dëgjon vetëm në localhost, ndaj rreziqet që mbrohen nuk janë autentikimi, por shtegu dhe burimet. Shtegu që dërgon përdoruesi kanonizohet dhe pranohet vetëm nëse bie brenda një rrënje të lejuar, edhe pasi ndiqen lidhjet simbolike. Një analizë ka kufij për numrin e skedarëve, madhësinë totale dhe kohën. Gabimet kthehen me mesazh dhe kod, pa gjurmë të brendshme dhe pa shtigje absolute.</w:t>
+        <w:t>Aplikacioni ka një përdorues dhe dëgjon vetëm në localhost, ndaj rreziqet që mbrohen nuk janë autentikimi, por shtegu dhe burimet. Shtegu që dërgon përdoruesi kanonizohet dhe pranohet vetëm nëse bie brenda një rrënje të lejuar, edhe pasi ndiqen lidhjet simbolike; rrënjët janë dosja e zgjedhur dhe ajo e depove të importuara. Një analizë ka kufij për numrin e skedarëve, madhësinë totale dhe kohën. Gabimet kthehen me mesazh dhe kod, pa gjurmë të brendshme dhe pa shtigje absolute.</w:t>
+      </w:r>
+    </w:p>
+    <w:p>
+      <w:pPr>
+        <w:spacing w:line="360" w:lineRule="auto"/>
+        <w:ind w:firstLine="360"/>
+        <w:jc w:val="both"/>
+      </w:pPr>
+      <w:r>
+        <w:rPr>
+          <w:rFonts w:ascii="Times New Roman" w:hAnsi="Times New Roman" w:eastAsia="Times New Roman"/>
+          <w:b w:val="0"/>
+          <w:caps w:val="0"/>
+          <w:sz w:val="24"/>
+        </w:rPr>
+        <w:t>Importi nga GitHub shkarkon arkivin e një depoje publike dhe shkruan vetëm anëtarët «.java», me kufij për madhësinë e arkivit e të skedarit, dhe me çdo shteg të kontrolluar se bie brenda dosjes së synuar. Lidhjet me kredenciale refuzohen: importohen vetëm depo publike.</w:t>
       </w:r>
     </w:p>
     <w:p>
@@ -4781,7 +4813,7 @@
           <w:caps w:val="0"/>
           <w:sz w:val="24"/>
         </w:rPr>
-        <w:t>Ndërfaqja është aplikacion React me TypeScript. Përdoruesi shkruan shtegun e projektit dhe, sipas dëshirës, kërkon edhe verdiktin e modelit. Paneli tregon përmbledhjen sipas erës, të dy qasjet përballë njëra-tjetrës dhe gjetjet sipas skedarit. Për secilën gjetje shfaqen kushtet me vlerat e matura, shpjegimi i modelit, dhe diff-i i rishkrimit ose arsyeja e refuzimit në gjuhë të kuptueshme. Pas shkrimit në disk, ndërfaqja tregon cilat erëra u hoqën dhe cilat lindën.</w:t>
+        <w:t>Ndërfaqja është aplikacion React me TypeScript. Projekti zgjidhet duke shfletuar dosjet brenda rrënjëve të lejuara, ose duke importuar një depo, dhe përdoruesi, sipas dëshirës, kërkon edhe verdiktin e modelit. Paneli tregon përmbledhjen sipas erës, të dy qasjet përballë njëra-tjetrës dhe gjetjet sipas skedarit. Për secilën gjetje shfaqen kushtet me vlerat e matura, shpjegimi i modelit, dhe diff-i i rishkrimit ose arsyeja e refuzimit në gjuhë të kuptueshme. Pas shkrimit në disk, ndërfaqja tregon cilat erëra u hoqën dhe cilat lindën.</w:t>
       </w:r>
     </w:p>
     <w:p>
@@ -5001,7 +5033,7 @@
           <w:caps w:val="0"/>
           <w:sz w:val="24"/>
         </w:rPr>
-        <w:t>Rregulli kryesor i testimit është se asnjë prag, metrikë apo detektor nuk ndryshohet që të kalojë një test. Kur kodi dhe testi nuk pajtohen, gjendet më parë cili prej tyre është i gabuar. Në verifikimin e fundit, më 17 shtator 2026, kaluan 593 teste të backend-it, me mbulim 96% të kodit, dhe 147 teste të ndërfaqes.</w:t>
+        <w:t>Rregulli kryesor i testimit është se asnjë prag, metrikë apo detektor nuk ndryshohet që të kalojë një test. Kur kodi dhe testi nuk pajtohen, gjendet më parë cili prej tyre është i gabuar. Në verifikimin e fundit, më 18 shtator 2026, kaluan 645 teste të backend-it, me mbulim 96% të kodit, dhe 159 teste të ndërfaqes.</w:t>
       </w:r>
     </w:p>
     <w:p>
@@ -20573,7 +20605,7 @@
                 <w:caps w:val="0"/>
                 <w:sz w:val="22"/>
               </w:rPr>
-              <w:t>figurat e Kapitullit 5</w:t>
+              <w:t>figurat e Kapitujve 4 dhe 5</w:t>
             </w:r>
           </w:p>
         </w:tc>

</xml_diff>

<commit_message>
Shkruaj VD-127 dhe perditeso dokumentimin
</commit_message>
<xml_diff>
--- a/docs/thesis/Punim_Diplome_Florent_Latifi.docx
+++ b/docs/thesis/Punim_Diplome_Florent_Latifi.docx
@@ -4765,7 +4765,7 @@
           <w:caps w:val="0"/>
           <w:sz w:val="24"/>
         </w:rPr>
-        <w:t>Aplikacioni ka një përdorues dhe dëgjon vetëm në localhost, ndaj rreziqet që mbrohen nuk janë autentikimi, por shtegu dhe burimet. Shtegu që dërgon përdoruesi kanonizohet dhe pranohet vetëm nëse bie brenda një rrënje të lejuar, edhe pasi ndiqen lidhjet simbolike; rrënjët janë dosja e zgjedhur dhe ajo e depove të importuara. Një analizë ka kufij për numrin e skedarëve, madhësinë totale dhe kohën. Gabimet kthehen me mesazh dhe kod, pa gjurmë të brendshme dhe pa shtigje absolute.</w:t>
+        <w:t>Aplikacioni ka një përdorues dhe dëgjon vetëm në localhost, ndaj rreziqet që mbrohen nuk janë autentikimi, por shtegu dhe burimet. Shtegu që dërgon përdoruesi kanonizohet dhe pranohet vetëm nëse bie brenda një rrënje të lejuar, edhe pasi ndiqen lidhjet simbolike; rrënjët janë dosja e zgjedhur dhe ajo e depove të importuara. Një analizë ka kufij për numrin e skedarëve, madhësinë totale dhe kohën. Gabimet kthehen me mesazh dhe kod, pa gjurmë të brendshme dhe pa shtigje absolute. Meqë çdo faqe që hap përdoruesi e arrin localhost-in përmes shfletuesit të tij, çdo kërkesë kalon një roje: pranohen vetëm emra lokalë te koka Host, që e ndal DNS rebinding, asnjë POST nga një origjinë e huaj, dhe ndërfaqja nuk lejohet të mbështillet në një faqe tjetër. /source lexon vetëm skedarë «.java».</w:t>
       </w:r>
     </w:p>
     <w:p>
@@ -4781,7 +4781,7 @@
           <w:caps w:val="0"/>
           <w:sz w:val="24"/>
         </w:rPr>
-        <w:t>Importi nga GitHub shkarkon arkivin e një depoje publike dhe shkruan vetëm anëtarët «.java», me kufij për madhësinë e arkivit e të skedarit, dhe me çdo shteg të kontrolluar se bie brenda dosjes së synuar. Lidhjet me kredenciale refuzohen: importohen vetëm depo publike.</w:t>
+        <w:t>Importi nga GitHub shkarkon arkivin e një depoje publike dhe shkruan vetëm anëtarët «.java», me kufij madhësie dhe me çdo shteg të kontrolluar se bie brenda dosjes së synuar; importohen vetëm depo publike.</w:t>
       </w:r>
     </w:p>
     <w:p>
@@ -4813,7 +4813,7 @@
           <w:caps w:val="0"/>
           <w:sz w:val="24"/>
         </w:rPr>
-        <w:t>Ndërfaqja është aplikacion React me TypeScript. Projekti zgjidhet duke shfletuar dosjet brenda rrënjëve të lejuara, ose duke importuar një depo, dhe përdoruesi, sipas dëshirës, kërkon edhe verdiktin e modelit. Paneli tregon përmbledhjen sipas erës, të dy qasjet përballë njëra-tjetrës dhe gjetjet sipas skedarit. Për secilën gjetje shfaqen kushtet me vlerat e matura, shpjegimi i modelit, dhe diff-i i rishkrimit ose arsyeja e refuzimit në gjuhë të kuptueshme. Pas shkrimit në disk, ndërfaqja tregon cilat erëra u hoqën dhe cilat lindën.</w:t>
+        <w:t>Ndërfaqja është aplikacion React me TypeScript, e ndërtuar një herë dhe e shërbyer nga i njëjti proces si API-ja. Projekti zgjidhet duke shfletuar dosjet brenda rrënjëve të lejuara, ose duke importuar një depo, dhe përdoruesi, sipas dëshirës, kërkon edhe verdiktin e modelit. Paneli tregon përmbledhjen sipas erës, të dy qasjet përballë njëra-tjetrës dhe gjetjet sipas skedarit. Për secilën gjetje shfaqen kushtet me vlerat e matura, shpjegimi i modelit, dhe diff-i i rishkrimit ose arsyeja e refuzimit në gjuhë të kuptueshme. Pas shkrimit në disk, ndërfaqja tregon cilat erëra u hoqën dhe cilat lindën.</w:t>
       </w:r>
     </w:p>
     <w:p>
@@ -5033,7 +5033,7 @@
           <w:caps w:val="0"/>
           <w:sz w:val="24"/>
         </w:rPr>
-        <w:t>Rregulli kryesor i testimit është se asnjë prag, metrikë apo detektor nuk ndryshohet që të kalojë një test. Kur kodi dhe testi nuk pajtohen, gjendet më parë cili prej tyre është i gabuar. Në verifikimin e fundit, më 18 shtator 2026, kaluan 645 teste të backend-it, me mbulim 96% të kodit, dhe 159 teste të ndërfaqes.</w:t>
+        <w:t>Rregulli kryesor i testimit është se asnjë prag, metrikë apo detektor nuk ndryshohet që të kalojë një test. Kur kodi dhe testi nuk pajtohen, gjendet më parë cili prej tyre është i gabuar. Në verifikimin e fundit, më 18 shtator 2026, kaluan 688 teste të backend-it, me mbulim 96% të kodit, dhe 163 teste të ndërfaqes.</w:t>
       </w:r>
     </w:p>
     <w:p>

</xml_diff>

<commit_message>
Hiq perseritjet nga punimi
</commit_message>
<xml_diff>
--- a/docs/thesis/Punim_Diplome_Florent_Latifi.docx
+++ b/docs/thesis/Punim_Diplome_Florent_Latifi.docx
@@ -2085,7 +2085,7 @@
           <w:caps w:val="0"/>
           <w:sz w:val="24"/>
         </w:rPr>
-        <w:t>Mjetet e analizës statike e automatizojnë pjesërisht këtë punë, por problemi mbetet i hapur në tri drejtime. Së pari, strategjitë që kombinojnë metrika, si ato të Lanza &amp; Marinescu (2006), përdorin pragje fikse të nxjerra nga një korpus tjetër, dhe rrallë dihet sa pajtohen ato me gjykimin e zhvilluesve. Së dyti, detektimi me mësim makine premton më shumë, por rezultatet e tij varen fort nga mënyra si ndërtohen dhe ndahen të dhënat, dhe rrallë krahasohet me rregullat mbi të njëjtën të vërtetë bazë. Së treti, shumica e mjeteve ndalen te njoftimi: e thonë çfarë është e gabuar, por jo çfarë duhet bërë. Qasjet që propozojnë edhe refaktorimin, si ajo e Tsantalis &amp; Chatzigeorgiou (2009) për Move Method, janë më të rralla dhe mbulojnë vetëm disa raste.</w:t>
+        <w:t>Mjetet e analizës statike e automatizojnë pjesërisht këtë punë, por problemi mbetet i hapur në tri drejtime. Së pari, strategjitë që kombinojnë metrika, si ato të Lanza &amp; Marinescu (2006), përdorin pragje fikse të nxjerra nga një korpus tjetër, dhe rrallë dihet sa pajtohen ato me gjykimin e zhvilluesve. Së dyti, detektimi me mësim makine premton më shumë, por rezultatet e tij varen fort nga mënyra si ndërtohen dhe ndahen të dhënat, dhe rrallë vihet përballë rregullave mbi të njëjtat mostra. Së treti, shumica e mjeteve ndalen te njoftimi: e thonë çfarë është e gabuar, por jo çfarë duhet bërë. Qasjet që propozojnë edhe refaktorimin, si ajo e Tsantalis &amp; Chatzigeorgiou (2009) për Move Method, janë më të rralla dhe mbulojnë vetëm disa raste.</w:t>
       </w:r>
     </w:p>
     <w:p>
@@ -2101,7 +2101,7 @@
           <w:caps w:val="0"/>
           <w:sz w:val="24"/>
         </w:rPr>
-        <w:t>Ky punim e trajton hapësirën mes gjetjes së problemit dhe ndreqjes së tij, për gjuhën Java. Ai ndërton një sistem që i zbulon code smells në dy mënyra, me strategji metrikash dhe me klasifikues të mësuar mbi të njëjtat metrika, i vlerëson të dyja mbi të njëjtin dataset të etiketuar nga zhvillues profesionistë, dhe shton një motor që e rishkruan kodin vetëm kur e provon se transformimi është i sigurt. Kapitulli 2 shqyrton literaturën, Kapitulli 3 shtron problemin dhe pyetjet kërkimore, Kapitulli 4 përshkruan metodologjinë dhe sistemin, Kapitulli 5 paraqet rezultatet, dhe Kapitulli 6 i diskuton ato dhe nxjerr përfundimet.</w:t>
+        <w:t>Ky punim e trajton hapësirën mes gjetjes së problemit dhe ndreqjes së tij, për gjuhën Java. Detektimi bëhet në dy mënyra, me strategji metrikash dhe me klasifikues të mësuar mbi të njëjtat metrika; të dyja vlerësohen mbi të njëjtin dataset të etiketuar nga zhvillues profesionistë, dhe një motor i veçantë e rishkruan kodin vetëm kur e provon se transformimi është i sigurt. Kapitulli 2 shqyrton literaturën, Kapitulli 3 shtron problemin dhe pyetjet kërkimore, Kapitulli 4 përshkruan metodologjinë dhe sistemin, Kapitulli 5 paraqet rezultatet, dhe Kapitulli 6 i diskuton ato dhe nxjerr përfundimet.</w:t>
       </w:r>
     </w:p>
     <w:p>
@@ -2162,7 +2162,7 @@
           <w:caps w:val="0"/>
           <w:sz w:val="24"/>
         </w:rPr>
-        <w:t>Katalogun kanonik e jep Fowler (2018), botimi i dytë i të cilit përshkruan njëzet e katër smells bashkë me refaktorimet që i adresojnë. Përkufizimi mbetet qëllimisht cilësor: një smell është simptomë, jo gabim, dhe gjykimi nëse diçka është problem varet nga konteksti.</w:t>
+        <w:t>Katalogun kanonik e jep Fowler (2018): njëzet e katër smells, secili me refaktorimet që e adresojnë. Përkufizimi mbetet qëllimisht cilësor: një smell është simptomë, jo gabim, dhe gjykimi nëse diçka është problem varet nga konteksti.</w:t>
       </w:r>
     </w:p>
     <w:p>
@@ -2472,7 +2472,7 @@
           <w:caps w:val="0"/>
           <w:sz w:val="24"/>
         </w:rPr>
-        <w:t>Nga sa më sipër dalin tri vërejtje. E para: qasja me rregulla dhe ajo me mësim makine rrallë vlerësohen mbi të njëjtën të vërtetë bazë me të njëjtat metrika, çka e bën krahasimin e drejtpërdrejtë të vështirë. E dyta: rezultatet e raportuara për mësimin e makinës janë të ndjeshme ndaj mënyrës si ndërtohen dhe ndahen të dhënat e vlerësimit, dhe jo çdo punim e deklaron atë qartë. E treta: detektimi dhe refaktorimi trajtohen zakonisht si probleme të ndara, ndaj pyetja nëse një smell i detektuar mund edhe të rregullohet automatikisht mbetet pa përgjigje empirike.</w:t>
+        <w:t>Nga sa më sipër dalin tri vërejtje. E para: qasja me rregulla dhe ajo me mësim makine rrallë vlerësohen mbi të njëjtën të vërtetë bazë me të njëjtat metrika, çka e bën krahasimin e drejtpërdrejtë të vështirë. E dyta: jo çdo punim e deklaron qartë si e ndan bashkësinë e vlerësimit, ndonëse shifra e raportuar varet pikërisht prej saj. E treta: detektimi dhe refaktorimi trajtohen zakonisht si probleme të ndara, ndaj pyetja nëse një smell i detektuar mund edhe të rregullohet automatikisht mbetet pa përgjigje empirike.</w:t>
       </w:r>
     </w:p>
     <w:p>
@@ -2553,7 +2553,7 @@
           <w:caps w:val="0"/>
           <w:sz w:val="24"/>
         </w:rPr>
-        <w:t xml:space="preserve"> Identifikimi manual nuk shkallëzohet dhe varet nga shqyrtuesi (Kapitulli 1). Mjetet ekzistuese mbështeten kryesisht në pragje fikse të kalibruara gjetiu dhe rrallë shkojnë përtej njoftimit. Qasjet me rregulla dhe ato me mësim makine rrallë vlerësohen mbi të njëjtën të vërtetë bazë, dhe pyetja nëse një erë e detektuar mund edhe të ndreqet automatikisht mbetet pa përgjigje empirike (Nënkapitulli 2.6).</w:t>
+        <w:t xml:space="preserve"> Identifikimi manual nuk shkallëzohet, dhe mjetet ekzistuese ndalen zakonisht te njoftimi, me pragje të kalibruara gjetiu (Kapitulli 1). Studimet, nga ana e tyre, rrallë i vënë dy qasjet përballë njëra-tjetrës dhe nuk e matin nëse një erë e gjetur ndreqet edhe vetë (Nënkapitulli 2.6).</w:t>
       </w:r>
     </w:p>
     <w:p>
@@ -2578,7 +2578,7 @@
           <w:caps w:val="0"/>
           <w:sz w:val="24"/>
         </w:rPr>
-        <w:t xml:space="preserve"> Ky punim i krahason dy qasjet e detektimit mbi të njëjtin korpus të etiketuar nga profesionistë, me ndarje sipas depos dhe me të njëjtin kod pikëzimi, dhe mat sa nga vendet e detektuara mund të rishkruhen automatikisht pa sjellë gabime të reja kompilimi.</w:t>
+        <w:t xml:space="preserve"> Ky punim i krahason dy qasjet e detektimit mbi të njëjtin korpus të etiketuar nga profesionistë, me ndarje sipas depos dhe me një kod të përbashkët pikëzimi, dhe mat sa nga vendet e detektuara mund të rishkruhen automatikisht pa sjellë gabime të reja kompilimi.</w:t>
       </w:r>
     </w:p>
     <w:p>
@@ -2782,7 +2782,7 @@
           <w:caps w:val="0"/>
           <w:sz w:val="24"/>
         </w:rPr>
-        <w:t>Të trajnohet dhe vlerësohet një model i mësimit të makinës mbi një dataset të etiketuar nga zhvillues profesionistë, dhe të krahasohet me rregullat.</w:t>
+        <w:t>Të trajnohet dhe vlerësohet një klasifikues mbi të dhënat e etiketuara të MLCQ-së, dhe të krahasohet me rregullat.</w:t>
       </w:r>
     </w:p>
     <w:p>
@@ -2892,7 +2892,7 @@
           <w:caps w:val="0"/>
           <w:sz w:val="24"/>
         </w:rPr>
-        <w:t>Për PK2: krahasim mbi të njëjtat mostra, me të njëjtin kod pikëzimi, dhe me një model bazë që tregon sa merret pa mësuar asgjë.</w:t>
+        <w:t>Për PK2: krahasim mostër për mostër me Qasjen A, bashkë me një model bazë që nuk mëson asgjë, që fitimi të mos ngatërrohet me çekuilibrin.</w:t>
       </w:r>
     </w:p>
     <w:p>
@@ -3069,7 +3069,7 @@
           <w:caps w:val="0"/>
           <w:sz w:val="24"/>
         </w:rPr>
-        <w:t xml:space="preserve"> Tri prej tyre e formësojnë gjithë kapitullin: analizuesi nuk zgjidh simbole, verifikimi nuk ekzekuton testet e projekteve, dhe e vërteta bazë vjen nga një dataset i vetëm. Ato deklarohen te Nënkapitulli 3.4 dhe diskutohen te Nënkapitulli 6.6.</w:t>
+        <w:t xml:space="preserve"> Tri kufizime të deklaruara te Nënkapitulli 3.4 e formësojnë gjithë kapitullin: mungesa e zgjidhjes së simboleve, mungesa e testeve të projekteve dhe mbështetja te një dataset i vetëm. Pesha e tyre mbi rezultatet diskutohet te Nënkapitulli 6.6.</w:t>
       </w:r>
     </w:p>
     <w:p>
@@ -4335,7 +4335,7 @@
           <w:caps w:val="0"/>
           <w:sz w:val="24"/>
         </w:rPr>
-        <w:t>Analizuesi ndërtohet mbi tree-sitter (Brunsfeld et al.), dhe mbi modelin sintaksor që ai prodhon maten shtatëmbëdhjetë metrika klase dhe nëntë metrika metode, me një kalim të vetëm për klasë. Ndër to janë metrikat e Chidamber &amp; Kemerer-it (1994), varianti i normalizuar i LCOM-it i Henderson-Sellers-it (1996), TCC-ja e Bieman &amp; Kang-ut (1995) dhe kompleksiteti ciklomatik (McCabe, 1976), i matur si numri i pikave të vendimit në trupin e metodës plus një. Lista e plotë jepet te Shtojca 8.3.</w:t>
+        <w:t>Analizuesi ndërtohet mbi tree-sitter (Brunsfeld et al.), dhe mbi modelin sintaksor që ai prodhon maten shtatëmbëdhjetë metrika klase dhe nëntë metrika metode, me një kalim të vetëm për klasë. Ndër to janë metrikat e Chidamber &amp; Kemerer-it (1994), varianti i normalizuar i LCOM-it i Henderson-Sellers-it (1996), TCC-ja e Bieman &amp; Kang-ut (1995) dhe kompleksiteti ciklomatik (McCabe, 1976), i matur si numri i pikave të vendimit në trupin e metodës plus një. Të gjitha janë te Shtojca 8.3.</w:t>
       </w:r>
     </w:p>
     <w:p>
@@ -4475,7 +4475,7 @@
           <w:caps w:val="0"/>
           <w:sz w:val="24"/>
         </w:rPr>
-        <w:t>Klasifikuesi i shumicës raportohet si model bazë: mbi një bashkësi ku shumica e etiketave janë negative, ai tregon sa merret pa mësuar asgjë.</w:t>
+        <w:t>Klasifikuesi i shumicës, që parashikon gjithmonë «pa erë», raportohet si model bazë.</w:t>
       </w:r>
     </w:p>
     <w:p>
@@ -4601,7 +4601,7 @@
           <w:caps w:val="0"/>
           <w:sz w:val="24"/>
         </w:rPr>
-        <w:t>Çdo transformim deklaron parakushtet e veta. Nëse ndonjëra prej tyre nuk provohet nga pema e analizës, transformimi kthen «e paaplikueshme» me arsyen përkatëse. Refuzimi është rezultat i saktë dhe numërohet si i tillë, jo si dështim. Te Extract Method, një analizë e rrjedhës së të dhënave kërkon që blloku i nxjerrë të ketë një dalje të vetme, që asnjë return, break ose continue të mos dalë prej tij, dhe që çdo variabël që lexon të jetë e caktuar me siguri.</w:t>
+        <w:t>Çdo transformim deklaron parakushtet e veta. Nëse ndonjëra prej tyre nuk provohet nga pema e analizës, transformimi kthen «e paaplikueshme» me arsyen përkatëse, e cila numërohet si rezultat (Shtojca 8.4). Te Extract Method, një analizë e rrjedhës së të dhënave kërkon që blloku i nxjerrë të ketë një dalje të vetme, që asnjë return, break ose continue të mos dalë prej tij, dhe që çdo variabël që lexon të jetë e caktuar me siguri.</w:t>
       </w:r>
     </w:p>
     <w:p>
@@ -4813,7 +4813,7 @@
           <w:caps w:val="0"/>
           <w:sz w:val="24"/>
         </w:rPr>
-        <w:t>Ndërfaqja është aplikacion React me TypeScript, e ndërtuar një herë dhe e shërbyer nga i njëjti proces si API-ja. Projekti zgjidhet duke shfletuar dosjet brenda rrënjëve të lejuara, ose duke importuar një depo, dhe përdoruesi, sipas dëshirës, kërkon edhe verdiktin e modelit. Paneli tregon përmbledhjen sipas erës, të dy qasjet përballë njëra-tjetrës dhe gjetjet sipas skedarit. Për secilën gjetje shfaqen kushtet me vlerat e matura, shpjegimi i modelit, dhe diff-i i rishkrimit ose arsyeja e refuzimit në gjuhë të kuptueshme. Pas shkrimit në disk, ndërfaqja tregon cilat erëra u hoqën dhe cilat lindën.</w:t>
+        <w:t>Ndërfaqja është aplikacion React me TypeScript, e ndërtuar një herë dhe e shërbyer nga i njëjti proces si API-ja. Projekti zgjidhet duke shfletuar dosjet brenda rrënjëve të lejuara, ose duke importuar një depo, dhe përdoruesi, sipas dëshirës, kërkon edhe verdiktin e modelit. Paneli tregon përmbledhjen sipas erës, krahasimin e dy qasjeve dhe gjetjet sipas skedarit. Për secilën gjetje shfaqen kushtet me vlerat e matura, shpjegimi i modelit, dhe diff-i i rishkrimit ose arsyeja e refuzimit në gjuhë të kuptueshme. Pas shkrimit në disk, ndërfaqja tregon cilat erëra u hoqën dhe cilat lindën.</w:t>
       </w:r>
     </w:p>
     <w:p>
@@ -4859,7 +4859,7 @@
           <w:caps w:val="0"/>
           <w:sz w:val="24"/>
         </w:rPr>
-        <w:t>Mbi këtë përkufizim maten precizioni, recall-i dhe F1-i, bashkë me koeficientin e korrelacionit të Matthews-it (Matthews, 1975), i cili i përfshin të katër qelizat e matricës konfuze. Mbi një bashkësi ku shumica e etiketave janë negative kjo veti është vendimtare: një detektor që nuk ndez kurrë del i papërcaktuar këtu, ndërsa saktësia e përgjithshme do t'i jepte shifër të lartë. Recall-i raportohet edhe i ndarë sipas ashpërsisë që caktuan rishikuesit.</w:t>
+        <w:t>Mbi këtë përkufizim maten precizioni, recall-i dhe F1-i, bashkë me koeficientin e korrelacionit të Matthews-it (Matthews, 1975), i cili i përfshin të katër qelizat e matricës konfuze. Kur shumica e etiketave janë negative, kjo veti është vendimtare: një detektor që nuk ndez kurrë del i papërcaktuar këtu, ndërsa saktësia e përgjithshme do t'i jepte shifër të lartë. Recall-i raportohet edhe i ndarë sipas ashpërsisë që caktuan rishikuesit.</w:t>
       </w:r>
     </w:p>
     <w:p>
@@ -4891,7 +4891,7 @@
           <w:caps w:val="0"/>
           <w:sz w:val="24"/>
         </w:rPr>
-        <w:t>Pasiguria e shifrave matet me intervale besimi bootstrap, ku rimostrohen depot e jo mostrat, që mostrat e një projekti të mbeten bashkë. Pajtimi mes vetë rishikuesve të MLCQ-së matet mbi çdo çift rishikimesh të së njëjtës mostër, dhe jep tavanin kundrejt të cilit lexohen shifrat e detektorëve.</w:t>
+        <w:t>Pasiguria e shifrave matet me intervale besimi bootstrap, ku rimostrohen depo të plota e jo mostra të veçanta, që një projekt të mos ndahet. Pajtimi mes vetë rishikuesve të MLCQ-së matet mbi çdo çift rishikimesh të së njëjtës mostër, dhe jep tavanin kundrejt të cilit lexohen shifrat e detektorëve.</w:t>
       </w:r>
     </w:p>
     <w:p>
@@ -4923,7 +4923,7 @@
           <w:caps w:val="0"/>
           <w:sz w:val="24"/>
         </w:rPr>
-        <w:t>Si krahasim i jashtëm, i njëjti vlerësim i zbatohet PMD-së (PMD Team, 2026), version 7.27.0, rregullat GodClass dhe DataClass të të cilit zbatojnë strategjitë e Lanza &amp; Marinescu (2006). PMD ekzekutohet me pragjet e veta të parazgjedhura, mbi të njëjtat mostra dhe me të njëjtin kod pikëzimi; një shkelje përputhet me entitetin sipas emrit të klasës dhe të metodës. PMD analizon një skedar në një kohë, ndaj ATFD-në e llogarit vetëm brenda skedarit, handikap që e favorizon këtë punim; dhe nuk ka rregull për Feature Envy.</w:t>
+        <w:t>Si krahasim i jashtëm, i njëjti vlerësim i zbatohet PMD-së (PMD Team, 2026), version 7.27.0, rregullat GodClass dhe DataClass të të cilit zbatojnë strategjitë e Lanza &amp; Marinescu (2006). PMD ekzekutohet pa iu prekur pragjet dhe pikëzohet njësoj si Qasja A; një shkelje përputhet me entitetin sipas emrit të klasës dhe të metodës. PMD analizon një skedar në një kohë, ndaj ATFD-në e llogarit vetëm brenda skedarit, handikap që e favorizon këtë punim; dhe nuk ka rregull për Feature Envy.</w:t>
       </w:r>
     </w:p>
     <w:p>
@@ -5288,7 +5288,7 @@
           <w:caps w:val="0"/>
           <w:sz w:val="24"/>
         </w:rPr>
-        <w:t>Tabela më poshtë jep precizionin (P), recall-in (R), F1-in dhe MCC-në e strategjive për çdo erë, bashkë me numrin e mostrave pozitive (Tabela 2).</w:t>
+        <w:t>Kundrejt gjykimit të rishikuesve, strategjitë arrijnë këtë precizion (P), recall (R), F1 dhe MCC për çdo erë, mbi numrin e mostrave pozitive në kolonën e fundit (Tabela 2).</w:t>
       </w:r>
     </w:p>
     <w:p>
@@ -6087,7 +6087,7 @@
           <w:caps w:val="0"/>
           <w:sz w:val="24"/>
         </w:rPr>
-        <w:t>Tabela dhe figura në vijim e ndajnë recall-in sipas ashpërsisë që caktuan vetë rishikuesit (Tabela 3; Figura 3).</w:t>
+        <w:t>Recall-i ndryshon ndjeshëm sipas ashpërsisë që rishikuesit i dhanë secilës mostër (Tabela 3; Figura 3).</w:t>
       </w:r>
     </w:p>
     <w:p>
@@ -7252,7 +7252,7 @@
           <w:caps w:val="0"/>
           <w:sz w:val="24"/>
         </w:rPr>
-        <w:t>MCC-ja më e lartë e arritur është 0.713. Figura në vijim jep veçoritë me rëndësinë më të lartë për secilën erë (Figura 4).</w:t>
+        <w:t>MCC-ja më e lartë e arritur është 0.713. Veçoritë që peshojnë më shumë te secila erë, të matura me permutim, janë këto (Figura 4):</w:t>
       </w:r>
     </w:p>
     <w:p>
@@ -7322,7 +7322,7 @@
           <w:caps w:val="0"/>
           <w:sz w:val="24"/>
         </w:rPr>
-        <w:t>Çdo entitet që modeli e shënoi u shpjegua me metodën e Nënkapitullit 4.6. Tabela jep sa prej tyre kanë një matje të vetme që e mban verdiktin, dhe cilat matje dalin më shpesh vendimtare (në kllapa, numri i rasteve) (Tabela 5).</w:t>
+        <w:t>Me metodën e Nënkapitullit 4.6, shumica e verdikteve pozitive të modelit gjejnë një matje të vetme që i mban; matjet që dalin më shpesh vendimtare kanë numrin e rasteve në kllapa (Tabela 5).</w:t>
       </w:r>
     </w:p>
     <w:p>
@@ -7865,7 +7865,7 @@
           <w:caps w:val="0"/>
           <w:sz w:val="24"/>
         </w:rPr>
-        <w:t>Qasja B ka MCC më të lartë se Qasja A te 4 nga 4 erërat. Tabela në vijim jep pajtimin mes tyre: koeficientin kappa dhe numrin e mostrave që shënon secila qasje, vetëm ose bashkë me tjetrën (Figura 5; Tabela 6; Figura 6).</w:t>
+        <w:t>Qasja B ka MCC më të lartë se Qasja A te 4 nga 4 erërat. Pajtimi mes tyre matet me koeficientin kappa dhe me numrin e mostrave që shënon secila qasje, vetëm ose bashkë me tjetrën (Figura 5; Tabela 6; Figura 6).</w:t>
       </w:r>
     </w:p>
     <w:p>
@@ -8596,7 +8596,7 @@
           <w:caps w:val="0"/>
           <w:sz w:val="24"/>
         </w:rPr>
-        <w:t>Tabela në vijim jep MCC-në e modelit, të bashkimit (A∪B) dhe të prerjes (A∩B) të dy qasjeve, bashkë me recall-in e bashkimit dhe precizionin e prerjes (Tabela 7).</w:t>
+        <w:t>Dy qasjet u kombinuan edhe drejtpërdrejt, si bashkim (A∪B) dhe si prerje (A∩B), me këto vlera (Tabela 7):</w:t>
       </w:r>
     </w:p>
     <w:p>
@@ -9675,7 +9675,7 @@
           <w:caps w:val="0"/>
           <w:sz w:val="24"/>
         </w:rPr>
-        <w:t>Dy tabelat në vijim japin arsyet e refuzimit dhe verdiktin e verifikimit për rishkrimet e aplikuara. Kuptimi i secilës arsye jepet te Shtojca 8.4 (Tabela 9; Tabela 10).</w:t>
+        <w:t>Refuzimet ndahen sipas arsyes, kuptimi i së cilës jepet te Shtojca 8.4, dhe rishkrimet e aplikuara sipas verdiktit të verifikimit (Tabela 9; Tabela 10).</w:t>
       </w:r>
     </w:p>
     <w:p>
@@ -10827,7 +10827,7 @@
           <w:caps w:val="0"/>
           <w:sz w:val="24"/>
         </w:rPr>
-        <w:t>Tabela tjetër jep mesoren e metrikës mbi të cilën ndez detektori, para dhe pas rishkrimit, mbi vendet e aplikuara (Tabela 12).</w:t>
+        <w:t>Edhe metrika që e ndez detektorin u mat para dhe pas; mesoret mbi vendet e aplikuara janë (Tabela 12):</w:t>
       </w:r>
     </w:p>
     <w:p>
@@ -11708,7 +11708,7 @@
           <w:caps w:val="0"/>
           <w:sz w:val="24"/>
         </w:rPr>
-        <w:t>Norma e përgjithshme e transformimit është 20.4%. Tabela në vijim e ndan sipas erës dhe sipas ashpërsisë që i cakton vetë sistemi vendit (Tabela 14).</w:t>
+        <w:t>Norma e përgjithshme e transformimit është 20.4%. E ndarë sipas erës dhe sipas ashpërsisë që sistemi i cakton vendit, ajo shpërndahet kështu (Tabela 14):</w:t>
       </w:r>
     </w:p>
     <w:p>
@@ -13116,7 +13116,7 @@
           <w:caps w:val="0"/>
           <w:sz w:val="24"/>
         </w:rPr>
-        <w:t>Tabela tjetër jep përbërjen e arsyeve të refuzimit brenda çdo niveli ashpërsie (Tabela 15).</w:t>
+        <w:t>Brenda çdo niveli ashpërsie, arsyet e refuzimit kanë këtë përbërje (Tabela 15):</w:t>
       </w:r>
     </w:p>
     <w:p>
@@ -13809,7 +13809,7 @@
           <w:caps w:val="0"/>
           <w:sz w:val="24"/>
         </w:rPr>
-        <w:t xml:space="preserve"> Gjetja më e qëndrueshme është se te strategjitë e publikuara precizioni është shumë mbi recall-in. Kur ndezin, kanë më shpesh të drejtë sesa gabim, por i humbin shumicën e rasteve që rishikuesit i shënojnë, nga 56% te Long Method deri në 90% te Blob. Pragjet e nxjerra nga një korpus tjetër janë pra konservative për gjykimin e rishikuesve të MLCQ-së. Për një mjet praktik kjo nuk është domosdoshmërisht e keqe: një sinjal i rrallë por i besueshëm konsumohet më lehtë se një listë e gjatë me alarme false.</w:t>
+        <w:t xml:space="preserve"> Kur ndezin, strategjitë e publikuara kanë më shpesh të drejtë sesa gabim, por i humbin shumicën e rasteve që rishikuesit i shënojnë, nga 56% te Long Method deri në 90% te Blob. Pragjet e tyre, të llogaritura mbi sisteme krejt të tjera, janë pra konservative për mënyrën si i gjykojnë erërat rishikuesit e MLCQ-së.</w:t>
       </w:r>
     </w:p>
     <w:p>
@@ -13825,7 +13825,7 @@
           <w:caps w:val="0"/>
           <w:sz w:val="24"/>
         </w:rPr>
-        <w:t>Ndarja sipas ashpërsisë e ndryshon leximin. Te 3 nga 4 erërat strategjia i kap rastet major më mirë se ato minor, pra është më e ndjeshme ndaj rasteve të qarta; te Blob ndodh e kundërta. Një F1 i vetëm e fsheh këtë ndarje, dhe një mjet që i kap rastet e rënda nuk është i njëjti me një që i humb të dyja.</w:t>
+        <w:t>Kjo tërheqje nuk bie njësoj mbi të gjitha rastet. Shfaqjet e qarta të erës, ato që rishikuesit i quajtën major, kapen më lehtë se ato të butat (Nënkapitulli 5.1): strategjitë reagojnë ndaj tepricës së dukshme dhe heshtin para asaj që mezi dallohet; përjashtimi, Blob, mbështetet te vetëm 20 raste major. Një F1 i vetëm do ta fshihte këtë dallim.</w:t>
       </w:r>
     </w:p>
     <w:p>
@@ -13850,7 +13850,7 @@
           <w:caps w:val="0"/>
           <w:sz w:val="24"/>
         </w:rPr>
-        <w:t xml:space="preserve"> Modelet e tejkalojnë qasjen me rregulla te çdo erë, dhe meqë klasifikuesi i shumicës nuk ndez kurrë, fitimi nuk vjen nga çekuilibri i klasave: informacioni ndodhet te metrikat, dhe janë pragjet fikse ato që e humbin. Parashikimet janë jashtë fold-it mbi një ndarje sipas depos, ndaj shifrat përshkruajnë atë që pritet mbi një projekt që modeli nuk e ka parë. Përparësia qëndron edhe me intervale besimi, por jo pa kusht: kur rregullit i jepet pragu i tij më i mirë nga fshirja, dallimi te Long Method e përfshin zeron (Shtojca 8.10). Pra pretendimi vlen përgjithësisht, dhe jo pikërisht te era ku rregulli tashmë punonte më mirë.</w:t>
+        <w:t xml:space="preserve"> Modelet e tejkalojnë qasjen me rregulla te çdo erë, dhe meqë klasifikuesi i shumicës nuk ndez kurrë, fitimi nuk vjen nga çekuilibri i klasave. I njëjti informacion, i lexuar pa kufij të fiksuar paraprakisht, jep më shumë: strategjive nuk u mungojnë metrikat, u mungon vendi i duhur ku t'i presin.</w:t>
       </w:r>
     </w:p>
     <w:p>
@@ -13882,7 +13882,7 @@
           <w:caps w:val="0"/>
           <w:sz w:val="24"/>
         </w:rPr>
-        <w:t>Modeli pothuajse e përfshin rregullin: te çdo erë ai shënon më shumë raste që rregulli i humb sesa anasjelltas. Bashkimi i dy qasjeve nuk ndihmon, sepse bashkë me rastet e sakta të rregullit vijnë edhe pozitivët e tij të rremë, dhe mbi një bashkësi ku shumica e etiketave janë negative ky shkëmbim humbet; ironikisht, bashkimi humbet më shumë pikërisht te Feature Envy, ku rregulli kishte më shumë raste të veta. Vlerë praktike ka prerja: te çdo erë, kur dy qasje të pavarura pajtohen, precizioni del mbi secilën veç. Për një përdorues që do pak alarme të rreme, pajtimi i tyre është sinjali më i fortë që prodhon sistemi.</w:t>
+        <w:t>Modeli pothuajse e përfshin rregullin: te çdo erë ai shënon më shumë raste që rregulli i humb sesa anasjelltas. Bashkimi i dy qasjeve nuk ndihmon, sepse bashkë me rastet e sakta të rregullit vijnë edhe pozitivët e tij të rremë, dhe mbi një bashkësi ku shumica e etiketave janë negative ky shkëmbim humbet; ironikisht, bashkimi humbet më shumë pikërisht te Feature Envy, ku rregulli kishte më shumë raste të veta. Prerja sillet ndryshe: te çdo erë, kur dy qasje të pavarura pajtohen, precizioni del mbi secilën veç, sepse gabimet e tyre rrallë bien mbi të njëjtat mostra.</w:t>
       </w:r>
     </w:p>
     <w:p>
@@ -13907,7 +13907,7 @@
           <w:caps w:val="0"/>
           <w:sz w:val="24"/>
         </w:rPr>
-        <w:t xml:space="preserve"> Motori transformoi 20.4% të vendeve. Refuzimet tregojnë ku ndalet automatizimi i sigurt: arsyeja kryesore është forma e kodit që nuk i përshtatet transformimit, e ndjekur nga rrjedha e kontrollit që del nga blloku, dhe sa më e rëndë metoda, aq më shumë peshon e dyta, sepse një metodë e gjatë ose e ndërfutur thellë mban më shumë return, break e continue. Motori tërhiqet pra pikërisht te metodat ku ndihma do të vlente më shumë. Për kompilatorin, rishkrimet janë të sigurta: 98.3% kompilojnë ose nuk shtojnë lloj të ri gabimi.</w:t>
+        <w:t xml:space="preserve"> Refuzimet e motorit tregojnë ku ndalet automatizimi i sigurt. Arsyeja kryesore është forma e kodit që nuk i përshtatet transformimit, e ndjekur nga rrjedha e kontrollit që del nga blloku, dhe sa më e rëndë metoda, aq më shumë peshon e dyta: një metodë e gjatë ose e ndërfutur thellë mban më shumë return, break e continue. Motori tërhiqet pra pikërisht te metodat ku ndihma do të vlente më shumë.</w:t>
       </w:r>
     </w:p>
     <w:p>
@@ -13923,7 +13923,7 @@
           <w:caps w:val="0"/>
           <w:sz w:val="24"/>
         </w:rPr>
-        <w:t>Kompilimi brenda projektit e sqaron këtë lexim: verdikti «kompilon» rritet nga 0.2% në 11.4%, pra shumica e rasteve «pa gabim të ri» i detyrohen izolimit të skedarit dhe jo rishkrimit. Përmbysja e vetme, te Ambari, shton gabime vetëm sepse tipi që kalon te nënshkrimi i metodës së nxjerrë mban anotacione nga një bibliotekë që korpusi nuk e ka. Toleranca «pa lloj të ri gabimi» mbetet dëshmi e përdorshme ku kompilimi i plotë nuk arrihet, por jo garanci.</w:t>
+        <w:t>Verdikti i izoluar është më i rreptë se vetë rishkrimi. Brenda projektit të vet (Nënkapitulli 5.4), shumica e rasteve «pa gabim të ri» kompilojnë plotësisht, ndaj gabimet e tyre të mëparshme i detyroheshin mungesës së fqinjëve dhe jo transformimit. Përmbysja e vetme, te Ambari, shton gabime vetëm sepse tipi që kalon te nënshkrimi i metodës së nxjerrë mban anotacione nga një bibliotekë që korpusi nuk e ka. Toleranca «pa lloj të ri gabimi» mbetet dëshmi e përdorshme ku kompilimi i plotë nuk arrihet, por jo garanci.</w:t>
       </w:r>
     </w:p>
     <w:p>
@@ -13939,7 +13939,7 @@
           <w:caps w:val="0"/>
           <w:sz w:val="24"/>
         </w:rPr>
-        <w:t>Që një rishkrim kompilon nuk do të thotë se e heq erën. Era mbeti në 22.7% të rishkrimeve, dhe kjo rrjedh nga vetë transformimet: Guard Clauses heq saktësisht një nivel ndërfutjeje, ndërsa Deep Nesting ndez mbi tre, ndaj një metodë me gjashtë nivele mbetet mbi kufirin; Extract Method nxjerr bllokun më të madh pa garanci se metoda bie nën prag. Vetëm Introduce Parameter Object e zgjidh erën me ndërtim, sepse lista e parametrave bëhet një. Edhe kur era mbetet, matja lëviz ndjeshëm (mesoret: LongMethod nga 45 në 21; LongParameterList nga 7 në 1), pra struktura ndryshon.</w:t>
+        <w:t>Që një rishkrim kompilon nuk do të thotë se e heq erën, dhe kur era mbetet, shkaku është te vetë transformimet. Guard Clauses heq saktësisht një nivel ndërfutjeje, ndërsa Deep Nesting ndez mbi tre, ndaj një metodë me gjashtë nivele mbetet mbi kufirin; Extract Method nxjerr bllokun më të madh pa garanci se metoda bie nën prag. Vetëm Introduce Parameter Object e zgjidh erën me ndërtim, sepse lista e parametrave bëhet një.</w:t>
       </w:r>
     </w:p>
     <w:p>
@@ -13955,7 +13955,7 @@
           <w:caps w:val="0"/>
           <w:sz w:val="24"/>
         </w:rPr>
-        <w:t>Rishkrimet sollën 937 erëra të reja, më shpesh LongParameterList (372). Shkaku është i drejtpërdrejtë: Extract Method ia kalon metodës së nxjerrë çdo vlerë që blloku lexonte, ndaj një bllok me gjashtë hyrje prodhon një metodë me gjashtë parametra. Transformimi është i saktë, por e zhvendos problemin. Prandaj numri i vendeve të transformuara nuk lexohet si numri i erërave të hequra: sa u shëruan, sa lëvizi matja dhe sa probleme të reja lindën duhen lexuar bashkë.</w:t>
+        <w:t>Erërat e reja janë më shpesh LongParameterList, dhe shkaku është i drejtpërdrejtë: Extract Method ia kalon metodës së nxjerrë çdo vlerë që blloku lexonte, ndaj një bllok me gjashtë hyrje prodhon një metodë me gjashtë parametra. Transformimi është i saktë, por e zhvendos problemin. Prandaj numri i vendeve të transformuara nuk lexohet si numri i erërave të hequra: sa u shëruan, sa lëvizi matja dhe sa probleme të reja lindën duhen lexuar bashkë.</w:t>
       </w:r>
     </w:p>
     <w:p>
@@ -13994,7 +13994,7 @@
           <w:caps w:val="0"/>
           <w:sz w:val="24"/>
         </w:rPr>
-        <w:t xml:space="preserve"> Ndarja sipas depos dhe parashikimet jashtë fold-it i bënë dy qasjet të krahasueshme mostër për mostër. Motori, duke refuzuar çdo gjë që nuk e provon, nuk e prishi kodin përtej pakicës së raportuar. Verifikimi mbi kod real kapi tri defekte që testet e shkruara me dorë nuk i kapën (Nënkapitulli 5.4): verifikimi empirik nuk zëvendësohet dot me teste njësie.</w:t>
+        <w:t xml:space="preserve"> Tri zgjedhje metodologjike u dëshmuan të drejta. Ndarja e grupuar sipas depos e la vlerësimin pa rrjedhje, ndaj krahasimi i dy qasjeve mbi të njëjtat mostra është i ndershëm. Refuzimi si parim e mbajti motorin larg kodit që nuk e kuptonte, dhe dëmi mbeti te pakica e raportuar. Matja mbi kod real, më në fund, kapi tri defekte që testet e njësisë i kishin lënë të kalonin (Nënkapitulli 5.4).</w:t>
       </w:r>
     </w:p>
     <w:p>
@@ -14035,7 +14035,7 @@
           <w:caps w:val="0"/>
           <w:sz w:val="24"/>
         </w:rPr>
-        <w:t>E treta vjen nga vetë mospërputhjet. Nga 315 raste që rishikuesit i quajtën Blob dhe strategjia nuk i ndezi, 254 nuk e kalojnë as dy nga tri klauzolat (Shtojca 8.8). Nuk janë raste kufitare që një prag pak më i butë do t'i kapte, por entitete që, të matura me këto metrika, nuk i ngjajnë erës nga disa anë njëherësh.</w:t>
+        <w:t>E treta vjen nga vetë mospërputhjet. Nga 315 raste që rishikuesit i quajtën Blob dhe strategjia nuk i ndezi, 254 nuk e kalojnë as dy nga tri klauzolat (Shtojca 8.8). Humbja e tyre nuk zgjidhet pra duke lëvizur një prag: këto klasa dallojnë nga përkufizimi i strategjisë në më shumë se një dimension.</w:t>
       </w:r>
     </w:p>
     <w:p>
@@ -14051,7 +14051,7 @@
           <w:caps w:val="0"/>
           <w:sz w:val="24"/>
         </w:rPr>
-        <w:t>Këto sugjerojnë se ajo që rishikuesit e MLCQ-së e quajnë «blob» shpjegohet më mirë me madhësi sesa me kohezionin që strategjia e vendos në qendër. Kjo nuk e zhvlerëson strategjinë, por tregon se ajo mat diçka pak më ndryshe nga ajo që emërton.</w:t>
+        <w:t>Këto sugjerojnë se ajo që rishikuesit e MLCQ-së e quajnë «blob» shpjegohet më mirë me madhësi sesa me kohezionin që strategjia e vendos në qendër. Strategjia nuk bëhet e gabuar prej kësaj; rishikuesit dhe autorët e saj thjesht nuk kanë ndër mend saktësisht të njëjtën erë.</w:t>
       </w:r>
     </w:p>
     <w:p>
@@ -14067,7 +14067,7 @@
           <w:caps w:val="0"/>
           <w:sz w:val="24"/>
         </w:rPr>
-        <w:t>Ashpërsia e derivuar nga teprica mbi pragje nuk e riprodhoi gjykimin e rishikuesve: pajtimi doli pranë rastësisë për tri nga katër erërat, me mbivlerësim sistematik (Shtojca 8.9). Kalibrimi i pragjeve jashtë fold-it e ngriti MCC-në qartë te Feature Envy dhe Long Method, pak te Blob, e uli te Data Class, dhe foldet nuk pajtohen për të njëjtën vlerë te 3 nga 4 erërat; një prag «optimal» që ndryshon me pjesën e korpusit që shihet është veti e bashkësisë, jo e gjuhës (Shtojca 8.6).</w:t>
+        <w:t>Edhe ashpërsia doli rezultat negativ: e llogaritur nga teprica, ajo u pajtua me rishikuesit afërsisht sa rastësia te tri nga katër erërat, duke e mbivlerësuar sistematikisht (Shtojca 8.9). Kalibrimi i pragjeve jashtë fold-it e ngriti MCC-në qartë te Feature Envy dhe Long Method, pak te Blob, e uli te Data Class, dhe foldet nuk pajtohen për të njëjtën vlerë te 3 nga 4 erërat; një prag «optimal» që ndryshon me pjesën e korpusit që shihet është veti e bashkësisë, jo e gjuhës (Shtojca 8.6).</w:t>
       </w:r>
     </w:p>
     <w:p>
@@ -14083,7 +14083,7 @@
           <w:caps w:val="0"/>
           <w:sz w:val="24"/>
         </w:rPr>
-        <w:t>Te refaktorimi, dy transformime të rekomanduara gjerësisht e zhvendosin problemin në vend që ta heqin. Encapsulate Field, i rekomanduar për Data Class, e përkeqëson matjen sipas vetë përkufizimit të strategjisë: një fushë publike bëhet dy akses-metoda publike, dhe të dyja kushtet e strategjisë e numërojnë këtë si përkeqësim. Fowler-i e trajton atë si hap përgatitor, jo si ilaç. Extract Method, siç u pa më lart, sjell shpesh një Long Parameter List të re.</w:t>
+        <w:t>Te refaktorimi, dy transformime të rekomanduara gjerësisht e zhvendosin problemin në vend që ta heqin. Encapsulate Field, i rekomanduar për Data Class, e përkeqëson matjen sipas vetë përkufizimit të strategjisë: një fushë publike bëhet dy akses-metoda publike, dhe të dyja kushtet e strategjisë e numërojnë këtë si përkeqësim. Fowler-i e trajton atë si hap përgatitor, jo si ilaç. Extract Method e ka të njëjtin cen në shkallë më të vogël, përmes listës së gjatë të parametrave që lë pas (Nënkapitulli 6.1).</w:t>
       </w:r>
     </w:p>
     <w:p>
@@ -14572,7 +14572,7 @@
           <w:caps w:val="0"/>
           <w:sz w:val="24"/>
         </w:rPr>
-        <w:t>Te Blob, Data Class dhe Long Method modelet e këtij punimi dalin pak nën ato të Madeyski &amp; Lewowski-t. Dallimi i validimit e bën këtë të pritshme: ata e ndajnë bashkësinë me validim të kryqëzuar me pesë folde, të shtresuar sipas klasës por jo të grupuar sipas projektit, ndaj mostrat e së njëjtës depo mund të jenë njëherësh në trajnim dhe në testim, pikërisht rrjedhja që ky punim e shmang me GroupKFold. Ata raportojnë edhe mesoren e 120 ekzekutimeve me hiperparametra të optimizuar për MCC, ndërsa këtu modelet kanë parametra fiksë dhe një ekzekutim të vetëm jashtë fold-it. Me një ndarje më të rreptë dhe pa akordim, rezultatet e këtij punimi janë në të njëjtin brez.</w:t>
+        <w:t>Te Blob, Data Class dhe Long Method modelet e këtij punimi dalin pak nën ato të Madeyski &amp; Lewowski-t. Dallimi i validimit e bën këtë të pritshme: ata e ndajnë bashkësinë me validim të kryqëzuar me pesë folde, të shtresuar sipas klasës por jo të grupuar sipas projektit, ndaj e njëjta depo mund ta ushqejë trajnimin dhe të vlerësohet në të njëjtën kohë, pikërisht rrjedhja që ky punim e shmang me GroupKFold. Ata raportojnë edhe mesoren e 120 ekzekutimeve me hiperparametra të optimizuar për MCC, ndërsa këtu modelet kanë parametra fiksë dhe një ekzekutim të vetëm jashtë fold-it. Me një ndarje më të rreptë dhe pa akordim, rezultatet e këtij punimi janë në të njëjtin brez.</w:t>
       </w:r>
     </w:p>
     <w:p>
@@ -14588,7 +14588,7 @@
           <w:caps w:val="0"/>
           <w:sz w:val="24"/>
         </w:rPr>
-        <w:t>Te Feature Envy drejtimi është i kundërt: 0.67 këtu kundrejt 0.31 atje, ku autorët e quajnë erën më të vështirë. Shpjegimi më i mundshëm janë veçoritë: ky punim mat për çdo metodë ATFD, LAA, FDP dhe rreshtat efektivë, ndërsa ata përdorin metrika të mjeteve të përgjithshme. Dy punimet nuk vlerësohen mbi saktësisht të njëjtat mostra, sepse disa depo nuk ishin më të arritshme, ndaj dallimi lexohet si tregues dhe jo si provë.</w:t>
+        <w:t>Te Feature Envy drejtimi është i kundërt: 0.67 këtu kundrejt 0.31 atje, ku autorët e quajnë erën më të vështirë. Shpjegimi më i mundshëm janë veçoritë: ky punim mat për çdo metodë ATFD, LAA, FDP dhe rreshtat efektivë, ndërsa ata përdorin metrika të mjeteve të përgjithshme. Dy punimet nuk vlerësohen mbi saktësisht të njëjtat mostra, sepse një pjesë e depove sot mungon, ndaj dallimi lexohet si tregues dhe jo si provë.</w:t>
       </w:r>
     </w:p>
     <w:p>
@@ -14666,7 +14666,7 @@
           <w:caps w:val="0"/>
           <w:sz w:val="24"/>
         </w:rPr>
-        <w:t>PK1: Sa e saktë është detektimi me strategji metrikash?</w:t>
+        <w:t>PK1, saktësia e strategjive.</w:t>
       </w:r>
       <w:r>
         <w:rPr>
@@ -14675,7 +14675,7 @@
           <w:caps w:val="0"/>
           <w:sz w:val="24"/>
         </w:rPr>
-        <w:t xml:space="preserve"> I saktë kur ndez, por i kursyer. Kundrejt etiketave të rishikuesve, precizioni është nga 0.520 deri në 0.872, recall-i nga 0.100 deri në 0.440 dhe MCC-ja nga 0.232 deri në 0.580. Strategjia punon më mirë te Long Method dhe më keq te Blob, dhe ashpërsia që derivon nuk pajtohet me atë të rishikuesve.</w:t>
+        <w:t xml:space="preserve"> Precizioni i tyre e kalon recall-in te çdo erë, dhe MCC-ja kundrejt rishikuesve shkon nga 0.232 deri në 0.580, më e larta te Long Method dhe më e ulëta te Blob. Ashpërsia që derivojnë nuk pajtohet me atë të rishikuesve.</w:t>
       </w:r>
     </w:p>
     <w:p>
@@ -14691,7 +14691,7 @@
           <w:caps w:val="0"/>
           <w:sz w:val="24"/>
         </w:rPr>
-        <w:t>PK2: A e përmirëson mësimi i makinës detektimin?</w:t>
+        <w:t>PK2, mësimi i makinës.</w:t>
       </w:r>
       <w:r>
         <w:rPr>
@@ -14700,7 +14700,7 @@
           <w:caps w:val="0"/>
           <w:sz w:val="24"/>
         </w:rPr>
-        <w:t xml:space="preserve"> Po. Modeli i mësuar mbi të njëjtat metrika e ngre MCC-në te të katër erërat: brezi kalon nga 0.232–0.580 në 0.488–0.713, dhe intervalet bootstrap sipas depos e vendosin këtë përparësi mbi zero te 4 nga 4 erërat. Fitimi vjen kryesisht nga recall-i, që rritet te 4 nga 4 erërat. Përparësia ngushtohet kur rregullit i jepet pragu më i mirë i mundshëm, dhe te Long Method nuk dallohet më nga zeroja.</w:t>
+        <w:t xml:space="preserve"> Po, e përmirëson. Modeli i mësuar mbi të njëjtat metrika e ngre MCC-në te të katër erërat: brezi kalon nga 0.232–0.580 në 0.488–0.713, dhe intervalet bootstrap sipas depos e vendosin këtë përparësi mbi zero pa përjashtim. Fitimi vjen kryesisht nga recall-i, që rritet te çdo erë. Një rezervë e vetme: kur rregullit i jepet pragu i tij më i mirë nga fshirja, dallimi te Long Method nuk ndahet më nga zeroja (Shtojca 8.10). Përparësia vlen pra përgjithësisht, jo pikërisht te era ku rregulli punonte tashmë më mirë.</w:t>
       </w:r>
     </w:p>
     <w:p>
@@ -14716,7 +14716,7 @@
           <w:caps w:val="0"/>
           <w:sz w:val="24"/>
         </w:rPr>
-        <w:t>PK3: A i përmirësojnë refaktorimet karakteristikat strukturore, duke ruajtur kompilueshmërinë dhe sjelljen?</w:t>
+        <w:t>PK3, refaktorimi.</w:t>
       </w:r>
       <w:r>
         <w:rPr>
@@ -14725,7 +14725,7 @@
           <w:caps w:val="0"/>
           <w:sz w:val="24"/>
         </w:rPr>
-        <w:t xml:space="preserve"> Pjesërisht. Motori transformoi 20.4% të vendeve të detektuara. Nga rishkrimet, 98.3% kompiluan ose nuk shtuan lloj të ri gabimi, dhe 1.6% shtuan. Era u hoq te 64.4% e tyre, dhe metrika mbi të cilën ndez detektori ra ndjeshëm edhe aty ku era mbeti, pra struktura përmirësohet objektivisht në shumicën e rasteve, me koston e 937 erërave të reja. Kompilueshmëria u verifikua për çdo rishkrim, dhe kur skedari kompilohet brenda projektit të vet, pjesa që kompilon plotësisht rritet ndjeshëm, ndërsa një rishkrim i vetëm nga 405 e përmbys verdiktin në drejtimin e kundërt dhe e kufizon pretendimin. Ruajtja e sjelljes </w:t>
+        <w:t xml:space="preserve"> Pjesërisht. Motori transformoi 20.4% të vendeve të detektuara; nga rishkrimet, 98.3% kompiluan ose nuk shtuan lloj të ri gabimi, dhe 1.6% shtuan. Era u hoq te 64.4% e tyre, dhe metrika që e shkakton detektimin ra edhe aty ku era mbeti: struktura përmirësohet objektivisht në shumicën e rasteve, me koston e 937 erërave të reja. Kur skedari kompilohet brenda projektit të vet, pjesa që kompilon plotësisht rritet ndjeshëm, ndërsa një rishkrim i vetëm nga 405 e përmbys verdiktin në drejtimin e kundërt dhe e kufizon pretendimin. Ruajtja e sjelljes </w:t>
       </w:r>
       <w:r>
         <w:rPr>
@@ -14743,7 +14743,7 @@
           <w:caps w:val="0"/>
           <w:sz w:val="24"/>
         </w:rPr>
-        <w:t>, sepse korpusi nuk mban testet e projekteve. Përgjigjja është pra po për strukturën dhe kompilueshmërinë, me kosto të matur, dhe e hapur për sjelljen.</w:t>
+        <w:t xml:space="preserve"> (Nënkapitulli 3.4). Përgjigjja është pra po për strukturën dhe kompilueshmërinë, me kosto të matur, dhe e hapur për sjelljen.</w:t>
       </w:r>
     </w:p>
     <w:p>
@@ -14782,7 +14782,7 @@
           <w:caps w:val="0"/>
           <w:sz w:val="24"/>
         </w:rPr>
-        <w:t xml:space="preserve"> Informacioni për erërat ndodhet te metrikat, dhe pragjet fikse janë ajo që e humbin. Një pjesë e gabimit i takon përkufizimit të erës dhe jo detektorit, dhe mënyra si ndërtohet e ndahet dataset-i peshon po aq sa algoritmi.</w:t>
+        <w:t xml:space="preserve"> Strategjitë e publikuara nuk hidhen poshtë nga këto rezultate: si njohuri e shpjegueshme për atë që e bën një klasë të dyshimtë, ato mbeten të vlefshme. Ajo që nuk kalon nga një korpus te tjetri janë kufijtë numerikë, të cilët duhen kalibruar ose mësuar për kodin ku zbatohen. Pajtimi i ulët mes rishikuesve i vë gjithashtu një tavan çdo detektori, përtej të cilit gabimi i përket paqartësisë së vetë erës.</w:t>
       </w:r>
     </w:p>
     <w:p>
@@ -14807,7 +14807,7 @@
           <w:caps w:val="0"/>
           <w:sz w:val="24"/>
         </w:rPr>
-        <w:t xml:space="preserve"> Rregullat përshtaten si paralajmërim me pak zhurmë, modeli aty ku mbulimi ka më shumë rëndësi, dhe pajtimi i të dyjave si sinjali më i sigurt. Refaktorimi i automatizuar është i realizueshëm me siguri për rreth një në pesë vende, dhe vlera e tij varet nga refuzimi i atyre që nuk i provon dhe nga matja e asaj që ndodh pas rishkrimit.</w:t>
+        <w:t xml:space="preserve"> Për një ekip, strategjitë janë sinjal i rrallë por i besueshëm, i përshtatshëm si paralajmërim që nuk e mbyt zhvilluesin me zhurmë. Modeli vlen aty ku ka më shumë rëndësi të mos humbasë asnjë rast, dhe kur të dyja pajtohen, sistemi jep sinjalin e tij më të sigurt. Rishkrimi automatik mund t'i besohet mjetit për rreth një në pesë vende, me kusht që ai të refuzojë çdo gjë që nuk e provon dhe ta masë atë që ndodh pas rishkrimit.</w:t>
       </w:r>
     </w:p>
     <w:p>
@@ -14837,7 +14837,7 @@
           <w:caps w:val="0"/>
           <w:sz w:val="24"/>
         </w:rPr>
-        <w:t>Mbulimi i korpusit nuk është i plotë: disa depo të MLCQ-së janë fshirë ose zhvendosur, dhe mostrat e tyre nuk hyjnë në vlerësim. E vërteta bazë vjen nga një dataset i vetëm, me mospajtim të konsiderueshëm mes rishikuesve; prandaj çdo strategji agregimi raportohet veç, dhe mostrat që një strategji nuk i etiketon dot hidhen në vend që të lexohen si negative.</w:t>
+        <w:t>Mostrat e depove që nuk ishin më të arritshme mungojnë nga vlerësimi (hyrja e Kapitullit 5); nëse ato ndryshojnë sistematikisht nga pjesa tjetër, shifrat e raportuara nuk e pasqyrojnë këtë. E vërteta bazë vjen nga një dataset i vetëm, me mospajtim të konsiderueshëm mes rishikuesve; prandaj çdo strategji agregimi raportohet veç, dhe mostrat që një strategji nuk i etiketon dot hidhen në vend që të lexohen si negative.</w:t>
       </w:r>
     </w:p>
     <w:p>
@@ -14853,7 +14853,7 @@
           <w:caps w:val="0"/>
           <w:sz w:val="24"/>
         </w:rPr>
-        <w:t>Verifikimi i refaktorimeve është më i dobët se sa do të dëshirohej. Për shumicën e skedarëve pretendimi kufizohet te «nuk shton lloj të ri gabimi». Testet e projekteve nuk u ekzekutuan, sepse korpusi mban vetëm skedarë «.java», pa «pom.xml», «build.gradle» dhe biblioteka të treta; ky verifikim mbetet punë e ardhshme. Cilësia e rishkrimeve gjykohet nga një rishikues i vetëm, autori i motorit, dhe pajtimi mes rishikuesve për këtë matje nuk mund të matet.</w:t>
+        <w:t>Verifikimi i refaktorimeve kufizohet te kompilatori, dhe për shumicën e skedarëve vetëm te forma e tij më e dobët, mungesa e llojeve të reja të gabimit; testet e projekteve nuk u ekzekutuan, për arsyen e dhënë te Nënkapitulli 3.4. Cilësia e rishkrimeve u gjykua nga një rishikues i vetëm, autori i motorit, ndaj për të nuk ka pajtim mes rishikuesish që të matet.</w:t>
       </w:r>
     </w:p>
     <w:p>
@@ -14869,7 +14869,7 @@
           <w:caps w:val="0"/>
           <w:sz w:val="24"/>
         </w:rPr>
-        <w:t>Analizuesi nuk zgjidh simbole, ndaj dy nga pesë transformimet e planifikuara nuk automatizohen. Kjo nuk është mangësi implementimi por pasojë e drejtpërdrejtë e një zgjedhjeje arkitekturore të deklaruar. Ashpërsia që sistemi e derivon mbetet renditje e brendshme e mjetit dhe jo parashikim i gjykimit njerëzor.</w:t>
+        <w:t>Pa zgjidhje simbolesh (Nënkapitulli 3.4), motori ndreq vetëm atë që mbyllet brenda një skedari; erërat që kërkojnë ndryshime në gjithë projektin mbeten te zhvilluesi. Po ashtu, niveli i ashpërsisë që shfaq mjeti është renditje e brendshme e tij dhe jo parashikim i gjykimit njerëzor.</w:t>
       </w:r>
     </w:p>
     <w:p>
@@ -14885,7 +14885,7 @@
           <w:caps w:val="0"/>
           <w:sz w:val="24"/>
         </w:rPr>
-        <w:t>Recall-i i Blob-it ka dy tavane të veta (Shtojca 8.11). Nga 315 raste që strategjia i humbi, 65 nuk janë më të mëdha se klasa mesatare e pastër, dhe asnjë metrikë e vetme klase nuk i ndan nga klasat e pastra (më e mira arrin 0.773, ku 0.50 është rastësi). Po ashtu, TCC-ja e papërcaktuar merr vlerën maksimale, të cilën God Class nuk e pranon: nga 19 mospërputhje që ndalen vetëm te kohezioni, 17 kanë TCC të papërcaktuar. Ndreqja do ta shkëpuste TCC-në nga përkufizimi i botuar, ndaj u zgjodh raportimi.</w:t>
+        <w:t>Recall-i i Blob-it ka dy tavane që nuk varen nga pragjet (Shtojca 8.11). I pari: një pjesë e rasteve të humbura nuk janë më të mëdha se klasat e pastra, dhe asnjë metrikë e vetme klase nuk i ndan prej tyre (më e mira arrin 0.773); një detektor që mbështetet vetëm te këto metrika e ka të vështirë t'i kapë. I dyti: TCC-ja e papërcaktuar merr vlerën maksimale, të cilën God Class nuk e pranon. Ndreqja do ta shkëpuste TCC-në nga përkufizimi i botuar, ndaj u zgjodh raportimi.</w:t>
       </w:r>
     </w:p>
     <w:p>
@@ -15009,7 +15009,7 @@
           <w:caps w:val="0"/>
           <w:sz w:val="24"/>
         </w:rPr>
-        <w:t>Punimi ndërtoi një sistem që i zbulon code smells në dy mënyra të pavarura dhe i krahason mbi të njëjtën të vërtetë bazë, si dhe një motor refaktorimi që rishkruan kod vetëm kur i provon parakushtet e veta. Strategjitë e publikuara dolën të sakta por të kursyera; një klasifikues mbi të njëjtat metrika doli dukshëm më i mirë; dhe një pjesë e vogël por reale e vendeve u transformua automatikisht, me strukturë të përmirësuar dhe pa gabime të reja në shumicën dërrmuese të rasteve. Dy rezultate negative i shoqërojnë: ashpërsia e derivuar nuk e riprodhon gjykimin e rishikuesve, dhe vetë rishikuesit pajtohen pak mes tyre. Ruajtja e sjelljes mbetet pyetje e hapur.</w:t>
+        <w:t>Punimi u nis nga pyetja nëse erërat e kodit mund të gjenden dhe të ndreqen automatikisht në një mënyrë të cilës zhvilluesi t'i besojë. Përgjigjja që japin të dhënat është e ndarë. Gjetja mund t'u besohet metrikave, por jo pragjeve të fiksuara gjetiu: kufiri i mësuar nga vetë bashkësia jep më shumë se ai i trashëguar. Ndreqja mund t'i besohet makinës vetëm aty ku ajo e provon se ka të drejtë, dhe kjo ndodh më rrallë sesa ndeshen erërat. Mes të dyjave qëndron një kufi që asnjë algoritëm nuk e kapërcen: as rishikuesit nuk pajtohen plotësisht se ku fillon një erë.</w:t>
       </w:r>
     </w:p>
     <w:p>
@@ -15025,7 +15025,7 @@
           <w:caps w:val="0"/>
           <w:sz w:val="24"/>
         </w:rPr>
-        <w:t>Kontributi kryesor nuk është një shifër e vetme, por një hark i plotë e i riprodhueshëm nga korpusi te rezultati, ku çdo numër rigjenerohet me një komandë dhe çdo vendim është i regjistruar me arsyen e vet.</w:t>
+        <w:t>Më i qëndrueshëm se çdo shifër është mësimi metodologjik. Dy qasje krahasohen me kuptim vetëm mbi të njëjtat mostra dhe me një ndarje që nuk rrjedh nga një depo te tjetra, dhe një rishkrim vlen aq sa verifikimi që e ndjek. Që këto të mos mbeten pohime, çdo numër i punimit rigjenerohet nga korpusi me një komandë, dhe çdo vendim ruhet bashkë me arsyen e vet.</w:t>
       </w:r>
     </w:p>
     <w:p>
@@ -16478,7 +16478,7 @@
           <w:caps w:val="0"/>
           <w:sz w:val="24"/>
         </w:rPr>
-        <w:t>Strategjitë janë shkruar në një fjalor kuantifikuesish e jo në numra të veçantë. Vlerat janë ato të nxjerra statistikisht nga një korpus prej dyzet e pesë sistemesh Java dhe C++ (Tabela 18).</w:t>
+        <w:t>Strategjitë janë shkruar në një fjalor kuantifikuesish e jo në numra të veçantë. Vlerat numerike pas tyre vijnë nga statistikat e metrikave mbi dyzet e pesë sisteme Java dhe C++ (Tabela 18).</w:t>
       </w:r>
     </w:p>
     <w:p>
@@ -21980,7 +21980,7 @@
           <w:caps w:val="0"/>
           <w:sz w:val="24"/>
         </w:rPr>
-        <w:t>Pragjet e përdorura janë ato të botuara, të nxjerra statistikisht nga një korpus tjetër. Pyetja e natyrshme është sa varet rezultati prej tyre. Secili prag u zhvendos veç, mes gjysmës dhe dyfishit të vlerës së vet, me të tjerët të mbajtur fiks (Tabela 25; Figura 7).</w:t>
+        <w:t>Pragjet e përdorura janë ato të botuara (Shtojca 8.2), dhe pyetja e natyrshme është sa varet rezultati prej tyre. Secili prag u zhvendos veç, mes gjysmës dhe dyfishit të vlerës së vet, me të tjerët të mbajtur fiks (Tabela 25; Figura 7).</w:t>
       </w:r>
     </w:p>
     <w:p>
@@ -23949,7 +23949,7 @@
           <w:caps w:val="0"/>
           <w:sz w:val="24"/>
         </w:rPr>
-        <w:t>, dhe përmirësohen njëkohësisht edhe precizioni edhe recall-i. Kjo e forcon vërejtjen e mësipërme se klauzola e numrit të klasave-burim nuk e bën punën për të cilën është vendosur. Për Long Method fitimi është gjithashtu i qartë, por foldet ndahen mes dy vlerave dhe blihet me precizion.</w:t>
+        <w:t>, dhe përmirësohen njëkohësisht edhe precizioni edhe recall-i, çka e forcon dyshimin e mësipërm për klauzolën e numrit të klasave-burim. Për Long Method fitimi është gjithashtu i qartë, por foldet ndahen mes dy vlerave dhe blihet me precizion.</w:t>
       </w:r>
     </w:p>
     <w:p>
@@ -25658,7 +25658,7 @@
           <w:caps w:val="0"/>
           <w:sz w:val="24"/>
         </w:rPr>
-        <w:t xml:space="preserve"> 34 nga 58 i dështojnë dy ose tri klauzola njëkohësisht, pra shumica nuk janë raste që një prag pak më i butë do t'i kapte: janë entitete që, të matura me këto metrika, nuk i ngjajnë erës nga disa anë njëherësh. Aty ku bllokuesi është një i vetëm, medianat e afrisë shkojnë nga 0.71 te 0.83 e pragut.</w:t>
+        <w:t xml:space="preserve"> 34 nga 58 ngecin te më shumë se një klauzolë; edhe këtu, shumica janë larg erës dhe jo pranë pragut. Me një bllokues të vetëm, rastet ndalen (në mesore) te 0.71–0.83 e pragut.</w:t>
       </w:r>
     </w:p>
     <w:p>
@@ -26564,7 +26564,7 @@
           <w:caps w:val="0"/>
           <w:sz w:val="24"/>
         </w:rPr>
-        <w:t xml:space="preserve"> e jo rreshta: mostrat e së njëjtës depo ndajnë autorë dhe konvencione, ndaj rimostrimi i rreshtave do të prodhonte intervale artificialisht të ngushta, për të njëjtën arsye që ndarja e trajnimit është e grupuar (Tabela 31; Figura 9).</w:t>
+        <w:t xml:space="preserve"> e jo rreshta, për arsyen që e bën edhe ndarjen e trajnimit të grupuar (Nënkapitulli 2.3): rimostrimi i rreshtave do të jepte intervale artificialisht të ngushta (Tabela 31; Figura 9).</w:t>
       </w:r>
     </w:p>
     <w:p>
@@ -27178,7 +27178,7 @@
           <w:caps w:val="0"/>
           <w:sz w:val="24"/>
         </w:rPr>
-        <w:t>Përparësia e Qasjes B ndaj Qasjes A e kalon zeron te të katër erërat, pra nuk është artefakt i korpusit. Por intervalet janë të gjera — për Feature Envy-n gjerësia i kalon njëzet e pesë pikët — dhe kjo do të thotë se renditja e erërave mes tyre nuk qëndron: dallimi mes Data Class-it dhe Blob-it, për shembull, humbet brenda tyre.</w:t>
+        <w:t>Përparësia e Qasjes B ndaj Qasjes A e kalon zeron te të katër erërat, pra nuk është artefakt i korpusit. Por intervalet janë të gjera — për Feature Envy-n gjerësia i kalon njëzet e pesë pikët — prandaj renditja e erërave mes tyre nuk qëndron: dallimi mes Data Class-it dhe Blob-it, për shembull, humbet brenda tyre.</w:t>
       </w:r>
     </w:p>
     <w:p>
@@ -28229,7 +28229,7 @@
           <w:caps w:val="0"/>
           <w:sz w:val="24"/>
         </w:rPr>
-        <w:t>Asnjë erë nuk e kalon 0.238. Kjo nuk do të thotë se sistemi i tejkalon njerëzit: shifrat e kapitullit maten kundrejt etiketës së agreguar, e cila e heq një pjesë të zhurmës së një individi, ndaj të dy numrat nuk vendosen në një renditje. Ajo që tregon është sa e vështirë është vetë detyra: një pjesë e pareduktueshme e gabimit të çdo detektori i takon përkufizimit, dhe çdo shifër e Kapitullit 5 duhet lexuar mbi këtë sfond.</w:t>
+        <w:t>Asnjë erë nuk e kalon 0.238. Kjo nuk do të thotë se sistemi i tejkalon njerëzit: shifrat e kapitullit maten kundrejt etiketës së agreguar, e cila e heq një pjesë të zhurmës së një individi, ndaj të dy numrat nuk vendosen në një renditje. Ajo që tregon është sa e vështirë është vetë detyra: kur ekspertët ndahen kaq shumë, një pjesë e gabimit mbetet te paqartësia e erës, sido që të ndërtohet detektori, dhe çdo shifër e Kapitullit 5 duhet lexuar mbi këtë sfond.</w:t>
       </w:r>
     </w:p>
     <w:p>

</xml_diff>

<commit_message>
Permireso punimin pas leximit te plote
</commit_message>
<xml_diff>
--- a/docs/thesis/Punim_Diplome_Florent_Latifi.docx
+++ b/docs/thesis/Punim_Diplome_Florent_Latifi.docx
@@ -568,7 +568,7 @@
           <w:caps w:val="0"/>
           <w:sz w:val="24"/>
         </w:rPr>
-        <w:t>Ky punim ndërton një sistem që i zbulon code smells në dy mënyra të pavarura dhe i krahason mbi të njëjtën të vërtetë bazë. Qasja e parë zbaton strategjitë e publikuara të detektimit mbi 26 metrika; e dyta trajnon klasifikues mbi po ato metrika. Të dyja vlerësohen mbi 4 534 mostra nga 512 depo Java, të etiketuara nga zhvillues profesionistë, me ndarje të grupuar sipas depos dhe me të njëjtin kod pikëzimi. Sistemi përfshin edhe një motor refaktorimi që rishkruan kod vetëm kur i provon parakushtet e veta nga pema sintaksore, dhe një ndërfaqe web mbi të tria.</w:t>
+        <w:t>Ky punim ndërton një sistem që i zbulon code smells në dy mënyra të pavarura dhe i krahason mbi të njëjtën të vërtetë bazë. Qasja e parë zbaton strategjitë e publikuara të detektimit mbi 26 metrika; e dyta trajnon klasifikues mbi po ato metrika. Të dyja vlerësohen mbi 4534 mostra nga 512 depo Java, të etiketuara nga zhvillues profesionistë, me ndarje të grupuar sipas depos dhe me të njëjtin kod pikëzimi. Sistemi përfshin edhe një motor refaktorimi që rishkruan kod vetëm kur i provon parakushtet e veta nga pema sintaksore, dhe një ndërfaqe web mbi të tria.</w:t>
       </w:r>
     </w:p>
     <w:p>
@@ -600,7 +600,7 @@
           <w:caps w:val="0"/>
           <w:sz w:val="24"/>
         </w:rPr>
-        <w:t>Dy rezultate janë negative dhe raportohen si të tilla. Ashpërsia që sistemi e derivon nga teprica mbi pragje nuk e riprodhon gjykimin e rishikuesve: pajtimi i matur me kappa me peshë qëndron te 0.007 deri 0.293, dhe gabimi është i njëanshëm nga mbivlerësimi. Po ashtu, vetë rishikuesit pajtohen mes tyre me MCC 0.022 deri 0.238, çka tregon se një pjesë e pareduktueshme e gabimit të çdo detektori i takon përkufizimit të erës dhe jo detektorit. Motori i refaktorimit automatizon 3 transformime dhe transformoi 20.4% të vendeve të detektuara; refuzimi trajtohet si rezultat i saktë dhe numërohet. Kontributi kryesor nuk është një shifër e vetme, por një hark i plotë e i riprodhueshëm nga korpusi te rezultati.</w:t>
+        <w:t>Dy rezultate janë negative dhe raportohen si të tilla. Ashpërsia që sistemi e derivon nga teprica mbi pragje nuk e riprodhon gjykimin e rishikuesve: pajtimi i matur me kappa me peshë qëndron te 0.007 deri 0.293, dhe gabimi anon nga mbivlerësimi. Po ashtu, vetë rishikuesit pajtohen mes tyre me MCC 0.022 deri 0.238, çka tregon se një pjesë e pareduktueshme e gabimit të çdo detektori i takon përkufizimit të erës dhe jo detektorit. Motori i refaktorimit automatizon tri transformime dhe transformoi 20.4% të vendeve të detektuara; refuzimi trajtohet si rezultat i saktë dhe numërohet. Kontributi kryesor nuk është një shifër e vetme, por një zinxhir i plotë dhe i riprodhueshëm, nga korpusi deri te rezultati.</w:t>
       </w:r>
     </w:p>
     <w:p>
@@ -2053,7 +2053,7 @@
           <w:caps w:val="0"/>
           <w:sz w:val="24"/>
         </w:rPr>
-        <w:t>Një burim i madh i vështirësisë janë code smells. Termi u prezantua nga Kent Beck dhe u popullarizua nga libri Refactoring i Martin Fowler-it, botimi i dytë i të cilit (Fowler, 2018) përdoret në këtë punim. Një code smell nuk është gabim: programi kompilohet dhe funksionon saktë. Ai është simptomë e një problemi më të thellë dizajni, si një klasë që mban shumë përgjegjësi të palidhura, një metodë që zgjatet për qindra rreshta, ose një klasë që mban vetëm të dhëna pa asnjë sjellje. Cunningham (1992) e përshkroi efektin e tyre të grumbulluar me metaforën e borxhit teknik: çdo kompromis i vogël në strukturë krijon një detyrim që paguhet me interes në çdo ndryshim të ardhshëm.</w:t>
+        <w:t>Një burim i madh i vështirësisë janë code smells, të quajtura në vijim edhe erëra të kodit, ose shkurt erëra. Termi u prezantua nga Kent Beck dhe u popullarizua nga libri Refactoring i Martin Fowler-it, botimi i dytë i të cilit (Fowler, 2018) përdoret në këtë punim. Një code smell nuk është gabim: programi kompilohet dhe funksionon saktë. Ai është simptomë e një problemi më të thellë dizajni, si një klasë që mban shumë përgjegjësi të palidhura, një metodë që zgjatet për qindra rreshta, ose një klasë që mban vetëm të dhëna pa asnjë sjellje. Cunningham (1992) e përshkroi efektin e tyre të grumbulluar me metaforën e borxhit teknik: çdo kompromis i vogël në strukturë krijon një detyrim që paguhet me interes në çdo ndryshim të ardhshëm.</w:t>
       </w:r>
     </w:p>
     <w:p>
@@ -2132,7 +2132,7 @@
           <w:caps w:val="0"/>
           <w:sz w:val="24"/>
         </w:rPr>
-        <w:t>Detektimi automatik i code smells dhe refaktorimi janë studiuar prej më shumë se dy dekadash. Ky kapitull i ndan burimet në katër grupe: përkufizimi dhe matja e smells, detektimi me rregulla mbi metrika, detektimi me mësim të makinës, dhe refaktorimi i automatizuar. Në fund identifikohet hendeku që ky punim e adreson.</w:t>
+        <w:t>Detektimi automatik i code smells dhe refaktorimi janë studiuar prej më shumë se dy dekadash. Ky kapitull i ndan burimet në katër grupe: përkufizimi dhe matja e erërave, detektimi me rregulla mbi metrika, detektimi me mësim të makinës, dhe refaktorimi i automatizuar. Në fund identifikohet hendeku që ky punim e adreson.</w:t>
       </w:r>
     </w:p>
     <w:p>
@@ -2162,7 +2162,7 @@
           <w:caps w:val="0"/>
           <w:sz w:val="24"/>
         </w:rPr>
-        <w:t>Katalogun kanonik e jep Fowler (2018): njëzet e katër smells, secili me refaktorimet që e adresojnë. Përkufizimi mbetet qëllimisht cilësor: një smell është simptomë, jo gabim, dhe gjykimi nëse diçka është problem varet nga konteksti.</w:t>
+        <w:t>Katalogun kanonik e jep Fowler (2018): njëzet e katër erëra, secila me refaktorimet që e adresojnë. Përkufizimi mbetet qëllimisht cilësor: një erë është simptomë, jo gabim, dhe gjykimi nëse diçka është problem varet nga konteksti.</w:t>
       </w:r>
     </w:p>
     <w:p>
@@ -2194,7 +2194,7 @@
           <w:caps w:val="0"/>
           <w:sz w:val="24"/>
         </w:rPr>
-        <w:t>Sharma &amp; Spinellis (2018) ofrojnë një shqyrtim sistematik të fushës dhe vërejnë se literatura ka prodhuar përkufizime jokonsistente për smells, dhe se metodat e detektimit japin rezultate po aq jokonsistente, çka e bën krahasimin mes mjeteve të vështirë.</w:t>
+        <w:t>Sharma &amp; Spinellis (2018) ofrojnë një shqyrtim sistematik të fushës dhe vërejnë se literatura ka prodhuar përkufizime jokonsistente për erërat, dhe se metodat e detektimit japin rezultate po aq jokonsistente, çka e bën krahasimin mes mjeteve të vështirë.</w:t>
       </w:r>
     </w:p>
     <w:p>
@@ -2224,7 +2224,7 @@
           <w:caps w:val="0"/>
           <w:sz w:val="24"/>
         </w:rPr>
-        <w:t>Marinescu (2004) prezantoi konceptin e strategjive të detektimit: rregulla që kombinojnë disa metrika me pragje, në vend që të mbështeten në një metrikë të vetme. Ideja u zhvillua në një katalog të plotë nga Lanza &amp; Marinescu (2006), ku çdo smell shprehet si kombinim logjik kushtesh mbi metrika, zakonisht si konjunksion, me pragje të nxjerra statistikisht nga një korpus prej dyzet e pesë sistemesh Java.</w:t>
+        <w:t>Marinescu (2004) prezantoi konceptin e strategjive të detektimit: rregulla që kombinojnë disa metrika me pragje, në vend që të mbështeten në një metrikë të vetme. Ideja u zhvillua në një katalog të plotë nga Lanza &amp; Marinescu (2006), ku çdo erë shprehet si kombinim logjik kushtesh mbi metrika, zakonisht si konjunksion, me pragje të nxjerra statistikisht nga një korpus prej dyzet e pesë sistemesh Java.</w:t>
       </w:r>
     </w:p>
     <w:p>
@@ -2240,7 +2240,7 @@
           <w:caps w:val="0"/>
           <w:sz w:val="24"/>
         </w:rPr>
-        <w:t>Moha et al. (2010) propozuan DECOR-in, një metodë me gjuhë të specifikimit për smells, e cila i gjeneron detektorët nga përshkrimet. Përparësia e këtyre qasjeve është transparenca: kur një detektor ndez, arsyeja është e lexueshme. Dobësia e tyre është ndjeshmëria ndaj pragjeve, të cilat janë të vështira për t'u kalibruar përtej korpusit ku u nxorën.</w:t>
+        <w:t>Moha et al. (2010) propozuan DECOR-in, një metodë me gjuhë të specifikimit të erërave, e cila i gjeneron detektorët nga përshkrimet. Përparësia e këtyre qasjeve është transparenca: kur një detektor ndez, arsyeja është e lexueshme. Dobësia e tyre është ndjeshmëria ndaj pragjeve, të cilat janë të vështira për t'u kalibruar përtej korpusit ku u nxorën.</w:t>
       </w:r>
     </w:p>
     <w:p>
@@ -2256,7 +2256,7 @@
           <w:caps w:val="0"/>
           <w:sz w:val="24"/>
         </w:rPr>
-        <w:t>Palomba et al. (2015) morën një drejtim tjetër me HIST-in, duke i detektuar smells nga historiku i ndryshimeve në vend që nga një pamje e vetme e kodit. Kjo e kap një dimension që metrikat statike nuk e shohin, por kërkon akses në historikun e plotë të depos.</w:t>
+        <w:t>Palomba et al. (2015) morën një drejtim tjetër me HIST-in, duke i detektuar erërat nga historiku i ndryshimeve në vend që nga një pamje e vetme e kodit. Kjo e kap një dimension që metrikat statike nuk e shohin, por kërkon akses në historikun e plotë të depos.</w:t>
       </w:r>
     </w:p>
     <w:p>
@@ -2286,7 +2286,7 @@
           <w:caps w:val="0"/>
           <w:sz w:val="24"/>
         </w:rPr>
-        <w:t>Arcelli Fontana et al. (2016) krahasuan gjashtëmbëdhjetë algoritme të mësimit të makinës mbi katër smells dhe raportuan performancë të lartë për të gjitha në validimin e kryqëzuar, me J48 dhe Random Forest si më të mirat. Ky punim u bë referenca kryesore e fushës dhe motivoi një varg studimesh pasuese.</w:t>
+        <w:t>Arcelli Fontana et al. (2016) krahasuan gjashtëmbëdhjetë algoritme të mësimit të makinës mbi katër erëra dhe raportuan performancë të lartë për të gjitha në validimin e kryqëzuar, me J48 dhe Random Forest si më të mirat. Ky punim u bë referenca kryesore e fushës dhe motivoi një varg studimesh pasuese.</w:t>
       </w:r>
     </w:p>
     <w:p>
@@ -2302,7 +2302,7 @@
           <w:caps w:val="0"/>
           <w:sz w:val="24"/>
         </w:rPr>
-        <w:t>Megjithatë, Di Nucci et al. (2018) vunë re se në atë studim çdo dataset përmbante raste të një lloji të vetëm smell-i. E përsëritën eksperimentin me dataset-e ku bashkëjetojnë disa lloje smells, dhe në këtë konfigurim më realist teknikat e mësimit të makinës shfaqën kufizime kritike. Rrjedhimisht, një rezultat i raportuar varet nga mënyra si ndërtohet bashkësia e vlerësimit, jo vetëm nga algoritmi.</w:t>
+        <w:t>Megjithatë, Di Nucci et al. (2018) vunë re se në atë studim çdo dataset përmbante raste të një lloji të vetëm ere. E përsëritën eksperimentin me dataset-e ku bashkëjetojnë disa lloje erërash, dhe në këtë konfigurim më realist teknikat e mësimit të makinës shfaqën kufizime kritike. Rrjedhimisht, një rezultat i raportuar varet nga mënyra si ndërtohet bashkësia e vlerësimit, jo vetëm nga algoritmi.</w:t>
       </w:r>
     </w:p>
     <w:p>
@@ -2334,7 +2334,7 @@
           <w:caps w:val="0"/>
           <w:sz w:val="24"/>
         </w:rPr>
-        <w:t>Azeem et al. (2019), në një shqyrtim sistematik dhe meta-analizë, gjetën vetëm pesëmbëdhjetë studime që përdorin mësimin e makinës për detektimin e smells, nga një bashkësi fillestare prej më shumë se dy mijë punimesh, dhe përfundojnë se në këtë nënfushë ka ende hapësirë për përmirësim.</w:t>
+        <w:t>Azeem et al. (2019), në një shqyrtim sistematik dhe meta-analizë, gjetën vetëm pesëmbëdhjetë studime që përdorin mësimin e makinës për detektimin e erërave, nga një bashkësi fillestare prej më shumë se dy mijë punimesh, dhe përfundojnë se në këtë nënfushë ka ende hapësirë për përmirësim.</w:t>
       </w:r>
     </w:p>
     <w:p>
@@ -2364,7 +2364,7 @@
           <w:caps w:val="0"/>
           <w:sz w:val="24"/>
         </w:rPr>
-        <w:t>Çdo vlerësim i detektimit kërkon një të vërtetë bazë, dhe këtu literatura has një problem themelor. Mäntylä &amp; Lassenius (2006) treguan në një studim empirik se vlerësimi i zhvilluesve për praninë e një smell është subjektiv dhe se mospajtimi mes tyre është i konsiderueshëm.</w:t>
+        <w:t>Çdo vlerësim i detektimit kërkon një të vërtetë bazë, dhe këtu literatura has një problem themelor. Mäntylä &amp; Lassenius (2006) treguan në një studim empirik se vlerësimi i zhvilluesve për praninë e një ere është subjektiv dhe se mospajtimi mes tyre është i konsiderueshëm.</w:t>
       </w:r>
     </w:p>
     <w:p>
@@ -2380,7 +2380,7 @@
           <w:caps w:val="0"/>
           <w:sz w:val="24"/>
         </w:rPr>
-        <w:t>Madeyski &amp; Lewowski (2020) e adresuan mungesën e dataset-eve me MLCQ-në, një bashkësi mostrash Java të etiketuara nga zhvillues profesionistë për katër smells, me ashpërsi në shkallën none/minor/major/critical. Ky punim e përdor MLCQ-në si të vërtetë bazë, dhe e trajton mospajtimin mes rishikuesve si të dhënë që raportohet, jo si zhurmë që pastrohet.</w:t>
+        <w:t>Madeyski &amp; Lewowski (2020) e adresuan mungesën e dataset-eve me MLCQ-në, një bashkësi mostrash Java të etiketuara nga zhvillues profesionistë për katër erëra, me ashpërsi në shkallën none/minor/major/critical. Ky punim e përdor MLCQ-në si të vërtetë bazë, dhe e trajton mospajtimin mes rishikuesve si të dhënë që raportohet, jo si zhurmë që pastrohet.</w:t>
       </w:r>
     </w:p>
     <w:p>
@@ -2472,7 +2472,7 @@
           <w:caps w:val="0"/>
           <w:sz w:val="24"/>
         </w:rPr>
-        <w:t>Nga sa më sipër dalin tri vërejtje. E para: qasja me rregulla dhe ajo me mësim makine rrallë vlerësohen mbi të njëjtën të vërtetë bazë me të njëjtat metrika, çka e bën krahasimin e drejtpërdrejtë të vështirë. E dyta: jo çdo punim e deklaron qartë si e ndan bashkësinë e vlerësimit, ndonëse shifra e raportuar varet pikërisht prej saj. E treta: detektimi dhe refaktorimi trajtohen zakonisht si probleme të ndara, ndaj pyetja nëse një smell i detektuar mund edhe të rregullohet automatikisht mbetet pa përgjigje empirike.</w:t>
+        <w:t>Nga sa më sipër dalin tri vërejtje. E para: qasja me rregulla dhe ajo me mësim makine rrallë vlerësohen mbi të njëjtën të vërtetë bazë me të njëjtat metrika, çka e bën krahasimin e drejtpërdrejtë të vështirë. E dyta: jo çdo punim e deklaron qartë si e ndan bashkësinë e vlerësimit, ndonëse shifra e raportuar varet pikërisht prej saj. E treta: detektimi dhe refaktorimi trajtohen zakonisht si probleme të ndara, ndaj pyetja nëse një erë e detektuar mund edhe të rregullohet automatikisht mbetet pa përgjigje empirike.</w:t>
       </w:r>
     </w:p>
     <w:p>
@@ -2488,7 +2488,7 @@
           <w:caps w:val="0"/>
           <w:sz w:val="24"/>
         </w:rPr>
-        <w:t>Ky punim i adreson të tria: dy qasjet vlerësohen mbi të njëjtin korpus me të njëjtin kod pikëzimi, ndarja është e grupuar sipas depos dhe e deklaruar, dhe motori i refaktorimit raporton se sa nga rastet e detektuara arrin t'i transformojë vërtet.</w:t>
+        <w:t>Kapitulli 3 i kthen këto tri vërejtje në problemin dhe pyetjet e këtij punimi.</w:t>
       </w:r>
     </w:p>
     <w:p>
@@ -2908,7 +2908,7 @@
           <w:caps w:val="0"/>
           <w:sz w:val="24"/>
         </w:rPr>
-        <w:t>Për PK3: verifikim që çdo rishkrim i aplikuar nuk e prish skedarin, dhe matje nëse era u hoq. Ruajtja e plotë e sjelljes kërkon ekzekutimin e testeve të vetë projekteve (Nënkapitulli 3.4).</w:t>
+        <w:t>Për PK3: verifikim që çdo rishkrim i aplikuar nuk e prish skedarin, dhe matje nëse era u hoq; ruajtja e sjelljes mbetet pa kriter, për arsyen e Nënkapitullit 3.4.</w:t>
       </w:r>
     </w:p>
     <w:p>
@@ -4459,7 +4459,7 @@
           <w:caps w:val="0"/>
           <w:sz w:val="24"/>
         </w:rPr>
-        <w:t>Katër modele vlerësohen: klasifikuesi i shumicës, regresioni logjistik, Random Forest (Breiman, 2001) dhe Gradient Boosting (Friedman, 2001), të zbatuar me scikit-learn (Pedregosa et al., 2011). Veçoritë janë të gjitha metrikat e Nënkapitullit 4.4, jo vetëm ato që përdorin strategjitë.</w:t>
+        <w:t>Katër modele vlerësohen: klasifikuesi i shumicës, regresioni logjistik, Random Forest (Breiman, 2001) dhe Gradient Boosting (Friedman, 2001), të zbatuar me scikit-learn (Pedregosa et al., 2011). Veçoritë janë të gjitha metrikat e Nënkapitullit 4.4, jo vetëm ato që përdorin strategjitë. Në tabela dhe figura, parashtesa «c_» shënon një metrikë të klasës dhe «m_» një metrikë të metodës, sepse disa, si ATFD, maten në të dy nivelet.</w:t>
       </w:r>
     </w:p>
     <w:p>
@@ -6071,7 +6071,7 @@
           <w:caps w:val="0"/>
           <w:sz w:val="24"/>
         </w:rPr>
-        <w:t>Precizioni i strategjive është mbi recall-in te 4 nga 4 erërat: precizioni shkon nga 0.520 deri në 0.872, recall-i nga 0.100 deri në 0.440.</w:t>
+        <w:t>Precizioni i strategjive është mbi recall-in te të katër erërat: precizioni shkon nga 0.520 deri në 0.872, recall-i nga 0.100 deri në 0.440.</w:t>
       </w:r>
     </w:p>
     <w:p>
@@ -6561,7 +6561,7 @@
           <w:caps w:val="0"/>
           <w:sz w:val="24"/>
         </w:rPr>
-        <w:t>Te 3 nga 4 erërat, strategjia e botuar i kap rastet major më shpesh se ato minor; për Blob ndodh e kundërta.</w:t>
+        <w:t>Te tri nga katër erërat, strategjia e botuar i kap rastet major më shpesh se ato minor; për Blob ndodh e kundërta.</w:t>
       </w:r>
     </w:p>
     <w:p>
@@ -7262,7 +7262,7 @@
       <w:r>
         <w:drawing>
           <wp:inline xmlns:a="http://schemas.openxmlformats.org/drawingml/2006/main" xmlns:pic="http://schemas.openxmlformats.org/drawingml/2006/picture">
-            <wp:extent cx="5120640" cy="2369251"/>
+            <wp:extent cx="5120640" cy="4356365"/>
             <wp:docPr id="6" name="Picture 6"/>
             <wp:cNvGraphicFramePr>
               <a:graphicFrameLocks noChangeAspect="1"/>
@@ -7283,7 +7283,7 @@
                   <pic:spPr>
                     <a:xfrm>
                       <a:off x="0" y="0"/>
-                      <a:ext cx="5120640" cy="2369251"/>
+                      <a:ext cx="5120640" cy="4356365"/>
                     </a:xfrm>
                     <a:prstGeom prst="rect"/>
                   </pic:spPr>
@@ -7865,7 +7865,7 @@
           <w:caps w:val="0"/>
           <w:sz w:val="24"/>
         </w:rPr>
-        <w:t>Qasja B ka MCC më të lartë se Qasja A te 4 nga 4 erërat. Pajtimi mes tyre matet me koeficientin kappa dhe me numrin e mostrave që shënon secila qasje, vetëm ose bashkë me tjetrën (Figura 5; Tabela 6; Figura 6).</w:t>
+        <w:t>Qasja B ka MCC më të lartë se Qasja A te të katër erërat. Pajtimi mes tyre matet me koeficientin kappa dhe me numrin e mostrave që shënon secila qasje, vetëm ose bashkë me tjetrën (Figura 5; Tabela 6; Figura 6).</w:t>
       </w:r>
     </w:p>
     <w:p>
@@ -8580,7 +8580,7 @@
           <w:caps w:val="0"/>
           <w:sz w:val="24"/>
         </w:rPr>
-        <w:t>Numri i mostrave që shënon vetëm A, kundrejt atyre që shënon vetëm B, është: Blob 4 me 329; Data Class 7 me 145; Feature Envy 13 me 54; Long Method 4 me 126. Raporti më i afërt mes të dyjave është te Feature Envy.</w:t>
+        <w:t>Te të katër erërat, mostrat që shënon vetëm B janë më të shumta se ato që shënon vetëm A. Raporti më i afërt mes të dyjave është te Feature Envy, 13 me 54.</w:t>
       </w:r>
     </w:p>
     <w:p>
@@ -9257,7 +9257,7 @@
           <w:caps w:val="0"/>
           <w:sz w:val="24"/>
         </w:rPr>
-        <w:t>Bashkimi e ngre recall-in mbi atë të modelit te 3 nga 4 erërat; MCC-ja rritet te Blob (0.488 → 0.494) dhe Data Class (0.500 → 0.510), dhe bie te Feature Envy (0.669 → 0.644) dhe Long Method (0.713 → 0.706).</w:t>
+        <w:t>Bashkimi e ngre recall-in mbi atë të modelit te tri nga katër erërat; MCC-ja rritet te Blob (0.488 → 0.494) dhe Data Class (0.500 → 0.510), dhe bie te Feature Envy (0.669 → 0.644) dhe Long Method (0.713 → 0.706).</w:t>
       </w:r>
     </w:p>
     <w:p>
@@ -9273,7 +9273,7 @@
           <w:caps w:val="0"/>
           <w:sz w:val="24"/>
         </w:rPr>
-        <w:t>Te prerja, precizioni është të paktën 0.80 te çdo erë dhe arrin 0.905 te Long Method, ndërsa recall-i dhe MCC-ja janë nën ato të modelit te 4 nga 4 erërat.</w:t>
+        <w:t>Te prerja, precizioni është të paktën 0.80 te çdo erë dhe arrin 0.905 te Long Method, ndërsa recall-i dhe MCC-ja janë nën ato të modelit te të katër erërat.</w:t>
       </w:r>
     </w:p>
     <w:p>
@@ -9303,7 +9303,7 @@
           <w:caps w:val="0"/>
           <w:sz w:val="24"/>
         </w:rPr>
-        <w:t>Mbi 4409 skedarë të korpusit u detektuan 17833 vende ku motori ka një transformim; prej tyre 3633 u transformuan (Tabela 8).</w:t>
+        <w:t>Mbi 4409 skedarë të korpusit u detektuan 17 833 vende ku motori ka një transformim; prej tyre 3633 u transformuan (Tabela 8).</w:t>
       </w:r>
     </w:p>
     <w:p>
@@ -9430,7 +9430,7 @@
                 <w:caps w:val="0"/>
                 <w:sz w:val="22"/>
               </w:rPr>
-              <w:t>17833</w:t>
+              <w:t>17 833</w:t>
             </w:r>
           </w:p>
         </w:tc>
@@ -9554,7 +9554,7 @@
                 <w:caps w:val="0"/>
                 <w:sz w:val="22"/>
               </w:rPr>
-              <w:t>14183</w:t>
+              <w:t>14 183</w:t>
             </w:r>
           </w:p>
         </w:tc>
@@ -9636,6 +9636,7 @@
                 <w:caps w:val="0"/>
                 <w:sz w:val="22"/>
               </w:rPr>
+              <w:t>0.1%</w:t>
             </w:r>
           </w:p>
         </w:tc>
@@ -9659,7 +9660,7 @@
           <w:caps w:val="0"/>
           <w:sz w:val="24"/>
         </w:rPr>
-        <w:t>Sipas transformimit, rishkrimet ndahen: ExtractMethod 3367 (92.7%), IntroduceParameterObject 155 (4.3%), ReplaceNestedConditionalWithGuardClauses 111 (3.1%).</w:t>
+        <w:t>Sipas transformimit, rishkrimet ndahen: Extract Method 3367 (92.7%), Introduce Parameter Object 155 (4.3%), Replace Nested Conditional with Guard Clauses 111 (3.1%).</w:t>
       </w:r>
     </w:p>
     <w:p>
@@ -10249,7 +10250,7 @@
                 <w:caps w:val="0"/>
                 <w:sz w:val="22"/>
               </w:rPr>
-              <w:t>no new errors</w:t>
+              <w:t>pa gabim të ri</w:t>
             </w:r>
           </w:p>
         </w:tc>
@@ -10311,7 +10312,7 @@
                 <w:caps w:val="0"/>
                 <w:sz w:val="22"/>
               </w:rPr>
-              <w:t>new errors</w:t>
+              <w:t>gabim i ri</w:t>
             </w:r>
           </w:p>
         </w:tc>
@@ -10373,7 +10374,7 @@
                 <w:caps w:val="0"/>
                 <w:sz w:val="22"/>
               </w:rPr>
-              <w:t>compiles</w:t>
+              <w:t>kompilon</w:t>
             </w:r>
           </w:p>
         </w:tc>
@@ -10435,7 +10436,7 @@
                 <w:caps w:val="0"/>
                 <w:sz w:val="22"/>
               </w:rPr>
-              <w:t>parses</w:t>
+              <w:t>u parsua, pa kompilim</w:t>
             </w:r>
           </w:p>
         </w:tc>
@@ -10797,22 +10798,6 @@
       <w:pPr>
         <w:spacing w:line="240" w:lineRule="auto" w:after="0"/>
       </w:pPr>
-    </w:p>
-    <w:p>
-      <w:pPr>
-        <w:spacing w:line="360" w:lineRule="auto"/>
-        <w:ind w:firstLine="360"/>
-        <w:jc w:val="both"/>
-      </w:pPr>
-      <w:r>
-        <w:rPr>
-          <w:rFonts w:ascii="Times New Roman" w:hAnsi="Times New Roman" w:eastAsia="Times New Roman"/>
-          <w:b w:val="0"/>
-          <w:caps w:val="0"/>
-          <w:sz w:val="24"/>
-        </w:rPr>
-        <w:t>Era u hoq në 64.4% të rishkrimeve dhe mbeti në 22.7% prej tyre.</w:t>
-      </w:r>
     </w:p>
     <w:p>
       <w:pPr>
@@ -10956,7 +10941,7 @@
                 <w:caps w:val="0"/>
                 <w:sz w:val="22"/>
               </w:rPr>
-              <w:t>BrainMethod</w:t>
+              <w:t>Brain Method</w:t>
             </w:r>
           </w:p>
         </w:tc>
@@ -11038,7 +11023,7 @@
                 <w:caps w:val="0"/>
                 <w:sz w:val="22"/>
               </w:rPr>
-              <w:t>DeepNesting</w:t>
+              <w:t>Deep Nesting</w:t>
             </w:r>
           </w:p>
         </w:tc>
@@ -11120,7 +11105,7 @@
                 <w:caps w:val="0"/>
                 <w:sz w:val="22"/>
               </w:rPr>
-              <w:t>LongMethod</w:t>
+              <w:t>Long Method</w:t>
             </w:r>
           </w:p>
         </w:tc>
@@ -11202,7 +11187,7 @@
                 <w:caps w:val="0"/>
                 <w:sz w:val="22"/>
               </w:rPr>
-              <w:t>LongParameterList</w:t>
+              <w:t>Long Parameter List</w:t>
             </w:r>
           </w:p>
         </w:tc>
@@ -11286,7 +11271,7 @@
           <w:caps w:val="0"/>
           <w:sz w:val="24"/>
         </w:rPr>
-        <w:t>Pas rishkrimit u shfaqën 937 erëra që nuk ishin aty më parë: BrainMethod (63), DeepNesting (146), FeatureEnvy (134), GodClass (47), LargeClass (8), LongMethod (167), LongParameterList (372).</w:t>
+        <w:t>Pas rishkrimit u shfaqën 937 erëra që nuk ishin aty më parë: Brain Method (63), Deep Nesting (146), Feature Envy (134), God Class (47), Large Class (8), Long Method (167), Long Parameter List (372).</w:t>
       </w:r>
     </w:p>
     <w:p>
@@ -11410,7 +11395,7 @@
                 <w:caps w:val="0"/>
                 <w:sz w:val="22"/>
               </w:rPr>
-              <w:t>compiles</w:t>
+              <w:t>kompilon</w:t>
             </w:r>
           </w:p>
         </w:tc>
@@ -11472,7 +11457,7 @@
                 <w:caps w:val="0"/>
                 <w:sz w:val="22"/>
               </w:rPr>
-              <w:t>new errors</w:t>
+              <w:t>gabim i ri</w:t>
             </w:r>
           </w:p>
         </w:tc>
@@ -11534,7 +11519,7 @@
                 <w:caps w:val="0"/>
                 <w:sz w:val="22"/>
               </w:rPr>
-              <w:t>no new errors</w:t>
+              <w:t>pa gabim të ri</w:t>
             </w:r>
           </w:p>
         </w:tc>
@@ -11596,7 +11581,7 @@
                 <w:caps w:val="0"/>
                 <w:sz w:val="22"/>
               </w:rPr>
-              <w:t>not checked</w:t>
+              <w:t>i pakontrolluar</w:t>
             </w:r>
           </w:p>
         </w:tc>
@@ -11676,7 +11661,7 @@
           <w:caps w:val="0"/>
           <w:sz w:val="24"/>
         </w:rPr>
-        <w:t>Një rishkrim nga 405 nuk shtonte lloj të ri gabimi i izoluar, por shton brenda projektit të vet. Rasti është një Extract Method mbi AlertSummaryRenderer.finalizeResult(Result) te «AlertSummaryRenderer.java» e projektit Ambari, dhe të tria gabimet që shton janë paketa të palëve të treta që mungojnë në korpus. 7 kompilime e kaluan kufirin kohor dhe numërohen si të pakontrolluara, kurrë si sukses. Matja zgjati rreth 4 orë.</w:t>
+        <w:t>Një rishkrim nga 405 nuk shtonte lloj të ri gabimi i izoluar, por shton brenda projektit të vet. Rasti është një Extract Method mbi AlertSummaryRenderer.finalizeResult(Result) te «AlertSummaryRenderer.java» e projektit Ambari, dhe të tria gabimet që shton janë paketa të palëve të treta që mungojnë në korpus. Shtatë kompilime e kaluan kufirin kohor dhe numërohen si të pakontrolluara, kurrë si sukses. Matja zgjati rreth 4 orë.</w:t>
       </w:r>
     </w:p>
     <w:p>
@@ -11858,7 +11843,7 @@
                 <w:caps w:val="0"/>
                 <w:sz w:val="22"/>
               </w:rPr>
-              <w:t>BrainMethod</w:t>
+              <w:t>Brain Method</w:t>
             </w:r>
           </w:p>
         </w:tc>
@@ -11960,7 +11945,7 @@
                 <w:caps w:val="0"/>
                 <w:sz w:val="22"/>
               </w:rPr>
-              <w:t>BrainMethod</w:t>
+              <w:t>Brain Method</w:t>
             </w:r>
           </w:p>
         </w:tc>
@@ -12062,7 +12047,7 @@
                 <w:caps w:val="0"/>
                 <w:sz w:val="22"/>
               </w:rPr>
-              <w:t>BrainMethod</w:t>
+              <w:t>Brain Method</w:t>
             </w:r>
           </w:p>
         </w:tc>
@@ -12164,7 +12149,7 @@
                 <w:caps w:val="0"/>
                 <w:sz w:val="22"/>
               </w:rPr>
-              <w:t>DeepNesting</w:t>
+              <w:t>Deep Nesting</w:t>
             </w:r>
           </w:p>
         </w:tc>
@@ -12266,7 +12251,7 @@
                 <w:caps w:val="0"/>
                 <w:sz w:val="22"/>
               </w:rPr>
-              <w:t>DeepNesting</w:t>
+              <w:t>Deep Nesting</w:t>
             </w:r>
           </w:p>
         </w:tc>
@@ -12368,7 +12353,7 @@
                 <w:caps w:val="0"/>
                 <w:sz w:val="22"/>
               </w:rPr>
-              <w:t>DeepNesting</w:t>
+              <w:t>Deep Nesting</w:t>
             </w:r>
           </w:p>
         </w:tc>
@@ -12470,7 +12455,7 @@
                 <w:caps w:val="0"/>
                 <w:sz w:val="22"/>
               </w:rPr>
-              <w:t>LongMethod</w:t>
+              <w:t>Long Method</w:t>
             </w:r>
           </w:p>
         </w:tc>
@@ -12572,7 +12557,7 @@
                 <w:caps w:val="0"/>
                 <w:sz w:val="22"/>
               </w:rPr>
-              <w:t>LongMethod</w:t>
+              <w:t>Long Method</w:t>
             </w:r>
           </w:p>
         </w:tc>
@@ -12674,7 +12659,7 @@
                 <w:caps w:val="0"/>
                 <w:sz w:val="22"/>
               </w:rPr>
-              <w:t>LongMethod</w:t>
+              <w:t>Long Method</w:t>
             </w:r>
           </w:p>
         </w:tc>
@@ -12776,7 +12761,7 @@
                 <w:caps w:val="0"/>
                 <w:sz w:val="22"/>
               </w:rPr>
-              <w:t>LongParameterList</w:t>
+              <w:t>Long Parameter List</w:t>
             </w:r>
           </w:p>
         </w:tc>
@@ -12878,7 +12863,7 @@
                 <w:caps w:val="0"/>
                 <w:sz w:val="22"/>
               </w:rPr>
-              <w:t>LongParameterList</w:t>
+              <w:t>Long Parameter List</w:t>
             </w:r>
           </w:p>
         </w:tc>
@@ -12980,7 +12965,7 @@
                 <w:caps w:val="0"/>
                 <w:sz w:val="22"/>
               </w:rPr>
-              <w:t>LongParameterList</w:t>
+              <w:t>Long Parameter List</w:t>
             </w:r>
           </w:p>
         </w:tc>
@@ -13084,7 +13069,7 @@
           <w:caps w:val="0"/>
           <w:sz w:val="24"/>
         </w:rPr>
-        <w:t>Niveli kritik ka normën më të ulët te 3 nga 4 erërat, dhe te BrainMethod dhe LongMethod niveli i mesëm ka normë më të lartë se i buti.</w:t>
+        <w:t>Niveli kritik ka normën më të ulët te tri nga katër erërat, dhe te Brain Method dhe Long Method niveli i mesëm ka normë më të lartë se i buti.</w:t>
       </w:r>
     </w:p>
     <w:p>
@@ -13100,7 +13085,7 @@
           <w:caps w:val="0"/>
           <w:sz w:val="24"/>
         </w:rPr>
-        <w:t>E bashkuar mbi erërat, niveli kritik del me 23.2% kundrejt 19.7% të niveleve të tjera, renditje e kundërt me atë të erërave veç e veç (paradoksi i Simpson-it): BrainMethod ka normë 29.1% dhe 45.6% vende kritike, ndërsa LongParameterList ka 8.4% dhe 4.9%. Prandaj tabela nuk bashkohet.</w:t>
+        <w:t>E bashkuar mbi erërat, niveli kritik del me 23.2% kundrejt 19.7% të niveleve të tjera, renditje e kundërt me atë të erërave veç e veç (paradoksi i Simpson-it): Brain Method ka normë 29.1% dhe 45.6% vende kritike, ndërsa Long Parameter List ka 8.4% dhe 4.9%. Prandaj tabela nuk bashkohet.</w:t>
       </w:r>
     </w:p>
     <w:p>
@@ -13955,7 +13940,7 @@
           <w:caps w:val="0"/>
           <w:sz w:val="24"/>
         </w:rPr>
-        <w:t>Erërat e reja janë më shpesh LongParameterList, dhe shkaku është i drejtpërdrejtë: Extract Method ia kalon metodës së nxjerrë çdo vlerë që blloku lexonte, ndaj një bllok me gjashtë hyrje prodhon një metodë me gjashtë parametra. Transformimi është i saktë, por e zhvendos problemin. Prandaj numri i vendeve të transformuara nuk lexohet si numri i erërave të hequra: sa u shëruan, sa lëvizi matja dhe sa probleme të reja lindën duhen lexuar bashkë.</w:t>
+        <w:t>Erërat e reja janë më shpesh Long Parameter List, dhe shkaku është i drejtpërdrejtë: Extract Method ia kalon metodës së nxjerrë çdo vlerë që blloku lexonte, ndaj një bllok me gjashtë hyrje prodhon një metodë me gjashtë parametra. Transformimi është i saktë, por e zhvendos problemin. Prandaj numri i vendeve të transformuara nuk lexohet si numri i erërave të hequra: sa u shëruan, sa lëvizi matja dhe sa probleme të reja lindën duhen lexuar bashkë.</w:t>
       </w:r>
     </w:p>
     <w:p>
@@ -14067,7 +14052,7 @@
           <w:caps w:val="0"/>
           <w:sz w:val="24"/>
         </w:rPr>
-        <w:t>Edhe ashpërsia doli rezultat negativ: e llogaritur nga teprica, ajo u pajtua me rishikuesit afërsisht sa rastësia te tri nga katër erërat, duke e mbivlerësuar sistematikisht (Shtojca 8.9). Kalibrimi i pragjeve jashtë fold-it e ngriti MCC-në qartë te Feature Envy dhe Long Method, pak te Blob, e uli te Data Class, dhe foldet nuk pajtohen për të njëjtën vlerë te 3 nga 4 erërat; një prag «optimal» që ndryshon me pjesën e korpusit që shihet është veti e bashkësisë, jo e gjuhës (Shtojca 8.6).</w:t>
+        <w:t>Edhe ashpërsia doli rezultat negativ: e llogaritur nga teprica, ajo u pajtua me rishikuesit afërsisht sa rastësia te tri nga katër erërat, duke e mbivlerësuar sistematikisht (Shtojca 8.9). Kalibrimi i pragjeve jashtë fold-it e ngriti MCC-në qartë te Feature Envy dhe Long Method, pak te Blob, e uli te Data Class, dhe foldet nuk pajtohen për të njëjtën vlerë te tri nga katër erërat; një prag «optimal» që ndryshon me pjesën e korpusit që shihet është veti e bashkësisë, jo e gjuhës (Shtojca 8.6).</w:t>
       </w:r>
     </w:p>
     <w:p>
@@ -14113,7 +14098,7 @@
           <w:caps w:val="0"/>
           <w:sz w:val="24"/>
         </w:rPr>
-        <w:t>Krahasimi më i drejtpërdrejtë është me Madeyski &amp; Lewowski (2023), të cilët trajnuan tetë algoritme mbi të njëjtin dataset MLCQ, me metrikat e PMD-së dhe të CODEBEAT-it si veçori. Në konfigurimin e tyre DS1 një mostër është pozitive kur ashpërsia e saj e agreguar është mbi «none», i njëjti përkufizim që përdor ky punim. Tabela vë përballë MCC-në e të dy qasjeve këtu me mesoren më të mirë të MCC-së që raportojnë ata (Tabela 16).</w:t>
+        <w:t>Krahasimi më i drejtpërdrejtë është me Madeyski &amp; Lewowski (2023), të cilët trajnuan tetë algoritme mbi të njëjtin dataset MLCQ, me metrikat e PMD-së dhe të CODEBEAT-it si veçori. Konfigurimi i tyre DS1 e quan pozitive një mostër me të njëjtin kriter si ky punim (Nënkapitulli 4.9). Tabela vë përballë MCC-në e të dy qasjeve këtu me mesoren më të mirë të MCC-së që raportojnë ata (Tabela 16).</w:t>
       </w:r>
     </w:p>
     <w:p>
@@ -14700,7 +14685,7 @@
           <w:caps w:val="0"/>
           <w:sz w:val="24"/>
         </w:rPr>
-        <w:t xml:space="preserve"> Po, e përmirëson. Modeli i mësuar mbi të njëjtat metrika e ngre MCC-në te të katër erërat: brezi kalon nga 0.232–0.580 në 0.488–0.713, dhe intervalet bootstrap sipas depos e vendosin këtë përparësi mbi zero pa përjashtim. Fitimi vjen kryesisht nga recall-i, që rritet te çdo erë. Një rezervë e vetme: kur rregullit i jepet pragu i tij më i mirë nga fshirja, dallimi te Long Method nuk ndahet më nga zeroja (Shtojca 8.10). Përparësia vlen pra përgjithësisht, jo pikërisht te era ku rregulli punonte tashmë më mirë.</w:t>
+        <w:t xml:space="preserve"> Po, e përmirëson. Modeli i mësuar mbi të njëjtat metrika e ngre MCC-në te të katër erërat: brezi kalon nga 0.232–0.580 në 0.488–0.713, dhe intervalet bootstrap sipas depos e vendosin këtë përparësi mbi zero pa përjashtim. Fitimi vjen kryesisht nga recall-i, që rritet te çdo erë. Një rezervë e vetme: kur rregullit i jepet pragu i tij më i mirë nga fshirja, dallimi te Long Method nuk ndahet më nga zeroja (Shtojca 8.10).</w:t>
       </w:r>
     </w:p>
     <w:p>
@@ -15850,7 +15835,7 @@
                 <w:caps w:val="0"/>
                 <w:sz w:val="22"/>
               </w:rPr>
-              <w:t>Lanza &amp; Marinescu, p. 80</w:t>
+              <w:t>Lanza &amp; Marinescu (2006), f. 80</w:t>
             </w:r>
           </w:p>
         </w:tc>
@@ -15932,7 +15917,7 @@
                 <w:caps w:val="0"/>
                 <w:sz w:val="22"/>
               </w:rPr>
-              <w:t>Lanza &amp; Marinescu, p. 88</w:t>
+              <w:t>Lanza &amp; Marinescu (2006), f. 88</w:t>
             </w:r>
           </w:p>
         </w:tc>
@@ -16014,7 +15999,7 @@
                 <w:caps w:val="0"/>
                 <w:sz w:val="22"/>
               </w:rPr>
-              <w:t>Fowler): size alone, without the cohesion evidence</w:t>
+              <w:t>Fowler (2018)</w:t>
             </w:r>
           </w:p>
         </w:tc>
@@ -16096,7 +16081,7 @@
                 <w:caps w:val="0"/>
                 <w:sz w:val="22"/>
               </w:rPr>
-              <w:t>Lanza &amp; Marinescu, p. 84</w:t>
+              <w:t>Lanza &amp; Marinescu (2006), f. 84</w:t>
             </w:r>
           </w:p>
         </w:tc>
@@ -16158,7 +16143,7 @@
                 <w:caps w:val="0"/>
                 <w:sz w:val="22"/>
               </w:rPr>
-              <w:t>LOC &gt; HIGH/2  AND  CC &gt;= threshold  AND  MAXNESTING &gt;= 3 AND  NOAV &gt; MANY</w:t>
+              <w:t>MLOC &gt; HIGH_METHOD_LOC/2  AND  CC &gt;= 4  AND  MAXNESTING &gt;= 3 AND  NOAV &gt; MANY</w:t>
             </w:r>
           </w:p>
         </w:tc>
@@ -16178,7 +16163,7 @@
                 <w:caps w:val="0"/>
                 <w:sz w:val="22"/>
               </w:rPr>
-              <w:t>Lanza &amp; Marinescu, p. 92</w:t>
+              <w:t>Lanza &amp; Marinescu (2006), f. 92</w:t>
             </w:r>
           </w:p>
         </w:tc>
@@ -16260,7 +16245,7 @@
                 <w:caps w:val="0"/>
                 <w:sz w:val="22"/>
               </w:rPr>
-              <w:t>Fowler): effective lines of code past the threshold</w:t>
+              <w:t>Fowler (2018)</w:t>
             </w:r>
           </w:p>
         </w:tc>
@@ -16342,7 +16327,7 @@
                 <w:caps w:val="0"/>
                 <w:sz w:val="22"/>
               </w:rPr>
-              <w:t>Fowler</w:t>
+              <w:t>Fowler (2018)</w:t>
             </w:r>
           </w:p>
         </w:tc>
@@ -16364,7 +16349,7 @@
                 <w:caps w:val="0"/>
                 <w:sz w:val="22"/>
               </w:rPr>
-              <w:t>Deeply nested control flow</w:t>
+              <w:t>Deep Nesting</w:t>
             </w:r>
           </w:p>
         </w:tc>
@@ -16478,7 +16463,7 @@
           <w:caps w:val="0"/>
           <w:sz w:val="24"/>
         </w:rPr>
-        <w:t>Strategjitë janë shkruar në një fjalor kuantifikuesish e jo në numra të veçantë. Vlerat numerike pas tyre vijnë nga statistikat e metrikave mbi dyzet e pesë sisteme Java dhe C++ (Tabela 18).</w:t>
+        <w:t>Strategjitë janë shkruar në një fjalor kuantifikuesish e jo në numra të veçantë. Vlerat numerike pas tyre vijnë nga statistikat e metrikave mbi dyzet e pesë sisteme Java (Tabela 18).</w:t>
       </w:r>
     </w:p>
     <w:p>
@@ -18309,7 +18294,7 @@
                 <w:caps w:val="0"/>
                 <w:sz w:val="22"/>
               </w:rPr>
-              <w:t>GodClass</w:t>
+              <w:t>God Class</w:t>
             </w:r>
           </w:p>
         </w:tc>
@@ -18329,7 +18314,7 @@
                 <w:caps w:val="0"/>
                 <w:sz w:val="22"/>
               </w:rPr>
-              <w:t>ExtractClass, MoveMethod, ExtractSubclass</w:t>
+              <w:t>Extract Class, Move Method, Extract Subclass</w:t>
             </w:r>
           </w:p>
         </w:tc>
@@ -18371,7 +18356,7 @@
                 <w:caps w:val="0"/>
                 <w:sz w:val="22"/>
               </w:rPr>
-              <w:t>DataClass</w:t>
+              <w:t>Data Class</w:t>
             </w:r>
           </w:p>
         </w:tc>
@@ -18391,7 +18376,7 @@
                 <w:caps w:val="0"/>
                 <w:sz w:val="22"/>
               </w:rPr>
-              <w:t>EncapsulateField, MoveMethod</w:t>
+              <w:t>Encapsulate Field, Move Method</w:t>
             </w:r>
           </w:p>
         </w:tc>
@@ -18433,7 +18418,7 @@
                 <w:caps w:val="0"/>
                 <w:sz w:val="22"/>
               </w:rPr>
-              <w:t>LargeClass</w:t>
+              <w:t>Large Class</w:t>
             </w:r>
           </w:p>
         </w:tc>
@@ -18453,7 +18438,7 @@
                 <w:caps w:val="0"/>
                 <w:sz w:val="22"/>
               </w:rPr>
-              <w:t>ExtractClass, ExtractSubclass</w:t>
+              <w:t>Extract Class, Extract Subclass</w:t>
             </w:r>
           </w:p>
         </w:tc>
@@ -18495,7 +18480,7 @@
                 <w:caps w:val="0"/>
                 <w:sz w:val="22"/>
               </w:rPr>
-              <w:t>FeatureEnvy</w:t>
+              <w:t>Feature Envy</w:t>
             </w:r>
           </w:p>
         </w:tc>
@@ -18515,7 +18500,7 @@
                 <w:caps w:val="0"/>
                 <w:sz w:val="22"/>
               </w:rPr>
-              <w:t>MoveMethod, ExtractMethod</w:t>
+              <w:t>Move Method, Extract Method</w:t>
             </w:r>
           </w:p>
         </w:tc>
@@ -18557,7 +18542,7 @@
                 <w:caps w:val="0"/>
                 <w:sz w:val="22"/>
               </w:rPr>
-              <w:t>BrainMethod</w:t>
+              <w:t>Brain Method</w:t>
             </w:r>
           </w:p>
         </w:tc>
@@ -18577,7 +18562,7 @@
                 <w:caps w:val="0"/>
                 <w:sz w:val="22"/>
               </w:rPr>
-              <w:t>ExtractMethod, ReplaceConditionalWithPolymorphism</w:t>
+              <w:t>Extract Method, Replace Conditional with Polymorphism</w:t>
             </w:r>
           </w:p>
         </w:tc>
@@ -18597,7 +18582,7 @@
                 <w:caps w:val="0"/>
                 <w:sz w:val="22"/>
               </w:rPr>
-              <w:t>aplikohet: ExtractMethod</w:t>
+              <w:t>aplikohet: Extract Method</w:t>
             </w:r>
           </w:p>
         </w:tc>
@@ -18619,7 +18604,7 @@
                 <w:caps w:val="0"/>
                 <w:sz w:val="22"/>
               </w:rPr>
-              <w:t>LongMethod</w:t>
+              <w:t>Long Method</w:t>
             </w:r>
           </w:p>
         </w:tc>
@@ -18639,7 +18624,7 @@
                 <w:caps w:val="0"/>
                 <w:sz w:val="22"/>
               </w:rPr>
-              <w:t>ExtractMethod, DecomposeConditional</w:t>
+              <w:t>Extract Method, Decompose Conditional</w:t>
             </w:r>
           </w:p>
         </w:tc>
@@ -18659,7 +18644,7 @@
                 <w:caps w:val="0"/>
                 <w:sz w:val="22"/>
               </w:rPr>
-              <w:t>aplikohet: ExtractMethod</w:t>
+              <w:t>aplikohet: Extract Method</w:t>
             </w:r>
           </w:p>
         </w:tc>
@@ -18681,7 +18666,7 @@
                 <w:caps w:val="0"/>
                 <w:sz w:val="22"/>
               </w:rPr>
-              <w:t>LongParameterList</w:t>
+              <w:t>Long Parameter List</w:t>
             </w:r>
           </w:p>
         </w:tc>
@@ -18701,7 +18686,7 @@
                 <w:caps w:val="0"/>
                 <w:sz w:val="22"/>
               </w:rPr>
-              <w:t>IntroduceParameterObject, PreserveWholeObject</w:t>
+              <w:t>Introduce Parameter Object, Preserve Whole Object</w:t>
             </w:r>
           </w:p>
         </w:tc>
@@ -18721,7 +18706,7 @@
                 <w:caps w:val="0"/>
                 <w:sz w:val="22"/>
               </w:rPr>
-              <w:t>aplikohet: IntroduceParameterObject</w:t>
+              <w:t>aplikohet: Introduce Parameter Object</w:t>
             </w:r>
           </w:p>
         </w:tc>
@@ -18743,7 +18728,7 @@
                 <w:caps w:val="0"/>
                 <w:sz w:val="22"/>
               </w:rPr>
-              <w:t>DeepNesting</w:t>
+              <w:t>Deep Nesting</w:t>
             </w:r>
           </w:p>
         </w:tc>
@@ -18763,7 +18748,7 @@
                 <w:caps w:val="0"/>
                 <w:sz w:val="22"/>
               </w:rPr>
-              <w:t>ReplaceNestedConditionalWithGuardClauses, ExtractMethod</w:t>
+              <w:t>Replace Nested Conditional with Guard Clauses, Extract Method</w:t>
             </w:r>
           </w:p>
         </w:tc>
@@ -18783,7 +18768,7 @@
                 <w:caps w:val="0"/>
                 <w:sz w:val="22"/>
               </w:rPr>
-              <w:t>aplikohet: ReplaceNestedConditionalWithGuardClauses</w:t>
+              <w:t>aplikohet: Replace Nested Conditional with Guard Clauses</w:t>
             </w:r>
           </w:p>
         </w:tc>
@@ -18894,7 +18879,7 @@
                 <w:caps w:val="0"/>
                 <w:sz w:val="22"/>
               </w:rPr>
-              <w:t>unresolved_name</w:t>
+              <w:t>unresolved name</w:t>
             </w:r>
           </w:p>
         </w:tc>
@@ -18936,7 +18921,7 @@
                 <w:caps w:val="0"/>
                 <w:sz w:val="22"/>
               </w:rPr>
-              <w:t>possible_side_effect</w:t>
+              <w:t>possible side effect</w:t>
             </w:r>
           </w:p>
         </w:tc>
@@ -18978,7 +18963,7 @@
                 <w:caps w:val="0"/>
                 <w:sz w:val="22"/>
               </w:rPr>
-              <w:t>ambiguous_overload</w:t>
+              <w:t>ambiguous overload</w:t>
             </w:r>
           </w:p>
         </w:tc>
@@ -19020,7 +19005,7 @@
                 <w:caps w:val="0"/>
                 <w:sz w:val="22"/>
               </w:rPr>
-              <w:t>multiple_outputs</w:t>
+              <w:t>multiple outputs</w:t>
             </w:r>
           </w:p>
         </w:tc>
@@ -19062,7 +19047,7 @@
                 <w:caps w:val="0"/>
                 <w:sz w:val="22"/>
               </w:rPr>
-              <w:t>control_flow_escapes</w:t>
+              <w:t>control flow escapes</w:t>
             </w:r>
           </w:p>
         </w:tc>
@@ -19104,7 +19089,7 @@
                 <w:caps w:val="0"/>
                 <w:sz w:val="22"/>
               </w:rPr>
-              <w:t>shape_not_matched</w:t>
+              <w:t>shape not matched</w:t>
             </w:r>
           </w:p>
         </w:tc>
@@ -19146,7 +19131,7 @@
                 <w:caps w:val="0"/>
                 <w:sz w:val="22"/>
               </w:rPr>
-              <w:t>edit_conflict</w:t>
+              <w:t>edit conflict</w:t>
             </w:r>
           </w:p>
         </w:tc>
@@ -19188,7 +19173,7 @@
                 <w:caps w:val="0"/>
                 <w:sz w:val="22"/>
               </w:rPr>
-              <w:t>not_definitely_assigned</w:t>
+              <w:t>not definitely assigned</w:t>
             </w:r>
           </w:p>
         </w:tc>
@@ -21752,7 +21737,7 @@
                 <w:caps w:val="0"/>
                 <w:sz w:val="22"/>
               </w:rPr>
-              <w:t>40b3d7b240</w:t>
+              <w:t>44edc463a6</w:t>
             </w:r>
           </w:p>
         </w:tc>
@@ -21918,7 +21903,7 @@
           <w:caps w:val="0"/>
           <w:sz w:val="24"/>
         </w:rPr>
-        <w:t>Ky premtim u vu në provë më 3 shtator 2026. Trembëdhjetë nga pesëmbëdhjetë hapat u ri-ekzekutuan mbi të njëjtat hyrje, dhe të gjithë, me një përjashtim, dhanë skedarë identikë me të komituarit, veç commit-it dhe kohëzgjatjes që regjistrojnë. Tabela e veçorive, 4.534 rreshta, doli bajt për bajt identike; po ashtu të katër modelet e stërvitura, dhe asnjë figurë nuk ndryshoi.</w:t>
+        <w:t>Ky premtim u vu në provë më 3 shtator 2026. Trembëdhjetë nga pesëmbëdhjetë hapat që kishte atëherë tabela u ri-ekzekutuan mbi të njëjtat hyrje, dhe të gjithë, me një përjashtim, dhanë skedarë identikë me të komituarit, veç commit-it dhe kohëzgjatjes që regjistrojnë. Tabela e veçorive, 4534 rreshta, doli bajt për bajt identike; po ashtu të katër modelet e stërvitura, dhe asnjë figurë nuk ndryshoi.</w:t>
       </w:r>
     </w:p>
     <w:p>
@@ -24075,7 +24060,7 @@
                 <w:caps w:val="0"/>
                 <w:sz w:val="22"/>
               </w:rPr>
-              <w:t>Era</w:t>
+              <w:t>Erë</w:t>
             </w:r>
           </w:p>
         </w:tc>
@@ -24135,7 +24120,7 @@
                 <w:caps w:val="0"/>
                 <w:sz w:val="22"/>
               </w:rPr>
-              <w:t>MCC ynë</w:t>
+              <w:t>MCC i punimit</w:t>
             </w:r>
           </w:p>
         </w:tc>
@@ -24689,7 +24674,7 @@
           <w:caps w:val="0"/>
           <w:sz w:val="24"/>
         </w:rPr>
-        <w:t>Nga 4 krahasimet me përgjigje, detektorët e këtij punimi dalin përpara te 2 dhe PMD te asnjëri. Te 2 prej tyre intervali e përmban zeron, pra dy anët nuk dallohen mbi këtë dëshmi.</w:t>
+        <w:t>Nga katër krahasimet me përgjigje, detektorët e këtij punimi dalin përpara te dy dhe PMD te asnjëri. Te dy prej tyre intervali e përmban zeron, pra dy anët nuk dallohen mbi këtë dëshmi.</w:t>
       </w:r>
     </w:p>
     <w:p>
@@ -24721,7 +24706,7 @@
           <w:caps w:val="0"/>
           <w:sz w:val="24"/>
         </w:rPr>
-        <w:t>Krahasimi e favorizon këtë punim në drejtimin e deklaruar te Nënkapitulli 4.9, sepse PMD e llogarit ATFD-në vetëm brenda një skedari. Heqja e handikapit do të kërkonte ndërtimin e çdo depoje në commit-in e vet historik, çka korpusi nuk e lejon (Nënkapitulli 6.6).</w:t>
+        <w:t>Krahasimi e favorizon këtë punim në drejtimin e deklaruar te Nënkapitulli 4.9, sepse PMD e llogarit ATFD-në vetëm brenda një skedari. Heqja e handikapit do të kërkonte ndërtimin e çdo depoje në commit-in e vet historik, çka korpusi nuk e lejon (Nënkapitulli 3.4).</w:t>
       </w:r>
     </w:p>
     <w:p>
@@ -24813,7 +24798,7 @@
                 <w:caps w:val="0"/>
                 <w:sz w:val="22"/>
               </w:rPr>
-              <w:t>Era</w:t>
+              <w:t>Erë</w:t>
             </w:r>
           </w:p>
         </w:tc>
@@ -25032,7 +25017,7 @@
                 <w:caps w:val="0"/>
                 <w:sz w:val="22"/>
               </w:rPr>
-              <w:t>Era</w:t>
+              <w:t>Erë</w:t>
             </w:r>
           </w:p>
         </w:tc>
@@ -27959,7 +27944,7 @@
                 <w:caps w:val="0"/>
                 <w:sz w:val="22"/>
               </w:rPr>
-              <w:t>9 849</w:t>
+              <w:t>9849</w:t>
             </w:r>
           </w:p>
         </w:tc>
@@ -28041,7 +28026,7 @@
                 <w:caps w:val="0"/>
                 <w:sz w:val="22"/>
               </w:rPr>
-              <w:t>5 786</w:t>
+              <w:t>5786</w:t>
             </w:r>
           </w:p>
         </w:tc>
@@ -28123,7 +28108,7 @@
                 <w:caps w:val="0"/>
                 <w:sz w:val="22"/>
               </w:rPr>
-              <w:t>2 762</w:t>
+              <w:t>2762</w:t>
             </w:r>
           </w:p>
         </w:tc>
@@ -28205,7 +28190,7 @@
                 <w:caps w:val="0"/>
                 <w:sz w:val="22"/>
               </w:rPr>
-              <w:t>6 507</w:t>
+              <w:t>6507</w:t>
             </w:r>
           </w:p>
         </w:tc>
@@ -29055,7 +29040,7 @@
           <w:caps w:val="0"/>
           <w:sz w:val="24"/>
         </w:rPr>
-        <w:t>Kjo renditje përputhet me një matje të pavarur: veçoritë që modeli i Qasjes B zgjodhi për Blob-in (Nënkapitulli 5.2) ndajnë 3 nga katër vendet e para me të: NOF, CLOC, NOAM. As TCC-ja dhe as WMC-ja, kushtet e strategjisë së botuar, nuk hyjnë te asnjëra listë (Tabela 35).</w:t>
+        <w:t>Kjo renditje përputhet me një matje të pavarur: veçoritë që modeli i Qasjes B zgjodhi për Blob-in (Figura e Nënkapitullit 5.2) ndajnë tri nga katër vendet e para me të: NOF, CLOC, NOAM. As TCC-ja dhe as WMC-ja, kushtet e strategjisë së botuar, nuk hyjnë te asnjëra listë (Tabela 35).</w:t>
       </w:r>
     </w:p>
     <w:p>

</xml_diff>

<commit_message>
Perditeso punimin me rezultatet e reja
</commit_message>
<xml_diff>
--- a/docs/thesis/Punim_Diplome_Florent_Latifi.docx
+++ b/docs/thesis/Punim_Diplome_Florent_Latifi.docx
@@ -584,7 +584,7 @@
           <w:caps w:val="0"/>
           <w:sz w:val="24"/>
         </w:rPr>
-        <w:t>Strategjitë e publikuara dolën të sakta por të kursyera: precizion 0.520 deri 0.872 me recall 0.100 deri 0.440. Klasifikuesit i tejkaluan qartë, me MCC 0.488 deri 0.713 kundrejt 0.232 deri 0.580. Intervalet e besimit me bootstrap sipas depos tregojnë se ajo përparësi e kalon zeron te të katër erërat.</w:t>
+        <w:t>Strategjitë e publikuara dolën të sakta por të kursyera: precizion 0.520 deri 0.872 me recall 0.100 deri 0.440. Klasifikuesit i tejkaluan qartë, me MCC 0.488 deri 0.724 kundrejt 0.232 deri 0.580. Intervalet e besimit me bootstrap sipas depos tregojnë se ajo përparësi e kalon zeron te të katër erërat.</w:t>
       </w:r>
     </w:p>
     <w:p>
@@ -600,7 +600,7 @@
           <w:caps w:val="0"/>
           <w:sz w:val="24"/>
         </w:rPr>
-        <w:t>Dy rezultate janë negative dhe raportohen si të tilla. Ashpërsia që sistemi e derivon nga teprica mbi pragje nuk e riprodhon gjykimin e rishikuesve: pajtimi i matur me kappa me peshë qëndron te 0.007 deri 0.293, dhe gabimi anon nga mbivlerësimi. Po ashtu, vetë rishikuesit pajtohen mes tyre me MCC 0.022 deri 0.238, çka tregon se një pjesë e pareduktueshme e gabimit të çdo detektori i takon përkufizimit të erës dhe jo detektorit. Motori i refaktorimit automatizon tri transformime dhe transformoi 20.4% të vendeve të detektuara; refuzimi trajtohet si rezultat i saktë dhe numërohet. Kontributi kryesor nuk është një shifër e vetme, por një zinxhir i plotë dhe i riprodhueshëm, nga korpusi deri te rezultati.</w:t>
+        <w:t>Dy rezultate janë negative dhe raportohen si të tilla. Ashpërsia që sistemi e derivon nga teprica mbi pragje nuk e riprodhon gjykimin e rishikuesve: pajtimi i matur me kappa me peshë qëndron te 0.007 deri 0.293, dhe gabimi anon nga mbivlerësimi. Po ashtu, vetë rishikuesit pajtohen mes tyre me MCC 0.022 deri 0.238, çka tregon se një pjesë e pareduktueshme e gabimit të çdo detektori i takon përkufizimit të erës dhe jo detektorit. Motori i refaktorimit automatizon tri transformime dhe transformoi 22.4% të vendeve të detektuara; refuzimi trajtohet si rezultat i saktë dhe numërohet. Kontributi kryesor nuk është një shifër e vetme, por një zinxhir i plotë dhe i riprodhueshëm, nga korpusi deri te rezultati.</w:t>
       </w:r>
     </w:p>
     <w:p>
@@ -955,7 +955,7 @@
           <w:caps w:val="0"/>
           <w:sz w:val="24"/>
         </w:rPr>
-        <w:t>Tabela 6. Pajtimi mes dy qasjeve</w:t>
+        <w:t>Tabela 6. MCC me metrikat e strategjisë dhe me të gjitha metrikat</w:t>
       </w:r>
     </w:p>
     <w:p>
@@ -971,7 +971,7 @@
           <w:caps w:val="0"/>
           <w:sz w:val="24"/>
         </w:rPr>
-        <w:t>Tabela 7. Të dyja qasjet së bashku</w:t>
+        <w:t>Tabela 7. Pajtimi mes dy qasjeve</w:t>
       </w:r>
     </w:p>
     <w:p>
@@ -987,7 +987,7 @@
           <w:caps w:val="0"/>
           <w:sz w:val="24"/>
         </w:rPr>
-        <w:t>Tabela 8. Rezultati i motorit të refaktorimit</w:t>
+        <w:t>Tabela 8. Të dyja qasjet së bashku</w:t>
       </w:r>
     </w:p>
     <w:p>
@@ -1003,7 +1003,7 @@
           <w:caps w:val="0"/>
           <w:sz w:val="24"/>
         </w:rPr>
-        <w:t>Tabela 9. Pse u refuzuan</w:t>
+        <w:t>Tabela 9. Rezultati i motorit të refaktorimit</w:t>
       </w:r>
     </w:p>
     <w:p>
@@ -1019,7 +1019,7 @@
           <w:caps w:val="0"/>
           <w:sz w:val="24"/>
         </w:rPr>
-        <w:t>Tabela 10. Verifikimi i atyre që u aplikuan</w:t>
+        <w:t>Tabela 10. Pse u refuzuan</w:t>
       </w:r>
     </w:p>
     <w:p>
@@ -1035,7 +1035,7 @@
           <w:caps w:val="0"/>
           <w:sz w:val="24"/>
         </w:rPr>
-        <w:t>Tabela 11. A u hoq era pas rishkrimit</w:t>
+        <w:t>Tabela 11. Verifikimi i atyre që u aplikuan</w:t>
       </w:r>
     </w:p>
     <w:p>
@@ -1051,7 +1051,7 @@
           <w:caps w:val="0"/>
           <w:sz w:val="24"/>
         </w:rPr>
-        <w:t>Tabela 12. Sa lëvizi matja pas rishkrimit</w:t>
+        <w:t>Tabela 12. A u hoq era pas rishkrimit</w:t>
       </w:r>
     </w:p>
     <w:p>
@@ -1067,7 +1067,7 @@
           <w:caps w:val="0"/>
           <w:sz w:val="24"/>
         </w:rPr>
-        <w:t>Tabela 13. Verdikti i të njëjtave rishkrime, të izoluara dhe brenda projektit</w:t>
+        <w:t>Tabela 13. Sa lëvizi matja pas rishkrimit</w:t>
       </w:r>
     </w:p>
     <w:p>
@@ -1083,7 +1083,7 @@
           <w:caps w:val="0"/>
           <w:sz w:val="24"/>
         </w:rPr>
-        <w:t>Tabela 14. Norma e transformimit sipas erës dhe ashpërsisë</w:t>
+        <w:t>Tabela 14. Verdikti i të njëjtave rishkrime, të izoluara dhe brenda projektit</w:t>
       </w:r>
     </w:p>
     <w:p>
@@ -1099,7 +1099,7 @@
           <w:caps w:val="0"/>
           <w:sz w:val="24"/>
         </w:rPr>
-        <w:t>Tabela 15. Përbërja e arsyeve të refuzimit brenda çdo niveli</w:t>
+        <w:t>Tabela 15. Norma e transformimit sipas erës dhe ashpërsisë</w:t>
       </w:r>
     </w:p>
     <w:p>
@@ -1115,7 +1115,7 @@
           <w:caps w:val="0"/>
           <w:sz w:val="24"/>
         </w:rPr>
-        <w:t>Tabela 16. Krahasimi i MCC-së me Madeyski &amp; Lewowski (2023), mbi MLCQ</w:t>
+        <w:t>Tabela 16. Përbërja e arsyeve të refuzimit brenda çdo niveli</w:t>
       </w:r>
     </w:p>
     <w:p>
@@ -1131,7 +1131,7 @@
           <w:caps w:val="0"/>
           <w:sz w:val="24"/>
         </w:rPr>
-        <w:t>Tabela 17. Strategjitë e detektimit dhe burimet e tyre</w:t>
+        <w:t>Tabela 17. Krahasimi i MCC-së me Madeyski &amp; Lewowski (2023), mbi MLCQ</w:t>
       </w:r>
     </w:p>
     <w:p>
@@ -1147,7 +1147,7 @@
           <w:caps w:val="0"/>
           <w:sz w:val="24"/>
         </w:rPr>
-        <w:t>Tabela 18. Kuantifikuesit e përgjithshëm</w:t>
+        <w:t>Tabela 18. Strategjitë e detektimit dhe burimet e tyre</w:t>
       </w:r>
     </w:p>
     <w:p>
@@ -1163,7 +1163,7 @@
           <w:caps w:val="0"/>
           <w:sz w:val="24"/>
         </w:rPr>
-        <w:t>Tabela 19. Pragjet e përdorura</w:t>
+        <w:t>Tabela 19. Kuantifikuesit e përgjithshëm</w:t>
       </w:r>
     </w:p>
     <w:p>
@@ -1179,7 +1179,7 @@
           <w:caps w:val="0"/>
           <w:sz w:val="24"/>
         </w:rPr>
-        <w:t>Tabela 20. Metrikat sipas nivelit</w:t>
+        <w:t>Tabela 20. Pragjet e përdorura</w:t>
       </w:r>
     </w:p>
     <w:p>
@@ -1195,7 +1195,7 @@
           <w:caps w:val="0"/>
           <w:sz w:val="24"/>
         </w:rPr>
-        <w:t>Tabela 21. Çka propozohet dhe çka aplikohet</w:t>
+        <w:t>Tabela 21. Metrikat sipas nivelit</w:t>
       </w:r>
     </w:p>
     <w:p>
@@ -1211,7 +1211,7 @@
           <w:caps w:val="0"/>
           <w:sz w:val="24"/>
         </w:rPr>
-        <w:t>Tabela 22. Arsyet e refuzimit</w:t>
+        <w:t>Tabela 22. Çka propozohet dhe çka aplikohet</w:t>
       </w:r>
     </w:p>
     <w:p>
@@ -1227,7 +1227,7 @@
           <w:caps w:val="0"/>
           <w:sz w:val="24"/>
         </w:rPr>
-        <w:t>Tabela 23. Radha e ekzekutimit</w:t>
+        <w:t>Tabela 23. Arsyet e refuzimit</w:t>
       </w:r>
     </w:p>
     <w:p>
@@ -1243,7 +1243,7 @@
           <w:caps w:val="0"/>
           <w:sz w:val="24"/>
         </w:rPr>
-        <w:t>Tabela 24. Commit-i që prodhoi çdo skedar rezultati</w:t>
+        <w:t>Tabela 24. Radha e ekzekutimit</w:t>
       </w:r>
     </w:p>
     <w:p>
@@ -1259,7 +1259,7 @@
           <w:caps w:val="0"/>
           <w:sz w:val="24"/>
         </w:rPr>
-        <w:t>Tabela 25. Sa lëviz MCC-ja kur zhvendoset një prag</w:t>
+        <w:t>Tabela 25. Commit-i që prodhoi çdo skedar rezultati</w:t>
       </w:r>
     </w:p>
     <w:p>
@@ -1275,7 +1275,7 @@
           <w:caps w:val="0"/>
           <w:sz w:val="24"/>
         </w:rPr>
-        <w:t>Tabela 26. Rregullat me pragje të kalibruara, të pikëzuara jashtë fold-it</w:t>
+        <w:t>Tabela 26. Sa lëviz MCC-ja kur zhvendoset një prag</w:t>
       </w:r>
     </w:p>
     <w:p>
@@ -1291,7 +1291,7 @@
           <w:caps w:val="0"/>
           <w:sz w:val="24"/>
         </w:rPr>
-        <w:t>Tabela 27. Detektorët e këtij punimi kundrejt PMD-së, mbi të njëjtat mostra</w:t>
+        <w:t>Tabela 27. Rregullat me pragje të kalibruara, të pikëzuara jashtë fold-it</w:t>
       </w:r>
     </w:p>
     <w:p>
@@ -1307,7 +1307,7 @@
           <w:caps w:val="0"/>
           <w:sz w:val="24"/>
         </w:rPr>
-        <w:t>Tabela 28. Sa klauzola dështuan te secila mospërputhje</w:t>
+        <w:t>Tabela 28. Detektorët e këtij punimi kundrejt PMD-së, mbi të njëjtat mostra</w:t>
       </w:r>
     </w:p>
     <w:p>
@@ -1323,7 +1323,7 @@
           <w:caps w:val="0"/>
           <w:sz w:val="24"/>
         </w:rPr>
-        <w:t>Tabela 29. Kur një klauzolë e vetme e ndal strategjinë</w:t>
+        <w:t>Tabela 29. Sa klauzola dështuan te secila mospërputhje</w:t>
       </w:r>
     </w:p>
     <w:p>
@@ -1339,7 +1339,7 @@
           <w:caps w:val="0"/>
           <w:sz w:val="24"/>
         </w:rPr>
-        <w:t>Tabela 30. Pajtimi i ashpërsisë me rishikuesit</w:t>
+        <w:t>Tabela 30. Kur një klauzolë e vetme e ndal strategjinë</w:t>
       </w:r>
     </w:p>
     <w:p>
@@ -1355,7 +1355,7 @@
           <w:caps w:val="0"/>
           <w:sz w:val="24"/>
         </w:rPr>
-        <w:t>Tabela 31. Intervale besimi 95% për MCC-në</w:t>
+        <w:t>Tabela 31. Pajtimi i ashpërsisë me rishikuesit</w:t>
       </w:r>
     </w:p>
     <w:p>
@@ -1371,7 +1371,7 @@
           <w:caps w:val="0"/>
           <w:sz w:val="24"/>
         </w:rPr>
-        <w:t>Tabela 32. B − A kur rregullat marrin pragun e tyre më të mirë</w:t>
+        <w:t>Tabela 32. Intervale besimi 95% për MCC-në</w:t>
       </w:r>
     </w:p>
     <w:p>
@@ -1387,7 +1387,7 @@
           <w:caps w:val="0"/>
           <w:sz w:val="24"/>
         </w:rPr>
-        <w:t>Tabela 33. Sa pajtohen rishikuesit me njëri-tjetrin</w:t>
+        <w:t>Tabela 33. B − A kur rregullat marrin pragun e tyre më të mirë</w:t>
       </w:r>
     </w:p>
     <w:p>
@@ -1403,7 +1403,7 @@
           <w:caps w:val="0"/>
           <w:sz w:val="24"/>
         </w:rPr>
-        <w:t>Tabela 34. Madhësia e klasave në secilën qelizë, si kuartil i poshtëm–mesatare–i sipërm</w:t>
+        <w:t>Tabela 34. Sa pajtohen rishikuesit me njëri-tjetrin</w:t>
       </w:r>
     </w:p>
     <w:p>
@@ -1419,7 +1419,7 @@
           <w:caps w:val="0"/>
           <w:sz w:val="24"/>
         </w:rPr>
-        <w:t>Tabela 35. Recall-i sipas ashpërsisë që caktuan rishikuesit, agregim MAX</w:t>
+        <w:t>Tabela 35. Madhësia e klasave në secilën qelizë, si kuartil i poshtëm–mesatare–i sipërm</w:t>
       </w:r>
     </w:p>
     <w:p>
@@ -1435,7 +1435,23 @@
           <w:caps w:val="0"/>
           <w:sz w:val="24"/>
         </w:rPr>
-        <w:t>Tabela 36. Klasat që klauzola e kohezionit nuk i arrin dot</w:t>
+        <w:t>Tabela 36. Recall-i sipas ashpërsisë që caktuan rishikuesit, agregim MAX</w:t>
+      </w:r>
+    </w:p>
+    <w:p>
+      <w:pPr>
+        <w:spacing w:line="360" w:lineRule="auto"/>
+        <w:ind w:firstLine="360"/>
+        <w:jc w:val="both"/>
+      </w:pPr>
+      <w:r>
+        <w:rPr>
+          <w:rFonts w:ascii="Times New Roman" w:hAnsi="Times New Roman" w:eastAsia="Times New Roman"/>
+          <w:b w:val="0"/>
+          <w:caps w:val="0"/>
+          <w:sz w:val="24"/>
+        </w:rPr>
+        <w:t>Tabela 37. Klasat që klauzola e kohezionit nuk i arrin dot</w:t>
       </w:r>
     </w:p>
     <w:p>
@@ -4397,7 +4413,23 @@
           <w:caps w:val="0"/>
           <w:sz w:val="24"/>
         </w:rPr>
-        <w:t>Sistemi zbaton tetë strategji. God Class, Data Class, Feature Envy dhe Brain Method zbatohen ashtu siç janë publikuar nga Lanza &amp; Marinescu (2006); Large Class, Long Method dhe Long Parameter List ndjekin përshkrimet e Fowler-it (2018), dhe Deep Nesting mat thellësinë e ndërfutjes së blloqeve. Kushtet dhe burimi i secilës jepen te Shtojca 8.1. Çdo prag rri i centralizuar në një skedar të vetëm dhe çdo numër aty ka citim; një vlerë që nuk i atribuohet dot një burimi nuk përdoret.</w:t>
+        <w:t>Sistemi zbaton tetë strategji. God Class, Data Class, Feature Envy dhe Brain Method zbatohen ashtu siç janë publikuar nga Lanza &amp; Marinescu (2006); Large Class, Long Method dhe Long Parameter List ndjekin përshkrimet e Fowler-it (2018), dhe Deep Nesting mat thellësinë e ndërfutjes së blloqeve. Kushtet dhe burimi i secilës jepen te Shtojca 8.1.</w:t>
+      </w:r>
+    </w:p>
+    <w:p>
+      <w:pPr>
+        <w:spacing w:line="360" w:lineRule="auto"/>
+        <w:ind w:firstLine="360"/>
+        <w:jc w:val="both"/>
+      </w:pPr>
+      <w:r>
+        <w:rPr>
+          <w:rFonts w:ascii="Times New Roman" w:hAnsi="Times New Roman" w:eastAsia="Times New Roman"/>
+          <w:b w:val="0"/>
+          <w:caps w:val="0"/>
+          <w:sz w:val="24"/>
+        </w:rPr>
+        <w:t>Katër pragje nuk kanë burim të botuar dhe janë zgjedhje të autorit: kufiri i Long Method (30 rreshta), dy kushte të Brain Method (CC ≥ 4, ndërfutja ≥ 3) dhe kufiri i Deep Nesting (&gt; 3). I pari zhvendoset te Shtojca 8.6; tre të tjerët nuk maten dot kundrejt MLCQ-së. Të autorit janë edhe tre pragjet e ashpërsisë (Shtojca 8.9); të tjerat vijnë nga Lanza &amp; Marinescu (Shtojca 8.2).</w:t>
       </w:r>
     </w:p>
     <w:p>
@@ -4475,7 +4507,7 @@
           <w:caps w:val="0"/>
           <w:sz w:val="24"/>
         </w:rPr>
-        <w:t>Klasifikuesi i shumicës, që parashikon gjithmonë «pa erë», raportohet si model bazë.</w:t>
+        <w:t>Klasifikuesi i shumicës, që parashikon gjithmonë «pa erë», raportohet si model bazë. Të njëjtat modele trajnohen edhe vetëm me metrikat e strategjisë, që fitimi të mos ngatërrohet me metrikat shtesë.</w:t>
       </w:r>
     </w:p>
     <w:p>
@@ -4749,7 +4781,7 @@
           <w:caps w:val="0"/>
           <w:sz w:val="24"/>
         </w:rPr>
-        <w:t>Shërbimi HTTP ofron njëmbëdhjetë pika hyrjeje. /health jep gjendjen, /analyze analizon një projekt ose skedar, /metrics jep metrikat e një entiteti, /source kodin e tij, /browse nënndosjet e një shtegu dhe /projects/github importon një depo publike. Pesë të tjera janë nën /refactor: pamja paraprake e një rishkrimi (preview), diff-i i të gjitha rishkrimeve të verifikuara (patch, edhe si rrjedhë progresi), pyetja nëse shkrimi lejohet (tree) dhe shkrimi në disk (apply). Çdo pikë e validon kërkesën, thërret të njëjtat funksione si rreshti i komandës dhe e kthen përgjigjen si JSON.</w:t>
+        <w:t>Shërbimi HTTP ofron njëmbëdhjetë pika hyrjeje: analizën e një projekti, metrikat dhe kodin e një entiteti, shfletimin e dosjeve, importin nga GitHub, gjendjen e shërbimit, dhe pesë pika nën /refactor për pamjen paraprake, patch-in, kontrollin dhe shkrimin në disk. Çdo pikë e validon kërkesën, thërret të njëjtat funksione si rreshti i komandës dhe kthen JSON.</w:t>
       </w:r>
     </w:p>
     <w:p>
@@ -5033,7 +5065,7 @@
           <w:caps w:val="0"/>
           <w:sz w:val="24"/>
         </w:rPr>
-        <w:t>Rregulli kryesor i testimit është se asnjë prag, metrikë apo detektor nuk ndryshohet që të kalojë një test. Kur kodi dhe testi nuk pajtohen, gjendet më parë cili prej tyre është i gabuar. Në verifikimin e fundit, më 18 shtator 2026, kaluan 688 teste të backend-it, me mbulim 96% të kodit, dhe 165 teste të ndërfaqes.</w:t>
+        <w:t>Rregulli kryesor i testimit është se asnjë prag, metrikë apo detektor nuk ndryshohet që të kalojë një test. Kur kodi dhe testi nuk pajtohen, gjendet më parë cili prej tyre është i gabuar. Në verifikimin e fundit, më 22 shtator 2026, kaluan 700 teste të backend-it, me mbulim 96% të kodit, dhe 165 teste të ndërfaqes.</w:t>
       </w:r>
     </w:p>
     <w:p>
@@ -6904,7 +6936,7 @@
                 <w:caps w:val="0"/>
                 <w:sz w:val="22"/>
               </w:rPr>
-              <w:t>gradient boosting</w:t>
+              <w:t>random forest</w:t>
             </w:r>
           </w:p>
         </w:tc>
@@ -6924,6 +6956,26 @@
                 <w:caps w:val="0"/>
                 <w:sz w:val="22"/>
               </w:rPr>
+              <w:t>0.600</w:t>
+            </w:r>
+          </w:p>
+        </w:tc>
+        <w:tc>
+          <w:tcPr>
+            <w:tcW w:type="dxa" w:w="1473"/>
+          </w:tcPr>
+          <w:p>
+            <w:pPr>
+              <w:spacing w:line="240" w:lineRule="auto"/>
+              <w:jc w:val="left"/>
+            </w:pPr>
+            <w:r>
+              <w:rPr>
+                <w:rFonts w:ascii="Times New Roman" w:hAnsi="Times New Roman" w:eastAsia="Times New Roman"/>
+                <w:b w:val="0"/>
+                <w:caps w:val="0"/>
+                <w:sz w:val="22"/>
+              </w:rPr>
               <w:t>0.629</w:t>
             </w:r>
           </w:p>
@@ -6944,7 +6996,7 @@
                 <w:caps w:val="0"/>
                 <w:sz w:val="22"/>
               </w:rPr>
-              <w:t>0.591</w:t>
+              <w:t>0.614</w:t>
             </w:r>
           </w:p>
         </w:tc>
@@ -6964,27 +7016,7 @@
                 <w:caps w:val="0"/>
                 <w:sz w:val="22"/>
               </w:rPr>
-              <w:t>0.609</w:t>
-            </w:r>
-          </w:p>
-        </w:tc>
-        <w:tc>
-          <w:tcPr>
-            <w:tcW w:type="dxa" w:w="1473"/>
-          </w:tcPr>
-          <w:p>
-            <w:pPr>
-              <w:spacing w:line="240" w:lineRule="auto"/>
-              <w:jc w:val="left"/>
-            </w:pPr>
-            <w:r>
-              <w:rPr>
-                <w:rFonts w:ascii="Times New Roman" w:hAnsi="Times New Roman" w:eastAsia="Times New Roman"/>
-                <w:b w:val="0"/>
-                <w:caps w:val="0"/>
-                <w:sz w:val="22"/>
-              </w:rPr>
-              <w:t>0.500</w:t>
+              <w:t>0.498</w:t>
             </w:r>
           </w:p>
         </w:tc>
@@ -7046,7 +7078,7 @@
                 <w:caps w:val="0"/>
                 <w:sz w:val="22"/>
               </w:rPr>
-              <w:t>0.727</w:t>
+              <w:t>0.722</w:t>
             </w:r>
           </w:p>
         </w:tc>
@@ -7066,7 +7098,7 @@
                 <w:caps w:val="0"/>
                 <w:sz w:val="22"/>
               </w:rPr>
-              <w:t>0.667</w:t>
+              <w:t>0.722</w:t>
             </w:r>
           </w:p>
         </w:tc>
@@ -7086,27 +7118,27 @@
                 <w:caps w:val="0"/>
                 <w:sz w:val="22"/>
               </w:rPr>
+              <w:t>0.722</w:t>
+            </w:r>
+          </w:p>
+        </w:tc>
+        <w:tc>
+          <w:tcPr>
+            <w:tcW w:type="dxa" w:w="1473"/>
+          </w:tcPr>
+          <w:p>
+            <w:pPr>
+              <w:spacing w:line="240" w:lineRule="auto"/>
+              <w:jc w:val="left"/>
+            </w:pPr>
+            <w:r>
+              <w:rPr>
+                <w:rFonts w:ascii="Times New Roman" w:hAnsi="Times New Roman" w:eastAsia="Times New Roman"/>
+                <w:b w:val="0"/>
+                <w:caps w:val="0"/>
+                <w:sz w:val="22"/>
+              </w:rPr>
               <w:t>0.696</w:t>
-            </w:r>
-          </w:p>
-        </w:tc>
-        <w:tc>
-          <w:tcPr>
-            <w:tcW w:type="dxa" w:w="1473"/>
-          </w:tcPr>
-          <w:p>
-            <w:pPr>
-              <w:spacing w:line="240" w:lineRule="auto"/>
-              <w:jc w:val="left"/>
-            </w:pPr>
-            <w:r>
-              <w:rPr>
-                <w:rFonts w:ascii="Times New Roman" w:hAnsi="Times New Roman" w:eastAsia="Times New Roman"/>
-                <w:b w:val="0"/>
-                <w:caps w:val="0"/>
-                <w:sz w:val="22"/>
-              </w:rPr>
-              <w:t>0.669</w:t>
             </w:r>
           </w:p>
         </w:tc>
@@ -7168,7 +7200,7 @@
                 <w:caps w:val="0"/>
                 <w:sz w:val="22"/>
               </w:rPr>
-              <w:t>0.732</w:t>
+              <w:t>0.740</w:t>
             </w:r>
           </w:p>
         </w:tc>
@@ -7188,7 +7220,7 @@
                 <w:caps w:val="0"/>
                 <w:sz w:val="22"/>
               </w:rPr>
-              <w:t>0.782</w:t>
+              <w:t>0.792</w:t>
             </w:r>
           </w:p>
         </w:tc>
@@ -7208,7 +7240,7 @@
                 <w:caps w:val="0"/>
                 <w:sz w:val="22"/>
               </w:rPr>
-              <w:t>0.756</w:t>
+              <w:t>0.765</w:t>
             </w:r>
           </w:p>
         </w:tc>
@@ -7228,7 +7260,7 @@
                 <w:caps w:val="0"/>
                 <w:sz w:val="22"/>
               </w:rPr>
-              <w:t>0.713</w:t>
+              <w:t>0.724</w:t>
             </w:r>
           </w:p>
         </w:tc>
@@ -7252,7 +7284,7 @@
           <w:caps w:val="0"/>
           <w:sz w:val="24"/>
         </w:rPr>
-        <w:t>MCC-ja më e lartë e arritur është 0.713. Veçoritë që peshojnë më shumë te secila erë, të matura me permutim, janë këto (Figura 4):</w:t>
+        <w:t>MCC-ja më e lartë e arritur është 0.724. Veçoritë që peshojnë më shumë te secila erë, të matura me permutim, janë këto (Figura 4):</w:t>
       </w:r>
     </w:p>
     <w:p>
@@ -7553,7 +7585,7 @@
                 <w:caps w:val="0"/>
                 <w:sz w:val="22"/>
               </w:rPr>
-              <w:t>175</w:t>
+              <w:t>195</w:t>
             </w:r>
           </w:p>
         </w:tc>
@@ -7573,7 +7605,7 @@
                 <w:caps w:val="0"/>
                 <w:sz w:val="22"/>
               </w:rPr>
-              <w:t>69.1%</w:t>
+              <w:t>55.9%</w:t>
             </w:r>
           </w:p>
         </w:tc>
@@ -7593,7 +7625,7 @@
                 <w:caps w:val="0"/>
                 <w:sz w:val="22"/>
               </w:rPr>
-              <w:t>c_CLOC (48), c_WOC (21), c_CBO (20)</w:t>
+              <w:t>c_CLOC (25), c_WOC (23), c_CBO (14)</w:t>
             </w:r>
           </w:p>
         </w:tc>
@@ -7635,7 +7667,7 @@
                 <w:caps w:val="0"/>
                 <w:sz w:val="22"/>
               </w:rPr>
-              <w:t>66</w:t>
+              <w:t>72</w:t>
             </w:r>
           </w:p>
         </w:tc>
@@ -7655,7 +7687,7 @@
                 <w:caps w:val="0"/>
                 <w:sz w:val="22"/>
               </w:rPr>
-              <w:t>89.4%</w:t>
+              <w:t>97.2%</w:t>
             </w:r>
           </w:p>
         </w:tc>
@@ -7675,7 +7707,7 @@
                 <w:caps w:val="0"/>
                 <w:sz w:val="22"/>
               </w:rPr>
-              <w:t>m_MLOC (53), m_NOAV (5), m_MAXNESTING (1)</w:t>
+              <w:t>m_MLOC (68), m_NOAV (2)</w:t>
             </w:r>
           </w:p>
         </w:tc>
@@ -7737,7 +7769,7 @@
                 <w:caps w:val="0"/>
                 <w:sz w:val="22"/>
               </w:rPr>
-              <w:t>96.1%</w:t>
+              <w:t>93.9%</w:t>
             </w:r>
           </w:p>
         </w:tc>
@@ -7757,7 +7789,7 @@
                 <w:caps w:val="0"/>
                 <w:sz w:val="22"/>
               </w:rPr>
-              <w:t>m_MLOC (220), m_CC (2)</w:t>
+              <w:t>m_MLOC (211), m_CC (5), m_NOAV (1)</w:t>
             </w:r>
           </w:p>
         </w:tc>
@@ -7781,8 +7813,568 @@
           <w:caps w:val="0"/>
           <w:sz w:val="24"/>
         </w:rPr>
-        <w:t>Pjesa e verdikteve me shpjegim shkon nga 69.1% deri në 96.1%.</w:t>
+        <w:t>Pjesa e verdikteve me shpjegim shkon nga 55.9% deri në 97.2%.</w:t>
       </w:r>
+    </w:p>
+    <w:p>
+      <w:pPr>
+        <w:spacing w:line="360" w:lineRule="auto"/>
+        <w:ind w:firstLine="360"/>
+        <w:jc w:val="both"/>
+      </w:pPr>
+      <w:r>
+        <w:rPr>
+          <w:rFonts w:ascii="Times New Roman" w:hAnsi="Times New Roman" w:eastAsia="Times New Roman"/>
+          <w:b w:val="0"/>
+          <w:caps w:val="0"/>
+          <w:sz w:val="24"/>
+        </w:rPr>
+        <w:t>Vetëm me metrikat e strategjisë, modelet arrijnë këtë MCC (Tabela 6):</w:t>
+      </w:r>
+    </w:p>
+    <w:p>
+      <w:pPr>
+        <w:spacing w:line="240" w:lineRule="auto"/>
+        <w:jc w:val="center"/>
+      </w:pPr>
+      <w:r>
+        <w:rPr>
+          <w:rFonts w:ascii="Times New Roman" w:hAnsi="Times New Roman" w:eastAsia="Times New Roman"/>
+          <w:b w:val="0"/>
+          <w:caps w:val="0"/>
+          <w:sz w:val="22"/>
+        </w:rPr>
+        <w:t>Tabela 6. MCC me metrikat e strategjisë dhe me të gjitha metrikat</w:t>
+      </w:r>
+    </w:p>
+    <w:tbl>
+      <w:tblPr>
+        <w:tblStyle w:val="TableGrid"/>
+        <w:tblW w:type="auto" w:w="0"/>
+        <w:tblLook w:firstColumn="1" w:firstRow="1" w:lastColumn="0" w:lastRow="0" w:noHBand="0" w:noVBand="1" w:val="04A0"/>
+      </w:tblPr>
+      <w:tblGrid>
+        <w:gridCol w:w="1768"/>
+        <w:gridCol w:w="1768"/>
+        <w:gridCol w:w="1768"/>
+        <w:gridCol w:w="1768"/>
+        <w:gridCol w:w="1768"/>
+      </w:tblGrid>
+      <w:tr>
+        <w:tc>
+          <w:tcPr>
+            <w:tcW w:type="dxa" w:w="1768"/>
+          </w:tcPr>
+          <w:p>
+            <w:pPr>
+              <w:spacing w:line="240" w:lineRule="auto"/>
+              <w:jc w:val="left"/>
+            </w:pPr>
+            <w:r>
+              <w:rPr>
+                <w:rFonts w:ascii="Times New Roman" w:hAnsi="Times New Roman" w:eastAsia="Times New Roman"/>
+                <w:b/>
+                <w:caps w:val="0"/>
+                <w:sz w:val="22"/>
+              </w:rPr>
+              <w:t>Erë</w:t>
+            </w:r>
+          </w:p>
+        </w:tc>
+        <w:tc>
+          <w:tcPr>
+            <w:tcW w:type="dxa" w:w="1768"/>
+          </w:tcPr>
+          <w:p>
+            <w:pPr>
+              <w:spacing w:line="240" w:lineRule="auto"/>
+              <w:jc w:val="left"/>
+            </w:pPr>
+            <w:r>
+              <w:rPr>
+                <w:rFonts w:ascii="Times New Roman" w:hAnsi="Times New Roman" w:eastAsia="Times New Roman"/>
+                <w:b/>
+                <w:caps w:val="0"/>
+                <w:sz w:val="22"/>
+              </w:rPr>
+              <w:t>Metrikat e strategjisë</w:t>
+            </w:r>
+          </w:p>
+        </w:tc>
+        <w:tc>
+          <w:tcPr>
+            <w:tcW w:type="dxa" w:w="1768"/>
+          </w:tcPr>
+          <w:p>
+            <w:pPr>
+              <w:spacing w:line="240" w:lineRule="auto"/>
+              <w:jc w:val="left"/>
+            </w:pPr>
+            <w:r>
+              <w:rPr>
+                <w:rFonts w:ascii="Times New Roman" w:hAnsi="Times New Roman" w:eastAsia="Times New Roman"/>
+                <w:b/>
+                <w:caps w:val="0"/>
+                <w:sz w:val="22"/>
+              </w:rPr>
+              <w:t>Rregulli</w:t>
+            </w:r>
+          </w:p>
+        </w:tc>
+        <w:tc>
+          <w:tcPr>
+            <w:tcW w:type="dxa" w:w="1768"/>
+          </w:tcPr>
+          <w:p>
+            <w:pPr>
+              <w:spacing w:line="240" w:lineRule="auto"/>
+              <w:jc w:val="left"/>
+            </w:pPr>
+            <w:r>
+              <w:rPr>
+                <w:rFonts w:ascii="Times New Roman" w:hAnsi="Times New Roman" w:eastAsia="Times New Roman"/>
+                <w:b/>
+                <w:caps w:val="0"/>
+                <w:sz w:val="22"/>
+              </w:rPr>
+              <w:t>Modeli, vetëm ato</w:t>
+            </w:r>
+          </w:p>
+        </w:tc>
+        <w:tc>
+          <w:tcPr>
+            <w:tcW w:type="dxa" w:w="1768"/>
+          </w:tcPr>
+          <w:p>
+            <w:pPr>
+              <w:spacing w:line="240" w:lineRule="auto"/>
+              <w:jc w:val="left"/>
+            </w:pPr>
+            <w:r>
+              <w:rPr>
+                <w:rFonts w:ascii="Times New Roman" w:hAnsi="Times New Roman" w:eastAsia="Times New Roman"/>
+                <w:b/>
+                <w:caps w:val="0"/>
+                <w:sz w:val="22"/>
+              </w:rPr>
+              <w:t>Modeli, të gjitha</w:t>
+            </w:r>
+          </w:p>
+        </w:tc>
+      </w:tr>
+      <w:tr>
+        <w:tc>
+          <w:tcPr>
+            <w:tcW w:type="dxa" w:w="1768"/>
+          </w:tcPr>
+          <w:p>
+            <w:pPr>
+              <w:spacing w:line="240" w:lineRule="auto"/>
+              <w:jc w:val="left"/>
+            </w:pPr>
+            <w:r>
+              <w:rPr>
+                <w:rFonts w:ascii="Times New Roman" w:hAnsi="Times New Roman" w:eastAsia="Times New Roman"/>
+                <w:b w:val="0"/>
+                <w:caps w:val="0"/>
+                <w:sz w:val="22"/>
+              </w:rPr>
+              <w:t>Blob</w:t>
+            </w:r>
+          </w:p>
+        </w:tc>
+        <w:tc>
+          <w:tcPr>
+            <w:tcW w:type="dxa" w:w="1768"/>
+          </w:tcPr>
+          <w:p>
+            <w:pPr>
+              <w:spacing w:line="240" w:lineRule="auto"/>
+              <w:jc w:val="left"/>
+            </w:pPr>
+            <w:r>
+              <w:rPr>
+                <w:rFonts w:ascii="Times New Roman" w:hAnsi="Times New Roman" w:eastAsia="Times New Roman"/>
+                <w:b w:val="0"/>
+                <w:caps w:val="0"/>
+                <w:sz w:val="22"/>
+              </w:rPr>
+              <w:t>c_WMC, c_TCC, c_ATFD</w:t>
+            </w:r>
+          </w:p>
+        </w:tc>
+        <w:tc>
+          <w:tcPr>
+            <w:tcW w:type="dxa" w:w="1768"/>
+          </w:tcPr>
+          <w:p>
+            <w:pPr>
+              <w:spacing w:line="240" w:lineRule="auto"/>
+              <w:jc w:val="left"/>
+            </w:pPr>
+            <w:r>
+              <w:rPr>
+                <w:rFonts w:ascii="Times New Roman" w:hAnsi="Times New Roman" w:eastAsia="Times New Roman"/>
+                <w:b w:val="0"/>
+                <w:caps w:val="0"/>
+                <w:sz w:val="22"/>
+              </w:rPr>
+              <w:t>0.232</w:t>
+            </w:r>
+          </w:p>
+        </w:tc>
+        <w:tc>
+          <w:tcPr>
+            <w:tcW w:type="dxa" w:w="1768"/>
+          </w:tcPr>
+          <w:p>
+            <w:pPr>
+              <w:spacing w:line="240" w:lineRule="auto"/>
+              <w:jc w:val="left"/>
+            </w:pPr>
+            <w:r>
+              <w:rPr>
+                <w:rFonts w:ascii="Times New Roman" w:hAnsi="Times New Roman" w:eastAsia="Times New Roman"/>
+                <w:b w:val="0"/>
+                <w:caps w:val="0"/>
+                <w:sz w:val="22"/>
+              </w:rPr>
+              <w:t>0.373</w:t>
+            </w:r>
+          </w:p>
+        </w:tc>
+        <w:tc>
+          <w:tcPr>
+            <w:tcW w:type="dxa" w:w="1768"/>
+          </w:tcPr>
+          <w:p>
+            <w:pPr>
+              <w:spacing w:line="240" w:lineRule="auto"/>
+              <w:jc w:val="left"/>
+            </w:pPr>
+            <w:r>
+              <w:rPr>
+                <w:rFonts w:ascii="Times New Roman" w:hAnsi="Times New Roman" w:eastAsia="Times New Roman"/>
+                <w:b w:val="0"/>
+                <w:caps w:val="0"/>
+                <w:sz w:val="22"/>
+              </w:rPr>
+              <w:t>0.488</w:t>
+            </w:r>
+          </w:p>
+        </w:tc>
+      </w:tr>
+      <w:tr>
+        <w:tc>
+          <w:tcPr>
+            <w:tcW w:type="dxa" w:w="1768"/>
+          </w:tcPr>
+          <w:p>
+            <w:pPr>
+              <w:spacing w:line="240" w:lineRule="auto"/>
+              <w:jc w:val="left"/>
+            </w:pPr>
+            <w:r>
+              <w:rPr>
+                <w:rFonts w:ascii="Times New Roman" w:hAnsi="Times New Roman" w:eastAsia="Times New Roman"/>
+                <w:b w:val="0"/>
+                <w:caps w:val="0"/>
+                <w:sz w:val="22"/>
+              </w:rPr>
+              <w:t>Data Class</w:t>
+            </w:r>
+          </w:p>
+        </w:tc>
+        <w:tc>
+          <w:tcPr>
+            <w:tcW w:type="dxa" w:w="1768"/>
+          </w:tcPr>
+          <w:p>
+            <w:pPr>
+              <w:spacing w:line="240" w:lineRule="auto"/>
+              <w:jc w:val="left"/>
+            </w:pPr>
+            <w:r>
+              <w:rPr>
+                <w:rFonts w:ascii="Times New Roman" w:hAnsi="Times New Roman" w:eastAsia="Times New Roman"/>
+                <w:b w:val="0"/>
+                <w:caps w:val="0"/>
+                <w:sz w:val="22"/>
+              </w:rPr>
+              <w:t>c_WOC, c_NOPA, c_NOAM, c_WMC</w:t>
+            </w:r>
+          </w:p>
+        </w:tc>
+        <w:tc>
+          <w:tcPr>
+            <w:tcW w:type="dxa" w:w="1768"/>
+          </w:tcPr>
+          <w:p>
+            <w:pPr>
+              <w:spacing w:line="240" w:lineRule="auto"/>
+              <w:jc w:val="left"/>
+            </w:pPr>
+            <w:r>
+              <w:rPr>
+                <w:rFonts w:ascii="Times New Roman" w:hAnsi="Times New Roman" w:eastAsia="Times New Roman"/>
+                <w:b w:val="0"/>
+                <w:caps w:val="0"/>
+                <w:sz w:val="22"/>
+              </w:rPr>
+              <w:t>0.275</w:t>
+            </w:r>
+          </w:p>
+        </w:tc>
+        <w:tc>
+          <w:tcPr>
+            <w:tcW w:type="dxa" w:w="1768"/>
+          </w:tcPr>
+          <w:p>
+            <w:pPr>
+              <w:spacing w:line="240" w:lineRule="auto"/>
+              <w:jc w:val="left"/>
+            </w:pPr>
+            <w:r>
+              <w:rPr>
+                <w:rFonts w:ascii="Times New Roman" w:hAnsi="Times New Roman" w:eastAsia="Times New Roman"/>
+                <w:b w:val="0"/>
+                <w:caps w:val="0"/>
+                <w:sz w:val="22"/>
+              </w:rPr>
+              <w:t>0.399</w:t>
+            </w:r>
+          </w:p>
+        </w:tc>
+        <w:tc>
+          <w:tcPr>
+            <w:tcW w:type="dxa" w:w="1768"/>
+          </w:tcPr>
+          <w:p>
+            <w:pPr>
+              <w:spacing w:line="240" w:lineRule="auto"/>
+              <w:jc w:val="left"/>
+            </w:pPr>
+            <w:r>
+              <w:rPr>
+                <w:rFonts w:ascii="Times New Roman" w:hAnsi="Times New Roman" w:eastAsia="Times New Roman"/>
+                <w:b w:val="0"/>
+                <w:caps w:val="0"/>
+                <w:sz w:val="22"/>
+              </w:rPr>
+              <w:t>0.498</w:t>
+            </w:r>
+          </w:p>
+        </w:tc>
+      </w:tr>
+      <w:tr>
+        <w:tc>
+          <w:tcPr>
+            <w:tcW w:type="dxa" w:w="1768"/>
+          </w:tcPr>
+          <w:p>
+            <w:pPr>
+              <w:spacing w:line="240" w:lineRule="auto"/>
+              <w:jc w:val="left"/>
+            </w:pPr>
+            <w:r>
+              <w:rPr>
+                <w:rFonts w:ascii="Times New Roman" w:hAnsi="Times New Roman" w:eastAsia="Times New Roman"/>
+                <w:b w:val="0"/>
+                <w:caps w:val="0"/>
+                <w:sz w:val="22"/>
+              </w:rPr>
+              <w:t>Feature Envy</w:t>
+            </w:r>
+          </w:p>
+        </w:tc>
+        <w:tc>
+          <w:tcPr>
+            <w:tcW w:type="dxa" w:w="1768"/>
+          </w:tcPr>
+          <w:p>
+            <w:pPr>
+              <w:spacing w:line="240" w:lineRule="auto"/>
+              <w:jc w:val="left"/>
+            </w:pPr>
+            <w:r>
+              <w:rPr>
+                <w:rFonts w:ascii="Times New Roman" w:hAnsi="Times New Roman" w:eastAsia="Times New Roman"/>
+                <w:b w:val="0"/>
+                <w:caps w:val="0"/>
+                <w:sz w:val="22"/>
+              </w:rPr>
+              <w:t>m_ATFD, m_LAA, m_FDP</w:t>
+            </w:r>
+          </w:p>
+        </w:tc>
+        <w:tc>
+          <w:tcPr>
+            <w:tcW w:type="dxa" w:w="1768"/>
+          </w:tcPr>
+          <w:p>
+            <w:pPr>
+              <w:spacing w:line="240" w:lineRule="auto"/>
+              <w:jc w:val="left"/>
+            </w:pPr>
+            <w:r>
+              <w:rPr>
+                <w:rFonts w:ascii="Times New Roman" w:hAnsi="Times New Roman" w:eastAsia="Times New Roman"/>
+                <w:b w:val="0"/>
+                <w:caps w:val="0"/>
+                <w:sz w:val="22"/>
+              </w:rPr>
+              <w:t>0.271</w:t>
+            </w:r>
+          </w:p>
+        </w:tc>
+        <w:tc>
+          <w:tcPr>
+            <w:tcW w:type="dxa" w:w="1768"/>
+          </w:tcPr>
+          <w:p>
+            <w:pPr>
+              <w:spacing w:line="240" w:lineRule="auto"/>
+              <w:jc w:val="left"/>
+            </w:pPr>
+            <w:r>
+              <w:rPr>
+                <w:rFonts w:ascii="Times New Roman" w:hAnsi="Times New Roman" w:eastAsia="Times New Roman"/>
+                <w:b w:val="0"/>
+                <w:caps w:val="0"/>
+                <w:sz w:val="22"/>
+              </w:rPr>
+              <w:t>0.437</w:t>
+            </w:r>
+          </w:p>
+        </w:tc>
+        <w:tc>
+          <w:tcPr>
+            <w:tcW w:type="dxa" w:w="1768"/>
+          </w:tcPr>
+          <w:p>
+            <w:pPr>
+              <w:spacing w:line="240" w:lineRule="auto"/>
+              <w:jc w:val="left"/>
+            </w:pPr>
+            <w:r>
+              <w:rPr>
+                <w:rFonts w:ascii="Times New Roman" w:hAnsi="Times New Roman" w:eastAsia="Times New Roman"/>
+                <w:b w:val="0"/>
+                <w:caps w:val="0"/>
+                <w:sz w:val="22"/>
+              </w:rPr>
+              <w:t>0.696</w:t>
+            </w:r>
+          </w:p>
+        </w:tc>
+      </w:tr>
+      <w:tr>
+        <w:tc>
+          <w:tcPr>
+            <w:tcW w:type="dxa" w:w="1768"/>
+          </w:tcPr>
+          <w:p>
+            <w:pPr>
+              <w:spacing w:line="240" w:lineRule="auto"/>
+              <w:jc w:val="left"/>
+            </w:pPr>
+            <w:r>
+              <w:rPr>
+                <w:rFonts w:ascii="Times New Roman" w:hAnsi="Times New Roman" w:eastAsia="Times New Roman"/>
+                <w:b w:val="0"/>
+                <w:caps w:val="0"/>
+                <w:sz w:val="22"/>
+              </w:rPr>
+              <w:t>Long Method</w:t>
+            </w:r>
+          </w:p>
+        </w:tc>
+        <w:tc>
+          <w:tcPr>
+            <w:tcW w:type="dxa" w:w="1768"/>
+          </w:tcPr>
+          <w:p>
+            <w:pPr>
+              <w:spacing w:line="240" w:lineRule="auto"/>
+              <w:jc w:val="left"/>
+            </w:pPr>
+            <w:r>
+              <w:rPr>
+                <w:rFonts w:ascii="Times New Roman" w:hAnsi="Times New Roman" w:eastAsia="Times New Roman"/>
+                <w:b w:val="0"/>
+                <w:caps w:val="0"/>
+                <w:sz w:val="22"/>
+              </w:rPr>
+              <w:t>m_MLOC</w:t>
+            </w:r>
+          </w:p>
+        </w:tc>
+        <w:tc>
+          <w:tcPr>
+            <w:tcW w:type="dxa" w:w="1768"/>
+          </w:tcPr>
+          <w:p>
+            <w:pPr>
+              <w:spacing w:line="240" w:lineRule="auto"/>
+              <w:jc w:val="left"/>
+            </w:pPr>
+            <w:r>
+              <w:rPr>
+                <w:rFonts w:ascii="Times New Roman" w:hAnsi="Times New Roman" w:eastAsia="Times New Roman"/>
+                <w:b w:val="0"/>
+                <w:caps w:val="0"/>
+                <w:sz w:val="22"/>
+              </w:rPr>
+              <w:t>0.580</w:t>
+            </w:r>
+          </w:p>
+        </w:tc>
+        <w:tc>
+          <w:tcPr>
+            <w:tcW w:type="dxa" w:w="1768"/>
+          </w:tcPr>
+          <w:p>
+            <w:pPr>
+              <w:spacing w:line="240" w:lineRule="auto"/>
+              <w:jc w:val="left"/>
+            </w:pPr>
+            <w:r>
+              <w:rPr>
+                <w:rFonts w:ascii="Times New Roman" w:hAnsi="Times New Roman" w:eastAsia="Times New Roman"/>
+                <w:b w:val="0"/>
+                <w:caps w:val="0"/>
+                <w:sz w:val="22"/>
+              </w:rPr>
+              <w:t>0.672</w:t>
+            </w:r>
+          </w:p>
+        </w:tc>
+        <w:tc>
+          <w:tcPr>
+            <w:tcW w:type="dxa" w:w="1768"/>
+          </w:tcPr>
+          <w:p>
+            <w:pPr>
+              <w:spacing w:line="240" w:lineRule="auto"/>
+              <w:jc w:val="left"/>
+            </w:pPr>
+            <w:r>
+              <w:rPr>
+                <w:rFonts w:ascii="Times New Roman" w:hAnsi="Times New Roman" w:eastAsia="Times New Roman"/>
+                <w:b w:val="0"/>
+                <w:caps w:val="0"/>
+                <w:sz w:val="22"/>
+              </w:rPr>
+              <w:t>0.724</w:t>
+            </w:r>
+          </w:p>
+        </w:tc>
+      </w:tr>
+    </w:tbl>
+    <w:p>
+      <w:pPr>
+        <w:spacing w:line="240" w:lineRule="auto" w:after="0"/>
+      </w:pPr>
     </w:p>
     <w:p>
       <w:pPr>
@@ -7865,7 +8457,7 @@
           <w:caps w:val="0"/>
           <w:sz w:val="24"/>
         </w:rPr>
-        <w:t>Qasja B ka MCC më të lartë se Qasja A te të katër erërat. Pajtimi mes tyre matet me koeficientin kappa dhe me numrin e mostrave që shënon secila qasje, vetëm ose bashkë me tjetrën (Figura 5; Tabela 6; Figura 6).</w:t>
+        <w:t>Qasja B ka MCC më të lartë se Qasja A te të katër erërat. Pajtimi mes tyre matet me koeficientin kappa dhe me numrin e mostrave që shënon secila qasje, vetëm ose bashkë me tjetrën (Figura 5; Tabela 7; Figura 6).</w:t>
       </w:r>
     </w:p>
     <w:p>
@@ -7880,7 +8472,7 @@
           <w:caps w:val="0"/>
           <w:sz w:val="22"/>
         </w:rPr>
-        <w:t>Tabela 6. Pajtimi mes dy qasjeve</w:t>
+        <w:t>Tabela 7. Pajtimi mes dy qasjeve</w:t>
       </w:r>
     </w:p>
     <w:tbl>
@@ -8178,7 +8770,7 @@
                 <w:caps w:val="0"/>
                 <w:sz w:val="22"/>
               </w:rPr>
-              <w:t>0.225</w:t>
+              <w:t>0.217</w:t>
             </w:r>
           </w:p>
         </w:tc>
@@ -8198,7 +8790,7 @@
                 <w:caps w:val="0"/>
                 <w:sz w:val="22"/>
               </w:rPr>
-              <w:t>30</w:t>
+              <w:t>32</w:t>
             </w:r>
           </w:p>
         </w:tc>
@@ -8218,7 +8810,7 @@
                 <w:caps w:val="0"/>
                 <w:sz w:val="22"/>
               </w:rPr>
-              <w:t>7</w:t>
+              <w:t>5</w:t>
             </w:r>
           </w:p>
         </w:tc>
@@ -8238,7 +8830,7 @@
                 <w:caps w:val="0"/>
                 <w:sz w:val="22"/>
               </w:rPr>
-              <w:t>145</w:t>
+              <w:t>163</w:t>
             </w:r>
           </w:p>
         </w:tc>
@@ -8300,7 +8892,7 @@
                 <w:caps w:val="0"/>
                 <w:sz w:val="22"/>
               </w:rPr>
-              <w:t>0.230</w:t>
+              <w:t>0.255</w:t>
             </w:r>
           </w:p>
         </w:tc>
@@ -8320,7 +8912,7 @@
                 <w:caps w:val="0"/>
                 <w:sz w:val="22"/>
               </w:rPr>
-              <w:t>12</w:t>
+              <w:t>14</w:t>
             </w:r>
           </w:p>
         </w:tc>
@@ -8340,7 +8932,7 @@
                 <w:caps w:val="0"/>
                 <w:sz w:val="22"/>
               </w:rPr>
-              <w:t>13</w:t>
+              <w:t>11</w:t>
             </w:r>
           </w:p>
         </w:tc>
@@ -8360,7 +8952,7 @@
                 <w:caps w:val="0"/>
                 <w:sz w:val="22"/>
               </w:rPr>
-              <w:t>54</w:t>
+              <w:t>58</w:t>
             </w:r>
           </w:p>
         </w:tc>
@@ -8580,7 +9172,7 @@
           <w:caps w:val="0"/>
           <w:sz w:val="24"/>
         </w:rPr>
-        <w:t>Te të katër erërat, mostrat që shënon vetëm B janë më të shumta se ato që shënon vetëm A. Raporti më i afërt mes të dyjave është te Feature Envy, 13 me 54.</w:t>
+        <w:t>Te të katër erërat, mostrat që shënon vetëm B janë më të shumta se ato që shënon vetëm A. Raporti më i afërt mes të dyjave është te Feature Envy, 11 me 58.</w:t>
       </w:r>
     </w:p>
     <w:p>
@@ -8596,7 +9188,7 @@
           <w:caps w:val="0"/>
           <w:sz w:val="24"/>
         </w:rPr>
-        <w:t>Dy qasjet u kombinuan edhe drejtpërdrejt, si bashkim (A∪B) dhe si prerje (A∩B), me këto vlera (Tabela 7):</w:t>
+        <w:t>Dy qasjet u kombinuan edhe drejtpërdrejt, si bashkim (A∪B) dhe si prerje (A∩B), me këto vlera (Tabela 8):</w:t>
       </w:r>
     </w:p>
     <w:p>
@@ -8611,7 +9203,7 @@
           <w:caps w:val="0"/>
           <w:sz w:val="22"/>
         </w:rPr>
-        <w:t>Tabela 7. Të dyja qasjet së bashku</w:t>
+        <w:t>Tabela 8. Të dyja qasjet së bashku</w:t>
       </w:r>
     </w:p>
     <w:tbl>
@@ -8909,7 +9501,7 @@
                 <w:caps w:val="0"/>
                 <w:sz w:val="22"/>
               </w:rPr>
-              <w:t>0.500</w:t>
+              <w:t>0.498</w:t>
             </w:r>
           </w:p>
         </w:tc>
@@ -8929,7 +9521,7 @@
                 <w:caps w:val="0"/>
                 <w:sz w:val="22"/>
               </w:rPr>
-              <w:t>0.510</w:t>
+              <w:t>0.506</w:t>
             </w:r>
           </w:p>
         </w:tc>
@@ -8969,7 +9561,7 @@
                 <w:caps w:val="0"/>
                 <w:sz w:val="22"/>
               </w:rPr>
-              <w:t>0.613</w:t>
+              <w:t>0.645</w:t>
             </w:r>
           </w:p>
         </w:tc>
@@ -8989,7 +9581,7 @@
                 <w:caps w:val="0"/>
                 <w:sz w:val="22"/>
               </w:rPr>
-              <w:t>0.800</w:t>
+              <w:t>0.781</w:t>
             </w:r>
           </w:p>
         </w:tc>
@@ -9031,7 +9623,7 @@
                 <w:caps w:val="0"/>
                 <w:sz w:val="22"/>
               </w:rPr>
-              <w:t>0.669</w:t>
+              <w:t>0.696</w:t>
             </w:r>
           </w:p>
         </w:tc>
@@ -9051,7 +9643,7 @@
                 <w:caps w:val="0"/>
                 <w:sz w:val="22"/>
               </w:rPr>
-              <w:t>0.644</w:t>
+              <w:t>0.667</w:t>
             </w:r>
           </w:p>
         </w:tc>
@@ -9071,7 +9663,7 @@
                 <w:caps w:val="0"/>
                 <w:sz w:val="22"/>
               </w:rPr>
-              <w:t>0.321</w:t>
+              <w:t>0.325</w:t>
             </w:r>
           </w:p>
         </w:tc>
@@ -9091,7 +9683,7 @@
                 <w:caps w:val="0"/>
                 <w:sz w:val="22"/>
               </w:rPr>
-              <w:t>0.708</w:t>
+              <w:t>0.750</w:t>
             </w:r>
           </w:p>
         </w:tc>
@@ -9111,7 +9703,7 @@
                 <w:caps w:val="0"/>
                 <w:sz w:val="22"/>
               </w:rPr>
-              <w:t>0.833</w:t>
+              <w:t>0.786</w:t>
             </w:r>
           </w:p>
         </w:tc>
@@ -9153,7 +9745,7 @@
                 <w:caps w:val="0"/>
                 <w:sz w:val="22"/>
               </w:rPr>
-              <w:t>0.713</w:t>
+              <w:t>0.724</w:t>
             </w:r>
           </w:p>
         </w:tc>
@@ -9173,7 +9765,7 @@
                 <w:caps w:val="0"/>
                 <w:sz w:val="22"/>
               </w:rPr>
-              <w:t>0.706</w:t>
+              <w:t>0.716</w:t>
             </w:r>
           </w:p>
         </w:tc>
@@ -9213,7 +9805,7 @@
                 <w:caps w:val="0"/>
                 <w:sz w:val="22"/>
               </w:rPr>
-              <w:t>0.782</w:t>
+              <w:t>0.792</w:t>
             </w:r>
           </w:p>
         </w:tc>
@@ -9257,7 +9849,7 @@
           <w:caps w:val="0"/>
           <w:sz w:val="24"/>
         </w:rPr>
-        <w:t>Bashkimi e ngre recall-in mbi atë të modelit te tri nga katër erërat; MCC-ja rritet te Blob (0.488 → 0.494) dhe Data Class (0.500 → 0.510), dhe bie te Feature Envy (0.669 → 0.644) dhe Long Method (0.713 → 0.706).</w:t>
+        <w:t>Bashkimi e ngre recall-in mbi atë të modelit te të katër erërat; MCC-ja rritet te Blob (0.488 → 0.494) dhe Data Class (0.498 → 0.506), dhe bie te Feature Envy (0.696 → 0.667) dhe Long Method (0.724 → 0.716).</w:t>
       </w:r>
     </w:p>
     <w:p>
@@ -9273,7 +9865,7 @@
           <w:caps w:val="0"/>
           <w:sz w:val="24"/>
         </w:rPr>
-        <w:t>Te prerja, precizioni është të paktën 0.80 te çdo erë dhe arrin 0.905 te Long Method, ndërsa recall-i dhe MCC-ja janë nën ato të modelit te të katër erërat.</w:t>
+        <w:t>Te prerja, precizioni është të paktën 0.78 te çdo erë dhe arrin 0.905 te Long Method, ndërsa recall-i dhe MCC-ja janë nën ato të modelit te të katër erërat.</w:t>
       </w:r>
     </w:p>
     <w:p>
@@ -9303,7 +9895,7 @@
           <w:caps w:val="0"/>
           <w:sz w:val="24"/>
         </w:rPr>
-        <w:t>Mbi 4409 skedarë të korpusit u detektuan 17 833 vende ku motori ka një transformim; prej tyre 3633 u transformuan (Tabela 8).</w:t>
+        <w:t>Mbi 4409 skedarë të korpusit u detektuan 15 800 vende ku motori ka një transformim; prej tyre 3532 u transformuan (Tabela 9).</w:t>
       </w:r>
     </w:p>
     <w:p>
@@ -9318,7 +9910,7 @@
           <w:caps w:val="0"/>
           <w:sz w:val="22"/>
         </w:rPr>
-        <w:t>Tabela 8. Rezultati i motorit të refaktorimit</w:t>
+        <w:t>Tabela 9. Rezultati i motorit të refaktorimit</w:t>
       </w:r>
     </w:p>
     <w:tbl>
@@ -9430,7 +10022,7 @@
                 <w:caps w:val="0"/>
                 <w:sz w:val="22"/>
               </w:rPr>
-              <w:t>17 833</w:t>
+              <w:t>15 800</w:t>
             </w:r>
           </w:p>
         </w:tc>
@@ -9492,7 +10084,7 @@
                 <w:caps w:val="0"/>
                 <w:sz w:val="22"/>
               </w:rPr>
-              <w:t>3633</w:t>
+              <w:t>3532</w:t>
             </w:r>
           </w:p>
         </w:tc>
@@ -9512,7 +10104,7 @@
                 <w:caps w:val="0"/>
                 <w:sz w:val="22"/>
               </w:rPr>
-              <w:t>20.4%</w:t>
+              <w:t>22.4%</w:t>
             </w:r>
           </w:p>
         </w:tc>
@@ -9554,7 +10146,7 @@
                 <w:caps w:val="0"/>
                 <w:sz w:val="22"/>
               </w:rPr>
-              <w:t>14 183</w:t>
+              <w:t>12 252</w:t>
             </w:r>
           </w:p>
         </w:tc>
@@ -9574,7 +10166,7 @@
                 <w:caps w:val="0"/>
                 <w:sz w:val="22"/>
               </w:rPr>
-              <w:t>79.5%</w:t>
+              <w:t>77.5%</w:t>
             </w:r>
           </w:p>
         </w:tc>
@@ -9616,7 +10208,7 @@
                 <w:caps w:val="0"/>
                 <w:sz w:val="22"/>
               </w:rPr>
-              <w:t>17</w:t>
+              <w:t>16</w:t>
             </w:r>
           </w:p>
         </w:tc>
@@ -9660,7 +10252,7 @@
           <w:caps w:val="0"/>
           <w:sz w:val="24"/>
         </w:rPr>
-        <w:t>Sipas transformimit, rishkrimet ndahen: Extract Method 3367 (92.7%), Introduce Parameter Object 155 (4.3%), Replace Nested Conditional with Guard Clauses 111 (3.1%).</w:t>
+        <w:t>Sipas transformimit, rishkrimet ndahen: Extract Method 3298 (93.4%), Introduce Parameter Object 155 (4.4%), Replace Nested Conditional with Guard Clauses 79 (2.2%).</w:t>
       </w:r>
     </w:p>
     <w:p>
@@ -9676,7 +10268,7 @@
           <w:caps w:val="0"/>
           <w:sz w:val="24"/>
         </w:rPr>
-        <w:t>Refuzimet ndahen sipas arsyes, kuptimi i së cilës jepet te Shtojca 8.4, dhe rishkrimet e aplikuara sipas verdiktit të verifikimit (Tabela 9; Tabela 10).</w:t>
+        <w:t>Refuzimet ndahen sipas arsyes, kuptimi i së cilës jepet te Shtojca 8.4, dhe rishkrimet e aplikuara sipas verdiktit të verifikimit (Tabela 10; Tabela 11).</w:t>
       </w:r>
     </w:p>
     <w:p>
@@ -9691,7 +10283,7 @@
           <w:caps w:val="0"/>
           <w:sz w:val="22"/>
         </w:rPr>
-        <w:t>Tabela 9. Pse u refuzuan</w:t>
+        <w:t>Tabela 10. Pse u refuzuan</w:t>
       </w:r>
     </w:p>
     <w:tbl>
@@ -9804,7 +10396,7 @@
                 <w:caps w:val="0"/>
                 <w:sz w:val="22"/>
               </w:rPr>
-              <w:t>8935</w:t>
+              <w:t>7154</w:t>
             </w:r>
           </w:p>
         </w:tc>
@@ -9824,7 +10416,7 @@
                 <w:caps w:val="0"/>
                 <w:sz w:val="22"/>
               </w:rPr>
-              <w:t>50.1%</w:t>
+              <w:t>45.3%</w:t>
             </w:r>
           </w:p>
         </w:tc>
@@ -9866,7 +10458,7 @@
                 <w:caps w:val="0"/>
                 <w:sz w:val="22"/>
               </w:rPr>
-              <w:t>4185</w:t>
+              <w:t>4050</w:t>
             </w:r>
           </w:p>
         </w:tc>
@@ -9886,7 +10478,7 @@
                 <w:caps w:val="0"/>
                 <w:sz w:val="22"/>
               </w:rPr>
-              <w:t>23.5%</w:t>
+              <w:t>25.6%</w:t>
             </w:r>
           </w:p>
         </w:tc>
@@ -9928,7 +10520,7 @@
                 <w:caps w:val="0"/>
                 <w:sz w:val="22"/>
               </w:rPr>
-              <w:t>628</w:t>
+              <w:t>621</w:t>
             </w:r>
           </w:p>
         </w:tc>
@@ -9948,7 +10540,7 @@
                 <w:caps w:val="0"/>
                 <w:sz w:val="22"/>
               </w:rPr>
-              <w:t>3.5%</w:t>
+              <w:t>3.9%</w:t>
             </w:r>
           </w:p>
         </w:tc>
@@ -9990,7 +10582,7 @@
                 <w:caps w:val="0"/>
                 <w:sz w:val="22"/>
               </w:rPr>
-              <w:t>368</w:t>
+              <w:t>360</w:t>
             </w:r>
           </w:p>
         </w:tc>
@@ -10010,7 +10602,7 @@
                 <w:caps w:val="0"/>
                 <w:sz w:val="22"/>
               </w:rPr>
-              <w:t>2.1%</w:t>
+              <w:t>2.3%</w:t>
             </w:r>
           </w:p>
         </w:tc>
@@ -10157,7 +10749,7 @@
           <w:caps w:val="0"/>
           <w:sz w:val="22"/>
         </w:rPr>
-        <w:t>Tabela 10. Verifikimi i atyre që u aplikuan</w:t>
+        <w:t>Tabela 11. Verifikimi i atyre që u aplikuan</w:t>
       </w:r>
     </w:p>
     <w:tbl>
@@ -10270,7 +10862,7 @@
                 <w:caps w:val="0"/>
                 <w:sz w:val="22"/>
               </w:rPr>
-              <w:t>3558</w:t>
+              <w:t>3460</w:t>
             </w:r>
           </w:p>
         </w:tc>
@@ -10290,7 +10882,7 @@
                 <w:caps w:val="0"/>
                 <w:sz w:val="22"/>
               </w:rPr>
-              <w:t>97.9%</w:t>
+              <w:t>98.0%</w:t>
             </w:r>
           </w:p>
         </w:tc>
@@ -10394,7 +10986,7 @@
                 <w:caps w:val="0"/>
                 <w:sz w:val="22"/>
               </w:rPr>
-              <w:t>13</w:t>
+              <w:t>12</w:t>
             </w:r>
           </w:p>
         </w:tc>
@@ -10414,7 +11006,7 @@
                 <w:caps w:val="0"/>
                 <w:sz w:val="22"/>
               </w:rPr>
-              <w:t>0.4%</w:t>
+              <w:t>0.3%</w:t>
             </w:r>
           </w:p>
         </w:tc>
@@ -10456,7 +11048,7 @@
                 <w:caps w:val="0"/>
                 <w:sz w:val="22"/>
               </w:rPr>
-              <w:t>4</w:t>
+              <w:t>2</w:t>
             </w:r>
           </w:p>
         </w:tc>
@@ -10500,7 +11092,7 @@
           <w:caps w:val="0"/>
           <w:sz w:val="24"/>
         </w:rPr>
-        <w:t>Nga 3633 rishkrime, 58 futën një gabim që nuk ishte aty më parë (1.60%). Pjesa tjetër ose kompiloi, ose nuk shtoi asnjë lloj të ri gabimi kundrejt skedarit origjinal.</w:t>
+        <w:t>Nga 3532 rishkrime, 58 futën një gabim që nuk ishte aty më parë (1.64%). Pjesa tjetër ose kompiloi, ose nuk shtoi asnjë lloj të ri gabimi kundrejt skedarit origjinal.</w:t>
       </w:r>
     </w:p>
     <w:p>
@@ -10516,7 +11108,7 @@
           <w:caps w:val="0"/>
           <w:sz w:val="24"/>
         </w:rPr>
-        <w:t>Çdo entitet i rishkruar u mat sërish, për të parë nëse detektori ende ndez mbi të (Tabela 11).</w:t>
+        <w:t>Çdo entitet i rishkruar u mat sërish, për të parë nëse detektori ende ndez mbi të (Tabela 12).</w:t>
       </w:r>
     </w:p>
     <w:p>
@@ -10531,7 +11123,7 @@
           <w:caps w:val="0"/>
           <w:sz w:val="22"/>
         </w:rPr>
-        <w:t>Tabela 11. A u hoq era pas rishkrimit</w:t>
+        <w:t>Tabela 12. A u hoq era pas rishkrimit</w:t>
       </w:r>
     </w:p>
     <w:tbl>
@@ -10644,7 +11236,7 @@
                 <w:caps w:val="0"/>
                 <w:sz w:val="22"/>
               </w:rPr>
-              <w:t>2341</w:t>
+              <w:t>2287</w:t>
             </w:r>
           </w:p>
         </w:tc>
@@ -10664,7 +11256,7 @@
                 <w:caps w:val="0"/>
                 <w:sz w:val="22"/>
               </w:rPr>
-              <w:t>64.4%</w:t>
+              <w:t>64.8%</w:t>
             </w:r>
           </w:p>
         </w:tc>
@@ -10706,7 +11298,7 @@
                 <w:caps w:val="0"/>
                 <w:sz w:val="22"/>
               </w:rPr>
-              <w:t>825</w:t>
+              <w:t>793</w:t>
             </w:r>
           </w:p>
         </w:tc>
@@ -10726,7 +11318,7 @@
                 <w:caps w:val="0"/>
                 <w:sz w:val="22"/>
               </w:rPr>
-              <w:t>22.7%</w:t>
+              <w:t>22.5%</w:t>
             </w:r>
           </w:p>
         </w:tc>
@@ -10768,7 +11360,7 @@
                 <w:caps w:val="0"/>
                 <w:sz w:val="22"/>
               </w:rPr>
-              <w:t>467</w:t>
+              <w:t>452</w:t>
             </w:r>
           </w:p>
         </w:tc>
@@ -10788,7 +11380,7 @@
                 <w:caps w:val="0"/>
                 <w:sz w:val="22"/>
               </w:rPr>
-              <w:t>12.9%</w:t>
+              <w:t>12.8%</w:t>
             </w:r>
           </w:p>
         </w:tc>
@@ -10812,7 +11404,7 @@
           <w:caps w:val="0"/>
           <w:sz w:val="24"/>
         </w:rPr>
-        <w:t>Edhe metrika që e ndez detektorin u mat para dhe pas; mesoret mbi vendet e aplikuara janë (Tabela 12):</w:t>
+        <w:t>Edhe metrika që e ndez detektorin u mat para dhe pas; mesoret mbi vendet e aplikuara janë (Tabela 13):</w:t>
       </w:r>
     </w:p>
     <w:p>
@@ -10827,7 +11419,7 @@
           <w:caps w:val="0"/>
           <w:sz w:val="22"/>
         </w:rPr>
-        <w:t>Tabela 12. Sa lëvizi matja pas rishkrimit</w:t>
+        <w:t>Tabela 13. Sa lëvizi matja pas rishkrimit</w:t>
       </w:r>
     </w:p>
     <w:tbl>
@@ -11001,7 +11593,7 @@
                 <w:caps w:val="0"/>
                 <w:sz w:val="22"/>
               </w:rPr>
-              <w:t>819</w:t>
+              <w:t>761</w:t>
             </w:r>
           </w:p>
         </w:tc>
@@ -11083,7 +11675,7 @@
                 <w:caps w:val="0"/>
                 <w:sz w:val="22"/>
               </w:rPr>
-              <w:t>100</w:t>
+              <w:t>72</w:t>
             </w:r>
           </w:p>
         </w:tc>
@@ -11271,7 +11863,7 @@
           <w:caps w:val="0"/>
           <w:sz w:val="24"/>
         </w:rPr>
-        <w:t>Pas rishkrimit u shfaqën 937 erëra që nuk ishin aty më parë: Brain Method (63), Deep Nesting (146), Feature Envy (134), God Class (47), Large Class (8), Long Method (167), Long Parameter List (372).</w:t>
+        <w:t>Pas rishkrimit u shfaqën 865 erëra që nuk ishin aty më parë: Brain Method (55), Deep Nesting (89), Feature Envy (134), God Class (47), Large Class (8), Long Method (165), Long Parameter List (367).</w:t>
       </w:r>
     </w:p>
     <w:p>
@@ -11287,7 +11879,7 @@
           <w:caps w:val="0"/>
           <w:sz w:val="24"/>
         </w:rPr>
-        <w:t>Mbi mostrën e mbjellë të Nënkapitullit 4.7, prej 60 skedarësh dhe 405 rishkrimesh, i njëjti rishkrim u kompilua i vetëm dhe brenda projektit të vet (Tabela 13).</w:t>
+        <w:t>Mbi mostrën e mbjellë të Nënkapitullit 4.7, prej 60 skedarësh dhe 201 rishkrimesh, i njëjti rishkrim u kompilua i vetëm dhe brenda projektit të vet (Tabela 14).</w:t>
       </w:r>
     </w:p>
     <w:p>
@@ -11302,7 +11894,7 @@
           <w:caps w:val="0"/>
           <w:sz w:val="22"/>
         </w:rPr>
-        <w:t>Tabela 13. Verdikti i të njëjtave rishkrime, të izoluara dhe brenda projektit</w:t>
+        <w:t>Tabela 14. Verdikti i të njëjtave rishkrime, të izoluara dhe brenda projektit</w:t>
       </w:r>
     </w:p>
     <w:tbl>
@@ -11415,7 +12007,7 @@
                 <w:caps w:val="0"/>
                 <w:sz w:val="22"/>
               </w:rPr>
-              <w:t>1</w:t>
+              <w:t>5</w:t>
             </w:r>
           </w:p>
         </w:tc>
@@ -11435,7 +12027,7 @@
                 <w:caps w:val="0"/>
                 <w:sz w:val="22"/>
               </w:rPr>
-              <w:t>46</w:t>
+              <w:t>66</w:t>
             </w:r>
           </w:p>
         </w:tc>
@@ -11497,7 +12089,7 @@
                 <w:caps w:val="0"/>
                 <w:sz w:val="22"/>
               </w:rPr>
-              <w:t>1</w:t>
+              <w:t>2</w:t>
             </w:r>
           </w:p>
         </w:tc>
@@ -11539,7 +12131,7 @@
                 <w:caps w:val="0"/>
                 <w:sz w:val="22"/>
               </w:rPr>
-              <w:t>404</w:t>
+              <w:t>196</w:t>
             </w:r>
           </w:p>
         </w:tc>
@@ -11559,7 +12151,7 @@
                 <w:caps w:val="0"/>
                 <w:sz w:val="22"/>
               </w:rPr>
-              <w:t>351</w:t>
+              <w:t>110</w:t>
             </w:r>
           </w:p>
         </w:tc>
@@ -11621,7 +12213,7 @@
                 <w:caps w:val="0"/>
                 <w:sz w:val="22"/>
               </w:rPr>
-              <w:t>7</w:t>
+              <w:t>23</w:t>
             </w:r>
           </w:p>
         </w:tc>
@@ -11645,7 +12237,7 @@
           <w:caps w:val="0"/>
           <w:sz w:val="24"/>
         </w:rPr>
-        <w:t>Verdikti «kompilon» kalon nga 1 te 46 nga 405 rishkrime, pra nga 0.2% në 11.4%.</w:t>
+        <w:t>Verdikti «kompilon» kalon nga 5 te 66 nga 201 rishkrime, pra nga 2.5% në 32.8%.</w:t>
       </w:r>
     </w:p>
     <w:p>
@@ -11661,7 +12253,7 @@
           <w:caps w:val="0"/>
           <w:sz w:val="24"/>
         </w:rPr>
-        <w:t>Një rishkrim nga 405 nuk shtonte lloj të ri gabimi i izoluar, por shton brenda projektit të vet. Rasti është një Extract Method mbi AlertSummaryRenderer.finalizeResult(Result) te «AlertSummaryRenderer.java» e projektit Ambari, dhe të tria gabimet që shton janë paketa të palëve të treta që mungojnë në korpus. Shtatë kompilime e kaluan kufirin kohor dhe numërohen si të pakontrolluara, kurrë si sukses. Matja zgjati rreth 4 orë.</w:t>
+        <w:t>Dy rishkrime nga 201 nuk shtonin lloj të ri gabimi të izoluara, por shtojnë brenda projektit të vet. Rastet janë Extract Method mbi PlanModifierUtil.fixTopOBSchema(RelNode, Pair, List, boolean) në projektin «hive» dhe Extract Method mbi TypeHierarchyTests.testSupertypeHierarchyOnWorkingCopy() në projektin «eclipse.jdt.core». Skedari i matjes mban verdiktin e jo mesazhin e kompilatorit, ndaj shkaku i tyre nuk u veçua. Kufirin kohor e kaluan 23 kompilime, dhe numërohen si të pakontrolluara, kurrë si sukses.</w:t>
       </w:r>
     </w:p>
     <w:p>
@@ -11693,7 +12285,7 @@
           <w:caps w:val="0"/>
           <w:sz w:val="24"/>
         </w:rPr>
-        <w:t>Norma e përgjithshme e transformimit është 20.4%. E ndarë sipas erës dhe sipas ashpërsisë që sistemi i cakton vendit, ajo shpërndahet kështu (Tabela 14):</w:t>
+        <w:t>Norma e përgjithshme e transformimit është 22.4%. E ndarë sipas erës dhe sipas ashpërsisë që sistemi i cakton vendit, ajo shpërndahet kështu (Tabela 15):</w:t>
       </w:r>
     </w:p>
     <w:p>
@@ -11708,7 +12300,7 @@
           <w:caps w:val="0"/>
           <w:sz w:val="22"/>
         </w:rPr>
-        <w:t>Tabela 14. Norma e transformimit sipas erës dhe ashpërsisë</w:t>
+        <w:t>Tabela 15. Norma e transformimit sipas erës dhe ashpërsisë</w:t>
       </w:r>
     </w:p>
     <w:tbl>
@@ -11883,7 +12475,7 @@
                 <w:caps w:val="0"/>
                 <w:sz w:val="22"/>
               </w:rPr>
-              <w:t>1520</w:t>
+              <w:t>1334</w:t>
             </w:r>
           </w:p>
         </w:tc>
@@ -11903,7 +12495,7 @@
                 <w:caps w:val="0"/>
                 <w:sz w:val="22"/>
               </w:rPr>
-              <w:t>381</w:t>
+              <w:t>325</w:t>
             </w:r>
           </w:p>
         </w:tc>
@@ -11923,7 +12515,7 @@
                 <w:caps w:val="0"/>
                 <w:sz w:val="22"/>
               </w:rPr>
-              <w:t>25.1%</w:t>
+              <w:t>24.4%</w:t>
             </w:r>
           </w:p>
         </w:tc>
@@ -11985,7 +12577,7 @@
                 <w:caps w:val="0"/>
                 <w:sz w:val="22"/>
               </w:rPr>
-              <w:t>1539</w:t>
+              <w:t>1496</w:t>
             </w:r>
           </w:p>
         </w:tc>
@@ -12005,7 +12597,7 @@
                 <w:caps w:val="0"/>
                 <w:sz w:val="22"/>
               </w:rPr>
-              <w:t>525</w:t>
+              <w:t>519</w:t>
             </w:r>
           </w:p>
         </w:tc>
@@ -12025,7 +12617,7 @@
                 <w:caps w:val="0"/>
                 <w:sz w:val="22"/>
               </w:rPr>
-              <w:t>34.1%</w:t>
+              <w:t>34.7%</w:t>
             </w:r>
           </w:p>
         </w:tc>
@@ -12087,7 +12679,7 @@
                 <w:caps w:val="0"/>
                 <w:sz w:val="22"/>
               </w:rPr>
-              <w:t>276</w:t>
+              <w:t>135</w:t>
             </w:r>
           </w:p>
         </w:tc>
@@ -12107,7 +12699,7 @@
                 <w:caps w:val="0"/>
                 <w:sz w:val="22"/>
               </w:rPr>
-              <w:t>63</w:t>
+              <w:t>56</w:t>
             </w:r>
           </w:p>
         </w:tc>
@@ -12127,7 +12719,7 @@
                 <w:caps w:val="0"/>
                 <w:sz w:val="22"/>
               </w:rPr>
-              <w:t>22.8%</w:t>
+              <w:t>41.5%</w:t>
             </w:r>
           </w:p>
         </w:tc>
@@ -12189,7 +12781,7 @@
                 <w:caps w:val="0"/>
                 <w:sz w:val="22"/>
               </w:rPr>
-              <w:t>416</w:t>
+              <w:t>96</w:t>
             </w:r>
           </w:p>
         </w:tc>
@@ -12209,7 +12801,7 @@
                 <w:caps w:val="0"/>
                 <w:sz w:val="22"/>
               </w:rPr>
-              <w:t>4</w:t>
+              <w:t>2</w:t>
             </w:r>
           </w:p>
         </w:tc>
@@ -12229,7 +12821,7 @@
                 <w:caps w:val="0"/>
                 <w:sz w:val="22"/>
               </w:rPr>
-              <w:t>1.0%</w:t>
+              <w:t>2.1%</w:t>
             </w:r>
           </w:p>
         </w:tc>
@@ -12291,7 +12883,7 @@
                 <w:caps w:val="0"/>
                 <w:sz w:val="22"/>
               </w:rPr>
-              <w:t>2054</w:t>
+              <w:t>1383</w:t>
             </w:r>
           </w:p>
         </w:tc>
@@ -12311,7 +12903,7 @@
                 <w:caps w:val="0"/>
                 <w:sz w:val="22"/>
               </w:rPr>
-              <w:t>42</w:t>
+              <w:t>29</w:t>
             </w:r>
           </w:p>
         </w:tc>
@@ -12331,7 +12923,7 @@
                 <w:caps w:val="0"/>
                 <w:sz w:val="22"/>
               </w:rPr>
-              <w:t>2.0%</w:t>
+              <w:t>2.1%</w:t>
             </w:r>
           </w:p>
         </w:tc>
@@ -12393,7 +12985,7 @@
                 <w:caps w:val="0"/>
                 <w:sz w:val="22"/>
               </w:rPr>
-              <w:t>3019</w:t>
+              <w:t>2348</w:t>
             </w:r>
           </w:p>
         </w:tc>
@@ -12413,7 +13005,7 @@
                 <w:caps w:val="0"/>
                 <w:sz w:val="22"/>
               </w:rPr>
-              <w:t>65</w:t>
+              <w:t>48</w:t>
             </w:r>
           </w:p>
         </w:tc>
@@ -12433,7 +13025,7 @@
                 <w:caps w:val="0"/>
                 <w:sz w:val="22"/>
               </w:rPr>
-              <w:t>2.1%</w:t>
+              <w:t>2.0%</w:t>
             </w:r>
           </w:p>
         </w:tc>
@@ -13069,7 +13661,7 @@
           <w:caps w:val="0"/>
           <w:sz w:val="24"/>
         </w:rPr>
-        <w:t>Niveli kritik ka normën më të ulët te tri nga katër erërat, dhe te Brain Method dhe Long Method niveli i mesëm ka normë më të lartë se i buti.</w:t>
+        <w:t>Niveli kritik ka normën më të ulët te tri nga katër erërat, dhe te Deep Nesting dhe Long Method niveli i mesëm ka normë më të lartë se i buti.</w:t>
       </w:r>
     </w:p>
     <w:p>
@@ -13085,7 +13677,7 @@
           <w:caps w:val="0"/>
           <w:sz w:val="24"/>
         </w:rPr>
-        <w:t>E bashkuar mbi erërat, niveli kritik del me 23.2% kundrejt 19.7% të niveleve të tjera, renditje e kundërt me atë të erërave veç e veç (paradoksi i Simpson-it): Brain Method ka normë 29.1% dhe 45.6% vende kritike, ndërsa Long Parameter List ka 8.4% dhe 4.9%. Prandaj tabela nuk bashkohet.</w:t>
+        <w:t>E bashkuar mbi erërat, niveli kritik del me 25.3% kundrejt 21.7% të niveleve të tjera, renditje e kundërt me atë të erërave veç e veç (paradoksi i Simpson-it): Brain Method ka normë 30.4% dhe 45.0% vende kritike, ndërsa Deep Nesting ka 2.1% dhe 2.5%. Prandaj tabela nuk bashkohet.</w:t>
       </w:r>
     </w:p>
     <w:p>
@@ -13101,7 +13693,7 @@
           <w:caps w:val="0"/>
           <w:sz w:val="24"/>
         </w:rPr>
-        <w:t>Brenda çdo niveli ashpërsie, arsyet e refuzimit kanë këtë përbërje (Tabela 15):</w:t>
+        <w:t>Brenda çdo niveli ashpërsie, arsyet e refuzimit kanë këtë përbërje (Tabela 16):</w:t>
       </w:r>
     </w:p>
     <w:p>
@@ -13116,7 +13708,7 @@
           <w:caps w:val="0"/>
           <w:sz w:val="22"/>
         </w:rPr>
-        <w:t>Tabela 15. Përbërja e arsyeve të refuzimit brenda çdo niveli</w:t>
+        <w:t>Tabela 16. Përbërja e arsyeve të refuzimit brenda çdo niveli</w:t>
       </w:r>
     </w:p>
     <w:tbl>
@@ -13250,7 +13842,7 @@
                 <w:caps w:val="0"/>
                 <w:sz w:val="22"/>
               </w:rPr>
-              <w:t>78%</w:t>
+              <w:t>75%</w:t>
             </w:r>
           </w:p>
         </w:tc>
@@ -13270,7 +13862,7 @@
                 <w:caps w:val="0"/>
                 <w:sz w:val="22"/>
               </w:rPr>
-              <w:t>62%</w:t>
+              <w:t>56%</w:t>
             </w:r>
           </w:p>
         </w:tc>
@@ -13290,7 +13882,7 @@
                 <w:caps w:val="0"/>
                 <w:sz w:val="22"/>
               </w:rPr>
-              <w:t>28%</w:t>
+              <w:t>19%</w:t>
             </w:r>
           </w:p>
         </w:tc>
@@ -13332,7 +13924,7 @@
                 <w:caps w:val="0"/>
                 <w:sz w:val="22"/>
               </w:rPr>
-              <w:t>17%</w:t>
+              <w:t>19%</w:t>
             </w:r>
           </w:p>
         </w:tc>
@@ -13352,7 +13944,7 @@
                 <w:caps w:val="0"/>
                 <w:sz w:val="22"/>
               </w:rPr>
-              <w:t>30%</w:t>
+              <w:t>34%</w:t>
             </w:r>
           </w:p>
         </w:tc>
@@ -13372,7 +13964,7 @@
                 <w:caps w:val="0"/>
                 <w:sz w:val="22"/>
               </w:rPr>
-              <w:t>62%</w:t>
+              <w:t>69%</w:t>
             </w:r>
           </w:p>
         </w:tc>
@@ -13434,7 +14026,7 @@
                 <w:caps w:val="0"/>
                 <w:sz w:val="22"/>
               </w:rPr>
-              <w:t>5%</w:t>
+              <w:t>6%</w:t>
             </w:r>
           </w:p>
         </w:tc>
@@ -13454,7 +14046,7 @@
                 <w:caps w:val="0"/>
                 <w:sz w:val="22"/>
               </w:rPr>
-              <w:t>5%</w:t>
+              <w:t>6%</w:t>
             </w:r>
           </w:p>
         </w:tc>
@@ -13496,7 +14088,7 @@
                 <w:caps w:val="0"/>
                 <w:sz w:val="22"/>
               </w:rPr>
-              <w:t>1%</w:t>
+              <w:t>2%</w:t>
             </w:r>
           </w:p>
         </w:tc>
@@ -13578,7 +14170,7 @@
                 <w:caps w:val="0"/>
                 <w:sz w:val="22"/>
               </w:rPr>
-              <w:t>0%</w:t>
+              <w:t>1%</w:t>
             </w:r>
           </w:p>
         </w:tc>
@@ -13724,7 +14316,7 @@
           <w:caps w:val="0"/>
           <w:sz w:val="24"/>
         </w:rPr>
-        <w:t>Nga niveli minor te critical, pjesa e refuzimeve për formën e kodit (shape not matched) kalon nga 78% në 28%, ndërsa ajo për rrjedhën e kontrollit (control flow escapes) nga 17% në 62%.</w:t>
+        <w:t>Nga niveli minor te critical, pjesa e refuzimeve për formën e kodit (shape not matched) kalon nga 75% në 19%, ndërsa ajo për rrjedhën e kontrollit (control flow escapes) nga 19% në 69%.</w:t>
       </w:r>
     </w:p>
     <w:p>
@@ -13835,7 +14427,7 @@
           <w:caps w:val="0"/>
           <w:sz w:val="24"/>
         </w:rPr>
-        <w:t xml:space="preserve"> Modelet e tejkalojnë qasjen me rregulla te çdo erë, dhe meqë klasifikuesi i shumicës nuk ndez kurrë, fitimi nuk vjen nga çekuilibri i klasave. I njëjti informacion, i lexuar pa kufij të fiksuar paraprakisht, jep më shumë: strategjive nuk u mungojnë metrikat, u mungon vendi i duhur ku t'i presin.</w:t>
+        <w:t xml:space="preserve"> Modelet e tejkalojnë qasjen me rregulla te çdo erë, dhe meqë klasifikuesi i shumicës nuk ndez kurrë, fitimi nuk vjen nga çekuilibri i klasave. Ablacioni i Nënkapitullit 5.2 e ndan këtë fitim në dy pjesë. Vetëm me metrikat e strategjisë, pra duke mësuar vetëm ku pritet kufiri, modeli e ngre MCC-në te të katër erërat, me 0.093 deri në 0.166. Metrikat e tjera shtojnë edhe 0.052 deri në 0.259, më së shumti te Feature Envy. Strategjive u mungojnë pra të dyja: kufiri i duhur dhe një pjesë e informacionit.</w:t>
       </w:r>
     </w:p>
     <w:p>
@@ -13851,7 +14443,7 @@
           <w:caps w:val="0"/>
           <w:sz w:val="24"/>
         </w:rPr>
-        <w:t>Shpjegimi për rast e zbut kundërshtimin standard ndaj mësimit të makinës, se modeli fiton por nuk thotë pse. Te 69% deri në 96% të verdikteve një matje e vetme e mban shënimin, dhe matja më e shpeshtë vendimtare është CLOC te Blob, CLOC te Data Class, MLOC te Feature Envy, MLOC te Long Method. Zhvilluesi merr kështu një fjali me të njëjtën formë si klauzola e një strategjie. Që Feature Envy shpjegohet kryesisht me gjatësinë e metodës, e jo me qasjet në të dhëna të huaja, tregon se modeli mëson atë që rishikuesit shënojnë, jo domosdoshmërisht përkufizimin e erës.</w:t>
+        <w:t>Shpjegimi për rast e zbut kundërshtimin standard ndaj mësimit të makinës, se modeli fiton por nuk thotë pse. Te 56% deri në 97% të verdikteve një matje e vetme e mban shënimin, dhe matja më e shpeshtë vendimtare është CLOC te Blob, CLOC te Data Class, MLOC te Feature Envy, MLOC te Long Method. Zhvilluesi merr kështu një fjali me të njëjtën formë si klauzola e një strategjie. Që Feature Envy shpjegohet kryesisht me gjatësinë e metodës, e jo me qasjet në të dhëna të huaja, tregon se modeli mëson atë që rishikuesit shënojnë, jo domosdoshmërisht përkufizimin e erës.</w:t>
       </w:r>
     </w:p>
     <w:p>
@@ -13908,7 +14500,7 @@
           <w:caps w:val="0"/>
           <w:sz w:val="24"/>
         </w:rPr>
-        <w:t>Verdikti i izoluar është më i rreptë se vetë rishkrimi. Brenda projektit të vet (Nënkapitulli 5.4), shumica e rasteve «pa gabim të ri» kompilojnë plotësisht, ndaj gabimet e tyre të mëparshme i detyroheshin mungesës së fqinjëve dhe jo transformimit. Përmbysja e vetme, te Ambari, shton gabime vetëm sepse tipi që kalon te nënshkrimi i metodës së nxjerrë mban anotacione nga një bibliotekë që korpusi nuk e ka. Toleranca «pa lloj të ri gabimi» mbetet dëshmi e përdorshme ku kompilimi i plotë nuk arrihet, por jo garanci.</w:t>
+        <w:t>Verdikti i izoluar është më i rreptë se vetë rishkrimi. Brenda projektit të vet (Nënkapitulli 5.4), 65 nga 196 rishkrimet «pa gabim të ri» kompilojnë plotësisht, pra gabimet e tyre të mëparshme i detyroheshin mungesës së fqinjëve dhe jo transformimit. Te pjesa tjetër, gabimet ishin aty edhe para rishkrimit: korpusi nuk mban bibliotekat e jashtme. Dy rishkrime shkojnë në drejtimin e kundërt: pa gabim të ri të izoluara, me gabim të ri brenda projektit. Toleranca «pa lloj të ri gabimi» mbetet dëshmi e përdorshme ku kompilimi i plotë nuk arrihet, por jo garanci.</w:t>
       </w:r>
     </w:p>
     <w:p>
@@ -14098,7 +14690,7 @@
           <w:caps w:val="0"/>
           <w:sz w:val="24"/>
         </w:rPr>
-        <w:t>Krahasimi më i drejtpërdrejtë është me Madeyski &amp; Lewowski (2023), të cilët trajnuan tetë algoritme mbi të njëjtin dataset MLCQ, me metrikat e PMD-së dhe të CODEBEAT-it si veçori. Konfigurimi i tyre DS1 e quan pozitive një mostër me të njëjtin kriter si ky punim (Nënkapitulli 4.9). Tabela vë përballë MCC-në e të dy qasjeve këtu me mesoren më të mirë të MCC-së që raportojnë ata (Tabela 16).</w:t>
+        <w:t>Krahasimi më i drejtpërdrejtë është me Madeyski &amp; Lewowski (2023), të cilët trajnuan tetë algoritme mbi të njëjtin dataset MLCQ, me metrikat e PMD-së dhe të CODEBEAT-it si veçori. Konfigurimi i tyre DS1 e quan pozitive një mostër me të njëjtin kriter si ky punim (Nënkapitulli 4.9). Tabela vë përballë MCC-në e të dy qasjeve këtu me mesoren më të mirë të MCC-së që raportojnë ata (Tabela 17).</w:t>
       </w:r>
     </w:p>
     <w:p>
@@ -14113,7 +14705,7 @@
           <w:caps w:val="0"/>
           <w:sz w:val="22"/>
         </w:rPr>
-        <w:t>Tabela 16. Krahasimi i MCC-së me Madeyski &amp; Lewowski (2023), mbi MLCQ</w:t>
+        <w:t>Tabela 17. Krahasimi i MCC-së me Madeyski &amp; Lewowski (2023), mbi MLCQ</w:t>
       </w:r>
     </w:p>
     <w:tbl>
@@ -14349,7 +14941,7 @@
                 <w:caps w:val="0"/>
                 <w:sz w:val="22"/>
               </w:rPr>
-              <w:t>0.500</w:t>
+              <w:t>0.498</w:t>
             </w:r>
           </w:p>
         </w:tc>
@@ -14431,7 +15023,7 @@
                 <w:caps w:val="0"/>
                 <w:sz w:val="22"/>
               </w:rPr>
-              <w:t>0.669</w:t>
+              <w:t>0.696</w:t>
             </w:r>
           </w:p>
         </w:tc>
@@ -14513,7 +15105,7 @@
                 <w:caps w:val="0"/>
                 <w:sz w:val="22"/>
               </w:rPr>
-              <w:t>0.713</w:t>
+              <w:t>0.724</w:t>
             </w:r>
           </w:p>
         </w:tc>
@@ -14573,7 +15165,7 @@
           <w:caps w:val="0"/>
           <w:sz w:val="24"/>
         </w:rPr>
-        <w:t>Te Feature Envy drejtimi është i kundërt: 0.67 këtu kundrejt 0.31 atje, ku autorët e quajnë erën më të vështirë. Shpjegimi më i mundshëm janë veçoritë: ky punim mat për çdo metodë ATFD, LAA, FDP dhe rreshtat efektivë, ndërsa ata përdorin metrika të mjeteve të përgjithshme. Dy punimet nuk vlerësohen mbi saktësisht të njëjtat mostra, sepse një pjesë e depove sot mungon, ndaj dallimi lexohet si tregues dhe jo si provë.</w:t>
+        <w:t>Te Feature Envy drejtimi është i kundërt: 0.70 këtu kundrejt 0.31 atje, ku autorët e quajnë erën më të vështirë. Shpjegimi më i mundshëm janë veçoritë: ky punim mat për çdo metodë ATFD, LAA, FDP dhe rreshtat efektivë, ndërsa ata përdorin metrika të mjeteve të përgjithshme. Dy punimet nuk vlerësohen mbi saktësisht të njëjtat mostra, sepse një pjesë e depove sot mungon, ndaj dallimi lexohet si tregues dhe jo si provë.</w:t>
       </w:r>
     </w:p>
     <w:p>
@@ -14589,7 +15181,7 @@
           <w:caps w:val="0"/>
           <w:sz w:val="24"/>
         </w:rPr>
-        <w:t>Rezultatet janë shumë larg atyre të Arcelli Fontana et al. (2016), ku shumica e klasifikuesve kaluan 95% në saktësi dhe F-measure. Di Nucci et al. (2018) treguan se ato vlera vinin nga ndërtimi i dataset-it: me shpërndarje më realiste të metrikave, F-measure ra deri në 90% më poshtë. MLCQ është ky lloj dataset-i realist, dhe F1-i i këtij punimi, nga 0.61 deri në 0.76, e konfirmon drejtimin e Di Nucci et al.: mësimi i makinës ndihmon, por problemi nuk është i zgjidhur.</w:t>
+        <w:t>Rezultatet janë shumë larg atyre të Arcelli Fontana et al. (2016), ku shumica e klasifikuesve kaluan 95% në saktësi dhe F-measure. Di Nucci et al. (2018) treguan se ato vlera vinin nga ndërtimi i dataset-it: me shpërndarje më realiste të metrikave, F-measure ra deri në 90% më poshtë. MLCQ është ky lloj dataset-i realist, dhe F1-i i këtij punimi, nga 0.61 deri në 0.77, e konfirmon drejtimin e Di Nucci et al.: mësimi i makinës ndihmon, por problemi nuk është i zgjidhur.</w:t>
       </w:r>
     </w:p>
     <w:p>
@@ -14685,7 +15277,7 @@
           <w:caps w:val="0"/>
           <w:sz w:val="24"/>
         </w:rPr>
-        <w:t xml:space="preserve"> Po, e përmirëson. Modeli i mësuar mbi të njëjtat metrika e ngre MCC-në te të katër erërat: brezi kalon nga 0.232–0.580 në 0.488–0.713, dhe intervalet bootstrap sipas depos e vendosin këtë përparësi mbi zero pa përjashtim. Fitimi vjen kryesisht nga recall-i, që rritet te çdo erë. Një rezervë e vetme: kur rregullit i jepet pragu i tij më i mirë nga fshirja, dallimi te Long Method nuk ndahet më nga zeroja (Shtojca 8.10).</w:t>
+        <w:t xml:space="preserve"> Po, e përmirëson. Modeli i mësuar mbi metrikat e sistemit e ngre MCC-në te të katër erërat: brezi kalon nga 0.232–0.580 në 0.488–0.724, dhe intervalet bootstrap sipas depos e vendosin këtë përparësi mbi zero pa përjashtim. Fitimi vjen kryesisht nga recall-i, që rritet te çdo erë. Një rezervë e vetme: kur rregullit i jepet pragu i tij më i mirë nga fshirja, dallimi te Long Method nuk ndahet më nga zeroja (Shtojca 8.10). Fitimi mbetet, më i vogël, edhe kur modeli sheh vetëm metrikat e strategjisë, ndaj nuk vjen vetëm nga metrikat shtesë (Nënkapitulli 5.2).</w:t>
       </w:r>
     </w:p>
     <w:p>
@@ -14710,7 +15302,7 @@
           <w:caps w:val="0"/>
           <w:sz w:val="24"/>
         </w:rPr>
-        <w:t xml:space="preserve"> Pjesërisht. Motori transformoi 20.4% të vendeve të detektuara; nga rishkrimet, 98.3% kompiluan ose nuk shtuan lloj të ri gabimi, dhe 1.6% shtuan. Era u hoq te 64.4% e tyre, dhe metrika që e shkakton detektimin ra edhe aty ku era mbeti: struktura përmirësohet objektivisht në shumicën e rasteve, me koston e 937 erërave të reja. Kur skedari kompilohet brenda projektit të vet, pjesa që kompilon plotësisht rritet ndjeshëm, ndërsa një rishkrim i vetëm nga 405 e përmbys verdiktin në drejtimin e kundërt dhe e kufizon pretendimin. Ruajtja e sjelljes </w:t>
+        <w:t xml:space="preserve"> Pjesërisht. Motori transformoi 22.4% të vendeve të detektuara; nga rishkrimet, 98.3% kompiluan ose nuk shtuan lloj të ri gabimi, dhe 1.6% shtuan. Era u hoq te 64.8% e tyre, dhe metrika që e shkakton detektimin ra edhe aty ku era mbeti: struktura përmirësohet objektivisht në shumicën e rasteve, me koston e 865 erërave të reja. Kur skedari kompilohet brenda projektit të vet, pjesa që kompilon plotësisht rritet ndjeshëm, ndërsa dy rishkrime nga 201 e përmbysin verdiktin në drejtimin e kundërt dhe e kufizojnë pretendimin. Ruajtja e sjelljes </w:t>
       </w:r>
       <w:r>
         <w:rPr>
@@ -14792,7 +15384,7 @@
           <w:caps w:val="0"/>
           <w:sz w:val="24"/>
         </w:rPr>
-        <w:t xml:space="preserve"> Për një ekip, strategjitë janë sinjal i rrallë por i besueshëm, i përshtatshëm si paralajmërim që nuk e mbyt zhvilluesin me zhurmë. Modeli vlen aty ku ka më shumë rëndësi të mos humbasë asnjë rast, dhe kur të dyja pajtohen, sistemi jep sinjalin e tij më të sigurt. Rishkrimi automatik mund t'i besohet mjetit për rreth një në pesë vende, me kusht që ai të refuzojë çdo gjë që nuk e provon dhe ta masë atë që ndodh pas rishkrimit.</w:t>
+        <w:t xml:space="preserve"> Për një ekip, strategjitë janë sinjal i rrallë por i besueshëm, i përshtatshëm si paralajmërim që nuk e mbyt zhvilluesin me zhurmë. Modeli vlen aty ku ka më shumë rëndësi të mos humbasë asnjë rast, dhe kur të dyja pajtohen, sistemi jep sinjalin e tij më të sigurt. Rishkrimi automatik mund t'i besohet mjetit për rreth një në katër vende, me kusht që ai të refuzojë çdo gjë që nuk e provon dhe ta masë atë që ndodh pas rishkrimit.</w:t>
       </w:r>
     </w:p>
     <w:p>
@@ -14854,7 +15446,7 @@
           <w:caps w:val="0"/>
           <w:sz w:val="24"/>
         </w:rPr>
-        <w:t>Pa zgjidhje simbolesh (Nënkapitulli 3.4), motori ndreq vetëm atë që mbyllet brenda një skedari; erërat që kërkojnë ndryshime në gjithë projektin mbeten te zhvilluesi. Po ashtu, niveli i ashpërsisë që shfaq mjeti është renditje e brendshme e tij dhe jo parashikim i gjykimit njerëzor.</w:t>
+        <w:t>Pa zgjidhje simbolesh (Nënkapitulli 3.4), motori ndreq vetëm atë që mbyllet brenda një skedari; erërat që kërkojnë ndryshime në gjithë projektin mbeten te zhvilluesi. Për të njëjtën arsye, ATFD-ja nuk i ndjek marrësit me zinxhir («a.getB().getC()»): matet në mënyrë konservative, dhe mund t'i humbasë disa raste të Feature Envy-së e të God Class-it. Po ashtu, niveli i ashpërsisë që shfaq mjeti është renditje e brendshme e tij dhe jo parashikim i gjykimit njerëzor.</w:t>
       </w:r>
     </w:p>
     <w:p>
@@ -15646,7 +16238,7 @@
           <w:caps w:val="0"/>
           <w:sz w:val="24"/>
         </w:rPr>
-        <w:t>Tabela jep të tetë strategjitë ashtu si i zbaton sistemi. Kushtet janë ato të shkruara në kodin e detektorit dhe nxirren prej tij kur ndërtohet ky dokument, jo të kopjuara me dorë (Tabela 17).</w:t>
+        <w:t>Tabela jep të tetë strategjitë ashtu si i zbaton sistemi. Kushtet janë ato të shkruara në kodin e detektorit dhe nxirren prej tij kur ndërtohet ky dokument, jo të kopjuara me dorë (Tabela 18).</w:t>
       </w:r>
     </w:p>
     <w:p>
@@ -15661,7 +16253,7 @@
           <w:caps w:val="0"/>
           <w:sz w:val="22"/>
         </w:rPr>
-        <w:t>Tabela 17. Strategjitë e detektimit dhe burimet e tyre</w:t>
+        <w:t>Tabela 18. Strategjitë e detektimit dhe burimet e tyre</w:t>
       </w:r>
     </w:p>
     <w:tbl>
@@ -16463,7 +17055,7 @@
           <w:caps w:val="0"/>
           <w:sz w:val="24"/>
         </w:rPr>
-        <w:t>Strategjitë janë shkruar në një fjalor kuantifikuesish e jo në numra të veçantë. Vlerat numerike pas tyre vijnë nga statistikat e metrikave mbi dyzet e pesë sisteme Java (Tabela 18).</w:t>
+        <w:t>Strategjitë janë shkruar në një fjalor kuantifikuesish e jo në numra të veçantë. Vlerat numerike pas tyre vijnë nga statistikat e metrikave mbi dyzet e pesë sisteme Java (Tabela 19).</w:t>
       </w:r>
     </w:p>
     <w:p>
@@ -16478,7 +17070,7 @@
           <w:caps w:val="0"/>
           <w:sz w:val="22"/>
         </w:rPr>
-        <w:t>Tabela 18. Kuantifikuesit e përgjithshëm</w:t>
+        <w:t>Tabela 19. Kuantifikuesit e përgjithshëm</w:t>
       </w:r>
     </w:p>
     <w:tbl>
@@ -16930,7 +17522,7 @@
           <w:caps w:val="0"/>
           <w:sz w:val="24"/>
         </w:rPr>
-        <w:t>Poshtë janë pragjet me të cilat u prodhuan rezultatet e Kapitullit 5. Secili prej tyre është një nga ata që analiza e ndjeshmërisë i zhvendos, një nga një (Tabela 19).</w:t>
+        <w:t>Poshtë janë pragjet me të cilat u prodhuan rezultatet e Kapitullit 5. Secili prej tyre është një nga ata që analiza e ndjeshmërisë i zhvendos, një nga një (Tabela 20).</w:t>
       </w:r>
     </w:p>
     <w:p>
@@ -16945,7 +17537,7 @@
           <w:caps w:val="0"/>
           <w:sz w:val="22"/>
         </w:rPr>
-        <w:t>Tabela 19. Pragjet e përdorura</w:t>
+        <w:t>Tabela 20. Pragjet e përdorura</w:t>
       </w:r>
     </w:p>
     <w:tbl>
@@ -17999,7 +18591,7 @@
           <w:caps w:val="0"/>
           <w:sz w:val="24"/>
         </w:rPr>
-        <w:t>Çdo entitet matet një herë dhe të gjitha metrikat shkojnë në tabelën e veçorive, edhe ato që asnjë strategji nuk i përdor: modelet e Qasjes B i shohin të gjitha, dhe pikërisht kjo e bën të përgjigjshme pyetjen nëse ato zgjedhin metrikat e strategjive. Kuptimi i shkurtesave jepet te Fjalori i termave (Tabela 20).</w:t>
+        <w:t>Çdo entitet matet një herë dhe të gjitha metrikat shkojnë në tabelën e veçorive, edhe ato që asnjë strategji nuk i përdor: modelet e Qasjes B i shohin të gjitha, dhe pikërisht kjo e bën të përgjigjshme pyetjen nëse ato zgjedhin metrikat e strategjive. Kuptimi i shkurtesave jepet te Fjalori i termave (Tabela 21).</w:t>
       </w:r>
     </w:p>
     <w:p>
@@ -18014,7 +18606,7 @@
           <w:caps w:val="0"/>
           <w:sz w:val="22"/>
         </w:rPr>
-        <w:t>Tabela 20. Metrikat sipas nivelit</w:t>
+        <w:t>Tabela 21. Metrikat sipas nivelit</w:t>
       </w:r>
     </w:p>
     <w:tbl>
@@ -18186,7 +18778,7 @@
           <w:caps w:val="0"/>
           <w:sz w:val="24"/>
         </w:rPr>
-        <w:t>Kolona e fundit dallon çka propozon sistemi nga çka aplikon. Dallimi nuk vjen nga koha e zhvillimit: transformimet e mbetura kërkojnë gjetjen e çdo reference në projekt, çka analiza sintaksore nuk e provon dot (Tabela 21).</w:t>
+        <w:t>Kolona e fundit dallon çka propozon sistemi nga çka aplikon. Dallimi nuk vjen nga koha e zhvillimit: transformimet e mbetura kërkojnë gjetjen e çdo reference në projekt, çka analiza sintaksore nuk e provon dot (Tabela 22).</w:t>
       </w:r>
     </w:p>
     <w:p>
@@ -18201,7 +18793,7 @@
           <w:caps w:val="0"/>
           <w:sz w:val="22"/>
         </w:rPr>
-        <w:t>Tabela 21. Çka propozohet dhe çka aplikohet</w:t>
+        <w:t>Tabela 22. Çka propozohet dhe çka aplikohet</w:t>
       </w:r>
     </w:p>
     <w:tbl>
@@ -18792,7 +19384,7 @@
           <w:caps w:val="0"/>
           <w:sz w:val="24"/>
         </w:rPr>
-        <w:t>Kur një parakusht nuk provohet, motori refuzon me një arsye të numërueshme. Shpërndarja e tyre mbi korpus jepet te Kapitulli 5 (Tabela 22).</w:t>
+        <w:t>Kur një parakusht nuk provohet, motori refuzon me një arsye të numërueshme. Shpërndarja e tyre mbi korpus jepet te Kapitulli 5 (Tabela 23).</w:t>
       </w:r>
     </w:p>
     <w:p>
@@ -18807,7 +19399,7 @@
           <w:caps w:val="0"/>
           <w:sz w:val="22"/>
         </w:rPr>
-        <w:t>Tabela 22. Arsyet e refuzimit</w:t>
+        <w:t>Tabela 23. Arsyet e refuzimit</w:t>
       </w:r>
     </w:p>
     <w:tbl>
@@ -19273,7 +19865,7 @@
           <w:caps w:val="0"/>
           <w:sz w:val="24"/>
         </w:rPr>
-        <w:t>Kodi burimor është i hapur te https://github.com/FlorentLatifi/Code-Smell-Detection-and-Refactoring-Recommendations. Skriptet ekzekutohen në këtë radhë; hapi i parë kërkon qasje në internet, të tjerët jo (Tabela 23).</w:t>
+        <w:t>Kodi burimor është i hapur te https://github.com/FlorentLatifi/Code-Smell-Detection-and-Refactoring-Recommendations. Skriptet ekzekutohen në këtë radhë; hapi i parë kërkon qasje në internet, të tjerët jo (Tabela 24).</w:t>
       </w:r>
     </w:p>
     <w:p>
@@ -19288,7 +19880,7 @@
           <w:caps w:val="0"/>
           <w:sz w:val="22"/>
         </w:rPr>
-        <w:t>Tabela 23. Radha e ekzekutimit</w:t>
+        <w:t>Tabela 24. Radha e ekzekutimit</w:t>
       </w:r>
     </w:p>
     <w:tbl>
@@ -21107,6 +21699,88 @@
           </w:p>
         </w:tc>
       </w:tr>
+      <w:tr>
+        <w:tc>
+          <w:tcPr>
+            <w:tcW w:type="dxa" w:w="2209"/>
+          </w:tcPr>
+          <w:p>
+            <w:pPr>
+              <w:spacing w:line="240" w:lineRule="auto"/>
+              <w:jc w:val="left"/>
+            </w:pPr>
+            <w:r>
+              <w:rPr>
+                <w:rFonts w:ascii="Times New Roman" w:hAnsi="Times New Roman" w:eastAsia="Times New Roman"/>
+                <w:b w:val="0"/>
+                <w:caps w:val="0"/>
+                <w:sz w:val="22"/>
+              </w:rPr>
+              <w:t>22</w:t>
+            </w:r>
+          </w:p>
+        </w:tc>
+        <w:tc>
+          <w:tcPr>
+            <w:tcW w:type="dxa" w:w="2209"/>
+          </w:tcPr>
+          <w:p>
+            <w:pPr>
+              <w:spacing w:line="240" w:lineRule="auto"/>
+              <w:jc w:val="left"/>
+            </w:pPr>
+            <w:r>
+              <w:rPr>
+                <w:rFonts w:ascii="Times New Roman" w:hAnsi="Times New Roman" w:eastAsia="Times New Roman"/>
+                <w:b w:val="0"/>
+                <w:caps w:val="0"/>
+                <w:sz w:val="22"/>
+              </w:rPr>
+              <w:t>train_strategy_features.py</w:t>
+            </w:r>
+          </w:p>
+        </w:tc>
+        <w:tc>
+          <w:tcPr>
+            <w:tcW w:type="dxa" w:w="2209"/>
+          </w:tcPr>
+          <w:p>
+            <w:pPr>
+              <w:spacing w:line="240" w:lineRule="auto"/>
+              <w:jc w:val="left"/>
+            </w:pPr>
+            <w:r>
+              <w:rPr>
+                <w:rFonts w:ascii="Times New Roman" w:hAnsi="Times New Roman" w:eastAsia="Times New Roman"/>
+                <w:b w:val="0"/>
+                <w:caps w:val="0"/>
+                <w:sz w:val="22"/>
+              </w:rPr>
+              <w:t>Qasja B vetëm me metrikat e strategjisë</w:t>
+            </w:r>
+          </w:p>
+        </w:tc>
+        <w:tc>
+          <w:tcPr>
+            <w:tcW w:type="dxa" w:w="2209"/>
+          </w:tcPr>
+          <w:p>
+            <w:pPr>
+              <w:spacing w:line="240" w:lineRule="auto"/>
+              <w:jc w:val="left"/>
+            </w:pPr>
+            <w:r>
+              <w:rPr>
+                <w:rFonts w:ascii="Times New Roman" w:hAnsi="Times New Roman" w:eastAsia="Times New Roman"/>
+                <w:b w:val="0"/>
+                <w:caps w:val="0"/>
+                <w:sz w:val="22"/>
+              </w:rPr>
+              <w:t>sekonda</w:t>
+            </w:r>
+          </w:p>
+        </w:tc>
+      </w:tr>
     </w:tbl>
     <w:p>
       <w:pPr>
@@ -21126,7 +21800,7 @@
           <w:caps w:val="0"/>
           <w:sz w:val="24"/>
         </w:rPr>
-        <w:t>Çdo skript shkruan rezultatin si CSV ose JSON në data/results/, bashkë me commit-in, versionin e Python-it dhe platformën që e prodhuan. Interpretuesi dhe platforma janë të njëjtët për të gjithë: Python 3.13.1, Windows-11-10.0.26200-SP0. Commit-i jo: eksperimentet u ekzekutuan njëri pas tjetrit, ndaj secili skedar mban commit-in e vet, dhe ai duhet përdorur për ta riprodhuar (Tabela 24).</w:t>
+        <w:t>Çdo skript shkruan rezultatin si CSV ose JSON në data/results/, bashkë me commit-in, versionin e Python-it dhe platformën që e prodhuan. Interpretuesi dhe platforma janë të njëjtët për të gjithë: Python 3.13.1, Windows-11-10.0.26200-SP0. Commit-i jo: eksperimentet u ekzekutuan njëri pas tjetrit, ndaj secili skedar mban commit-in e vet, dhe ai duhet përdorur për ta riprodhuar (Tabela 25).</w:t>
       </w:r>
     </w:p>
     <w:p>
@@ -21141,7 +21815,7 @@
           <w:caps w:val="0"/>
           <w:sz w:val="22"/>
         </w:rPr>
-        <w:t>Tabela 24. Commit-i që prodhoi çdo skedar rezultati</w:t>
+        <w:t>Tabela 25. Commit-i që prodhoi çdo skedar rezultati</w:t>
       </w:r>
     </w:p>
     <w:tbl>
@@ -21233,7 +21907,7 @@
                 <w:caps w:val="0"/>
                 <w:sz w:val="22"/>
               </w:rPr>
-              <w:t>1b96a94105</w:t>
+              <w:t>b9db342476</w:t>
             </w:r>
           </w:p>
         </w:tc>
@@ -21275,7 +21949,7 @@
                 <w:caps w:val="0"/>
                 <w:sz w:val="22"/>
               </w:rPr>
-              <w:t>1e0e249e67</w:t>
+              <w:t>b9db342476</w:t>
             </w:r>
           </w:p>
         </w:tc>
@@ -21317,7 +21991,7 @@
                 <w:caps w:val="0"/>
                 <w:sz w:val="22"/>
               </w:rPr>
-              <w:t>40b3d7b240</w:t>
+              <w:t>b9db342476</w:t>
             </w:r>
           </w:p>
         </w:tc>
@@ -21359,7 +22033,7 @@
                 <w:caps w:val="0"/>
                 <w:sz w:val="22"/>
               </w:rPr>
-              <w:t>40b3d7b240</w:t>
+              <w:t>b9db342476</w:t>
             </w:r>
           </w:p>
         </w:tc>
@@ -21381,7 +22055,7 @@
                 <w:caps w:val="0"/>
                 <w:sz w:val="22"/>
               </w:rPr>
-              <w:t>mlcq_dataset.json</w:t>
+              <w:t>ml_strategy_features.json</w:t>
             </w:r>
           </w:p>
         </w:tc>
@@ -21401,7 +22075,7 @@
                 <w:caps w:val="0"/>
                 <w:sz w:val="22"/>
               </w:rPr>
-              <w:t>9b87962978</w:t>
+              <w:t>b9db342476</w:t>
             </w:r>
           </w:p>
         </w:tc>
@@ -21423,7 +22097,7 @@
                 <w:caps w:val="0"/>
                 <w:sz w:val="22"/>
               </w:rPr>
-              <w:t>mlcq_matching.json</w:t>
+              <w:t>mlcq_dataset.json</w:t>
             </w:r>
           </w:p>
         </w:tc>
@@ -21443,7 +22117,7 @@
                 <w:caps w:val="0"/>
                 <w:sz w:val="22"/>
               </w:rPr>
-              <w:t>40b3d7b240</w:t>
+              <w:t>b9db342476</w:t>
             </w:r>
           </w:p>
         </w:tc>
@@ -21465,7 +22139,7 @@
                 <w:caps w:val="0"/>
                 <w:sz w:val="22"/>
               </w:rPr>
-              <w:t>model_without_project.json</w:t>
+              <w:t>mlcq_matching.json</w:t>
             </w:r>
           </w:p>
         </w:tc>
@@ -21485,7 +22159,7 @@
                 <w:caps w:val="0"/>
                 <w:sz w:val="22"/>
               </w:rPr>
-              <w:t>fb8c2d4167</w:t>
+              <w:t>40b3d7b240</w:t>
             </w:r>
           </w:p>
         </w:tc>
@@ -21507,7 +22181,7 @@
                 <w:caps w:val="0"/>
                 <w:sz w:val="22"/>
               </w:rPr>
-              <w:t>pmd_comparison.json</w:t>
+              <w:t>model_without_project.json</w:t>
             </w:r>
           </w:p>
         </w:tc>
@@ -21527,7 +22201,7 @@
                 <w:caps w:val="0"/>
                 <w:sz w:val="22"/>
               </w:rPr>
-              <w:t>e34b32a8c8</w:t>
+              <w:t>b9db342476</w:t>
             </w:r>
           </w:p>
         </w:tc>
@@ -21549,7 +22223,7 @@
                 <w:caps w:val="0"/>
                 <w:sz w:val="22"/>
               </w:rPr>
-              <w:t>refactoring_evaluation.json</w:t>
+              <w:t>pmd_comparison.json</w:t>
             </w:r>
           </w:p>
         </w:tc>
@@ -21569,7 +22243,7 @@
                 <w:caps w:val="0"/>
                 <w:sz w:val="22"/>
               </w:rPr>
-              <w:t>5f62b7b790</w:t>
+              <w:t>e34b32a8c8</w:t>
             </w:r>
           </w:p>
         </w:tc>
@@ -21591,7 +22265,7 @@
                 <w:caps w:val="0"/>
                 <w:sz w:val="22"/>
               </w:rPr>
-              <w:t>refusals_by_severity.json</w:t>
+              <w:t>refactoring_evaluation.json</w:t>
             </w:r>
           </w:p>
         </w:tc>
@@ -21611,7 +22285,7 @@
                 <w:caps w:val="0"/>
                 <w:sz w:val="22"/>
               </w:rPr>
-              <w:t>fb8c2d4167</w:t>
+              <w:t>b9db342476</w:t>
             </w:r>
           </w:p>
         </w:tc>
@@ -21633,7 +22307,7 @@
                 <w:caps w:val="0"/>
                 <w:sz w:val="22"/>
               </w:rPr>
-              <w:t>reviewer_agreement.json</w:t>
+              <w:t>refusals_by_severity.json</w:t>
             </w:r>
           </w:p>
         </w:tc>
@@ -21653,7 +22327,7 @@
                 <w:caps w:val="0"/>
                 <w:sz w:val="22"/>
               </w:rPr>
-              <w:t>40b3d7b240</w:t>
+              <w:t>b9db342476</w:t>
             </w:r>
           </w:p>
         </w:tc>
@@ -21675,7 +22349,7 @@
                 <w:caps w:val="0"/>
                 <w:sz w:val="22"/>
               </w:rPr>
-              <w:t>rules_evaluation.json</w:t>
+              <w:t>reviewer_agreement.json</w:t>
             </w:r>
           </w:p>
         </w:tc>
@@ -21717,7 +22391,7 @@
                 <w:caps w:val="0"/>
                 <w:sz w:val="22"/>
               </w:rPr>
-              <w:t>system_reference.json</w:t>
+              <w:t>rules_evaluation.json</w:t>
             </w:r>
           </w:p>
         </w:tc>
@@ -21737,7 +22411,7 @@
                 <w:caps w:val="0"/>
                 <w:sz w:val="22"/>
               </w:rPr>
-              <w:t>44edc463a6</w:t>
+              <w:t>b9db342476</w:t>
             </w:r>
           </w:p>
         </w:tc>
@@ -21759,7 +22433,7 @@
                 <w:caps w:val="0"/>
                 <w:sz w:val="22"/>
               </w:rPr>
-              <w:t>threshold_calibration.json</w:t>
+              <w:t>system_reference.json</w:t>
             </w:r>
           </w:p>
         </w:tc>
@@ -21779,7 +22453,7 @@
                 <w:caps w:val="0"/>
                 <w:sz w:val="22"/>
               </w:rPr>
-              <w:t>40b3d7b240</w:t>
+              <w:t>44edc463a6</w:t>
             </w:r>
           </w:p>
         </w:tc>
@@ -21801,7 +22475,7 @@
                 <w:caps w:val="0"/>
                 <w:sz w:val="22"/>
               </w:rPr>
-              <w:t>threshold_sweep.json</w:t>
+              <w:t>threshold_calibration.json</w:t>
             </w:r>
           </w:p>
         </w:tc>
@@ -21821,7 +22495,7 @@
                 <w:caps w:val="0"/>
                 <w:sz w:val="22"/>
               </w:rPr>
-              <w:t>40b3d7b240</w:t>
+              <w:t>b9db342476</w:t>
             </w:r>
           </w:p>
         </w:tc>
@@ -21843,6 +22517,48 @@
                 <w:caps w:val="0"/>
                 <w:sz w:val="22"/>
               </w:rPr>
+              <w:t>threshold_sweep.json</w:t>
+            </w:r>
+          </w:p>
+        </w:tc>
+        <w:tc>
+          <w:tcPr>
+            <w:tcW w:type="dxa" w:w="4419"/>
+          </w:tcPr>
+          <w:p>
+            <w:pPr>
+              <w:spacing w:line="240" w:lineRule="auto"/>
+              <w:jc w:val="left"/>
+            </w:pPr>
+            <w:r>
+              <w:rPr>
+                <w:rFonts w:ascii="Times New Roman" w:hAnsi="Times New Roman" w:eastAsia="Times New Roman"/>
+                <w:b w:val="0"/>
+                <w:caps w:val="0"/>
+                <w:sz w:val="22"/>
+              </w:rPr>
+              <w:t>b9db342476</w:t>
+            </w:r>
+          </w:p>
+        </w:tc>
+      </w:tr>
+      <w:tr>
+        <w:tc>
+          <w:tcPr>
+            <w:tcW w:type="dxa" w:w="4419"/>
+          </w:tcPr>
+          <w:p>
+            <w:pPr>
+              <w:spacing w:line="240" w:lineRule="auto"/>
+              <w:jc w:val="left"/>
+            </w:pPr>
+            <w:r>
+              <w:rPr>
+                <w:rFonts w:ascii="Times New Roman" w:hAnsi="Times New Roman" w:eastAsia="Times New Roman"/>
+                <w:b w:val="0"/>
+                <w:caps w:val="0"/>
+                <w:sz w:val="22"/>
+              </w:rPr>
               <w:t>verify_with_project.json</w:t>
             </w:r>
           </w:p>
@@ -21863,7 +22579,7 @@
                 <w:caps w:val="0"/>
                 <w:sz w:val="22"/>
               </w:rPr>
-              <w:t>6dedb127db</w:t>
+              <w:t>b9db342476</w:t>
             </w:r>
           </w:p>
         </w:tc>
@@ -21919,7 +22635,7 @@
           <w:caps w:val="0"/>
           <w:sz w:val="24"/>
         </w:rPr>
-        <w:t>Përjashtimi është hapi i dymbëdhjetë. Ai riprodhoi numrat që mbajnë pretendimin — po aq rishkrime, po aq verdikte «kompilon», asnjë përmbysje — por pesë kompilime që herën e parë e kaluan kufirin kohor, herën e dytë morën verdikt: ndarja mes «i kontrolluar» dhe «i pakontrolluar» varet nga ngarkesa e makinës. Ai riprodhim i përket mostrës së atëhershme prej 30 skedarësh; mostra u dyfishua më vonë, dhe dyfishimi nxori përmbysjen e vetme që raporton Kapitulli 5.</w:t>
+        <w:t>Përjashtimi është hapi i dymbëdhjetë. Ai riprodhoi numrat që mbajnë pretendimin — po aq rishkrime, po aq verdikte «kompilon», asnjë përmbysje — por pesë kompilime që herën e parë e kaluan kufirin kohor, herën e dytë morën verdikt: ndarja mes «i kontrolluar» dhe «i pakontrolluar» varet nga ngarkesa e makinës. Ai riprodhim i përket mostrës së atëhershme prej 30 skedarësh; mostra u dyfishua më vonë në 60 skedarë, dhe Kapitulli 5 raporton matjen e saj më të fundit.</w:t>
       </w:r>
     </w:p>
     <w:p>
@@ -21965,7 +22681,7 @@
           <w:caps w:val="0"/>
           <w:sz w:val="24"/>
         </w:rPr>
-        <w:t>Pragjet e përdorura janë ato të botuara (Shtojca 8.2), dhe pyetja e natyrshme është sa varet rezultati prej tyre. Secili prag u zhvendos veç, mes gjysmës dhe dyfishit të vlerës së vet, me të tjerët të mbajtur fiks (Tabela 25; Figura 7).</w:t>
+        <w:t>Pragjet e përdorura janë ato të botuara (Shtojca 8.2), dhe pyetja e natyrshme është sa varet rezultati prej tyre. Secili prag u zhvendos veç, mes gjysmës dhe dyfishit të vlerës së vet, me të tjerët të mbajtur fiks (Tabela 26; Figura 7).</w:t>
       </w:r>
     </w:p>
     <w:p>
@@ -21980,7 +22696,7 @@
           <w:caps w:val="0"/>
           <w:sz w:val="22"/>
         </w:rPr>
-        <w:t>Tabela 25. Sa lëviz MCC-ja kur zhvendoset një prag</w:t>
+        <w:t>Tabela 26. Sa lëviz MCC-ja kur zhvendoset një prag</w:t>
       </w:r>
     </w:p>
     <w:tbl>
@@ -23255,7 +23971,7 @@
           <w:caps w:val="0"/>
           <w:sz w:val="24"/>
         </w:rPr>
-        <w:t>Kalibrimi u bë me 5 folde të ndara sipas depos, si te Qasja B. Për secilin fold pragu u zgjodh duke parë vetëm foldet e trajnimit dhe u pikëzua mbi foldin e mbajtur jashtë; parashikimet u bashkuan dhe u pikëzuan një herë, ndaj shifra është jashtë-fold-it në të njëjtin kuptim me atë të modeleve (Tabela 26).</w:t>
+        <w:t>Kalibrimi u bë me 5 folde të ndara sipas depos, si te Qasja B. Për secilin fold pragu u zgjodh duke parë vetëm foldet e trajnimit dhe u pikëzua mbi foldin e mbajtur jashtë; parashikimet u bashkuan dhe u pikëzuan një herë, ndaj shifra është jashtë-fold-it në të njëjtin kuptim me atë të modeleve (Tabela 27).</w:t>
       </w:r>
     </w:p>
     <w:p>
@@ -23270,7 +23986,7 @@
           <w:caps w:val="0"/>
           <w:sz w:val="22"/>
         </w:rPr>
-        <w:t>Tabela 26. Rregullat me pragje të kalibruara, të pikëzuara jashtë fold-it</w:t>
+        <w:t>Tabela 27. Rregullat me pragje të kalibruara, të pikëzuara jashtë fold-it</w:t>
       </w:r>
     </w:p>
     <w:tbl>
@@ -24012,7 +24728,7 @@
           <w:caps w:val="0"/>
           <w:sz w:val="24"/>
         </w:rPr>
-        <w:t>PMD 7.27.0 u ekzekutua mbi të njëjtat 512 depo, me pragjet e veta të parazgjedhura, dhe u pikëzua me të njëjtin kod dhe të njëjtin agregim si Qasja A. Të dyja kolonat rillogariten nga i njëjti skedar në të njëjtin ekzekutim (Tabela 27).</w:t>
+        <w:t>PMD 7.27.0 u ekzekutua mbi të njëjtat 512 depo, me pragjet e veta të parazgjedhura, dhe u pikëzua me të njëjtin kod dhe të njëjtin agregim si Qasja A. Të dyja kolonat rillogariten nga i njëjti skedar në të njëjtin ekzekutim (Tabela 28).</w:t>
       </w:r>
     </w:p>
     <w:p>
@@ -24027,7 +24743,7 @@
           <w:caps w:val="0"/>
           <w:sz w:val="22"/>
         </w:rPr>
-        <w:t>Tabela 27. Detektorët e këtij punimi kundrejt PMD-së, mbi të njëjtat mostra</w:t>
+        <w:t>Tabela 28. Detektorët e këtij punimi kundrejt PMD-së, mbi të njëjtat mostra</w:t>
       </w:r>
     </w:p>
     <w:tbl>
@@ -24752,7 +25468,7 @@
           <w:caps w:val="0"/>
           <w:sz w:val="24"/>
         </w:rPr>
-        <w:t>Një strategji e Lanza &amp; Marinescu-t është konjunksion, ndaj çdo mospërputhje ka shkak të emërtueshëm: një klauzolë, ose dy, ose të tria nuk qëndruan. Matjet për ta thënë këtë ekzistojnë tashmë te tabela e veçorive, ndaj pyetja «pse nuk ndezi» ka përgjigje pa asnjë ekzekutim të ri (Tabela 28; Tabela 29).</w:t>
+        <w:t>Një strategji e Lanza &amp; Marinescu-t është konjunksion, ndaj çdo mospërputhje ka shkak të emërtueshëm: një klauzolë, ose dy, ose të tria nuk qëndruan. Matjet për ta thënë këtë ekzistojnë tashmë te tabela e veçorive, ndaj pyetja «pse nuk ndezi» ka përgjigje pa asnjë ekzekutim të ri (Tabela 29; Tabela 30).</w:t>
       </w:r>
     </w:p>
     <w:p>
@@ -24767,7 +25483,7 @@
           <w:caps w:val="0"/>
           <w:sz w:val="22"/>
         </w:rPr>
-        <w:t>Tabela 28. Sa klauzola dështuan te secila mospërputhje</w:t>
+        <w:t>Tabela 29. Sa klauzola dështuan te secila mospërputhje</w:t>
       </w:r>
     </w:p>
     <w:tbl>
@@ -24985,7 +25701,7 @@
           <w:caps w:val="0"/>
           <w:sz w:val="22"/>
         </w:rPr>
-        <w:t>Tabela 29. Kur një klauzolë e vetme e ndal strategjinë</w:t>
+        <w:t>Tabela 30. Kur një klauzolë e vetme e ndal strategjinë</w:t>
       </w:r>
     </w:p>
     <w:tbl>
@@ -25721,7 +26437,7 @@
           <w:caps w:val="0"/>
           <w:sz w:val="24"/>
         </w:rPr>
-        <w:t>Matja kufizohet te mostrat ku të dyja anët shohin një erë. Askund tjetër shkallët nuk janë të krahasueshme: një detektor që nuk ndez nuk cakton ashpërsi, dhe një pozitiv i rremë është pyetje precizioni, jo ashpërsie (Tabela 30).</w:t>
+        <w:t>Matja kufizohet te mostrat ku të dyja anët shohin një erë. Askund tjetër shkallët nuk janë të krahasueshme: një detektor që nuk ndez nuk cakton ashpërsi, dhe një pozitiv i rremë është pyetje precizioni, jo ashpërsie (Tabela 31).</w:t>
       </w:r>
     </w:p>
     <w:p>
@@ -25736,7 +26452,7 @@
           <w:caps w:val="0"/>
           <w:sz w:val="22"/>
         </w:rPr>
-        <w:t>Tabela 30. Pajtimi i ashpërsisë me rishikuesit</w:t>
+        <w:t>Tabela 31. Pajtimi i ashpërsisë me rishikuesit</w:t>
       </w:r>
     </w:p>
     <w:tbl>
@@ -26549,7 +27265,7 @@
           <w:caps w:val="0"/>
           <w:sz w:val="24"/>
         </w:rPr>
-        <w:t xml:space="preserve"> e jo rreshta, për arsyen që e bën edhe ndarjen e trajnimit të grupuar (Nënkapitulli 2.3): rimostrimi i rreshtave do të jepte intervale artificialisht të ngushta (Tabela 31; Figura 9).</w:t>
+        <w:t xml:space="preserve"> e jo rreshta, për arsyen që e bën edhe ndarjen e trajnimit të grupuar (Nënkapitulli 2.3): rimostrimi i rreshtave do të jepte intervale artificialisht të ngushta (Tabela 32; Figura 9).</w:t>
       </w:r>
     </w:p>
     <w:p>
@@ -26564,7 +27280,7 @@
           <w:caps w:val="0"/>
           <w:sz w:val="22"/>
         </w:rPr>
-        <w:t>Tabela 31. Intervale besimi 95% për MCC-në</w:t>
+        <w:t>Tabela 32. Intervale besimi 95% për MCC-në</w:t>
       </w:r>
     </w:p>
     <w:tbl>
@@ -26841,7 +27557,7 @@
                 <w:caps w:val="0"/>
                 <w:sz w:val="22"/>
               </w:rPr>
-              <w:t>[0.426, 0.568]</w:t>
+              <w:t>[0.423, 0.568]</w:t>
             </w:r>
           </w:p>
         </w:tc>
@@ -26861,7 +27577,7 @@
                 <w:caps w:val="0"/>
                 <w:sz w:val="22"/>
               </w:rPr>
-              <w:t>[0.134, 0.322]</w:t>
+              <w:t>[0.135, 0.312]</w:t>
             </w:r>
           </w:p>
         </w:tc>
@@ -26943,7 +27659,7 @@
                 <w:caps w:val="0"/>
                 <w:sz w:val="22"/>
               </w:rPr>
-              <w:t>[0.572, 0.765]</w:t>
+              <w:t>[0.608, 0.778]</w:t>
             </w:r>
           </w:p>
         </w:tc>
@@ -26963,7 +27679,7 @@
                 <w:caps w:val="0"/>
                 <w:sz w:val="22"/>
               </w:rPr>
-              <w:t>[0.251, 0.556]</w:t>
+              <w:t>[0.288, 0.568]</w:t>
             </w:r>
           </w:p>
         </w:tc>
@@ -27045,7 +27761,7 @@
                 <w:caps w:val="0"/>
                 <w:sz w:val="22"/>
               </w:rPr>
-              <w:t>[0.667, 0.757]</w:t>
+              <w:t>[0.681, 0.766]</w:t>
             </w:r>
           </w:p>
         </w:tc>
@@ -27065,7 +27781,7 @@
                 <w:caps w:val="0"/>
                 <w:sz w:val="22"/>
               </w:rPr>
-              <w:t>[0.072, 0.203]</w:t>
+              <w:t>[0.082, 0.213]</w:t>
             </w:r>
           </w:p>
         </w:tc>
@@ -27179,7 +27895,7 @@
           <w:caps w:val="0"/>
           <w:sz w:val="24"/>
         </w:rPr>
-        <w:t>Krahasimi ndryshon kur Qasjes A i jepet pragu i saj më i mirë nga fshirja e Shtojcës 8.6, çka është krahasimi më bujar që mund t'i bëhet (Tabela 32):</w:t>
+        <w:t>Krahasimi ndryshon kur Qasjes A i jepet pragu i saj më i mirë nga fshirja e Shtojcës 8.6, çka është krahasimi më bujar që mund t'i bëhet (Tabela 33):</w:t>
       </w:r>
     </w:p>
     <w:p>
@@ -27194,7 +27910,7 @@
           <w:caps w:val="0"/>
           <w:sz w:val="22"/>
         </w:rPr>
-        <w:t>Tabela 32. B − A kur rregullat marrin pragun e tyre më të mirë</w:t>
+        <w:t>Tabela 33. B − A kur rregullat marrin pragun e tyre më të mirë</w:t>
       </w:r>
     </w:p>
     <w:tbl>
@@ -27471,7 +28187,7 @@
                 <w:caps w:val="0"/>
                 <w:sz w:val="22"/>
               </w:rPr>
-              <w:t>[0.117, 0.301]</w:t>
+              <w:t>[0.120, 0.297]</w:t>
             </w:r>
           </w:p>
         </w:tc>
@@ -27573,7 +28289,7 @@
                 <w:caps w:val="0"/>
                 <w:sz w:val="22"/>
               </w:rPr>
-              <w:t>[0.135, 0.379]</w:t>
+              <w:t>[0.168, 0.400]</w:t>
             </w:r>
           </w:p>
         </w:tc>
@@ -27675,7 +28391,7 @@
                 <w:caps w:val="0"/>
                 <w:sz w:val="22"/>
               </w:rPr>
-              <w:t>[-0.016, 0.062]</w:t>
+              <w:t>[-0.001, 0.068]</w:t>
             </w:r>
           </w:p>
         </w:tc>
@@ -27715,7 +28431,7 @@
                 <w:caps w:val="0"/>
                 <w:sz w:val="22"/>
               </w:rPr>
-              <w:t>88.6%</w:t>
+              <w:t>97.2%</w:t>
             </w:r>
           </w:p>
         </w:tc>
@@ -27739,7 +28455,7 @@
           <w:caps w:val="0"/>
           <w:sz w:val="24"/>
         </w:rPr>
-        <w:t>Për tri erërat e para përparësia mbetet. Për Long Method-in ajo zhduket: intervali e përfshin zeron dhe shenja ruhet vetëm në 88.6% të rimostrimeve. Pra pretendimi «modeli e tejkalon rregullin» qëndron përgjithësisht, por jo për erën ku rregulli tashmë punonte më mirë, sapo atij rregulli i lejohet të kalibrohet. Ky është kufizimi i vetëm i rëndësishëm i krahasimit A↔B.</w:t>
+        <w:t>Për tri erërat e para përparësia mbetet. Për Long Method-in ajo zhduket: intervali e përfshin zeron dhe shenja ruhet vetëm në 97.2% të rimostrimeve. Pra pretendimi «modeli e tejkalon rregullin» qëndron përgjithësisht, por jo për erën ku rregulli tashmë punonte më mirë, sapo atij rregulli i lejohet të kalibrohet. Ky është kufizimi i vetëm i rëndësishëm i krahasimit A↔B.</w:t>
       </w:r>
     </w:p>
     <w:p>
@@ -27755,7 +28471,7 @@
           <w:caps w:val="0"/>
           <w:sz w:val="24"/>
         </w:rPr>
-        <w:t>Mbetet pyetja e dytë: kundrejt çfarë etikete maten këto shifra. Etiketa është ndërtuar duke bashkuar rishikime njerëzore, dhe ata rishikues nuk pajtohen me njëri-tjetrin. Tabela më poshtë e mat atë mospajtim me të njëjtin tregues dhe të njëjtin kod: një rishikues merret si e vërtetë, tjetri si parashikim, dhe çifti kalon nëpër të njëjtën matricë konfuze (Tabela 33).</w:t>
+        <w:t>Mbetet pyetja e dytë: kundrejt çfarë etikete maten këto shifra. Etiketa është ndërtuar duke bashkuar rishikime njerëzore, dhe ata rishikues nuk pajtohen me njëri-tjetrin. Tabela më poshtë e mat atë mospajtim me të njëjtin tregues dhe të njëjtin kod: një rishikues merret si e vërtetë, tjetri si parashikim, dhe çifti kalon nëpër të njëjtën matricë konfuze (Tabela 34).</w:t>
       </w:r>
     </w:p>
     <w:p>
@@ -27770,7 +28486,7 @@
           <w:caps w:val="0"/>
           <w:sz w:val="22"/>
         </w:rPr>
-        <w:t>Tabela 33. Sa pajtohen rishikuesit me njëri-tjetrin</w:t>
+        <w:t>Tabela 34. Sa pajtohen rishikuesit me njëri-tjetrin</w:t>
       </w:r>
     </w:p>
     <w:tbl>
@@ -28244,7 +28960,7 @@
           <w:caps w:val="0"/>
           <w:sz w:val="24"/>
         </w:rPr>
-        <w:t>Shtojca 8.8 numëron klauzolat që ndalën secilën mospërputhje, por nuk thotë si duket klasa që rishikuesi e quajti blob ndërsa strategjia jo. Ose klasat e humbura u ngjajnë atyre të kapura në një përmasë që strategjia nuk e lexon, dhe asaj i mungon një klauzolë; ose u ngjajnë klasave të pastra në çdo përmasë të matur, dhe atëherë asnjë prag nuk i arrin (Tabela 34).</w:t>
+        <w:t>Shtojca 8.8 numëron klauzolat që ndalën secilën mospërputhje, por nuk thotë si duket klasa që rishikuesi e quajti blob ndërsa strategjia jo. Ose klasat e humbura u ngjajnë atyre të kapura në një përmasë që strategjia nuk e lexon, dhe asaj i mungon një klauzolë; ose u ngjajnë klasave të pastra në çdo përmasë të matur, dhe atëherë asnjë prag nuk i arrin (Tabela 35).</w:t>
       </w:r>
     </w:p>
     <w:p>
@@ -28259,7 +28975,7 @@
           <w:caps w:val="0"/>
           <w:sz w:val="22"/>
         </w:rPr>
-        <w:t>Tabela 34. Madhësia e klasave në secilën qelizë, si kuartil i poshtëm–mesatare–i sipërm</w:t>
+        <w:t>Tabela 35. Madhësia e klasave në secilën qelizë, si kuartil i poshtëm–mesatare–i sipërm</w:t>
       </w:r>
     </w:p>
     <w:tbl>
@@ -29040,7 +29756,7 @@
           <w:caps w:val="0"/>
           <w:sz w:val="24"/>
         </w:rPr>
-        <w:t>Kjo renditje përputhet me një matje të pavarur: veçoritë që modeli i Qasjes B zgjodhi për Blob-in (Figura e Nënkapitullit 5.2) ndajnë tri nga katër vendet e para me të: NOF, CLOC, NOAM. As TCC-ja dhe as WMC-ja, kushtet e strategjisë së botuar, nuk hyjnë te asnjëra listë (Tabela 35).</w:t>
+        <w:t>Kjo renditje përputhet me një matje të pavarur: veçoritë që modeli i Qasjes B zgjodhi për Blob-in (Figura e Nënkapitullit 5.2) ndajnë tri nga katër vendet e para me të: NOF, CLOC, NOAM. As TCC-ja dhe as WMC-ja, kushtet e strategjisë së botuar, nuk hyjnë te asnjëra listë (Tabela 36).</w:t>
       </w:r>
     </w:p>
     <w:p>
@@ -29055,7 +29771,7 @@
           <w:caps w:val="0"/>
           <w:sz w:val="22"/>
         </w:rPr>
-        <w:t>Tabela 35. Recall-i sipas ashpërsisë që caktuan rishikuesit, agregim MAX</w:t>
+        <w:t>Tabela 36. Recall-i sipas ashpërsisë që caktuan rishikuesit, agregim MAX</w:t>
       </w:r>
     </w:p>
     <w:tbl>
@@ -29854,7 +30570,7 @@
           <w:caps w:val="0"/>
           <w:sz w:val="24"/>
         </w:rPr>
-        <w:t xml:space="preserve"> një prag, pra kjo klasë nuk kapet me asnjë prag (Tabela 36).</w:t>
+        <w:t xml:space="preserve"> një prag, pra kjo klasë nuk kapet me asnjë prag (Tabela 37).</w:t>
       </w:r>
     </w:p>
     <w:p>
@@ -29869,7 +30585,7 @@
           <w:caps w:val="0"/>
           <w:sz w:val="22"/>
         </w:rPr>
-        <w:t>Tabela 36. Klasat që klauzola e kohezionit nuk i arrin dot</w:t>
+        <w:t>Tabela 37. Klasat që klauzola e kohezionit nuk i arrin dot</w:t>
       </w:r>
     </w:p>
     <w:tbl>

</xml_diff>

<commit_message>
Rindertoj punimin me kapitujt e shkurtuar
Dokumenti ne depo ishte ende versioni para VD-134, sepse ne ate kohe ishte
i hapur ne Word. U ndertua me build_thesis.py; check_format, check_citations,
check_repetition dhe check_reproduction kalojne mbi te.
</commit_message>
<xml_diff>
--- a/docs/thesis/Punim_Diplome_Florent_Latifi.docx
+++ b/docs/thesis/Punim_Diplome_Florent_Latifi.docx
@@ -2053,7 +2053,7 @@
           <w:caps w:val="0"/>
           <w:sz w:val="24"/>
         </w:rPr>
-        <w:t>Zhvillimi i një sistemi softuerik nuk përfundon me lëshimin e versionit të parë. Pjesa më e madhe e jetës së tij kalon në mirëmbajtje dhe evoluim, ku kodi lexohet, kuptohet dhe ndryshohet vazhdimisht nga zhvillues të ndryshëm. Lehman (1980) e formuloi këtë si ligj: një sistem që përdoret në një mjedis real duhet të ndryshojë vazhdimisht, përndryshe bëhet gradualisht më pak i dobishëm. Prandaj lehtësia me të cilën ndryshohet kodi nuk është çështje estetike, por kosto e përditshme e çdo ekipi.</w:t>
+        <w:t>Zhvillimi i një sistemi softuerik nuk përfundon me lëshimin e versionit të parë. Pjesa më e madhe e jetës së tij kalon në mirëmbajtje, ku kodi lexohet dhe ndryshohet vazhdimisht nga zhvillues të ndryshëm. Lehman (1980) e formuloi këtë si ligj: një sistem që përdoret në një mjedis real duhet të ndryshojë vazhdimisht, përndryshe bëhet gradualisht më pak i dobishëm. Prandaj sa lehtë ndryshohet kodi është kosto e përditshme për çdo ekip.</w:t>
       </w:r>
     </w:p>
     <w:p>
@@ -2069,7 +2069,7 @@
           <w:caps w:val="0"/>
           <w:sz w:val="24"/>
         </w:rPr>
-        <w:t>Një burim i madh i vështirësisë janë code smells, të quajtura në vijim edhe erëra të kodit, ose shkurt erëra. Termi u prezantua nga Kent Beck dhe u popullarizua nga libri Refactoring i Martin Fowler-it, botimi i dytë i të cilit (Fowler, 2018) përdoret në këtë punim. Një code smell nuk është gabim: programi kompilohet dhe funksionon saktë. Ai është simptomë e një problemi më të thellë dizajni, si një klasë që mban shumë përgjegjësi të palidhura, një metodë që zgjatet për qindra rreshta, ose një klasë që mban vetëm të dhëna pa asnjë sjellje. Cunningham (1992) e përshkroi efektin e tyre të grumbulluar me metaforën e borxhit teknik: çdo kompromis i vogël në strukturë krijon një detyrim që paguhet me interes në çdo ndryshim të ardhshëm.</w:t>
+        <w:t>Një burim i madh i kësaj vështirësie janë code smells, që në vijim quhen edhe erëra të kodit, ose shkurt erëra. Termi është i Kent Beck-ut dhe u përhap me librin Refactoring të Martin Fowler-it, botimi i dytë i të cilit (Fowler, 2018) përdoret në këtë punim. Një erë nuk është gabim, sepse programi kompilohet dhe punon saktë. Është shenjë e një problemi dizajni: një klasë me shumë përgjegjësi të palidhura, një metodë qindra rreshta e gjatë, ose një klasë që mban vetëm të dhëna. Cunningham (1992) e quajti efektin e tyre të grumbulluar borxh teknik: çdo kompromis i vogël në strukturë paguhet me interes në çdo ndryshim të mëvonshëm.</w:t>
       </w:r>
     </w:p>
     <w:p>
@@ -2085,7 +2085,7 @@
           <w:caps w:val="0"/>
           <w:sz w:val="24"/>
         </w:rPr>
-        <w:t>Kundërpesha ndaj këtij degradimi është refaktorimi, të cilin Fowler (2018) e përkufizon si ndryshim të strukturës së brendshme të kodit pa ndryshuar sjelljen e tij të jashtme. Refaktorimi kërkon dy gjëra: që problemi të jetë gjetur, dhe që të dihet cili transformim e heq pa e prishur programin. Në një sistem me qindra klasa asnjëra nuk bëhet dot me dorë në mënyrë sistematike, dhe gjykimi se çfarë është problem ndryshon nga një shqyrtues te tjetri.</w:t>
+        <w:t>Zgjidhja e zakonshme është refaktorimi, të cilin Fowler (2018) e përkufizon si ndryshim të strukturës së brendshme të kodit pa ndryshuar sjelljen e tij të jashtme. Por që të refaktorohet, problemi duhet gjetur më parë, dhe duhet ditur cili transformim e heq pa e prishur programin. Në një sistem me qindra klasa kjo nuk bëhet dot me dorë në mënyrë sistematike, dhe dy shqyrtues shpesh nuk pajtohen se çfarë është problem.</w:t>
       </w:r>
     </w:p>
     <w:p>
@@ -2101,7 +2101,7 @@
           <w:caps w:val="0"/>
           <w:sz w:val="24"/>
         </w:rPr>
-        <w:t>Mjetet e analizës statike e automatizojnë pjesërisht këtë punë, por problemi mbetet i hapur në tri drejtime. Së pari, strategjitë që kombinojnë metrika, si ato të Lanza &amp; Marinescu (2006), përdorin pragje fikse të nxjerra nga një korpus tjetër, dhe rrallë dihet sa pajtohen ato me gjykimin e zhvilluesve. Së dyti, detektimi me mësim makine premton më shumë, por rezultatet e tij varen fort nga mënyra si ndërtohen dhe ndahen të dhënat, dhe rrallë vihet përballë rregullave mbi të njëjtat mostra. Së treti, shumica e mjeteve ndalen te njoftimi: e thonë çfarë është e gabuar, por jo çfarë duhet bërë. Qasjet që propozojnë edhe refaktorimin, si ajo e Tsantalis &amp; Chatzigeorgiou (2009) për Move Method, janë më të rralla dhe mbulojnë vetëm disa raste.</w:t>
+        <w:t>Mjetet e analizës statike e automatizojnë një pjesë të kësaj pune, por mbeten tri probleme. Strategjitë me metrika, si ato të Lanza &amp; Marinescu (2006), përdorin pragje fikse të nxjerra nga një korpus tjetër, dhe rrallë dihet sa pajtohen me gjykimin e zhvilluesve. Detektimi me mësim makine premton më shumë, por rezultatet e tij varen shumë nga mënyra si ndërtohen dhe ndahen të dhënat, dhe rrallë krahasohet me rregullat mbi të njëjtat mostra. Shumica e mjeteve, për më tepër, ndalen te njoftimi: e thonë ku është problemi, por jo çfarë duhet bërë. Qasjet që propozojnë edhe refaktorimin, si ajo e Tsantalis &amp; Chatzigeorgiou (2009) për Move Method, janë më të rralla dhe mbulojnë pak raste.</w:t>
       </w:r>
     </w:p>
     <w:p>
@@ -2117,7 +2117,7 @@
           <w:caps w:val="0"/>
           <w:sz w:val="24"/>
         </w:rPr>
-        <w:t>Ky punim e trajton hapësirën mes gjetjes së problemit dhe ndreqjes së tij, për gjuhën Java. Detektimi bëhet në dy mënyra, me strategji metrikash dhe me klasifikues të mësuar mbi të njëjtat metrika; të dyja vlerësohen mbi të njëjtin dataset të etiketuar nga zhvillues profesionistë, dhe një motor i veçantë e rishkruan kodin vetëm kur e provon se transformimi është i sigurt. Kapitulli 2 shqyrton literaturën, Kapitulli 3 shtron problemin dhe pyetjet kërkimore, Kapitulli 4 përshkruan metodologjinë dhe sistemin, Kapitulli 5 paraqet rezultatet, dhe Kapitulli 6 i diskuton ato dhe nxjerr përfundimet.</w:t>
+        <w:t>Ky punim merret me hapësirën mes gjetjes së problemit dhe ndreqjes së tij, për gjuhën Java. Erërat detektohen në dy mënyra, me strategji metrikash dhe me një klasifikues të trajnuar mbi të njëjtat metrika, dhe të dyja vlerësohen mbi të njëjtin dataset të etiketuar nga zhvillues profesionistë. Një motor i veçantë e rishkruan kodin vetëm kur mund ta provojë se transformimi është i sigurt. Kapitulli 2 shqyrton literaturën, Kapitulli 3 shtron problemin dhe pyetjet kërkimore, Kapitulli 4 përshkruan metodologjinë, ndërsa Kapitujt 5 dhe 6 paraqesin dhe diskutojnë rezultatet.</w:t>
       </w:r>
     </w:p>
     <w:p>
@@ -2148,7 +2148,7 @@
           <w:caps w:val="0"/>
           <w:sz w:val="24"/>
         </w:rPr>
-        <w:t>Detektimi automatik i code smells dhe refaktorimi janë studiuar prej më shumë se dy dekadash. Ky kapitull i ndan burimet në katër grupe: përkufizimi dhe matja e erërave, detektimi me rregulla mbi metrika, detektimi me mësim të makinës, dhe refaktorimi i automatizuar. Në fund identifikohet hendeku që ky punim e adreson.</w:t>
+        <w:t>Detektimi automatik i code smells dhe refaktorimi studiohen prej më shumë se dy dekadash. Kapitulli i grupon burimet sipas temës dhe mbyllet me hendekun që adreson ky punim.</w:t>
       </w:r>
     </w:p>
     <w:p>
@@ -2178,7 +2178,7 @@
           <w:caps w:val="0"/>
           <w:sz w:val="24"/>
         </w:rPr>
-        <w:t>Katalogun kanonik e jep Fowler (2018): njëzet e katër erëra, secila me refaktorimet që e adresojnë. Përkufizimi mbetet qëllimisht cilësor: një erë është simptomë, jo gabim, dhe gjykimi nëse diçka është problem varet nga konteksti.</w:t>
+        <w:t>Katalogun kanonik e jep Fowler (2018): njëzet e katër erëra, secila me refaktorimet që e adresojnë. Përkufizimi është qëllimisht cilësor. Një erë është simptomë, jo gabim, dhe nëse diçka është problem apo jo varet nga konteksti.</w:t>
       </w:r>
     </w:p>
     <w:p>
@@ -2194,7 +2194,7 @@
           <w:caps w:val="0"/>
           <w:sz w:val="24"/>
         </w:rPr>
-        <w:t>Matja sasiore u mundësua nga suita e metrikave e Chidamber &amp; Kemerer (1994), e cila propozoi gjashtë metrika për sistemet e orientuara nga objektet: WMC, DIT, NOC, CBO, RFC dhe LCOM. Henderson-Sellers (1996) e rishikoi LCOM-in duke propozuar një variant të normalizuar, ndërsa Bieman &amp; Kang (1995) prezantuan TCC-në, e cila e mat kohezionin përmes çifteve të metodave që ndajnë të paktën një fushë. Këto metrika janë baza mbi të cilën ndërtohet çdo detektim sasior i mëvonshëm.</w:t>
+        <w:t>Matja sasiore u bë e mundur me suitën e Chidamber &amp; Kemerer (1994), gjashtë metrika për sistemet e orientuara nga objektet: WMC, DIT, NOC, CBO, RFC dhe LCOM. Henderson-Sellers (1996) propozoi një variant të normalizuar të LCOM-it, ndërsa Bieman &amp; Kang (1995) prezantuan TCC-në, që e mat kohezionin me çiftet e metodave që ndajnë të paktën një fushë. Mbi këto metrika ndërtohet pothuajse çdo detektim sasior i mëvonshëm.</w:t>
       </w:r>
     </w:p>
     <w:p>
@@ -2210,7 +2210,7 @@
           <w:caps w:val="0"/>
           <w:sz w:val="24"/>
         </w:rPr>
-        <w:t>Sharma &amp; Spinellis (2018) ofrojnë një shqyrtim sistematik të fushës dhe vërejnë se literatura ka prodhuar përkufizime jokonsistente për erërat, dhe se metodat e detektimit japin rezultate po aq jokonsistente, çka e bën krahasimin mes mjeteve të vështirë.</w:t>
+        <w:t>Sharma &amp; Spinellis (2018), në një shqyrtim sistematik të fushës, vërejnë se përkufizimet e erërave në literaturë nuk janë konsistente, dhe as rezultatet e metodave të detektimit, ndaj mjetet krahasohen me vështirësi.</w:t>
       </w:r>
     </w:p>
     <w:p>
@@ -2240,7 +2240,7 @@
           <w:caps w:val="0"/>
           <w:sz w:val="24"/>
         </w:rPr>
-        <w:t>Marinescu (2004) prezantoi konceptin e strategjive të detektimit: rregulla që kombinojnë disa metrika me pragje, në vend që të mbështeten në një metrikë të vetme. Ideja u zhvillua në një katalog të plotë nga Lanza &amp; Marinescu (2006), ku çdo erë shprehet si kombinim logjik kushtesh mbi metrika, zakonisht si konjunksion, me pragje të nxjerra statistikisht nga një korpus prej dyzet e pesë sistemesh Java.</w:t>
+        <w:t>Marinescu (2004) prezantoi strategjitë e detektimit: rregulla që kombinojnë disa metrika me pragje, në vend që të mbështeten te një metrikë e vetme. Lanza &amp; Marinescu (2006) e zgjeruan idenë në një katalog të plotë, ku çdo erë shprehet si kombinim kushtesh mbi metrika, me pragje të nxjerra statistikisht nga dyzet e pesë sisteme Java.</w:t>
       </w:r>
     </w:p>
     <w:p>
@@ -2256,7 +2256,7 @@
           <w:caps w:val="0"/>
           <w:sz w:val="24"/>
         </w:rPr>
-        <w:t>Moha et al. (2010) propozuan DECOR-in, një metodë me gjuhë të specifikimit të erërave, e cila i gjeneron detektorët nga përshkrimet. Përparësia e këtyre qasjeve është transparenca: kur një detektor ndez, arsyeja është e lexueshme. Dobësia e tyre është ndjeshmëria ndaj pragjeve, të cilat janë të vështira për t'u kalibruar përtej korpusit ku u nxorën.</w:t>
+        <w:t>Moha et al. (2010) propozuan DECOR-in, një metodë ku erërat përshkruhen në një gjuhë specifikimi dhe detektorët gjenerohen nga përshkrimet. Avantazhi i qasjeve me rregulla është se arsyeja e çdo detektimi lexohet qartë. Dobësia është ndjeshmëria ndaj pragjeve, që kalibrohen me vështirësi jashtë korpusit ku u nxorën.</w:t>
       </w:r>
     </w:p>
     <w:p>
@@ -2272,7 +2272,7 @@
           <w:caps w:val="0"/>
           <w:sz w:val="24"/>
         </w:rPr>
-        <w:t>Palomba et al. (2015) morën një drejtim tjetër me HIST-in, duke i detektuar erërat nga historiku i ndryshimeve në vend që nga një pamje e vetme e kodit. Kjo e kap një dimension që metrikat statike nuk e shohin, por kërkon akses në historikun e plotë të depos.</w:t>
+        <w:t>Palomba et al. (2015) i detektojnë erërat me HIST nga historiku i ndryshimeve, jo nga një pamje e vetme e kodit. Kështu kapin diçka që metrikat statike nuk e shohin, por u duhet historiku i plotë i depos.</w:t>
       </w:r>
     </w:p>
     <w:p>
@@ -2302,7 +2302,7 @@
           <w:caps w:val="0"/>
           <w:sz w:val="24"/>
         </w:rPr>
-        <w:t>Arcelli Fontana et al. (2016) krahasuan gjashtëmbëdhjetë algoritme të mësimit të makinës mbi katër erëra dhe raportuan performancë të lartë për të gjitha në validimin e kryqëzuar, me J48 dhe Random Forest si më të mirat. Ky punim u bë referenca kryesore e fushës dhe motivoi një varg studimesh pasuese.</w:t>
+        <w:t>Arcelli Fontana et al. (2016) krahasuan gjashtëmbëdhjetë algoritme të mësimit të makinës mbi katër erëra dhe raportuan performancë të lartë për të gjitha në validimin e kryqëzuar, me J48 dhe Random Forest si më të mirat. Studimi u bë pikë referimi për shumë punime pasuese.</w:t>
       </w:r>
     </w:p>
     <w:p>
@@ -2318,7 +2318,7 @@
           <w:caps w:val="0"/>
           <w:sz w:val="24"/>
         </w:rPr>
-        <w:t>Megjithatë, Di Nucci et al. (2018) vunë re se në atë studim çdo dataset përmbante raste të një lloji të vetëm ere. E përsëritën eksperimentin me dataset-e ku bashkëjetojnë disa lloje erërash, dhe në këtë konfigurim më realist teknikat e mësimit të makinës shfaqën kufizime kritike. Rrjedhimisht, një rezultat i raportuar varet nga mënyra si ndërtohet bashkësia e vlerësimit, jo vetëm nga algoritmi.</w:t>
+        <w:t>Di Nucci et al. (2018) vunë re megjithatë se aty çdo dataset kishte raste të një lloji të vetëm ere. Kur e përsëritën eksperimentin me dataset-e ku bashkëjetojnë disa erëra, performanca ra ndjeshëm. Pra shifra e raportuar varet nga mënyra si ndërtohet bashkësia e vlerësimit, jo vetëm nga algoritmi.</w:t>
       </w:r>
     </w:p>
     <w:p>
@@ -2334,7 +2334,7 @@
           <w:caps w:val="0"/>
           <w:sz w:val="24"/>
         </w:rPr>
-        <w:t>I njëjti kujdes ndaj ndërtimit të të dhënave përcakton njërën nga zgjedhjet qendrore të këtij punimi: ndarja mes trajnimit dhe testimit bëhet e grupuar sipas depos, kurrë e rastësishme sipas rreshtave. Mostrat e së njëjtës depo ndajnë autorë, konvencione dhe shpesh kod të kopjuar; një ndarje e rastësishme i vendos ato në të dyja anët dhe e fryn çdo shifër.</w:t>
+        <w:t>E njëjta arsye qëndron pas njërës nga zgjedhjet kryesore të këtij punimi: trajnimi dhe testimi ndahen sipas depos, jo rastësisht sipas rreshtave. Mostrat e një depoje kanë të njëjtët autorë, të njëjtat konvencione e shpesh kod të kopjuar, dhe një ndarje e rastësishme i vendos në të dyja anët, duke i fryrë shifrat.</w:t>
       </w:r>
     </w:p>
     <w:p>
@@ -2350,7 +2350,7 @@
           <w:caps w:val="0"/>
           <w:sz w:val="24"/>
         </w:rPr>
-        <w:t>Azeem et al. (2019), në një shqyrtim sistematik dhe meta-analizë, gjetën vetëm pesëmbëdhjetë studime që përdorin mësimin e makinës për detektimin e erërave, nga një bashkësi fillestare prej më shumë se dy mijë punimesh, dhe përfundojnë se në këtë nënfushë ka ende hapësirë për përmirësim.</w:t>
+        <w:t>Azeem et al. (2019), në një shqyrtim sistematik me meta-analizë, gjetën vetëm pesëmbëdhjetë studime që përdorin mësimin e makinës për këtë qëllim, nga mbi dy mijë punime fillestare, dhe përfundojnë se fusha ka ende vend për përmirësim.</w:t>
       </w:r>
     </w:p>
     <w:p>
@@ -2380,7 +2380,7 @@
           <w:caps w:val="0"/>
           <w:sz w:val="24"/>
         </w:rPr>
-        <w:t>Çdo vlerësim i detektimit kërkon një të vërtetë bazë, dhe këtu literatura has një problem themelor. Mäntylä &amp; Lassenius (2006) treguan në një studim empirik se vlerësimi i zhvilluesve për praninë e një ere është subjektiv dhe se mospajtimi mes tyre është i konsiderueshëm.</w:t>
+        <w:t>Çdo vlerësim i detektimit ka nevojë për një të vërtetë bazë, dhe këtu del një problem themelor. Mäntylä &amp; Lassenius (2006) treguan se vlerësimi i zhvilluesve për praninë e një ere është subjektiv dhe se ata shpesh nuk pajtohen.</w:t>
       </w:r>
     </w:p>
     <w:p>
@@ -2396,7 +2396,7 @@
           <w:caps w:val="0"/>
           <w:sz w:val="24"/>
         </w:rPr>
-        <w:t>Madeyski &amp; Lewowski (2020) e adresuan mungesën e dataset-eve me MLCQ-në, një bashkësi mostrash Java të etiketuara nga zhvillues profesionistë për katër erëra, me ashpërsi në shkallën none/minor/major/critical. Ky punim e përdor MLCQ-në si të vërtetë bazë, dhe e trajton mospajtimin mes rishikuesve si të dhënë që raportohet, jo si zhurmë që pastrohet.</w:t>
+        <w:t>Madeyski &amp; Lewowski (2020) ndërtuan MLCQ-në, një bashkësi mostrash Java të etiketuara nga zhvillues profesionistë për katër erëra, me ashpërsi në shkallën none/minor/major/critical. Ky punim e përdor MLCQ-në si të vërtetë bazë, dhe mospajtimin mes rishikuesve e raporton si të dhënë, në vend që ta pastrojë si zhurmë.</w:t>
       </w:r>
     </w:p>
     <w:p>
@@ -2426,7 +2426,7 @@
           <w:caps w:val="0"/>
           <w:sz w:val="24"/>
         </w:rPr>
-        <w:t>Opdyke (1992) e formalizoi refaktorimin në tezën e tij të doktoratës, duke prezantuar nocionin e parakushteve: një transformim është i sigurt vetëm nëse kushte të caktuara vërtetohen para aplikimit. Ky nocion mbetet themeli i çdo motori refaktorimi që pretendon ruajtjen e sjelljes.</w:t>
+        <w:t>Opdyke (1992), në tezën e doktoratës, e formalizoi refaktorimin me nocionin e parakushteve: një transformim është i sigurt vetëm nëse disa kushte vërtetohen para se të aplikohet. Mbi këtë nocion mbështetet çdo motor refaktorimi që pretendon se e ruan sjelljen.</w:t>
       </w:r>
     </w:p>
     <w:p>
@@ -2442,7 +2442,7 @@
           <w:caps w:val="0"/>
           <w:sz w:val="24"/>
         </w:rPr>
-        <w:t>Tsantalis &amp; Chatzigeorgiou (2009) propozuan një metodë për identifikimin e mundësive të Move Method si zgjidhje për Feature Envy: një algoritëm i bazuar te distanca mes entiteteve dhe klasave nxjerr refaktorime që ruajnë sjelljen pas kontrollit të një bashkësie parakushtesh, ndërsa vendimi përfundimtar i mbetet projektuesit.</w:t>
+        <w:t>Tsantalis &amp; Chatzigeorgiou (2009) propozuan një metodë për gjetjen e rasteve të Move Method si zgjidhje për Feature Envy. Algoritmi mat distancën mes entiteteve dhe klasave, propozon vetëm lëvizje që kalojnë një bashkësi parakushtesh, dhe vendimin e fundit ia lë projektuesit.</w:t>
       </w:r>
     </w:p>
     <w:p>
@@ -2458,7 +2458,7 @@
           <w:caps w:val="0"/>
           <w:sz w:val="24"/>
         </w:rPr>
-        <w:t>Murphy-Hill et al. (2012), mbi të dhëna nga më shumë se trembëdhjetë mijë zhvillues, gjetën se refaktorimi ndërthuret shpesh me ndryshime të tjera dhe rrallë shënohet në mesazhet e commit-eve, çka e vështirëson matjen e tij nga historiku. Silva et al. (2016) pyetën zhvilluesit pse refaktorojnë dhe gjetën se motivet janë kryesisht praktike, të lidhura me një ndryshim konkret që duhet bërë.</w:t>
+        <w:t>Murphy-Hill et al. (2012), me të dhëna nga mbi trembëdhjetë mijë zhvillues, gjetën se refaktorimi shpesh përzihet me ndryshime të tjera dhe rrallë përmendet në mesazhet e commit-eve, ndaj matet me vështirësi nga historiku. Silva et al. (2016) i pyetën zhvilluesit pse refaktorojnë dhe gjetën se arsyet janë kryesisht praktike, të lidhura me një ndryshim konkret që duhet bërë.</w:t>
       </w:r>
     </w:p>
     <w:p>
@@ -2488,23 +2488,7 @@
           <w:caps w:val="0"/>
           <w:sz w:val="24"/>
         </w:rPr>
-        <w:t>Nga sa më sipër dalin tri vërejtje. E para: qasja me rregulla dhe ajo me mësim makine rrallë vlerësohen mbi të njëjtën të vërtetë bazë me të njëjtat metrika, çka e bën krahasimin e drejtpërdrejtë të vështirë. E dyta: jo çdo punim e deklaron qartë si e ndan bashkësinë e vlerësimit, ndonëse shifra e raportuar varet pikërisht prej saj. E treta: detektimi dhe refaktorimi trajtohen zakonisht si probleme të ndara, ndaj pyetja nëse një erë e detektuar mund edhe të rregullohet automatikisht mbetet pa përgjigje empirike.</w:t>
-      </w:r>
-    </w:p>
-    <w:p>
-      <w:pPr>
-        <w:spacing w:line="360" w:lineRule="auto"/>
-        <w:ind w:firstLine="360"/>
-        <w:jc w:val="both"/>
-      </w:pPr>
-      <w:r>
-        <w:rPr>
-          <w:rFonts w:ascii="Times New Roman" w:hAnsi="Times New Roman" w:eastAsia="Times New Roman"/>
-          <w:b w:val="0"/>
-          <w:caps w:val="0"/>
-          <w:sz w:val="24"/>
-        </w:rPr>
-        <w:t>Kapitulli 3 i kthen këto tri vërejtje në problemin dhe pyetjet e këtij punimi.</w:t>
+        <w:t>Nga ky shqyrtim dalin tri vërejtje. Qasja me rregulla dhe ajo me mësim makine rrallë vlerësohen mbi të njëjtën të vërtetë bazë dhe me të njëjtat metrika, ndaj krahasimi i drejtpërdrejtë mungon. Jo çdo punim e thotë qartë si e ndan bashkësinë e vlerësimit, edhe pse shifra e raportuar varet pikërisht prej saj. Detektimi dhe refaktorimi, nga ana tjetër, trajtohen zakonisht veç e veç, ndaj mbetet pa përgjigje empirike nëse një erë e gjetur mund të ndreqet edhe automatikisht. Kapitulli 3 i kthen këto vërejtje në problemin dhe pyetjet e punimit.</w:t>
       </w:r>
     </w:p>
     <w:p>
@@ -2544,7 +2528,7 @@
           <w:caps w:val="0"/>
           <w:sz w:val="24"/>
         </w:rPr>
-        <w:t xml:space="preserve"> Për çdo pjesë të kodit, një ekip zhvillimi do të duhej të dinte nëse ajo mban një problem dizajni, sa i rëndë është ai, dhe cili transformim e heq pa ndryshuar sjelljen. Ky gjykim do të duhej të ishte i përsëritshëm dhe i matur kundrejt vlerësimit të zhvilluesve me përvojë.</w:t>
+        <w:t xml:space="preserve"> Për çdo pjesë të kodit, ekipi do të duhej të dinte nëse ka një problem dizajni, sa i rëndë është, dhe cili transformim e heq pa ndryshuar sjelljen. Ky gjykim do të duhej të ishte i përsëritshëm dhe i krahasuar me vlerësimin e zhvilluesve me përvojë.</w:t>
       </w:r>
     </w:p>
     <w:p>
@@ -2569,7 +2553,7 @@
           <w:caps w:val="0"/>
           <w:sz w:val="24"/>
         </w:rPr>
-        <w:t xml:space="preserve"> Identifikimi manual nuk shkallëzohet, dhe mjetet ekzistuese ndalen zakonisht te njoftimi, me pragje të kalibruara gjetiu (Kapitulli 1). Studimet, nga ana e tyre, rrallë i vënë dy qasjet përballë njëra-tjetrës dhe nuk e matin nëse një erë e gjetur ndreqet edhe vetë (Nënkapitulli 2.6).</w:t>
+        <w:t xml:space="preserve"> Identifikimi me dorë nuk shkallëzohet, dhe mjetet ekzistuese zakonisht vetëm njoftojnë, me pragje të kalibruara në projekte të tjera (Kapitulli 1). Studimet rrallë i vënë dy qasjet përballë njëra-tjetrës, dhe nuk matin sa nga erërat e gjetura ndreqen dot automatikisht (Nënkapitulli 2.6).</w:t>
       </w:r>
     </w:p>
     <w:p>
@@ -2594,23 +2578,7 @@
           <w:caps w:val="0"/>
           <w:sz w:val="24"/>
         </w:rPr>
-        <w:t xml:space="preserve"> Ky punim i krahason dy qasjet e detektimit mbi të njëjtin korpus të etiketuar nga profesionistë, me ndarje sipas depos dhe me një kod të përbashkët pikëzimi, dhe mat sa nga vendet e detektuara mund të rishkruhen automatikisht pa sjellë gabime të reja kompilimi.</w:t>
-      </w:r>
-    </w:p>
-    <w:p>
-      <w:pPr>
-        <w:spacing w:line="360" w:lineRule="auto"/>
-        <w:ind w:firstLine="360"/>
-        <w:jc w:val="both"/>
-      </w:pPr>
-      <w:r>
-        <w:rPr>
-          <w:rFonts w:ascii="Times New Roman" w:hAnsi="Times New Roman" w:eastAsia="Times New Roman"/>
-          <w:b w:val="0"/>
-          <w:caps w:val="0"/>
-          <w:sz w:val="24"/>
-        </w:rPr>
-        <w:t>Nga ky fokus dalin pyetjet kërkimore dhe objektivat e punimit. Pjesa tjetër e kapitullit i bën pyetjet të matshme dhe deklaron kufizimet që e formësojnë atë që mund të pretendohet.</w:t>
+        <w:t xml:space="preserve"> Ky punim i krahason dy qasjet e detektimit mbi të njëjtin korpus të etiketuar nga profesionistë, me ndarje sipas depos dhe me të njëjtën mënyrë pikëzimi, dhe mat sa nga vendet e detektuara mund të rishkruhen automatikisht pa sjellë gabime të reja kompilimi.</w:t>
       </w:r>
     </w:p>
     <w:p>
@@ -2640,7 +2608,7 @@
           <w:caps w:val="0"/>
           <w:sz w:val="24"/>
         </w:rPr>
-        <w:t>Secila pyetje i përgjigjet njërës nga tri pjesët e sistemit: detektimit me rregulla, detektimit me mësim makine dhe refaktorimit.</w:t>
+        <w:t>Secila pyetje lidhet me një nga tri pjesët e sistemit:</w:t>
       </w:r>
     </w:p>
     <w:p>
@@ -2704,7 +2672,7 @@
           <w:caps w:val="0"/>
           <w:sz w:val="24"/>
         </w:rPr>
-        <w:t>PK1 e mat problemin e parë të realitetit, pragjet fikse, kundrejt gjykimit njerëzor. PK2 pyet nëse i njëjti informacion, i përdorur ndryshe, jep më shumë. PK3 pyet nëse sistemi mund të shkojë përtej njoftimit pa e prishur kodin.</w:t>
+        <w:t>PK1 e vë gjykimin e pragjeve fikse përballë atij njerëzor. PK2 pyet nëse të njëjtat metrika, të përdorura ndryshe, japin më shumë. PK3 pyet nëse sistemi mund të shkojë përtej njoftimit pa e prishur kodin.</w:t>
       </w:r>
     </w:p>
     <w:p>
@@ -2734,7 +2702,7 @@
           <w:caps w:val="0"/>
           <w:sz w:val="24"/>
         </w:rPr>
-        <w:t>Qëllimi i punimit është projektimi, implementimi dhe vlerësimi empirik i një sistemi që identifikon code smells në kod burimor Java dhe propozon refaktorime konkrete e të verifikueshme për t'i adresuar ato. Objektivat janë:</w:t>
+        <w:t>Qëllimi i punimit është të projektohet, të implementohet dhe të vlerësohet empirikisht një sistem që gjen code smells në kod Java dhe propozon refaktorime konkrete e të verifikueshme për to. Objektivat janë:</w:t>
       </w:r>
     </w:p>
     <w:p>
@@ -2750,7 +2718,7 @@
           <w:caps w:val="0"/>
           <w:sz w:val="24"/>
         </w:rPr>
-        <w:t>Të shqyrtohet literatura mbi metrikat e cilësisë së kodit, strategjitë e detektimit dhe teknikat e refaktorimit.</w:t>
+        <w:t>Të shqyrtohet literatura për metrikat e cilësisë së kodit, strategjitë e detektimit dhe refaktorimin.</w:t>
       </w:r>
     </w:p>
     <w:p>
@@ -2766,7 +2734,7 @@
           <w:caps w:val="0"/>
           <w:sz w:val="24"/>
         </w:rPr>
-        <w:t>Të implementohet një motor analize që nxjerr metrika nga kodi burimor Java në nivel klase dhe metode.</w:t>
+        <w:t>Të ndërtohet një motor analize që mat kodin Java në nivel klase dhe metode.</w:t>
       </w:r>
     </w:p>
     <w:p>
@@ -2782,7 +2750,7 @@
           <w:caps w:val="0"/>
           <w:sz w:val="24"/>
         </w:rPr>
-        <w:t>Të implementohet detektimi me rregulla, me strategji të publikuara dhe pragje të justifikuara nga literatura.</w:t>
+        <w:t>Të implementohet detektimi me rregulla, me strategji të publikuara dhe me burimin e çdo pragu të deklaruar.</w:t>
       </w:r>
     </w:p>
     <w:p>
@@ -2798,7 +2766,7 @@
           <w:caps w:val="0"/>
           <w:sz w:val="24"/>
         </w:rPr>
-        <w:t>Të trajnohet dhe vlerësohet një klasifikues mbi të dhënat e etiketuara të MLCQ-së, dhe të krahasohet me rregullat.</w:t>
+        <w:t>Të trajnohet një klasifikues mbi të dhënat e MLCQ-së dhe të krahasohet me rregullat.</w:t>
       </w:r>
     </w:p>
     <w:p>
@@ -2814,7 +2782,7 @@
           <w:caps w:val="0"/>
           <w:sz w:val="24"/>
         </w:rPr>
-        <w:t>Të implementohet një motor refaktorimi që gjeneron transformime konkrete dhe verifikon efektin e tyre.</w:t>
+        <w:t>Të ndërtohet një motor refaktorimi që i aplikon transformimet vetëm kur janë të sigurta dhe e verifikon rezultatin.</w:t>
       </w:r>
     </w:p>
     <w:p>
@@ -2830,7 +2798,7 @@
           <w:caps w:val="0"/>
           <w:sz w:val="24"/>
         </w:rPr>
-        <w:t>Të ndërtohet një ndërfaqe web që i bën rezultatet të shfrytëzueshme nga zhvilluesi.</w:t>
+        <w:t>Të ndërtohet një ndërfaqe web që ia bën rezultatet të përdorshme zhvilluesit.</w:t>
       </w:r>
     </w:p>
     <w:p>
@@ -2860,7 +2828,7 @@
           <w:caps w:val="0"/>
           <w:sz w:val="24"/>
         </w:rPr>
-        <w:t>Detektimi shprehet si klasifikim binar mbi një entitet kodi: një klasë ose një metodë është ose nuk është shembull i një ere të caktuar. E vërteta bazë vjen nga rishikuesit profesionistë të MLCQ-së, dhe krahasimi bëhet me matricën konfuze dhe shifrat që derivohen prej saj.</w:t>
+        <w:t>Detektimi trajtohet si klasifikim binar: një klasë ose metodë është ose nuk është shembull i një ere të caktuar. E vërteta bazë vjen nga rishikuesit e MLCQ-së, dhe krahasimi bëhet me matricën konfuze dhe shifrat që dalin prej saj.</w:t>
       </w:r>
     </w:p>
     <w:p>
@@ -2876,7 +2844,7 @@
           <w:caps w:val="0"/>
           <w:sz w:val="24"/>
         </w:rPr>
-        <w:t>Refaktorimi nuk është klasifikim, por transformim me parakushte, dhe pyetja e matshme është «sa shpesh zbatohet pa e prishur kodin». Rezultati i tij raportohet si numri i vendeve të detektuara, i atyre të transformuara, dhe shpërndarja e arsyeve pse pjesa tjetër u refuzua. Kriteret e suksesit janë:</w:t>
+        <w:t>Refaktorimi nuk është klasifikim, por transformim me parakushte, dhe pyetja e matshme është sa shpesh aplikohet pa e prishur kodin. Raportohen vendet e detektuara, ato të transformuara dhe arsyet pse të tjerat u refuzuan. Kriteret e suksesit janë:</w:t>
       </w:r>
     </w:p>
     <w:p>
@@ -2892,7 +2860,7 @@
           <w:caps w:val="0"/>
           <w:sz w:val="24"/>
         </w:rPr>
-        <w:t>Për PK1: shifra për çdo erë, të prodhuara mbi një korpus të deklaruar dhe të riprodhueshme me një komandë. Një recall i ulët është përgjigje e vlefshme; fshehja e tij nuk është.</w:t>
+        <w:t>Për PK1: shifra për çdo erë mbi një korpus të deklaruar, të riprodhueshme me një komandë. Edhe një recall i ulët është përgjigje e vlefshme, për sa kohë nuk fshihet.</w:t>
       </w:r>
     </w:p>
     <w:p>
@@ -2908,7 +2876,7 @@
           <w:caps w:val="0"/>
           <w:sz w:val="24"/>
         </w:rPr>
-        <w:t>Për PK2: krahasim mostër për mostër me Qasjen A, bashkë me një model bazë që nuk mëson asgjë, që fitimi të mos ngatërrohet me çekuilibrin.</w:t>
+        <w:t>Për PK2: krahasim mostër për mostër me detektimin me rregulla, plus një model bazë që nuk mëson asgjë, që fitimi të mos ngatërrohet me çekuilibrin e klasave.</w:t>
       </w:r>
     </w:p>
     <w:p>
@@ -2924,7 +2892,7 @@
           <w:caps w:val="0"/>
           <w:sz w:val="24"/>
         </w:rPr>
-        <w:t>Për PK3: verifikim që çdo rishkrim i aplikuar nuk e prish skedarin, dhe matje nëse era u hoq; ruajtja e sjelljes mbetet pa kriter, për arsyen e Nënkapitullit 3.4.</w:t>
+        <w:t>Për PK3: çdo rishkrim i aplikuar verifikohet se nuk e prish skedarin, dhe matet nëse era u hoq. Për ruajtjen e sjelljes nuk ka kriter, për arsyen që jepet te Nënkapitulli 3.4.</w:t>
       </w:r>
     </w:p>
     <w:p>
@@ -2954,7 +2922,7 @@
           <w:caps w:val="0"/>
           <w:sz w:val="24"/>
         </w:rPr>
-        <w:t>Punimi kufizohet në gjuhën Java, sepse pjesa dërrmuese e literaturës mbi metrikat e objekteve dhe datasetet e etiketuara të code smells janë ndërtuar mbi kod Java. Erërat e vlerësuara janë ato për të cilat ekzistojnë strategji të publikuara dhe të dhëna të etiketuara. Analiza është statike: programi nuk ekzekutohet, ndaj karakteristikat që shfaqen vetëm gjatë ekzekutimit nuk mbulohen.</w:t>
+        <w:t>Punimi kufizohet te Java, sepse shumica e literaturës për metrikat e objekteve dhe dataset-et e etiketuara të code smells janë ndërtuar mbi kod Java. Vlerësohen vetëm erërat për të cilat ka strategji të publikuara dhe të dhëna të etiketuara. Analiza është statike: programi nuk ekzekutohet, ndaj sjellja gjatë ekzekutimit nuk mbulohet.</w:t>
       </w:r>
     </w:p>
     <w:p>
@@ -2970,7 +2938,7 @@
           <w:caps w:val="0"/>
           <w:sz w:val="24"/>
         </w:rPr>
-        <w:t>Dy zgjedhje arkitekturore janë të qëllimshme. E para: analizuesi regjistron fakte sintaksore dhe nuk zgjidh simbole, ndaj çdo transformim që duhet të gjejë të gjitha referencat ndaj një emri nuk i provon dot parakushtet e veta, dhe dy nga pesë transformimet e planifikuara mbeten propozim. Për të njëjtën arsye Introduce Parameter Object aplikohet vetëm te metodat «private», thirrjet e të cilave Java-ja i mban brenda skedarit. E dyta: refaktorimi bëhet me transformime mbi pemën sintaksore dhe jo me gjenerim teksti, sepse ajo çka aplikohet duhet të jetë e saktë. Nga kjo rrjedh kriteri i motorit: refuzimi është rezultat i saktë.</w:t>
+        <w:t>Dy zgjedhje janë bërë me qëllim. E para, analizuesi regjistron fakte sintaksore dhe nuk zgjidh simbole. Prandaj një transformim që duhet të gjejë çdo referencë ndaj një emri nuk mund t'i provojë parakushtet e veta, dhe dy nga pesë transformimet e planifikuara mbeten vetëm propozim. Për të njëjtën arsye Introduce Parameter Object aplikohet vetëm te metodat «private», thirrjet e të cilave mbeten brenda skedarit. E dyta, refaktorimi bëhet me transformime mbi pemën sintaksore dhe jo me gjenerim teksti, sepse ajo që aplikohet duhet të jetë e saktë. Kur siguria nuk provohet, refuzimi konsiderohet rezultat i saktë.</w:t>
       </w:r>
     </w:p>
     <w:p>
@@ -2986,7 +2954,7 @@
           <w:caps w:val="0"/>
           <w:sz w:val="24"/>
         </w:rPr>
-        <w:t xml:space="preserve">Korpusi ruan nga depot që përmend MLCQ-ja vetëm skedarët «.java», pa skedarë ndërtimi dhe pa varësi, dhe disa depo nuk ishin më të arritshme. Prandaj çdo rishkrim kontrollohet vetëm me kompilator: nëse kompilon, ose nëse nuk shton lloj të ri gabimi. Ruajtja e sjelljes, që përmend PK3, </w:t>
+        <w:t xml:space="preserve">Korpusi mban nga depot e MLCQ-së vetëm skedarët «.java», pa skedarë ndërtimi dhe pa varësi, dhe disa depo nuk gjenden më. Prandaj çdo rishkrim kontrollohet vetëm me kompilator: nëse kompilon, ose të paktën nëse nuk shton lloj të ri gabimi. Ruajtja e sjelljes, që përmend PK3, </w:t>
       </w:r>
       <w:r>
         <w:rPr>
@@ -3004,7 +2972,7 @@
           <w:caps w:val="0"/>
           <w:sz w:val="24"/>
         </w:rPr>
-        <w:t>, sepse kërkon ekzekutimin e testeve të projekteve, çka korpusi nuk e lejon.</w:t>
+        <w:t>, sepse do të kërkonte ekzekutimin e testeve të projekteve, gjë që korpusi nuk e lejon.</w:t>
       </w:r>
     </w:p>
     <w:p>
@@ -3035,7 +3003,7 @@
           <w:caps w:val="0"/>
           <w:sz w:val="24"/>
         </w:rPr>
-        <w:t>Ky kapitull përshkruan çfarë u ndërtua dhe si u mat: sistemin (4.1–4.2), eksperimentin në radhën e ekzekutimit (4.3–4.9), dhe validimin, riprodhueshmërinë e etikën (4.10–4.12).</w:t>
+        <w:t>Ky kapitull përshkruan çfarë u ndërtua dhe si matet: sistemin (4.1–4.2), hapat e eksperimentit sipas radhës (4.3–4.9), dhe validimin, riprodhueshmërinë e etikën (4.10–4.12).</w:t>
       </w:r>
     </w:p>
     <w:p>
@@ -3060,7 +3028,7 @@
           <w:caps w:val="0"/>
           <w:sz w:val="24"/>
         </w:rPr>
-        <w:t xml:space="preserve"> Kërkimi është sasior dhe eksperimental, me një pjesë të vetme cilësore. Të tria pyetjet kërkimore pyesin «sa» dhe «a e përmirëson», dhe përgjigjja e tyre është matje e përsëritshme mbi të njëjtin korpus: metrikat e kodit, etiketat e rishikuesve të MLCQ-së dhe verdiktet e kompilatorit. Pjesa cilësore është gjykimi me rubrikë i një mostre rishkrimesh (Nënkapitulli 4.7), sepse vlera e një rishkrimi për zhvilluesin nuk matet dot vetëm me kompilim.</w:t>
+        <w:t xml:space="preserve"> Kërkimi është sasior dhe eksperimental. Pyetjet kërkimore pyesin «sa» dhe «a e përmirëson», dhe përgjigjen e marrin nga matje të përsëritshme mbi të njëjtin korpus: metrikat e kodit, etiketat e rishikuesve të MLCQ-së dhe verdiktet e kompilatorit. E vetmja pjesë cilësore është vlerësimi me rubrikë i një mostre rishkrimesh (Nënkapitulli 4.7), sepse vlera e një rishkrimi për zhvilluesin nuk matet vetëm me kompilim.</w:t>
       </w:r>
     </w:p>
     <w:p>
@@ -3085,7 +3053,7 @@
           <w:caps w:val="0"/>
           <w:sz w:val="24"/>
         </w:rPr>
-        <w:t xml:space="preserve"> Tri kufizime të deklaruara te Nënkapitulli 3.4 e formësojnë gjithë kapitullin: mungesa e zgjidhjes së simboleve, mungesa e testeve të projekteve dhe mbështetja te një dataset i vetëm. Pesha e tyre mbi rezultatet diskutohet te Nënkapitulli 6.6.</w:t>
+        <w:t xml:space="preserve"> Kapitulli formësohet nga kufizimet e Nënkapitullit 3.4, sidomos nga mungesa e zgjidhjes së simboleve dhe e testeve të projekteve, si dhe nga mbështetja te një dataset i vetëm.</w:t>
       </w:r>
     </w:p>
     <w:p>
@@ -3115,11 +3083,12 @@
           <w:caps w:val="0"/>
           <w:sz w:val="24"/>
         </w:rPr>
-        <w:t>Sistemi, i quajtur JavaSmell, është ndërtuar si një zinxhir shtresash me varësi në një drejtim të vetëm: një modul importon vetëm nga shtresat para tij, kurrë nga ato pas. Kjo e bën secilën shtresë të testueshme veç dhe e pengon logjikën e detektimit të rrjedhë te shtresa e transportit. Shtresat dhe rrjedha e të dhënave mes tyre janë (Figura 1):</w:t>
+        <w:t>Sistemi, i quajtur JavaSmell, është ndërtuar si një zinxhir shtresash ku varësia shkon në një drejtim: një modul importon vetëm nga shtresat para tij. Kështu çdo shtresë testohet veç, dhe logjika e detektimit nuk përzihet me transportin. Shtresat dhe rrjedha e të dhënave janë (Figura 1):</w:t>
       </w:r>
     </w:p>
     <w:p>
       <w:pPr>
+        <w:keepNext/>
         <w:jc w:val="center"/>
       </w:pPr>
       <w:r>
@@ -3185,7 +3154,7 @@
           <w:caps w:val="0"/>
           <w:sz w:val="24"/>
         </w:rPr>
-        <w:t>parsing: lexon skedarët «.java» me tree-sitter dhe regjistron vetëm fakte sintaksore, si deklarimet, thirrjet dhe qasjet në fusha (emër i thjeshtë, «this.x» ose «marrësi.anëtari»). Nuk zgjidh simbole.</w:t>
+        <w:t>parsing: lexon skedarët «.java» me tree-sitter dhe regjistron vetëm fakte sintaksore: deklarime, thirrje dhe qasje në fusha (emër i thjeshtë, «this.x» ose «marrësi.anëtari»). Nuk zgjidh simbole.</w:t>
       </w:r>
     </w:p>
     <w:p>
@@ -3201,7 +3170,7 @@
           <w:caps w:val="0"/>
           <w:sz w:val="24"/>
         </w:rPr>
-        <w:t>model dhe metrics: struktura të thjeshta të dhënash për klasat, metodat dhe fushat, dhe metrikat e tyre, të llogaritura me një kalim të vetëm mbi çdo klasë.</w:t>
+        <w:t>model dhe metrics: strukturat e të dhënave për klasat, metodat dhe fushat, dhe metrikat e tyre, të llogaritura me një kalim të vetëm mbi çdo klasë.</w:t>
       </w:r>
     </w:p>
     <w:p>
@@ -3217,7 +3186,7 @@
           <w:caps w:val="0"/>
           <w:sz w:val="24"/>
         </w:rPr>
-        <w:t>detectors: funksione të pastra që marrin një entitet dhe pragjet, dhe kthejnë erën bashkë me kushtet e vlerësuara. Çdo prag numerik rri në një skedar të vetëm.</w:t>
+        <w:t>detectors: funksione të pastra që marrin një entitet dhe pragjet, dhe kthejnë erën bashkë me kushtet e vlerësuara. Të gjitha pragjet numerike janë në një skedar.</w:t>
       </w:r>
     </w:p>
     <w:p>
@@ -3233,7 +3202,7 @@
           <w:caps w:val="0"/>
           <w:sz w:val="24"/>
         </w:rPr>
-        <w:t>ml dhe refactor: Qasja B dhe Qasja C. Të dyja përdorin daljen e detektorëve dhe modelin, por nuk importojnë njëra-tjetrën.</w:t>
+        <w:t>ml dhe refactor: Qasja B dhe Qasja C, që përdorin daljen e detektorëve por nuk importojnë njëra-tjetrën.</w:t>
       </w:r>
     </w:p>
     <w:p>
@@ -3249,7 +3218,7 @@
           <w:caps w:val="0"/>
           <w:sz w:val="24"/>
         </w:rPr>
-        <w:t>projects: materializon te disku një depo publike të GitHub-ut, që analiza të mos kërkojë një kopje të shkarkuar më parë.</w:t>
+        <w:t>projects: shkarkon në disk një depo publike të GitHub-ut, që të analizohet.</w:t>
       </w:r>
     </w:p>
     <w:p>
@@ -3265,7 +3234,7 @@
           <w:caps w:val="0"/>
           <w:sz w:val="24"/>
         </w:rPr>
-        <w:t>api: vetëm transport, pra validim, serializim dhe hartëzim gabimesh, pa logjikë detektimi apo refaktorimi.</w:t>
+        <w:t>api: vetëm transport (validim, serializim, gabime), pa logjikë detektimi apo refaktorimi.</w:t>
       </w:r>
     </w:p>
     <w:p>
@@ -3281,7 +3250,7 @@
           <w:caps w:val="0"/>
           <w:sz w:val="24"/>
         </w:rPr>
-        <w:t>frontend: ndërfaqja web, që flet me shërbimin vetëm përmes HTTP.</w:t>
+        <w:t>frontend: ndërfaqja web, që komunikon me shërbimin vetëm përmes HTTP.</w:t>
       </w:r>
     </w:p>
     <w:p>
@@ -3297,23 +3266,7 @@
           <w:caps w:val="0"/>
           <w:sz w:val="24"/>
         </w:rPr>
-        <w:t>Për një analizë, projekti lexohet dhe parsohet i tëri, sepse disa metrika varen nga tipat e tjerë të projektit. Çdo entitet matet, detektorët vlerësojnë strategjitë, dhe nëse përdoruesi e kërkon, modeli jep verdiktin e vet mbi të njëjtat metrika. Për çdo erë me transformim të automatizuar, motori i refaktorimit prodhon një diff të verifikuar. E njëjta rrjedhë arrihet nga rreshti i komandës dhe nga shërbimi HTTP.</w:t>
-      </w:r>
-    </w:p>
-    <w:p>
-      <w:pPr>
-        <w:spacing w:line="360" w:lineRule="auto"/>
-        <w:ind w:firstLine="360"/>
-        <w:jc w:val="both"/>
-      </w:pPr>
-      <w:r>
-        <w:rPr>
-          <w:rFonts w:ascii="Times New Roman" w:hAnsi="Times New Roman" w:eastAsia="Times New Roman"/>
-          <w:b w:val="0"/>
-          <w:caps w:val="0"/>
-          <w:sz w:val="24"/>
-        </w:rPr>
-        <w:t>Paketa evaluation dhe skriptet e dosjes scripts/ nuk janë pjesë e rrjedhës që sheh përdoruesi. Ato i ekzekutojnë të njëjtat shtresa mbi korpusin dhe shkruajnë rezultatet, ndaj çdo numër i Kapitullit 5 prodhohet nga i njëjti kod që përdor zhvilluesi, jo nga një kopje e tij.</w:t>
+        <w:t>Gjatë një analize parsohet i gjithë projekti, sepse disa metrika kërkojnë klasat e tjera të tij. Pastaj çdo entitet matet, detektorët vlerësojnë strategjitë, modeli jep verdiktin e vet kur kërkohet, dhe motori prodhon një diff të verifikuar për çdo erë që ka transformim të automatizuar. E njëjta rrjedhë thirret nga rreshti i komandës dhe nga shërbimi HTTP. Skriptet e eksperimenteve, te evaluation dhe scripts/, përdorin po këto shtresa mbi korpusin, ndaj çdo numër i punimit vjen nga i njëjti kod që përdor zhvilluesi.</w:t>
       </w:r>
     </w:p>
     <w:p>
@@ -3343,11 +3296,12 @@
           <w:caps w:val="0"/>
           <w:sz w:val="24"/>
         </w:rPr>
-        <w:t>Backend-i dhe eksperimentet janë shkruar në Python, ndërfaqja në TypeScript. Çdo varësi është falas, me licencë të hapur, dhe e fiksuar në version të saktë, që një rezultat të riprodhohet me versionin që e prodhoi (Tabela 1).</w:t>
+        <w:t>Backend-i dhe eksperimentet janë në Python, ndërfaqja në TypeScript. Të gjitha varësitë janë falas, me licencë të hapur dhe me version të fiksuar, që një rezultat të mund të riprodhohet me të njëjtat versione (Tabela 1).</w:t>
       </w:r>
     </w:p>
     <w:p>
       <w:pPr>
+        <w:keepNext/>
         <w:spacing w:line="240" w:lineRule="auto"/>
         <w:jc w:val="center"/>
       </w:pPr>
@@ -4259,7 +4213,7 @@
           <w:caps w:val="0"/>
           <w:sz w:val="24"/>
         </w:rPr>
-        <w:t>tree-sitter jep pemë sintaksore të plotë edhe për kod që nuk kompilon, pa ndërtuar projektin; scikit-learn ofron ndarjen e grupuar, ansamblet e pemëve dhe rëndësinë me permutim. Asnjë model gjuhësor dhe asnjë shërbim me pagesë nuk përdoret në sistem.</w:t>
+        <w:t>tree-sitter jep pemë sintaksore të plotë edhe për kod që nuk kompilon, pa ndërtuar projektin, dhe scikit-learn ofron ndarjen e grupuar, ansamblet e pemëve dhe rëndësinë me permutim. Sistemi nuk përdor asnjë model gjuhësor apo shërbim me pagesë.</w:t>
       </w:r>
     </w:p>
     <w:p>
@@ -4289,7 +4243,7 @@
           <w:caps w:val="0"/>
           <w:sz w:val="24"/>
         </w:rPr>
-        <w:t>MLCQ (Madeyski &amp; Lewowski, 2020) përmban rishikime nga zhvillues profesionistë, por jo kodin: çdo rresht tregon depon, commit-in dhe entitetin. Kodi u materializua duke shkarkuar çdo depo në commit-in e saktë të regjistruar.</w:t>
+        <w:t>MLCQ (Madeyski &amp; Lewowski, 2020) përmban rishikimet e zhvilluesve profesionistë, por jo vetë kodin: çdo rresht tregon depon, commit-in dhe entitetin. Prandaj çdo depo u shkarkua në commit-in e saktë të regjistruar.</w:t>
       </w:r>
     </w:p>
     <w:p>
@@ -4305,7 +4259,7 @@
           <w:caps w:val="0"/>
           <w:sz w:val="24"/>
         </w:rPr>
-        <w:t>Depot e zhvendosura u ndoqën vetëm kur commit-i i regjistruar zgjidhej te vendndodhja e re. SHA-ja e git-it është hash i përmbajtjes, ndaj nëse ai zgjidhet, pema është provueshëm e njëjta që panë rishikuesit; nëse nuk zgjidhet, depoja nuk zëvendësohet me hamendje.</w:t>
+        <w:t>Nëse një depo ishte zhvendosur, ajo u ndoq vetëm kur commit-i gjendej edhe te vendi i ri. Meqë SHA-ja e git-it është hash i përmbajtjes, një commit i gjetur garanton se kodi është i njëjti që panë rishikuesit. Kur nuk gjendet, depoja nuk zëvendësohet me hamendje.</w:t>
       </w:r>
     </w:p>
     <w:p>
@@ -4321,7 +4275,7 @@
           <w:caps w:val="0"/>
           <w:sz w:val="24"/>
         </w:rPr>
-        <w:t>Përputhja mes një mostre të MLCQ-së dhe një entiteti të modelit tonë ankorohet te rangu i rreshtave dhe verifikohet me emrin. Emri i publikuar i entitetit vjen në katër formate të ndryshme dhe nuk është i besueshëm si ankorim.</w:t>
+        <w:t>Një mostër e MLCQ-së lidhet me entitetin përkatës sipas rangut të rreshtave, dhe lidhja verifikohet me emrin. Vetëm emri nuk mjafton si ankorim, sepse në dataset shfaqet në katër formate të ndryshme.</w:t>
       </w:r>
     </w:p>
     <w:p>
@@ -4351,7 +4305,7 @@
           <w:caps w:val="0"/>
           <w:sz w:val="24"/>
         </w:rPr>
-        <w:t>Analizuesi ndërtohet mbi tree-sitter (Brunsfeld et al.), dhe mbi modelin sintaksor që ai prodhon maten shtatëmbëdhjetë metrika klase dhe nëntë metrika metode, me një kalim të vetëm për klasë. Ndër to janë metrikat e Chidamber &amp; Kemerer-it (1994), varianti i normalizuar i LCOM-it i Henderson-Sellers-it (1996), TCC-ja e Bieman &amp; Kang-ut (1995) dhe kompleksiteti ciklomatik (McCabe, 1976), i matur si numri i pikave të vendimit në trupin e metodës plus një. Të gjitha janë te Shtojca 8.3.</w:t>
+        <w:t>Analizuesi mbështetet te tree-sitter (Brunsfeld et al.), dhe mbi pemën që ai prodhon maten shtatëmbëdhjetë metrika klase dhe nëntë metrika metode, me një kalim për klasë. Ndër to janë metrikat e Chidamber &amp; Kemerer (1994), varianti i normalizuar i LCOM-it nga Henderson-Sellers (1996), TCC-ja e Bieman &amp; Kang (1995) dhe kompleksiteti ciklomatik (McCabe, 1976), i matur si numri i pikave të vendimit në trupin e metodës plus një. Përkufizimet e të gjitha metrikave jepen te Shtojca 8.3.</w:t>
       </w:r>
     </w:p>
     <w:p>
@@ -4367,7 +4321,7 @@
           <w:caps w:val="0"/>
           <w:sz w:val="24"/>
         </w:rPr>
-        <w:t>Rreshtat e kodit numërohen si rreshta logjikë, sipas dallimit që bën Park (1992) mes rreshtave fizikë dhe logjikë: rreshtat bosh, komentet dhe rreshtat me vetëm shenja ndarëse, si «}» ose «});», nuk janë pohime dhe nuk numërohen.</w:t>
+        <w:t>Rreshtat e kodit numërohen si rreshta logjikë, sipas dallimit të Park (1992) mes rreshtave fizikë dhe logjikë: rreshtat bosh, komentet dhe rreshtat që kanë vetëm shenja si «}» ose «});» nuk numërohen.</w:t>
       </w:r>
     </w:p>
     <w:p>
@@ -4383,7 +4337,7 @@
           <w:caps w:val="0"/>
           <w:sz w:val="24"/>
         </w:rPr>
-        <w:t>Metrikat ATFD, CBO, DIT dhe TCC përcaktohen kundrejt tipave të tjerë të projektit. Prandaj çdo depo analizohet e plotë; një klasë e matur e izoluar do të raportonte vlera thjesht të gabuara.</w:t>
+        <w:t>Metrikat ATFD, CBO, DIT dhe TCC varen nga tipat e tjerë të projektit, ndaj çdo depo analizohet e plotë. Një klasë e matur veçmas do të jepte vlera të gabuara.</w:t>
       </w:r>
     </w:p>
     <w:p>
@@ -4413,7 +4367,7 @@
           <w:caps w:val="0"/>
           <w:sz w:val="24"/>
         </w:rPr>
-        <w:t>Sistemi zbaton tetë strategji. God Class, Data Class, Feature Envy dhe Brain Method zbatohen ashtu siç janë publikuar nga Lanza &amp; Marinescu (2006); Large Class, Long Method dhe Long Parameter List ndjekin përshkrimet e Fowler-it (2018), dhe Deep Nesting mat thellësinë e ndërfutjes së blloqeve. Kushtet dhe burimi i secilës jepen te Shtojca 8.1.</w:t>
+        <w:t>Sistemi zbaton tetë strategji. God Class, Data Class, Feature Envy dhe Brain Method janë marrë ashtu siç i publikuan Lanza &amp; Marinescu (2006). Large Class, Long Method dhe Long Parameter List ndjekin përshkrimet e Fowler-it (2018), ndërsa Deep Nesting mat sa thellë janë futur blloqet brenda njëri-tjetrit. Kushtet dhe burimi i secilës janë te Shtojca 8.1.</w:t>
       </w:r>
     </w:p>
     <w:p>
@@ -4429,7 +4383,7 @@
           <w:caps w:val="0"/>
           <w:sz w:val="24"/>
         </w:rPr>
-        <w:t>Katër pragje nuk kanë burim të botuar dhe janë zgjedhje të autorit: kufiri i Long Method (30 rreshta), dy kushte të Brain Method (CC ≥ 4, ndërfutja ≥ 3) dhe kufiri i Deep Nesting (&gt; 3). I pari zhvendoset te Shtojca 8.6; tre të tjerët nuk maten dot kundrejt MLCQ-së. Të autorit janë edhe tre pragjet e ashpërsisë (Shtojca 8.9); të tjerat vijnë nga Lanza &amp; Marinescu (Shtojca 8.2).</w:t>
+        <w:t>Katër pragje nuk kanë burim të botuar dhe i ka zgjedhur autori: kufiri i Long Method (30 rreshta), dy kushte të Brain Method (CC ≥ 4, ndërfutja ≥ 3) dhe kufiri i Deep Nesting (&gt; 3). Ndjeshmëria ndaj të parit matet te Shtojca 8.6, ndërsa tre të tjerët nuk maten dot kundrejt MLCQ-së. Të autorit janë edhe tre pragjet e ashpërsisë (Shtojca 8.9); të tjerat vijnë nga Lanza &amp; Marinescu (Shtojca 8.2).</w:t>
       </w:r>
     </w:p>
     <w:p>
@@ -4445,7 +4399,7 @@
           <w:caps w:val="0"/>
           <w:sz w:val="24"/>
         </w:rPr>
-        <w:t>Katër strategji vlerësohen kundrejt MLCQ-së: God Class kundrejt etiketës «blob», Data Class, Feature Envy dhe Long Method kundrejt etiketave me të njëjtin emër. Për Blob-in pikëzohet edhe një variant që i bashkon God Class dhe Large Class, detektorin që mbështetet vetëm te madhësia.</w:t>
+        <w:t>Kundrejt MLCQ-së vlerësohen katër strategji: God Class kundrejt etiketës «blob», dhe Data Class, Feature Envy e Long Method kundrejt etiketave me të njëjtin emër. Për Blob-in pikëzohet edhe një variant që bashkon God Class me Large Class, detektorin që shikon vetëm madhësinë.</w:t>
       </w:r>
     </w:p>
     <w:p>
@@ -4461,7 +4415,7 @@
           <w:caps w:val="0"/>
           <w:sz w:val="24"/>
         </w:rPr>
-        <w:t>Një detektor nuk kthen boolean, por kushtet që vlerësoi bashkë me vlerat e matura. Kjo bën të mundura tri gjëra: ndërfaqja shpjegon pse diçka u shënua, punimi raporton cila klauzolë e mbajti detektimin, dhe ashpërsia derivohet nga sa larg pragut është matja në vend që të caktohet. Shkalla e ashpërsisë është ajo e MLCQ-së, ndaj dalja e rregullave krahasohet me etiketat e njeriut pa asnjë hap hartëzimi.</w:t>
+        <w:t>Një detektor nuk kthen thjesht po ose jo, por kushtet që vlerësoi me vlerat e matura. Kjo i lejon ndërfaqes të shpjegojë pse u shënua diçka dhe punimit të raportojë cili kusht e mbajti detektimin, ndërsa ashpërsia llogaritet nga sa larg pragut është matja, jo me dorë. Ashpërsia përdor shkallën e MLCQ-së, ndaj krahasohet drejtpërdrejt me etiketat e rishikuesve.</w:t>
       </w:r>
     </w:p>
     <w:p>
@@ -4491,7 +4445,7 @@
           <w:caps w:val="0"/>
           <w:sz w:val="24"/>
         </w:rPr>
-        <w:t>Katër modele vlerësohen: klasifikuesi i shumicës, regresioni logjistik, Random Forest (Breiman, 2001) dhe Gradient Boosting (Friedman, 2001), të zbatuar me scikit-learn (Pedregosa et al., 2011). Veçoritë janë të gjitha metrikat e Nënkapitullit 4.4, jo vetëm ato që përdorin strategjitë. Në tabela dhe figura, parashtesa «c_» shënon një metrikë të klasës dhe «m_» një metrikë të metodës, sepse disa, si ATFD, maten në të dy nivelet.</w:t>
+        <w:t>Vlerësohen katër modele: klasifikuesi i shumicës, regresioni logjistik, Random Forest (Breiman, 2001) dhe Gradient Boosting (Friedman, 2001), të gjitha me scikit-learn (Pedregosa et al., 2011). Si veçori përdoren të gjitha metrikat e Nënkapitullit 4.4, jo vetëm ato të strategjive. Parashtesa «c_» shënon një metrikë klase dhe «m_» një metrikë metode, sepse disa metrika, si ATFD, maten në të dy nivelet.</w:t>
       </w:r>
     </w:p>
     <w:p>
@@ -4507,7 +4461,7 @@
           <w:caps w:val="0"/>
           <w:sz w:val="24"/>
         </w:rPr>
-        <w:t>Klasifikuesi i shumicës, që parashikon gjithmonë «pa erë», raportohet si model bazë. Të njëjtat modele trajnohen edhe vetëm me metrikat e strategjisë, që fitimi të mos ngatërrohet me metrikat shtesë.</w:t>
+        <w:t>Klasifikuesi i shumicës parashikon gjithmonë «pa erë» dhe shërben si model bazë. Modelet trajnohen edhe vetëm me metrikat e strategjive, që të dallohet sa nga fitimi vjen nga metrikat shtesë.</w:t>
       </w:r>
     </w:p>
     <w:p>
@@ -4523,7 +4477,7 @@
           <w:caps w:val="0"/>
           <w:sz w:val="24"/>
         </w:rPr>
-        <w:t>Ndarja bëhet me GroupKFold sipas depos, që mostrat e një projekti të mos jenë njëherësh në trajnim dhe në testim (Nënkapitulli 2.3). Parashikimet janë jashtë fold-it: çdo mostër parashikohet saktësisht një herë, nga një model që nuk e ka parë kurrë projektin e saj. Kjo jep të njëjtën formë që prodhojnë detektorët, ndaj dy qasjet krahasohen mostër për mostër.</w:t>
+        <w:t>Ndarja bëhet me GroupKFold sipas depos, që mostrat e një projekti të mos jenë njëkohësisht në trajnim dhe në testim (Nënkapitulli 2.3). Çdo mostër parashikohet një herë, nga një model që nuk e ka parë projektin e saj. Kështu modeli jep dalje të së njëjtës formë si detektorët, dhe të dy krahasohen mostër për mostër.</w:t>
       </w:r>
     </w:p>
     <w:p>
@@ -4539,7 +4493,7 @@
           <w:caps w:val="0"/>
           <w:sz w:val="24"/>
         </w:rPr>
-        <w:t>Çekuilibri trajtohet me peshë klase, jo me mbi-mostrim. Mbi-mostrimi do t'i dyfishonte rreshtat përtej kufirit të fold-it dhe do ta prishte grupimin. Asnjë ribalancim nuk zbatohet mbi bashkësinë e testimit.</w:t>
+        <w:t>Çekuilibri i klasave trajtohet me pesha, jo me mbi-mostrim, sepse mbi-mostrimi do t'i kopjonte rreshtat përtej kufirit të fold-it dhe do ta prishte grupimin. Bashkësia e testimit nuk ribalancohet.</w:t>
       </w:r>
     </w:p>
     <w:p>
@@ -4555,7 +4509,7 @@
           <w:caps w:val="0"/>
           <w:sz w:val="24"/>
         </w:rPr>
-        <w:t>Rëndësia e veçorive matet me permutation importance mbi fold-in e mbajtur jashtë, sepse rëndësia e papastërtisë së një pylli anon nga veçoritë me shumë vlera të ndryshme.</w:t>
+        <w:t>Rëndësia e veçorive matet me permutation importance mbi fold-in e testimit, sepse rëndësia e bazuar te papastërtia favorizon veçoritë me shumë vlera të ndryshme. Kjo tregon cila metrikë ka peshë në tërë korpusin, por jo pse u shënua një entitet i caktuar. Prandaj çdo verdikt pozitiv shpjegohet veç: çdo metrikë, një nga një, zëvendësohet me mesoren e bashkësisë së trajnimit dhe modeli pyetet sërish. Nëse ky ndryshim i vetëm e ul probabilitetin nën 0.5, ajo metrikë e mban verdiktin, dhe ndërfaqja e shkruan si fjali: «po të ishte CLOC-u tipik, kjo klasë nuk do të shënohej». Metoda vlen për çdo lloj modeli, por shikon një metrikë në një kohë: kur dy metrika mbajnë të njëjtin informacion, ndryshimi i njërës mund të mos lëvizë asgjë, dhe rasti mbetet pa shpjegim. Edhe shpjegimet llogariten jashtë fold-it.</w:t>
       </w:r>
     </w:p>
     <w:p>
@@ -4571,23 +4525,7 @@
           <w:caps w:val="0"/>
           <w:sz w:val="24"/>
         </w:rPr>
-        <w:t>Rëndësia me permutim thotë cila metrikë ka peshë mbi tërë korpusin, por jo pse u shënua një entitet i caktuar. Prandaj çdo verdikt pozitiv i modelit shpjegohet veç: secila metrikë, një nga një, zëvendësohet me mesoren e bashkësisë së trajnimit dhe modeli pyetet sërish. Nëse ky zëvendësim i vetëm e çon probabilitetin nën kufirin e vendimit, 0.5, ajo metrikë e mban vetë verdiktin, dhe ndërfaqja e shkruan si fjali: «po të ishte CLOC-u tipik, kjo klasë nuk do të shënohej». Metoda krahason dy parashikime reale të modelit dhe nuk varet nga lloji i tij. Kufiri i saj është se e sheh një metrikë në një kohë: kur dy metrika mbajnë të njëjtin informacion, zëvendësimi i njërës mund të mos lëvizë asgjë dhe rasti del i pashpjeguar. Shpjegimi jepet jashtë fold-it, si vetë verdiktet.</w:t>
-      </w:r>
-    </w:p>
-    <w:p>
-      <w:pPr>
-        <w:spacing w:line="360" w:lineRule="auto"/>
-        <w:ind w:firstLine="360"/>
-        <w:jc w:val="both"/>
-      </w:pPr>
-      <w:r>
-        <w:rPr>
-          <w:rFonts w:ascii="Times New Roman" w:hAnsi="Times New Roman" w:eastAsia="Times New Roman"/>
-          <w:b w:val="0"/>
-          <w:caps w:val="0"/>
-          <w:sz w:val="24"/>
-        </w:rPr>
-        <w:t>Në ndërfaqe, modeli i trajnuar lexohet nga disku bashkë me manifestin e tij dhe pyetet vetëm kur përdoruesi e kërkon. Nëse mungon, shërbimi e thotë me një kod gabimi të veçantë dhe analiza me rregulla vazhdon.</w:t>
+        <w:t>Në ndërfaqe, modeli lexohet nga disku me manifestin e tij dhe pyetet vetëm kur përdoruesi e kërkon; nëse mungon, analiza me rregulla vazhdon dhe shërbimi e njofton me një kod gabimi të veçantë.</w:t>
       </w:r>
     </w:p>
     <w:p>
@@ -4617,7 +4555,7 @@
           <w:caps w:val="0"/>
           <w:sz w:val="24"/>
         </w:rPr>
-        <w:t>Motori automatizon tri transformime të Fowler-it (2018): Extract Method për Long Method dhe Brain Method, Replace Nested Conditional with Guard Clauses për Deep Nesting, dhe Introduce Parameter Object për Long Parameter List, vetëm te metodat «private». Për katër erërat e tjera refaktorimet propozohen pa u aplikuar (Shtojca 8.4).</w:t>
+        <w:t>Motori automatizon tri transformime të Fowler-it (2018): Extract Method për Long Method dhe Brain Method, Replace Nested Conditional with Guard Clauses për Deep Nesting, dhe Introduce Parameter Object për Long Parameter List, vetëm te metodat «private». Për katër erërat e tjera refaktorimi vetëm propozohet (Shtojca 8.4).</w:t>
       </w:r>
     </w:p>
     <w:p>
@@ -4633,7 +4571,7 @@
           <w:caps w:val="0"/>
           <w:sz w:val="24"/>
         </w:rPr>
-        <w:t>Çdo transformim deklaron parakushtet e veta. Nëse ndonjëra prej tyre nuk provohet nga pema e analizës, transformimi kthen «e paaplikueshme» me arsyen përkatëse, e cila numërohet si rezultat (Shtojca 8.4). Te Extract Method, një analizë e rrjedhës së të dhënave kërkon që blloku i nxjerrë të ketë një dalje të vetme, që asnjë return, break ose continue të mos dalë prej tij, dhe që çdo variabël që lexon të jetë e caktuar me siguri.</w:t>
+        <w:t>Çdo transformim ka parakushtet e veta. Nëse ndonjë prej tyre nuk mund të provohet nga pema sintaksore, transformimi kthen «e paaplikueshme» bashkë me arsyen, dhe ky refuzim numërohet si rezultat. Te Extract Method, një analizë e rrjedhës së të dhënave kontrollon që blloku i nxjerrë të ketë një dalje të vetme, që asnjë return, break ose continue të mos dalë prej tij, dhe që çdo variabël që lexon të ketë vlerë me siguri.</w:t>
       </w:r>
     </w:p>
     <w:p>
@@ -4649,7 +4587,7 @@
           <w:caps w:val="0"/>
           <w:sz w:val="24"/>
         </w:rPr>
-        <w:t>Rishkrimi bëhet mbi rangje bajtash, sepse tree-sitter i jep pozicionet në bajta të tekstit UTF-8, dhe aplikohet nga fundi para, që pozicionet e çdo editimi të mbeten të vlefshme. Dy editime që mbivendosen refuzohen.</w:t>
+        <w:t>Rishkrimi bëhet mbi pozicione bajtash, sepse tree-sitter jep pozicionet në bajta të tekstit UTF-8. Editimet aplikohen nga fundi i skedarit drejt fillimit, që pozicionet e të tjerave të mbeten të sakta, dhe dy editime që mbivendosen refuzohen.</w:t>
       </w:r>
     </w:p>
     <w:p>
@@ -4665,7 +4603,7 @@
           <w:caps w:val="0"/>
           <w:sz w:val="24"/>
         </w:rPr>
-        <w:t>Verifikimi bëhet në tri nivele, sepse një skedar i një depoje reale importon fqinjët e vet dhe shpesh nuk kompilon i vetëm. Së pari kontrollohet nëse skedari i rishkruar parsohet, pastaj nëse javac, i ekzekutuar para dhe pas, raporton ndonjë lloj të ri gabimi, dhe së fundi, kur skedari kompilon i vetëm, nëse kompilon ende. Kompilatori thirret me listë të fiksuar argumentesh, me kufi kohor dhe në një dosje të përkohshme. Kufiri i izolimit matet veç mbi një mostër të mbjellë skedarësh: i njëjti rishkrim kompilohet dy herë, i vetëm dhe me burimet e projektit të vet, dhe krahasohen verdiktet.</w:t>
+        <w:t>Verifikimi ka tri nivele, sepse një skedar nga një depo reale varet nga fqinjët e tij dhe shpesh nuk kompilon i vetëm: skedari i rishkruar duhet të parsohet; javac, i ekzekutuar para dhe pas, nuk duhet të japë lloj të ri gabimi; dhe nëse skedari kompilonte i vetëm, duhet të kompilojë ende. Kompilatori thirret me argumente të fiksuara, me kufi kohe dhe në një dosje të përkohshme. Ndikimi i izolimit matet veç: mbi një mostër skedarësh të zgjedhur me farë, i njëjti rishkrim kompilohet një herë i vetëm dhe një herë me burimet e projektit, dhe verdiktet krahasohen.</w:t>
       </w:r>
     </w:p>
     <w:p>
@@ -4681,7 +4619,7 @@
           <w:caps w:val="0"/>
           <w:sz w:val="24"/>
         </w:rPr>
-        <w:t>Pas verifikimit, çdo entitet i rishkruar matet sërish me të njëjtët detektorë. Klasa matet e tëra para dhe pas, sepse Extract Method krijon një metodë të re. Kështu matet nëse era u hoq, sa lëvizi metrika mbi të cilën ndez detektori, dhe nëse rishkrimi solli një erë që nuk ishte aty.</w:t>
+        <w:t>Pas verifikimit, çdo entitet i rishkruar matet sërish me të njëjtët detektorë. Matet e gjithë klasa, para dhe pas, sepse Extract Method shton një metodë të re. Kështu shihet nëse era u hoq, sa ndryshoi metrika që e ndez detektorin, dhe nëse rishkrimi solli një erë të re.</w:t>
       </w:r>
     </w:p>
     <w:p>
@@ -4697,7 +4635,7 @@
           <w:caps w:val="0"/>
           <w:sz w:val="24"/>
         </w:rPr>
-        <w:t xml:space="preserve">Kompilimi flet vetëm për gjysmën e përkufizimit të Fowler-it (2018), ruajtjen e sjelljes; përmirësimi i strukturës gjykohet veç, nga një njeri që lexon një mostër diff-esh sipas një rubrike të fiksuar me tri përmasa: </w:t>
+        <w:t xml:space="preserve">Kompilimi mbulon vetëm gjysmën e përkufizimit të Fowler-it (2018), ruajtjen e sjelljes. Nëse struktura u përmirësua e gjykon një njeri, mbi një mostër diff-esh, me një rubrikë me tri përmasa: </w:t>
       </w:r>
       <w:r>
         <w:rPr>
@@ -4751,7 +4689,7 @@
           <w:caps w:val="0"/>
           <w:sz w:val="24"/>
         </w:rPr>
-        <w:t xml:space="preserve"> (ashtu si është, pas një ndreqjeje, e refuzuar). Mostra është e mbjellë me farë dhe e shtresuar sipas transformimit, dhe shifra e bashkuar ripeshohet me madhësitë reale të shtresave. Fleta nuk mban verdiktin e kompilatorit, që ai të mos e ndikojë gjykimin. Intervalet janë Wilson (1927), sepse përafrimi normal me pak vëzhgime jep kufij jashtë [0, 1] (Brown et al., 2001). Vlerësuesi është autori i punimit, çka është kufizim i deklaruar.</w:t>
+        <w:t xml:space="preserve"> (ashtu si është, pas një ndreqjeje, e refuzuar). Mostra zgjidhet me farë, e shtresuar sipas transformimit, dhe shifra e përgjithshme ripeshohet sipas madhësisë së shtresave. Vlerësuesi nuk e sheh verdiktin e kompilatorit. Intervalet janë ato të Wilson (1927), sepse përafrimi normal me pak vëzhgime jep kufij jashtë [0, 1] (Brown et al., 2001). Vlerësuesi është vetë autori, çka është kufizim i deklaruar.</w:t>
       </w:r>
     </w:p>
     <w:p>
@@ -4781,7 +4719,7 @@
           <w:caps w:val="0"/>
           <w:sz w:val="24"/>
         </w:rPr>
-        <w:t>Shërbimi HTTP ofron njëmbëdhjetë pika hyrjeje: analizën e një projekti, metrikat dhe kodin e një entiteti, shfletimin e dosjeve, importin nga GitHub, gjendjen e shërbimit, dhe pesë pika nën /refactor për pamjen paraprake, patch-in, kontrollin dhe shkrimin në disk. Çdo pikë e validon kërkesën, thërret të njëjtat funksione si rreshti i komandës dhe kthen JSON.</w:t>
+        <w:t>Shërbimi HTTP ka njëmbëdhjetë pika hyrjeje: analizën e projektit, metrikat dhe kodin e një entiteti, shfletimin e dosjeve, importin nga GitHub, gjendjen e shërbimit, dhe pesë pika nën /refactor (pamja paraprake, patch-i, kontrolli dhe shkrimi në disk). Secila e validon kërkesën, thërret të njëjtat funksione si rreshti i komandës dhe kthen JSON.</w:t>
       </w:r>
     </w:p>
     <w:p>
@@ -4797,7 +4735,7 @@
           <w:caps w:val="0"/>
           <w:sz w:val="24"/>
         </w:rPr>
-        <w:t>Aplikacioni ka një përdorues dhe dëgjon vetëm në localhost, ndaj rreziqet që mbrohen nuk janë autentikimi, por shtegu dhe burimet. Shtegu që dërgon përdoruesi kanonizohet dhe pranohet vetëm nëse bie brenda një rrënje të lejuar, edhe pasi ndiqen lidhjet simbolike; rrënjët janë dosja e zgjedhur dhe ajo e depove të importuara. Një analizë ka kufij për numrin e skedarëve, madhësinë totale dhe kohën. Gabimet kthehen me mesazh dhe kod, pa gjurmë të brendshme dhe pa shtigje absolute. Meqë çdo faqe që hap përdoruesi e arrin localhost-in përmes shfletuesit të tij, çdo kërkesë kalon një roje: pranohen vetëm emra lokalë te koka Host, që e ndal DNS rebinding, asnjë POST nga një origjinë e huaj, dhe ndërfaqja nuk lejohet të mbështillet në një faqe tjetër. /source lexon vetëm skedarë «.java».</w:t>
+        <w:t>Aplikacioni ka një përdorues dhe dëgjon vetëm në localhost, ndaj rreziqet kryesore janë shtigjet dhe burimet, jo autentikimi. Pranohen vetëm shtigje brenda rrënjëve të lejuara, edhe pas lidhjeve simbolike; analiza ka kufij për skedarët, madhësinë dhe kohën; dhe gabimet kthehen pa detaje të brendshme. Meqë çdo faqe e hapur në shfletues mund ta arrijë localhost-in, refuzohen edhe emrat jo-lokalë te koka Host (DNS rebinding), kërkesat POST nga origjina të huaja dhe shfaqja e ndërfaqes brenda një faqeje tjetër. Importi nga GitHub ruan vetëm skedarët «.java» të një depoje publike, me kufij madhësie dhe me çdo shteg brenda dosjes së synuar.</w:t>
       </w:r>
     </w:p>
     <w:p>
@@ -4813,7 +4751,7 @@
           <w:caps w:val="0"/>
           <w:sz w:val="24"/>
         </w:rPr>
-        <w:t>Importi nga GitHub shkarkon arkivin e një depoje publike dhe shkruan vetëm anëtarët «.java», me kufij madhësie dhe me çdo shteg të kontrolluar se bie brenda dosjes së synuar; importohen vetëm depo publike.</w:t>
+        <w:t>Shkrimi në disk është i vetmi veprim që ndryshon kodin e autorit, ndaj kërkon konfirmim të qartë, një depo git pa ndryshime të pakomituara dhe skedarë që git-i i ndjek, që një «git restore» t'i kthejë të gjitha. Përndryshe refuzohet me arsyen përkatëse. Shkruhen vetëm rishkrimet që kaluan verifikimin.</w:t>
       </w:r>
     </w:p>
     <w:p>
@@ -4829,23 +4767,7 @@
           <w:caps w:val="0"/>
           <w:sz w:val="24"/>
         </w:rPr>
-        <w:t>Shkrimi në disk është i vetmi veprim që ndryshon kodin e autorit, ndaj kërkon një konfirmim të qartë në kërkesë, një depo git pa ndryshime të pakomituara, dhe skedarë që git-i i ndjek. Vetëm atëherë një komandë e vetme, «git restore», e kthen gjithçka; nëse një kusht nuk plotësohet, shkrimi refuzohet me arsyen përkatëse. Shkruhen vetëm rishkrimet që kaluan verifikimin.</w:t>
-      </w:r>
-    </w:p>
-    <w:p>
-      <w:pPr>
-        <w:spacing w:line="360" w:lineRule="auto"/>
-        <w:ind w:firstLine="360"/>
-        <w:jc w:val="both"/>
-      </w:pPr>
-      <w:r>
-        <w:rPr>
-          <w:rFonts w:ascii="Times New Roman" w:hAnsi="Times New Roman" w:eastAsia="Times New Roman"/>
-          <w:b w:val="0"/>
-          <w:caps w:val="0"/>
-          <w:sz w:val="24"/>
-        </w:rPr>
-        <w:t>Ndërfaqja është aplikacion React me TypeScript, e ndërtuar një herë dhe e shërbyer nga i njëjti proces si API-ja. Projekti zgjidhet duke shfletuar dosjet brenda rrënjëve të lejuara, ose duke importuar një depo, dhe përdoruesi, sipas dëshirës, kërkon edhe verdiktin e modelit. Paneli tregon përmbledhjen sipas erës, krahasimin e dy qasjeve dhe gjetjet sipas skedarit. Për secilën gjetje shfaqen kushtet me vlerat e matura, shpjegimi i modelit, dhe diff-i i rishkrimit ose arsyeja e refuzimit në gjuhë të kuptueshme. Pas shkrimit në disk, ndërfaqja tregon cilat erëra u hoqën dhe cilat lindën.</w:t>
+        <w:t>Ndërfaqja është aplikacion React me TypeScript, që shërbehet nga i njëjti proces si API-ja. Projekti zgjidhet duke shfletuar dosjet ose duke importuar një depo. Për çdo gjetje shfaqen kushtet me vlerat e matura, shpjegimi i modelit, dhe diff-i i rishkrimit ose arsyeja e refuzimit. Pas shkrimit në disk tregohet cilat erëra u hoqën dhe cilat u shfaqën.</w:t>
       </w:r>
     </w:p>
     <w:p>
@@ -4875,7 +4797,7 @@
           <w:caps w:val="0"/>
           <w:sz w:val="24"/>
         </w:rPr>
-        <w:t>Një mostër quhet pozitive kur ashpërsia e agreguar e rishikuesve është mbi «none». Agregimi parësor është mesatarja e rishikimeve; maksimumi, minimumi dhe unanimiteti raportohen si analizë ndjeshmërie, sepse rishikuesit e MLCQ-së nuk pajtohen me njëri-tjetrin në një të katërtën e mostrave dhe një shifër e vetme do ta fshihte atë mospajtim.</w:t>
+        <w:t>Një mostër quhet pozitive kur ashpërsia mesatare e rishikuesve është mbi «none». Maksimumi, minimumi dhe unanimiteti përdoren si analizë ndjeshmërie, sepse rishikuesit e MLCQ-së nuk pajtohen në rreth një të katërtën e mostrave, dhe një shifër e vetme do ta fshihte këtë.</w:t>
       </w:r>
     </w:p>
     <w:p>
@@ -4891,7 +4813,7 @@
           <w:caps w:val="0"/>
           <w:sz w:val="24"/>
         </w:rPr>
-        <w:t>Mbi këtë përkufizim maten precizioni, recall-i dhe F1-i, bashkë me koeficientin e korrelacionit të Matthews-it (Matthews, 1975), i cili i përfshin të katër qelizat e matricës konfuze. Kur shumica e etiketave janë negative, kjo veti është vendimtare: një detektor që nuk ndez kurrë del i papërcaktuar këtu, ndërsa saktësia e përgjithshme do t'i jepte shifër të lartë. Recall-i raportohet edhe i ndarë sipas ashpërsisë që caktuan rishikuesit.</w:t>
+        <w:t>Mbi këtë përkufizim maten precizioni, recall-i dhe F1, si dhe koeficienti i korrelacionit i Matthews-it (Matthews, 1975), që i merr parasysh të katër qelizat e matricës konfuze. Kjo ka rëndësi kur shumica e etiketave janë negative: një detektor që nuk ndez kurrë del i papërcaktuar sipas tij, ndërsa saktësia e përgjithshme do t'i jepte shifër të lartë. Recall-i raportohet edhe sipas ashpërsisë që caktuan rishikuesit.</w:t>
       </w:r>
     </w:p>
     <w:p>
@@ -4907,7 +4829,7 @@
           <w:caps w:val="0"/>
           <w:sz w:val="24"/>
         </w:rPr>
-        <w:t>Pajtimi mes dy qasjeve matet me koeficientin kappa (Cohen, 1960), sepse kur 82% e etiketave janë negative, dy detektorë që ndezin rrallë pajtohen shumë vetëm nga rastësia. Raportohen edhe të katër qelizat, bashkimi i dy qasjeve (mostra shënohet nëse e shënon njëra) dhe prerja e tyre (nëse e shënojnë të dyja).</w:t>
+        <w:t>Pajtimi mes dy qasjeve matet me koeficientin kappa (Cohen, 1960), sepse kur 82% e etiketave janë negative, dy detektorë që ndezin rrallë pajtohen shumë edhe rastësisht. Raportohen edhe të katër qelizat, bashkimi i dy qasjeve (mostra shënohet nëse e shënon njëra) dhe prerja e tyre (nëse e shënojnë të dyja).</w:t>
       </w:r>
     </w:p>
     <w:p>
@@ -4923,7 +4845,7 @@
           <w:caps w:val="0"/>
           <w:sz w:val="24"/>
         </w:rPr>
-        <w:t>Pasiguria e shifrave matet me intervale besimi bootstrap, ku rimostrohen depo të plota e jo mostra të veçanta, që një projekt të mos ndahet. Pajtimi mes vetë rishikuesve të MLCQ-së matet mbi çdo çift rishikimesh të së njëjtës mostër, dhe jep tavanin kundrejt të cilit lexohen shifrat e detektorëve.</w:t>
+        <w:t>Pasiguria matet me intervale besimi bootstrap, ku rimostrohen depo të plota e jo mostra të veçanta, që një projekt të mos ndahet. Pajtimi mes vetë rishikuesve të MLCQ-së matet mbi çdo çift rishikimesh të së njëjtës mostër, dhe shërben si tavan për shifrat e detektorëve.</w:t>
       </w:r>
     </w:p>
     <w:p>
@@ -4939,7 +4861,7 @@
           <w:caps w:val="0"/>
           <w:sz w:val="24"/>
         </w:rPr>
-        <w:t>Motori i refaktorimit nuk matet me këto shifra. Për të numërohen vendet e detektuara, ato të transformuara dhe ato të refuzuara sipas arsyes, plus verdikti i verifikimit për secilin rishkrim.</w:t>
+        <w:t>Motori i refaktorimit matet ndryshe: numërohen vendet e detektuara, të transformuara dhe të refuzuara sipas arsyes, me verdiktin e verifikimit për çdo rishkrim.</w:t>
       </w:r>
     </w:p>
     <w:p>
@@ -4955,7 +4877,7 @@
           <w:caps w:val="0"/>
           <w:sz w:val="24"/>
         </w:rPr>
-        <w:t>Si krahasim i jashtëm, i njëjti vlerësim i zbatohet PMD-së (PMD Team, 2026), version 7.27.0, rregullat GodClass dhe DataClass të të cilit zbatojnë strategjitë e Lanza &amp; Marinescu (2006). PMD ekzekutohet pa iu prekur pragjet dhe pikëzohet njësoj si Qasja A; një shkelje përputhet me entitetin sipas emrit të klasës dhe të metodës. PMD analizon një skedar në një kohë, ndaj ATFD-në e llogarit vetëm brenda skedarit, handikap që e favorizon këtë punim; dhe nuk ka rregull për Feature Envy.</w:t>
+        <w:t>Si krahasim i jashtëm, i njëjti vlerësim zbatohet te PMD (PMD Team, 2026), versioni 7.27.0, rregullat GodClass dhe DataClass të të cilit bazohen te strategjitë e Lanza &amp; Marinescu (2006). PMD ekzekutohet me pragjet e veta, pikëzohet njësoj si Qasja A, dhe shkeljet lidhen me entitetet sipas emrit të klasës dhe të metodës. Meqë analizon një skedar në një kohë, ATFD-në e llogarit vetëm brenda skedarit, gjë që e vë në disavantazh; rregull për Feature Envy nuk ka.</w:t>
       </w:r>
     </w:p>
     <w:p>
@@ -4985,7 +4907,7 @@
           <w:caps w:val="0"/>
           <w:sz w:val="24"/>
         </w:rPr>
-        <w:t>Sistemi validohet në katër nivele, dhe asnjë ndryshim nuk quhet i përfunduar pa i kaluar të gjitha:</w:t>
+        <w:t>Sistemi validohet në katër nivele, dhe një ndryshim quhet i përfunduar vetëm kur i kalon të gjitha:</w:t>
       </w:r>
     </w:p>
     <w:p>
@@ -5001,7 +4923,7 @@
           <w:caps w:val="0"/>
           <w:sz w:val="24"/>
         </w:rPr>
-        <w:t>Testet e backend-it me pytest. Vlerat e pritura derivohen me dorë nga fiksturat, me derivimin në koment, dhe jo nga dalja aktuale e kodit. Çdo detektor ka një rast pozitiv, një rast që i plotëson disa kushte por jo të gjitha, dhe një rast kufitar (ndërfaqe, enum, klasë bosh). Çdo transformim testohet që aplikohet saktë, që refuzon kur nuk është i sigurt, dhe që dalja kompilon.</w:t>
+        <w:t>Testet e backend-it me pytest, me vlera të pritura të llogaritura me dorë nga fiksturat dhe jo të marra nga dalja e kodit. Çdo detektor ka një rast pozitiv, një rast që plotëson vetëm disa kushte dhe një rast kufitar (ndërfaqe, enum, klasë bosh); çdo transformim testohet që aplikohet saktë, që refuzon kur nuk është i sigurt dhe që dalja kompilon.</w:t>
       </w:r>
     </w:p>
     <w:p>
@@ -5017,7 +4939,7 @@
           <w:caps w:val="0"/>
           <w:sz w:val="24"/>
         </w:rPr>
-        <w:t>Testet e ndërfaqes me Vitest, dhe testet end-to-end me Playwright, të cilat nisin të dy shërbimet dhe e përdorin aplikacionin si përdorues; një pjesë e tyre kontrollon aksesueshmërinë me axe-core.</w:t>
+        <w:t>Testet e ndërfaqes me Vitest dhe testet end-to-end me Playwright, që e përdorin aplikacionin si përdorues dhe kontrollojnë edhe aksesueshmërinë me axe-core.</w:t>
       </w:r>
     </w:p>
     <w:p>
@@ -5033,7 +4955,7 @@
           <w:caps w:val="0"/>
           <w:sz w:val="24"/>
         </w:rPr>
-        <w:t>Analiza statike e kodit: Ruff për stilin dhe mypy në modalitet strikt, që mbulon edhe skriptet e eksperimenteve, sepse ato prodhojnë numrat e punimit.</w:t>
+        <w:t>Analiza statike: Ruff për stilin dhe mypy në modalitet strikt, që mbulon edhe skriptet e eksperimenteve, sepse ato prodhojnë numrat e punimit.</w:t>
       </w:r>
     </w:p>
     <w:p>
@@ -5049,7 +4971,7 @@
           <w:caps w:val="0"/>
           <w:sz w:val="24"/>
         </w:rPr>
-        <w:t>Integrimi i vazhdueshëm: çdo commit ekzekuton pesë punë të pavarura, për backend-in, ndërfaqen, testet end-to-end, mjetet e Java-s dhe kontrollet e këtij dokumenti (citimet, formati dhe tabela e riprodhimit).</w:t>
+        <w:t>Integrimi i vazhdueshëm: çdo commit ekzekuton pesë punë të pavarura, për backend-in, ndërfaqen, testet end-to-end, mjetet e Java-s dhe kontrollet e dokumentit.</w:t>
       </w:r>
     </w:p>
     <w:p>
@@ -5065,7 +4987,7 @@
           <w:caps w:val="0"/>
           <w:sz w:val="24"/>
         </w:rPr>
-        <w:t>Rregulli kryesor i testimit është se asnjë prag, metrikë apo detektor nuk ndryshohet që të kalojë një test. Kur kodi dhe testi nuk pajtohen, gjendet më parë cili prej tyre është i gabuar. Në verifikimin e fundit, më 22 shtator 2026, kaluan 700 teste të backend-it, me mbulim 96% të kodit, dhe 165 teste të ndërfaqes.</w:t>
+        <w:t>Rregulli kryesor është që asnjë prag, metrikë apo detektor nuk ndryshohet vetëm që të kalojë një test; kur kodi dhe testi nuk pajtohen, gjendet më parë cili është i gabuar. Në verifikimin e fundit, më 22 shtator 2026, kaluan 700 teste të backend-it, me mbulim 96% të kodit, dhe 165 teste të ndërfaqes.</w:t>
       </w:r>
     </w:p>
     <w:p>
@@ -5095,7 +5017,7 @@
           <w:caps w:val="0"/>
           <w:sz w:val="24"/>
         </w:rPr>
-        <w:t>Çdo numër i raportuar në Kapitullin 5 prodhohet nga një skript dhe shkruhet si CSV ose JSON që komitohet. Farat e rastësisë janë të fiksuara, versionet e varësive të pinuara, dhe mjedisi i regjistruar në çdo skedar rezultati.</w:t>
+        <w:t>Çdo numër në punim prodhohet nga një skript dhe ruhet si CSV ose JSON në depo. Farat e rastësisë dhe versionet e varësive janë të fiksuara, dhe mjedisi regjistrohet në çdo skedar rezultati.</w:t>
       </w:r>
     </w:p>
     <w:p>
@@ -5111,7 +5033,7 @@
           <w:caps w:val="0"/>
           <w:sz w:val="24"/>
         </w:rPr>
-        <w:t>Kalimi i shtrenjtë mbi korpusin, 56 minuta për 690 mijë skedarë në matjen e fundit, bëhet një herë dhe prodhon një tabelë veçorish që komitohet. Pragjet nuk hyjnë në atë kalim, ndaj analiza e ndjeshmërisë rirendit detektorët mbi rreshtat e ruajtur në sekonda. Pa këtë ndarje, një fshirje me njëzet konfigurime do të kushtonte mbi tetëmbëdhjetë orë dhe nuk do të bëhej. Radha e plotë e skripteve jepet te Shtojca 8.5.</w:t>
+        <w:t>Kalimi mbi korpusin, afro një orë për rreth 690 mijë skedarë, bëhet një herë dhe prodhon një tabelë veçorish që ruhet në depo. Pragjet nuk hyjnë në këtë kalim, ndaj analiza e ndjeshmërisë i riekzekuton detektorët mbi rreshtat e ruajtur brenda sekondash. Radha e plotë e skripteve është te Shtojca 8.5.</w:t>
       </w:r>
     </w:p>
     <w:p>
@@ -5141,7 +5063,7 @@
           <w:caps w:val="0"/>
           <w:sz w:val="24"/>
         </w:rPr>
-        <w:t>Punimi nuk mbledh të dhëna nga njerëz, ndaj pëlqimi i informuar dhe konfidencialiteti, që kërkohen kur mblidhen të tilla, nuk zbatohen këtu. Të gjitha të dhënat që përdor janë publike: gjykimet e dataset-it MLCQ, të mbledhura dhe të publikuara nga autorët e tij (Madeyski &amp; Lewowski, 2020), dhe kodi i depove Java me burim të hapur të cilave u referohen mostrat.</w:t>
+        <w:t>Punimi nuk mbledh të dhëna nga njerëz, ndaj pëlqimi i informuar dhe konfidencialiteti nuk zbatohen këtu. Të gjitha të dhënat janë publike: gjykimet e MLCQ-së, të mbledhura dhe publikuara nga autorët e saj (Madeyski &amp; Lewowski, 2020), dhe kodi i depove Java me burim të hapur ku ndodhen mostrat.</w:t>
       </w:r>
     </w:p>
     <w:p>
@@ -5157,23 +5079,7 @@
           <w:caps w:val="0"/>
           <w:sz w:val="24"/>
         </w:rPr>
-        <w:t>Kodi i këtyre depove përdoret vetëm si objekt matjeje. Ai nuk ekzekutohet kurrë: analiza e lexon si tekst, dhe verifikimi e kompilon me javac pa e nisur. Korpusi nuk shpërndahet bashkë me punimin, sepse mbahet jashtë depos së kodit; kush do t'i riprodhojë rezultatet e shkarkon nga burimet origjinale me skriptin e parë të Shtojcës 8.5.</w:t>
-      </w:r>
-    </w:p>
-    <w:p>
-      <w:pPr>
-        <w:spacing w:line="360" w:lineRule="auto"/>
-        <w:ind w:firstLine="360"/>
-        <w:jc w:val="both"/>
-      </w:pPr>
-      <w:r>
-        <w:rPr>
-          <w:rFonts w:ascii="Times New Roman" w:hAnsi="Times New Roman" w:eastAsia="Times New Roman"/>
-          <w:b w:val="0"/>
-          <w:caps w:val="0"/>
-          <w:sz w:val="24"/>
-        </w:rPr>
-        <w:t>Rezultatet negative raportohen njësoj si ato pozitive, që numrat e Kapitullit 5 të lexohen si matje dhe jo si argument.</w:t>
+        <w:t>Ky kod përdoret vetëm si objekt matjeje dhe nuk ekzekutohet kurrë: analiza e lexon si tekst, dhe verifikimi e kompilon me javac pa e nisur. Korpusi nuk shpërndahet me punimin; kush do t'i riprodhojë rezultatet e shkarkon nga burimet origjinale me skriptin e parë të Shtojcës 8.5. Rezultatet negative raportohen njësoj si ato pozitive.</w:t>
       </w:r>
     </w:p>
     <w:p>
@@ -5225,6 +5131,7 @@
     </w:p>
     <w:p>
       <w:pPr>
+        <w:keepNext/>
         <w:jc w:val="center"/>
       </w:pPr>
       <w:r>
@@ -5325,6 +5232,7 @@
     </w:p>
     <w:p>
       <w:pPr>
+        <w:keepNext/>
         <w:spacing w:line="240" w:lineRule="auto"/>
         <w:jc w:val="center"/>
       </w:pPr>
@@ -6124,6 +6032,7 @@
     </w:p>
     <w:p>
       <w:pPr>
+        <w:keepNext/>
         <w:spacing w:line="240" w:lineRule="auto"/>
         <w:jc w:val="center"/>
       </w:pPr>
@@ -6528,6 +6437,7 @@
     </w:p>
     <w:p>
       <w:pPr>
+        <w:keepNext/>
         <w:jc w:val="center"/>
       </w:pPr>
       <w:r>
@@ -6628,6 +6538,7 @@
     </w:p>
     <w:p>
       <w:pPr>
+        <w:keepNext/>
         <w:spacing w:line="240" w:lineRule="auto"/>
         <w:jc w:val="center"/>
       </w:pPr>
@@ -7289,6 +7200,7 @@
     </w:p>
     <w:p>
       <w:pPr>
+        <w:keepNext/>
         <w:jc w:val="center"/>
       </w:pPr>
       <w:r>
@@ -7359,6 +7271,7 @@
     </w:p>
     <w:p>
       <w:pPr>
+        <w:keepNext/>
         <w:spacing w:line="240" w:lineRule="auto"/>
         <w:jc w:val="center"/>
       </w:pPr>
@@ -7834,6 +7747,7 @@
     </w:p>
     <w:p>
       <w:pPr>
+        <w:keepNext/>
         <w:spacing w:line="240" w:lineRule="auto"/>
         <w:jc w:val="center"/>
       </w:pPr>
@@ -8392,6 +8306,7 @@
     </w:p>
     <w:p>
       <w:pPr>
+        <w:keepNext/>
         <w:jc w:val="center"/>
       </w:pPr>
       <w:r>
@@ -8462,6 +8377,7 @@
     </w:p>
     <w:p>
       <w:pPr>
+        <w:keepNext/>
         <w:spacing w:line="240" w:lineRule="auto"/>
         <w:jc w:val="center"/>
       </w:pPr>
@@ -9107,6 +9023,7 @@
     </w:p>
     <w:p>
       <w:pPr>
+        <w:keepNext/>
         <w:jc w:val="center"/>
       </w:pPr>
       <w:r>
@@ -9193,6 +9110,7 @@
     </w:p>
     <w:p>
       <w:pPr>
+        <w:keepNext/>
         <w:spacing w:line="240" w:lineRule="auto"/>
         <w:jc w:val="center"/>
       </w:pPr>
@@ -9900,6 +9818,7 @@
     </w:p>
     <w:p>
       <w:pPr>
+        <w:keepNext/>
         <w:spacing w:line="240" w:lineRule="auto"/>
         <w:jc w:val="center"/>
       </w:pPr>
@@ -10273,6 +10192,7 @@
     </w:p>
     <w:p>
       <w:pPr>
+        <w:keepNext/>
         <w:spacing w:line="240" w:lineRule="auto"/>
         <w:jc w:val="center"/>
       </w:pPr>
@@ -10739,6 +10659,7 @@
     </w:p>
     <w:p>
       <w:pPr>
+        <w:keepNext/>
         <w:spacing w:line="240" w:lineRule="auto"/>
         <w:jc w:val="center"/>
       </w:pPr>
@@ -11113,6 +11034,7 @@
     </w:p>
     <w:p>
       <w:pPr>
+        <w:keepNext/>
         <w:spacing w:line="240" w:lineRule="auto"/>
         <w:jc w:val="center"/>
       </w:pPr>
@@ -11409,6 +11331,7 @@
     </w:p>
     <w:p>
       <w:pPr>
+        <w:keepNext/>
         <w:spacing w:line="240" w:lineRule="auto"/>
         <w:jc w:val="center"/>
       </w:pPr>
@@ -11884,6 +11807,7 @@
     </w:p>
     <w:p>
       <w:pPr>
+        <w:keepNext/>
         <w:spacing w:line="240" w:lineRule="auto"/>
         <w:jc w:val="center"/>
       </w:pPr>
@@ -12290,6 +12214,7 @@
     </w:p>
     <w:p>
       <w:pPr>
+        <w:keepNext/>
         <w:spacing w:line="240" w:lineRule="auto"/>
         <w:jc w:val="center"/>
       </w:pPr>
@@ -13698,6 +13623,7 @@
     </w:p>
     <w:p>
       <w:pPr>
+        <w:keepNext/>
         <w:spacing w:line="240" w:lineRule="auto"/>
         <w:jc w:val="center"/>
       </w:pPr>
@@ -14695,6 +14621,7 @@
     </w:p>
     <w:p>
       <w:pPr>
+        <w:keepNext/>
         <w:spacing w:line="240" w:lineRule="auto"/>
         <w:jc w:val="center"/>
       </w:pPr>
@@ -16243,6 +16170,7 @@
     </w:p>
     <w:p>
       <w:pPr>
+        <w:keepNext/>
         <w:spacing w:line="240" w:lineRule="auto"/>
         <w:jc w:val="center"/>
       </w:pPr>
@@ -17060,6 +16988,7 @@
     </w:p>
     <w:p>
       <w:pPr>
+        <w:keepNext/>
         <w:spacing w:line="240" w:lineRule="auto"/>
         <w:jc w:val="center"/>
       </w:pPr>
@@ -17527,6 +17456,7 @@
     </w:p>
     <w:p>
       <w:pPr>
+        <w:keepNext/>
         <w:spacing w:line="240" w:lineRule="auto"/>
         <w:jc w:val="center"/>
       </w:pPr>
@@ -18596,6 +18526,7 @@
     </w:p>
     <w:p>
       <w:pPr>
+        <w:keepNext/>
         <w:spacing w:line="240" w:lineRule="auto"/>
         <w:jc w:val="center"/>
       </w:pPr>
@@ -18783,6 +18714,7 @@
     </w:p>
     <w:p>
       <w:pPr>
+        <w:keepNext/>
         <w:spacing w:line="240" w:lineRule="auto"/>
         <w:jc w:val="center"/>
       </w:pPr>
@@ -19389,6 +19321,7 @@
     </w:p>
     <w:p>
       <w:pPr>
+        <w:keepNext/>
         <w:spacing w:line="240" w:lineRule="auto"/>
         <w:jc w:val="center"/>
       </w:pPr>
@@ -19870,6 +19803,7 @@
     </w:p>
     <w:p>
       <w:pPr>
+        <w:keepNext/>
         <w:spacing w:line="240" w:lineRule="auto"/>
         <w:jc w:val="center"/>
       </w:pPr>
@@ -21805,6 +21739,7 @@
     </w:p>
     <w:p>
       <w:pPr>
+        <w:keepNext/>
         <w:spacing w:line="240" w:lineRule="auto"/>
         <w:jc w:val="center"/>
       </w:pPr>
@@ -22686,6 +22621,7 @@
     </w:p>
     <w:p>
       <w:pPr>
+        <w:keepNext/>
         <w:spacing w:line="240" w:lineRule="auto"/>
         <w:jc w:val="center"/>
       </w:pPr>
@@ -23842,6 +23778,7 @@
     </w:p>
     <w:p>
       <w:pPr>
+        <w:keepNext/>
         <w:jc w:val="center"/>
       </w:pPr>
       <w:r>
@@ -23976,6 +23913,7 @@
     </w:p>
     <w:p>
       <w:pPr>
+        <w:keepNext/>
         <w:spacing w:line="240" w:lineRule="auto"/>
         <w:jc w:val="center"/>
       </w:pPr>
@@ -24733,6 +24671,7 @@
     </w:p>
     <w:p>
       <w:pPr>
+        <w:keepNext/>
         <w:spacing w:line="240" w:lineRule="auto"/>
         <w:jc w:val="center"/>
       </w:pPr>
@@ -25473,6 +25412,7 @@
     </w:p>
     <w:p>
       <w:pPr>
+        <w:keepNext/>
         <w:spacing w:line="240" w:lineRule="auto"/>
         <w:jc w:val="center"/>
       </w:pPr>
@@ -25691,6 +25631,7 @@
     </w:p>
     <w:p>
       <w:pPr>
+        <w:keepNext/>
         <w:spacing w:line="240" w:lineRule="auto"/>
         <w:jc w:val="center"/>
       </w:pPr>
@@ -26442,6 +26383,7 @@
     </w:p>
     <w:p>
       <w:pPr>
+        <w:keepNext/>
         <w:spacing w:line="240" w:lineRule="auto"/>
         <w:jc w:val="center"/>
       </w:pPr>
@@ -27120,6 +27062,7 @@
     </w:p>
     <w:p>
       <w:pPr>
+        <w:keepNext/>
         <w:jc w:val="center"/>
       </w:pPr>
       <w:r>
@@ -27270,6 +27213,7 @@
     </w:p>
     <w:p>
       <w:pPr>
+        <w:keepNext/>
         <w:spacing w:line="240" w:lineRule="auto"/>
         <w:jc w:val="center"/>
       </w:pPr>
@@ -27814,6 +27758,7 @@
     </w:p>
     <w:p>
       <w:pPr>
+        <w:keepNext/>
         <w:jc w:val="center"/>
       </w:pPr>
       <w:r>
@@ -27900,6 +27845,7 @@
     </w:p>
     <w:p>
       <w:pPr>
+        <w:keepNext/>
         <w:spacing w:line="240" w:lineRule="auto"/>
         <w:jc w:val="center"/>
       </w:pPr>
@@ -28476,6 +28422,7 @@
     </w:p>
     <w:p>
       <w:pPr>
+        <w:keepNext/>
         <w:spacing w:line="240" w:lineRule="auto"/>
         <w:jc w:val="center"/>
       </w:pPr>
@@ -28965,6 +28912,7 @@
     </w:p>
     <w:p>
       <w:pPr>
+        <w:keepNext/>
         <w:spacing w:line="240" w:lineRule="auto"/>
         <w:jc w:val="center"/>
       </w:pPr>
@@ -29761,6 +29709,7 @@
     </w:p>
     <w:p>
       <w:pPr>
+        <w:keepNext/>
         <w:spacing w:line="240" w:lineRule="auto"/>
         <w:jc w:val="center"/>
       </w:pPr>
@@ -30575,6 +30524,7 @@
     </w:p>
     <w:p>
       <w:pPr>
+        <w:keepNext/>
         <w:spacing w:line="240" w:lineRule="auto"/>
         <w:jc w:val="center"/>
       </w:pPr>

</xml_diff>

<commit_message>
Rishiko punimin sipas mentores, udhezuesit dhe shabllonit
Referencat u kontrolluan nje nga nje se ekzistojne; u shtuan 12 burime te
verifikuara (44 gjithsej). Kapitulli 5 mban vetem vlera, interpretimi kalon
te Kapitulli 6. Metodologjia shkruhet me holesi, me 8 ekuacione te numeruara
dhe nenkapitullin 4.13 per vlefshmerine. Literatura organizohet sipas ideve.
Hyrja shpjegon me shume problemin brenda 1-1.5 faqeve. Ndreqet fjalia per
foldet e Data Class-it, qe tani lexohet nga skedari (VD-136).
</commit_message>
<xml_diff>
--- a/docs/thesis/Punim_Diplome_Florent_Latifi.docx
+++ b/docs/thesis/Punim_Diplome_Florent_Latifi.docx
@@ -2053,7 +2053,7 @@
           <w:caps w:val="0"/>
           <w:sz w:val="24"/>
         </w:rPr>
-        <w:t>Zhvillimi i një sistemi softuerik nuk përfundon me lëshimin e versionit të parë. Pjesa më e madhe e jetës së tij kalon në mirëmbajtje, ku kodi lexohet dhe ndryshohet vazhdimisht nga zhvillues të ndryshëm. Lehman (1980) e formuloi këtë si ligj: një sistem që përdoret në një mjedis real duhet të ndryshojë vazhdimisht, përndryshe bëhet gradualisht më pak i dobishëm. Prandaj sa lehtë ndryshohet kodi është kosto e përditshme për çdo ekip.</w:t>
+        <w:t>Zhvillimi i një sistemi softuerik nuk përfundon me lëshimin e versionit të parë. Pjesa më e madhe e jetës së tij kalon në mirëmbajtje, ku kodi lexohet dhe ndryshohet vazhdimisht nga zhvillues të ndryshëm, shpesh vite pasi u shkrua dhe nga njerëz që nuk e shkruan vetë. Lehman (1980) e formuloi këtë si ligj: një sistem që përdoret në një mjedis real duhet të ndryshojë vazhdimisht, përndryshe bëhet gradualisht më pak i dobishëm. Po ai vuri re se me çdo ndryshim kompleksiteti i sistemit rritet, përveç kur dikush punon qëllimisht për ta ulur. Prandaj sa lehtë ndryshohet kodi është kosto e përditshme për çdo ekip, dhe ajo kosto rritet me moshën e sistemit.</w:t>
       </w:r>
     </w:p>
     <w:p>
@@ -2069,7 +2069,7 @@
           <w:caps w:val="0"/>
           <w:sz w:val="24"/>
         </w:rPr>
-        <w:t>Një burim i madh i kësaj vështirësie janë code smells, që në vijim quhen edhe erëra të kodit, ose shkurt erëra. Termi është i Kent Beck-ut dhe u përhap me librin Refactoring të Martin Fowler-it, botimi i dytë i të cilit (Fowler, 2018) përdoret në këtë punim. Një erë nuk është gabim, sepse programi kompilohet dhe punon saktë. Është shenjë e një problemi dizajni: një klasë me shumë përgjegjësi të palidhura, një metodë qindra rreshta e gjatë, ose një klasë që mban vetëm të dhëna. Cunningham (1992) e quajti efektin e tyre të grumbulluar borxh teknik: çdo kompromis i vogël në strukturë paguhet me interes në çdo ndryshim të mëvonshëm.</w:t>
+        <w:t>Një burim i madh i kësaj vështirësie janë code smells, që në vijim quhen edhe erëra të kodit, ose shkurt erëra. Termi është i Kent Beck-ut dhe u përhap me librin Refactoring të Martin Fowler-it, botimi i dytë i të cilit (Fowler, 2018) përdoret në këtë punim. Një erë nuk është gabim, sepse programi kompilohet dhe punon saktë. Është shenjë e një problemi dizajni: një klasë me shumë përgjegjësi të palidhura, një metodë qindra rreshta e gjatë, ose një klasë që mban vetëm të dhëna. Cunningham (1992) e quajti efektin e tyre të grumbulluar borxh teknik: çdo kompromis i vogël në strukturë paguhet me interes në çdo ndryshim të mëvonshëm. Studimet empirike e lidhin këtë metaforë me kosto reale, sepse kodi me erëra ka më shumë gjasë të ndryshojë dhe të përmbajë defekte (Palomba et al., 2018).</w:t>
       </w:r>
     </w:p>
     <w:p>
@@ -2085,7 +2085,7 @@
           <w:caps w:val="0"/>
           <w:sz w:val="24"/>
         </w:rPr>
-        <w:t>Zgjidhja e zakonshme është refaktorimi, të cilin Fowler (2018) e përkufizon si ndryshim të strukturës së brendshme të kodit pa ndryshuar sjelljen e tij të jashtme. Por që të refaktorohet, problemi duhet gjetur më parë, dhe duhet ditur cili transformim e heq pa e prishur programin. Në një sistem me qindra klasa kjo nuk bëhet dot me dorë në mënyrë sistematike, dhe dy shqyrtues shpesh nuk pajtohen se çfarë është problem.</w:t>
+        <w:t>Zgjidhja e zakonshme është refaktorimi, të cilin Fowler (2018) e përkufizon si ndryshim të strukturës së brendshme të kodit pa ndryshuar sjelljen e tij të jashtme. Por që të refaktorohet, problemi duhet gjetur më parë, dhe duhet ditur cili transformim e heq pa e prishur programin. Në një sistem me qindra klasa kjo nuk bëhet dot me dorë në mënyrë sistematike. Rishikimi i kodit e kap një erë vetëm kur dikush e sheh dhe ka kohë ta ndreqë, dy shqyrtues shpesh nuk pajtohen se çfarë është problem, dhe një rishkrim me dorë mund ta prishë programin pikërisht aty ku synonte ta përmirësonte. Problemi pra nuk është mungesa e një përkufizimi, por mungesa e një mënyre të përsëritshme për ta zbatuar atë mbi kod real.</w:t>
       </w:r>
     </w:p>
     <w:p>
@@ -2148,7 +2148,7 @@
           <w:caps w:val="0"/>
           <w:sz w:val="24"/>
         </w:rPr>
-        <w:t>Detektimi automatik i code smells dhe refaktorimi studiohen prej më shumë se dy dekadash. Kapitulli i grupon burimet sipas temës dhe mbyllet me hendekun që adreson ky punim.</w:t>
+        <w:t>Detektimi automatik i code smells dhe refaktorimi studiohen prej më shumë se dy dekadash. Shqyrtimi mbështetet te artikuj në revista dhe konferenca me rishikim nga kolegët, te librat që e themeluan fushën dhe te dy shqyrtime sistematike, ai i Sharma &amp; Spinellis (2018) dhe ai i Azeem et al. (2019), të cilat shërbyen edhe si pikënisje për burime të tjera. Burimet u kërkuan kryesisht në IEEE Xplore, ACM Digital Library dhe Springer, dhe grupohen sipas idesë që trajtojnë, jo sipas autorit. Kapitulli nis me atë që është një erë dhe pse ka rëndësi, kalon te mënyrat si matet dhe si detektohet, dhe mbyllet me hendekun që adreson ky punim.</w:t>
       </w:r>
     </w:p>
     <w:p>
@@ -2162,7 +2162,7 @@
           <w:caps w:val="0"/>
           <w:sz w:val="24"/>
         </w:rPr>
-        <w:t>2.1 Përkufizimi dhe matja</w:t>
+        <w:t>2.1 Code smells dhe ndikimi i tyre</w:t>
       </w:r>
     </w:p>
     <w:p>
@@ -2178,7 +2178,7 @@
           <w:caps w:val="0"/>
           <w:sz w:val="24"/>
         </w:rPr>
-        <w:t>Katalogun kanonik e jep Fowler (2018): njëzet e katër erëra, secila me refaktorimet që e adresojnë. Përkufizimi është qëllimisht cilësor. Një erë është simptomë, jo gabim, dhe nëse diçka është problem apo jo varet nga konteksti.</w:t>
+        <w:t>Katalogun kanonik e jep Fowler (2018): njëzet e katër erëra, secila me refaktorimet që e adresojnë. Përkufizimi është qëllimisht cilësor. Një erë është simptomë, jo gabim, dhe nëse diçka është problem apo jo varet nga konteksti. Edhe erërat që duken sasiore, si metoda e gjatë apo klasa e madhe, nuk thonë sa rreshta janë shumë; pikërisht ky boshllëk e detyron çdo mjet të vendosë kufijtë e vet.</w:t>
       </w:r>
     </w:p>
     <w:p>
@@ -2194,7 +2194,7 @@
           <w:caps w:val="0"/>
           <w:sz w:val="24"/>
         </w:rPr>
-        <w:t>Matja sasiore u bë e mundur me suitën e Chidamber &amp; Kemerer (1994), gjashtë metrika për sistemet e orientuara nga objektet: WMC, DIT, NOC, CBO, RFC dhe LCOM. Henderson-Sellers (1996) propozoi një variant të normalizuar të LCOM-it, ndërsa Bieman &amp; Kang (1995) prezantuan TCC-në, që e mat kohezionin me çiftet e metodave që ndajnë të paktën një fushë. Mbi këto metrika ndërtohet pothuajse çdo detektim sasior i mëvonshëm.</w:t>
+        <w:t>A kanë erërat pasoja të matshme? Khomh et al. (2012) detektuan trembëdhjetë antimodele në 54 versione të katër sistemeve Java, ArgoUML, Eclipse, Mylyn dhe Rhino, dhe gjetën se klasat që marrin pjesë në to ndryshojnë dhe përmbajnë defekte më shpesh se klasat e tjera. Palomba et al. (2018) e përsëritën pyetjen në shkallë shumë më të madhe, mbi 395 versione të 30 projekteve me burim të hapur dhe 17 350 raste të validuara me dorë të trembëdhjetë erërave. Erërat që lidhen me kod të gjatë ose të ndërlikuar dolën më të përhapurat, dhe klasat e prekura dolën më të prirura ndaj ndryshimeve dhe defekteve se klasat pa erë.</w:t>
       </w:r>
     </w:p>
     <w:p>
@@ -2210,21 +2210,7 @@
           <w:caps w:val="0"/>
           <w:sz w:val="24"/>
         </w:rPr>
-        <w:t>Sharma &amp; Spinellis (2018), në një shqyrtim sistematik të fushës, vërejnë se përkufizimet e erërave në literaturë nuk janë konsistente, dhe as rezultatet e metodave të detektimit, ndaj mjetet krahasohen me vështirësi.</w:t>
-      </w:r>
-    </w:p>
-    <w:p>
-      <w:pPr>
-        <w:pStyle w:val="Heading2"/>
-      </w:pPr>
-      <w:r>
-        <w:rPr>
-          <w:rFonts w:ascii="Times New Roman" w:hAnsi="Times New Roman" w:eastAsia="Times New Roman"/>
-          <w:b/>
-          <w:caps w:val="0"/>
-          <w:sz w:val="24"/>
-        </w:rPr>
-        <w:t>2.2 Detektimi me rregulla mbi metrika</w:t>
+        <w:t>Efekti nuk është i njëjtë në çdo kontekst. Sjøberg et al. (2013) matën me saktësi kohën që gjashtë zhvillues shpenzuan për të mirëmbajtur katër sisteme Java me funksionalitet të njëjtë, dhe gjetën se efekti i dymbëdhjetë erërave mbi përpjekjen ishte i kufizuar; sipas tyre, zvogëlimi i madhësisë së kodit dhe i numrit të ndryshimeve premtonte më shumë se refaktorimi i erërave. Kjo nuk i bën erërat të parëndësishme, por tregon se madhësia duhet ndarë prej tyre në çdo analizë: një klasë e madhe ndryshon më shpesh edhe kur nuk ka asnjë erë tjetër.</w:t>
       </w:r>
     </w:p>
     <w:p>
@@ -2240,7 +2226,7 @@
           <w:caps w:val="0"/>
           <w:sz w:val="24"/>
         </w:rPr>
-        <w:t>Marinescu (2004) prezantoi strategjitë e detektimit: rregulla që kombinojnë disa metrika me pragje, në vend që të mbështeten te një metrikë e vetme. Lanza &amp; Marinescu (2006) e zgjeruan idenë në një katalog të plotë, ku çdo erë shprehet si kombinim kushtesh mbi metrika, me pragje të nxjerra statistikisht nga dyzet e pesë sisteme Java.</w:t>
+        <w:t>Tufano et al. (2015) ndoqën historikun e 200 projekteve me burim të hapur për të parë kur lindin erërat. Shumica e tyre futen që kur krijohet klasa ose metoda, jo gradualisht gjatë evolucionit, dhe rreth katër të pestat mbijetojnë në sistem. Nëse një erë lind bashkë me kodin, mjeti që e gjen ka më shumë vlerë kur vepron herët, para se kodi të rritet mbi të.</w:t>
       </w:r>
     </w:p>
     <w:p>
@@ -2256,7 +2242,21 @@
           <w:caps w:val="0"/>
           <w:sz w:val="24"/>
         </w:rPr>
-        <w:t>Moha et al. (2010) propozuan DECOR-in, një metodë ku erërat përshkruhen në një gjuhë specifikimi dhe detektorët gjenerohen nga përshkrimet. Avantazhi i qasjeve me rregulla është se arsyeja e çdo detektimi lexohet qartë. Dobësia është ndjeshmëria ndaj pragjeve, që kalibrohen me vështirësi jashtë korpusit ku u nxorën.</w:t>
+        <w:t>Mbetet pyetja nëse zhvilluesit i shohin erërat si probleme reale. Yamashita &amp; Moonen (2013) anketuan 85 zhvillues profesionistë për njohjen, interesin dhe rëndësinë që u japin erërave, duke nisur nga vërejtja se vlera e tyre si koncept i cilësisë mbetej e diskutueshme nga pikëpamja e zhvilluesit. Pyetja ka rëndësi për çdo detektor: ai vlen aq sa zhvilluesi e njeh gjetjen e tij si problem.</w:t>
+      </w:r>
+    </w:p>
+    <w:p>
+      <w:pPr>
+        <w:pStyle w:val="Heading2"/>
+      </w:pPr>
+      <w:r>
+        <w:rPr>
+          <w:rFonts w:ascii="Times New Roman" w:hAnsi="Times New Roman" w:eastAsia="Times New Roman"/>
+          <w:b/>
+          <w:caps w:val="0"/>
+          <w:sz w:val="24"/>
+        </w:rPr>
+        <w:t>2.2 Matja e cilësisë së dizajnit</w:t>
       </w:r>
     </w:p>
     <w:p>
@@ -2272,21 +2272,7 @@
           <w:caps w:val="0"/>
           <w:sz w:val="24"/>
         </w:rPr>
-        <w:t>Palomba et al. (2015) i detektojnë erërat me HIST nga historiku i ndryshimeve, jo nga një pamje e vetme e kodit. Kështu kapin diçka që metrikat statike nuk e shohin, por u duhet historiku i plotë i depos.</w:t>
-      </w:r>
-    </w:p>
-    <w:p>
-      <w:pPr>
-        <w:pStyle w:val="Heading2"/>
-      </w:pPr>
-      <w:r>
-        <w:rPr>
-          <w:rFonts w:ascii="Times New Roman" w:hAnsi="Times New Roman" w:eastAsia="Times New Roman"/>
-          <w:b/>
-          <w:caps w:val="0"/>
-          <w:sz w:val="24"/>
-        </w:rPr>
-        <w:t>2.3 Detektimi me mësim të makinës</w:t>
+        <w:t>Matja sasiore e sistemeve me objekte u bë e mundur me suitën e Chidamber &amp; Kemerer (1994), gjashtë metrika për klasën: WMC, DIT, NOC, CBO, RFC dhe LCOM. WMC e peshon klasën me kompleksitetin e metodave të saj, DIT dhe NOC e vendosin në hierarkinë e trashëgimisë, CBO dhe RFC matin sa varet nga klasat e tjera, dhe LCOM mat sa pak i ndajnë metodat fushat e saj. Kompleksiteti i një metode matet zakonisht me numrin ciklomatik të McCabe (1976), pra me numrin e shtigjeve të pavarura në grafin e saj të kontrollit.</w:t>
       </w:r>
     </w:p>
     <w:p>
@@ -2302,7 +2288,7 @@
           <w:caps w:val="0"/>
           <w:sz w:val="24"/>
         </w:rPr>
-        <w:t>Arcelli Fontana et al. (2016) krahasuan gjashtëmbëdhjetë algoritme të mësimit të makinës mbi katër erëra dhe raportuan performancë të lartë për të gjitha në validimin e kryqëzuar, me J48 dhe Random Forest si më të mirat. Studimi u bë pikë referimi për shumë punime pasuese.</w:t>
+        <w:t>LCOM-i origjinal rritet me katrorin e numrit të metodave dhe nuk krahason dot klasa me madhësi të ndryshme. Henderson-Sellers (1996) propozoi një variant të normalizuar mes 0 dhe 1, ndërsa Bieman &amp; Kang (1995) prezantuan TCC-në, që e mat kohezionin me pjesën e çifteve të metodave që ndajnë të paktën një fushë. Mbi këto metrika ndërtohet pothuajse çdo detektim sasior i mëvonshëm.</w:t>
       </w:r>
     </w:p>
     <w:p>
@@ -2318,7 +2304,7 @@
           <w:caps w:val="0"/>
           <w:sz w:val="24"/>
         </w:rPr>
-        <w:t>Di Nucci et al. (2018) vunë re megjithatë se aty çdo dataset kishte raste të një lloji të vetëm ere. Kur e përsëritën eksperimentin me dataset-e ku bashkëjetojnë disa erëra, performanca ra ndjeshëm. Pra shifra e raportuar varet nga mënyra si ndërtohet bashkësia e vlerësimit, jo vetëm nga algoritmi.</w:t>
+        <w:t>Lanza &amp; Marinescu (2006) i organizojnë metrikat në tri përmasa: madhësinë dhe kompleksitetin, lidhjen me klasat e tjera, dhe trashëgiminë. Ata u shtuan edhe metrika të reja, si ATFD, LAA dhe FDP, që nuk matin madhësinë e një entiteti por marrëdhënien e tij me të dhënat e klasave të tjera. Këto janë metrikat që u duhen erërave të bashkëpunimit, si Feature Envy, të cilat nuk i kap dot asnjë metrikë madhësie.</w:t>
       </w:r>
     </w:p>
     <w:p>
@@ -2334,7 +2320,21 @@
           <w:caps w:val="0"/>
           <w:sz w:val="24"/>
         </w:rPr>
-        <w:t>E njëjta arsye qëndron pas njërës nga zgjedhjet kryesore të këtij punimi: trajnimi dhe testimi ndahen sipas depos, jo rastësisht sipas rreshtave. Mostrat e një depoje kanë të njëjtët autorë, të njëjtat konvencione e shpesh kod të kopjuar, dhe një ndarje e rastësishme i vendos në të dyja anët, duke i fryrë shifrat.</w:t>
+        <w:t>Sharma &amp; Spinellis (2018), në një shqyrtim sistematik të fushës, vërejnë se përkufizimet e erërave në literaturë nuk janë konsistente, dhe as rezultatet e metodave të detektimit, ndaj mjetet krahasohen me vështirësi. Ata i ndajnë metodat e detektimit në disa familje, ndër të cilat ato që mbështeten te metrikat, te rregullat, te historiku i ndryshimeve dhe te mësimi i makinës; nënkapitujt që vijnë ndjekin këtë ndarje.</w:t>
+      </w:r>
+    </w:p>
+    <w:p>
+      <w:pPr>
+        <w:pStyle w:val="Heading2"/>
+      </w:pPr>
+      <w:r>
+        <w:rPr>
+          <w:rFonts w:ascii="Times New Roman" w:hAnsi="Times New Roman" w:eastAsia="Times New Roman"/>
+          <w:b/>
+          <w:caps w:val="0"/>
+          <w:sz w:val="24"/>
+        </w:rPr>
+        <w:t>2.3 Detektimi me rregulla mbi metrika</w:t>
       </w:r>
     </w:p>
     <w:p>
@@ -2350,21 +2350,7 @@
           <w:caps w:val="0"/>
           <w:sz w:val="24"/>
         </w:rPr>
-        <w:t>Azeem et al. (2019), në një shqyrtim sistematik me meta-analizë, gjetën vetëm pesëmbëdhjetë studime që përdorin mësimin e makinës për këtë qëllim, nga mbi dy mijë punime fillestare, dhe përfundojnë se fusha ka ende vend për përmirësim.</w:t>
-      </w:r>
-    </w:p>
-    <w:p>
-      <w:pPr>
-        <w:pStyle w:val="Heading2"/>
-      </w:pPr>
-      <w:r>
-        <w:rPr>
-          <w:rFonts w:ascii="Times New Roman" w:hAnsi="Times New Roman" w:eastAsia="Times New Roman"/>
-          <w:b/>
-          <w:caps w:val="0"/>
-          <w:sz w:val="24"/>
-        </w:rPr>
-        <w:t>2.4 E vërteta bazë dhe subjektiviteti</w:t>
+        <w:t>Marinescu (2004) prezantoi strategjitë e detektimit: rregulla që kombinojnë disa metrika me pragje, në vend që të mbështeten te një metrikë e vetme. Një strategji filtron fillimisht entitetet që e kalojnë secilin prag dhe pastaj i kombinon filtrat me «dhe» dhe «ose», ndaj arsyeja e çdo detektimi mbetet e lexueshme si kusht. Lanza &amp; Marinescu (2006) e zgjeruan idenë në një katalog të plotë, ku çdo erë shprehet si kombinim kushtesh mbi metrika, me pragje të nxjerra statistikisht nga dyzet e pesë sisteme Java.</w:t>
       </w:r>
     </w:p>
     <w:p>
@@ -2380,7 +2366,7 @@
           <w:caps w:val="0"/>
           <w:sz w:val="24"/>
         </w:rPr>
-        <w:t>Çdo vlerësim i detektimit ka nevojë për një të vërtetë bazë, dhe këtu del një problem themelor. Mäntylä &amp; Lassenius (2006) treguan se vlerësimi i zhvilluesve për praninë e një ere është subjektiv dhe se ata shpesh nuk pajtohen.</w:t>
+        <w:t>Pragjet e tyre janë dy llojesh. Ato statistikore, si «i lartë» dhe «shumë i lartë», nxirren nga mesatarja dhe devijimi standard i metrikës në korpusin e tyre. Ato me kuptim të zakonshëm, si «pak» ose «një e treta», vijnë nga mënyra si njerëzit i përdorin këto fjalë. Të parat varen pra nga korpusi ku u matën, dhe kjo i bën pyetje të hapur për çdo korpus tjetër.</w:t>
       </w:r>
     </w:p>
     <w:p>
@@ -2396,21 +2382,7 @@
           <w:caps w:val="0"/>
           <w:sz w:val="24"/>
         </w:rPr>
-        <w:t>Madeyski &amp; Lewowski (2020) ndërtuan MLCQ-në, një bashkësi mostrash Java të etiketuara nga zhvillues profesionistë për katër erëra, me ashpërsi në shkallën none/minor/major/critical. Ky punim e përdor MLCQ-në si të vërtetë bazë, dhe mospajtimin mes rishikuesve e raporton si të dhënë, në vend që ta pastrojë si zhurmë.</w:t>
-      </w:r>
-    </w:p>
-    <w:p>
-      <w:pPr>
-        <w:pStyle w:val="Heading2"/>
-      </w:pPr>
-      <w:r>
-        <w:rPr>
-          <w:rFonts w:ascii="Times New Roman" w:hAnsi="Times New Roman" w:eastAsia="Times New Roman"/>
-          <w:b/>
-          <w:caps w:val="0"/>
-          <w:sz w:val="24"/>
-        </w:rPr>
-        <w:t>2.5 Refaktorimi i automatizuar</w:t>
+        <w:t>Moha et al. (2010) propozuan DECOR-in, një metodë ku erërat përshkruhen në një gjuhë specifikimi dhe detektorët gjenerohen nga përshkrimet; zbatimi i saj u vlerësua me precizion dhe recall mbi sisteme me burim të hapur. Avantazhi i qasjeve me rregulla është se arsyeja e çdo detektimi lexohet qartë. Dobësia është ndjeshmëria ndaj pragjeve, që kalibrohen me vështirësi jashtë korpusit ku u nxorën.</w:t>
       </w:r>
     </w:p>
     <w:p>
@@ -2426,7 +2398,7 @@
           <w:caps w:val="0"/>
           <w:sz w:val="24"/>
         </w:rPr>
-        <w:t>Opdyke (1992), në tezën e doktoratës, e formalizoi refaktorimin me nocionin e parakushteve: një transformim është i sigurt vetëm nëse disa kushte vërtetohen para se të aplikohet. Mbi këtë nocion mbështetet çdo motor refaktorimi që pretendon se e ruan sjelljen.</w:t>
+        <w:t>Palomba et al. (2015) i detektojnë erërat me HIST nga historiku i ndryshimeve, jo nga një pamje e vetme e kodit. Për pesë erëra, ndër to Blob dhe Feature Envy, ata treguan se historiku kap raste që analiza e kodit nuk i sheh, por qasja kërkon historikun e plotë të depos, që jo çdo projekt e ka dhe jo çdo dataset e ruan.</w:t>
       </w:r>
     </w:p>
     <w:p>
@@ -2442,7 +2414,21 @@
           <w:caps w:val="0"/>
           <w:sz w:val="24"/>
         </w:rPr>
-        <w:t>Tsantalis &amp; Chatzigeorgiou (2009) propozuan një metodë për gjetjen e rasteve të Move Method si zgjidhje për Feature Envy. Algoritmi mat distancën mes entiteteve dhe klasave, propozon vetëm lëvizje që kalojnë një bashkësi parakushtesh, dhe vendimin e fundit ia lë projektuesit.</w:t>
+        <w:t>Mjetet që përdoren në praktikë, si PMD (PMD Team, 2026), zbatojnë kryesisht këtë familje: rregulla me pragje të fiksuara, që zhvilluesi mund t'i ndryshojë por rrallë i ndryshon. Rezultati i tyre mbetet pra aq i mirë sa janë pragjet e parazgjedhura për kodin ku zbatohen.</w:t>
+      </w:r>
+    </w:p>
+    <w:p>
+      <w:pPr>
+        <w:pStyle w:val="Heading2"/>
+      </w:pPr>
+      <w:r>
+        <w:rPr>
+          <w:rFonts w:ascii="Times New Roman" w:hAnsi="Times New Roman" w:eastAsia="Times New Roman"/>
+          <w:b/>
+          <w:caps w:val="0"/>
+          <w:sz w:val="24"/>
+        </w:rPr>
+        <w:t>2.4 Detektimi me mësim të makinës</w:t>
       </w:r>
     </w:p>
     <w:p>
@@ -2458,21 +2444,7 @@
           <w:caps w:val="0"/>
           <w:sz w:val="24"/>
         </w:rPr>
-        <w:t>Murphy-Hill et al. (2012), me të dhëna nga mbi trembëdhjetë mijë zhvillues, gjetën se refaktorimi shpesh përzihet me ndryshime të tjera dhe rrallë përmendet në mesazhet e commit-eve, ndaj matet me vështirësi nga historiku. Silva et al. (2016) i pyetën zhvilluesit pse refaktorojnë dhe gjetën se arsyet janë kryesisht praktike, të lidhura me një ndryshim konkret që duhet bërë.</w:t>
-      </w:r>
-    </w:p>
-    <w:p>
-      <w:pPr>
-        <w:pStyle w:val="Heading2"/>
-      </w:pPr>
-      <w:r>
-        <w:rPr>
-          <w:rFonts w:ascii="Times New Roman" w:hAnsi="Times New Roman" w:eastAsia="Times New Roman"/>
-          <w:b/>
-          <w:caps w:val="0"/>
-          <w:sz w:val="24"/>
-        </w:rPr>
-        <w:t>2.6 Hendeku</w:t>
+        <w:t>Ideja e mësimit të makinës është që pragjet t'i mësojë modeli nga shembuj të etiketuar, në vend që t'i vendosë njeriu. Arcelli Fontana et al. (2016) kryen një nga eksperimentet më të mëdha të këtij lloji: gjashtëmbëdhjetë algoritme mbi katër erëra (Data Class, Large Class, Feature Envy dhe Long Method), me 1 986 raste të validuara me dorë nga 74 sisteme. Ata raportuan performancë të lartë për shumicën e algoritmeve në validimin e kryqëzuar, me J48 dhe Random Forest si më të mirat dhe makinat me vektorë mbështetës si më të dobëtat. Studimi u bë pikë referimi për shumë punime pasuese.</w:t>
       </w:r>
     </w:p>
     <w:p>
@@ -2488,7 +2460,241 @@
           <w:caps w:val="0"/>
           <w:sz w:val="24"/>
         </w:rPr>
-        <w:t>Nga ky shqyrtim dalin tri vërejtje. Qasja me rregulla dhe ajo me mësim makine rrallë vlerësohen mbi të njëjtën të vërtetë bazë dhe me të njëjtat metrika, ndaj krahasimi i drejtpërdrejtë mungon. Jo çdo punim e thotë qartë si e ndan bashkësinë e vlerësimit, edhe pse shifra e raportuar varet pikërisht prej saj. Detektimi dhe refaktorimi, nga ana tjetër, trajtohen zakonisht veç e veç, ndaj mbetet pa përgjigje empirike nëse një erë e gjetur mund të ndreqet edhe automatikisht. Kapitulli 3 i kthen këto vërejtje në problemin dhe pyetjet e punimit.</w:t>
+        <w:t>Di Nucci et al. (2018) vunë re megjithatë se aty çdo dataset kishte raste të një lloji të vetëm ere. Kur e përsëritën eksperimentin me dataset-e ku bashkëjetojnë disa erëra, performanca ra ndjeshëm. Pra shifra e raportuar varet nga mënyra si ndërtohet bashkësia e vlerësimit, jo vetëm nga algoritmi.</w:t>
+      </w:r>
+    </w:p>
+    <w:p>
+      <w:pPr>
+        <w:spacing w:line="360" w:lineRule="auto"/>
+        <w:ind w:firstLine="360"/>
+        <w:jc w:val="both"/>
+      </w:pPr>
+      <w:r>
+        <w:rPr>
+          <w:rFonts w:ascii="Times New Roman" w:hAnsi="Times New Roman" w:eastAsia="Times New Roman"/>
+          <w:b w:val="0"/>
+          <w:caps w:val="0"/>
+          <w:sz w:val="24"/>
+        </w:rPr>
+        <w:t>E njëjta arsye qëndron pas njërës nga zgjedhjet kryesore të këtij punimi: trajnimi dhe testimi ndahen sipas depos, jo rastësisht sipas rreshtave. Mostrat e një depoje kanë të njëjtët autorë, të njëjtat konvencione e shpesh kod të kopjuar, dhe një ndarje e rastësishme i vendos në të dyja anët, duke i fryrë shifrat.</w:t>
+      </w:r>
+    </w:p>
+    <w:p>
+      <w:pPr>
+        <w:spacing w:line="360" w:lineRule="auto"/>
+        <w:ind w:firstLine="360"/>
+        <w:jc w:val="both"/>
+      </w:pPr>
+      <w:r>
+        <w:rPr>
+          <w:rFonts w:ascii="Times New Roman" w:hAnsi="Times New Roman" w:eastAsia="Times New Roman"/>
+          <w:b w:val="0"/>
+          <w:caps w:val="0"/>
+          <w:sz w:val="24"/>
+        </w:rPr>
+        <w:t>Azeem et al. (2019), në një shqyrtim sistematik me meta-analizë, gjetën vetëm pesëmbëdhjetë studime që përdorin mësimin e makinës për këtë qëllim, nga mbi dy mijë punime fillestare, dhe përfundojnë se fusha ka ende vend për përmirësim. Ata e vendosin mësimin e makinës si përgjigje ndaj tri kufizimeve të detektorëve me rregulla: subjektivitetit të zhvilluesve, pajtimit të ulët mes detektorëve të ndryshëm dhe vështirësisë për të gjetur pragje të mira.</w:t>
+      </w:r>
+    </w:p>
+    <w:p>
+      <w:pPr>
+        <w:spacing w:line="360" w:lineRule="auto"/>
+        <w:ind w:firstLine="360"/>
+        <w:jc w:val="both"/>
+      </w:pPr>
+      <w:r>
+        <w:rPr>
+          <w:rFonts w:ascii="Times New Roman" w:hAnsi="Times New Roman" w:eastAsia="Times New Roman"/>
+          <w:b w:val="0"/>
+          <w:caps w:val="0"/>
+          <w:sz w:val="24"/>
+        </w:rPr>
+        <w:t>Madeyski &amp; Lewowski (2023) trajnuan klasifikues mbi MLCQ-në, me metrikat e mjeteve të përgjithshme të analizës statike si veçori, dhe raportuan koeficientin e Matthews-it në vend të saktësisë. Punimi i tyre është krahasimi më i afërt me këtë punim, sepse përdor të njëjtën të vërtetë bazë, dhe Kapitulli 6 i vë rezultatet përballë.</w:t>
+      </w:r>
+    </w:p>
+    <w:p>
+      <w:pPr>
+        <w:spacing w:line="360" w:lineRule="auto"/>
+        <w:ind w:firstLine="360"/>
+        <w:jc w:val="both"/>
+      </w:pPr>
+      <w:r>
+        <w:rPr>
+          <w:rFonts w:ascii="Times New Roman" w:hAnsi="Times New Roman" w:eastAsia="Times New Roman"/>
+          <w:b w:val="0"/>
+          <w:caps w:val="0"/>
+          <w:sz w:val="24"/>
+        </w:rPr>
+        <w:t>Një kundërshtim i përsëritur ndaj modeleve është se nuk e shpjegojnë vendimin e tyre. Rëndësia e veçorive jep një përgjigje për tërë bashkësinë, por mënyra si llogaritet ka rëndësi: Strobl et al. (2007) treguan se rëndësia e bazuar te papastërtia në pyjet e rastësishme anon nga veçoritë me shumë vlera të mundshme, dhe propozuan matje që e shmangin këtë anim.</w:t>
+      </w:r>
+    </w:p>
+    <w:p>
+      <w:pPr>
+        <w:pStyle w:val="Heading2"/>
+      </w:pPr>
+      <w:r>
+        <w:rPr>
+          <w:rFonts w:ascii="Times New Roman" w:hAnsi="Times New Roman" w:eastAsia="Times New Roman"/>
+          <w:b/>
+          <w:caps w:val="0"/>
+          <w:sz w:val="24"/>
+        </w:rPr>
+        <w:t>2.5 E vërteta bazë dhe subjektiviteti</w:t>
+      </w:r>
+    </w:p>
+    <w:p>
+      <w:pPr>
+        <w:spacing w:line="360" w:lineRule="auto"/>
+        <w:ind w:firstLine="360"/>
+        <w:jc w:val="both"/>
+      </w:pPr>
+      <w:r>
+        <w:rPr>
+          <w:rFonts w:ascii="Times New Roman" w:hAnsi="Times New Roman" w:eastAsia="Times New Roman"/>
+          <w:b w:val="0"/>
+          <w:caps w:val="0"/>
+          <w:sz w:val="24"/>
+        </w:rPr>
+        <w:t>Çdo vlerësim i detektimit ka nevojë për një të vërtetë bazë, dhe këtu del një problem themelor. Mäntylä &amp; Lassenius (2006), në një studim rasti në një kompani finlandeze produktesh softuerike, treguan se vlerësimi i zhvilluesve për praninë e një ere është subjektiv dhe se vlerësues të ndryshëm shpesh nuk pajtohen për të njëjtin modul.</w:t>
+      </w:r>
+    </w:p>
+    <w:p>
+      <w:pPr>
+        <w:spacing w:line="360" w:lineRule="auto"/>
+        <w:ind w:firstLine="360"/>
+        <w:jc w:val="both"/>
+      </w:pPr>
+      <w:r>
+        <w:rPr>
+          <w:rFonts w:ascii="Times New Roman" w:hAnsi="Times New Roman" w:eastAsia="Times New Roman"/>
+          <w:b w:val="0"/>
+          <w:caps w:val="0"/>
+          <w:sz w:val="24"/>
+        </w:rPr>
+        <w:t>Madeyski &amp; Lewowski (2020) ndërtuan MLCQ-në, një bashkësi mostrash Java të etiketuara nga zhvillues profesionistë për katër erëra, me ashpërsi në shkallën none/minor/major/critical. Mostrat vijnë nga projekte me burim të hapur të zgjedhura për rëndësi industriale, dhe për çdo rishikues publikohet edhe profili i përvojës së tij, ndaj çdo gjykim mund të lidhet me atë që e dha. Ky punim e përdor MLCQ-në si të vërtetë bazë, dhe mospajtimin mes rishikuesve e raporton si të dhënë, në vend që ta pastrojë si zhurmë.</w:t>
+      </w:r>
+    </w:p>
+    <w:p>
+      <w:pPr>
+        <w:pStyle w:val="Heading2"/>
+      </w:pPr>
+      <w:r>
+        <w:rPr>
+          <w:rFonts w:ascii="Times New Roman" w:hAnsi="Times New Roman" w:eastAsia="Times New Roman"/>
+          <w:b/>
+          <w:caps w:val="0"/>
+          <w:sz w:val="24"/>
+        </w:rPr>
+        <w:t>2.6 Refaktorimi i automatizuar</w:t>
+      </w:r>
+    </w:p>
+    <w:p>
+      <w:pPr>
+        <w:spacing w:line="360" w:lineRule="auto"/>
+        <w:ind w:firstLine="360"/>
+        <w:jc w:val="both"/>
+      </w:pPr>
+      <w:r>
+        <w:rPr>
+          <w:rFonts w:ascii="Times New Roman" w:hAnsi="Times New Roman" w:eastAsia="Times New Roman"/>
+          <w:b w:val="0"/>
+          <w:caps w:val="0"/>
+          <w:sz w:val="24"/>
+        </w:rPr>
+        <w:t>Opdyke (1992), në tezën e doktoratës, e formalizoi refaktorimin me nocionin e parakushteve: një transformim është i sigurt vetëm nëse disa kushte vërtetohen para se të aplikohet. Mbi këtë nocion mbështetet çdo motor refaktorimi që pretendon se e ruan sjelljen.</w:t>
+      </w:r>
+    </w:p>
+    <w:p>
+      <w:pPr>
+        <w:spacing w:line="360" w:lineRule="auto"/>
+        <w:ind w:firstLine="360"/>
+        <w:jc w:val="both"/>
+      </w:pPr>
+      <w:r>
+        <w:rPr>
+          <w:rFonts w:ascii="Times New Roman" w:hAnsi="Times New Roman" w:eastAsia="Times New Roman"/>
+          <w:b w:val="0"/>
+          <w:caps w:val="0"/>
+          <w:sz w:val="24"/>
+        </w:rPr>
+        <w:t>Mens &amp; Tourwé (2004), në shqyrtimin e tyre të fushës, e ndajnë procesin e refaktorimit në disa veprimtari: gjetja e vendit që duhet refaktoruar, zgjedhja e transformimit, garantimi që sjellja ruhet, aplikimi, vlerësimi i efektit mbi cilësinë, dhe ruajtja e përputhjes me artefaktet e tjera. Mjetet zakonisht mbulojnë vetëm aplikimin; ky punim synon të lidhë gjetjen, aplikimin dhe matjen e efektit në një zinxhir të vetëm.</w:t>
+      </w:r>
+    </w:p>
+    <w:p>
+      <w:pPr>
+        <w:spacing w:line="360" w:lineRule="auto"/>
+        <w:ind w:firstLine="360"/>
+        <w:jc w:val="both"/>
+      </w:pPr>
+      <w:r>
+        <w:rPr>
+          <w:rFonts w:ascii="Times New Roman" w:hAnsi="Times New Roman" w:eastAsia="Times New Roman"/>
+          <w:b w:val="0"/>
+          <w:caps w:val="0"/>
+          <w:sz w:val="24"/>
+        </w:rPr>
+        <w:t>Tsantalis &amp; Chatzigeorgiou (2009) propozuan një metodë për gjetjen e rasteve të Move Method si zgjidhje për Feature Envy. Algoritmi mat distancën mes entiteteve dhe klasave, propozon vetëm lëvizje që kalojnë një bashkësi parakushtesh, dhe vendimin e fundit ia lë projektuesit.</w:t>
+      </w:r>
+    </w:p>
+    <w:p>
+      <w:pPr>
+        <w:spacing w:line="360" w:lineRule="auto"/>
+        <w:ind w:firstLine="360"/>
+        <w:jc w:val="both"/>
+      </w:pPr>
+      <w:r>
+        <w:rPr>
+          <w:rFonts w:ascii="Times New Roman" w:hAnsi="Times New Roman" w:eastAsia="Times New Roman"/>
+          <w:b w:val="0"/>
+          <w:caps w:val="0"/>
+          <w:sz w:val="24"/>
+        </w:rPr>
+        <w:t>Murphy-Hill et al. (2012), me të dhëna nga mbi trembëdhjetë mijë zhvillues, gjetën se refaktorimi shpesh përzihet me ndryshime të tjera dhe rrallë përmendet në mesazhet e commit-eve, ndaj matet me vështirësi nga historiku. Silva et al. (2016) i pyetën zhvilluesit pse refaktorojnë dhe gjetën se arsyet janë kryesisht praktike, të lidhura me një ndryshim konkret që duhet bërë.</w:t>
+      </w:r>
+    </w:p>
+    <w:p>
+      <w:pPr>
+        <w:spacing w:line="360" w:lineRule="auto"/>
+        <w:ind w:firstLine="360"/>
+        <w:jc w:val="both"/>
+      </w:pPr>
+      <w:r>
+        <w:rPr>
+          <w:rFonts w:ascii="Times New Roman" w:hAnsi="Times New Roman" w:eastAsia="Times New Roman"/>
+          <w:b w:val="0"/>
+          <w:caps w:val="0"/>
+          <w:sz w:val="24"/>
+        </w:rPr>
+        <w:t>Lidhja mes refaktorimit dhe erërave është më e dobët nga sa pritet. Bavota et al. (2015), duke ndjekur refaktorimet në historikun e sistemeve me burim të hapur, gjetën se vetëm 42% e refaktorimeve prekin entitete me erë, dhe vetëm 7% e tyre e heqin erën nga klasa. Refaktorimi që bëjnë zhvilluesit, pra, nuk është në shumicën e rasteve ndreqje e një ere, dhe as ndreqja e një ere nuk është domosdoshmërisht e suksesshme; kjo e bën të nevojshme që çdo rishkrim automatik të matet pas aplikimit.</w:t>
+      </w:r>
+    </w:p>
+    <w:p>
+      <w:pPr>
+        <w:pStyle w:val="Heading2"/>
+      </w:pPr>
+      <w:r>
+        <w:rPr>
+          <w:rFonts w:ascii="Times New Roman" w:hAnsi="Times New Roman" w:eastAsia="Times New Roman"/>
+          <w:b/>
+          <w:caps w:val="0"/>
+          <w:sz w:val="24"/>
+        </w:rPr>
+        <w:t>2.7 Hendeku</w:t>
+      </w:r>
+    </w:p>
+    <w:p>
+      <w:pPr>
+        <w:spacing w:line="360" w:lineRule="auto"/>
+        <w:ind w:firstLine="360"/>
+        <w:jc w:val="both"/>
+      </w:pPr>
+      <w:r>
+        <w:rPr>
+          <w:rFonts w:ascii="Times New Roman" w:hAnsi="Times New Roman" w:eastAsia="Times New Roman"/>
+          <w:b w:val="0"/>
+          <w:caps w:val="0"/>
+          <w:sz w:val="24"/>
+        </w:rPr>
+        <w:t>Nga ky shqyrtim dalin tri vërejtje. Qasja me rregulla dhe ajo me mësim makine rrallë vlerësohen mbi të njëjtën të vërtetë bazë dhe me të njëjtat metrika, ndaj krahasimi i drejtpërdrejtë mungon. Jo çdo punim e thotë qartë si e ndan bashkësinë e vlerësimit, edhe pse shifra e raportuar varet pikërisht prej saj. Detektimi dhe refaktorimi, nga ana tjetër, trajtohen zakonisht veç e veç, ndaj mbetet pa përgjigje empirike nëse një erë e gjetur mund të ndreqet edhe automatikisht, dhe nëse ndreqja e heq vërtet. Kapitulli 3 i kthen këto vërejtje në problemin dhe pyetjet e punimit.</w:t>
       </w:r>
     </w:p>
     <w:p>
@@ -2553,7 +2759,7 @@
           <w:caps w:val="0"/>
           <w:sz w:val="24"/>
         </w:rPr>
-        <w:t xml:space="preserve"> Identifikimi me dorë nuk shkallëzohet, dhe mjetet ekzistuese zakonisht vetëm njoftojnë, me pragje të kalibruara në projekte të tjera (Kapitulli 1). Studimet rrallë i vënë dy qasjet përballë njëra-tjetrës, dhe nuk matin sa nga erërat e gjetura ndreqen dot automatikisht (Nënkapitulli 2.6).</w:t>
+        <w:t xml:space="preserve"> Identifikimi me dorë nuk shkallëzohet, dhe mjetet ekzistuese zakonisht vetëm njoftojnë, me pragje të kalibruara në projekte të tjera (Kapitulli 1). Studimet rrallë i vënë dy qasjet përballë njëra-tjetrës, dhe nuk matin sa nga erërat e gjetura ndreqen dot automatikisht (Nënkapitulli 2.7).</w:t>
       </w:r>
     </w:p>
     <w:p>
@@ -3003,7 +3209,7 @@
           <w:caps w:val="0"/>
           <w:sz w:val="24"/>
         </w:rPr>
-        <w:t>Ky kapitull përshkruan çfarë u ndërtua dhe si matet: sistemin (4.1–4.2), hapat e eksperimentit sipas radhës (4.3–4.9), dhe validimin, riprodhueshmërinë e etikën (4.10–4.12).</w:t>
+        <w:t>Ky kapitull përshkruan si u ndërtua sistemi dhe si u krye eksperimenti, me aq hollësi sa një lexues tjetër ta përsërisë. Radha ndjek rrugën e të dhënave: arkitektura dhe teknologjitë (4.1–4.2), korpusi dhe matja (4.3–4.4), tri qasjet (4.5–4.7), ndërfaqja (4.8), mënyra e vlerësimit (4.9), validimi i sistemit (4.10), riprodhueshmëria dhe mjedisi (4.11), etika (4.12) dhe kërcënimet ndaj vlefshmërisë (4.13). Rezultatet nuk jepen këtu; ato janë te Kapitulli 5.</w:t>
       </w:r>
     </w:p>
     <w:p>
@@ -3044,7 +3250,7 @@
           <w:caps w:val="0"/>
           <w:sz w:val="24"/>
         </w:rPr>
-        <w:t>Kufizimet metodologjike.</w:t>
+        <w:t>Dizajni.</w:t>
       </w:r>
       <w:r>
         <w:rPr>
@@ -3053,7 +3259,160 @@
           <w:caps w:val="0"/>
           <w:sz w:val="24"/>
         </w:rPr>
-        <w:t xml:space="preserve"> Kapitulli formësohet nga kufizimet e Nënkapitullit 3.4, sidomos nga mungesa e zgjidhjes së simboleve dhe e testeve të projekteve, si dhe nga mbështetja te një dataset i vetëm.</w:t>
+        <w:t xml:space="preserve"> Çdo mostër e MLCQ-së gjykohet nga të dyja qasjet e detektimit, ndaj dallimi mes tyre nuk ngatërrohet me dallimin mes mostrave. Variabla e pavarur është qasja e detektimit, dhe te refaktorimi lloji i transformimit; variablat e varura janë treguesit e Nënkapitullit 4.9. Për PK2 hipoteza zero është se MCC-ja e Qasjes B nuk ndryshon nga ajo e Qasjes A. Ajo hidhet poshtë për një erë kur intervali 95% i dallimit B − A, i llogaritur me bootstrap sipas depos, nuk e përmban zeron.</w:t>
+      </w:r>
+    </w:p>
+    <w:p>
+      <w:pPr>
+        <w:spacing w:line="360" w:lineRule="auto"/>
+        <w:ind w:firstLine="360"/>
+        <w:jc w:val="both"/>
+      </w:pPr>
+      <w:r>
+        <w:rPr>
+          <w:rFonts w:ascii="Times New Roman" w:hAnsi="Times New Roman" w:eastAsia="Times New Roman"/>
+          <w:b/>
+          <w:caps w:val="0"/>
+          <w:sz w:val="24"/>
+        </w:rPr>
+        <w:t>Hapat e studimit.</w:t>
+      </w:r>
+      <w:r>
+        <w:rPr>
+          <w:rFonts w:ascii="Times New Roman" w:hAnsi="Times New Roman" w:eastAsia="Times New Roman"/>
+          <w:b w:val="0"/>
+          <w:caps w:val="0"/>
+          <w:sz w:val="24"/>
+        </w:rPr>
+        <w:t xml:space="preserve"> Eksperimenti kryhet në tetë hapa, secili me skriptin e vet, sipas radhës së Shtojcës 8.5:</w:t>
+      </w:r>
+    </w:p>
+    <w:p>
+      <w:pPr>
+        <w:pStyle w:val="ListBullet"/>
+        <w:spacing w:line="360" w:lineRule="auto"/>
+        <w:jc w:val="both"/>
+      </w:pPr>
+      <w:r>
+        <w:rPr>
+          <w:rFonts w:ascii="Times New Roman" w:hAnsi="Times New Roman" w:eastAsia="Times New Roman"/>
+          <w:b w:val="0"/>
+          <w:caps w:val="0"/>
+          <w:sz w:val="24"/>
+        </w:rPr>
+        <w:t>materializimi i korpusit: çdo depo e MLCQ-së shkarkohet në commit-in që panë rishikuesit;</w:t>
+      </w:r>
+    </w:p>
+    <w:p>
+      <w:pPr>
+        <w:pStyle w:val="ListBullet"/>
+        <w:spacing w:line="360" w:lineRule="auto"/>
+        <w:jc w:val="both"/>
+      </w:pPr>
+      <w:r>
+        <w:rPr>
+          <w:rFonts w:ascii="Times New Roman" w:hAnsi="Times New Roman" w:eastAsia="Times New Roman"/>
+          <w:b w:val="0"/>
+          <w:caps w:val="0"/>
+          <w:sz w:val="24"/>
+        </w:rPr>
+        <w:t>përputhja e çdo mostre me entitetin që prodhon analizuesi;</w:t>
+      </w:r>
+    </w:p>
+    <w:p>
+      <w:pPr>
+        <w:pStyle w:val="ListBullet"/>
+        <w:spacing w:line="360" w:lineRule="auto"/>
+        <w:jc w:val="both"/>
+      </w:pPr>
+      <w:r>
+        <w:rPr>
+          <w:rFonts w:ascii="Times New Roman" w:hAnsi="Times New Roman" w:eastAsia="Times New Roman"/>
+          <w:b w:val="0"/>
+          <w:caps w:val="0"/>
+          <w:sz w:val="24"/>
+        </w:rPr>
+        <w:t>matja e çdo entiteti dhe ruajtja e tabelës së veçorive;</w:t>
+      </w:r>
+    </w:p>
+    <w:p>
+      <w:pPr>
+        <w:pStyle w:val="ListBullet"/>
+        <w:spacing w:line="360" w:lineRule="auto"/>
+        <w:jc w:val="both"/>
+      </w:pPr>
+      <w:r>
+        <w:rPr>
+          <w:rFonts w:ascii="Times New Roman" w:hAnsi="Times New Roman" w:eastAsia="Times New Roman"/>
+          <w:b w:val="0"/>
+          <w:caps w:val="0"/>
+          <w:sz w:val="24"/>
+        </w:rPr>
+        <w:t>pikëzimi i strategjive të Qasjes A kundrejt etiketave;</w:t>
+      </w:r>
+    </w:p>
+    <w:p>
+      <w:pPr>
+        <w:pStyle w:val="ListBullet"/>
+        <w:spacing w:line="360" w:lineRule="auto"/>
+        <w:jc w:val="both"/>
+      </w:pPr>
+      <w:r>
+        <w:rPr>
+          <w:rFonts w:ascii="Times New Roman" w:hAnsi="Times New Roman" w:eastAsia="Times New Roman"/>
+          <w:b w:val="0"/>
+          <w:caps w:val="0"/>
+          <w:sz w:val="24"/>
+        </w:rPr>
+        <w:t>trajnimi i modeleve të Qasjes B dhe pikëzimi i tyre jashtë fold-it, bashkë me ablacionin mbi metrikat e strategjive;</w:t>
+      </w:r>
+    </w:p>
+    <w:p>
+      <w:pPr>
+        <w:pStyle w:val="ListBullet"/>
+        <w:spacing w:line="360" w:lineRule="auto"/>
+        <w:jc w:val="both"/>
+      </w:pPr>
+      <w:r>
+        <w:rPr>
+          <w:rFonts w:ascii="Times New Roman" w:hAnsi="Times New Roman" w:eastAsia="Times New Roman"/>
+          <w:b w:val="0"/>
+          <w:caps w:val="0"/>
+          <w:sz w:val="24"/>
+        </w:rPr>
+        <w:t>krahasimi i dy qasjeve mostër për mostër, me intervale besimi;</w:t>
+      </w:r>
+    </w:p>
+    <w:p>
+      <w:pPr>
+        <w:pStyle w:val="ListBullet"/>
+        <w:spacing w:line="360" w:lineRule="auto"/>
+        <w:jc w:val="both"/>
+      </w:pPr>
+      <w:r>
+        <w:rPr>
+          <w:rFonts w:ascii="Times New Roman" w:hAnsi="Times New Roman" w:eastAsia="Times New Roman"/>
+          <w:b w:val="0"/>
+          <w:caps w:val="0"/>
+          <w:sz w:val="24"/>
+        </w:rPr>
+        <w:t>ekzekutimi i motorit të refaktorimit mbi korpus, me verifikim dhe rimatje;</w:t>
+      </w:r>
+    </w:p>
+    <w:p>
+      <w:pPr>
+        <w:pStyle w:val="ListBullet"/>
+        <w:spacing w:line="360" w:lineRule="auto"/>
+        <w:jc w:val="both"/>
+      </w:pPr>
+      <w:r>
+        <w:rPr>
+          <w:rFonts w:ascii="Times New Roman" w:hAnsi="Times New Roman" w:eastAsia="Times New Roman"/>
+          <w:b w:val="0"/>
+          <w:caps w:val="0"/>
+          <w:sz w:val="24"/>
+        </w:rPr>
+        <w:t>analizat dytësore: ndjeshmëria dhe kalibrimi i pragjeve, krahasimi me PMD-në dhe pajtimi mes rishikuesve.</w:t>
       </w:r>
     </w:p>
     <w:p>
@@ -3271,6 +3630,56 @@
     </w:p>
     <w:p>
       <w:pPr>
+        <w:spacing w:line="360" w:lineRule="auto"/>
+        <w:ind w:firstLine="360"/>
+        <w:jc w:val="both"/>
+      </w:pPr>
+      <w:r>
+        <w:rPr>
+          <w:rFonts w:ascii="Times New Roman" w:hAnsi="Times New Roman" w:eastAsia="Times New Roman"/>
+          <w:b/>
+          <w:caps w:val="0"/>
+          <w:sz w:val="24"/>
+        </w:rPr>
+        <w:t>Modeli i të dhënave.</w:t>
+      </w:r>
+      <w:r>
+        <w:rPr>
+          <w:rFonts w:ascii="Times New Roman" w:hAnsi="Times New Roman" w:eastAsia="Times New Roman"/>
+          <w:b w:val="0"/>
+          <w:caps w:val="0"/>
+          <w:sz w:val="24"/>
+        </w:rPr>
+        <w:t xml:space="preserve"> Për çdo skedar, parser-i ndërton një njësi me paketën, importet dhe klasat e saj. Një klasë mban llojin (class, interface, enum ose record), emrin, modifikuesit, superklasën, ndërfaqet, fushat, metodat dhe rangun e rreshtave. Një metodë mban tipin që kthen, parametrat me tipet e tyre, variablat lokale që deklaron, emrat e thjeshtë që lexon, qasjet e formës «this.x» dhe «marrësi.anëtari», thirrjet me marrës dhe pa marrës, dhe tipet që përmend. Këto janë të gjitha fakte që lexohen drejtpërdrejt nga pema; asnjëra nuk kërkon të dihet se çfarë tipi ka një shprehje e ndërlikuar.</w:t>
+      </w:r>
+    </w:p>
+    <w:p>
+      <w:pPr>
+        <w:spacing w:line="360" w:lineRule="auto"/>
+        <w:ind w:firstLine="360"/>
+        <w:jc w:val="both"/>
+      </w:pPr>
+      <w:r>
+        <w:rPr>
+          <w:rFonts w:ascii="Times New Roman" w:hAnsi="Times New Roman" w:eastAsia="Times New Roman"/>
+          <w:b/>
+          <w:caps w:val="0"/>
+          <w:sz w:val="24"/>
+        </w:rPr>
+        <w:t>Rreshti i komandës.</w:t>
+      </w:r>
+      <w:r>
+        <w:rPr>
+          <w:rFonts w:ascii="Times New Roman" w:hAnsi="Times New Roman" w:eastAsia="Times New Roman"/>
+          <w:b w:val="0"/>
+          <w:caps w:val="0"/>
+          <w:sz w:val="24"/>
+        </w:rPr>
+        <w:t xml:space="preserve"> Analiza nis me «python -m javasmell» dhe dosjen e projektit. Gjetjet dalin si tekst, JSON ose CSV, metrikat e çdo entiteti si tabelë, dhe rishkrimet e sigurta si patch i unifikuar që autori e lexon para se ta aplikojë. Si portë ndërtimi, opsioni «--fail-on» e mbyll komandën me kod 3 kur mbetet një gjetje në ashpërsinë e kërkuar ose mbi të, ndërsa kodet 1 dhe 2 i mbeten dështimit të vetë mjetit. Opsioni «--thresholds» lexon nga një skedar TOML vetëm pragjet që ndryshojnë, dhe i shkruan ato në dalje, që një raport me pragje të lëvizura të mos ngatërrohet me një të matur me vlerat e botuara.</w:t>
+      </w:r>
+    </w:p>
+    <w:p>
+      <w:pPr>
         <w:pStyle w:val="Heading2"/>
       </w:pPr>
       <w:r>
@@ -4213,7 +4622,7 @@
           <w:caps w:val="0"/>
           <w:sz w:val="24"/>
         </w:rPr>
-        <w:t>tree-sitter jep pemë sintaksore të plotë edhe për kod që nuk kompilon, pa ndërtuar projektin, dhe scikit-learn ofron ndarjen e grupuar, ansamblet e pemëve dhe rëndësinë me permutim. Sistemi nuk përdor asnjë model gjuhësor apo shërbim me pagesë.</w:t>
+        <w:t>Zgjedhjet kryesore kanë arsye konkrete. tree-sitter u preferua ndaj një analizuesi që kërkon ndërtimin e projektit, sepse korpusi nuk mban skedarë ndërtimi dhe shumica e skedarëve të tij nuk kompilojnë të vetëm; një analizues që toleron gabimet jep pemë të plotë edhe për ta. scikit-learn ofron në një vend ndarjen e grupuar, dy ansamblet e pemëve dhe rëndësinë me permutim, ndaj asnjëra prej tyre nuk u shkrua nga e para. FastAPI dhe Pydantic e validojnë çdo kërkesë nga tipet e deklaruara, dhe TypeScript e bën kontratën me ndërfaqen të kontrollueshme që gjatë ndërtimit. JDK 21 është versioni me mbështetje afatgjatë, ndaj javac-u i tij është kompilatori i verifikimit. PMD zgjidhet si mjet i jashtëm krahasimi, sepse zbaton dy nga strategjitë e Lanza &amp; Marinescu (2006) dhe është i lirë. Sistemi nuk përdor asnjë model gjuhësor apo shërbim me pagesë.</w:t>
       </w:r>
     </w:p>
     <w:p>
@@ -4243,7 +4652,7 @@
           <w:caps w:val="0"/>
           <w:sz w:val="24"/>
         </w:rPr>
-        <w:t>MLCQ (Madeyski &amp; Lewowski, 2020) përmban rishikimet e zhvilluesve profesionistë, por jo vetë kodin: çdo rresht tregon depon, commit-in dhe entitetin. Prandaj çdo depo u shkarkua në commit-in e saktë të regjistruar.</w:t>
+        <w:t>MLCQ (Madeyski &amp; Lewowski, 2020) përmban 14 739 rishikime të 4 770 mostrave kodi, të bëra nga 26 zhvillues profesionistë për katër erëra: Blob dhe Data Class në nivel klase, Feature Envy dhe Long Method në nivel metode. Çdo rishikim i jep mostrës një ashpërsi në shkallën none, minor, major dhe critical, ku «none» do të thotë se rishikuesi nuk e sheh erën. Mostrat vijnë nga projekte me burim të hapur, por vetë kodi nuk është pjesë e dataset-it: çdo rresht tregon depon, commit-in, skedarin dhe rangun e rreshtave të entitetit.</w:t>
       </w:r>
     </w:p>
     <w:p>
@@ -4255,11 +4664,20 @@
       <w:r>
         <w:rPr>
           <w:rFonts w:ascii="Times New Roman" w:hAnsi="Times New Roman" w:eastAsia="Times New Roman"/>
+          <w:b/>
+          <w:caps w:val="0"/>
+          <w:sz w:val="24"/>
+        </w:rPr>
+        <w:t>Materializimi.</w:t>
+      </w:r>
+      <w:r>
+        <w:rPr>
+          <w:rFonts w:ascii="Times New Roman" w:hAnsi="Times New Roman" w:eastAsia="Times New Roman"/>
           <w:b w:val="0"/>
           <w:caps w:val="0"/>
           <w:sz w:val="24"/>
         </w:rPr>
-        <w:t>Nëse një depo ishte zhvendosur, ajo u ndoq vetëm kur commit-i gjendej edhe te vendi i ri. Meqë SHA-ja e git-it është hash i përmbajtjes, një commit i gjetur garanton se kodi është i njëjti që panë rishikuesit. Kur nuk gjendet, depoja nuk zëvendësohet me hamendje.</w:t>
+        <w:t xml:space="preserve"> Për çdo depo u shkarkua arkivi i commit-it të rishikuar, dhe prej tij u mbajtën vetëm skedarët «.java». Merret depoja e plotë e jo vetëm skedari i mostrës, sepse ATFD, CBO, DIT dhe NOC përkufizohen kundrejt tipave të tjerë të projektit, dhe një skedar i vetëm do të dukej pothuajse pa qasje në të dhëna të huaja. Shkarkimi është inkremental dhe mund të ndërpritet: depot e përfunduara kapërcehen, dështimet riprovohen, dhe një manifest e ruan gjendjen e secilës depo pas çdo hapi.</w:t>
       </w:r>
     </w:p>
     <w:p>
@@ -4275,21 +4693,7 @@
           <w:caps w:val="0"/>
           <w:sz w:val="24"/>
         </w:rPr>
-        <w:t>Një mostër e MLCQ-së lidhet me entitetin përkatës sipas rangut të rreshtave, dhe lidhja verifikohet me emrin. Vetëm emri nuk mjafton si ankorim, sepse në dataset shfaqet në katër formate të ndryshme.</w:t>
-      </w:r>
-    </w:p>
-    <w:p>
-      <w:pPr>
-        <w:pStyle w:val="Heading2"/>
-      </w:pPr>
-      <w:r>
-        <w:rPr>
-          <w:rFonts w:ascii="Times New Roman" w:hAnsi="Times New Roman" w:eastAsia="Times New Roman"/>
-          <w:b/>
-          <w:caps w:val="0"/>
-          <w:sz w:val="24"/>
-        </w:rPr>
-        <w:t>4.4 Matja e metrikave</w:t>
+        <w:t>Nëse një depo ishte zhvendosur, ajo u ndoq vetëm kur commit-i gjendej edhe te vendi i ri. Meqë SHA-ja e git-it është hash i përmbajtjes, një commit i gjetur garanton se kodi është i njëjti që panë rishikuesit. Kur nuk gjendet, depoja nuk zëvendësohet me hamendje.</w:t>
       </w:r>
     </w:p>
     <w:p>
@@ -4301,11 +4705,20 @@
       <w:r>
         <w:rPr>
           <w:rFonts w:ascii="Times New Roman" w:hAnsi="Times New Roman" w:eastAsia="Times New Roman"/>
+          <w:b/>
+          <w:caps w:val="0"/>
+          <w:sz w:val="24"/>
+        </w:rPr>
+        <w:t>Përputhja.</w:t>
+      </w:r>
+      <w:r>
+        <w:rPr>
+          <w:rFonts w:ascii="Times New Roman" w:hAnsi="Times New Roman" w:eastAsia="Times New Roman"/>
           <w:b w:val="0"/>
           <w:caps w:val="0"/>
           <w:sz w:val="24"/>
         </w:rPr>
-        <w:t>Analizuesi mbështetet te tree-sitter (Brunsfeld et al.), dhe mbi pemën që ai prodhon maten shtatëmbëdhjetë metrika klase dhe nëntë metrika metode, me një kalim për klasë. Ndër to janë metrikat e Chidamber &amp; Kemerer (1994), varianti i normalizuar i LCOM-it nga Henderson-Sellers (1996), TCC-ja e Bieman &amp; Kang (1995) dhe kompleksiteti ciklomatik (McCabe, 1976), i matur si numri i pikave të vendimit në trupin e metodës plus një. Përkufizimet e të gjitha metrikave jepen te Shtojca 8.3.</w:t>
+        <w:t xml:space="preserve"> Një mostër e MLCQ-së lidhet me entitetin përkatës sipas rangut të rreshtave, dhe lidhja verifikohet me emrin. Renditja e kundërt nuk do të punonte, sepse emri i entitetit në dataset shfaqet në katër formate të ndryshme, ndërsa rangu i rreshtave përputhet pothuajse gjithmonë me atë të parser-it. Ky ankorim zgjidh pa asnjë zgjidhës simbolesh dy rastet që dukeshin të vështira: dy mbingarkesa të një metode nuk nisin në të njëjtin rresht, dhe as një klasë e brendshme me klasën që e përmban. Një mostër që nuk lidhet nuk detyrohet të lidhet: shkaku regjistrohet (skedari mungon, ka gabim sintakse, ose te rreshtat e dhënë nuk ka entitet me atë emër) dhe mostra del nga vlerësimi.</w:t>
       </w:r>
     </w:p>
     <w:p>
@@ -4317,11 +4730,34 @@
       <w:r>
         <w:rPr>
           <w:rFonts w:ascii="Times New Roman" w:hAnsi="Times New Roman" w:eastAsia="Times New Roman"/>
+          <w:b/>
+          <w:caps w:val="0"/>
+          <w:sz w:val="24"/>
+        </w:rPr>
+        <w:t>Etiketa.</w:t>
+      </w:r>
+      <w:r>
+        <w:rPr>
+          <w:rFonts w:ascii="Times New Roman" w:hAnsi="Times New Roman" w:eastAsia="Times New Roman"/>
           <w:b w:val="0"/>
           <w:caps w:val="0"/>
           <w:sz w:val="24"/>
         </w:rPr>
-        <w:t>Rreshtat e kodit numërohen si rreshta logjikë, sipas dallimit të Park (1992) mes rreshtave fizikë dhe logjikë: rreshtat bosh, komentet dhe rreshtat që kanë vetëm shenja si «}» ose «});» nuk numërohen.</w:t>
+        <w:t xml:space="preserve"> Ashpërsitë e rishikuesve kthehen në numra nga 0 (none) te 3 (critical), dhe për çdo mostër merret mesatarja e tyre, e rrumbullakosur te numri i plotë më i afërt me gjysmën drejt lart. Mostra quhet pozitive kur rezultati është mbi zero; te dy rishikues, pra, mjafton që njëri ta shohë erën. Si analizë ndjeshmërie përdoren edhe maksimumi, minimumi dhe unanimiteti, ku mostrat me mospajtim hidhen. Çdo mostër pikëzohet vetëm për erën për të cilën u rishikua, ndaj një mostër e Blob-it nuk hyn si negative në vlerësimin e Data Class-it.</w:t>
+      </w:r>
+    </w:p>
+    <w:p>
+      <w:pPr>
+        <w:pStyle w:val="Heading2"/>
+      </w:pPr>
+      <w:r>
+        <w:rPr>
+          <w:rFonts w:ascii="Times New Roman" w:hAnsi="Times New Roman" w:eastAsia="Times New Roman"/>
+          <w:b/>
+          <w:caps w:val="0"/>
+          <w:sz w:val="24"/>
+        </w:rPr>
+        <w:t>4.4 Matja e metrikave</w:t>
       </w:r>
     </w:p>
     <w:p>
@@ -4337,21 +4773,7 @@
           <w:caps w:val="0"/>
           <w:sz w:val="24"/>
         </w:rPr>
-        <w:t>Metrikat ATFD, CBO, DIT dhe TCC varen nga tipat e tjerë të projektit, ndaj çdo depo analizohet e plotë. Një klasë e matur veçmas do të jepte vlera të gabuara.</w:t>
-      </w:r>
-    </w:p>
-    <w:p>
-      <w:pPr>
-        <w:pStyle w:val="Heading2"/>
-      </w:pPr>
-      <w:r>
-        <w:rPr>
-          <w:rFonts w:ascii="Times New Roman" w:hAnsi="Times New Roman" w:eastAsia="Times New Roman"/>
-          <w:b/>
-          <w:caps w:val="0"/>
-          <w:sz w:val="24"/>
-        </w:rPr>
-        <w:t>4.5 Qasja A: detektimi me rregulla</w:t>
+        <w:t>Analizuesi mbështetet te tree-sitter (Brunsfeld et al.), dhe mbi pemën që ai prodhon maten shtatëmbëdhjetë metrika klase dhe nëntë metrika metode, me një kalim për klasë. Ndër to janë metrikat e Chidamber &amp; Kemerer (1994), varianti i normalizuar i LCOM-it nga Henderson-Sellers (1996), TCC-ja e Bieman &amp; Kang (1995) dhe kompleksiteti ciklomatik (McCabe, 1976), i matur si numri i pikave të vendimit në trupin e metodës plus një. Përkufizimet e të gjitha metrikave jepen te Shtojca 8.3.</w:t>
       </w:r>
     </w:p>
     <w:p>
@@ -4367,7 +4789,7 @@
           <w:caps w:val="0"/>
           <w:sz w:val="24"/>
         </w:rPr>
-        <w:t>Sistemi zbaton tetë strategji. God Class, Data Class, Feature Envy dhe Brain Method janë marrë ashtu siç i publikuan Lanza &amp; Marinescu (2006). Large Class, Long Method dhe Long Parameter List ndjekin përshkrimet e Fowler-it (2018), ndërsa Deep Nesting mat sa thellë janë futur blloqet brenda njëri-tjetrit. Kushtet dhe burimi i secilës janë te Shtojca 8.1.</w:t>
+        <w:t>Rreshtat e kodit numërohen si rreshta logjikë, sipas dallimit të Park (1992) mes rreshtave fizikë dhe logjikë: rreshtat bosh, komentet dhe rreshtat që kanë vetëm shenja si «}» ose «});» nuk numërohen.</w:t>
       </w:r>
     </w:p>
     <w:p>
@@ -4379,11 +4801,20 @@
       <w:r>
         <w:rPr>
           <w:rFonts w:ascii="Times New Roman" w:hAnsi="Times New Roman" w:eastAsia="Times New Roman"/>
+          <w:b/>
+          <w:caps w:val="0"/>
+          <w:sz w:val="24"/>
+        </w:rPr>
+        <w:t>Metrikat e metodës.</w:t>
+      </w:r>
+      <w:r>
+        <w:rPr>
+          <w:rFonts w:ascii="Times New Roman" w:hAnsi="Times New Roman" w:eastAsia="Times New Roman"/>
           <w:b w:val="0"/>
           <w:caps w:val="0"/>
           <w:sz w:val="24"/>
         </w:rPr>
-        <w:t>Katër pragje nuk kanë burim të botuar dhe i ka zgjedhur autori: kufiri i Long Method (30 rreshta), dy kushte të Brain Method (CC ≥ 4, ndërfutja ≥ 3) dhe kufiri i Deep Nesting (&gt; 3). Ndjeshmëria ndaj të parit matet te Nënkapitulli 5.5, ndërsa tre të tjerët nuk maten dot kundrejt MLCQ-së. Të autorit janë edhe tre pragjet e ashpërsisë (Shtojca 8.7); të tjerat vijnë nga Lanza &amp; Marinescu (Shtojca 8.2).</w:t>
+        <w:t xml:space="preserve"> ATFD numëron atributet e klasave të tjera të projektit që metoda i lexon, drejtpërdrejt ose përmes një akses-metode, që njihet nga parashtesa «get», «set», «is» ose «has». FDP numëron klasat nga vijnë këto atribute. LAA është pjesa e qasjeve në atribute që bien mbi klasën e vet, dhe merr vlerën 1 kur metoda nuk prek asnjë atribut. NOAV numëron variablat lokale dhe atributet që metoda prek, ndërsa CINT mat sa operacione të ndryshme thërret ajo. Një thirrje me sjellje mbi një objekt tjetër është lidhje, jo qasje në të dhëna, ndaj hyn te CINT dhe CBO por jo te ATFD.</w:t>
       </w:r>
     </w:p>
     <w:p>
@@ -4395,11 +4826,20 @@
       <w:r>
         <w:rPr>
           <w:rFonts w:ascii="Times New Roman" w:hAnsi="Times New Roman" w:eastAsia="Times New Roman"/>
+          <w:b/>
+          <w:caps w:val="0"/>
+          <w:sz w:val="24"/>
+        </w:rPr>
+        <w:t>Metrikat e klasës.</w:t>
+      </w:r>
+      <w:r>
+        <w:rPr>
+          <w:rFonts w:ascii="Times New Roman" w:hAnsi="Times New Roman" w:eastAsia="Times New Roman"/>
           <w:b w:val="0"/>
           <w:caps w:val="0"/>
           <w:sz w:val="24"/>
         </w:rPr>
-        <w:t>Kundrejt MLCQ-së vlerësohen katër strategji: God Class kundrejt etiketës «blob», dhe Data Class, Feature Envy e Long Method kundrejt etiketave me të njëjtin emër. Për Blob-in pikëzohet edhe një variant që bashkon God Class me Large Class, detektorin që shikon vetëm madhësinë.</w:t>
+        <w:t xml:space="preserve"> WMC është shuma e kompleksitetit ciklomatik të metodave, ndërsa AMW mesatarja e tij. TCC është pjesa e çifteve të metodave publike që ndajnë të paktën një fushë; konstruktorët përjashtohen, sepse prekin çdo fushë, dhe kur klasa ka më pak se dy metoda publike, TCC merr vlerën 1. WOC është pjesa e anëtarëve publikë që nuk janë akses-metoda, NOPA numri i fushave publike që nuk janë konstante, dhe NOAM numri i akses-metodave.</w:t>
       </w:r>
     </w:p>
     <w:p>
@@ -4415,7 +4855,7 @@
           <w:caps w:val="0"/>
           <w:sz w:val="24"/>
         </w:rPr>
-        <w:t>Një detektor nuk kthen thjesht po ose jo, por kushtet që vlerësoi me vlerat e matura. Kjo i lejon ndërfaqes të shpjegojë pse u shënua diçka dhe punimit të raportojë cili kusht e mbajti detektimin, ndërsa ashpërsia llogaritet nga sa larg pragut është matja, jo me dorë. Ashpërsia përdor shkallën e MLCQ-së, ndaj krahasohet drejtpërdrejt me etiketat e rishikuesve.</w:t>
+        <w:t>Metrikat ATFD, CBO, DIT dhe TCC varen nga tipat e tjerë të projektit, ndaj çdo depo analizohet e plotë. Si «e huaj» numërohet vetëm një klasë që i përket projektit, që thirrjet në bibliotekën standarde të mos e fryjnë ATFD-në. Tipi i marrësit gjendet vetëm kur marrësi është një identifikues i vetëm; një shprehje si «a.getB().getC()» lihet jashtë në vend që të hamendësohet, ndaj matja anon nga vlera më e ulët.</w:t>
       </w:r>
     </w:p>
     <w:p>
@@ -4429,7 +4869,7 @@
           <w:caps w:val="0"/>
           <w:sz w:val="24"/>
         </w:rPr>
-        <w:t>4.6 Qasja B: detektimi me mësim makine</w:t>
+        <w:t>4.5 Qasja A: detektimi me rregulla</w:t>
       </w:r>
     </w:p>
     <w:p>
@@ -4445,7 +4885,7 @@
           <w:caps w:val="0"/>
           <w:sz w:val="24"/>
         </w:rPr>
-        <w:t>Vlerësohen katër modele: klasifikuesi i shumicës, regresioni logjistik, Random Forest (Breiman, 2001) dhe Gradient Boosting (Friedman, 2001), të gjitha me scikit-learn (Pedregosa et al., 2011). Si veçori përdoren të gjitha metrikat e Nënkapitullit 4.4, jo vetëm ato të strategjive. Parashtesa «c_» shënon një metrikë klase dhe «m_» një metrikë metode, sepse disa metrika, si ATFD, maten në të dy nivelet.</w:t>
+        <w:t>Sistemi zbaton tetë strategji. God Class, Data Class, Feature Envy dhe Brain Method janë marrë ashtu siç i publikuan Lanza &amp; Marinescu (2006). Large Class, Long Method dhe Long Parameter List ndjekin përshkrimet e Fowler-it (2018), ndërsa Deep Nesting mat sa thellë janë futur blloqet brenda njëri-tjetrit. Kushtet dhe burimi i secilës janë te Shtojca 8.1.</w:t>
       </w:r>
     </w:p>
     <w:p>
@@ -4457,11 +4897,20 @@
       <w:r>
         <w:rPr>
           <w:rFonts w:ascii="Times New Roman" w:hAnsi="Times New Roman" w:eastAsia="Times New Roman"/>
+          <w:b/>
+          <w:caps w:val="0"/>
+          <w:sz w:val="24"/>
+        </w:rPr>
+        <w:t>Si shprehen strategjitë.</w:t>
+      </w:r>
+      <w:r>
+        <w:rPr>
+          <w:rFonts w:ascii="Times New Roman" w:hAnsi="Times New Roman" w:eastAsia="Times New Roman"/>
           <w:b w:val="0"/>
           <w:caps w:val="0"/>
           <w:sz w:val="24"/>
         </w:rPr>
-        <w:t>Klasifikuesi i shumicës parashikon gjithmonë «pa erë» dhe shërben si model bazë. Modelet trajnohen edhe vetëm me metrikat e strategjive, që të dallohet sa nga fitimi vjen nga metrikat shtesë.</w:t>
+        <w:t xml:space="preserve"> Secila strategji është kombinim kushtesh mbi metrika, jo një metrikë e vetme. God Class kërkon njëkohësisht kompleksitet të lartë (WMC ≥ 47), kohezion të ulët (TCC &lt; 1/3) dhe qasje në të dhëna të huaja (ATFD &gt; 5). Feature Envy kërkon që metoda të lexojë shumë atribute të huaja (ATFD &gt; 5), më shumë të huaja se të vetat (LAA &lt; 1/3), por nga pak klasa (FDP ≤ 5). Data Class kërkon një sipërfaqe publike pothuajse pa sjellje (WOC &lt; 1/3), me shumë fusha publike ose akses-metoda dhe me kompleksitet të ulët. Long Method kërkon vetëm që rreshtat efektivë të kalojnë 30.</w:t>
       </w:r>
     </w:p>
     <w:p>
@@ -4477,7 +4926,7 @@
           <w:caps w:val="0"/>
           <w:sz w:val="24"/>
         </w:rPr>
-        <w:t>Ndarja bëhet me GroupKFold sipas depos, që mostrat e një projekti të mos jenë njëkohësisht në trajnim dhe në testim (Nënkapitulli 2.3). Çdo mostër parashikohet një herë, nga një model që nuk e ka parë projektin e saj. Kështu modeli jep dalje të së njëjtës formë si detektorët, dhe të dy krahasohen mostër për mostër.</w:t>
+        <w:t>Katër pragje nuk kanë burim të botuar dhe i ka zgjedhur autori: kufiri i Long Method (30 rreshta), dy kushte të Brain Method (CC ≥ 4, ndërfutja ≥ 3) dhe kufiri i Deep Nesting (&gt; 3). Ndjeshmëria ndaj të parit matet te Nënkapitulli 5.5, ndërsa tre të tjerët nuk maten dot kundrejt MLCQ-së. Të autorit janë edhe tre pragjet e ashpërsisë (Shtojca 8.7); të tjerat vijnë nga Lanza &amp; Marinescu (Shtojca 8.2).</w:t>
       </w:r>
     </w:p>
     <w:p>
@@ -4493,7 +4942,7 @@
           <w:caps w:val="0"/>
           <w:sz w:val="24"/>
         </w:rPr>
-        <w:t>Çekuilibri i klasave trajtohet me pesha, jo me mbi-mostrim, sepse mbi-mostrimi do t'i kopjonte rreshtat përtej kufirit të fold-it dhe do ta prishte grupimin. Bashkësia e testimit nuk ribalancohet.</w:t>
+        <w:t>Kundrejt MLCQ-së vlerësohen katër strategji: God Class kundrejt etiketës «blob», dhe Data Class, Feature Envy e Long Method kundrejt etiketave me të njëjtin emër. Për Blob-in pikëzohet edhe një variant që bashkon God Class me Large Class, detektorin që shikon vetëm madhësinë.</w:t>
       </w:r>
     </w:p>
     <w:p>
@@ -4509,7 +4958,7 @@
           <w:caps w:val="0"/>
           <w:sz w:val="24"/>
         </w:rPr>
-        <w:t>Rëndësia e veçorive matet me permutation importance mbi fold-in e testimit, sepse rëndësia e bazuar te papastërtia favorizon veçoritë me shumë vlera të ndryshme. Kjo tregon cila metrikë ka peshë në tërë korpusin, por jo pse u shënua një entitet i caktuar. Prandaj çdo verdikt pozitiv shpjegohet veç: çdo metrikë, një nga një, zëvendësohet me mesoren e bashkësisë së trajnimit dhe modeli pyetet sërish. Nëse ky ndryshim i vetëm e ul probabilitetin nën 0.5, ajo metrikë e mban verdiktin, dhe ndërfaqja e shkruan si fjali: «po të ishte CLOC-u tipik, kjo klasë nuk do të shënohej». Metoda vlen për çdo lloj modeli, por shikon një metrikë në një kohë: kur dy metrika mbajnë të njëjtin informacion, ndryshimi i njërës mund të mos lëvizë asgjë, dhe rasti mbetet pa shpjegim. Edhe shpjegimet llogariten jashtë fold-it.</w:t>
+        <w:t>Një detektor nuk kthen thjesht po ose jo, por kushtet që vlerësoi me vlerat e matura. Kjo i lejon ndërfaqes të shpjegojë pse u shënua diçka dhe punimit të raportojë cili kusht e mbajti detektimin.</w:t>
       </w:r>
     </w:p>
     <w:p>
@@ -4521,25 +4970,43 @@
       <w:r>
         <w:rPr>
           <w:rFonts w:ascii="Times New Roman" w:hAnsi="Times New Roman" w:eastAsia="Times New Roman"/>
+          <w:b/>
+          <w:caps w:val="0"/>
+          <w:sz w:val="24"/>
+        </w:rPr>
+        <w:t>Ashpërsia.</w:t>
+      </w:r>
+      <w:r>
+        <w:rPr>
+          <w:rFonts w:ascii="Times New Roman" w:hAnsi="Times New Roman" w:eastAsia="Times New Roman"/>
           <w:b w:val="0"/>
           <w:caps w:val="0"/>
           <w:sz w:val="24"/>
         </w:rPr>
-        <w:t>Në ndërfaqe, modeli lexohet nga disku me manifestin e tij dhe pyetet vetëm kur përdoruesi e kërkon; nëse mungon, analiza me rregulla vazhdon dhe shërbimi e njofton me një kod gabimi të veçantë.</w:t>
-      </w:r>
-    </w:p>
-    <w:p>
-      <w:pPr>
-        <w:pStyle w:val="Heading2"/>
-      </w:pPr>
-      <w:r>
-        <w:rPr>
-          <w:rFonts w:ascii="Times New Roman" w:hAnsi="Times New Roman" w:eastAsia="Times New Roman"/>
-          <w:b/>
+        <w:t xml:space="preserve"> Për çdo kusht të plotësuar llogaritet teprica e, raporti mes matjes v dhe pragut t. Kur kushti kërkon që matja të jetë mbi prag, teprica është:</w:t>
+      </w:r>
+    </w:p>
+    <w:p>
+      <w:pPr>
+        <w:keepLines/>
+        <w:tabs>
+          <w:tab w:pos="4419" w:val="center"/>
+          <w:tab w:pos="8838" w:val="right"/>
+        </w:tabs>
+        <w:spacing w:line="360" w:lineRule="auto"/>
+        <w:jc w:val="both"/>
+      </w:pPr>
+      <w:r>
+        <w:rPr>
+          <w:rFonts w:ascii="Times New Roman" w:hAnsi="Times New Roman" w:eastAsia="Times New Roman"/>
+          <w:b w:val="0"/>
           <w:caps w:val="0"/>
           <w:sz w:val="24"/>
         </w:rPr>
-        <w:t>4.7 Qasja C: motori i refaktorimit</w:t>
+        <w:tab/>
+        <w:t>e = v / t</w:t>
+        <w:tab/>
+        <w:t>(1)</w:t>
       </w:r>
     </w:p>
     <w:p>
@@ -4555,7 +5022,30 @@
           <w:caps w:val="0"/>
           <w:sz w:val="24"/>
         </w:rPr>
-        <w:t>Motori automatizon tri transformime të Fowler-it (2018): Extract Method për Long Method dhe Brain Method, Replace Nested Conditional with Guard Clauses për Deep Nesting, dhe Introduce Parameter Object për Long Parameter List, vetëm te metodat «private». Për katër erërat e tjera refaktorimi vetëm propozohet (Shtojca 8.4).</w:t>
+        <w:t>Kur kushti kërkon që matja të jetë nën prag, si te TCC-ja, raporti përmbyset, që teprica të jetë përsëri së paku 1 dhe kushtet me drejtim të kundërt të mesatarizohen bashkë:</w:t>
+      </w:r>
+    </w:p>
+    <w:p>
+      <w:pPr>
+        <w:keepLines/>
+        <w:tabs>
+          <w:tab w:pos="4419" w:val="center"/>
+          <w:tab w:pos="8838" w:val="right"/>
+        </w:tabs>
+        <w:spacing w:line="360" w:lineRule="auto"/>
+        <w:jc w:val="both"/>
+      </w:pPr>
+      <w:r>
+        <w:rPr>
+          <w:rFonts w:ascii="Times New Roman" w:hAnsi="Times New Roman" w:eastAsia="Times New Roman"/>
+          <w:b w:val="0"/>
+          <w:caps w:val="0"/>
+          <w:sz w:val="24"/>
+        </w:rPr>
+        <w:tab/>
+        <w:t>e = t / v</w:t>
+        <w:tab/>
+        <w:t>(2)</w:t>
       </w:r>
     </w:p>
     <w:p>
@@ -4571,7 +5061,30 @@
           <w:caps w:val="0"/>
           <w:sz w:val="24"/>
         </w:rPr>
-        <w:t>Çdo transformim ka parakushtet e veta. Nëse ndonjë prej tyre nuk mund të provohet nga pema sintaksore, transformimi kthen «e paaplikueshme» bashkë me arsyen, dhe ky refuzim numërohet si rezultat. Te Extract Method, një analizë e rrjedhës së të dhënave kontrollon që blloku i nxjerrë të ketë një dalje të vetme, që asnjë return, break ose continue të mos dalë prej tij, dhe që çdo variabël që lexon të ketë vlerë me siguri.</w:t>
+        <w:t>Rezultati i gjetjes është mesatarja e tepricave të saj, ku secila kufizohet te 5, që një metrikë e vetme ekstreme të mos e shtyjë një rast të butë te niveli më i lartë; shuma merret mbi të n kushtet e strategjisë:</w:t>
+      </w:r>
+    </w:p>
+    <w:p>
+      <w:pPr>
+        <w:keepLines/>
+        <w:tabs>
+          <w:tab w:pos="4419" w:val="center"/>
+          <w:tab w:pos="8838" w:val="right"/>
+        </w:tabs>
+        <w:spacing w:line="360" w:lineRule="auto"/>
+        <w:jc w:val="both"/>
+      </w:pPr>
+      <w:r>
+        <w:rPr>
+          <w:rFonts w:ascii="Times New Roman" w:hAnsi="Times New Roman" w:eastAsia="Times New Roman"/>
+          <w:b w:val="0"/>
+          <w:caps w:val="0"/>
+          <w:sz w:val="24"/>
+        </w:rPr>
+        <w:tab/>
+        <w:t>s = (1 / n) · Σ min(e, 5)</w:t>
+        <w:tab/>
+        <w:t>(3)</w:t>
       </w:r>
     </w:p>
     <w:p>
@@ -4587,7 +5100,21 @@
           <w:caps w:val="0"/>
           <w:sz w:val="24"/>
         </w:rPr>
-        <w:t>Rishkrimi bëhet mbi pozicione bajtash, sepse tree-sitter jep pozicionet në bajta të tekstit UTF-8. Editimet aplikohen nga fundi i skedarit drejt fillimit, që pozicionet e të tjerave të mbeten të sakta, dhe dy editime që mbivendosen refuzohen.</w:t>
+        <w:t>Gjetja quhet minor kur s &lt; 1.5, major kur 1.5 ≤ s &lt; 2.5, dhe critical përndryshe. Shkalla është ajo e MLCQ-së, ndaj ashpërsia e derivuar krahasohet drejtpërdrejt me atë të rishikuesve.</w:t>
+      </w:r>
+    </w:p>
+    <w:p>
+      <w:pPr>
+        <w:pStyle w:val="Heading2"/>
+      </w:pPr>
+      <w:r>
+        <w:rPr>
+          <w:rFonts w:ascii="Times New Roman" w:hAnsi="Times New Roman" w:eastAsia="Times New Roman"/>
+          <w:b/>
+          <w:caps w:val="0"/>
+          <w:sz w:val="24"/>
+        </w:rPr>
+        <w:t>4.6 Qasja B: detektimi me mësim makine</w:t>
       </w:r>
     </w:p>
     <w:p>
@@ -4603,7 +5130,7 @@
           <w:caps w:val="0"/>
           <w:sz w:val="24"/>
         </w:rPr>
-        <w:t>Verifikimi ka tri nivele, sepse një skedar nga një depo reale varet nga fqinjët e tij dhe shpesh nuk kompilon i vetëm: skedari i rishkruar duhet të parsohet; javac, i ekzekutuar para dhe pas, nuk duhet të japë lloj të ri gabimi; dhe nëse skedari kompilonte i vetëm, duhet të kompilojë ende. Kompilatori thirret me argumente të fiksuara, me kufi kohe dhe në një dosje të përkohshme. Ndikimi i izolimit matet veç: mbi një mostër skedarësh të zgjedhur me farë, i njëjti rishkrim kompilohet një herë i vetëm dhe një herë me burimet e projektit, dhe verdiktet krahasohen.</w:t>
+        <w:t>Vlerësohen katër modele: klasifikuesi i shumicës, regresioni logjistik, Random Forest (Breiman, 2001) dhe Gradient Boosting (Friedman, 2001), të gjitha me scikit-learn (Pedregosa et al., 2011). Si veçori përdoren të gjitha metrikat e Nënkapitullit 4.4, jo vetëm ato të strategjive. Për erërat e klasës vektori ka shtatëmbëdhjetë metrika klase; për erërat e metodës ka nëntë metrika metode bashkë me metrikat e klasës që e përmban, gjithsej 26. Parashtesa «c_» shënon një metrikë klase dhe «m_» një metrikë metode, sepse disa metrika, si ATFD, maten në të dy nivelet.</w:t>
       </w:r>
     </w:p>
     <w:p>
@@ -4615,11 +5142,20 @@
       <w:r>
         <w:rPr>
           <w:rFonts w:ascii="Times New Roman" w:hAnsi="Times New Roman" w:eastAsia="Times New Roman"/>
+          <w:b/>
+          <w:caps w:val="0"/>
+          <w:sz w:val="24"/>
+        </w:rPr>
+        <w:t>Konfigurimi.</w:t>
+      </w:r>
+      <w:r>
+        <w:rPr>
+          <w:rFonts w:ascii="Times New Roman" w:hAnsi="Times New Roman" w:eastAsia="Times New Roman"/>
           <w:b w:val="0"/>
           <w:caps w:val="0"/>
           <w:sz w:val="24"/>
         </w:rPr>
-        <w:t>Pas verifikimit, çdo entitet i rishkruar matet sërish me të njëjtët detektorë. Matet e gjithë klasa, para dhe pas, sepse Extract Method shton një metodë të re. Kështu shihet nëse era u hoq, sa ndryshoi metrika që e ndez detektorin, dhe nëse rishkrimi solli një erë të re.</w:t>
+        <w:t xml:space="preserve"> Klasifikuesi i shumicës parashikon gjithmonë «pa erë» dhe shërben si model bazë. Regresioni logjistik përdoret pas standardizimit të veçorive, sepse vetëm ai është i ndjeshëm ndaj shkallës: pa të, LCOM-i, që arrin mijëra, do ta mbulonte TCC-në, që qëndron mes 0 dhe 1. Random Forest ndërtohet me 300 pemë, ndërsa Gradient Boosting përdor variantin me histograma të scikit-learn me parametrat e parazgjedhur. Hiperparametrat nuk akordohen: akordimi do të kërkonte një ndarje të dytë brenda çdo fold-i, dhe pa të do të rridhte informacion nga bashkësia e testimit. Të gjitha modelet përdorin farën 20260826.</w:t>
       </w:r>
     </w:p>
     <w:p>
@@ -4631,79 +5167,20 @@
       <w:r>
         <w:rPr>
           <w:rFonts w:ascii="Times New Roman" w:hAnsi="Times New Roman" w:eastAsia="Times New Roman"/>
+          <w:b/>
+          <w:caps w:val="0"/>
+          <w:sz w:val="24"/>
+        </w:rPr>
+        <w:t>Ndarja.</w:t>
+      </w:r>
+      <w:r>
+        <w:rPr>
+          <w:rFonts w:ascii="Times New Roman" w:hAnsi="Times New Roman" w:eastAsia="Times New Roman"/>
           <w:b w:val="0"/>
           <w:caps w:val="0"/>
           <w:sz w:val="24"/>
         </w:rPr>
-        <w:t xml:space="preserve">Kompilimi mbulon vetëm gjysmën e përkufizimit të Fowler-it (2018), ruajtjen e sjelljes. Nëse struktura u përmirësua e gjykon një njeri, mbi një mostër diff-esh, me një rubrikë me tri përmasa: </w:t>
-      </w:r>
-      <w:r>
-        <w:rPr>
-          <w:rFonts w:ascii="Times New Roman" w:hAnsi="Times New Roman" w:eastAsia="Times New Roman"/>
-          <w:b/>
-          <w:caps w:val="0"/>
-          <w:sz w:val="24"/>
-        </w:rPr>
-        <w:t>sjellja</w:t>
-      </w:r>
-      <w:r>
-        <w:rPr>
-          <w:rFonts w:ascii="Times New Roman" w:hAnsi="Times New Roman" w:eastAsia="Times New Roman"/>
-          <w:b w:val="0"/>
-          <w:caps w:val="0"/>
-          <w:sz w:val="24"/>
-        </w:rPr>
-        <w:t xml:space="preserve"> (e ruajtur, e paqartë, e ndryshuar), </w:t>
-      </w:r>
-      <w:r>
-        <w:rPr>
-          <w:rFonts w:ascii="Times New Roman" w:hAnsi="Times New Roman" w:eastAsia="Times New Roman"/>
-          <w:b/>
-          <w:caps w:val="0"/>
-          <w:sz w:val="24"/>
-        </w:rPr>
-        <w:t>përfitimi</w:t>
-      </w:r>
-      <w:r>
-        <w:rPr>
-          <w:rFonts w:ascii="Times New Roman" w:hAnsi="Times New Roman" w:eastAsia="Times New Roman"/>
-          <w:b w:val="0"/>
-          <w:caps w:val="0"/>
-          <w:sz w:val="24"/>
-        </w:rPr>
-        <w:t xml:space="preserve"> (përmirëson, asnjanës, përkeqëson) dhe </w:t>
-      </w:r>
-      <w:r>
-        <w:rPr>
-          <w:rFonts w:ascii="Times New Roman" w:hAnsi="Times New Roman" w:eastAsia="Times New Roman"/>
-          <w:b/>
-          <w:caps w:val="0"/>
-          <w:sz w:val="24"/>
-        </w:rPr>
-        <w:t>pranueshmëria</w:t>
-      </w:r>
-      <w:r>
-        <w:rPr>
-          <w:rFonts w:ascii="Times New Roman" w:hAnsi="Times New Roman" w:eastAsia="Times New Roman"/>
-          <w:b w:val="0"/>
-          <w:caps w:val="0"/>
-          <w:sz w:val="24"/>
-        </w:rPr>
-        <w:t xml:space="preserve"> (ashtu si është, pas një ndreqjeje, e refuzuar). Mostra zgjidhet me farë, e shtresuar sipas transformimit, dhe shifra e përgjithshme ripeshohet sipas madhësisë së shtresave. Vlerësuesi nuk e sheh verdiktin e kompilatorit. Intervalet janë ato të Wilson (1927), sepse përafrimi normal me pak vëzhgime jep kufij jashtë [0, 1] (Brown et al., 2001). Vlerësuesi është vetë autori, çka është kufizim i deklaruar.</w:t>
-      </w:r>
-    </w:p>
-    <w:p>
-      <w:pPr>
-        <w:pStyle w:val="Heading2"/>
-      </w:pPr>
-      <w:r>
-        <w:rPr>
-          <w:rFonts w:ascii="Times New Roman" w:hAnsi="Times New Roman" w:eastAsia="Times New Roman"/>
-          <w:b/>
-          <w:caps w:val="0"/>
-          <w:sz w:val="24"/>
-        </w:rPr>
-        <w:t>4.8 Ndërfaqja web dhe API</w:t>
+        <w:t xml:space="preserve"> Ndarja bëhet me GroupKFold në pesë folde sipas depos, që mostrat e një projekti të mos jenë njëkohësisht në trajnim dhe në testim (Nënkapitulli 2.4). Një ndarje e rastësishme sipas rreshtave do të ishte rast i asaj që Kaufman et al. (2012) e quajnë rrjedhje: modeli do të mësonte nga të dhëna që në përdorim real nuk i ka. Çdo mostër parashikohet një herë, nga një model që nuk e ka parë projektin e saj. Kështu modeli jep dalje të së njëjtës formë si detektorët, dhe të dy krahasohen mostër për mostër.</w:t>
       </w:r>
     </w:p>
     <w:p>
@@ -4719,7 +5196,7 @@
           <w:caps w:val="0"/>
           <w:sz w:val="24"/>
         </w:rPr>
-        <w:t>Shërbimi HTTP ka njëmbëdhjetë pika hyrjeje: analizën e projektit, metrikat dhe kodin e një entiteti, shfletimin e dosjeve, importin nga GitHub, gjendjen e shërbimit, dhe pesë pika nën /refactor (pamja paraprake, patch-i, kontrolli dhe shkrimi në disk). Secila e validon kërkesën, thërret të njëjtat funksione si rreshti i komandës dhe kthen JSON.</w:t>
+        <w:t>Çekuilibri i klasave trajtohet me pesha, jo me mbi-mostrim, sepse mbi-mostrimi do t'i kopjonte rreshtat përtej kufirit të fold-it dhe do ta prishte grupimin. Bashkësia e testimit nuk ribalancohet.</w:t>
       </w:r>
     </w:p>
     <w:p>
@@ -4731,11 +5208,20 @@
       <w:r>
         <w:rPr>
           <w:rFonts w:ascii="Times New Roman" w:hAnsi="Times New Roman" w:eastAsia="Times New Roman"/>
+          <w:b/>
+          <w:caps w:val="0"/>
+          <w:sz w:val="24"/>
+        </w:rPr>
+        <w:t>Ablacioni.</w:t>
+      </w:r>
+      <w:r>
+        <w:rPr>
+          <w:rFonts w:ascii="Times New Roman" w:hAnsi="Times New Roman" w:eastAsia="Times New Roman"/>
           <w:b w:val="0"/>
           <w:caps w:val="0"/>
           <w:sz w:val="24"/>
         </w:rPr>
-        <w:t>Aplikacioni ka një përdorues dhe dëgjon vetëm në localhost, ndaj rreziqet kryesore janë shtigjet dhe burimet, jo autentikimi. Pranohen vetëm shtigje brenda rrënjëve të lejuara, edhe pas lidhjeve simbolike; analiza ka kufij për skedarët, madhësinë dhe kohën; dhe gabimet kthehen pa detaje të brendshme. Meqë çdo faqe e hapur në shfletues mund ta arrijë localhost-in, refuzohen edhe emrat jo-lokalë te koka Host (DNS rebinding), kërkesat POST nga origjina të huaja dhe shfaqja e ndërfaqes brenda një faqeje tjetër. Importi nga GitHub ruan vetëm skedarët «.java» të një depoje publike, me kufij madhësie dhe me çdo shteg brenda dosjes së synuar.</w:t>
+        <w:t xml:space="preserve"> Modelet trajnohen edhe vetëm me metrikat që lexon strategjia përkatëse: te Blob WMC, TCC dhe ATFD e klasës, te Feature Envy ATFD, LAA dhe FDP e metodës, te Data Class WOC, NOPA, NOAM dhe WMC, dhe te Long Method vetëm MLOC. Foldet, fara dhe pikëzimi mbeten të njëjta, ndaj dallimi me modelin e plotë tregon sa nga fitimi vjen nga kufiri i mësuar dhe sa nga metrikat shtesë.</w:t>
       </w:r>
     </w:p>
     <w:p>
@@ -4747,11 +5233,20 @@
       <w:r>
         <w:rPr>
           <w:rFonts w:ascii="Times New Roman" w:hAnsi="Times New Roman" w:eastAsia="Times New Roman"/>
+          <w:b/>
+          <w:caps w:val="0"/>
+          <w:sz w:val="24"/>
+        </w:rPr>
+        <w:t>Rëndësia dhe shpjegimi.</w:t>
+      </w:r>
+      <w:r>
+        <w:rPr>
+          <w:rFonts w:ascii="Times New Roman" w:hAnsi="Times New Roman" w:eastAsia="Times New Roman"/>
           <w:b w:val="0"/>
           <w:caps w:val="0"/>
           <w:sz w:val="24"/>
         </w:rPr>
-        <w:t>Shkrimi në disk është i vetmi veprim që ndryshon kodin e autorit, ndaj kërkon konfirmim të qartë, një depo git pa ndryshime të pakomituara dhe skedarë që git-i i ndjek, që një «git restore» t'i kthejë të gjitha. Përndryshe refuzohet me arsyen përkatëse. Shkruhen vetëm rishkrimet që kaluan verifikimin.</w:t>
+        <w:t xml:space="preserve"> Rëndësia e veçorive matet me permutation importance mbi fold-in e testimit, me dhjetë përsëritje, sepse rëndësia e bazuar te papastërtia favorizon veçoritë me shumë vlera të ndryshme (Strobl et al., 2007). Kjo tregon cila metrikë ka peshë në tërë korpusin, por jo pse u shënua një entitet i caktuar. Prandaj çdo verdikt pozitiv shpjegohet veç: çdo metrikë, një nga një, zëvendësohet me mesoren e bashkësisë së trajnimit dhe modeli pyetet sërish. Nëse ky ndryshim i vetëm e ul probabilitetin nën 0.5, ajo metrikë e mban verdiktin, dhe ndërfaqja e shkruan si fjali: «po të ishte CLOC-u tipik, kjo klasë nuk do të shënohej». Metoda vlen për çdo lloj modeli, por shikon një metrikë në një kohë: kur dy metrika mbajnë të njëjtin informacion, ndryshimi i njërës mund të mos lëvizë asgjë, dhe rasti mbetet pa shpjegim. Edhe shpjegimet llogariten jashtë fold-it.</w:t>
       </w:r>
     </w:p>
     <w:p>
@@ -4767,7 +5262,7 @@
           <w:caps w:val="0"/>
           <w:sz w:val="24"/>
         </w:rPr>
-        <w:t>Ndërfaqja është aplikacion React me TypeScript, që shërbehet nga i njëjti proces si API-ja. Projekti zgjidhet duke shfletuar dosjet ose duke importuar një depo. Për çdo gjetje shfaqen kushtet me vlerat e matura, shpjegimi i modelit, dhe diff-i i rishkrimit ose arsyeja e refuzimit. Pas shkrimit në disk tregohet cilat erëra u hoqën dhe cilat u shfaqën.</w:t>
+        <w:t>Për ndërfaqen, modeli më i mirë i secilës erë trajnohet sërish mbi të gjitha mostrat dhe ruhet në disk me një manifest që mban veçoritë, versionet dhe farën. Ai pyetet vetëm kur përdoruesi e kërkon; nëse mungon, analiza me rregulla vazhdon dhe shërbimi e njofton me një kod gabimi të veçantë. Shifrat e punimit vijnë vetëm nga parashikimet jashtë fold-it, kurrë nga ky model.</w:t>
       </w:r>
     </w:p>
     <w:p>
@@ -4781,7 +5276,7 @@
           <w:caps w:val="0"/>
           <w:sz w:val="24"/>
         </w:rPr>
-        <w:t>4.9 Matja e performancës</w:t>
+        <w:t>4.7 Qasja C: motori i refaktorimit</w:t>
       </w:r>
     </w:p>
     <w:p>
@@ -4797,7 +5292,7 @@
           <w:caps w:val="0"/>
           <w:sz w:val="24"/>
         </w:rPr>
-        <w:t>Një mostër quhet pozitive kur ashpërsia mesatare e rishikuesve është mbi «none». Maksimumi, minimumi dhe unanimiteti përdoren si analizë ndjeshmërie, sepse rishikuesit e MLCQ-së nuk pajtohen në rreth një të katërtën e mostrave, dhe një shifër e vetme do ta fshihte këtë.</w:t>
+        <w:t>Motori automatizon tri transformime të Fowler-it (2018): Extract Method për Long Method dhe Brain Method, Replace Nested Conditional with Guard Clauses për Deep Nesting, dhe Introduce Parameter Object për Long Parameter List, vetëm te metodat «private». Për katër erërat e tjera refaktorimi vetëm propozohet (Shtojca 8.4).</w:t>
       </w:r>
     </w:p>
     <w:p>
@@ -4813,7 +5308,7 @@
           <w:caps w:val="0"/>
           <w:sz w:val="24"/>
         </w:rPr>
-        <w:t>Mbi këtë përkufizim maten precizioni, recall-i dhe F1, si dhe koeficienti i korrelacionit i Matthews-it (Matthews, 1975), që i merr parasysh të katër qelizat e matricës konfuze. Kjo ka rëndësi kur shumica e etiketave janë negative: një detektor që nuk ndez kurrë del i papërcaktuar sipas tij, ndërsa saktësia e përgjithshme do t'i jepte shifër të lartë. Recall-i raportohet edhe sipas ashpërsisë që caktuan rishikuesit.</w:t>
+        <w:t>Çdo transformim ka parakushtet e veta. Nëse ndonjë prej tyre nuk mund të provohet nga pema sintaksore, transformimi kthen «e paaplikueshme» bashkë me arsyen, dhe ky refuzim numërohet si rezultat.</w:t>
       </w:r>
     </w:p>
     <w:p>
@@ -4825,11 +5320,20 @@
       <w:r>
         <w:rPr>
           <w:rFonts w:ascii="Times New Roman" w:hAnsi="Times New Roman" w:eastAsia="Times New Roman"/>
+          <w:b/>
+          <w:caps w:val="0"/>
+          <w:sz w:val="24"/>
+        </w:rPr>
+        <w:t>Extract Method.</w:t>
+      </w:r>
+      <w:r>
+        <w:rPr>
+          <w:rFonts w:ascii="Times New Roman" w:hAnsi="Times New Roman" w:eastAsia="Times New Roman"/>
           <w:b w:val="0"/>
           <w:caps w:val="0"/>
           <w:sz w:val="24"/>
         </w:rPr>
-        <w:t>Pajtimi mes dy qasjeve matet me koeficientin kappa (Cohen, 1960), sepse kur 82% e etiketave janë negative, dy detektorë që ndezin rrallë pajtohen shumë edhe rastësisht. Raportohen edhe të katër qelizat, bashkimi i dy qasjeve (mostra shënohet nëse e shënon njëra) dhe prerja e tyre (nëse e shënojnë të dyja).</w:t>
+        <w:t xml:space="preserve"> Nga trupi i metodës zgjidhet deklarata e përbërë më e madhe e nivelit të parë (një if, for, while, do, try ose switch), e matur në rreshta. Zgjedhja është mekanike, që e njëjta hyrje të japë gjithmonë të njëjtin rishkrim. Një analizë e rrjedhës së të dhënave i ndan variablat e bllokut në tri grupe: ato që blloku i lexon dhe që janë deklaruar para tij bëhen parametra; ajo që blloku e shkruan dhe që lexohet pas tij bëhet vlera që kthehet, dhe mund të jetë vetëm një; ato që deklarohen brenda tij mbeten brenda. Blloku refuzohet kur prej tij del një return, break ose continue, kur ka më shumë se një dalje, kur një variabël që lexon nuk ka vlerë me siguri, ose kur tipi i një variable nuk duket në skedar. Metoda e re është private, statike kur edhe metoda burimore është statike, dhe e trashëgon klauzolën «throws». Ajo quhet «extracted»: një emër sipas qëllimit kërkon të kuptosh për çfarë shërben kodi, gjë që pema sintaksore nuk e jep, ndaj emërtimi i lihet autorit.</w:t>
       </w:r>
     </w:p>
     <w:p>
@@ -4841,11 +5345,20 @@
       <w:r>
         <w:rPr>
           <w:rFonts w:ascii="Times New Roman" w:hAnsi="Times New Roman" w:eastAsia="Times New Roman"/>
+          <w:b/>
+          <w:caps w:val="0"/>
+          <w:sz w:val="24"/>
+        </w:rPr>
+        <w:t>Replace Nested Conditional with Guard Clauses.</w:t>
+      </w:r>
+      <w:r>
+        <w:rPr>
+          <w:rFonts w:ascii="Times New Roman" w:hAnsi="Times New Roman" w:eastAsia="Times New Roman"/>
           <w:b w:val="0"/>
           <w:caps w:val="0"/>
           <w:sz w:val="24"/>
         </w:rPr>
-        <w:t>Pasiguria matet me intervale besimi bootstrap, ku rimostrohen depo të plota e jo mostra të veçanta, që një projekt të mos ndahet. Pajtimi mes vetë rishikuesve të MLCQ-së matet mbi çdo çift rishikimesh të së njëjtës mostër, dhe shërben si tavan për shifrat e detektorëve.</w:t>
+        <w:t xml:space="preserve"> Transformimi pranon vetëm një formë: metodë void, trupi i së cilës është një if i vetëm pa else. Kushti mbështillet si «!(kushti)», metoda del menjëherë kur ai vlen, dhe trupi i if-it zbret një nivel. Mbështjellja, në vend të përmbysjes së operatorit, e ruan kuptimin edhe për numrat me presje lëvizëse, ku «a &gt; b» dhe «a &lt;= b» mund të jenë të dy të rremë, dhe e vlerëson kushtin saktësisht një herë. Çdo formë tjetër refuzohet, sepse një degë else apo një vlerë kthyese do të kërkonin një vendim që sintaksa nuk e jep.</w:t>
       </w:r>
     </w:p>
     <w:p>
@@ -4857,11 +5370,20 @@
       <w:r>
         <w:rPr>
           <w:rFonts w:ascii="Times New Roman" w:hAnsi="Times New Roman" w:eastAsia="Times New Roman"/>
+          <w:b/>
+          <w:caps w:val="0"/>
+          <w:sz w:val="24"/>
+        </w:rPr>
+        <w:t>Introduce Parameter Object.</w:t>
+      </w:r>
+      <w:r>
+        <w:rPr>
+          <w:rFonts w:ascii="Times New Roman" w:hAnsi="Times New Roman" w:eastAsia="Times New Roman"/>
           <w:b w:val="0"/>
           <w:caps w:val="0"/>
           <w:sz w:val="24"/>
         </w:rPr>
-        <w:t>Motori i refaktorimit matet ndryshe: numërohen vendet e detektuara, të transformuara dhe të refuzuara sipas arsyes, me verdiktin e verifikimit për çdo rishkrim.</w:t>
+        <w:t xml:space="preserve"> Zbatohet vetëm te metodat private, sepse Java i kufizon thirrjet e tyre brenda klasës së nivelit të lartë, pra brenda skedarit që rishkruhet. Parametrat mblidhen në një klasë të brendshme statike me fusha finale dhe konstruktor, metoda merr një parametër të vetëm, dhe çdo thirrje në skedar e ndërton objektin. Trupi i metodës nuk preket: në krye të tij parametrat e vjetër rideklarohen si variabla lokale me të njëjtin emër e tip, ndaj as fshehja e një emri as caktimi i një parametri nuk e ndryshojnë kuptimin. Refuzohen mbingarkesat, referencat ndaj metodës, parametrat me numër të ndryshueshëm, tipet gjenerike, parametrat me anotime dhe klasat që nuk mund të mbajnë një klasë të brendshme statike.</w:t>
       </w:r>
     </w:p>
     <w:p>
@@ -4873,25 +5395,20 @@
       <w:r>
         <w:rPr>
           <w:rFonts w:ascii="Times New Roman" w:hAnsi="Times New Roman" w:eastAsia="Times New Roman"/>
+          <w:b/>
+          <w:caps w:val="0"/>
+          <w:sz w:val="24"/>
+        </w:rPr>
+        <w:t>Gjetja e vendit dhe editimi.</w:t>
+      </w:r>
+      <w:r>
+        <w:rPr>
+          <w:rFonts w:ascii="Times New Roman" w:hAnsi="Times New Roman" w:eastAsia="Times New Roman"/>
           <w:b w:val="0"/>
           <w:caps w:val="0"/>
           <w:sz w:val="24"/>
         </w:rPr>
-        <w:t>Si krahasim i jashtëm, i njëjti vlerësim zbatohet te PMD (PMD Team, 2026), versioni 7.27.0, rregullat GodClass dhe DataClass të të cilit bazohen te strategjitë e Lanza &amp; Marinescu (2006). PMD ekzekutohet me pragjet e veta, pikëzohet njësoj si Qasja A, dhe shkeljet lidhen me entitetet sipas emrit të klasës dhe të metodës. Meqë analizon një skedar në një kohë, ATFD-në e llogarit vetëm brenda skedarit, gjë që e vë në disavantazh; rregull për Feature Envy nuk ka.</w:t>
-      </w:r>
-    </w:p>
-    <w:p>
-      <w:pPr>
-        <w:pStyle w:val="Heading2"/>
-      </w:pPr>
-      <w:r>
-        <w:rPr>
-          <w:rFonts w:ascii="Times New Roman" w:hAnsi="Times New Roman" w:eastAsia="Times New Roman"/>
-          <w:b/>
-          <w:caps w:val="0"/>
-          <w:sz w:val="24"/>
-        </w:rPr>
-        <w:t>4.10 Validimi i sistemit</w:t>
+        <w:t xml:space="preserve"> Para rishkrimit skedari parsohet sërish, dhe entiteti gjendet me të njëjtin parim si mostrat e MLCQ-së: rreshti i fillimit si ankor, emri si kontroll. Kur skedari ka ndryshuar dhe rreshti mban diçka tjetër, vendi numërohet si i palokalizueshëm dhe nuk preket. Rishkrimi bëhet mbi pozicione bajtash, sepse tree-sitter jep pozicionet në bajta të tekstit UTF-8. Editimet aplikohen nga fundi i skedarit drejt fillimit, që pozicionet e të tjerave të mbeten të sakta, dhe dy editime që mbivendosen refuzohen.</w:t>
       </w:r>
     </w:p>
     <w:p>
@@ -4903,6 +5420,568 @@
       <w:r>
         <w:rPr>
           <w:rFonts w:ascii="Times New Roman" w:hAnsi="Times New Roman" w:eastAsia="Times New Roman"/>
+          <w:b/>
+          <w:caps w:val="0"/>
+          <w:sz w:val="24"/>
+        </w:rPr>
+        <w:t>Verifikimi.</w:t>
+      </w:r>
+      <w:r>
+        <w:rPr>
+          <w:rFonts w:ascii="Times New Roman" w:hAnsi="Times New Roman" w:eastAsia="Times New Roman"/>
+          <w:b w:val="0"/>
+          <w:caps w:val="0"/>
+          <w:sz w:val="24"/>
+        </w:rPr>
+        <w:t xml:space="preserve"> Verifikimi ka tri nivele, sepse një skedar nga një depo reale varet nga fqinjët e tij dhe shpesh nuk kompilon i vetëm: skedari i rishkruar duhet të parsohet; javac, i ekzekutuar para dhe pas, nuk duhet të japë lloj të ri gabimi; dhe nëse skedari kompilonte i vetëm, duhet të kompilojë ende. Krahasohen llojet e mesazheve dhe jo numri i tyre, sepse një parametër i ri me tip të importuar shton një «cannot find symbol» që vjen nga izolimi e jo nga rishkrimi. Kompilatori thirret me argumente të fiksuara, me kufi kohe prej 60 sekondash dhe në një dosje të përkohshme. Ndikimi i izolimit matet veç: mbi një mostër skedarësh të zgjedhur me farë, i njëjti rishkrim kompilohet një herë i vetëm dhe një herë me burimet e projektit, dhe verdiktet krahasohen.</w:t>
+      </w:r>
+    </w:p>
+    <w:p>
+      <w:pPr>
+        <w:spacing w:line="360" w:lineRule="auto"/>
+        <w:ind w:firstLine="360"/>
+        <w:jc w:val="both"/>
+      </w:pPr>
+      <w:r>
+        <w:rPr>
+          <w:rFonts w:ascii="Times New Roman" w:hAnsi="Times New Roman" w:eastAsia="Times New Roman"/>
+          <w:b w:val="0"/>
+          <w:caps w:val="0"/>
+          <w:sz w:val="24"/>
+        </w:rPr>
+        <w:t>Pas verifikimit, çdo entitet i rishkruar matet sërish me të njëjtët detektorë. Matet e gjithë klasa, para dhe pas, sepse Extract Method shton një metodë të re. Kështu shihet nëse era u hoq, sa ndryshoi metrika që e ndez detektorin, dhe nëse rishkrimi solli një erë të re.</w:t>
+      </w:r>
+    </w:p>
+    <w:p>
+      <w:pPr>
+        <w:spacing w:line="360" w:lineRule="auto"/>
+        <w:ind w:firstLine="360"/>
+        <w:jc w:val="both"/>
+      </w:pPr>
+      <w:r>
+        <w:rPr>
+          <w:rFonts w:ascii="Times New Roman" w:hAnsi="Times New Roman" w:eastAsia="Times New Roman"/>
+          <w:b/>
+          <w:caps w:val="0"/>
+          <w:sz w:val="24"/>
+        </w:rPr>
+        <w:t>Cilësia e rishkrimeve.</w:t>
+      </w:r>
+      <w:r>
+        <w:rPr>
+          <w:rFonts w:ascii="Times New Roman" w:hAnsi="Times New Roman" w:eastAsia="Times New Roman"/>
+          <w:b w:val="0"/>
+          <w:caps w:val="0"/>
+          <w:sz w:val="24"/>
+        </w:rPr>
+        <w:t xml:space="preserve"> Kompilimi mbulon vetëm gjysmën e përkufizimit të Fowler-it (2018), ruajtjen e sjelljes. Nëse struktura u përmirësua e gjykon një njeri, mbi një mostër diff-esh, me një rubrikë me tri përmasa: </w:t>
+      </w:r>
+      <w:r>
+        <w:rPr>
+          <w:rFonts w:ascii="Times New Roman" w:hAnsi="Times New Roman" w:eastAsia="Times New Roman"/>
+          <w:b/>
+          <w:caps w:val="0"/>
+          <w:sz w:val="24"/>
+        </w:rPr>
+        <w:t>sjellja</w:t>
+      </w:r>
+      <w:r>
+        <w:rPr>
+          <w:rFonts w:ascii="Times New Roman" w:hAnsi="Times New Roman" w:eastAsia="Times New Roman"/>
+          <w:b w:val="0"/>
+          <w:caps w:val="0"/>
+          <w:sz w:val="24"/>
+        </w:rPr>
+        <w:t xml:space="preserve"> (e ruajtur, e paqartë, e ndryshuar), </w:t>
+      </w:r>
+      <w:r>
+        <w:rPr>
+          <w:rFonts w:ascii="Times New Roman" w:hAnsi="Times New Roman" w:eastAsia="Times New Roman"/>
+          <w:b/>
+          <w:caps w:val="0"/>
+          <w:sz w:val="24"/>
+        </w:rPr>
+        <w:t>përfitimi</w:t>
+      </w:r>
+      <w:r>
+        <w:rPr>
+          <w:rFonts w:ascii="Times New Roman" w:hAnsi="Times New Roman" w:eastAsia="Times New Roman"/>
+          <w:b w:val="0"/>
+          <w:caps w:val="0"/>
+          <w:sz w:val="24"/>
+        </w:rPr>
+        <w:t xml:space="preserve"> (përmirëson, asnjanës, përkeqëson) dhe </w:t>
+      </w:r>
+      <w:r>
+        <w:rPr>
+          <w:rFonts w:ascii="Times New Roman" w:hAnsi="Times New Roman" w:eastAsia="Times New Roman"/>
+          <w:b/>
+          <w:caps w:val="0"/>
+          <w:sz w:val="24"/>
+        </w:rPr>
+        <w:t>pranueshmëria</w:t>
+      </w:r>
+      <w:r>
+        <w:rPr>
+          <w:rFonts w:ascii="Times New Roman" w:hAnsi="Times New Roman" w:eastAsia="Times New Roman"/>
+          <w:b w:val="0"/>
+          <w:caps w:val="0"/>
+          <w:sz w:val="24"/>
+        </w:rPr>
+        <w:t xml:space="preserve"> (ashtu si është, pas një ndreqjeje, e refuzuar). Mostra zgjidhet me farë, e shtresuar sipas transformimit, dhe shifra e përgjithshme ripeshohet sipas madhësisë së shtresave. Vlerësuesi nuk e sheh verdiktin e kompilatorit. Intervalet janë ato të Wilson (1927), sepse përafrimi normal me pak vëzhgime jep kufij jashtë [0, 1] (Brown et al., 2001). Vlerësuesi është vetë autori, çka është kufizim i deklaruar.</w:t>
+      </w:r>
+    </w:p>
+    <w:p>
+      <w:pPr>
+        <w:pStyle w:val="Heading2"/>
+      </w:pPr>
+      <w:r>
+        <w:rPr>
+          <w:rFonts w:ascii="Times New Roman" w:hAnsi="Times New Roman" w:eastAsia="Times New Roman"/>
+          <w:b/>
+          <w:caps w:val="0"/>
+          <w:sz w:val="24"/>
+        </w:rPr>
+        <w:t>4.8 Ndërfaqja web dhe API</w:t>
+      </w:r>
+    </w:p>
+    <w:p>
+      <w:pPr>
+        <w:spacing w:line="360" w:lineRule="auto"/>
+        <w:ind w:firstLine="360"/>
+        <w:jc w:val="both"/>
+      </w:pPr>
+      <w:r>
+        <w:rPr>
+          <w:rFonts w:ascii="Times New Roman" w:hAnsi="Times New Roman" w:eastAsia="Times New Roman"/>
+          <w:b w:val="0"/>
+          <w:caps w:val="0"/>
+          <w:sz w:val="24"/>
+        </w:rPr>
+        <w:t>Shërbimi HTTP ka njëmbëdhjetë pika hyrjeje: analizën e projektit, metrikat dhe kodin e një entiteti, shfletimin e dosjeve, importin nga GitHub, gjendjen e shërbimit, dhe pesë pika nën /refactor (pamja paraprake, patch-i, kontrolli dhe shkrimi në disk). Secila e validon kërkesën, thërret të njëjtat funksione si rreshti i komandës dhe kthen JSON.</w:t>
+      </w:r>
+    </w:p>
+    <w:p>
+      <w:pPr>
+        <w:spacing w:line="360" w:lineRule="auto"/>
+        <w:ind w:firstLine="360"/>
+        <w:jc w:val="both"/>
+      </w:pPr>
+      <w:r>
+        <w:rPr>
+          <w:rFonts w:ascii="Times New Roman" w:hAnsi="Times New Roman" w:eastAsia="Times New Roman"/>
+          <w:b w:val="0"/>
+          <w:caps w:val="0"/>
+          <w:sz w:val="24"/>
+        </w:rPr>
+        <w:t>Aplikacioni ka një përdorues dhe dëgjon vetëm në localhost, ndaj rreziqet kryesore janë shtigjet dhe burimet, jo autentikimi. Pranohen vetëm shtigje brenda rrënjëve të lejuara, edhe pas lidhjeve simbolike; analiza ka kufij për skedarët, madhësinë dhe kohën; dhe gabimet kthehen pa detaje të brendshme. Meqë çdo faqe e hapur në shfletues mund ta arrijë localhost-in, refuzohen edhe emrat jo-lokalë te koka Host (DNS rebinding), kërkesat POST nga origjina të huaja dhe shfaqja e ndërfaqes brenda një faqeje tjetër. Importi nga GitHub ruan vetëm skedarët «.java» të një depoje publike, me kufij madhësie dhe me çdo shteg brenda dosjes së synuar.</w:t>
+      </w:r>
+    </w:p>
+    <w:p>
+      <w:pPr>
+        <w:spacing w:line="360" w:lineRule="auto"/>
+        <w:ind w:firstLine="360"/>
+        <w:jc w:val="both"/>
+      </w:pPr>
+      <w:r>
+        <w:rPr>
+          <w:rFonts w:ascii="Times New Roman" w:hAnsi="Times New Roman" w:eastAsia="Times New Roman"/>
+          <w:b w:val="0"/>
+          <w:caps w:val="0"/>
+          <w:sz w:val="24"/>
+        </w:rPr>
+        <w:t>Shkrimi në disk është i vetmi veprim që ndryshon kodin e autorit, ndaj kërkon konfirmim të qartë, një depo git pa ndryshime të pakomituara dhe skedarë që git-i i ndjek, që një «git restore» t'i kthejë të gjitha. Përndryshe refuzohet me arsyen përkatëse. Shkruhen vetëm rishkrimet që kaluan verifikimin.</w:t>
+      </w:r>
+    </w:p>
+    <w:p>
+      <w:pPr>
+        <w:spacing w:line="360" w:lineRule="auto"/>
+        <w:ind w:firstLine="360"/>
+        <w:jc w:val="both"/>
+      </w:pPr>
+      <w:r>
+        <w:rPr>
+          <w:rFonts w:ascii="Times New Roman" w:hAnsi="Times New Roman" w:eastAsia="Times New Roman"/>
+          <w:b w:val="0"/>
+          <w:caps w:val="0"/>
+          <w:sz w:val="24"/>
+        </w:rPr>
+        <w:t>Ndërfaqja është aplikacion React me TypeScript, që shërbehet nga i njëjti proces si API-ja. Projekti zgjidhet duke shfletuar dosjet ose duke importuar një depo. Për çdo gjetje shfaqen kushtet me vlerat e matura, shpjegimi i modelit, dhe diff-i i rishkrimit ose arsyeja e refuzimit. Pas shkrimit në disk tregohet cilat erëra u hoqën dhe cilat u shfaqën.</w:t>
+      </w:r>
+    </w:p>
+    <w:p>
+      <w:pPr>
+        <w:pStyle w:val="Heading2"/>
+      </w:pPr>
+      <w:r>
+        <w:rPr>
+          <w:rFonts w:ascii="Times New Roman" w:hAnsi="Times New Roman" w:eastAsia="Times New Roman"/>
+          <w:b/>
+          <w:caps w:val="0"/>
+          <w:sz w:val="24"/>
+        </w:rPr>
+        <w:t>4.9 Matja e performancës</w:t>
+      </w:r>
+    </w:p>
+    <w:p>
+      <w:pPr>
+        <w:spacing w:line="360" w:lineRule="auto"/>
+        <w:ind w:firstLine="360"/>
+        <w:jc w:val="both"/>
+      </w:pPr>
+      <w:r>
+        <w:rPr>
+          <w:rFonts w:ascii="Times New Roman" w:hAnsi="Times New Roman" w:eastAsia="Times New Roman"/>
+          <w:b w:val="0"/>
+          <w:caps w:val="0"/>
+          <w:sz w:val="24"/>
+        </w:rPr>
+        <w:t>Detektimi vlerësohet si klasifikim binar mbi etiketën e Nënkapitullit 4.3. Te matrica konfuze, TP janë mostrat pozitive që detektori i shënon, FP negativet që shënon, FN pozitivet që i humbet dhe TN negativet që i lë. Prej saj llogariten precizioni, recall-i dhe F1:</w:t>
+      </w:r>
+    </w:p>
+    <w:p>
+      <w:pPr>
+        <w:keepLines/>
+        <w:tabs>
+          <w:tab w:pos="4419" w:val="center"/>
+          <w:tab w:pos="8838" w:val="right"/>
+        </w:tabs>
+        <w:spacing w:line="360" w:lineRule="auto"/>
+        <w:jc w:val="both"/>
+      </w:pPr>
+      <w:r>
+        <w:rPr>
+          <w:rFonts w:ascii="Times New Roman" w:hAnsi="Times New Roman" w:eastAsia="Times New Roman"/>
+          <w:b w:val="0"/>
+          <w:caps w:val="0"/>
+          <w:sz w:val="24"/>
+        </w:rPr>
+        <w:tab/>
+        <w:t>P = TP / (TP + FP)</w:t>
+        <w:tab/>
+        <w:t>(4)</w:t>
+      </w:r>
+    </w:p>
+    <w:p>
+      <w:pPr>
+        <w:keepLines/>
+        <w:tabs>
+          <w:tab w:pos="4419" w:val="center"/>
+          <w:tab w:pos="8838" w:val="right"/>
+        </w:tabs>
+        <w:spacing w:line="360" w:lineRule="auto"/>
+        <w:jc w:val="both"/>
+      </w:pPr>
+      <w:r>
+        <w:rPr>
+          <w:rFonts w:ascii="Times New Roman" w:hAnsi="Times New Roman" w:eastAsia="Times New Roman"/>
+          <w:b w:val="0"/>
+          <w:caps w:val="0"/>
+          <w:sz w:val="24"/>
+        </w:rPr>
+        <w:tab/>
+        <w:t>R = TP / (TP + FN)</w:t>
+        <w:tab/>
+        <w:t>(5)</w:t>
+      </w:r>
+    </w:p>
+    <w:p>
+      <w:pPr>
+        <w:keepLines/>
+        <w:tabs>
+          <w:tab w:pos="4419" w:val="center"/>
+          <w:tab w:pos="8838" w:val="right"/>
+        </w:tabs>
+        <w:spacing w:line="360" w:lineRule="auto"/>
+        <w:jc w:val="both"/>
+      </w:pPr>
+      <w:r>
+        <w:rPr>
+          <w:rFonts w:ascii="Times New Roman" w:hAnsi="Times New Roman" w:eastAsia="Times New Roman"/>
+          <w:b w:val="0"/>
+          <w:caps w:val="0"/>
+          <w:sz w:val="24"/>
+        </w:rPr>
+        <w:tab/>
+        <w:t>F1 = 2 · P · R / (P + R)</w:t>
+        <w:tab/>
+        <w:t>(6)</w:t>
+      </w:r>
+    </w:p>
+    <w:p>
+      <w:pPr>
+        <w:spacing w:line="360" w:lineRule="auto"/>
+        <w:ind w:firstLine="360"/>
+        <w:jc w:val="both"/>
+      </w:pPr>
+      <w:r>
+        <w:rPr>
+          <w:rFonts w:ascii="Times New Roman" w:hAnsi="Times New Roman" w:eastAsia="Times New Roman"/>
+          <w:b w:val="0"/>
+          <w:caps w:val="0"/>
+          <w:sz w:val="24"/>
+        </w:rPr>
+        <w:t>Treguesi kryesor është koeficienti i korrelacionit i Matthews-it (Matthews, 1975), që i merr parasysh të katër qelizat:</w:t>
+      </w:r>
+    </w:p>
+    <w:p>
+      <w:pPr>
+        <w:keepLines/>
+        <w:tabs>
+          <w:tab w:pos="4419" w:val="center"/>
+          <w:tab w:pos="8838" w:val="right"/>
+        </w:tabs>
+        <w:spacing w:line="360" w:lineRule="auto"/>
+        <w:jc w:val="both"/>
+      </w:pPr>
+      <w:r>
+        <w:rPr>
+          <w:rFonts w:ascii="Times New Roman" w:hAnsi="Times New Roman" w:eastAsia="Times New Roman"/>
+          <w:b w:val="0"/>
+          <w:caps w:val="0"/>
+          <w:sz w:val="24"/>
+        </w:rPr>
+        <w:tab/>
+        <w:t>MCC = (TP·TN − FP·FN) / √((TP+FP)(TP+FN)(TN+FP)(TN+FN))</w:t>
+        <w:tab/>
+        <w:t>(7)</w:t>
+      </w:r>
+    </w:p>
+    <w:p>
+      <w:pPr>
+        <w:spacing w:line="360" w:lineRule="auto"/>
+        <w:ind w:firstLine="360"/>
+        <w:jc w:val="both"/>
+      </w:pPr>
+      <w:r>
+        <w:rPr>
+          <w:rFonts w:ascii="Times New Roman" w:hAnsi="Times New Roman" w:eastAsia="Times New Roman"/>
+          <w:b w:val="0"/>
+          <w:caps w:val="0"/>
+          <w:sz w:val="24"/>
+        </w:rPr>
+        <w:t>Kjo ka rëndësi kur shumica e etiketave janë negative: një detektor që nuk ndez kurrë del i papërcaktuar sipas MCC-së, ndërsa saktësia e përgjithshme do t'i jepte shifër të lartë. Chicco &amp; Jurman (2020) tregojnë se MCC-ja del e lartë vetëm kur parashikimi është i mirë në të katër qelizat, ndërsa saktësia dhe F1 mund të dalin tepër optimiste mbi bashkësi të çekuilibruara. Recall-i raportohet edhe sipas ashpërsisë që caktuan rishikuesit.</w:t>
+      </w:r>
+    </w:p>
+    <w:p>
+      <w:pPr>
+        <w:spacing w:line="360" w:lineRule="auto"/>
+        <w:ind w:firstLine="360"/>
+        <w:jc w:val="both"/>
+      </w:pPr>
+      <w:r>
+        <w:rPr>
+          <w:rFonts w:ascii="Times New Roman" w:hAnsi="Times New Roman" w:eastAsia="Times New Roman"/>
+          <w:b w:val="0"/>
+          <w:caps w:val="0"/>
+          <w:sz w:val="24"/>
+        </w:rPr>
+        <w:t>Pajtimi mes dy qasjeve matet me koeficientin kappa (Cohen, 1960), ku A është pjesa e mostrave ku dy qasjet japin të njëjtin verdikt dhe E pajtimi që pritet rastësisht nga shpeshtësia me të cilën ndez secila:</w:t>
+      </w:r>
+    </w:p>
+    <w:p>
+      <w:pPr>
+        <w:keepLines/>
+        <w:tabs>
+          <w:tab w:pos="4419" w:val="center"/>
+          <w:tab w:pos="8838" w:val="right"/>
+        </w:tabs>
+        <w:spacing w:line="360" w:lineRule="auto"/>
+        <w:jc w:val="both"/>
+      </w:pPr>
+      <w:r>
+        <w:rPr>
+          <w:rFonts w:ascii="Times New Roman" w:hAnsi="Times New Roman" w:eastAsia="Times New Roman"/>
+          <w:b w:val="0"/>
+          <w:caps w:val="0"/>
+          <w:sz w:val="24"/>
+        </w:rPr>
+        <w:tab/>
+        <w:t>κ = (A − E) / (1 − E)</w:t>
+        <w:tab/>
+        <w:t>(8)</w:t>
+      </w:r>
+    </w:p>
+    <w:p>
+      <w:pPr>
+        <w:spacing w:line="360" w:lineRule="auto"/>
+        <w:ind w:firstLine="360"/>
+        <w:jc w:val="both"/>
+      </w:pPr>
+      <w:r>
+        <w:rPr>
+          <w:rFonts w:ascii="Times New Roman" w:hAnsi="Times New Roman" w:eastAsia="Times New Roman"/>
+          <w:b w:val="0"/>
+          <w:caps w:val="0"/>
+          <w:sz w:val="24"/>
+        </w:rPr>
+        <w:t>Kappa zgjidhet sepse kur 82% e etiketave janë negative, dy detektorë që ndezin rrallë pajtohen shumë edhe rastësisht. Raportohen edhe të katër qelizat, bashkimi i dy qasjeve (mostra shënohet nëse e shënon njëra) dhe prerja e tyre (nëse e shënojnë të dyja).</w:t>
+      </w:r>
+    </w:p>
+    <w:p>
+      <w:pPr>
+        <w:spacing w:line="360" w:lineRule="auto"/>
+        <w:ind w:firstLine="360"/>
+        <w:jc w:val="both"/>
+      </w:pPr>
+      <w:r>
+        <w:rPr>
+          <w:rFonts w:ascii="Times New Roman" w:hAnsi="Times New Roman" w:eastAsia="Times New Roman"/>
+          <w:b/>
+          <w:caps w:val="0"/>
+          <w:sz w:val="24"/>
+        </w:rPr>
+        <w:t>Ndjeshmëria ndaj pragjeve.</w:t>
+      </w:r>
+      <w:r>
+        <w:rPr>
+          <w:rFonts w:ascii="Times New Roman" w:hAnsi="Times New Roman" w:eastAsia="Times New Roman"/>
+          <w:b w:val="0"/>
+          <w:caps w:val="0"/>
+          <w:sz w:val="24"/>
+        </w:rPr>
+        <w:t xml:space="preserve"> Secili prag i katër strategjive të vlerësuara shumëzohet me faktorët 0.5, 0.75, 1, 1.25, 1.5, 2, një prag në një kohë dhe me të tjerët te vlerat e botuara, dhe strategjia pikëzohet sërish. Pragjet nuk hyjnë në matje, ndaj kjo bëhet mbi tabelën e ruajtur të veçorive. Vlera që jep MCC-në më të lartë nuk adoptohet: e zgjedhur mbi të njëjtën bashkësi mbi të cilën raportohet, ajo do të matte sa mirë u përshtat pragu, jo sa mirë detekton strategjia.</w:t>
+      </w:r>
+    </w:p>
+    <w:p>
+      <w:pPr>
+        <w:spacing w:line="360" w:lineRule="auto"/>
+        <w:ind w:firstLine="360"/>
+        <w:jc w:val="both"/>
+      </w:pPr>
+      <w:r>
+        <w:rPr>
+          <w:rFonts w:ascii="Times New Roman" w:hAnsi="Times New Roman" w:eastAsia="Times New Roman"/>
+          <w:b/>
+          <w:caps w:val="0"/>
+          <w:sz w:val="24"/>
+        </w:rPr>
+        <w:t>Kalibrimi jashtë fold-it.</w:t>
+      </w:r>
+      <w:r>
+        <w:rPr>
+          <w:rFonts w:ascii="Times New Roman" w:hAnsi="Times New Roman" w:eastAsia="Times New Roman"/>
+          <w:b w:val="0"/>
+          <w:caps w:val="0"/>
+          <w:sz w:val="24"/>
+        </w:rPr>
+        <w:t xml:space="preserve"> Për një shifër të ndershme me pragje të lëvizura, korpusi ndahet në pesë folde sipas depos, si te Qasja B. Për secilin fold, nga i njëjti rrjet faktorësh zgjidhet pragu me MCC-në më të lartë mbi foldet e tjera, dhe ai zbatohet mbi foldin e mbajtur jashtë. Parashikimet e të gjitha foldeve bashkohen dhe pikëzohen një herë, ndaj shifra është jashtë fold-it në të njëjtin kuptim me atë të modeleve.</w:t>
+      </w:r>
+    </w:p>
+    <w:p>
+      <w:pPr>
+        <w:spacing w:line="360" w:lineRule="auto"/>
+        <w:ind w:firstLine="360"/>
+        <w:jc w:val="both"/>
+      </w:pPr>
+      <w:r>
+        <w:rPr>
+          <w:rFonts w:ascii="Times New Roman" w:hAnsi="Times New Roman" w:eastAsia="Times New Roman"/>
+          <w:b/>
+          <w:caps w:val="0"/>
+          <w:sz w:val="24"/>
+        </w:rPr>
+        <w:t>Intervalet e besimit.</w:t>
+      </w:r>
+      <w:r>
+        <w:rPr>
+          <w:rFonts w:ascii="Times New Roman" w:hAnsi="Times New Roman" w:eastAsia="Times New Roman"/>
+          <w:b w:val="0"/>
+          <w:caps w:val="0"/>
+          <w:sz w:val="24"/>
+        </w:rPr>
+        <w:t xml:space="preserve"> Çdo tregues rillogaritet mbi 2000 rimostrime me kthim (Efron &amp; Tibshirani, 1993). Njësia e rimostrimit është depoja e jo mostra, që mostrat e një projekti të mbeten bashkë, dhe intervali 95% merret nga percentilet 2.5 dhe 97.5. Për dallimin B − A raportohet edhe pjesa e rimostrimeve ku ai ruan shenjën pozitive, dhe dallimi rillogaritet edhe kur Qasja A merr pragun e saj më të mirë nga fshirja.</w:t>
+      </w:r>
+    </w:p>
+    <w:p>
+      <w:pPr>
+        <w:spacing w:line="360" w:lineRule="auto"/>
+        <w:ind w:firstLine="360"/>
+        <w:jc w:val="both"/>
+      </w:pPr>
+      <w:r>
+        <w:rPr>
+          <w:rFonts w:ascii="Times New Roman" w:hAnsi="Times New Roman" w:eastAsia="Times New Roman"/>
+          <w:b/>
+          <w:caps w:val="0"/>
+          <w:sz w:val="24"/>
+        </w:rPr>
+        <w:t>Pajtimi mes rishikuesve.</w:t>
+      </w:r>
+      <w:r>
+        <w:rPr>
+          <w:rFonts w:ascii="Times New Roman" w:hAnsi="Times New Roman" w:eastAsia="Times New Roman"/>
+          <w:b w:val="0"/>
+          <w:caps w:val="0"/>
+          <w:sz w:val="24"/>
+        </w:rPr>
+        <w:t xml:space="preserve"> Për çdo mostër me dy rishikime ose më shumë, çdo çift rishikimesh kalon nëpër të njëjtën matricë konfuze: njëri rishikues merret si e vërtetë, tjetri si parashikim. MCC-ja që del shërben si tavan orientues për detektorët dhe jo si kufi i rreptë, sepse etiketa e agreguar e zbut zhurmën e një rishikuesi të vetëm.</w:t>
+      </w:r>
+    </w:p>
+    <w:p>
+      <w:pPr>
+        <w:spacing w:line="360" w:lineRule="auto"/>
+        <w:ind w:firstLine="360"/>
+        <w:jc w:val="both"/>
+      </w:pPr>
+      <w:r>
+        <w:rPr>
+          <w:rFonts w:ascii="Times New Roman" w:hAnsi="Times New Roman" w:eastAsia="Times New Roman"/>
+          <w:b w:val="0"/>
+          <w:caps w:val="0"/>
+          <w:sz w:val="24"/>
+        </w:rPr>
+        <w:t>Motori i refaktorimit matet ndryshe: numërohen vendet e detektuara, të transformuara dhe të refuzuara sipas arsyes, me verdiktin e verifikimit për çdo rishkrim.</w:t>
+      </w:r>
+    </w:p>
+    <w:p>
+      <w:pPr>
+        <w:spacing w:line="360" w:lineRule="auto"/>
+        <w:ind w:firstLine="360"/>
+        <w:jc w:val="both"/>
+      </w:pPr>
+      <w:r>
+        <w:rPr>
+          <w:rFonts w:ascii="Times New Roman" w:hAnsi="Times New Roman" w:eastAsia="Times New Roman"/>
+          <w:b/>
+          <w:caps w:val="0"/>
+          <w:sz w:val="24"/>
+        </w:rPr>
+        <w:t>Krahasimi me PMD-në.</w:t>
+      </w:r>
+      <w:r>
+        <w:rPr>
+          <w:rFonts w:ascii="Times New Roman" w:hAnsi="Times New Roman" w:eastAsia="Times New Roman"/>
+          <w:b w:val="0"/>
+          <w:caps w:val="0"/>
+          <w:sz w:val="24"/>
+        </w:rPr>
+        <w:t xml:space="preserve"> Si krahasim i jashtëm, i njëjti vlerësim zbatohet te PMD (PMD Team, 2026), versioni 7.27.0, rregullat GodClass dhe DataClass të të cilit bazohen te strategjitë e Lanza &amp; Marinescu (2006). PMD ekzekutohet me pragjet e veta, pikëzohet njësoj si Qasja A, dhe shkeljet lidhen me entitetet sipas emrit të klasës dhe të metodës. Meqë analizon një skedar në një kohë, ATFD-në e llogarit vetëm brenda skedarit, gjë që e vë në disavantazh; heqja e këtij handikapi do të kërkonte ndërtimin e çdo depoje në commit-in e vet historik. Rregull për Feature Envy PMD nuk ka, ndaj LawOfDemeter, që mat zinxhirët e thirrjeve, raportohet vetëm si referencë. Skedarët që PMD nuk i lexon dhe depot që nuk i përpunon hiqen nga të dyja anët, që dështimi i mjetit të mos lexohet si mosgjetje, dhe një raport XML i pavlefshëm lexohet me një rrugë rikuperimi që jep të njëjtat fusha. Dallimi i MCC-së ka interval të çiftuar, me të njëjtat rimostrime depo për të dyja anët.</w:t>
+      </w:r>
+    </w:p>
+    <w:p>
+      <w:pPr>
+        <w:pStyle w:val="Heading2"/>
+      </w:pPr>
+      <w:r>
+        <w:rPr>
+          <w:rFonts w:ascii="Times New Roman" w:hAnsi="Times New Roman" w:eastAsia="Times New Roman"/>
+          <w:b/>
+          <w:caps w:val="0"/>
+          <w:sz w:val="24"/>
+        </w:rPr>
+        <w:t>4.10 Validimi i sistemit</w:t>
+      </w:r>
+    </w:p>
+    <w:p>
+      <w:pPr>
+        <w:spacing w:line="360" w:lineRule="auto"/>
+        <w:ind w:firstLine="360"/>
+        <w:jc w:val="both"/>
+      </w:pPr>
+      <w:r>
+        <w:rPr>
+          <w:rFonts w:ascii="Times New Roman" w:hAnsi="Times New Roman" w:eastAsia="Times New Roman"/>
           <w:b w:val="0"/>
           <w:caps w:val="0"/>
           <w:sz w:val="24"/>
@@ -4992,20 +6071,6 @@
     </w:p>
     <w:p>
       <w:pPr>
-        <w:pStyle w:val="Heading2"/>
-      </w:pPr>
-      <w:r>
-        <w:rPr>
-          <w:rFonts w:ascii="Times New Roman" w:hAnsi="Times New Roman" w:eastAsia="Times New Roman"/>
-          <w:b/>
-          <w:caps w:val="0"/>
-          <w:sz w:val="24"/>
-        </w:rPr>
-        <w:t>4.11 Riprodhueshmëria</w:t>
-      </w:r>
-    </w:p>
-    <w:p>
-      <w:pPr>
         <w:spacing w:line="360" w:lineRule="auto"/>
         <w:ind w:firstLine="360"/>
         <w:jc w:val="both"/>
@@ -5017,7 +6082,21 @@
           <w:caps w:val="0"/>
           <w:sz w:val="24"/>
         </w:rPr>
-        <w:t>Çdo numër në punim prodhohet nga një skript dhe ruhet si CSV ose JSON në depo. Farat e rastësisë dhe versionet e varësive janë të fiksuara, dhe mjedisi regjistrohet në çdo skedar rezultati.</w:t>
+        <w:t>Edhe vetë ky dokument kontrollohet automatikisht: çdo citim duhet të ketë referencë dhe anasjelltas, formati krahasohet me rregullat e shabllonit, tabela e riprodhimit krahasohet me skriptet që ekzistojnë, dhe fjalitë e përsëritura mes kapitujve raportohen.</w:t>
+      </w:r>
+    </w:p>
+    <w:p>
+      <w:pPr>
+        <w:pStyle w:val="Heading2"/>
+      </w:pPr>
+      <w:r>
+        <w:rPr>
+          <w:rFonts w:ascii="Times New Roman" w:hAnsi="Times New Roman" w:eastAsia="Times New Roman"/>
+          <w:b/>
+          <w:caps w:val="0"/>
+          <w:sz w:val="24"/>
+        </w:rPr>
+        <w:t>4.11 Riprodhueshmëria dhe mjedisi</w:t>
       </w:r>
     </w:p>
     <w:p>
@@ -5033,21 +6112,7 @@
           <w:caps w:val="0"/>
           <w:sz w:val="24"/>
         </w:rPr>
-        <w:t>Kalimi mbi korpusin, afro një orë për rreth 690 mijë skedarë, bëhet një herë dhe prodhon një tabelë veçorish që ruhet në depo. Pragjet nuk hyjnë në këtë kalim, ndaj analiza e ndjeshmërisë i riekzekuton detektorët mbi rreshtat e ruajtur brenda sekondash. Radha e plotë e skripteve është te Shtojca 8.5.</w:t>
-      </w:r>
-    </w:p>
-    <w:p>
-      <w:pPr>
-        <w:pStyle w:val="Heading2"/>
-      </w:pPr>
-      <w:r>
-        <w:rPr>
-          <w:rFonts w:ascii="Times New Roman" w:hAnsi="Times New Roman" w:eastAsia="Times New Roman"/>
-          <w:b/>
-          <w:caps w:val="0"/>
-          <w:sz w:val="24"/>
-        </w:rPr>
-        <w:t>4.12 Konsideratat etike</w:t>
+        <w:t>Çdo numër në punim prodhohet nga një skript dhe ruhet si CSV ose JSON në depo. Farat e rastësisë dhe versionet e varësive janë të fiksuara, dhe mjedisi regjistrohet në çdo skedar rezultati.</w:t>
       </w:r>
     </w:p>
     <w:p>
@@ -5063,7 +6128,7 @@
           <w:caps w:val="0"/>
           <w:sz w:val="24"/>
         </w:rPr>
-        <w:t>Punimi nuk mbledh të dhëna nga njerëz, ndaj pëlqimi i informuar dhe konfidencialiteti nuk zbatohen këtu. Të gjitha të dhënat janë publike: gjykimet e MLCQ-së, të mbledhura dhe publikuara nga autorët e saj (Madeyski &amp; Lewowski, 2020), dhe kodi i depove Java me burim të hapur ku ndodhen mostrat.</w:t>
+        <w:t>Kalimi mbi korpusin, afro një orë për rreth 690 mijë skedarë, bëhet një herë dhe prodhon një tabelë veçorish që ruhet në depo. Pragjet nuk hyjnë në këtë kalim, ndaj analiza e ndjeshmërisë i riekzekuton detektorët mbi rreshtat e ruajtur brenda sekondash. Radha e plotë e skripteve është te Shtojca 8.5.</w:t>
       </w:r>
     </w:p>
     <w:p>
@@ -5075,11 +6140,212 @@
       <w:r>
         <w:rPr>
           <w:rFonts w:ascii="Times New Roman" w:hAnsi="Times New Roman" w:eastAsia="Times New Roman"/>
+          <w:b/>
+          <w:caps w:val="0"/>
+          <w:sz w:val="24"/>
+        </w:rPr>
+        <w:t>Mjedisi eksperimental.</w:t>
+      </w:r>
+      <w:r>
+        <w:rPr>
+          <w:rFonts w:ascii="Times New Roman" w:hAnsi="Times New Roman" w:eastAsia="Times New Roman"/>
           <w:b w:val="0"/>
           <w:caps w:val="0"/>
           <w:sz w:val="24"/>
         </w:rPr>
+        <w:t xml:space="preserve"> Eksperimentet u ekzekutuan në një laptop pa kartë grafike të dedikuar, me Windows 11, Python 3.13.1 dhe JDK 21. Çdo skedar rezultati mban commit-in e kodit që e prodhoi, platformën dhe versionin e Python-it, ndaj një shifër lidhet gjithmonë me kodin e saktë që e nxori. Trajnimi i modeleve zgjat disa minuta, ndërsa ekzekutimi i motorit të refaktorimit mbi tërë korpusin disa orë, sepse javac thirret dy herë për çdo skedar të rishkruar. Asnjë hap nuk kërkon shërbim në re apo me pagesë.</w:t>
+      </w:r>
+    </w:p>
+    <w:p>
+      <w:pPr>
+        <w:pStyle w:val="Heading2"/>
+      </w:pPr>
+      <w:r>
+        <w:rPr>
+          <w:rFonts w:ascii="Times New Roman" w:hAnsi="Times New Roman" w:eastAsia="Times New Roman"/>
+          <w:b/>
+          <w:caps w:val="0"/>
+          <w:sz w:val="24"/>
+        </w:rPr>
+        <w:t>4.12 Konsideratat etike</w:t>
+      </w:r>
+    </w:p>
+    <w:p>
+      <w:pPr>
+        <w:spacing w:line="360" w:lineRule="auto"/>
+        <w:ind w:firstLine="360"/>
+        <w:jc w:val="both"/>
+      </w:pPr>
+      <w:r>
+        <w:rPr>
+          <w:rFonts w:ascii="Times New Roman" w:hAnsi="Times New Roman" w:eastAsia="Times New Roman"/>
+          <w:b w:val="0"/>
+          <w:caps w:val="0"/>
+          <w:sz w:val="24"/>
+        </w:rPr>
+        <w:t>Punimi nuk mbledh të dhëna nga njerëz, ndaj pëlqimi i informuar dhe konfidencialiteti nuk zbatohen këtu. Të gjitha të dhënat janë publike: gjykimet e MLCQ-së, të mbledhura dhe publikuara nga autorët e saj (Madeyski &amp; Lewowski, 2020), dhe kodi i depove Java me burim të hapur ku ndodhen mostrat.</w:t>
+      </w:r>
+    </w:p>
+    <w:p>
+      <w:pPr>
+        <w:spacing w:line="360" w:lineRule="auto"/>
+        <w:ind w:firstLine="360"/>
+        <w:jc w:val="both"/>
+      </w:pPr>
+      <w:r>
+        <w:rPr>
+          <w:rFonts w:ascii="Times New Roman" w:hAnsi="Times New Roman" w:eastAsia="Times New Roman"/>
+          <w:b w:val="0"/>
+          <w:caps w:val="0"/>
+          <w:sz w:val="24"/>
+        </w:rPr>
         <w:t>Ky kod përdoret vetëm si objekt matjeje dhe nuk ekzekutohet kurrë: analiza e lexon si tekst, dhe verifikimi e kompilon me javac pa e nisur. Korpusi nuk shpërndahet me punimin; kush do t'i riprodhojë rezultatet e shkarkon nga burimet origjinale me skriptin e parë të Shtojcës 8.5. Rezultatet negative raportohen njësoj si ato pozitive.</w:t>
+      </w:r>
+    </w:p>
+    <w:p>
+      <w:pPr>
+        <w:spacing w:line="360" w:lineRule="auto"/>
+        <w:ind w:firstLine="360"/>
+        <w:jc w:val="both"/>
+      </w:pPr>
+      <w:r>
+        <w:rPr>
+          <w:rFonts w:ascii="Times New Roman" w:hAnsi="Times New Roman" w:eastAsia="Times New Roman"/>
+          <w:b w:val="0"/>
+          <w:caps w:val="0"/>
+          <w:sz w:val="24"/>
+        </w:rPr>
+        <w:t>Dataset-i MLCQ dhe depot e korpusit mbeten nën licencat e veta. Kodi i sistemit publikohet nën licencën MIT, ndërsa asnjë pjesë e kodit të huaj nuk shpërndahet bashkë me të.</w:t>
+      </w:r>
+    </w:p>
+    <w:p>
+      <w:pPr>
+        <w:pStyle w:val="Heading2"/>
+      </w:pPr>
+      <w:r>
+        <w:rPr>
+          <w:rFonts w:ascii="Times New Roman" w:hAnsi="Times New Roman" w:eastAsia="Times New Roman"/>
+          <w:b/>
+          <w:caps w:val="0"/>
+          <w:sz w:val="24"/>
+        </w:rPr>
+        <w:t>4.13 Kërcënimet ndaj vlefshmërisë</w:t>
+      </w:r>
+    </w:p>
+    <w:p>
+      <w:pPr>
+        <w:spacing w:line="360" w:lineRule="auto"/>
+        <w:ind w:firstLine="360"/>
+        <w:jc w:val="both"/>
+      </w:pPr>
+      <w:r>
+        <w:rPr>
+          <w:rFonts w:ascii="Times New Roman" w:hAnsi="Times New Roman" w:eastAsia="Times New Roman"/>
+          <w:b w:val="0"/>
+          <w:caps w:val="0"/>
+          <w:sz w:val="24"/>
+        </w:rPr>
+        <w:t>Kërcënimet grupohen sipas katër llojeve të vlefshmërisë që përdor literatura e eksperimenteve në inxhinierinë softuerike (Wohlin et al., 2012), secili me masën që e zbut.</w:t>
+      </w:r>
+    </w:p>
+    <w:p>
+      <w:pPr>
+        <w:spacing w:line="360" w:lineRule="auto"/>
+        <w:ind w:firstLine="360"/>
+        <w:jc w:val="both"/>
+      </w:pPr>
+      <w:r>
+        <w:rPr>
+          <w:rFonts w:ascii="Times New Roman" w:hAnsi="Times New Roman" w:eastAsia="Times New Roman"/>
+          <w:b/>
+          <w:caps w:val="0"/>
+          <w:sz w:val="24"/>
+        </w:rPr>
+        <w:t>Vlefshmëria e konstruktit.</w:t>
+      </w:r>
+      <w:r>
+        <w:rPr>
+          <w:rFonts w:ascii="Times New Roman" w:hAnsi="Times New Roman" w:eastAsia="Times New Roman"/>
+          <w:b w:val="0"/>
+          <w:caps w:val="0"/>
+          <w:sz w:val="24"/>
+        </w:rPr>
+        <w:t xml:space="preserve"> Pyetja është nëse shifra mat atë që pretendon. Etiketat e MLCQ-së janë gjykime njerëzore, dhe mënyra si bashkohen i ndryshon pozitivët; prandaj çdo agregim alternativ raportohet veç (Nënkapitulli 4.3). Numërimi i rreshtave dhe njohja e akses-metodave nga parashtesa janë zgjedhje që prekin disa metrika, dhe të dyja janë deklaruar te Nënkapitulli 4.4. Te refaktorimi, kompilimi provon se forma e kodit mbetet e ligjshme, jo se sjellja mbetet e njëjtë.</w:t>
+      </w:r>
+    </w:p>
+    <w:p>
+      <w:pPr>
+        <w:spacing w:line="360" w:lineRule="auto"/>
+        <w:ind w:firstLine="360"/>
+        <w:jc w:val="both"/>
+      </w:pPr>
+      <w:r>
+        <w:rPr>
+          <w:rFonts w:ascii="Times New Roman" w:hAnsi="Times New Roman" w:eastAsia="Times New Roman"/>
+          <w:b/>
+          <w:caps w:val="0"/>
+          <w:sz w:val="24"/>
+        </w:rPr>
+        <w:t>Vlefshmëria e brendshme.</w:t>
+      </w:r>
+      <w:r>
+        <w:rPr>
+          <w:rFonts w:ascii="Times New Roman" w:hAnsi="Times New Roman" w:eastAsia="Times New Roman"/>
+          <w:b w:val="0"/>
+          <w:caps w:val="0"/>
+          <w:sz w:val="24"/>
+        </w:rPr>
+        <w:t xml:space="preserve"> Një lidhje e gabuar mes mostrës dhe entitetit do t'i prishte të gjitha shifrat pa u vënë re; prandaj përputhja ankorohet te rreshtat, kontrollohet me emrin, dhe çdo mostër e palidhur raportohet me shkakun. Rrjedhja mes trajnimit dhe testimit pengohet nga ndarja sipas depos, dhe peshat në vend të mbi-mostrimit e ruajnë atë ndarje. Pragjet pa burim të botuar janë emërtuar te Nënkapitulli 4.5.</w:t>
+      </w:r>
+    </w:p>
+    <w:p>
+      <w:pPr>
+        <w:spacing w:line="360" w:lineRule="auto"/>
+        <w:ind w:firstLine="360"/>
+        <w:jc w:val="both"/>
+      </w:pPr>
+      <w:r>
+        <w:rPr>
+          <w:rFonts w:ascii="Times New Roman" w:hAnsi="Times New Roman" w:eastAsia="Times New Roman"/>
+          <w:b/>
+          <w:caps w:val="0"/>
+          <w:sz w:val="24"/>
+        </w:rPr>
+        <w:t>Vlefshmëria e jashtme.</w:t>
+      </w:r>
+      <w:r>
+        <w:rPr>
+          <w:rFonts w:ascii="Times New Roman" w:hAnsi="Times New Roman" w:eastAsia="Times New Roman"/>
+          <w:b w:val="0"/>
+          <w:caps w:val="0"/>
+          <w:sz w:val="24"/>
+        </w:rPr>
+        <w:t xml:space="preserve"> Rezultatet mbështeten te kod Java me burim të hapur, katër erëra dhe një dataset të vetëm, dhe asgjë këtu nuk provon se transferohen te gjuhë të tjera apo te kodi i mbyllur industrial. Humbja e disa depove mund ta anojë mostrën, dhe ky rrezik nuk matet dot pa kodin e tyre.</w:t>
+      </w:r>
+    </w:p>
+    <w:p>
+      <w:pPr>
+        <w:spacing w:line="360" w:lineRule="auto"/>
+        <w:ind w:firstLine="360"/>
+        <w:jc w:val="both"/>
+      </w:pPr>
+      <w:r>
+        <w:rPr>
+          <w:rFonts w:ascii="Times New Roman" w:hAnsi="Times New Roman" w:eastAsia="Times New Roman"/>
+          <w:b/>
+          <w:caps w:val="0"/>
+          <w:sz w:val="24"/>
+        </w:rPr>
+        <w:t>Vlefshmëria e përfundimeve.</w:t>
+      </w:r>
+      <w:r>
+        <w:rPr>
+          <w:rFonts w:ascii="Times New Roman" w:hAnsi="Times New Roman" w:eastAsia="Times New Roman"/>
+          <w:b w:val="0"/>
+          <w:caps w:val="0"/>
+          <w:sz w:val="24"/>
+        </w:rPr>
+        <w:t xml:space="preserve"> Çdo model trajnohet një herë, me parametra të fiksuar dhe pa akordim. Pasiguria që vjen nga korpusi matet me bootstrap sipas depos, por ajo që vjen nga ndryshimi i farës nuk matet. Një dallim, intervali i të cilit përfshin zeron, raportohet si i padallueshëm dhe jo si fitore e njërës anë.</w:t>
       </w:r>
     </w:p>
     <w:p>
@@ -5197,7 +6463,7 @@
           <w:caps w:val="0"/>
           <w:sz w:val="24"/>
         </w:rPr>
-        <w:t>Nënkapitujt 5.1 deri 5.4 u përgjigjen pyetjeve kërkimore sipas radhës së tyre. Tri analiza pas tyre tregojnë sa peshë mbajnë ato përgjigje: sa varen nga pragjet (5.5), si dalin përballë një mjeti ekzistues (5.6) dhe sa të gjera janë intervalet e tyre të besimit (5.7). Analizat e tjera dytësore janë te Shtojcat 8.6 deri 8.8.</w:t>
+        <w:t>Rezultatet kryesore ndjekin pyetjet kërkimore: 5.1 i përgjigjet PK1, 5.2 dhe 5.3 PK2, dhe 5.4 PK3. Vëzhgimet dytësore vijnë pas tyre: ndjeshmëria ndaj pragjeve (5.5), krahasimi me një mjet ekzistues (5.6), dhe intervalet e besimit bashkë me pajtimin mes rishikuesve (5.7). Analizat e tjera dytësore janë te Shtojcat 8.6 deri 8.8.</w:t>
       </w:r>
     </w:p>
     <w:p>
@@ -14288,7 +15554,7 @@
           <w:caps w:val="0"/>
           <w:sz w:val="24"/>
         </w:rPr>
-        <w:t>Pragjet e përdorura janë ato të botuara (Shtojca 8.2), dhe pyetja e natyrshme është sa varet rezultati prej tyre. Secili prag u zhvendos veç, mes gjysmës dhe dyfishit të vlerës së vet, me të tjerët të mbajtur fiks (Tabela 17; Figura 7).</w:t>
+        <w:t>Secili prag i strategjive u zhvendos veç me faktorët e Nënkapitullit 4.9, ndërsa të tjerët mbetën te vlerat e botuara. Rreshtat renditen sipas amplitudës, pra dallimit mes MCC-së më të lartë dhe më të ulët që jep pragu (Tabela 17; Figura 7):</w:t>
       </w:r>
     </w:p>
     <w:p>
@@ -15516,7 +16782,7 @@
           <w:caps w:val="0"/>
           <w:sz w:val="24"/>
         </w:rPr>
-        <w:t>Ndarja është e qartë. Për Blob dhe Data Class rezultati mezi lëviz, pra shifrat e raportuara për to flasin për kodin. Për Long Method dhe Feature Envy amplituda është e madhe, dhe kjo do të thotë se shifra e raportuar flet po aq për pragun sa për kodin — vërejtje që duhet mbajtur parasysh sa herë krahasohen mjete të ndryshme detektimi.</w:t>
+        <w:t>Amplituda kalon 0.2 vetëm te Long Method dhe Feature Envy; te Blob dhe Data Class asnjë prag nuk e lëviz MCC-në më shumë se 0.101.</w:t>
       </w:r>
     </w:p>
     <w:p>
@@ -15532,7 +16798,7 @@
           <w:caps w:val="0"/>
           <w:sz w:val="24"/>
         </w:rPr>
-        <w:t>Te Long Method pragu i botuar rezulton konservativ për këtë korpus: ulja e tij e rrit ndjeshëm recall-in me kosto të vogël precizioni, çka sugjeron se rishikuesit e MLCQ-së e quajnë një metodë të gjatë më herët se sa e vendos pragu.</w:t>
+        <w:t>Vlera me MCC-në më të lartë është long_method_loc = 15 në vend të 30 te Long Method (MCC 0.690; recall 0.440 → 0.838, precizion 0.872 → 0.653) dhe feature_envy_fdp = 10 në vend të 5 te Feature Envy (MCC 0.411; recall 0.181 → 0.306, precizion 0.520 → 0.647).</w:t>
       </w:r>
     </w:p>
     <w:p>
@@ -15548,39 +16814,7 @@
           <w:caps w:val="0"/>
           <w:sz w:val="24"/>
         </w:rPr>
-        <w:t>Te Feature Envy vërehet diçka më e veçantë. Klauzola që kërkon që numri i klasave-burim të jetë i vogël, kur relaksohet, i përmirëson njëkohësisht edhe precizionin edhe recall-in. Një kufizim që heq pozitivë të vërtetë pa hequr të rremë nuk po e ndan sinjalin nga zhurma; pra ajo klauzolë, të paktën mbi këtë korpus, nuk e bën punën për të cilën është vendosur.</w:t>
-      </w:r>
-    </w:p>
-    <w:p>
-      <w:pPr>
-        <w:spacing w:line="360" w:lineRule="auto"/>
-        <w:ind w:firstLine="360"/>
-        <w:jc w:val="both"/>
-      </w:pPr>
-      <w:r>
-        <w:rPr>
-          <w:rFonts w:ascii="Times New Roman" w:hAnsi="Times New Roman" w:eastAsia="Times New Roman"/>
-          <w:b w:val="0"/>
-          <w:caps w:val="0"/>
-          <w:sz w:val="24"/>
-        </w:rPr>
-        <w:t>Këto vlera nuk adoptohen: një prag i zgjedhur sepse jep shifrën më të mirë mbi bashkësinë e vlerësimit do të matte sa mirë u zgjodh pragu, jo sa mirë funksionon detektimi. Kalibrimi i ndershëm kërkon bashkësi të ndara, dhe kjo bëhet më poshtë.</w:t>
-      </w:r>
-    </w:p>
-    <w:p>
-      <w:pPr>
-        <w:spacing w:line="360" w:lineRule="auto"/>
-        <w:ind w:firstLine="360"/>
-        <w:jc w:val="both"/>
-      </w:pPr>
-      <w:r>
-        <w:rPr>
-          <w:rFonts w:ascii="Times New Roman" w:hAnsi="Times New Roman" w:eastAsia="Times New Roman"/>
-          <w:b w:val="0"/>
-          <w:caps w:val="0"/>
-          <w:sz w:val="24"/>
-        </w:rPr>
-        <w:t>Kalibrimi u bë me 5 folde të ndara sipas depos, si te Qasja B. Për secilin fold pragu u zgjodh duke parë vetëm foldet e trajnimit dhe u pikëzua mbi foldin e mbajtur jashtë; parashikimet u bashkuan dhe u pikëzuan një herë, ndaj shifra është jashtë-fold-it në të njëjtin kuptim me atë të modeleve (Tabela 18).</w:t>
+        <w:t>Me kalibrimin jashtë fold-it (5 folde sipas depos, Nënkapitulli 4.9), rregullat arrijnë këto vlera; kolona e fundit jep pragun që zgjodhi secili fold dhe sa herë u zgjodh (Tabela 18):</w:t>
       </w:r>
     </w:p>
     <w:p>
@@ -16242,25 +17476,7 @@
           <w:caps w:val="0"/>
           <w:sz w:val="24"/>
         </w:rPr>
-        <w:t xml:space="preserve">Rezultati ndahet në dy pjesë. Për Feature Envy kalibrimi jep fitimin më të madh dhe më të besueshmin: </w:t>
-      </w:r>
-      <w:r>
-        <w:rPr>
-          <w:rFonts w:ascii="Times New Roman" w:hAnsi="Times New Roman" w:eastAsia="Times New Roman"/>
-          <w:b/>
-          <w:caps w:val="0"/>
-          <w:sz w:val="24"/>
-        </w:rPr>
-        <w:t>të pesë foldet zgjodhën të njëjtën vlerë</w:t>
-      </w:r>
-      <w:r>
-        <w:rPr>
-          <w:rFonts w:ascii="Times New Roman" w:hAnsi="Times New Roman" w:eastAsia="Times New Roman"/>
-          <w:b w:val="0"/>
-          <w:caps w:val="0"/>
-          <w:sz w:val="24"/>
-        </w:rPr>
-        <w:t>, dhe përmirësohen njëkohësisht edhe precizioni edhe recall-i, çka e forcon dyshimin e mësipërm për klauzolën e numrit të klasave-burim. Për Long Method fitimi është gjithashtu i qartë, por foldet ndahen mes dy vlerave dhe blihet me precizion.</w:t>
+        <w:t>Të gjitha foldet zgjodhën të njëjtën vlerë vetëm te Feature Envy; te Blob dhe Long Method ranë dakord për pragun, por jo për vlerën; te Data Class katër folde lëvizën data_class_woc dhe një fold lëvizi data_class_wmc_low.</w:t>
       </w:r>
     </w:p>
     <w:p>
@@ -16276,7 +17492,7 @@
           <w:caps w:val="0"/>
           <w:sz w:val="24"/>
         </w:rPr>
-        <w:t>Për Blob dhe Data Class kalibrimi nuk ndihmon: te e para lëvizja është e vogël, te e dyta rezultati bie nën atë të pragjeve të botuara. Dhe foldet e Data Class-it nuk pajtohen as për cilin prag të lëvizin — dy prej tyre zgjedhin një prag krejt tjetër nga tre të tjerët. Kur zgjedhja varet kaq shumë nga cila pjesë e korpusit shihet, «pragu optimal» është veti e bashkësisë dhe jo e gjuhës.</w:t>
+        <w:t>Recall-i u rrit te të katër erërat, precizioni vetëm te Feature Envy, dhe MCC-ja te tri nga katër erërat.</w:t>
       </w:r>
     </w:p>
     <w:p>
@@ -16292,7 +17508,7 @@
           <w:caps w:val="0"/>
           <w:sz w:val="24"/>
         </w:rPr>
-        <w:t>Vlen të vihet re edhe dallimi me fshirjen. Ajo sugjeronte 0.690 për Long Method; kalibrimi i ndershëm jep 0.666. Diferenca është pikërisht ajo që fitohet kur zgjedhjes i lejohet ta shohë bashkësinë mbi të cilën do të raportohet, dhe arsyeja pse shifra e fshirjes nuk u adoptua.</w:t>
+        <w:t>Për Long Method, vlera më e mirë e fshirjes mbi tërë korpusin është 0.690, ndërsa kalibrimi jashtë fold-it jep 0.666.</w:t>
       </w:r>
     </w:p>
     <w:p>
@@ -16307,22 +17523,6 @@
           <w:sz w:val="24"/>
         </w:rPr>
         <w:t>5.6 Krahasimi me një mjet ekzistues</w:t>
-      </w:r>
-    </w:p>
-    <w:p>
-      <w:pPr>
-        <w:spacing w:line="360" w:lineRule="auto"/>
-        <w:ind w:firstLine="360"/>
-        <w:jc w:val="both"/>
-      </w:pPr>
-      <w:r>
-        <w:rPr>
-          <w:rFonts w:ascii="Times New Roman" w:hAnsi="Times New Roman" w:eastAsia="Times New Roman"/>
-          <w:b w:val="0"/>
-          <w:caps w:val="0"/>
-          <w:sz w:val="24"/>
-        </w:rPr>
-        <w:t>Nënkapitujt 5.1 deri 5.3 i vënë dy qasjet e këtij punimi përballë njëra-tjetrës. Ky i vë përballë një mjeti që zhvilluesi e instalon sot, sepse pyetja nuk është vetëm cila prej të dyjave është më e mirë, por a ia vlen ndonjëra.</w:t>
       </w:r>
     </w:p>
     <w:p>
@@ -17017,7 +18217,7 @@
           <w:caps w:val="0"/>
           <w:sz w:val="24"/>
         </w:rPr>
-        <w:t>Feature Envy nuk ka rresht krahasimi sepse PMD nuk ka rregull për të; LawOfDemeter, më i afërti, mat zinxhirë mesazhesh dhe nuk është matje e Feature Envy-së. Mungesa nuk është vetëm e PMD-së: as DesigniteJava nuk e përfshin mes erërave që dokumenton. JDeodorant e zbulon, sepse ndërtohet mbi identifikimin e mundësive për Move Method (Tsantalis &amp; Chatzigeorgiou, 2009), por është shtojcë e mjedisit të zhvillimit dhe varianti i tij në rresht komande nuk mban licencë. Pra erës që literatura e trajton më shpesh si objektiv refaktorimi i mungon mbështetja në mjetet e lira të përhapura.</w:t>
+        <w:t>Për Feature Envy PMD nuk ka rregull, ndaj rreshti i saj ka vetëm MCC-në e LawOfDemeter-it, rregullit më të afërt, dhe nuk ka kolonë krahasimi.</w:t>
       </w:r>
     </w:p>
     <w:p>
@@ -17033,7 +18233,21 @@
           <w:caps w:val="0"/>
           <w:sz w:val="24"/>
         </w:rPr>
-        <w:t>Krahasimi e favorizon këtë punim në drejtimin e deklaruar te Nënkapitulli 4.9, sepse PMD e llogarit ATFD-në vetëm brenda një skedari. Heqja e handikapit do të kërkonte ndërtimin e çdo depoje në commit-in e vet historik, çka korpusi nuk e lejon (Nënkapitulli 3.4).</w:t>
+        <w:t>Nga ekzekutimi, 538 skedarë nuk u lexuan dot nga PMD dhe 14 depo nuk u përpunuan fare. Mostrat e atyre depove janë hequr nga të dyja kolonat e tabelës, ndaj emëruesi i saj është më i vogël se ai i Qasjes A, e cila vlerësoi 4534 mostra.</w:t>
+      </w:r>
+    </w:p>
+    <w:p>
+      <w:pPr>
+        <w:pStyle w:val="Heading2"/>
+      </w:pPr>
+      <w:r>
+        <w:rPr>
+          <w:rFonts w:ascii="Times New Roman" w:hAnsi="Times New Roman" w:eastAsia="Times New Roman"/>
+          <w:b/>
+          <w:caps w:val="0"/>
+          <w:sz w:val="24"/>
+        </w:rPr>
+        <w:t>5.7 Intervalet e besimit dhe pajtimi mes rishikuesve</w:t>
       </w:r>
     </w:p>
     <w:p>
@@ -17049,55 +18263,7 @@
           <w:caps w:val="0"/>
           <w:sz w:val="24"/>
         </w:rPr>
-        <w:t>Nga ekzekutimi, 538 skedarë nuk u lexuan dot nga PMD dhe 14 depo nuk u përpunuan fare. Këto numërohen këtu dhe nuk lexohen si «PMD nuk gjeti asgjë»: dështimi dhe mosgjetja janë pohime të kundërta. Mostrat e atyre depove dalin nga tabela e mësipërme, dhe dalin nga të dyja kolonat njësoj, ndaj dy anët mbeten të krahasueshme. Emëruesi që mbetet është ai i tabelës; Qasja A vlerësoi 4534 mostra, dhe krahasimi mbulon ato që u përpunuan.</w:t>
-      </w:r>
-    </w:p>
-    <w:p>
-      <w:pPr>
-        <w:pStyle w:val="Heading2"/>
-      </w:pPr>
-      <w:r>
-        <w:rPr>
-          <w:rFonts w:ascii="Times New Roman" w:hAnsi="Times New Roman" w:eastAsia="Times New Roman"/>
-          <w:b/>
-          <w:caps w:val="0"/>
-          <w:sz w:val="24"/>
-        </w:rPr>
-        <w:t>5.7 Sa peshë mban një shifër e vetme</w:t>
-      </w:r>
-    </w:p>
-    <w:p>
-      <w:pPr>
-        <w:spacing w:line="360" w:lineRule="auto"/>
-        <w:ind w:firstLine="360"/>
-        <w:jc w:val="both"/>
-      </w:pPr>
-      <w:r>
-        <w:rPr>
-          <w:rFonts w:ascii="Times New Roman" w:hAnsi="Times New Roman" w:eastAsia="Times New Roman"/>
-          <w:b w:val="0"/>
-          <w:caps w:val="0"/>
-          <w:sz w:val="24"/>
-        </w:rPr>
-        <w:t xml:space="preserve">Çdo shifër e Kapitullit 5 është një vlerësim i vetëm mbi një korpus të caktuar. Për të matur sa varet ajo nga korpusi, çdo tregues u riprodhua me bootstrap mbi 2000 rimostrime, duke rimostruar </w:t>
-      </w:r>
-      <w:r>
-        <w:rPr>
-          <w:rFonts w:ascii="Times New Roman" w:hAnsi="Times New Roman" w:eastAsia="Times New Roman"/>
-          <w:b/>
-          <w:caps w:val="0"/>
-          <w:sz w:val="24"/>
-        </w:rPr>
-        <w:t>depo</w:t>
-      </w:r>
-      <w:r>
-        <w:rPr>
-          <w:rFonts w:ascii="Times New Roman" w:hAnsi="Times New Roman" w:eastAsia="Times New Roman"/>
-          <w:b w:val="0"/>
-          <w:caps w:val="0"/>
-          <w:sz w:val="24"/>
-        </w:rPr>
-        <w:t xml:space="preserve"> e jo rreshta, për arsyen që e bën edhe ndarjen e trajnimit të grupuar (Nënkapitulli 2.3): rimostrimi i rreshtave do të jepte intervale artificialisht të ngushta (Tabela 20; Figura 8).</w:t>
+        <w:t>Me bootstrap sipas depos (2000 rimostrime, Nënkapitulli 4.9), MCC-ja e secilës qasje dhe dallimi mes tyre kanë këto intervale besimi 95% (Tabela 20; Figura 8):</w:t>
       </w:r>
     </w:p>
     <w:p>
@@ -17713,7 +18879,7 @@
           <w:caps w:val="0"/>
           <w:sz w:val="24"/>
         </w:rPr>
-        <w:t>Përparësia e Qasjes B ndaj Qasjes A e kalon zeron te të katër erërat, pra nuk është artefakt i korpusit. Por intervalet janë të gjera — për Feature Envy-n gjerësia i kalon njëzet e pesë pikët — prandaj renditja e erërave mes tyre nuk qëndron: dallimi mes Data Class-it dhe Blob-it, për shembull, humbet brenda tyre.</w:t>
+        <w:t>Kufiri i poshtëm i dallimit B − A është mbi zero te të katër erërat. Intervali më i gjerë i dallimit është te Feature Envy, 0.281 pikë MCC.</w:t>
       </w:r>
     </w:p>
     <w:p>
@@ -17729,7 +18895,7 @@
           <w:caps w:val="0"/>
           <w:sz w:val="24"/>
         </w:rPr>
-        <w:t>Krahasimi ndryshon kur Qasjes A i jepet pragu i saj më i mirë nga fshirja e Nënkapitullit 5.5, çka është krahasimi më bujar që mund t'i bëhet (Tabela 21):</w:t>
+        <w:t>Kur Qasja A merr pragun e saj më të mirë nga fshirja e Nënkapitullit 5.5, dallimi ka këto intervale (Tabela 21):</w:t>
       </w:r>
     </w:p>
     <w:p>
@@ -18290,7 +19456,7 @@
           <w:caps w:val="0"/>
           <w:sz w:val="24"/>
         </w:rPr>
-        <w:t>Për tri erërat e para përparësia mbetet. Për Long Method-in ajo zhduket: intervali e përfshin zeron dhe shenja ruhet vetëm në 97.2% të rimostrimeve. Pra pretendimi «modeli e tejkalon rregullin» qëndron përgjithësisht, por jo për erën ku rregulli tashmë punonte më mirë, sapo atij rregulli i lejohet të kalibrohet. Ky është kufizimi i vetëm i rëndësishëm i krahasimit A↔B.</w:t>
+        <w:t>Kufiri i poshtëm mbetet mbi zero te Blob, Data Class dhe Feature Envy. Te Long Method intervali e përfshin zeron, dhe shenja pozitive ruhet në 97.2% të rimostrimeve.</w:t>
       </w:r>
     </w:p>
     <w:p>
@@ -18306,7 +19472,7 @@
           <w:caps w:val="0"/>
           <w:sz w:val="24"/>
         </w:rPr>
-        <w:t>Mbetet pyetja e dytë: kundrejt çfarë etikete maten këto shifra. Etiketa është ndërtuar duke bashkuar rishikime njerëzore, dhe ata rishikues nuk pajtohen me njëri-tjetrin. Tabela më poshtë e mat atë mospajtim me të njëjtin tregues dhe të njëjtin kod: një rishikues merret si e vërtetë, tjetri si parashikim, dhe çifti kalon nëpër të njëjtën matricë konfuze (Tabela 22).</w:t>
+        <w:t>Pajtimi mes vetë rishikuesve të MLCQ-së, i matur me të njëjtin tregues mbi çdo çift rishikimesh të së njëjtës mostër (Nënkapitulli 4.9), jep këto vlera (Tabela 22):</w:t>
       </w:r>
     </w:p>
     <w:p>
@@ -18766,7 +19932,7 @@
           <w:caps w:val="0"/>
           <w:sz w:val="24"/>
         </w:rPr>
-        <w:t>Asnjë erë nuk e kalon 0.238. Kjo nuk do të thotë se sistemi i tejkalon njerëzit: shifrat e kapitullit maten kundrejt etiketës së agreguar, e cila e heq një pjesë të zhurmës së një individi, ndaj të dy numrat nuk vendosen në një renditje. Ajo që tregon është sa e vështirë është vetë detyra: kur ekspertët ndahen kaq shumë, një pjesë e gabimit mbetet te paqartësia e erës, sido që të ndërtohet detektori, dhe çdo shifër e Kapitullit 5 duhet lexuar mbi këtë sfond.</w:t>
+        <w:t>MCC-ja mes rishikuesve nuk e kalon 0.238 te asnjë erë.</w:t>
       </w:r>
     </w:p>
     <w:p>
@@ -18848,6 +20014,70 @@
       <w:r>
         <w:rPr>
           <w:rFonts w:ascii="Times New Roman" w:hAnsi="Times New Roman" w:eastAsia="Times New Roman"/>
+          <w:b w:val="0"/>
+          <w:caps w:val="0"/>
+          <w:sz w:val="24"/>
+        </w:rPr>
+        <w:t>Sa varet ky përfundim nga pragjet? Te Blob dhe Data Class zhvendosja e çdo pragu mezi e lëviz MCC-në (Nënkapitulli 5.5), ndaj shifrat e tyre flasin për kodin dhe jo për pragun. Te Feature Envy dhe Long Method amplituda është e madhe, pra shifra e raportuar flet po aq për pragun sa për kodin. Kjo vlen sa herë krahasohen mjete detektimi që përdorin pragje të ndryshme: dallimi mes tyre mund të jetë dallim pragjesh e jo metodash.</w:t>
+      </w:r>
+    </w:p>
+    <w:p>
+      <w:pPr>
+        <w:spacing w:line="360" w:lineRule="auto"/>
+        <w:ind w:firstLine="360"/>
+        <w:jc w:val="both"/>
+      </w:pPr>
+      <w:r>
+        <w:rPr>
+          <w:rFonts w:ascii="Times New Roman" w:hAnsi="Times New Roman" w:eastAsia="Times New Roman"/>
+          <w:b w:val="0"/>
+          <w:caps w:val="0"/>
+          <w:sz w:val="24"/>
+        </w:rPr>
+        <w:t>Te Long Method, pragu i botuar del konservativ për këtë korpus: me një prag më të ulët recall-i rritet shumë më tepër se sa bie precizioni, çka sugjeron se rishikuesit e MLCQ-së e quajnë një metodë të gjatë më herët se sa e vendos pragu. Fitimi megjithatë paguhet me precizion, dhe foldet e kalibrimit nuk bien dakord për vlerën.</w:t>
+      </w:r>
+    </w:p>
+    <w:p>
+      <w:pPr>
+        <w:spacing w:line="360" w:lineRule="auto"/>
+        <w:ind w:firstLine="360"/>
+        <w:jc w:val="both"/>
+      </w:pPr>
+      <w:r>
+        <w:rPr>
+          <w:rFonts w:ascii="Times New Roman" w:hAnsi="Times New Roman" w:eastAsia="Times New Roman"/>
+          <w:b w:val="0"/>
+          <w:caps w:val="0"/>
+          <w:sz w:val="24"/>
+        </w:rPr>
+        <w:t>Te Feature Envy vërehet diçka më e veçantë. Klauzola që kërkon që klasat-burim të jenë pak, kur relaksohet, i përmirëson njëkohësisht precizionin dhe recall-in, dhe kalibrimi jashtë fold-it e zgjedh të njëjtën vlerë në çdo fold. Një kufizim që heq pozitivë të vërtetë pa hequr të rremë nuk e ndan sinjalin nga zhurma; mbi këtë korpus, pra, ajo klauzolë nuk e bën punën për të cilën u vendos.</w:t>
+      </w:r>
+    </w:p>
+    <w:p>
+      <w:pPr>
+        <w:spacing w:line="360" w:lineRule="auto"/>
+        <w:ind w:firstLine="360"/>
+        <w:jc w:val="both"/>
+      </w:pPr>
+      <w:r>
+        <w:rPr>
+          <w:rFonts w:ascii="Times New Roman" w:hAnsi="Times New Roman" w:eastAsia="Times New Roman"/>
+          <w:b w:val="0"/>
+          <w:caps w:val="0"/>
+          <w:sz w:val="24"/>
+        </w:rPr>
+        <w:t>Te Long Method, dallimi mes fshirjes dhe kalibrimit (Nënkapitulli 5.5) është pikërisht ajo që fitohet kur zgjedhjes i lejohet ta shohë bashkësinë mbi të cilën do të raportohet, dhe arsyeja pse u raportua shifra e kalibruar.</w:t>
+      </w:r>
+    </w:p>
+    <w:p>
+      <w:pPr>
+        <w:spacing w:line="360" w:lineRule="auto"/>
+        <w:ind w:firstLine="360"/>
+        <w:jc w:val="both"/>
+      </w:pPr>
+      <w:r>
+        <w:rPr>
+          <w:rFonts w:ascii="Times New Roman" w:hAnsi="Times New Roman" w:eastAsia="Times New Roman"/>
           <w:b/>
           <w:caps w:val="0"/>
           <w:sz w:val="24"/>
@@ -18862,6 +20092,22 @@
           <w:sz w:val="24"/>
         </w:rPr>
         <w:t xml:space="preserve"> Modelet e tejkalojnë qasjen me rregulla te çdo erë, dhe meqë klasifikuesi i shumicës nuk ndez kurrë, fitimi nuk vjen nga çekuilibri i klasave. Ablacioni i Nënkapitullit 5.2 e ndan këtë fitim në dy pjesë. Vetëm me metrikat e strategjisë, pra duke mësuar vetëm ku pritet kufiri, modeli e ngre MCC-në te të katër erërat, me 0.093 deri në 0.166. Metrikat e tjera shtojnë edhe 0.052 deri në 0.259, më së shumti te Feature Envy. Strategjive u mungojnë pra të dyja: kufiri i duhur dhe një pjesë e informacionit.</w:t>
+      </w:r>
+    </w:p>
+    <w:p>
+      <w:pPr>
+        <w:spacing w:line="360" w:lineRule="auto"/>
+        <w:ind w:firstLine="360"/>
+        <w:jc w:val="both"/>
+      </w:pPr>
+      <w:r>
+        <w:rPr>
+          <w:rFonts w:ascii="Times New Roman" w:hAnsi="Times New Roman" w:eastAsia="Times New Roman"/>
+          <w:b w:val="0"/>
+          <w:caps w:val="0"/>
+          <w:sz w:val="24"/>
+        </w:rPr>
+        <w:t>Intervalet e besimit e forcojnë këtë lexim (Nënkapitulli 5.7). Përparësia e modelit mbetet mbi zero te të katër erërat kur korpusi rimostrohet sipas depos, pra nuk është artefakt i një korpusi të veçantë. Por intervalet janë të gjera, ndaj renditja e erërave mes tyre nuk qëndron: dallimi mes Data Class-it dhe Blob-it, për shembull, humbet brenda tyre. Kur rregullit i jepet pragu i tij më i mirë, përparësia zhduket te Long Method, pikërisht aty ku rregulli punonte më mirë; ky është kufizimi i vetëm i rëndësishëm i krahasimit mes dy qasjeve.</w:t>
       </w:r>
     </w:p>
     <w:p>
@@ -19648,21 +20894,7 @@
           <w:caps w:val="0"/>
           <w:sz w:val="24"/>
         </w:rPr>
-        <w:t>Te rregullat, rezultati përputhet me vërejtjen e Nënkapitullit 2.2 se pragjet e nxjerra nga një korpus nuk transferohen lehtë në një tjetër: strategjitë e Lanza &amp; Marinescu (2006) ruajnë precizion të lartë mbi MLCQ, por humbin shumicën e rasteve. PMD-ja, që zbaton të njëjtat strategji me pragjet e veta, nuk del më mirë në asnjë krahasim (Nënkapitulli 5.6), ndaj recall-i i ulët nuk është defekt i zbatimit tonë. Te refaktorimi, motori ndjek parimin e Opdyke (1992): transformimi aplikohet vetëm kur parakushtet provohen. Tsantalis &amp; Chatzigeorgiou (2009) ia lënë vendimin përfundimtar projektuesit; ky punim e aplikon rishkrimin, por vetëm pas verifikimit me kompilator dhe vetëm aty ku kthimi është një komandë.</w:t>
-      </w:r>
-    </w:p>
-    <w:p>
-      <w:pPr>
-        <w:pStyle w:val="Heading2"/>
-      </w:pPr>
-      <w:r>
-        <w:rPr>
-          <w:rFonts w:ascii="Times New Roman" w:hAnsi="Times New Roman" w:eastAsia="Times New Roman"/>
-          <w:b/>
-          <w:caps w:val="0"/>
-          <w:sz w:val="24"/>
-        </w:rPr>
-        <w:t>6.4 Përgjigjet ndaj pyetjeve kërkimore</w:t>
+        <w:t>Te rregullat, rezultati përputhet me vërejtjen e Nënkapitullit 2.3 se pragjet e nxjerra nga një korpus nuk transferohen lehtë në një tjetër: strategjitë e Lanza &amp; Marinescu (2006) ruajnë precizion të lartë mbi MLCQ, por humbin shumicën e rasteve. PMD-ja, që zbaton të njëjtat strategji me pragjet e veta, nuk del më mirë në asnjë krahasim (Nënkapitulli 5.6), ndaj recall-i i ulët nuk është defekt i zbatimit tonë. Te refaktorimi, motori ndjek parimin e Opdyke (1992): transformimi aplikohet vetëm kur parakushtet provohen. Tsantalis &amp; Chatzigeorgiou (2009) ia lënë vendimin përfundimtar projektuesit; ky punim e aplikon rishkrimin, por vetëm pas verifikimit me kompilator dhe vetëm aty ku kthimi është një komandë.</w:t>
       </w:r>
     </w:p>
     <w:p>
@@ -19674,20 +20906,25 @@
       <w:r>
         <w:rPr>
           <w:rFonts w:ascii="Times New Roman" w:hAnsi="Times New Roman" w:eastAsia="Times New Roman"/>
+          <w:b w:val="0"/>
+          <w:caps w:val="0"/>
+          <w:sz w:val="24"/>
+        </w:rPr>
+        <w:t>Dy gjetje të tjera lidhen me literaturën për ndikimin e erërave. Roli i madhësisë te Blob-i, i diskutuar te Nënkapitulli 6.2, ka një paralel te Sjøberg et al. (2013): edhe atje madhësia e kodit peshonte më shumë se erërat vetë në përpjekjen e mirëmbajtjes. Te refaktorimi, Bavota et al. (2015) gjetën se vetëm 7% e refaktorimeve të zhvilluesve e heqin erën nga klasa; motori i këtij punimi e heq atë te 64.8% e rishkrimeve që aplikon. Krahasimi nuk është i drejtpërdrejtë, sepse zhvilluesit shpesh refaktorojnë për arsye që nuk kanë lidhje me një erë (Silva et al., 2016), por tregon vlerën e një transformimi që zgjidhet për erën e gjetur dhe matet pas aplikimit.</w:t>
+      </w:r>
+    </w:p>
+    <w:p>
+      <w:pPr>
+        <w:pStyle w:val="Heading2"/>
+      </w:pPr>
+      <w:r>
+        <w:rPr>
+          <w:rFonts w:ascii="Times New Roman" w:hAnsi="Times New Roman" w:eastAsia="Times New Roman"/>
           <w:b/>
           <w:caps w:val="0"/>
           <w:sz w:val="24"/>
         </w:rPr>
-        <w:t>PK1, saktësia e strategjive.</w:t>
-      </w:r>
-      <w:r>
-        <w:rPr>
-          <w:rFonts w:ascii="Times New Roman" w:hAnsi="Times New Roman" w:eastAsia="Times New Roman"/>
-          <w:b w:val="0"/>
-          <w:caps w:val="0"/>
-          <w:sz w:val="24"/>
-        </w:rPr>
-        <w:t xml:space="preserve"> Precizioni i tyre e kalon recall-in te çdo erë, dhe MCC-ja kundrejt rishikuesve shkon nga 0.232 deri në 0.580, më e larta te Long Method dhe më e ulëta te Blob. Ashpërsia që derivojnë nuk pajtohet me atë të rishikuesve.</w:t>
+        <w:t>6.4 Përgjigjet ndaj pyetjeve kërkimore</w:t>
       </w:r>
     </w:p>
     <w:p>
@@ -19703,7 +20940,7 @@
           <w:caps w:val="0"/>
           <w:sz w:val="24"/>
         </w:rPr>
-        <w:t>PK2, mësimi i makinës.</w:t>
+        <w:t>PK1, saktësia e strategjive.</w:t>
       </w:r>
       <w:r>
         <w:rPr>
@@ -19712,7 +20949,7 @@
           <w:caps w:val="0"/>
           <w:sz w:val="24"/>
         </w:rPr>
-        <w:t xml:space="preserve"> Po, e përmirëson. Modeli i mësuar mbi metrikat e sistemit e ngre MCC-në te të katër erërat: brezi kalon nga 0.232–0.580 në 0.488–0.724, dhe intervalet bootstrap sipas depos e vendosin këtë përparësi mbi zero pa përjashtim. Fitimi vjen kryesisht nga recall-i, që rritet te çdo erë. Një rezervë e vetme: kur rregullit i jepet pragu i tij më i mirë nga fshirja, dallimi te Long Method nuk ndahet më nga zeroja (Nënkapitulli 5.7). Fitimi mbetet, më i vogël, edhe kur modeli sheh vetëm metrikat e strategjisë, ndaj nuk vjen vetëm nga metrikat shtesë (Nënkapitulli 5.2).</w:t>
+        <w:t xml:space="preserve"> Precizioni i tyre e kalon recall-in te çdo erë, dhe MCC-ja kundrejt rishikuesve shkon nga 0.232 deri në 0.580, më e larta te Long Method dhe më e ulëta te Blob. Ashpërsia që derivojnë nuk pajtohet me atë të rishikuesve.</w:t>
       </w:r>
     </w:p>
     <w:p>
@@ -19728,7 +20965,7 @@
           <w:caps w:val="0"/>
           <w:sz w:val="24"/>
         </w:rPr>
-        <w:t>PK3, refaktorimi.</w:t>
+        <w:t>PK2, mësimi i makinës.</w:t>
       </w:r>
       <w:r>
         <w:rPr>
@@ -19737,39 +20974,7 @@
           <w:caps w:val="0"/>
           <w:sz w:val="24"/>
         </w:rPr>
-        <w:t xml:space="preserve"> Pjesërisht. Motori transformoi 22.4% të vendeve të detektuara; nga rishkrimet, 98.3% kompiluan ose nuk shtuan lloj të ri gabimi, dhe 1.6% shtuan. Era u hoq te 64.8% e tyre, dhe metrika që e shkakton detektimin ra edhe aty ku era mbeti: struktura përmirësohet objektivisht në shumicën e rasteve, me koston e 865 erërave të reja. Kur skedari kompilohet brenda projektit të vet, pjesa që kompilon plotësisht rritet ndjeshëm, ndërsa dy rishkrime nga 201 e përmbysin verdiktin në drejtimin e kundërt dhe e kufizojnë pretendimin. Ruajtja e sjelljes </w:t>
-      </w:r>
-      <w:r>
-        <w:rPr>
-          <w:rFonts w:ascii="Times New Roman" w:hAnsi="Times New Roman" w:eastAsia="Times New Roman"/>
-          <w:b/>
-          <w:caps w:val="0"/>
-          <w:sz w:val="24"/>
-        </w:rPr>
-        <w:t>nuk u mat</w:t>
-      </w:r>
-      <w:r>
-        <w:rPr>
-          <w:rFonts w:ascii="Times New Roman" w:hAnsi="Times New Roman" w:eastAsia="Times New Roman"/>
-          <w:b w:val="0"/>
-          <w:caps w:val="0"/>
-          <w:sz w:val="24"/>
-        </w:rPr>
-        <w:t xml:space="preserve"> (Nënkapitulli 3.4). Përgjigjja është pra po për strukturën dhe kompilueshmërinë, me kosto të matur, dhe e hapur për sjelljen.</w:t>
-      </w:r>
-    </w:p>
-    <w:p>
-      <w:pPr>
-        <w:pStyle w:val="Heading2"/>
-      </w:pPr>
-      <w:r>
-        <w:rPr>
-          <w:rFonts w:ascii="Times New Roman" w:hAnsi="Times New Roman" w:eastAsia="Times New Roman"/>
-          <w:b/>
-          <w:caps w:val="0"/>
-          <w:sz w:val="24"/>
-        </w:rPr>
-        <w:t>6.5 Implikimet teorike dhe praktike</w:t>
+        <w:t xml:space="preserve"> Po, e përmirëson. Modeli i mësuar mbi metrikat e sistemit e ngre MCC-në te të katër erërat: brezi kalon nga 0.232–0.580 në 0.488–0.724, dhe intervalet bootstrap sipas depos e vendosin këtë përparësi mbi zero pa përjashtim. Fitimi vjen kryesisht nga recall-i, që rritet te çdo erë. Një rezervë e vetme: kur rregullit i jepet pragu i tij më i mirë nga fshirja, dallimi te Long Method nuk ndahet më nga zeroja (Nënkapitulli 5.7). Fitimi mbetet, më i vogël, edhe kur modeli sheh vetëm metrikat e strategjisë, ndaj nuk vjen vetëm nga metrikat shtesë (Nënkapitulli 5.2).</w:t>
       </w:r>
     </w:p>
     <w:p>
@@ -19785,7 +20990,7 @@
           <w:caps w:val="0"/>
           <w:sz w:val="24"/>
         </w:rPr>
-        <w:t>Implikime teorike.</w:t>
+        <w:t>PK3, refaktorimi.</w:t>
       </w:r>
       <w:r>
         <w:rPr>
@@ -19794,7 +20999,39 @@
           <w:caps w:val="0"/>
           <w:sz w:val="24"/>
         </w:rPr>
-        <w:t xml:space="preserve"> Strategjitë e publikuara nuk hidhen poshtë nga këto rezultate: si njohuri e shpjegueshme për atë që e bën një klasë të dyshimtë, ato mbeten të vlefshme. Ajo që nuk kalon nga një korpus te tjetri janë kufijtë numerikë, të cilët duhen kalibruar ose mësuar për kodin ku zbatohen. Pajtimi i ulët mes rishikuesve i vë gjithashtu një tavan çdo detektori, përtej të cilit gabimi i përket paqartësisë së vetë erës.</w:t>
+        <w:t xml:space="preserve"> Pjesërisht. Motori transformoi 22.4% të vendeve të detektuara; nga rishkrimet, 98.3% kompiluan ose nuk shtuan lloj të ri gabimi, dhe 1.6% shtuan. Era u hoq te 64.8% e tyre, dhe metrika që e shkakton detektimin ra edhe aty ku era mbeti: struktura përmirësohet objektivisht në shumicën e rasteve, me koston e 865 erërave të reja. Kur skedari kompilohet brenda projektit të vet, pjesa që kompilon plotësisht rritet ndjeshëm, ndërsa dy rishkrime nga 201 e përmbysin verdiktin në drejtimin e kundërt dhe e kufizojnë pretendimin. Ruajtja e sjelljes </w:t>
+      </w:r>
+      <w:r>
+        <w:rPr>
+          <w:rFonts w:ascii="Times New Roman" w:hAnsi="Times New Roman" w:eastAsia="Times New Roman"/>
+          <w:b/>
+          <w:caps w:val="0"/>
+          <w:sz w:val="24"/>
+        </w:rPr>
+        <w:t>nuk u mat</w:t>
+      </w:r>
+      <w:r>
+        <w:rPr>
+          <w:rFonts w:ascii="Times New Roman" w:hAnsi="Times New Roman" w:eastAsia="Times New Roman"/>
+          <w:b w:val="0"/>
+          <w:caps w:val="0"/>
+          <w:sz w:val="24"/>
+        </w:rPr>
+        <w:t xml:space="preserve"> (Nënkapitulli 3.4). Përgjigjja është pra po për strukturën dhe kompilueshmërinë, me kosto të matur, dhe e hapur për sjelljen.</w:t>
+      </w:r>
+    </w:p>
+    <w:p>
+      <w:pPr>
+        <w:pStyle w:val="Heading2"/>
+      </w:pPr>
+      <w:r>
+        <w:rPr>
+          <w:rFonts w:ascii="Times New Roman" w:hAnsi="Times New Roman" w:eastAsia="Times New Roman"/>
+          <w:b/>
+          <w:caps w:val="0"/>
+          <w:sz w:val="24"/>
+        </w:rPr>
+        <w:t>6.5 Implikimet teorike dhe praktike</w:t>
       </w:r>
     </w:p>
     <w:p>
@@ -19810,7 +21047,7 @@
           <w:caps w:val="0"/>
           <w:sz w:val="24"/>
         </w:rPr>
-        <w:t>Implikime praktike.</w:t>
+        <w:t>Implikime teorike.</w:t>
       </w:r>
       <w:r>
         <w:rPr>
@@ -19819,21 +21056,7 @@
           <w:caps w:val="0"/>
           <w:sz w:val="24"/>
         </w:rPr>
-        <w:t xml:space="preserve"> Për një ekip, strategjitë janë sinjal i rrallë por i besueshëm, i përshtatshëm si paralajmërim që nuk e mbyt zhvilluesin me zhurmë. Modeli vlen aty ku ka më shumë rëndësi të mos humbasë asnjë rast, dhe kur të dyja pajtohen, sistemi jep sinjalin e tij më të sigurt. Rishkrimi automatik mund t'i besohet mjetit për rreth një në katër vende, me kusht që ai të refuzojë çdo gjë që nuk e provon dhe ta masë atë që ndodh pas rishkrimit.</w:t>
-      </w:r>
-    </w:p>
-    <w:p>
-      <w:pPr>
-        <w:pStyle w:val="Heading2"/>
-      </w:pPr>
-      <w:r>
-        <w:rPr>
-          <w:rFonts w:ascii="Times New Roman" w:hAnsi="Times New Roman" w:eastAsia="Times New Roman"/>
-          <w:b/>
-          <w:caps w:val="0"/>
-          <w:sz w:val="24"/>
-        </w:rPr>
-        <w:t>6.6 Kufizimet</w:t>
+        <w:t xml:space="preserve"> Strategjitë e publikuara nuk hidhen poshtë nga këto rezultate: si njohuri e shpjegueshme për atë që e bën një klasë të dyshimtë, ato mbeten të vlefshme. Ajo që nuk kalon nga një korpus te tjetri janë kufijtë numerikë, të cilët duhen kalibruar ose mësuar për kodin ku zbatohen. Pajtimi i ulët mes rishikuesve i vë gjithashtu një tavan çdo detektori, përtej të cilit gabimi i përket paqartësisë së vetë erës.</w:t>
       </w:r>
     </w:p>
     <w:p>
@@ -19845,11 +21068,20 @@
       <w:r>
         <w:rPr>
           <w:rFonts w:ascii="Times New Roman" w:hAnsi="Times New Roman" w:eastAsia="Times New Roman"/>
+          <w:b/>
+          <w:caps w:val="0"/>
+          <w:sz w:val="24"/>
+        </w:rPr>
+        <w:t>Implikime praktike.</w:t>
+      </w:r>
+      <w:r>
+        <w:rPr>
+          <w:rFonts w:ascii="Times New Roman" w:hAnsi="Times New Roman" w:eastAsia="Times New Roman"/>
           <w:b w:val="0"/>
           <w:caps w:val="0"/>
           <w:sz w:val="24"/>
         </w:rPr>
-        <w:t>Mostrat e depove që nuk ishin më të arritshme mungojnë nga vlerësimi (hyrja e Kapitullit 5); nëse ato ndryshojnë sistematikisht nga pjesa tjetër, shifrat e raportuara nuk e pasqyrojnë këtë. E vërteta bazë vjen nga një dataset i vetëm, me mospajtim të konsiderueshëm mes rishikuesve; prandaj çdo strategji agregimi raportohet veç, dhe mostrat që një strategji nuk i etiketon dot hidhen në vend që të lexohen si negative.</w:t>
+        <w:t xml:space="preserve"> Për një ekip, strategjitë janë sinjal i rrallë por i besueshëm, i përshtatshëm si paralajmërim që nuk e mbyt zhvilluesin me zhurmë. Modeli vlen aty ku ka më shumë rëndësi të mos humbasë asnjë rast, dhe kur të dyja pajtohen, sistemi jep sinjalin e tij më të sigurt. Rishkrimi automatik mund t'i besohet mjetit për rreth një në katër vende, me kusht që ai të refuzojë çdo gjë që nuk e provon dhe ta masë atë që ndodh pas rishkrimit.</w:t>
       </w:r>
     </w:p>
     <w:p>
@@ -19865,7 +21097,21 @@
           <w:caps w:val="0"/>
           <w:sz w:val="24"/>
         </w:rPr>
-        <w:t>Verifikimi i refaktorimeve kufizohet te kompilatori, dhe për shumicën e skedarëve vetëm te forma e tij më e dobët, mungesa e llojeve të reja të gabimit; testet e projekteve nuk u ekzekutuan, për arsyen e dhënë te Nënkapitulli 3.4. Cilësia e rishkrimeve u gjykua nga një rishikues i vetëm, autori i motorit, ndaj për të nuk ka pajtim mes rishikuesish që të matet.</w:t>
+        <w:t>Meqë shumica e erërave lindin bashkë me kodin (Tufano et al., 2015), mjeti ka më shumë vlerë kur vepron herët, si portë në integrimin e vazhdueshëm, sesa si auditim i rrallë mbi një sistem të pjekur. Për Feature Envy, erën që literatura e trajton më shpesh si objektiv refaktorimi, mjetet e lira të përhapura ofrojnë pak: PMD nuk ka rregull për të, DesigniteJava nuk e përfshin mes erërave që dokumenton, dhe JDeodorant, që e gjen përmes mundësive për Move Method (Tsantalis &amp; Chatzigeorgiou, 2009), punon si shtojcë e mjedisit të zhvillimit, ndërsa varianti i tij në rresht komande nuk mban licencë. Një detektor i lirë që punon nga rreshti i komandës e mbush pjesërisht këtë boshllëk.</w:t>
+      </w:r>
+    </w:p>
+    <w:p>
+      <w:pPr>
+        <w:pStyle w:val="Heading2"/>
+      </w:pPr>
+      <w:r>
+        <w:rPr>
+          <w:rFonts w:ascii="Times New Roman" w:hAnsi="Times New Roman" w:eastAsia="Times New Roman"/>
+          <w:b/>
+          <w:caps w:val="0"/>
+          <w:sz w:val="24"/>
+        </w:rPr>
+        <w:t>6.6 Kufizimet</w:t>
       </w:r>
     </w:p>
     <w:p>
@@ -19881,7 +21127,7 @@
           <w:caps w:val="0"/>
           <w:sz w:val="24"/>
         </w:rPr>
-        <w:t>Pa zgjidhje simbolesh (Nënkapitulli 3.4), motori ndreq vetëm atë që mbyllet brenda një skedari; erërat që kërkojnë ndryshime në gjithë projektin mbeten te zhvilluesi. Për të njëjtën arsye, ATFD-ja nuk i ndjek marrësit me zinxhir («a.getB().getC()»): matet në mënyrë konservative, dhe mund t'i humbasë disa raste të Feature Envy-së e të God Class-it. Po ashtu, niveli i ashpërsisë që shfaq mjeti është renditje e brendshme e tij dhe jo parashikim i gjykimit njerëzor.</w:t>
+        <w:t>Mostrat e depove që nuk ishin më të arritshme mungojnë nga vlerësimi (hyrja e Kapitullit 5); nëse ato ndryshojnë sistematikisht nga pjesa tjetër, shifrat e raportuara nuk e pasqyrojnë këtë. E vërteta bazë vjen nga një dataset i vetëm, me mospajtim të konsiderueshëm mes rishikuesve; prandaj çdo strategji agregimi raportohet veç, dhe mostrat që një strategji nuk i etiketon dot hidhen në vend që të lexohen si negative.</w:t>
       </w:r>
     </w:p>
     <w:p>
@@ -19897,6 +21143,38 @@
           <w:caps w:val="0"/>
           <w:sz w:val="24"/>
         </w:rPr>
+        <w:t>Verifikimi i refaktorimeve kufizohet te kompilatori, dhe për shumicën e skedarëve vetëm te forma e tij më e dobët, mungesa e llojeve të reja të gabimit; testet e projekteve nuk u ekzekutuan, për arsyen e dhënë te Nënkapitulli 3.4. Cilësia e rishkrimeve u gjykua nga një rishikues i vetëm, autori i motorit, ndaj për të nuk ka pajtim mes rishikuesish që të matet.</w:t>
+      </w:r>
+    </w:p>
+    <w:p>
+      <w:pPr>
+        <w:spacing w:line="360" w:lineRule="auto"/>
+        <w:ind w:firstLine="360"/>
+        <w:jc w:val="both"/>
+      </w:pPr>
+      <w:r>
+        <w:rPr>
+          <w:rFonts w:ascii="Times New Roman" w:hAnsi="Times New Roman" w:eastAsia="Times New Roman"/>
+          <w:b w:val="0"/>
+          <w:caps w:val="0"/>
+          <w:sz w:val="24"/>
+        </w:rPr>
+        <w:t>Pa zgjidhje simbolesh (Nënkapitulli 3.4), motori ndreq vetëm atë që mbyllet brenda një skedari; erërat që kërkojnë ndryshime në gjithë projektin mbeten te zhvilluesi. Për të njëjtën arsye, ATFD-ja nuk i ndjek marrësit me zinxhir («a.getB().getC()»): matet në mënyrë konservative, dhe mund t'i humbasë disa raste të Feature Envy-së e të God Class-it. Po ashtu, niveli i ashpërsisë që shfaq mjeti është renditje e brendshme e tij dhe jo parashikim i gjykimit njerëzor.</w:t>
+      </w:r>
+    </w:p>
+    <w:p>
+      <w:pPr>
+        <w:spacing w:line="360" w:lineRule="auto"/>
+        <w:ind w:firstLine="360"/>
+        <w:jc w:val="both"/>
+      </w:pPr>
+      <w:r>
+        <w:rPr>
+          <w:rFonts w:ascii="Times New Roman" w:hAnsi="Times New Roman" w:eastAsia="Times New Roman"/>
+          <w:b w:val="0"/>
+          <w:caps w:val="0"/>
+          <w:sz w:val="24"/>
+        </w:rPr>
         <w:t>Recall-i i Blob-it ka dy tavane që nuk varen nga pragjet (Shtojca 8.8). I pari: një pjesë e rasteve të humbura nuk janë më të mëdha se klasat e pastra, dhe asnjë metrikë e vetme klase nuk i ndan prej tyre (më e mira arrin 0.773); një detektor që mbështetet vetëm te këto metrika e ka të vështirë t'i kapë. I dyti: TCC-ja e papërcaktuar merr vlerën maksimale, të cilën God Class nuk e pranon. Ndreqja do ta shkëpuste TCC-në nga përkufizimi i botuar, ndaj u zgjodh raportimi.</w:t>
       </w:r>
     </w:p>
@@ -20106,7 +21384,7 @@
         </w:rPr>
         <w:t>[3]</w:t>
         <w:tab/>
-        <w:t>Bieman, J. M. &amp; Kang, B.-K. 1995. “Cohesion and Reuse in an Object-Oriented System.” Proceedings of the ACM Symposium on Software Reusability (SSR ’95), pp. 259-262.</w:t>
+        <w:t>Bavota, G., De Lucia, A., Di Penta, M., Oliveto, R. &amp; Palomba, F. 2015. “An experimental investigation on the innate relationship between quality and refactoring.” Journal of Systems and Software, 107, pp. 1-14.</w:t>
       </w:r>
     </w:p>
     <w:p>
@@ -20124,7 +21402,7 @@
         </w:rPr>
         <w:t>[4]</w:t>
         <w:tab/>
-        <w:t>Breiman, L. 2001. “Random Forests.” Machine Learning, 45(1), pp. 5-32.</w:t>
+        <w:t>Bieman, J. M. &amp; Kang, B.-K. 1995. “Cohesion and Reuse in an Object-Oriented System.” Proceedings of the ACM Symposium on Software Reusability (SSR ’95), pp. 259-262.</w:t>
       </w:r>
     </w:p>
     <w:p>
@@ -20142,7 +21420,7 @@
         </w:rPr>
         <w:t>[5]</w:t>
         <w:tab/>
-        <w:t>Brown, L. D., Cai, T. T. &amp; DasGupta, A. 2001. “Interval Estimation for a Binomial Proportion.” Statistical Science, 16(2), pp. 101-133.</w:t>
+        <w:t>Breiman, L. 2001. “Random Forests.” Machine Learning, 45(1), pp. 5-32.</w:t>
       </w:r>
     </w:p>
     <w:p>
@@ -20160,7 +21438,7 @@
         </w:rPr>
         <w:t>[6]</w:t>
         <w:tab/>
-        <w:t>Brunsfeld, M. et al. tree-sitter: An incremental parsing system for programming tools. [https://tree-sitter.github.io/tree-sitter/], data e qasjes: 30.08.2026.</w:t>
+        <w:t>Brown, L. D., Cai, T. T. &amp; DasGupta, A. 2001. “Interval Estimation for a Binomial Proportion.” Statistical Science, 16(2), pp. 101-133.</w:t>
       </w:r>
     </w:p>
     <w:p>
@@ -20178,7 +21456,7 @@
         </w:rPr>
         <w:t>[7]</w:t>
         <w:tab/>
-        <w:t>Chidamber, S. R. &amp; Kemerer, C. F. 1994. “A Metrics Suite for Object Oriented Design.” IEEE Transactions on Software Engineering, 20(6), pp. 476-493.</w:t>
+        <w:t>Brunsfeld, M. et al. tree-sitter: An incremental parsing system for programming tools. [https://tree-sitter.github.io/tree-sitter/], data e qasjes: 30.08.2026.</w:t>
       </w:r>
     </w:p>
     <w:p>
@@ -20196,7 +21474,7 @@
         </w:rPr>
         <w:t>[8]</w:t>
         <w:tab/>
-        <w:t>Cohen, J. 1960. “A Coefficient of Agreement for Nominal Scales.” Educational and Psychological Measurement, 20(1), pp. 37-46.</w:t>
+        <w:t>Chicco, D. &amp; Jurman, G. 2020. “The advantages of the Matthews correlation coefficient (MCC) over F1 score and accuracy in binary classification evaluation.” BMC Genomics, 21, 6.</w:t>
       </w:r>
     </w:p>
     <w:p>
@@ -20214,7 +21492,7 @@
         </w:rPr>
         <w:t>[9]</w:t>
         <w:tab/>
-        <w:t>Cunningham, W. 1992. “The WyCash Portfolio Management System.” OOPSLA ’92 Experience Report. Addendum to the Proceedings on Object-Oriented Programming Systems, Languages, and Applications, pp. 29-30.</w:t>
+        <w:t>Chidamber, S. R. &amp; Kemerer, C. F. 1994. “A Metrics Suite for Object Oriented Design.” IEEE Transactions on Software Engineering, 20(6), pp. 476-493.</w:t>
       </w:r>
     </w:p>
     <w:p>
@@ -20232,7 +21510,7 @@
         </w:rPr>
         <w:t>[10]</w:t>
         <w:tab/>
-        <w:t>Di Nucci, D., Palomba, F., Tamburri, D. A., Serebrenik, A. &amp; De Lucia, A. 2018. “Detecting code smells using machine learning techniques: Are we there yet?” Proceedings of the 25th IEEE International Conference on Software Analysis, Evolution and Reengineering (SANER ’18), pp. 612-621.</w:t>
+        <w:t>Cohen, J. 1960. “A Coefficient of Agreement for Nominal Scales.” Educational and Psychological Measurement, 20(1), pp. 37-46.</w:t>
       </w:r>
     </w:p>
     <w:p>
@@ -20250,7 +21528,7 @@
         </w:rPr>
         <w:t>[11]</w:t>
         <w:tab/>
-        <w:t>Fowler, M. 2018. Refactoring: Improving the Design of Existing Code, 2nd edn. Boston: Addison-Wesley.</w:t>
+        <w:t>Cunningham, W. 1992. “The WyCash Portfolio Management System.” OOPSLA ’92 Experience Report. Addendum to the Proceedings on Object-Oriented Programming Systems, Languages, and Applications, pp. 29-30.</w:t>
       </w:r>
     </w:p>
     <w:p>
@@ -20268,7 +21546,7 @@
         </w:rPr>
         <w:t>[12]</w:t>
         <w:tab/>
-        <w:t>Friedman, J. H. 2001. “Greedy Function Approximation: A Gradient Boosting Machine.” The Annals of Statistics, 29(5), pp. 1189-1232.</w:t>
+        <w:t>Di Nucci, D., Palomba, F., Tamburri, D. A., Serebrenik, A. &amp; De Lucia, A. 2018. “Detecting code smells using machine learning techniques: Are we there yet?” Proceedings of the 25th IEEE International Conference on Software Analysis, Evolution and Reengineering (SANER ’18), pp. 612-621.</w:t>
       </w:r>
     </w:p>
     <w:p>
@@ -20286,7 +21564,7 @@
         </w:rPr>
         <w:t>[13]</w:t>
         <w:tab/>
-        <w:t>Henderson-Sellers, B. 1996. Object-Oriented Metrics: Measures of Complexity. Upper Saddle River, NJ: Prentice Hall.</w:t>
+        <w:t>Efron, B. &amp; Tibshirani, R. J. 1993. An Introduction to the Bootstrap. New York: Chapman &amp; Hall.</w:t>
       </w:r>
     </w:p>
     <w:p>
@@ -20304,7 +21582,7 @@
         </w:rPr>
         <w:t>[14]</w:t>
         <w:tab/>
-        <w:t>Lanza, M. &amp; Marinescu, R. 2006. Object-Oriented Metrics in Practice: Using Software Metrics to Characterize, Evaluate, and Improve the Design of Object-Oriented Systems. Berlin: Springer.</w:t>
+        <w:t>Fowler, M. 2018. Refactoring: Improving the Design of Existing Code, 2nd edn. Boston: Addison-Wesley.</w:t>
       </w:r>
     </w:p>
     <w:p>
@@ -20322,7 +21600,7 @@
         </w:rPr>
         <w:t>[15]</w:t>
         <w:tab/>
-        <w:t>Lehman, M. M. 1980. “Programs, Life Cycles, and Laws of Software Evolution.” Proceedings of the IEEE, 68(9), pp. 1060-1076.</w:t>
+        <w:t>Friedman, J. H. 2001. “Greedy Function Approximation: A Gradient Boosting Machine.” The Annals of Statistics, 29(5), pp. 1189-1232.</w:t>
       </w:r>
     </w:p>
     <w:p>
@@ -20340,7 +21618,7 @@
         </w:rPr>
         <w:t>[16]</w:t>
         <w:tab/>
-        <w:t>Madeyski, L. &amp; Lewowski, T. 2020. “MLCQ: Industry-relevant code smell data set.” Proceedings of the 24th International Conference on Evaluation and Assessment in Software Engineering (EASE ’20), pp. 342-347.</w:t>
+        <w:t>Henderson-Sellers, B. 1996. Object-Oriented Metrics: Measures of Complexity. Upper Saddle River, NJ: Prentice Hall.</w:t>
       </w:r>
     </w:p>
     <w:p>
@@ -20358,7 +21636,7 @@
         </w:rPr>
         <w:t>[17]</w:t>
         <w:tab/>
-        <w:t>Madeyski, L. &amp; Lewowski, T. 2023. “Detecting code smells using industry-relevant data.” Information and Software Technology, 155, 107112.</w:t>
+        <w:t>Kaufman, S., Rosset, S., Perlich, C. &amp; Stitelman, O. 2012. “Leakage in Data Mining: Formulation, Detection, and Avoidance.” ACM Transactions on Knowledge Discovery from Data, 6(4), 15.</w:t>
       </w:r>
     </w:p>
     <w:p>
@@ -20376,7 +21654,7 @@
         </w:rPr>
         <w:t>[18]</w:t>
         <w:tab/>
-        <w:t>Mäntylä, M. V. &amp; Lassenius, C. 2006. “Subjective evaluation of software evolvability using code smells: An empirical study.” Empirical Software Engineering, 11(3), pp. 395-431.</w:t>
+        <w:t>Khomh, F., Di Penta, M., Guéhéneuc, Y.-G. &amp; Antoniol, G. 2012. “An exploratory study of the impact of antipatterns on class change- and fault-proneness.” Empirical Software Engineering, 17(3), pp. 243-275.</w:t>
       </w:r>
     </w:p>
     <w:p>
@@ -20394,7 +21672,7 @@
         </w:rPr>
         <w:t>[19]</w:t>
         <w:tab/>
-        <w:t>Marinescu, R. 2004. “Detection Strategies: Metrics-Based Rules for Detecting Design Flaws.” Proceedings of the 20th IEEE International Conference on Software Maintenance (ICSM ’04), pp. 350-359.</w:t>
+        <w:t>Lanza, M. &amp; Marinescu, R. 2006. Object-Oriented Metrics in Practice: Using Software Metrics to Characterize, Evaluate, and Improve the Design of Object-Oriented Systems. Berlin: Springer.</w:t>
       </w:r>
     </w:p>
     <w:p>
@@ -20412,7 +21690,7 @@
         </w:rPr>
         <w:t>[20]</w:t>
         <w:tab/>
-        <w:t>Matthews, B. W. 1975. “Comparison of the predicted and observed secondary structure of T4 phage lysozyme.” Biochimica et Biophysica Acta (BBA) - Protein Structure, 405(2), pp. 442-451.</w:t>
+        <w:t>Lehman, M. M. 1980. “Programs, Life Cycles, and Laws of Software Evolution.” Proceedings of the IEEE, 68(9), pp. 1060-1076.</w:t>
       </w:r>
     </w:p>
     <w:p>
@@ -20430,7 +21708,7 @@
         </w:rPr>
         <w:t>[21]</w:t>
         <w:tab/>
-        <w:t>McCabe, T. J. 1976. “A Complexity Measure.” IEEE Transactions on Software Engineering, SE-2(4), pp. 308-320.</w:t>
+        <w:t>Madeyski, L. &amp; Lewowski, T. 2020. “MLCQ: Industry-relevant code smell data set.” Proceedings of the 24th International Conference on Evaluation and Assessment in Software Engineering (EASE ’20), pp. 342-347.</w:t>
       </w:r>
     </w:p>
     <w:p>
@@ -20448,7 +21726,7 @@
         </w:rPr>
         <w:t>[22]</w:t>
         <w:tab/>
-        <w:t>Moha, N., Guéhéneuc, Y.-G., Duchien, L. &amp; Le Meur, A.-F. 2010. “DECOR: A Method for the Specification and Detection of Code and Design Smells.” IEEE Transactions on Software Engineering, 36(1), pp. 20-36.</w:t>
+        <w:t>Madeyski, L. &amp; Lewowski, T. 2023. “Detecting code smells using industry-relevant data.” Information and Software Technology, 155, 107112.</w:t>
       </w:r>
     </w:p>
     <w:p>
@@ -20466,7 +21744,7 @@
         </w:rPr>
         <w:t>[23]</w:t>
         <w:tab/>
-        <w:t>Murphy-Hill, E., Parnin, C. &amp; Black, A. P. 2012. “How We Refactor, and How We Know It.” IEEE Transactions on Software Engineering, 38(1), pp. 5-18.</w:t>
+        <w:t>Mäntylä, M. V. &amp; Lassenius, C. 2006. “Subjective evaluation of software evolvability using code smells: An empirical study.” Empirical Software Engineering, 11(3), pp. 395-431.</w:t>
       </w:r>
     </w:p>
     <w:p>
@@ -20484,7 +21762,7 @@
         </w:rPr>
         <w:t>[24]</w:t>
         <w:tab/>
-        <w:t>Opdyke, W. F. 1992. Refactoring Object-Oriented Frameworks. PhD thesis. University of Illinois at Urbana-Champaign.</w:t>
+        <w:t>Marinescu, R. 2004. “Detection Strategies: Metrics-Based Rules for Detecting Design Flaws.” Proceedings of the 20th IEEE International Conference on Software Maintenance (ICSM ’04), pp. 350-359.</w:t>
       </w:r>
     </w:p>
     <w:p>
@@ -20502,7 +21780,7 @@
         </w:rPr>
         <w:t>[25]</w:t>
         <w:tab/>
-        <w:t>Palomba, F., Bavota, G., Di Penta, M., Oliveto, R., Poshyvanyk, D. &amp; De Lucia, A. 2015. “Mining Version Histories for Detecting Code Smells.” IEEE Transactions on Software Engineering, 41(5), pp. 462-489.</w:t>
+        <w:t>Matthews, B. W. 1975. “Comparison of the predicted and observed secondary structure of T4 phage lysozyme.” Biochimica et Biophysica Acta (BBA) - Protein Structure, 405(2), pp. 442-451.</w:t>
       </w:r>
     </w:p>
     <w:p>
@@ -20520,7 +21798,7 @@
         </w:rPr>
         <w:t>[26]</w:t>
         <w:tab/>
-        <w:t>Park, R. E. 1992. Software Size Measurement: A Framework for Counting Source Statements. Technical Report CMU/SEI-92-TR-020. Pittsburgh: Software Engineering Institute, Carnegie Mellon University.</w:t>
+        <w:t>McCabe, T. J. 1976. “A Complexity Measure.” IEEE Transactions on Software Engineering, SE-2(4), pp. 308-320.</w:t>
       </w:r>
     </w:p>
     <w:p>
@@ -20538,7 +21816,7 @@
         </w:rPr>
         <w:t>[27]</w:t>
         <w:tab/>
-        <w:t>Pedregosa, F., Varoquaux, G., Gramfort, A., Michel, V., Thirion, B., Grisel, O., et al. 2011. “Scikit-learn: Machine Learning in Python.” Journal of Machine Learning Research, 12, pp. 2825-2830.</w:t>
+        <w:t>Mens, T. &amp; Tourwé, T. 2004. “A Survey of Software Refactoring.” IEEE Transactions on Software Engineering, 30(2), pp. 126-139.</w:t>
       </w:r>
     </w:p>
     <w:p>
@@ -20556,7 +21834,7 @@
         </w:rPr>
         <w:t>[28]</w:t>
         <w:tab/>
-        <w:t>PMD Team, 2026. PMD: An Extensible Cross-Language Static Code Analyzer, versioni 7.27.0. https://pmd.github.io/ (data e qasjes: 8 shtator 2026).</w:t>
+        <w:t>Moha, N., Guéhéneuc, Y.-G., Duchien, L. &amp; Le Meur, A.-F. 2010. “DECOR: A Method for the Specification and Detection of Code and Design Smells.” IEEE Transactions on Software Engineering, 36(1), pp. 20-36.</w:t>
       </w:r>
     </w:p>
     <w:p>
@@ -20574,7 +21852,7 @@
         </w:rPr>
         <w:t>[29]</w:t>
         <w:tab/>
-        <w:t>Sharma, T. &amp; Spinellis, D. 2018. “A survey on software smells.” Journal of Systems and Software, 138, pp. 158-173.</w:t>
+        <w:t>Murphy-Hill, E., Parnin, C. &amp; Black, A. P. 2012. “How We Refactor, and How We Know It.” IEEE Transactions on Software Engineering, 38(1), pp. 5-18.</w:t>
       </w:r>
     </w:p>
     <w:p>
@@ -20592,7 +21870,7 @@
         </w:rPr>
         <w:t>[30]</w:t>
         <w:tab/>
-        <w:t>Silva, D., Tsantalis, N. &amp; Valente, M. T. 2016. “Why We Refactor? Confessions of GitHub Contributors.” Proceedings of the 24th ACM SIGSOFT International Symposium on Foundations of Software Engineering (FSE ’16), pp. 858-870.</w:t>
+        <w:t>Opdyke, W. F. 1992. Refactoring Object-Oriented Frameworks. PhD thesis. University of Illinois at Urbana-Champaign.</w:t>
       </w:r>
     </w:p>
     <w:p>
@@ -20610,7 +21888,7 @@
         </w:rPr>
         <w:t>[31]</w:t>
         <w:tab/>
-        <w:t>Tsantalis, N. &amp; Chatzigeorgiou, A. 2009. “Identification of Move Method Refactoring Opportunities.” IEEE Transactions on Software Engineering, 35(3), pp. 347-367.</w:t>
+        <w:t>Palomba, F., Bavota, G., Di Penta, M., Fasano, F., Oliveto, R. &amp; De Lucia, A. 2018. “On the diffuseness and the impact on maintainability of code smells: a large scale empirical investigation.” Empirical Software Engineering, 23, pp. 1188-1221.</w:t>
       </w:r>
     </w:p>
     <w:p>
@@ -20628,7 +21906,223 @@
         </w:rPr>
         <w:t>[32]</w:t>
         <w:tab/>
+        <w:t>Palomba, F., Bavota, G., Di Penta, M., Oliveto, R., Poshyvanyk, D. &amp; De Lucia, A. 2015. “Mining Version Histories for Detecting Code Smells.” IEEE Transactions on Software Engineering, 41(5), pp. 462-489.</w:t>
+      </w:r>
+    </w:p>
+    <w:p>
+      <w:pPr>
+        <w:spacing w:line="360" w:lineRule="auto"/>
+        <w:ind w:left="720" w:hanging="720"/>
+        <w:jc w:val="both"/>
+      </w:pPr>
+      <w:r>
+        <w:rPr>
+          <w:rFonts w:ascii="Times New Roman" w:hAnsi="Times New Roman" w:eastAsia="Times New Roman"/>
+          <w:b w:val="0"/>
+          <w:caps w:val="0"/>
+          <w:sz w:val="24"/>
+        </w:rPr>
+        <w:t>[33]</w:t>
+        <w:tab/>
+        <w:t>Park, R. E. 1992. Software Size Measurement: A Framework for Counting Source Statements. Technical Report CMU/SEI-92-TR-020. Pittsburgh: Software Engineering Institute, Carnegie Mellon University.</w:t>
+      </w:r>
+    </w:p>
+    <w:p>
+      <w:pPr>
+        <w:spacing w:line="360" w:lineRule="auto"/>
+        <w:ind w:left="720" w:hanging="720"/>
+        <w:jc w:val="both"/>
+      </w:pPr>
+      <w:r>
+        <w:rPr>
+          <w:rFonts w:ascii="Times New Roman" w:hAnsi="Times New Roman" w:eastAsia="Times New Roman"/>
+          <w:b w:val="0"/>
+          <w:caps w:val="0"/>
+          <w:sz w:val="24"/>
+        </w:rPr>
+        <w:t>[34]</w:t>
+        <w:tab/>
+        <w:t>Pedregosa, F., Varoquaux, G., Gramfort, A., Michel, V., Thirion, B., Grisel, O., et al. 2011. “Scikit-learn: Machine Learning in Python.” Journal of Machine Learning Research, 12, pp. 2825-2830.</w:t>
+      </w:r>
+    </w:p>
+    <w:p>
+      <w:pPr>
+        <w:spacing w:line="360" w:lineRule="auto"/>
+        <w:ind w:left="720" w:hanging="720"/>
+        <w:jc w:val="both"/>
+      </w:pPr>
+      <w:r>
+        <w:rPr>
+          <w:rFonts w:ascii="Times New Roman" w:hAnsi="Times New Roman" w:eastAsia="Times New Roman"/>
+          <w:b w:val="0"/>
+          <w:caps w:val="0"/>
+          <w:sz w:val="24"/>
+        </w:rPr>
+        <w:t>[35]</w:t>
+        <w:tab/>
+        <w:t>PMD Team, 2026. PMD: An Extensible Cross-Language Static Code Analyzer, versioni 7.27.0. https://pmd.github.io/ (data e qasjes: 8 shtator 2026).</w:t>
+      </w:r>
+    </w:p>
+    <w:p>
+      <w:pPr>
+        <w:spacing w:line="360" w:lineRule="auto"/>
+        <w:ind w:left="720" w:hanging="720"/>
+        <w:jc w:val="both"/>
+      </w:pPr>
+      <w:r>
+        <w:rPr>
+          <w:rFonts w:ascii="Times New Roman" w:hAnsi="Times New Roman" w:eastAsia="Times New Roman"/>
+          <w:b w:val="0"/>
+          <w:caps w:val="0"/>
+          <w:sz w:val="24"/>
+        </w:rPr>
+        <w:t>[36]</w:t>
+        <w:tab/>
+        <w:t>Sharma, T. &amp; Spinellis, D. 2018. “A survey on software smells.” Journal of Systems and Software, 138, pp. 158-173.</w:t>
+      </w:r>
+    </w:p>
+    <w:p>
+      <w:pPr>
+        <w:spacing w:line="360" w:lineRule="auto"/>
+        <w:ind w:left="720" w:hanging="720"/>
+        <w:jc w:val="both"/>
+      </w:pPr>
+      <w:r>
+        <w:rPr>
+          <w:rFonts w:ascii="Times New Roman" w:hAnsi="Times New Roman" w:eastAsia="Times New Roman"/>
+          <w:b w:val="0"/>
+          <w:caps w:val="0"/>
+          <w:sz w:val="24"/>
+        </w:rPr>
+        <w:t>[37]</w:t>
+        <w:tab/>
+        <w:t>Silva, D., Tsantalis, N. &amp; Valente, M. T. 2016. “Why We Refactor? Confessions of GitHub Contributors.” Proceedings of the 24th ACM SIGSOFT International Symposium on Foundations of Software Engineering (FSE ’16), pp. 858-870.</w:t>
+      </w:r>
+    </w:p>
+    <w:p>
+      <w:pPr>
+        <w:spacing w:line="360" w:lineRule="auto"/>
+        <w:ind w:left="720" w:hanging="720"/>
+        <w:jc w:val="both"/>
+      </w:pPr>
+      <w:r>
+        <w:rPr>
+          <w:rFonts w:ascii="Times New Roman" w:hAnsi="Times New Roman" w:eastAsia="Times New Roman"/>
+          <w:b w:val="0"/>
+          <w:caps w:val="0"/>
+          <w:sz w:val="24"/>
+        </w:rPr>
+        <w:t>[38]</w:t>
+        <w:tab/>
+        <w:t>Sjøberg, D. I. K., Yamashita, A., Anda, B. C. D., Mockus, A. &amp; Dybå, T. 2013. “Quantifying the Effect of Code Smells on Maintenance Effort.” IEEE Transactions on Software Engineering, 39(8), pp. 1144-1156.</w:t>
+      </w:r>
+    </w:p>
+    <w:p>
+      <w:pPr>
+        <w:spacing w:line="360" w:lineRule="auto"/>
+        <w:ind w:left="720" w:hanging="720"/>
+        <w:jc w:val="both"/>
+      </w:pPr>
+      <w:r>
+        <w:rPr>
+          <w:rFonts w:ascii="Times New Roman" w:hAnsi="Times New Roman" w:eastAsia="Times New Roman"/>
+          <w:b w:val="0"/>
+          <w:caps w:val="0"/>
+          <w:sz w:val="24"/>
+        </w:rPr>
+        <w:t>[39]</w:t>
+        <w:tab/>
+        <w:t>Strobl, C., Boulesteix, A.-L., Zeileis, A. &amp; Hothorn, T. 2007. “Bias in random forest variable importance measures: Illustrations, sources and a solution.” BMC Bioinformatics, 8, 25.</w:t>
+      </w:r>
+    </w:p>
+    <w:p>
+      <w:pPr>
+        <w:spacing w:line="360" w:lineRule="auto"/>
+        <w:ind w:left="720" w:hanging="720"/>
+        <w:jc w:val="both"/>
+      </w:pPr>
+      <w:r>
+        <w:rPr>
+          <w:rFonts w:ascii="Times New Roman" w:hAnsi="Times New Roman" w:eastAsia="Times New Roman"/>
+          <w:b w:val="0"/>
+          <w:caps w:val="0"/>
+          <w:sz w:val="24"/>
+        </w:rPr>
+        <w:t>[40]</w:t>
+        <w:tab/>
+        <w:t>Tsantalis, N. &amp; Chatzigeorgiou, A. 2009. “Identification of Move Method Refactoring Opportunities.” IEEE Transactions on Software Engineering, 35(3), pp. 347-367.</w:t>
+      </w:r>
+    </w:p>
+    <w:p>
+      <w:pPr>
+        <w:spacing w:line="360" w:lineRule="auto"/>
+        <w:ind w:left="720" w:hanging="720"/>
+        <w:jc w:val="both"/>
+      </w:pPr>
+      <w:r>
+        <w:rPr>
+          <w:rFonts w:ascii="Times New Roman" w:hAnsi="Times New Roman" w:eastAsia="Times New Roman"/>
+          <w:b w:val="0"/>
+          <w:caps w:val="0"/>
+          <w:sz w:val="24"/>
+        </w:rPr>
+        <w:t>[41]</w:t>
+        <w:tab/>
+        <w:t>Tufano, M., Palomba, F., Bavota, G., Oliveto, R., Di Penta, M., De Lucia, A. &amp; Poshyvanyk, D. 2015. “When and Why Your Code Starts to Smell Bad.” Proceedings of the 37th IEEE/ACM International Conference on Software Engineering (ICSE ’15), pp. 403-414.</w:t>
+      </w:r>
+    </w:p>
+    <w:p>
+      <w:pPr>
+        <w:spacing w:line="360" w:lineRule="auto"/>
+        <w:ind w:left="720" w:hanging="720"/>
+        <w:jc w:val="both"/>
+      </w:pPr>
+      <w:r>
+        <w:rPr>
+          <w:rFonts w:ascii="Times New Roman" w:hAnsi="Times New Roman" w:eastAsia="Times New Roman"/>
+          <w:b w:val="0"/>
+          <w:caps w:val="0"/>
+          <w:sz w:val="24"/>
+        </w:rPr>
+        <w:t>[42]</w:t>
+        <w:tab/>
         <w:t>Wilson, E. B. 1927. “Probable Inference, the Law of Succession, and Statistical Inference.” Journal of the American Statistical Association, 22(158), pp. 209-212.</w:t>
+      </w:r>
+    </w:p>
+    <w:p>
+      <w:pPr>
+        <w:spacing w:line="360" w:lineRule="auto"/>
+        <w:ind w:left="720" w:hanging="720"/>
+        <w:jc w:val="both"/>
+      </w:pPr>
+      <w:r>
+        <w:rPr>
+          <w:rFonts w:ascii="Times New Roman" w:hAnsi="Times New Roman" w:eastAsia="Times New Roman"/>
+          <w:b w:val="0"/>
+          <w:caps w:val="0"/>
+          <w:sz w:val="24"/>
+        </w:rPr>
+        <w:t>[43]</w:t>
+        <w:tab/>
+        <w:t>Wohlin, C., Runeson, P., Höst, M., Ohlsson, M. C., Regnell, B. &amp; Wesslén, A. 2012. Experimentation in Software Engineering. Berlin: Springer.</w:t>
+      </w:r>
+    </w:p>
+    <w:p>
+      <w:pPr>
+        <w:spacing w:line="360" w:lineRule="auto"/>
+        <w:ind w:left="720" w:hanging="720"/>
+        <w:jc w:val="both"/>
+      </w:pPr>
+      <w:r>
+        <w:rPr>
+          <w:rFonts w:ascii="Times New Roman" w:hAnsi="Times New Roman" w:eastAsia="Times New Roman"/>
+          <w:b w:val="0"/>
+          <w:caps w:val="0"/>
+          <w:sz w:val="24"/>
+        </w:rPr>
+        <w:t>[44]</w:t>
+        <w:tab/>
+        <w:t>Yamashita, A. &amp; Moonen, L. 2013. “Do developers care about code smells? An exploratory survey.” Proceedings of the 20th Working Conference on Reverse Engineering (WCRE ’13), pp. 242-251.</w:t>
       </w:r>
     </w:p>
     <w:p>

</xml_diff>

<commit_message>
Korrigjo drejtshkrimin dhe gramatikën e punimit
Përshtatja në numër dhe gjini, «sesa» si një fjalë, numrat e vegjël me
fjalë, fjalitë e gjata të rishkruara, emri i programit në kopertinë,
data e qasjes te PMD dhe dhjetë terma të rinj në fjalor (VD-140).
</commit_message>
<xml_diff>
--- a/docs/thesis/Punim_Diplome_Florent_Latifi.docx
+++ b/docs/thesis/Punim_Diplome_Florent_Latifi.docx
@@ -54,7 +54,7 @@
           <w:caps w:val="0"/>
           <w:sz w:val="28"/>
         </w:rPr>
-        <w:t>Programi për Shkenca Kompjuterike dhe Inxhinieri</w:t>
+        <w:t>Programi për Shkenca Kompjuterike dhe Inxhinierisë</w:t>
       </w:r>
     </w:p>
     <w:p>
@@ -309,7 +309,7 @@
           <w:caps w:val="0"/>
           <w:sz w:val="28"/>
         </w:rPr>
-        <w:t>Programi për Shkenca Kompjuterike dhe Inxhinieri</w:t>
+        <w:t>Programi për Shkenca Kompjuterike dhe Inxhinierisë</w:t>
       </w:r>
     </w:p>
     <w:p>
@@ -1530,7 +1530,7 @@
           <w:caps w:val="0"/>
           <w:sz w:val="24"/>
         </w:rPr>
-        <w:t>CBO – Coupling Between Objects, lidhshmëria mes objekteve</w:t>
+        <w:t>Bootstrap – rimostrim me kthim për të vlerësuar pasigurinë e një treguesi</w:t>
       </w:r>
     </w:p>
     <w:p>
@@ -1546,7 +1546,7 @@
           <w:caps w:val="0"/>
           <w:sz w:val="24"/>
         </w:rPr>
-        <w:t>CC – Cyclomatic Complexity, kompleksiteti ciklomatik</w:t>
+        <w:t>CBO – Coupling Between Objects, lidhshmëria mes objekteve</w:t>
       </w:r>
     </w:p>
     <w:p>
@@ -1562,7 +1562,7 @@
           <w:caps w:val="0"/>
           <w:sz w:val="24"/>
         </w:rPr>
-        <w:t>CINT – Coupling Intensity, intensiteti i lidhshmërisë së një metode</w:t>
+        <w:t>CC – Cyclomatic Complexity, kompleksiteti ciklomatik</w:t>
       </w:r>
     </w:p>
     <w:p>
@@ -1578,7 +1578,7 @@
           <w:caps w:val="0"/>
           <w:sz w:val="24"/>
         </w:rPr>
-        <w:t>CK – Chidamber &amp; Kemerer, suita e metrikave të objekteve</w:t>
+        <w:t>CINT – Coupling Intensity, intensiteti i lidhshmërisë së një metode</w:t>
       </w:r>
     </w:p>
     <w:p>
@@ -1594,7 +1594,7 @@
           <w:caps w:val="0"/>
           <w:sz w:val="24"/>
         </w:rPr>
-        <w:t>CLOC – Class Lines of Code, rreshtat efektivë të një klase</w:t>
+        <w:t>CK – Chidamber &amp; Kemerer, suita e metrikave të objekteve</w:t>
       </w:r>
     </w:p>
     <w:p>
@@ -1610,7 +1610,7 @@
           <w:caps w:val="0"/>
           <w:sz w:val="24"/>
         </w:rPr>
-        <w:t>DECOR – metoda e specifikimit dhe e detektimit të code smells nga Moha et al.</w:t>
+        <w:t>CLOC – Class Lines of Code, rreshtat efektivë të një klase</w:t>
       </w:r>
     </w:p>
     <w:p>
@@ -1626,7 +1626,7 @@
           <w:caps w:val="0"/>
           <w:sz w:val="24"/>
         </w:rPr>
-        <w:t>DIT – Depth of Inheritance Tree, thellësia e pemës së trashëgimisë</w:t>
+        <w:t>Commit – një gjendje e ruajtur e kodit në historikun e git-it</w:t>
       </w:r>
     </w:p>
     <w:p>
@@ -1642,7 +1642,7 @@
           <w:caps w:val="0"/>
           <w:sz w:val="24"/>
         </w:rPr>
-        <w:t>F1 – mesatarja harmonike e precizionit dhe recall-it</w:t>
+        <w:t>Dataset – bashkësi të dhënash e etiketuar</w:t>
       </w:r>
     </w:p>
     <w:p>
@@ -1658,7 +1658,7 @@
           <w:caps w:val="0"/>
           <w:sz w:val="24"/>
         </w:rPr>
-        <w:t>FDP – Foreign Data Providers, numri i klasave që ofrojnë të dhëna të huaja</w:t>
+        <w:t>DECOR – metoda e specifikimit dhe e detektimit të code smells nga Moha et al.</w:t>
       </w:r>
     </w:p>
     <w:p>
@@ -1674,7 +1674,7 @@
           <w:caps w:val="0"/>
           <w:sz w:val="24"/>
         </w:rPr>
-        <w:t>GroupKFold – ndarje me grupe, ku çdo depo bie e tëra në një fold</w:t>
+        <w:t>Diff / patch – dallimi mes kodit para dhe pas një rishkrimi</w:t>
       </w:r>
     </w:p>
     <w:p>
@@ -1690,7 +1690,7 @@
           <w:caps w:val="0"/>
           <w:sz w:val="24"/>
         </w:rPr>
-        <w:t>LAA – Locality of Attribute Accesses, lokaliteti i qasjeve në atribute</w:t>
+        <w:t>DIT – Depth of Inheritance Tree, thellësia e pemës së trashëgimisë</w:t>
       </w:r>
     </w:p>
     <w:p>
@@ -1706,7 +1706,7 @@
           <w:caps w:val="0"/>
           <w:sz w:val="24"/>
         </w:rPr>
-        <w:t>LCOM – Lack of Cohesion in Methods, mungesa e kohezionit në metoda</w:t>
+        <w:t>F1 – mesatarja harmonike e precizionit dhe recall-it</w:t>
       </w:r>
     </w:p>
     <w:p>
@@ -1722,7 +1722,7 @@
           <w:caps w:val="0"/>
           <w:sz w:val="24"/>
         </w:rPr>
-        <w:t>LOC – Lines of Code, rreshtat e kodit</w:t>
+        <w:t>FDP – Foreign Data Providers, numri i klasave që ofrojnë të dhëna të huaja</w:t>
       </w:r>
     </w:p>
     <w:p>
@@ -1738,7 +1738,7 @@
           <w:caps w:val="0"/>
           <w:sz w:val="24"/>
         </w:rPr>
-        <w:t>MAXCC – kompleksiteti maksimal ciklomatik në një klasë</w:t>
+        <w:t>Fold – njëra nga pjesët në të cilat ndahet bashkësia për validim të kryqëzuar</w:t>
       </w:r>
     </w:p>
     <w:p>
@@ -1754,7 +1754,7 @@
           <w:caps w:val="0"/>
           <w:sz w:val="24"/>
         </w:rPr>
-        <w:t>MAXNESTING – thellësia maksimale e ndërfutjes së blloqeve</w:t>
+        <w:t>GroupKFold – ndarje me grupe, ku çdo depo bie e tëra në një fold</w:t>
       </w:r>
     </w:p>
     <w:p>
@@ -1770,7 +1770,7 @@
           <w:caps w:val="0"/>
           <w:sz w:val="24"/>
         </w:rPr>
-        <w:t>MCC – Matthews Correlation Coefficient, koeficienti i korrelacionit i Matthews-it</w:t>
+        <w:t>IB – interval besimi</w:t>
       </w:r>
     </w:p>
     <w:p>
@@ -1786,7 +1786,7 @@
           <w:caps w:val="0"/>
           <w:sz w:val="24"/>
         </w:rPr>
-        <w:t>MLCQ – Machine Learning Code Quality, dataset i etiketuar i code smells</w:t>
+        <w:t>JDK – Java Development Kit, që përmban kompilatorin javac</w:t>
       </w:r>
     </w:p>
     <w:p>
@@ -1802,7 +1802,7 @@
           <w:caps w:val="0"/>
           <w:sz w:val="24"/>
         </w:rPr>
-        <w:t>MLOC – Method Lines of Code, rreshtat efektivë të një metode</w:t>
+        <w:t>LAA – Locality of Attribute Accesses, lokaliteti i qasjeve në atribute</w:t>
       </w:r>
     </w:p>
     <w:p>
@@ -1818,7 +1818,7 @@
           <w:caps w:val="0"/>
           <w:sz w:val="24"/>
         </w:rPr>
-        <w:t>NOAM – Number of Accessor Methods, numri i akses-metodave</w:t>
+        <w:t>LCOM – Lack of Cohesion in Methods, mungesa e kohezionit në metoda</w:t>
       </w:r>
     </w:p>
     <w:p>
@@ -1834,7 +1834,7 @@
           <w:caps w:val="0"/>
           <w:sz w:val="24"/>
         </w:rPr>
-        <w:t>NOAV – Number of Accessed Variables, numri i variablave të prekura</w:t>
+        <w:t>LOC – Lines of Code, rreshtat e kodit</w:t>
       </w:r>
     </w:p>
     <w:p>
@@ -1850,7 +1850,7 @@
           <w:caps w:val="0"/>
           <w:sz w:val="24"/>
         </w:rPr>
-        <w:t>NOC – Number of Children, numri i nënklasave të drejtpërdrejta</w:t>
+        <w:t>MAXCC – kompleksiteti maksimal ciklomatik në një klasë</w:t>
       </w:r>
     </w:p>
     <w:p>
@@ -1866,7 +1866,7 @@
           <w:caps w:val="0"/>
           <w:sz w:val="24"/>
         </w:rPr>
-        <w:t>NOF – Number of Fields, numri i fushave</w:t>
+        <w:t>MAXNESTING – thellësia maksimale e ndërfutjes së blloqeve</w:t>
       </w:r>
     </w:p>
     <w:p>
@@ -1882,7 +1882,7 @@
           <w:caps w:val="0"/>
           <w:sz w:val="24"/>
         </w:rPr>
-        <w:t>NOM – Number of Methods, numri i metodave</w:t>
+        <w:t>MCC – Matthews Correlation Coefficient, koeficienti i korrelacionit i Matthews-it</w:t>
       </w:r>
     </w:p>
     <w:p>
@@ -1898,7 +1898,7 @@
           <w:caps w:val="0"/>
           <w:sz w:val="24"/>
         </w:rPr>
-        <w:t>NOPA – Number of Public Attributes, numri i atributeve publike</w:t>
+        <w:t>MLCQ – Machine Learning Code Quality, dataset i etiketuar i code smells</w:t>
       </w:r>
     </w:p>
     <w:p>
@@ -1914,7 +1914,7 @@
           <w:caps w:val="0"/>
           <w:sz w:val="24"/>
         </w:rPr>
-        <w:t>NP – Number of Parameters, numri i parametrave</w:t>
+        <w:t>MLOC – Method Lines of Code, rreshtat efektivë të një metode</w:t>
       </w:r>
     </w:p>
     <w:p>
@@ -1930,7 +1930,167 @@
           <w:caps w:val="0"/>
           <w:sz w:val="24"/>
         </w:rPr>
+        <w:t>NOAM – Number of Accessor Methods, numri i akses-metodave</w:t>
+      </w:r>
+    </w:p>
+    <w:p>
+      <w:pPr>
+        <w:pStyle w:val="ListBullet"/>
+        <w:spacing w:line="360" w:lineRule="auto"/>
+        <w:jc w:val="both"/>
+      </w:pPr>
+      <w:r>
+        <w:rPr>
+          <w:rFonts w:ascii="Times New Roman" w:hAnsi="Times New Roman" w:eastAsia="Times New Roman"/>
+          <w:b w:val="0"/>
+          <w:caps w:val="0"/>
+          <w:sz w:val="24"/>
+        </w:rPr>
+        <w:t>NOAV – Number of Accessed Variables, numri i variablave të prekura</w:t>
+      </w:r>
+    </w:p>
+    <w:p>
+      <w:pPr>
+        <w:pStyle w:val="ListBullet"/>
+        <w:spacing w:line="360" w:lineRule="auto"/>
+        <w:jc w:val="both"/>
+      </w:pPr>
+      <w:r>
+        <w:rPr>
+          <w:rFonts w:ascii="Times New Roman" w:hAnsi="Times New Roman" w:eastAsia="Times New Roman"/>
+          <w:b w:val="0"/>
+          <w:caps w:val="0"/>
+          <w:sz w:val="24"/>
+        </w:rPr>
+        <w:t>NOC – Number of Children, numri i nënklasave të drejtpërdrejta</w:t>
+      </w:r>
+    </w:p>
+    <w:p>
+      <w:pPr>
+        <w:pStyle w:val="ListBullet"/>
+        <w:spacing w:line="360" w:lineRule="auto"/>
+        <w:jc w:val="both"/>
+      </w:pPr>
+      <w:r>
+        <w:rPr>
+          <w:rFonts w:ascii="Times New Roman" w:hAnsi="Times New Roman" w:eastAsia="Times New Roman"/>
+          <w:b w:val="0"/>
+          <w:caps w:val="0"/>
+          <w:sz w:val="24"/>
+        </w:rPr>
+        <w:t>NOF – Number of Fields, numri i fushave</w:t>
+      </w:r>
+    </w:p>
+    <w:p>
+      <w:pPr>
+        <w:pStyle w:val="ListBullet"/>
+        <w:spacing w:line="360" w:lineRule="auto"/>
+        <w:jc w:val="both"/>
+      </w:pPr>
+      <w:r>
+        <w:rPr>
+          <w:rFonts w:ascii="Times New Roman" w:hAnsi="Times New Roman" w:eastAsia="Times New Roman"/>
+          <w:b w:val="0"/>
+          <w:caps w:val="0"/>
+          <w:sz w:val="24"/>
+        </w:rPr>
+        <w:t>NOM – Number of Methods, numri i metodave</w:t>
+      </w:r>
+    </w:p>
+    <w:p>
+      <w:pPr>
+        <w:pStyle w:val="ListBullet"/>
+        <w:spacing w:line="360" w:lineRule="auto"/>
+        <w:jc w:val="both"/>
+      </w:pPr>
+      <w:r>
+        <w:rPr>
+          <w:rFonts w:ascii="Times New Roman" w:hAnsi="Times New Roman" w:eastAsia="Times New Roman"/>
+          <w:b w:val="0"/>
+          <w:caps w:val="0"/>
+          <w:sz w:val="24"/>
+        </w:rPr>
+        <w:t>NOPA – Number of Public Attributes, numri i atributeve publike</w:t>
+      </w:r>
+    </w:p>
+    <w:p>
+      <w:pPr>
+        <w:pStyle w:val="ListBullet"/>
+        <w:spacing w:line="360" w:lineRule="auto"/>
+        <w:jc w:val="both"/>
+      </w:pPr>
+      <w:r>
+        <w:rPr>
+          <w:rFonts w:ascii="Times New Roman" w:hAnsi="Times New Roman" w:eastAsia="Times New Roman"/>
+          <w:b w:val="0"/>
+          <w:caps w:val="0"/>
+          <w:sz w:val="24"/>
+        </w:rPr>
+        <w:t>NP – Number of Parameters, numri i parametrave</w:t>
+      </w:r>
+    </w:p>
+    <w:p>
+      <w:pPr>
+        <w:pStyle w:val="ListBullet"/>
+        <w:spacing w:line="360" w:lineRule="auto"/>
+        <w:jc w:val="both"/>
+      </w:pPr>
+      <w:r>
+        <w:rPr>
+          <w:rFonts w:ascii="Times New Roman" w:hAnsi="Times New Roman" w:eastAsia="Times New Roman"/>
+          <w:b w:val="0"/>
+          <w:caps w:val="0"/>
+          <w:sz w:val="24"/>
+        </w:rPr>
+        <w:t>PK – pyetje kërkimore</w:t>
+      </w:r>
+    </w:p>
+    <w:p>
+      <w:pPr>
+        <w:pStyle w:val="ListBullet"/>
+        <w:spacing w:line="360" w:lineRule="auto"/>
+        <w:jc w:val="both"/>
+      </w:pPr>
+      <w:r>
+        <w:rPr>
+          <w:rFonts w:ascii="Times New Roman" w:hAnsi="Times New Roman" w:eastAsia="Times New Roman"/>
+          <w:b w:val="0"/>
+          <w:caps w:val="0"/>
+          <w:sz w:val="24"/>
+        </w:rPr>
         <w:t>PMD – mjet i hapur i analizës statike, i përdorur si krahasim i jashtëm</w:t>
+      </w:r>
+    </w:p>
+    <w:p>
+      <w:pPr>
+        <w:pStyle w:val="ListBullet"/>
+        <w:spacing w:line="360" w:lineRule="auto"/>
+        <w:jc w:val="both"/>
+      </w:pPr>
+      <w:r>
+        <w:rPr>
+          <w:rFonts w:ascii="Times New Roman" w:hAnsi="Times New Roman" w:eastAsia="Times New Roman"/>
+          <w:b w:val="0"/>
+          <w:caps w:val="0"/>
+          <w:sz w:val="24"/>
+        </w:rPr>
+        <w:t>Precizion – pjesa e rasteve të shënuara që janë vërtet pozitive</w:t>
+      </w:r>
+    </w:p>
+    <w:p>
+      <w:pPr>
+        <w:pStyle w:val="ListBullet"/>
+        <w:spacing w:line="360" w:lineRule="auto"/>
+        <w:jc w:val="both"/>
+      </w:pPr>
+      <w:r>
+        <w:rPr>
+          <w:rFonts w:ascii="Times New Roman" w:hAnsi="Times New Roman" w:eastAsia="Times New Roman"/>
+          <w:b w:val="0"/>
+          <w:caps w:val="0"/>
+          <w:sz w:val="24"/>
+        </w:rPr>
+        <w:t>Recall – pjesa e rasteve pozitive që detektori i gjen</w:t>
       </w:r>
     </w:p>
     <w:p>
@@ -2304,7 +2464,7 @@
           <w:caps w:val="0"/>
           <w:sz w:val="24"/>
         </w:rPr>
-        <w:t>Lanza &amp; Marinescu (2006) i organizojnë metrikat në tri përmasa: madhësinë dhe kompleksitetin, lidhjen me klasat e tjera, dhe trashëgiminë. Ata u shtuan edhe metrika të reja, si ATFD, LAA dhe FDP, që nuk matin madhësinë e një entiteti por marrëdhënien e tij me të dhënat e klasave të tjera. Këto janë metrikat që u duhen erërave të bashkëpunimit, si Feature Envy, të cilat nuk i kap dot asnjë metrikë madhësie.</w:t>
+        <w:t>Lanza &amp; Marinescu (2006) i organizojnë metrikat në tri përmasa: madhësinë dhe kompleksitetin, lidhjen me klasat e tjera, dhe trashëgiminë. Ata shtuan edhe metrika të reja, si ATFD, LAA dhe FDP, që nuk matin madhësinë e një entiteti por marrëdhënien e tij me të dhënat e klasave të tjera. Këto janë metrikat që u duhen erërave të bashkëpunimit, si Feature Envy, të cilat nuk i kap dot asnjë metrikë madhësie.</w:t>
       </w:r>
     </w:p>
     <w:p>
@@ -2366,7 +2526,7 @@
           <w:caps w:val="0"/>
           <w:sz w:val="24"/>
         </w:rPr>
-        <w:t>Pragjet e tyre janë dy llojesh. Ato statistikore, si «i lartë» dhe «shumë i lartë», nxirren nga mesatarja dhe devijimi standard i metrikës në korpusin e tyre. Ato me kuptim të zakonshëm, si «pak» ose «një e treta», vijnë nga mënyra si njerëzit i përdorin këto fjalë. Të parat varen pra nga korpusi ku u matën, dhe kjo i bën pyetje të hapur për çdo korpus tjetër.</w:t>
+        <w:t>Pragjet e tyre janë dy llojesh. Ato statistikore, si «i lartë» dhe «shumë i lartë», nxirren nga mesatarja dhe devijimi standard i metrikës në korpusin e tyre. Ato me kuptim të zakonshëm, si «pak» ose «një e treta», vijnë nga mënyra si njerëzit i përdorin këto fjalë. Të parat varen pra nga korpusi ku u matën, ndaj vlefshmëria e tyre në një korpus tjetër mbetet pyetje e hapur.</w:t>
       </w:r>
     </w:p>
     <w:p>
@@ -2444,7 +2604,7 @@
           <w:caps w:val="0"/>
           <w:sz w:val="24"/>
         </w:rPr>
-        <w:t>Ideja e mësimit të makinës është që pragjet t'i mësojë modeli nga shembuj të etiketuar, në vend që t'i vendosë njeriu. Arcelli Fontana et al. (2016) kryen një nga eksperimentet më të mëdha të këtij lloji: gjashtëmbëdhjetë algoritme mbi katër erëra (Data Class, Large Class, Feature Envy dhe Long Method), me 1 986 raste të validuara me dorë nga 74 sisteme. Ata raportuan performancë të lartë për shumicën e algoritmeve në validimin e kryqëzuar, me J48 dhe Random Forest si më të mirat dhe makinat me vektorë mbështetës si më të dobëtat. Studimi u bë pikë referimi për shumë punime pasuese.</w:t>
+        <w:t>Ideja e mësimit të makinës është që pragjet t'i mësojë modeli nga shembuj të etiketuar, në vend që t'i vendosë njeriu. Arcelli Fontana et al. (2016) kryen një nga eksperimentet më të mëdha të këtij lloji: gjashtëmbëdhjetë algoritme mbi katër erëra (Data Class, Large Class, Feature Envy dhe Long Method), me 1986 raste të validuara me dorë nga 74 sisteme. Ata raportuan performancë të lartë për shumicën e algoritmeve në validimin e kryqëzuar, me J48 dhe Random Forest si më të mirat dhe makinat me vektorë mbështetës si më të dobëtat. Studimi u bë pikë referimi për shumë punime pasuese.</w:t>
       </w:r>
     </w:p>
     <w:p>
@@ -4652,7 +4812,7 @@
           <w:caps w:val="0"/>
           <w:sz w:val="24"/>
         </w:rPr>
-        <w:t>MLCQ (Madeyski &amp; Lewowski, 2020) përmban 14 739 rishikime të 4 770 mostrave kodi, të bëra nga 26 zhvillues profesionistë për katër erëra: Blob dhe Data Class në nivel klase, Feature Envy dhe Long Method në nivel metode. Çdo rishikim i jep mostrës një ashpërsi në shkallën none, minor, major dhe critical, ku «none» do të thotë se rishikuesi nuk e sheh erën. Mostrat vijnë nga projekte me burim të hapur, por vetë kodi nuk është pjesë e dataset-it: çdo rresht tregon depon, commit-in, skedarin dhe rangun e rreshtave të entitetit.</w:t>
+        <w:t>MLCQ (Madeyski &amp; Lewowski, 2020) përmban 14 739 rishikime të 4770 mostrave kodi, të bëra nga 26 zhvillues profesionistë për katër erëra: Blob dhe Data Class në nivel klase, Feature Envy dhe Long Method në nivel metode. Çdo rishikim i jep mostrës një ashpërsi në shkallën none, minor, major dhe critical, ku «none» do të thotë se rishikuesi nuk e sheh erën. Mostrat vijnë nga projekte me burim të hapur, por vetë kodi nuk është pjesë e dataset-it: çdo rresht tregon depon, commit-in, skedarin dhe rangun e rreshtave të entitetit.</w:t>
       </w:r>
     </w:p>
     <w:p>
@@ -5474,7 +5634,7 @@
           <w:caps w:val="0"/>
           <w:sz w:val="24"/>
         </w:rPr>
-        <w:t xml:space="preserve"> Kompilimi mbulon vetëm gjysmën e përkufizimit të Fowler-it (2018), ruajtjen e sjelljes. Nëse struktura u përmirësua e gjykon një njeri, mbi një mostër diff-esh, me një rubrikë me tri përmasa: </w:t>
+        <w:t xml:space="preserve"> Kompilimi dëshmon vetëm se rishkrimi mbetet kod i vlefshëm. Përkufizimi i Fowler-it (2018) kërkon edhe që struktura të përmirësohet, dhe nëse u përmirësua e gjykon një njeri, mbi një mostër diff-esh, me një rubrikë me tri përmasa: </w:t>
       </w:r>
       <w:r>
         <w:rPr>
@@ -5636,7 +5796,7 @@
           <w:caps w:val="0"/>
           <w:sz w:val="24"/>
         </w:rPr>
-        <w:t>Detektimi vlerësohet si klasifikim binar mbi etiketën e Nënkapitullit 4.3. Te matrica konfuze, TP janë mostrat pozitive që detektori i shënon, FP negativet që shënon, FN pozitivet që i humbet dhe TN negativet që i lë. Prej saj llogariten precizioni, recall-i dhe F1:</w:t>
+        <w:t>Detektimi vlerësohet si klasifikim binar mbi etiketën e Nënkapitullit 4.3. Te matrica konfuze, TP janë mostrat pozitive që detektori i shënon, FP negativët që shënon, FN pozitivët që i humbet dhe TN negativët që i lë. Prej saj llogariten precizioni, recall-i dhe F1:</w:t>
       </w:r>
     </w:p>
     <w:p>
@@ -6376,7 +6536,7 @@
           <w:caps w:val="0"/>
           <w:sz w:val="24"/>
         </w:rPr>
-        <w:t>Të gjitha shifrat e këtij kapitulli janë prodhuar mbi 4534 mostra nga 512 depo, dhe rigjenerohen me një komandë. Agregimi i etiketave është mesatarja e rrumbullakosur lart, përveç aty ku thuhet ndryshe.</w:t>
+        <w:t>Të gjitha shifrat e këtij kapitulli janë prodhuar mbi 4534 mostra nga 512 depo, dhe rigjenerohen me një komandë. Etiketa është mesatarja e rrumbullakosur e Nënkapitullit 4.3, përveç aty ku thuhet ndryshe.</w:t>
       </w:r>
     </w:p>
     <w:p>
@@ -12279,7 +12439,7 @@
           <w:caps w:val="0"/>
           <w:sz w:val="24"/>
         </w:rPr>
-        <w:t>Nga 3532 rishkrime, 58 futën një gabim që nuk ishte aty më parë (1.64%). Te 3 rishkrime javac-u nuk dha verdikt, ndaj për ato dihet vetëm se rishkrimi është Java e vlefshme. Pjesa tjetër ose kompiloi, ose nuk shtoi asnjë lloj të ri gabimi kundrejt skedarit origjinal.</w:t>
+        <w:t>Nga 3532 rishkrime, 58 futën një gabim që nuk ishte aty më parë (1.64%). Te tri rishkrime javac-u nuk dha verdikt, ndaj për ato dihet vetëm se rishkrimi është Java e vlefshme. Pjesa tjetër ose kompiloi, ose nuk shtoi asnjë lloj të ri gabimi kundrejt skedarit origjinal.</w:t>
       </w:r>
     </w:p>
     <w:p>
@@ -13443,7 +13603,7 @@
           <w:caps w:val="0"/>
           <w:sz w:val="24"/>
         </w:rPr>
-        <w:t>Dy rishkrime nga 201 nuk shtonin lloj të ri gabimi të izoluara, por shtojnë brenda projektit të vet. Rastet janë Extract Method mbi PlanModifierUtil.fixTopOBSchema(RelNode, Pair, List, boolean) në projektin «hive» dhe Extract Method mbi TypeHierarchyTests.testSupertypeHierarchyOnWorkingCopy() në projektin «eclipse.jdt.core». Gabimet që shtojnë janë «package ImmutableMap does not exist», «package org.eclipse.jface.text does not exist» dhe «package org.eclipse.text.edits does not exist». 19 kompilime mbetën pa verdikt, nga kufiri kohor ose nga një javac që dështoi pa emërtuar gabim, dhe numërohen si të pakontrolluara, kurrë si sukses.</w:t>
+        <w:t>Dy nga 201 rishkrimet nuk shtonin lloj të ri gabimi kur kompiloheshin të izoluara, por shtojnë kur kompilohen brenda projektit të vet. Rastet janë Extract Method mbi PlanModifierUtil.fixTopOBSchema(RelNode, Pair, List, boolean) në projektin «hive» dhe Extract Method mbi TypeHierarchyTests.testSupertypeHierarchyOnWorkingCopy() në projektin «eclipse.jdt.core». Gabimet që shtojnë janë «package ImmutableMap does not exist», «package org.eclipse.jface.text does not exist» dhe «package org.eclipse.text.edits does not exist». Pa verdikt mbetën 19 kompilime, nga kufiri kohor ose nga një javac që dështoi pa emërtuar gabim, dhe numërohen si të pakontrolluara, kurrë si sukses.</w:t>
       </w:r>
     </w:p>
     <w:p>
@@ -16814,7 +16974,7 @@
           <w:caps w:val="0"/>
           <w:sz w:val="24"/>
         </w:rPr>
-        <w:t>Me kalibrimin jashtë fold-it (5 folde sipas depos, Nënkapitulli 4.9), rregullat arrijnë këto vlera; kolona e fundit jep pragun që zgjodhi secili fold dhe sa herë u zgjodh (Tabela 18):</w:t>
+        <w:t>Me kalibrimin jashtë fold-it (pesë folde sipas depos, Nënkapitulli 4.9), rregullat arrijnë këto vlera; kolona e fundit jep pragun që zgjodhi secili fold dhe sa herë u zgjodh (Tabela 18):</w:t>
       </w:r>
     </w:p>
     <w:p>
@@ -20034,7 +20194,7 @@
           <w:caps w:val="0"/>
           <w:sz w:val="24"/>
         </w:rPr>
-        <w:t>Te Long Method, pragu i botuar del konservativ për këtë korpus: me një prag më të ulët recall-i rritet shumë më tepër se sa bie precizioni, çka sugjeron se rishikuesit e MLCQ-së e quajnë një metodë të gjatë më herët se sa e vendos pragu. Fitimi megjithatë paguhet me precizion, dhe foldet e kalibrimit nuk bien dakord për vlerën.</w:t>
+        <w:t>Te Long Method, pragu i botuar del konservativ për këtë korpus: me një prag më të ulët recall-i rritet shumë më tepër sesa bie precizioni, çka sugjeron se rishikuesit e MLCQ-së e quajnë një metodë të gjatë më herët sesa e vendos pragu. Fitimi megjithatë paguhet me precizion, dhe foldet e kalibrimit nuk bien dakord për vlerën.</w:t>
       </w:r>
     </w:p>
     <w:p>
@@ -20830,7 +20990,7 @@
           <w:caps w:val="0"/>
           <w:sz w:val="24"/>
         </w:rPr>
-        <w:t>Te Blob, Data Class dhe Long Method modelet e këtij punimi dalin pak nën ato të Madeyski &amp; Lewowski-t. Dallimi i validimit e bën këtë të pritshme: ata e ndajnë bashkësinë me validim të kryqëzuar me pesë folde, të shtresuar sipas klasës por jo të grupuar sipas projektit, ndaj e njëjta depo mund ta ushqejë trajnimin dhe të vlerësohet në të njëjtën kohë, pikërisht rrjedhja që ky punim e shmang me GroupKFold. Ata raportojnë edhe mesoren e 120 ekzekutimeve me hiperparametra të optimizuar për MCC, ndërsa këtu modelet kanë parametra fiksë dhe një ekzekutim të vetëm jashtë fold-it. Me një ndarje më të rreptë dhe pa akordim, rezultatet e këtij punimi janë në të njëjtin brez.</w:t>
+        <w:t>Te Blob, Data Class dhe Long Method modelet e këtij punimi dalin pak nën ato të Madeyski &amp; Lewowski-t. Dallimi i validimit e bën këtë të pritshme: ata e ndajnë bashkësinë me validim të kryqëzuar me pesë folde, të shtresuar sipas klasës por jo të grupuar sipas projektit, ndaj e njëjta depo mund ta ushqejë trajnimin dhe të vlerësohet në të njëjtën kohë, pikërisht rrjedhja që ky punim e shmang me GroupKFold. Ata raportojnë edhe mesoren e 120 ekzekutimeve me hiperparametra të optimizuar për MCC, ndërsa këtu modelet kanë parametra të fiksuar dhe një ekzekutim të vetëm jashtë fold-it. Me një ndarje më të rreptë dhe pa akordim, rezultatet e këtij punimi janë në të njëjtin brez.</w:t>
       </w:r>
     </w:p>
     <w:p>
@@ -20878,7 +21038,7 @@
           <w:caps w:val="0"/>
           <w:sz w:val="24"/>
         </w:rPr>
-        <w:t>Mäntylä &amp; Lassenius (2006) gjetën se vlerësimi i erërave nga zhvilluesit është subjektiv, dhe ky punim e mat këtë mbi MLCQ: dy rishikues të së njëjtës mostër pajtohen me MCC nga 0.02 deri në 0.24. Etiketa e agreguar është mesatare e disa gjykimeve dhe e zbut zhurmën e secilit, ndaj modelet mund të pajtohen me të më shumë se sa pajtohen dy rishikues mes tyre. Kjo nuk e bën modelin më të mirë se njeriun, por tregon se shifrat e fushës duhen lexuar kundrejt një tavani të ulët.</w:t>
+        <w:t>Mäntylä &amp; Lassenius (2006) gjetën se vlerësimi i erërave nga zhvilluesit është subjektiv, dhe ky punim e mat këtë mbi MLCQ: dy rishikues të së njëjtës mostër pajtohen me MCC nga 0.02 deri në 0.24. Etiketa e agreguar është mesatare e disa gjykimeve dhe e zbut zhurmën e secilit, ndaj modelet mund të pajtohen me të më shumë sesa pajtohen dy rishikues mes tyre. Kjo nuk e bën modelin më të mirë se njeriun, por tregon se shifrat e fushës duhen lexuar kundrejt një tavani të ulët.</w:t>
       </w:r>
     </w:p>
     <w:p>
@@ -21960,7 +22120,7 @@
         </w:rPr>
         <w:t>[35]</w:t>
         <w:tab/>
-        <w:t>PMD Team, 2026. PMD: An Extensible Cross-Language Static Code Analyzer, versioni 7.27.0. https://pmd.github.io/ (data e qasjes: 8 shtator 2026).</w:t>
+        <w:t>PMD Team, 2026. PMD: An Extensible Cross-Language Static Code Analyzer, versioni 7.27.0. [https://pmd.github.io/], data e qasjes: 08.09.2026.</w:t>
       </w:r>
     </w:p>
     <w:p>
@@ -27736,7 +27896,7 @@
           <w:caps w:val="0"/>
           <w:sz w:val="24"/>
         </w:rPr>
-        <w:t>Çdo skript shkruan rezultatin si CSV ose JSON në data/results/, bashkë me commit-in, versionin e Python-it dhe platformën që e prodhuan. Interpretuesi dhe platforma janë të njëjtët për të gjithë: Python 3.13.1, Windows-11-10.0.26200-SP0. Commit-i jo: eksperimentet u ekzekutuan njëri pas tjetrit, ndaj secili skedar mban commit-in e vet, dhe ai duhet përdorur për ta riprodhuar (Tabela 31).</w:t>
+        <w:t>Çdo skript shkruan rezultatin si CSV ose JSON në data/results/, bashkë me commit-in, versionin e Python-it dhe platformën që e prodhuan. Interpretuesi dhe platforma janë të njëjtë për të gjithë: Python 3.13.1, Windows-11-10.0.26200-SP0. Commit-i jo: eksperimentet u ekzekutuan njëri pas tjetrit, ndaj secili skedar mban commit-in e vet, dhe ai duhet përdorur për ta riprodhuar (Tabela 31).</w:t>
       </w:r>
     </w:p>
     <w:p>
@@ -28556,7 +28716,7 @@
           <w:caps w:val="0"/>
           <w:sz w:val="24"/>
         </w:rPr>
-        <w:t>Ky premtim u vu në provë më 3 shtator 2026. Trembëdhjetë nga pesëmbëdhjetë hapat që kishte atëherë tabela u ri-ekzekutuan mbi të njëjtat hyrje, dhe të gjithë, me një përjashtim, dhanë skedarë identikë me të komituarit, veç commit-it dhe kohëzgjatjes që regjistrojnë. Tabela e veçorive, 4534 rreshta, doli bajt për bajt identike; po ashtu të katër modelet e stërvitura, dhe asnjë figurë nuk ndryshoi.</w:t>
+        <w:t>Ky premtim u vu në provë më 3 shtator 2026. Trembëdhjetë nga pesëmbëdhjetë hapat që kishte atëherë tabela u ri-ekzekutuan mbi të njëjtat hyrje, dhe të gjithë, me një përjashtim, dhanë skedarë identikë me të komituarit, veç commit-it dhe kohëzgjatjes që regjistrojnë. Tabela e veçorive, 4534 rreshta, doli bajt për bajt identike; po ashtu të katër modelet e trajnuara, dhe asnjë figurë nuk ndryshoi.</w:t>
       </w:r>
     </w:p>
     <w:p>
@@ -28588,7 +28748,7 @@
           <w:caps w:val="0"/>
           <w:sz w:val="24"/>
         </w:rPr>
-        <w:t>Hapi 7, motori mbi korpusin, u riekzekutua më vonë dhe dha të njëjtat total: po aq vende, po aq rishkrime, po aq refuzime, e njëjta ndarje sipas transformimit dhe sipas arsyes. Krahasimi rresht për rresht nxori megjithatë 21 verdikte kompilimi të ndryshuara, dhe ato çuan te një defekt i vërtetë: një javac që dështon pa emërtuar gabim mbi burimin lexohej si kompilim i pastër, pra 19 rishkrime ishin regjistruar si «kompilon» mbi skedarë që nuk kompilojnë. Pas ndreqjes, kjo shtojcë dhe Kapitulli 5 raportojnë matjen e re. Vlera e riprodhimit qëndron pikërisht këtu: totalet përkonin, dhe defekti u pa vetëm sepse u krahasua çdo rresht.</w:t>
+        <w:t>Hapi 7, motori mbi korpusin, u riekzekutua më vonë dhe dha të njëjtat totale: po aq vende, po aq rishkrime, po aq refuzime, e njëjta ndarje sipas transformimit dhe sipas arsyes. Krahasimi rresht për rresht nxori megjithatë 21 verdikte kompilimi të ndryshuara, dhe ato çuan te një defekt i vërtetë: një javac që dështon pa emërtuar gabim mbi burimin lexohej si kompilim i pastër, pra 19 rishkrime ishin regjistruar si «kompilon» mbi skedarë që nuk kompilojnë. Pas ndreqjes, kjo shtojcë dhe Kapitulli 5 raportojnë matjen e re. Vlera e riprodhimit qëndron pikërisht këtu: totalet përkonin, dhe defekti u pa vetëm sepse u krahasua çdo rresht.</w:t>
       </w:r>
     </w:p>
     <w:p>
@@ -29543,7 +29703,7 @@
           <w:caps w:val="0"/>
           <w:sz w:val="24"/>
         </w:rPr>
-        <w:t>Kjo llogari bën një parashikim që një matje tjetër e provon në mënyrë të pavarur. Te Blob-i mospërputhjet janë larg pragjeve (mediana mesatare 0.42), ndaj kalibrimi nuk duhet të ndihmojë shumë; te Feature Envy janë afër (0.78), ndaj duhet. Kalibrimi jashtë-fold-it i Nënkapitullit 5.5, i matur veç dhe pa e parë këtë analizë, jep +0.021 MCC për të parin dhe +0.140 për të dytin. Dy erëra nuk provojnë një rregull, por drejtimi është ai që llogaria e klauzolave e priste, dhe kjo e bën atë shpjegim me vlerë parashikuese e jo përshkrim të mëpasshëm.</w:t>
+        <w:t>Kjo llogari bën një parashikim që një matje tjetër e provon në mënyrë të pavarur. Te Blob-i mospërputhjet janë larg pragjeve (mediana mesatare 0.42), ndaj kalibrimi nuk duhet të ndihmojë shumë; te Feature Envy janë afër (0.78), ndaj duhet. Kalibrimi jashtë fold-it i Nënkapitullit 5.5, i matur veç dhe pa e parë këtë analizë, jep +0.021 MCC për të parin dhe +0.140 për të dytin. Dy erëra nuk provojnë një rregull, por drejtimi është ai që llogaria e klauzolave e priste, dhe kjo e bën atë shpjegim me vlerë parashikuese e jo përshkrim të mëpasshëm.</w:t>
       </w:r>
     </w:p>
     <w:p>
@@ -31995,7 +32155,7 @@
           <w:caps w:val="0"/>
           <w:sz w:val="24"/>
         </w:rPr>
-        <w:t>Te strategjia e botuar recall-i ngjitet nga 0.007 te rastet që vetëm një rishikues i quajti të lehta, në 0.159 te ato që dikush i quajti kritike, pra rreth 23 herë më i lartë. Mospërputhja nuk është e rastësishme: strategjia nuk pajton me rishikuesit pikërisht atje ku rishikuesit vetë ishin më pak të bindur.</w:t>
+        <w:t>Te strategjia e botuar recall-i ngjitet nga 0.007 te rastet që vetëm një rishikues i quajti të lehta, në 0.159 te ato që dikush i quajti kritike, pra rreth 23 herë më i lartë. Mospërputhja nuk është e rastësishme: strategjia nuk pajtohet me rishikuesit pikërisht atje ku rishikuesit vetë ishin më pak të bindur.</w:t>
       </w:r>
     </w:p>
     <w:p>

</xml_diff>

<commit_message>
Ndreq kapitujt 1-4 sipas komenteve te mentores
Kontributi dhe transformimi i sigurt te Hyrja, dallimi nga studimet te
Hendeku, PK3 sipas asaj qe matet, shkronja e titujve dhe versioni me
kapitujt 1-4 per mentoren (VD-141).
</commit_message>
<xml_diff>
--- a/docs/thesis/Punim_Diplome_Florent_Latifi.docx
+++ b/docs/thesis/Punim_Diplome_Florent_Latifi.docx
@@ -2277,7 +2277,39 @@
           <w:caps w:val="0"/>
           <w:sz w:val="24"/>
         </w:rPr>
-        <w:t>Ky punim merret me hapësirën mes gjetjes së problemit dhe ndreqjes së tij, për gjuhën Java. Erërat detektohen në dy mënyra, me strategji metrikash dhe me një klasifikues të trajnuar mbi të njëjtat metrika, dhe të dyja vlerësohen mbi të njëjtin dataset të etiketuar nga zhvillues profesionistë. Një motor i veçantë e rishkruan kodin vetëm kur mund ta provojë se transformimi është i sigurt. Kapitulli 2 shqyrton literaturën, Kapitulli 3 shtron problemin dhe pyetjet kërkimore, Kapitulli 4 përshkruan metodologjinë, ndërsa Kapitujt 5 dhe 6 paraqesin dhe diskutojnë rezultatet.</w:t>
+        <w:t>Ky punim merret me hapësirën mes gjetjes së problemit dhe ndreqjes së tij, për gjuhën Java. Kontributi i tij kryesor është një zinxhir i vetëm që i lidh tri hapa që literatura zakonisht i trajton veç e veç: detektimin e erës, rishkrimin e kodit dhe verifikimin e rishkrimit. Konkretisht, punimi sjell tri gjëra. E para, një krahasim të drejtpërdrejtë të dy qasjeve të detektimit, strategjive me metrika dhe një klasifikuesi të trajnuar mbi të njëjtat metrika, mbi të njëjtin dataset publik të etiketuar nga zhvillues profesionistë, me të njëjtën ndarje të të dhënave dhe me të njëjtën mënyrë pikëzimi. E dyta, një motor refaktorimi që nuk ndalet te njoftimi: e rishkruan kodin kur transformimi është i sigurt, dhe kur nuk është, e refuzon dhe e shënon arsyen. E treta, matjen e asaj që ndodh pas rishkrimit, pra nëse kodi kompilon ende dhe nëse era u hoq vërtet. I gjithë eksperimenti riprodhohet me komanda të dokumentuara.</w:t>
+      </w:r>
+    </w:p>
+    <w:p>
+      <w:pPr>
+        <w:spacing w:line="360" w:lineRule="auto"/>
+        <w:ind w:firstLine="360"/>
+        <w:jc w:val="both"/>
+      </w:pPr>
+      <w:r>
+        <w:rPr>
+          <w:rFonts w:ascii="Times New Roman" w:hAnsi="Times New Roman" w:eastAsia="Times New Roman"/>
+          <w:b w:val="0"/>
+          <w:caps w:val="0"/>
+          <w:sz w:val="24"/>
+        </w:rPr>
+        <w:t>Një transformim quhet këtu i sigurt kur plotëson dy kushte. Para aplikimit duhet të provohen parakushtet e tij, në kuptimin e Opdyke (1992): për shembull, Extract Method refuzohet kur nga blloku që do të nxirret del një return, break ose continue, sepse metoda e re do ta ndryshonte rrjedhën e programit. Ky kontroll bëhet mbi pemën sintaksore të kodit, jo mbi tekstin e tij. Pas aplikimit, rishkrimi kontrollohet në tri mënyra: skedari duhet të parsohet sërish, kompilatori javac nuk duhet të japë asnjë lloj të ri gabimi krahasuar me versionin para rishkrimit, dhe klasa matet sërish me të njëjtët detektorë për të parë nëse era u hoq. Siguria në këtë punim do të thotë pra se kodi mbetet i vlefshëm dhe se era hiqet. Që programi sillet njësoj edhe kur ekzekutohet është garanci më e fortë, të cilën ky punim nuk e jep (Nënkapitulli 3.4).</w:t>
+      </w:r>
+    </w:p>
+    <w:p>
+      <w:pPr>
+        <w:spacing w:line="360" w:lineRule="auto"/>
+        <w:ind w:firstLine="360"/>
+        <w:jc w:val="both"/>
+      </w:pPr>
+      <w:r>
+        <w:rPr>
+          <w:rFonts w:ascii="Times New Roman" w:hAnsi="Times New Roman" w:eastAsia="Times New Roman"/>
+          <w:b w:val="0"/>
+          <w:caps w:val="0"/>
+          <w:sz w:val="24"/>
+        </w:rPr>
+        <w:t>Kapitulli 2 shqyrton literaturën, Kapitulli 3 shtron problemin dhe pyetjet kërkimore, Kapitulli 4 përshkruan metodologjinë, ndërsa Kapitujt 5 dhe 6 paraqesin dhe diskutojnë rezultatet.</w:t>
       </w:r>
     </w:p>
     <w:p>
@@ -2854,7 +2886,23 @@
           <w:caps w:val="0"/>
           <w:sz w:val="24"/>
         </w:rPr>
-        <w:t>Nga ky shqyrtim dalin tri vërejtje. Qasja me rregulla dhe ajo me mësim makine rrallë vlerësohen mbi të njëjtën të vërtetë bazë dhe me të njëjtat metrika, ndaj krahasimi i drejtpërdrejtë mungon. Jo çdo punim e thotë qartë si e ndan bashkësinë e vlerësimit, edhe pse shifra e raportuar varet pikërisht prej saj. Detektimi dhe refaktorimi, nga ana tjetër, trajtohen zakonisht veç e veç, ndaj mbetet pa përgjigje empirike nëse një erë e gjetur mund të ndreqet edhe automatikisht, dhe nëse ndreqja e heq vërtet. Kapitulli 3 i kthen këto vërejtje në problemin dhe pyetjet e punimit.</w:t>
+        <w:t>Nga ky shqyrtim dalin tri vërejtje. Qasja me rregulla dhe ajo me mësim makine rrallë vlerësohen mbi të njëjtën të vërtetë bazë dhe me të njëjtat metrika, ndaj krahasimi i drejtpërdrejtë mungon. Jo çdo punim e thotë qartë si e ndan bashkësinë e vlerësimit, edhe pse shifra e raportuar varet pikërisht prej saj. Detektimi dhe refaktorimi, nga ana tjetër, trajtohen zakonisht veç e veç, ndaj mbetet pa përgjigje empirike nëse një erë e gjetur mund të ndreqet edhe automatikisht, dhe nëse ndreqja e heq vërtet.</w:t>
+      </w:r>
+    </w:p>
+    <w:p>
+      <w:pPr>
+        <w:spacing w:line="360" w:lineRule="auto"/>
+        <w:ind w:firstLine="360"/>
+        <w:jc w:val="both"/>
+      </w:pPr>
+      <w:r>
+        <w:rPr>
+          <w:rFonts w:ascii="Times New Roman" w:hAnsi="Times New Roman" w:eastAsia="Times New Roman"/>
+          <w:b w:val="0"/>
+          <w:caps w:val="0"/>
+          <w:sz w:val="24"/>
+        </w:rPr>
+        <w:t>Ky punim u përgjigjet të treve, dhe pikërisht kjo e dallon nga studimet e përmendura. Ndryshe nga Lanza &amp; Marinescu (2006), pragjet e strategjive nuk merren si të sakta, por maten kundrejt gjykimit të zhvilluesve profesionistë të MLCQ-së. Ndryshe nga Arcelli Fontana et al. (2016), rregullat dhe modelet vlerësohen mbi të njëjtat mostra, me të njëjtin kod pikëzimi, dhe ndarja e të dhënave bëhet sipas depos, ndaj shifra nuk fryhet nga mostra të të njëjtit projekt në trajnim dhe në testim. Ndryshe nga Madeyski &amp; Lewowski (2023), që përdorën metrikat e mjeteve të përgjithshme të analizës statike, modeli trajnohet mbi metrikat që lexojnë vetë strategjitë, dhe një ablacion me vetëm ato metrika tregon sa nga dallimi vjen nga kufiri i mësuar. Ndryshe nga Tsantalis &amp; Chatzigeorgiou (2009), që propozojnë një transformim dhe vendimin ia lënë projektuesit, këtu transformimi aplikohet, verifikohet me kompilator dhe matet nëse e hoqi erën, sepse Bavota et al. (2015) treguan se refaktorimi rrallë e heq erën vetvetiu. Kapitulli 3 i kthen këto vërejtje në problemin dhe pyetjet e punimit.</w:t>
       </w:r>
     </w:p>
     <w:p>
@@ -3022,7 +3070,7 @@
           <w:caps w:val="0"/>
           <w:sz w:val="24"/>
         </w:rPr>
-        <w:t>PK3: A i përmirësojnë objektivisht refaktorimet e propozuara karakteristikat strukturore të kodit, duke ruajtur kompilueshmërinë dhe sjelljen e tij?</w:t>
+        <w:t>PK3: A mund të aplikohen automatikisht refaktorimet e propozuara pa shtuar gabime të reja kompilimi, dhe a e heqin ato erën që i shkaktoi, sipas rimatjes me të njëjtat metrika?</w:t>
       </w:r>
     </w:p>
     <w:p>
@@ -3258,7 +3306,7 @@
           <w:caps w:val="0"/>
           <w:sz w:val="24"/>
         </w:rPr>
-        <w:t>Për PK3: çdo rishkrim i aplikuar verifikohet se nuk e prish skedarin, dhe matet nëse era u hoq. Për ruajtjen e sjelljes nuk ka kriter, për arsyen që jepet te Nënkapitulli 3.4.</w:t>
+        <w:t>Për PK3: çdo rishkrim i aplikuar verifikohet se nuk e prish skedarin, dhe matet nëse era u hoq.</w:t>
       </w:r>
     </w:p>
     <w:p>
@@ -3320,7 +3368,7 @@
           <w:caps w:val="0"/>
           <w:sz w:val="24"/>
         </w:rPr>
-        <w:t xml:space="preserve">Korpusi mban nga depot e MLCQ-së vetëm skedarët «.java», pa skedarë ndërtimi dhe pa varësi, dhe disa depo nuk gjenden më. Prandaj çdo rishkrim kontrollohet vetëm me kompilator: nëse kompilon, ose të paktën nëse nuk shton lloj të ri gabimi. Ruajtja e sjelljes, që përmend PK3, </w:t>
+        <w:t xml:space="preserve">Korpusi mban nga depot e MLCQ-së vetëm skedarët «.java», pa skedarë ndërtimi dhe pa varësi, dhe disa depo nuk gjenden më. Prandaj çdo rishkrim kontrollohet vetëm me kompilator: nëse kompilon, ose të paktën nëse nuk shton lloj të ri gabimi. Ruajtja e sjelljes, prandaj, nuk është pjesë e PK3 dhe </w:t>
       </w:r>
       <w:r>
         <w:rPr>
@@ -21159,7 +21207,7 @@
           <w:caps w:val="0"/>
           <w:sz w:val="24"/>
         </w:rPr>
-        <w:t xml:space="preserve"> Pjesërisht. Motori transformoi 22.4% të vendeve të detektuara; nga rishkrimet, 98.3% kompiluan ose nuk shtuan lloj të ri gabimi, dhe 1.6% shtuan. Era u hoq te 64.8% e tyre, dhe metrika që e shkakton detektimin ra edhe aty ku era mbeti: struktura përmirësohet objektivisht në shumicën e rasteve, me koston e 865 erërave të reja. Kur skedari kompilohet brenda projektit të vet, pjesa që kompilon plotësisht rritet ndjeshëm, ndërsa dy rishkrime nga 201 e përmbysin verdiktin në drejtimin e kundërt dhe e kufizojnë pretendimin. Ruajtja e sjelljes </w:t>
+        <w:t xml:space="preserve"> Pjesërisht. Motori transformoi 22.4% të vendeve të detektuara; nga rishkrimet, 98.3% kompiluan ose nuk shtuan lloj të ri gabimi, dhe 1.6% shtuan. Era u hoq te 64.8% e tyre, dhe metrika që e shkakton detektimin ra edhe aty ku era mbeti: struktura përmirësohet objektivisht në shumicën e rasteve, me koston e 865 erërave të reja. Kur skedari kompilohet brenda projektit të vet, pjesa që kompilon plotësisht rritet ndjeshëm, ndërsa dy rishkrime nga 201 e përmbysin verdiktin në drejtimin e kundërt dhe e kufizojnë pretendimin. Ruajtja e sjelljes nuk është pjesë e PK3 dhe </w:t>
       </w:r>
       <w:r>
         <w:rPr>
@@ -21177,7 +21225,7 @@
           <w:caps w:val="0"/>
           <w:sz w:val="24"/>
         </w:rPr>
-        <w:t xml:space="preserve"> (Nënkapitulli 3.4). Përgjigjja është pra po për strukturën dhe kompilueshmërinë, me kosto të matur, dhe e hapur për sjelljen.</w:t>
+        <w:t xml:space="preserve"> (Nënkapitulli 3.4). Përgjigjja është pra po për kompilueshmërinë dhe për strukturën, me kosto të matur, ndërsa sjellja mbetet pyetje e hapur.</w:t>
       </w:r>
     </w:p>
     <w:p>
@@ -33702,7 +33750,7 @@
       <w:outlineLvl w:val="0"/>
     </w:pPr>
     <w:rPr>
-      <w:rFonts w:asciiTheme="majorHAnsi" w:eastAsiaTheme="majorEastAsia" w:hAnsiTheme="majorHAnsi" w:cstheme="majorBidi" w:ascii="Times New Roman" w:hAnsi="Times New Roman" w:eastAsia="Times New Roman"/>
+      <w:rFonts w:ascii="Times New Roman" w:hAnsi="Times New Roman" w:eastAsia="Times New Roman"/>
       <w:b/>
       <w:bCs/>
       <w:caps/>
@@ -33727,7 +33775,7 @@
       <w:outlineLvl w:val="1"/>
     </w:pPr>
     <w:rPr>
-      <w:rFonts w:asciiTheme="majorHAnsi" w:eastAsiaTheme="majorEastAsia" w:hAnsiTheme="majorHAnsi" w:cstheme="majorBidi" w:ascii="Times New Roman" w:hAnsi="Times New Roman" w:eastAsia="Times New Roman"/>
+      <w:rFonts w:ascii="Times New Roman" w:hAnsi="Times New Roman" w:eastAsia="Times New Roman"/>
       <w:b/>
       <w:bCs/>
       <w:caps w:val="0"/>

</xml_diff>

<commit_message>
Rilexo shtesat e kapitujve 1-4 dhe ndreq gjuhen
</commit_message>
<xml_diff>
--- a/docs/thesis/Punim_Diplome_Florent_Latifi.docx
+++ b/docs/thesis/Punim_Diplome_Florent_Latifi.docx
@@ -2277,7 +2277,7 @@
           <w:caps w:val="0"/>
           <w:sz w:val="24"/>
         </w:rPr>
-        <w:t>Ky punim merret me hapësirën mes gjetjes së problemit dhe ndreqjes së tij, për gjuhën Java. Kontributi i tij kryesor është një zinxhir i vetëm që i lidh tri hapa që literatura zakonisht i trajton veç e veç: detektimin e erës, rishkrimin e kodit dhe verifikimin e rishkrimit. Konkretisht, punimi sjell tri gjëra. E para, një krahasim të drejtpërdrejtë të dy qasjeve të detektimit, strategjive me metrika dhe një klasifikuesi të trajnuar mbi të njëjtat metrika, mbi të njëjtin dataset publik të etiketuar nga zhvillues profesionistë, me të njëjtën ndarje të të dhënave dhe me të njëjtën mënyrë pikëzimi. E dyta, një motor refaktorimi që nuk ndalet te njoftimi: e rishkruan kodin kur transformimi është i sigurt, dhe kur nuk është, e refuzon dhe e shënon arsyen. E treta, matjen e asaj që ndodh pas rishkrimit, pra nëse kodi kompilon ende dhe nëse era u hoq vërtet. I gjithë eksperimenti riprodhohet me komanda të dokumentuara.</w:t>
+        <w:t>Ky punim merret me hapësirën mes gjetjes së problemit dhe ndreqjes së tij, për gjuhën Java. Kontributi i tij kryesor është një zinxhir i vetëm që i lidh tre hapa që literatura zakonisht i trajton veç e veç: detektimin e erës, rishkrimin e kodit dhe verifikimin e rishkrimit. Konkretisht, punimi sjell tri gjëra. E para, një krahasim të drejtpërdrejtë të dy qasjeve të detektimit, strategjive me metrika dhe një klasifikuesi të trajnuar mbi të njëjtat metrika, mbi të njëjtin dataset publik të etiketuar nga zhvillues profesionistë, me të njëjtën ndarje të të dhënave dhe me të njëjtën mënyrë pikëzimi. E dyta, një motor refaktorimi që nuk ndalet te njoftimi: e rishkruan kodin kur transformimi është i sigurt, dhe kur nuk është, e refuzon dhe e shënon arsyen. E treta, matjen e asaj që ndodh pas rishkrimit, pra nëse kodi kompilon ende dhe nëse era u hoq vërtet. I gjithë eksperimenti riprodhohet me komanda të dokumentuara.</w:t>
       </w:r>
     </w:p>
     <w:p>
@@ -2293,7 +2293,7 @@
           <w:caps w:val="0"/>
           <w:sz w:val="24"/>
         </w:rPr>
-        <w:t>Një transformim quhet këtu i sigurt kur plotëson dy kushte. Para aplikimit duhet të provohen parakushtet e tij, në kuptimin e Opdyke (1992): për shembull, Extract Method refuzohet kur nga blloku që do të nxirret del një return, break ose continue, sepse metoda e re do ta ndryshonte rrjedhën e programit. Ky kontroll bëhet mbi pemën sintaksore të kodit, jo mbi tekstin e tij. Pas aplikimit, rishkrimi kontrollohet në tri mënyra: skedari duhet të parsohet sërish, kompilatori javac nuk duhet të japë asnjë lloj të ri gabimi krahasuar me versionin para rishkrimit, dhe klasa matet sërish me të njëjtët detektorë për të parë nëse era u hoq. Siguria në këtë punim do të thotë pra se kodi mbetet i vlefshëm dhe se era hiqet. Që programi sillet njësoj edhe kur ekzekutohet është garanci më e fortë, të cilën ky punim nuk e jep (Nënkapitulli 3.4).</w:t>
+        <w:t>Një transformim quhet këtu i sigurt kur plotëson dy kushte. Para aplikimit duhet të provohen parakushtet e tij, në kuptimin e Opdyke (1992): për shembull, Extract Method refuzohet kur nga blloku që do të nxirret del një return, break ose continue, sepse metoda e re do ta ndryshonte rrjedhën e programit. Ky kontroll bëhet mbi pemën sintaksore të kodit, jo mbi tekstin e tij. Pas aplikimit, rishkrimi kontrollohet në tri mënyra: skedari duhet të parsohet sërish, kompilatori javac nuk duhet të japë asnjë lloj të ri gabimi krahasuar me versionin para rishkrimit, dhe klasa matet sërish me të njëjtët detektorë për të parë nëse era u hoq. Siguria në këtë punim do të thotë pra se kodi mbetet i vlefshëm dhe se era hiqet. Që programi të sillet njësoj edhe kur ekzekutohet do të ishte garanci më e fortë, por ky punim nuk e jep (Nënkapitulli 3.4).</w:t>
       </w:r>
     </w:p>
     <w:p>
@@ -2902,7 +2902,7 @@
           <w:caps w:val="0"/>
           <w:sz w:val="24"/>
         </w:rPr>
-        <w:t>Ky punim u përgjigjet të treve, dhe pikërisht kjo e dallon nga studimet e përmendura. Ndryshe nga Lanza &amp; Marinescu (2006), pragjet e strategjive nuk merren si të sakta, por maten kundrejt gjykimit të zhvilluesve profesionistë të MLCQ-së. Ndryshe nga Arcelli Fontana et al. (2016), rregullat dhe modelet vlerësohen mbi të njëjtat mostra, me të njëjtin kod pikëzimi, dhe ndarja e të dhënave bëhet sipas depos, ndaj shifra nuk fryhet nga mostra të të njëjtit projekt në trajnim dhe në testim. Ndryshe nga Madeyski &amp; Lewowski (2023), që përdorën metrikat e mjeteve të përgjithshme të analizës statike, modeli trajnohet mbi metrikat që lexojnë vetë strategjitë, dhe një ablacion me vetëm ato metrika tregon sa nga dallimi vjen nga kufiri i mësuar. Ndryshe nga Tsantalis &amp; Chatzigeorgiou (2009), që propozojnë një transformim dhe vendimin ia lënë projektuesit, këtu transformimi aplikohet, verifikohet me kompilator dhe matet nëse e hoqi erën, sepse Bavota et al. (2015) treguan se refaktorimi rrallë e heq erën vetvetiu. Kapitulli 3 i kthen këto vërejtje në problemin dhe pyetjet e punimit.</w:t>
+        <w:t>Ky punim u përgjigjet të triave, dhe pikërisht kjo e dallon nga studimet e përmendura. Ndryshe nga Lanza &amp; Marinescu (2006), pragjet e strategjive nuk merren si të sakta, por maten kundrejt gjykimit të zhvilluesve profesionistë të MLCQ-së. Ndryshe nga Arcelli Fontana et al. (2016), rregullat dhe modelet vlerësohen mbi të njëjtat mostra, me të njëjtin kod pikëzimi, dhe ndarja e të dhënave bëhet sipas depos, ndaj shifra nuk fryhet nga mostra të të njëjtit projekt në trajnim dhe në testim. Ndryshe nga Madeyski &amp; Lewowski (2023), që përdorën metrikat e mjeteve të përgjithshme të analizës statike, modeli trajnohet mbi metrikat e vetë sistemit, përfshirë ato që lexojnë strategjitë, dhe një ablacion me vetëm metrikat e strategjisë tregon sa nga dallimi vjen nga kufiri i mësuar. Ndryshe nga Tsantalis &amp; Chatzigeorgiou (2009), që propozojnë një transformim dhe vendimin ia lënë projektuesit, këtu transformimi aplikohet, verifikohet me kompilator dhe matet nëse e hoqi erën, sepse Bavota et al. (2015) treguan se refaktorimi rrallë e heq erën vetvetiu. Kapitulli 3 i kthen këto vërejtje në problemin dhe pyetjet e punimit.</w:t>
       </w:r>
     </w:p>
     <w:p>
@@ -3070,7 +3070,7 @@
           <w:caps w:val="0"/>
           <w:sz w:val="24"/>
         </w:rPr>
-        <w:t>PK3: A mund të aplikohen automatikisht refaktorimet e propozuara pa shtuar gabime të reja kompilimi, dhe a e heqin ato erën që i shkaktoi, sipas rimatjes me të njëjtat metrika?</w:t>
+        <w:t>PK3: A mund të aplikohen automatikisht refaktorimet e propozuara pa shtuar gabime të reja kompilimi, dhe a e heqin ato erën për të cilën u propozuan, sipas rimatjes me të njëjtat metrika?</w:t>
       </w:r>
     </w:p>
     <w:p>

</xml_diff>

<commit_message>
Korrigjo punimin, ndreq komentet e mentores dhe paketo mjetin në Docker (#3)
Korrektura gjuhësore e punimit (VD-140); komentet e mentores te kapitujt 1–3 dhe versioni me kapitujt 1–4 (VD-141); imazhi Docker me publikim te ghcr.io (VD-142); pritja e kontrastit te testi e2e.
</commit_message>
<xml_diff>
--- a/docs/thesis/Punim_Diplome_Florent_Latifi.docx
+++ b/docs/thesis/Punim_Diplome_Florent_Latifi.docx
@@ -54,7 +54,7 @@
           <w:caps w:val="0"/>
           <w:sz w:val="28"/>
         </w:rPr>
-        <w:t>Programi për Shkenca Kompjuterike dhe Inxhinieri</w:t>
+        <w:t>Programi për Shkenca Kompjuterike dhe Inxhinierisë</w:t>
       </w:r>
     </w:p>
     <w:p>
@@ -309,7 +309,7 @@
           <w:caps w:val="0"/>
           <w:sz w:val="28"/>
         </w:rPr>
-        <w:t>Programi për Shkenca Kompjuterike dhe Inxhinieri</w:t>
+        <w:t>Programi për Shkenca Kompjuterike dhe Inxhinierisë</w:t>
       </w:r>
     </w:p>
     <w:p>
@@ -1530,7 +1530,7 @@
           <w:caps w:val="0"/>
           <w:sz w:val="24"/>
         </w:rPr>
-        <w:t>CBO – Coupling Between Objects, lidhshmëria mes objekteve</w:t>
+        <w:t>Bootstrap – rimostrim me kthim për të vlerësuar pasigurinë e një treguesi</w:t>
       </w:r>
     </w:p>
     <w:p>
@@ -1546,7 +1546,7 @@
           <w:caps w:val="0"/>
           <w:sz w:val="24"/>
         </w:rPr>
-        <w:t>CC – Cyclomatic Complexity, kompleksiteti ciklomatik</w:t>
+        <w:t>CBO – Coupling Between Objects, lidhshmëria mes objekteve</w:t>
       </w:r>
     </w:p>
     <w:p>
@@ -1562,7 +1562,7 @@
           <w:caps w:val="0"/>
           <w:sz w:val="24"/>
         </w:rPr>
-        <w:t>CINT – Coupling Intensity, intensiteti i lidhshmërisë së një metode</w:t>
+        <w:t>CC – Cyclomatic Complexity, kompleksiteti ciklomatik</w:t>
       </w:r>
     </w:p>
     <w:p>
@@ -1578,7 +1578,7 @@
           <w:caps w:val="0"/>
           <w:sz w:val="24"/>
         </w:rPr>
-        <w:t>CK – Chidamber &amp; Kemerer, suita e metrikave të objekteve</w:t>
+        <w:t>CINT – Coupling Intensity, intensiteti i lidhshmërisë së një metode</w:t>
       </w:r>
     </w:p>
     <w:p>
@@ -1594,7 +1594,7 @@
           <w:caps w:val="0"/>
           <w:sz w:val="24"/>
         </w:rPr>
-        <w:t>CLOC – Class Lines of Code, rreshtat efektivë të një klase</w:t>
+        <w:t>CK – Chidamber &amp; Kemerer, suita e metrikave të objekteve</w:t>
       </w:r>
     </w:p>
     <w:p>
@@ -1610,7 +1610,7 @@
           <w:caps w:val="0"/>
           <w:sz w:val="24"/>
         </w:rPr>
-        <w:t>DECOR – metoda e specifikimit dhe e detektimit të code smells nga Moha et al.</w:t>
+        <w:t>CLOC – Class Lines of Code, rreshtat efektivë të një klase</w:t>
       </w:r>
     </w:p>
     <w:p>
@@ -1626,7 +1626,7 @@
           <w:caps w:val="0"/>
           <w:sz w:val="24"/>
         </w:rPr>
-        <w:t>DIT – Depth of Inheritance Tree, thellësia e pemës së trashëgimisë</w:t>
+        <w:t>Commit – një gjendje e ruajtur e kodit në historikun e git-it</w:t>
       </w:r>
     </w:p>
     <w:p>
@@ -1642,7 +1642,7 @@
           <w:caps w:val="0"/>
           <w:sz w:val="24"/>
         </w:rPr>
-        <w:t>F1 – mesatarja harmonike e precizionit dhe recall-it</w:t>
+        <w:t>Dataset – bashkësi të dhënash e etiketuar</w:t>
       </w:r>
     </w:p>
     <w:p>
@@ -1658,7 +1658,7 @@
           <w:caps w:val="0"/>
           <w:sz w:val="24"/>
         </w:rPr>
-        <w:t>FDP – Foreign Data Providers, numri i klasave që ofrojnë të dhëna të huaja</w:t>
+        <w:t>DECOR – metoda e specifikimit dhe e detektimit të code smells nga Moha et al.</w:t>
       </w:r>
     </w:p>
     <w:p>
@@ -1674,7 +1674,7 @@
           <w:caps w:val="0"/>
           <w:sz w:val="24"/>
         </w:rPr>
-        <w:t>GroupKFold – ndarje me grupe, ku çdo depo bie e tëra në një fold</w:t>
+        <w:t>Diff / patch – dallimi mes kodit para dhe pas një rishkrimi</w:t>
       </w:r>
     </w:p>
     <w:p>
@@ -1690,7 +1690,7 @@
           <w:caps w:val="0"/>
           <w:sz w:val="24"/>
         </w:rPr>
-        <w:t>LAA – Locality of Attribute Accesses, lokaliteti i qasjeve në atribute</w:t>
+        <w:t>DIT – Depth of Inheritance Tree, thellësia e pemës së trashëgimisë</w:t>
       </w:r>
     </w:p>
     <w:p>
@@ -1706,7 +1706,7 @@
           <w:caps w:val="0"/>
           <w:sz w:val="24"/>
         </w:rPr>
-        <w:t>LCOM – Lack of Cohesion in Methods, mungesa e kohezionit në metoda</w:t>
+        <w:t>F1 – mesatarja harmonike e precizionit dhe recall-it</w:t>
       </w:r>
     </w:p>
     <w:p>
@@ -1722,7 +1722,7 @@
           <w:caps w:val="0"/>
           <w:sz w:val="24"/>
         </w:rPr>
-        <w:t>LOC – Lines of Code, rreshtat e kodit</w:t>
+        <w:t>FDP – Foreign Data Providers, numri i klasave që ofrojnë të dhëna të huaja</w:t>
       </w:r>
     </w:p>
     <w:p>
@@ -1738,7 +1738,7 @@
           <w:caps w:val="0"/>
           <w:sz w:val="24"/>
         </w:rPr>
-        <w:t>MAXCC – kompleksiteti maksimal ciklomatik në një klasë</w:t>
+        <w:t>Fold – njëra nga pjesët në të cilat ndahet bashkësia për validim të kryqëzuar</w:t>
       </w:r>
     </w:p>
     <w:p>
@@ -1754,7 +1754,7 @@
           <w:caps w:val="0"/>
           <w:sz w:val="24"/>
         </w:rPr>
-        <w:t>MAXNESTING – thellësia maksimale e ndërfutjes së blloqeve</w:t>
+        <w:t>GroupKFold – ndarje me grupe, ku çdo depo bie e tëra në një fold</w:t>
       </w:r>
     </w:p>
     <w:p>
@@ -1770,7 +1770,7 @@
           <w:caps w:val="0"/>
           <w:sz w:val="24"/>
         </w:rPr>
-        <w:t>MCC – Matthews Correlation Coefficient, koeficienti i korrelacionit i Matthews-it</w:t>
+        <w:t>IB – interval besimi</w:t>
       </w:r>
     </w:p>
     <w:p>
@@ -1786,7 +1786,7 @@
           <w:caps w:val="0"/>
           <w:sz w:val="24"/>
         </w:rPr>
-        <w:t>MLCQ – Machine Learning Code Quality, dataset i etiketuar i code smells</w:t>
+        <w:t>JDK – Java Development Kit, që përmban kompilatorin javac</w:t>
       </w:r>
     </w:p>
     <w:p>
@@ -1802,7 +1802,7 @@
           <w:caps w:val="0"/>
           <w:sz w:val="24"/>
         </w:rPr>
-        <w:t>MLOC – Method Lines of Code, rreshtat efektivë të një metode</w:t>
+        <w:t>LAA – Locality of Attribute Accesses, lokaliteti i qasjeve në atribute</w:t>
       </w:r>
     </w:p>
     <w:p>
@@ -1818,7 +1818,7 @@
           <w:caps w:val="0"/>
           <w:sz w:val="24"/>
         </w:rPr>
-        <w:t>NOAM – Number of Accessor Methods, numri i akses-metodave</w:t>
+        <w:t>LCOM – Lack of Cohesion in Methods, mungesa e kohezionit në metoda</w:t>
       </w:r>
     </w:p>
     <w:p>
@@ -1834,7 +1834,7 @@
           <w:caps w:val="0"/>
           <w:sz w:val="24"/>
         </w:rPr>
-        <w:t>NOAV – Number of Accessed Variables, numri i variablave të prekura</w:t>
+        <w:t>LOC – Lines of Code, rreshtat e kodit</w:t>
       </w:r>
     </w:p>
     <w:p>
@@ -1850,7 +1850,7 @@
           <w:caps w:val="0"/>
           <w:sz w:val="24"/>
         </w:rPr>
-        <w:t>NOC – Number of Children, numri i nënklasave të drejtpërdrejta</w:t>
+        <w:t>MAXCC – kompleksiteti maksimal ciklomatik në një klasë</w:t>
       </w:r>
     </w:p>
     <w:p>
@@ -1866,7 +1866,7 @@
           <w:caps w:val="0"/>
           <w:sz w:val="24"/>
         </w:rPr>
-        <w:t>NOF – Number of Fields, numri i fushave</w:t>
+        <w:t>MAXNESTING – thellësia maksimale e ndërfutjes së blloqeve</w:t>
       </w:r>
     </w:p>
     <w:p>
@@ -1882,7 +1882,7 @@
           <w:caps w:val="0"/>
           <w:sz w:val="24"/>
         </w:rPr>
-        <w:t>NOM – Number of Methods, numri i metodave</w:t>
+        <w:t>MCC – Matthews Correlation Coefficient, koeficienti i korrelacionit i Matthews-it</w:t>
       </w:r>
     </w:p>
     <w:p>
@@ -1898,7 +1898,7 @@
           <w:caps w:val="0"/>
           <w:sz w:val="24"/>
         </w:rPr>
-        <w:t>NOPA – Number of Public Attributes, numri i atributeve publike</w:t>
+        <w:t>MLCQ – Machine Learning Code Quality, dataset i etiketuar i code smells</w:t>
       </w:r>
     </w:p>
     <w:p>
@@ -1914,7 +1914,7 @@
           <w:caps w:val="0"/>
           <w:sz w:val="24"/>
         </w:rPr>
-        <w:t>NP – Number of Parameters, numri i parametrave</w:t>
+        <w:t>MLOC – Method Lines of Code, rreshtat efektivë të një metode</w:t>
       </w:r>
     </w:p>
     <w:p>
@@ -1930,7 +1930,167 @@
           <w:caps w:val="0"/>
           <w:sz w:val="24"/>
         </w:rPr>
+        <w:t>NOAM – Number of Accessor Methods, numri i akses-metodave</w:t>
+      </w:r>
+    </w:p>
+    <w:p>
+      <w:pPr>
+        <w:pStyle w:val="ListBullet"/>
+        <w:spacing w:line="360" w:lineRule="auto"/>
+        <w:jc w:val="both"/>
+      </w:pPr>
+      <w:r>
+        <w:rPr>
+          <w:rFonts w:ascii="Times New Roman" w:hAnsi="Times New Roman" w:eastAsia="Times New Roman"/>
+          <w:b w:val="0"/>
+          <w:caps w:val="0"/>
+          <w:sz w:val="24"/>
+        </w:rPr>
+        <w:t>NOAV – Number of Accessed Variables, numri i variablave të prekura</w:t>
+      </w:r>
+    </w:p>
+    <w:p>
+      <w:pPr>
+        <w:pStyle w:val="ListBullet"/>
+        <w:spacing w:line="360" w:lineRule="auto"/>
+        <w:jc w:val="both"/>
+      </w:pPr>
+      <w:r>
+        <w:rPr>
+          <w:rFonts w:ascii="Times New Roman" w:hAnsi="Times New Roman" w:eastAsia="Times New Roman"/>
+          <w:b w:val="0"/>
+          <w:caps w:val="0"/>
+          <w:sz w:val="24"/>
+        </w:rPr>
+        <w:t>NOC – Number of Children, numri i nënklasave të drejtpërdrejta</w:t>
+      </w:r>
+    </w:p>
+    <w:p>
+      <w:pPr>
+        <w:pStyle w:val="ListBullet"/>
+        <w:spacing w:line="360" w:lineRule="auto"/>
+        <w:jc w:val="both"/>
+      </w:pPr>
+      <w:r>
+        <w:rPr>
+          <w:rFonts w:ascii="Times New Roman" w:hAnsi="Times New Roman" w:eastAsia="Times New Roman"/>
+          <w:b w:val="0"/>
+          <w:caps w:val="0"/>
+          <w:sz w:val="24"/>
+        </w:rPr>
+        <w:t>NOF – Number of Fields, numri i fushave</w:t>
+      </w:r>
+    </w:p>
+    <w:p>
+      <w:pPr>
+        <w:pStyle w:val="ListBullet"/>
+        <w:spacing w:line="360" w:lineRule="auto"/>
+        <w:jc w:val="both"/>
+      </w:pPr>
+      <w:r>
+        <w:rPr>
+          <w:rFonts w:ascii="Times New Roman" w:hAnsi="Times New Roman" w:eastAsia="Times New Roman"/>
+          <w:b w:val="0"/>
+          <w:caps w:val="0"/>
+          <w:sz w:val="24"/>
+        </w:rPr>
+        <w:t>NOM – Number of Methods, numri i metodave</w:t>
+      </w:r>
+    </w:p>
+    <w:p>
+      <w:pPr>
+        <w:pStyle w:val="ListBullet"/>
+        <w:spacing w:line="360" w:lineRule="auto"/>
+        <w:jc w:val="both"/>
+      </w:pPr>
+      <w:r>
+        <w:rPr>
+          <w:rFonts w:ascii="Times New Roman" w:hAnsi="Times New Roman" w:eastAsia="Times New Roman"/>
+          <w:b w:val="0"/>
+          <w:caps w:val="0"/>
+          <w:sz w:val="24"/>
+        </w:rPr>
+        <w:t>NOPA – Number of Public Attributes, numri i atributeve publike</w:t>
+      </w:r>
+    </w:p>
+    <w:p>
+      <w:pPr>
+        <w:pStyle w:val="ListBullet"/>
+        <w:spacing w:line="360" w:lineRule="auto"/>
+        <w:jc w:val="both"/>
+      </w:pPr>
+      <w:r>
+        <w:rPr>
+          <w:rFonts w:ascii="Times New Roman" w:hAnsi="Times New Roman" w:eastAsia="Times New Roman"/>
+          <w:b w:val="0"/>
+          <w:caps w:val="0"/>
+          <w:sz w:val="24"/>
+        </w:rPr>
+        <w:t>NP – Number of Parameters, numri i parametrave</w:t>
+      </w:r>
+    </w:p>
+    <w:p>
+      <w:pPr>
+        <w:pStyle w:val="ListBullet"/>
+        <w:spacing w:line="360" w:lineRule="auto"/>
+        <w:jc w:val="both"/>
+      </w:pPr>
+      <w:r>
+        <w:rPr>
+          <w:rFonts w:ascii="Times New Roman" w:hAnsi="Times New Roman" w:eastAsia="Times New Roman"/>
+          <w:b w:val="0"/>
+          <w:caps w:val="0"/>
+          <w:sz w:val="24"/>
+        </w:rPr>
+        <w:t>PK – pyetje kërkimore</w:t>
+      </w:r>
+    </w:p>
+    <w:p>
+      <w:pPr>
+        <w:pStyle w:val="ListBullet"/>
+        <w:spacing w:line="360" w:lineRule="auto"/>
+        <w:jc w:val="both"/>
+      </w:pPr>
+      <w:r>
+        <w:rPr>
+          <w:rFonts w:ascii="Times New Roman" w:hAnsi="Times New Roman" w:eastAsia="Times New Roman"/>
+          <w:b w:val="0"/>
+          <w:caps w:val="0"/>
+          <w:sz w:val="24"/>
+        </w:rPr>
         <w:t>PMD – mjet i hapur i analizës statike, i përdorur si krahasim i jashtëm</w:t>
+      </w:r>
+    </w:p>
+    <w:p>
+      <w:pPr>
+        <w:pStyle w:val="ListBullet"/>
+        <w:spacing w:line="360" w:lineRule="auto"/>
+        <w:jc w:val="both"/>
+      </w:pPr>
+      <w:r>
+        <w:rPr>
+          <w:rFonts w:ascii="Times New Roman" w:hAnsi="Times New Roman" w:eastAsia="Times New Roman"/>
+          <w:b w:val="0"/>
+          <w:caps w:val="0"/>
+          <w:sz w:val="24"/>
+        </w:rPr>
+        <w:t>Precizion – pjesa e rasteve të shënuara që janë vërtet pozitive</w:t>
+      </w:r>
+    </w:p>
+    <w:p>
+      <w:pPr>
+        <w:pStyle w:val="ListBullet"/>
+        <w:spacing w:line="360" w:lineRule="auto"/>
+        <w:jc w:val="both"/>
+      </w:pPr>
+      <w:r>
+        <w:rPr>
+          <w:rFonts w:ascii="Times New Roman" w:hAnsi="Times New Roman" w:eastAsia="Times New Roman"/>
+          <w:b w:val="0"/>
+          <w:caps w:val="0"/>
+          <w:sz w:val="24"/>
+        </w:rPr>
+        <w:t>Recall – pjesa e rasteve pozitive që detektori i gjen</w:t>
       </w:r>
     </w:p>
     <w:p>
@@ -2117,7 +2277,39 @@
           <w:caps w:val="0"/>
           <w:sz w:val="24"/>
         </w:rPr>
-        <w:t>Ky punim merret me hapësirën mes gjetjes së problemit dhe ndreqjes së tij, për gjuhën Java. Erërat detektohen në dy mënyra, me strategji metrikash dhe me një klasifikues të trajnuar mbi të njëjtat metrika, dhe të dyja vlerësohen mbi të njëjtin dataset të etiketuar nga zhvillues profesionistë. Një motor i veçantë e rishkruan kodin vetëm kur mund ta provojë se transformimi është i sigurt. Kapitulli 2 shqyrton literaturën, Kapitulli 3 shtron problemin dhe pyetjet kërkimore, Kapitulli 4 përshkruan metodologjinë, ndërsa Kapitujt 5 dhe 6 paraqesin dhe diskutojnë rezultatet.</w:t>
+        <w:t>Ky punim merret me hapësirën mes gjetjes së problemit dhe ndreqjes së tij, për gjuhën Java. Kontributi i tij kryesor është një zinxhir i vetëm që i lidh tre hapa që literatura zakonisht i trajton veç e veç: detektimin e erës, rishkrimin e kodit dhe verifikimin e rishkrimit. Konkretisht, punimi sjell tri gjëra. E para, një krahasim të drejtpërdrejtë të dy qasjeve të detektimit, strategjive me metrika dhe një klasifikuesi të trajnuar mbi të njëjtat metrika, mbi të njëjtin dataset publik të etiketuar nga zhvillues profesionistë, me të njëjtën ndarje të të dhënave dhe me të njëjtën mënyrë pikëzimi. E dyta, një motor refaktorimi që nuk ndalet te njoftimi: e rishkruan kodin kur transformimi është i sigurt, dhe kur nuk është, e refuzon dhe e shënon arsyen. E treta, matjen e asaj që ndodh pas rishkrimit, pra nëse kodi kompilon ende dhe nëse era u hoq vërtet. I gjithë eksperimenti riprodhohet me komanda të dokumentuara.</w:t>
+      </w:r>
+    </w:p>
+    <w:p>
+      <w:pPr>
+        <w:spacing w:line="360" w:lineRule="auto"/>
+        <w:ind w:firstLine="360"/>
+        <w:jc w:val="both"/>
+      </w:pPr>
+      <w:r>
+        <w:rPr>
+          <w:rFonts w:ascii="Times New Roman" w:hAnsi="Times New Roman" w:eastAsia="Times New Roman"/>
+          <w:b w:val="0"/>
+          <w:caps w:val="0"/>
+          <w:sz w:val="24"/>
+        </w:rPr>
+        <w:t>Një transformim quhet këtu i sigurt kur plotëson dy kushte. Para aplikimit duhet të provohen parakushtet e tij, në kuptimin e Opdyke (1992): për shembull, Extract Method refuzohet kur nga blloku që do të nxirret del një return, break ose continue, sepse metoda e re do ta ndryshonte rrjedhën e programit. Ky kontroll bëhet mbi pemën sintaksore të kodit, jo mbi tekstin e tij. Pas aplikimit, rishkrimi kontrollohet në tri mënyra: skedari duhet të parsohet sërish, kompilatori javac nuk duhet të japë asnjë lloj të ri gabimi krahasuar me versionin para rishkrimit, dhe klasa matet sërish me të njëjtët detektorë për të parë nëse era u hoq. Siguria në këtë punim do të thotë pra se kodi mbetet i vlefshëm dhe se era hiqet. Që programi të sillet njësoj edhe kur ekzekutohet do të ishte garanci më e fortë, por ky punim nuk e jep (Nënkapitulli 3.4).</w:t>
+      </w:r>
+    </w:p>
+    <w:p>
+      <w:pPr>
+        <w:spacing w:line="360" w:lineRule="auto"/>
+        <w:ind w:firstLine="360"/>
+        <w:jc w:val="both"/>
+      </w:pPr>
+      <w:r>
+        <w:rPr>
+          <w:rFonts w:ascii="Times New Roman" w:hAnsi="Times New Roman" w:eastAsia="Times New Roman"/>
+          <w:b w:val="0"/>
+          <w:caps w:val="0"/>
+          <w:sz w:val="24"/>
+        </w:rPr>
+        <w:t>Kapitulli 2 shqyrton literaturën, Kapitulli 3 shtron problemin dhe pyetjet kërkimore, Kapitulli 4 përshkruan metodologjinë, ndërsa Kapitujt 5 dhe 6 paraqesin dhe diskutojnë rezultatet.</w:t>
       </w:r>
     </w:p>
     <w:p>
@@ -2304,7 +2496,7 @@
           <w:caps w:val="0"/>
           <w:sz w:val="24"/>
         </w:rPr>
-        <w:t>Lanza &amp; Marinescu (2006) i organizojnë metrikat në tri përmasa: madhësinë dhe kompleksitetin, lidhjen me klasat e tjera, dhe trashëgiminë. Ata u shtuan edhe metrika të reja, si ATFD, LAA dhe FDP, që nuk matin madhësinë e një entiteti por marrëdhënien e tij me të dhënat e klasave të tjera. Këto janë metrikat që u duhen erërave të bashkëpunimit, si Feature Envy, të cilat nuk i kap dot asnjë metrikë madhësie.</w:t>
+        <w:t>Lanza &amp; Marinescu (2006) i organizojnë metrikat në tri përmasa: madhësinë dhe kompleksitetin, lidhjen me klasat e tjera, dhe trashëgiminë. Ata shtuan edhe metrika të reja, si ATFD, LAA dhe FDP, që nuk matin madhësinë e një entiteti por marrëdhënien e tij me të dhënat e klasave të tjera. Këto janë metrikat që u duhen erërave të bashkëpunimit, si Feature Envy, të cilat nuk i kap dot asnjë metrikë madhësie.</w:t>
       </w:r>
     </w:p>
     <w:p>
@@ -2366,7 +2558,7 @@
           <w:caps w:val="0"/>
           <w:sz w:val="24"/>
         </w:rPr>
-        <w:t>Pragjet e tyre janë dy llojesh. Ato statistikore, si «i lartë» dhe «shumë i lartë», nxirren nga mesatarja dhe devijimi standard i metrikës në korpusin e tyre. Ato me kuptim të zakonshëm, si «pak» ose «një e treta», vijnë nga mënyra si njerëzit i përdorin këto fjalë. Të parat varen pra nga korpusi ku u matën, dhe kjo i bën pyetje të hapur për çdo korpus tjetër.</w:t>
+        <w:t>Pragjet e tyre janë dy llojesh. Ato statistikore, si «i lartë» dhe «shumë i lartë», nxirren nga mesatarja dhe devijimi standard i metrikës në korpusin e tyre. Ato me kuptim të zakonshëm, si «pak» ose «një e treta», vijnë nga mënyra si njerëzit i përdorin këto fjalë. Të parat varen pra nga korpusi ku u matën, ndaj vlefshmëria e tyre në një korpus tjetër mbetet pyetje e hapur.</w:t>
       </w:r>
     </w:p>
     <w:p>
@@ -2444,7 +2636,7 @@
           <w:caps w:val="0"/>
           <w:sz w:val="24"/>
         </w:rPr>
-        <w:t>Ideja e mësimit të makinës është që pragjet t'i mësojë modeli nga shembuj të etiketuar, në vend që t'i vendosë njeriu. Arcelli Fontana et al. (2016) kryen një nga eksperimentet më të mëdha të këtij lloji: gjashtëmbëdhjetë algoritme mbi katër erëra (Data Class, Large Class, Feature Envy dhe Long Method), me 1 986 raste të validuara me dorë nga 74 sisteme. Ata raportuan performancë të lartë për shumicën e algoritmeve në validimin e kryqëzuar, me J48 dhe Random Forest si më të mirat dhe makinat me vektorë mbështetës si më të dobëtat. Studimi u bë pikë referimi për shumë punime pasuese.</w:t>
+        <w:t>Ideja e mësimit të makinës është që pragjet t'i mësojë modeli nga shembuj të etiketuar, në vend që t'i vendosë njeriu. Arcelli Fontana et al. (2016) kryen një nga eksperimentet më të mëdha të këtij lloji: gjashtëmbëdhjetë algoritme mbi katër erëra (Data Class, Large Class, Feature Envy dhe Long Method), me 1986 raste të validuara me dorë nga 74 sisteme. Ata raportuan performancë të lartë për shumicën e algoritmeve në validimin e kryqëzuar, me J48 dhe Random Forest si më të mirat dhe makinat me vektorë mbështetës si më të dobëtat. Studimi u bë pikë referimi për shumë punime pasuese.</w:t>
       </w:r>
     </w:p>
     <w:p>
@@ -2694,7 +2886,23 @@
           <w:caps w:val="0"/>
           <w:sz w:val="24"/>
         </w:rPr>
-        <w:t>Nga ky shqyrtim dalin tri vërejtje. Qasja me rregulla dhe ajo me mësim makine rrallë vlerësohen mbi të njëjtën të vërtetë bazë dhe me të njëjtat metrika, ndaj krahasimi i drejtpërdrejtë mungon. Jo çdo punim e thotë qartë si e ndan bashkësinë e vlerësimit, edhe pse shifra e raportuar varet pikërisht prej saj. Detektimi dhe refaktorimi, nga ana tjetër, trajtohen zakonisht veç e veç, ndaj mbetet pa përgjigje empirike nëse një erë e gjetur mund të ndreqet edhe automatikisht, dhe nëse ndreqja e heq vërtet. Kapitulli 3 i kthen këto vërejtje në problemin dhe pyetjet e punimit.</w:t>
+        <w:t>Nga ky shqyrtim dalin tri vërejtje. Qasja me rregulla dhe ajo me mësim makine rrallë vlerësohen mbi të njëjtën të vërtetë bazë dhe me të njëjtat metrika, ndaj krahasimi i drejtpërdrejtë mungon. Jo çdo punim e thotë qartë si e ndan bashkësinë e vlerësimit, edhe pse shifra e raportuar varet pikërisht prej saj. Detektimi dhe refaktorimi, nga ana tjetër, trajtohen zakonisht veç e veç, ndaj mbetet pa përgjigje empirike nëse një erë e gjetur mund të ndreqet edhe automatikisht, dhe nëse ndreqja e heq vërtet.</w:t>
+      </w:r>
+    </w:p>
+    <w:p>
+      <w:pPr>
+        <w:spacing w:line="360" w:lineRule="auto"/>
+        <w:ind w:firstLine="360"/>
+        <w:jc w:val="both"/>
+      </w:pPr>
+      <w:r>
+        <w:rPr>
+          <w:rFonts w:ascii="Times New Roman" w:hAnsi="Times New Roman" w:eastAsia="Times New Roman"/>
+          <w:b w:val="0"/>
+          <w:caps w:val="0"/>
+          <w:sz w:val="24"/>
+        </w:rPr>
+        <w:t>Ky punim u përgjigjet të triave, dhe pikërisht kjo e dallon nga studimet e përmendura. Ndryshe nga Lanza &amp; Marinescu (2006), pragjet e strategjive nuk merren si të sakta, por maten kundrejt gjykimit të zhvilluesve profesionistë të MLCQ-së. Ndryshe nga Arcelli Fontana et al. (2016), rregullat dhe modelet vlerësohen mbi të njëjtat mostra, me të njëjtin kod pikëzimi, dhe ndarja e të dhënave bëhet sipas depos, ndaj shifra nuk fryhet nga mostra të të njëjtit projekt në trajnim dhe në testim. Ndryshe nga Madeyski &amp; Lewowski (2023), që përdorën metrikat e mjeteve të përgjithshme të analizës statike, modeli trajnohet mbi metrikat e vetë sistemit, përfshirë ato që lexojnë strategjitë, dhe një ablacion me vetëm metrikat e strategjisë tregon sa nga dallimi vjen nga kufiri i mësuar. Ndryshe nga Tsantalis &amp; Chatzigeorgiou (2009), që propozojnë një transformim dhe vendimin ia lënë projektuesit, këtu transformimi aplikohet, verifikohet me kompilator dhe matet nëse e hoqi erën, sepse Bavota et al. (2015) treguan se refaktorimi rrallë e heq erën vetvetiu. Kapitulli 3 i kthen këto vërejtje në problemin dhe pyetjet e punimit.</w:t>
       </w:r>
     </w:p>
     <w:p>
@@ -2862,7 +3070,7 @@
           <w:caps w:val="0"/>
           <w:sz w:val="24"/>
         </w:rPr>
-        <w:t>PK3: A i përmirësojnë objektivisht refaktorimet e propozuara karakteristikat strukturore të kodit, duke ruajtur kompilueshmërinë dhe sjelljen e tij?</w:t>
+        <w:t>PK3: A mund të aplikohen automatikisht refaktorimet e propozuara pa shtuar gabime të reja kompilimi, dhe a e heqin ato erën për të cilën u propozuan, sipas rimatjes me të njëjtat metrika?</w:t>
       </w:r>
     </w:p>
     <w:p>
@@ -3098,7 +3306,7 @@
           <w:caps w:val="0"/>
           <w:sz w:val="24"/>
         </w:rPr>
-        <w:t>Për PK3: çdo rishkrim i aplikuar verifikohet se nuk e prish skedarin, dhe matet nëse era u hoq. Për ruajtjen e sjelljes nuk ka kriter, për arsyen që jepet te Nënkapitulli 3.4.</w:t>
+        <w:t>Për PK3: çdo rishkrim i aplikuar verifikohet se nuk e prish skedarin, dhe matet nëse era u hoq.</w:t>
       </w:r>
     </w:p>
     <w:p>
@@ -3160,7 +3368,7 @@
           <w:caps w:val="0"/>
           <w:sz w:val="24"/>
         </w:rPr>
-        <w:t xml:space="preserve">Korpusi mban nga depot e MLCQ-së vetëm skedarët «.java», pa skedarë ndërtimi dhe pa varësi, dhe disa depo nuk gjenden më. Prandaj çdo rishkrim kontrollohet vetëm me kompilator: nëse kompilon, ose të paktën nëse nuk shton lloj të ri gabimi. Ruajtja e sjelljes, që përmend PK3, </w:t>
+        <w:t xml:space="preserve">Korpusi mban nga depot e MLCQ-së vetëm skedarët «.java», pa skedarë ndërtimi dhe pa varësi, dhe disa depo nuk gjenden më. Prandaj çdo rishkrim kontrollohet vetëm me kompilator: nëse kompilon, ose të paktën nëse nuk shton lloj të ri gabimi. Ruajtja e sjelljes, prandaj, nuk është pjesë e PK3 dhe </w:t>
       </w:r>
       <w:r>
         <w:rPr>
@@ -4652,7 +4860,7 @@
           <w:caps w:val="0"/>
           <w:sz w:val="24"/>
         </w:rPr>
-        <w:t>MLCQ (Madeyski &amp; Lewowski, 2020) përmban 14 739 rishikime të 4 770 mostrave kodi, të bëra nga 26 zhvillues profesionistë për katër erëra: Blob dhe Data Class në nivel klase, Feature Envy dhe Long Method në nivel metode. Çdo rishikim i jep mostrës një ashpërsi në shkallën none, minor, major dhe critical, ku «none» do të thotë se rishikuesi nuk e sheh erën. Mostrat vijnë nga projekte me burim të hapur, por vetë kodi nuk është pjesë e dataset-it: çdo rresht tregon depon, commit-in, skedarin dhe rangun e rreshtave të entitetit.</w:t>
+        <w:t>MLCQ (Madeyski &amp; Lewowski, 2020) përmban 14 739 rishikime të 4770 mostrave kodi, të bëra nga 26 zhvillues profesionistë për katër erëra: Blob dhe Data Class në nivel klase, Feature Envy dhe Long Method në nivel metode. Çdo rishikim i jep mostrës një ashpërsi në shkallën none, minor, major dhe critical, ku «none» do të thotë se rishikuesi nuk e sheh erën. Mostrat vijnë nga projekte me burim të hapur, por vetë kodi nuk është pjesë e dataset-it: çdo rresht tregon depon, commit-in, skedarin dhe rangun e rreshtave të entitetit.</w:t>
       </w:r>
     </w:p>
     <w:p>
@@ -5474,7 +5682,7 @@
           <w:caps w:val="0"/>
           <w:sz w:val="24"/>
         </w:rPr>
-        <w:t xml:space="preserve"> Kompilimi mbulon vetëm gjysmën e përkufizimit të Fowler-it (2018), ruajtjen e sjelljes. Nëse struktura u përmirësua e gjykon një njeri, mbi një mostër diff-esh, me një rubrikë me tri përmasa: </w:t>
+        <w:t xml:space="preserve"> Kompilimi dëshmon vetëm se rishkrimi mbetet kod i vlefshëm. Përkufizimi i Fowler-it (2018) kërkon edhe që struktura të përmirësohet, dhe nëse u përmirësua e gjykon një njeri, mbi një mostër diff-esh, me një rubrikë me tri përmasa: </w:t>
       </w:r>
       <w:r>
         <w:rPr>
@@ -5636,7 +5844,7 @@
           <w:caps w:val="0"/>
           <w:sz w:val="24"/>
         </w:rPr>
-        <w:t>Detektimi vlerësohet si klasifikim binar mbi etiketën e Nënkapitullit 4.3. Te matrica konfuze, TP janë mostrat pozitive që detektori i shënon, FP negativet që shënon, FN pozitivet që i humbet dhe TN negativet që i lë. Prej saj llogariten precizioni, recall-i dhe F1:</w:t>
+        <w:t>Detektimi vlerësohet si klasifikim binar mbi etiketën e Nënkapitullit 4.3. Te matrica konfuze, TP janë mostrat pozitive që detektori i shënon, FP negativët që shënon, FN pozitivët që i humbet dhe TN negativët që i lë. Prej saj llogariten precizioni, recall-i dhe F1:</w:t>
       </w:r>
     </w:p>
     <w:p>
@@ -6376,7 +6584,7 @@
           <w:caps w:val="0"/>
           <w:sz w:val="24"/>
         </w:rPr>
-        <w:t>Të gjitha shifrat e këtij kapitulli janë prodhuar mbi 4534 mostra nga 512 depo, dhe rigjenerohen me një komandë. Agregimi i etiketave është mesatarja e rrumbullakosur lart, përveç aty ku thuhet ndryshe.</w:t>
+        <w:t>Të gjitha shifrat e këtij kapitulli janë prodhuar mbi 4534 mostra nga 512 depo, dhe rigjenerohen me një komandë. Etiketa është mesatarja e rrumbullakosur e Nënkapitullit 4.3, përveç aty ku thuhet ndryshe.</w:t>
       </w:r>
     </w:p>
     <w:p>
@@ -12279,7 +12487,7 @@
           <w:caps w:val="0"/>
           <w:sz w:val="24"/>
         </w:rPr>
-        <w:t>Nga 3532 rishkrime, 58 futën një gabim që nuk ishte aty më parë (1.64%). Te 3 rishkrime javac-u nuk dha verdikt, ndaj për ato dihet vetëm se rishkrimi është Java e vlefshme. Pjesa tjetër ose kompiloi, ose nuk shtoi asnjë lloj të ri gabimi kundrejt skedarit origjinal.</w:t>
+        <w:t>Nga 3532 rishkrime, 58 futën një gabim që nuk ishte aty më parë (1.64%). Te tri rishkrime javac-u nuk dha verdikt, ndaj për ato dihet vetëm se rishkrimi është Java e vlefshme. Pjesa tjetër ose kompiloi, ose nuk shtoi asnjë lloj të ri gabimi kundrejt skedarit origjinal.</w:t>
       </w:r>
     </w:p>
     <w:p>
@@ -13443,7 +13651,7 @@
           <w:caps w:val="0"/>
           <w:sz w:val="24"/>
         </w:rPr>
-        <w:t>Dy rishkrime nga 201 nuk shtonin lloj të ri gabimi të izoluara, por shtojnë brenda projektit të vet. Rastet janë Extract Method mbi PlanModifierUtil.fixTopOBSchema(RelNode, Pair, List, boolean) në projektin «hive» dhe Extract Method mbi TypeHierarchyTests.testSupertypeHierarchyOnWorkingCopy() në projektin «eclipse.jdt.core». Gabimet që shtojnë janë «package ImmutableMap does not exist», «package org.eclipse.jface.text does not exist» dhe «package org.eclipse.text.edits does not exist». 19 kompilime mbetën pa verdikt, nga kufiri kohor ose nga një javac që dështoi pa emërtuar gabim, dhe numërohen si të pakontrolluara, kurrë si sukses.</w:t>
+        <w:t>Dy nga 201 rishkrimet nuk shtonin lloj të ri gabimi kur kompiloheshin të izoluara, por shtojnë kur kompilohen brenda projektit të vet. Rastet janë Extract Method mbi PlanModifierUtil.fixTopOBSchema(RelNode, Pair, List, boolean) në projektin «hive» dhe Extract Method mbi TypeHierarchyTests.testSupertypeHierarchyOnWorkingCopy() në projektin «eclipse.jdt.core». Gabimet që shtojnë janë «package ImmutableMap does not exist», «package org.eclipse.jface.text does not exist» dhe «package org.eclipse.text.edits does not exist». Pa verdikt mbetën 19 kompilime, nga kufiri kohor ose nga një javac që dështoi pa emërtuar gabim, dhe numërohen si të pakontrolluara, kurrë si sukses.</w:t>
       </w:r>
     </w:p>
     <w:p>
@@ -16814,7 +17022,7 @@
           <w:caps w:val="0"/>
           <w:sz w:val="24"/>
         </w:rPr>
-        <w:t>Me kalibrimin jashtë fold-it (5 folde sipas depos, Nënkapitulli 4.9), rregullat arrijnë këto vlera; kolona e fundit jep pragun që zgjodhi secili fold dhe sa herë u zgjodh (Tabela 18):</w:t>
+        <w:t>Me kalibrimin jashtë fold-it (pesë folde sipas depos, Nënkapitulli 4.9), rregullat arrijnë këto vlera; kolona e fundit jep pragun që zgjodhi secili fold dhe sa herë u zgjodh (Tabela 18):</w:t>
       </w:r>
     </w:p>
     <w:p>
@@ -20034,7 +20242,7 @@
           <w:caps w:val="0"/>
           <w:sz w:val="24"/>
         </w:rPr>
-        <w:t>Te Long Method, pragu i botuar del konservativ për këtë korpus: me një prag më të ulët recall-i rritet shumë më tepër se sa bie precizioni, çka sugjeron se rishikuesit e MLCQ-së e quajnë një metodë të gjatë më herët se sa e vendos pragu. Fitimi megjithatë paguhet me precizion, dhe foldet e kalibrimit nuk bien dakord për vlerën.</w:t>
+        <w:t>Te Long Method, pragu i botuar del konservativ për këtë korpus: me një prag më të ulët recall-i rritet shumë më tepër sesa bie precizioni, çka sugjeron se rishikuesit e MLCQ-së e quajnë një metodë të gjatë më herët sesa e vendos pragu. Fitimi megjithatë paguhet me precizion, dhe foldet e kalibrimit nuk bien dakord për vlerën.</w:t>
       </w:r>
     </w:p>
     <w:p>
@@ -20830,7 +21038,7 @@
           <w:caps w:val="0"/>
           <w:sz w:val="24"/>
         </w:rPr>
-        <w:t>Te Blob, Data Class dhe Long Method modelet e këtij punimi dalin pak nën ato të Madeyski &amp; Lewowski-t. Dallimi i validimit e bën këtë të pritshme: ata e ndajnë bashkësinë me validim të kryqëzuar me pesë folde, të shtresuar sipas klasës por jo të grupuar sipas projektit, ndaj e njëjta depo mund ta ushqejë trajnimin dhe të vlerësohet në të njëjtën kohë, pikërisht rrjedhja që ky punim e shmang me GroupKFold. Ata raportojnë edhe mesoren e 120 ekzekutimeve me hiperparametra të optimizuar për MCC, ndërsa këtu modelet kanë parametra fiksë dhe një ekzekutim të vetëm jashtë fold-it. Me një ndarje më të rreptë dhe pa akordim, rezultatet e këtij punimi janë në të njëjtin brez.</w:t>
+        <w:t>Te Blob, Data Class dhe Long Method modelet e këtij punimi dalin pak nën ato të Madeyski &amp; Lewowski-t. Dallimi i validimit e bën këtë të pritshme: ata e ndajnë bashkësinë me validim të kryqëzuar me pesë folde, të shtresuar sipas klasës por jo të grupuar sipas projektit, ndaj e njëjta depo mund ta ushqejë trajnimin dhe të vlerësohet në të njëjtën kohë, pikërisht rrjedhja që ky punim e shmang me GroupKFold. Ata raportojnë edhe mesoren e 120 ekzekutimeve me hiperparametra të optimizuar për MCC, ndërsa këtu modelet kanë parametra të fiksuar dhe një ekzekutim të vetëm jashtë fold-it. Me një ndarje më të rreptë dhe pa akordim, rezultatet e këtij punimi janë në të njëjtin brez.</w:t>
       </w:r>
     </w:p>
     <w:p>
@@ -20878,7 +21086,7 @@
           <w:caps w:val="0"/>
           <w:sz w:val="24"/>
         </w:rPr>
-        <w:t>Mäntylä &amp; Lassenius (2006) gjetën se vlerësimi i erërave nga zhvilluesit është subjektiv, dhe ky punim e mat këtë mbi MLCQ: dy rishikues të së njëjtës mostër pajtohen me MCC nga 0.02 deri në 0.24. Etiketa e agreguar është mesatare e disa gjykimeve dhe e zbut zhurmën e secilit, ndaj modelet mund të pajtohen me të më shumë se sa pajtohen dy rishikues mes tyre. Kjo nuk e bën modelin më të mirë se njeriun, por tregon se shifrat e fushës duhen lexuar kundrejt një tavani të ulët.</w:t>
+        <w:t>Mäntylä &amp; Lassenius (2006) gjetën se vlerësimi i erërave nga zhvilluesit është subjektiv, dhe ky punim e mat këtë mbi MLCQ: dy rishikues të së njëjtës mostër pajtohen me MCC nga 0.02 deri në 0.24. Etiketa e agreguar është mesatare e disa gjykimeve dhe e zbut zhurmën e secilit, ndaj modelet mund të pajtohen me të më shumë sesa pajtohen dy rishikues mes tyre. Kjo nuk e bën modelin më të mirë se njeriun, por tregon se shifrat e fushës duhen lexuar kundrejt një tavani të ulët.</w:t>
       </w:r>
     </w:p>
     <w:p>
@@ -20999,7 +21207,7 @@
           <w:caps w:val="0"/>
           <w:sz w:val="24"/>
         </w:rPr>
-        <w:t xml:space="preserve"> Pjesërisht. Motori transformoi 22.4% të vendeve të detektuara; nga rishkrimet, 98.3% kompiluan ose nuk shtuan lloj të ri gabimi, dhe 1.6% shtuan. Era u hoq te 64.8% e tyre, dhe metrika që e shkakton detektimin ra edhe aty ku era mbeti: struktura përmirësohet objektivisht në shumicën e rasteve, me koston e 865 erërave të reja. Kur skedari kompilohet brenda projektit të vet, pjesa që kompilon plotësisht rritet ndjeshëm, ndërsa dy rishkrime nga 201 e përmbysin verdiktin në drejtimin e kundërt dhe e kufizojnë pretendimin. Ruajtja e sjelljes </w:t>
+        <w:t xml:space="preserve"> Pjesërisht. Motori transformoi 22.4% të vendeve të detektuara; nga rishkrimet, 98.3% kompiluan ose nuk shtuan lloj të ri gabimi, dhe 1.6% shtuan. Era u hoq te 64.8% e tyre, dhe metrika që e shkakton detektimin ra edhe aty ku era mbeti: struktura përmirësohet objektivisht në shumicën e rasteve, me koston e 865 erërave të reja. Kur skedari kompilohet brenda projektit të vet, pjesa që kompilon plotësisht rritet ndjeshëm, ndërsa dy rishkrime nga 201 e përmbysin verdiktin në drejtimin e kundërt dhe e kufizojnë pretendimin. Ruajtja e sjelljes nuk është pjesë e PK3 dhe </w:t>
       </w:r>
       <w:r>
         <w:rPr>
@@ -21017,7 +21225,7 @@
           <w:caps w:val="0"/>
           <w:sz w:val="24"/>
         </w:rPr>
-        <w:t xml:space="preserve"> (Nënkapitulli 3.4). Përgjigjja është pra po për strukturën dhe kompilueshmërinë, me kosto të matur, dhe e hapur për sjelljen.</w:t>
+        <w:t xml:space="preserve"> (Nënkapitulli 3.4). Përgjigjja është pra po për kompilueshmërinë dhe për strukturën, me kosto të matur, ndërsa sjellja mbetet pyetje e hapur.</w:t>
       </w:r>
     </w:p>
     <w:p>
@@ -21960,7 +22168,7 @@
         </w:rPr>
         <w:t>[35]</w:t>
         <w:tab/>
-        <w:t>PMD Team, 2026. PMD: An Extensible Cross-Language Static Code Analyzer, versioni 7.27.0. https://pmd.github.io/ (data e qasjes: 8 shtator 2026).</w:t>
+        <w:t>PMD Team, 2026. PMD: An Extensible Cross-Language Static Code Analyzer, versioni 7.27.0. [https://pmd.github.io/], data e qasjes: 08.09.2026.</w:t>
       </w:r>
     </w:p>
     <w:p>
@@ -27736,7 +27944,7 @@
           <w:caps w:val="0"/>
           <w:sz w:val="24"/>
         </w:rPr>
-        <w:t>Çdo skript shkruan rezultatin si CSV ose JSON në data/results/, bashkë me commit-in, versionin e Python-it dhe platformën që e prodhuan. Interpretuesi dhe platforma janë të njëjtët për të gjithë: Python 3.13.1, Windows-11-10.0.26200-SP0. Commit-i jo: eksperimentet u ekzekutuan njëri pas tjetrit, ndaj secili skedar mban commit-in e vet, dhe ai duhet përdorur për ta riprodhuar (Tabela 31).</w:t>
+        <w:t>Çdo skript shkruan rezultatin si CSV ose JSON në data/results/, bashkë me commit-in, versionin e Python-it dhe platformën që e prodhuan. Interpretuesi dhe platforma janë të njëjtë për të gjithë: Python 3.13.1, Windows-11-10.0.26200-SP0. Commit-i jo: eksperimentet u ekzekutuan njëri pas tjetrit, ndaj secili skedar mban commit-in e vet, dhe ai duhet përdorur për ta riprodhuar (Tabela 31).</w:t>
       </w:r>
     </w:p>
     <w:p>
@@ -28556,7 +28764,7 @@
           <w:caps w:val="0"/>
           <w:sz w:val="24"/>
         </w:rPr>
-        <w:t>Ky premtim u vu në provë më 3 shtator 2026. Trembëdhjetë nga pesëmbëdhjetë hapat që kishte atëherë tabela u ri-ekzekutuan mbi të njëjtat hyrje, dhe të gjithë, me një përjashtim, dhanë skedarë identikë me të komituarit, veç commit-it dhe kohëzgjatjes që regjistrojnë. Tabela e veçorive, 4534 rreshta, doli bajt për bajt identike; po ashtu të katër modelet e stërvitura, dhe asnjë figurë nuk ndryshoi.</w:t>
+        <w:t>Ky premtim u vu në provë më 3 shtator 2026. Trembëdhjetë nga pesëmbëdhjetë hapat që kishte atëherë tabela u ri-ekzekutuan mbi të njëjtat hyrje, dhe të gjithë, me një përjashtim, dhanë skedarë identikë me të komituarit, veç commit-it dhe kohëzgjatjes që regjistrojnë. Tabela e veçorive, 4534 rreshta, doli bajt për bajt identike; po ashtu të katër modelet e trajnuara, dhe asnjë figurë nuk ndryshoi.</w:t>
       </w:r>
     </w:p>
     <w:p>
@@ -28588,7 +28796,7 @@
           <w:caps w:val="0"/>
           <w:sz w:val="24"/>
         </w:rPr>
-        <w:t>Hapi 7, motori mbi korpusin, u riekzekutua më vonë dhe dha të njëjtat total: po aq vende, po aq rishkrime, po aq refuzime, e njëjta ndarje sipas transformimit dhe sipas arsyes. Krahasimi rresht për rresht nxori megjithatë 21 verdikte kompilimi të ndryshuara, dhe ato çuan te një defekt i vërtetë: një javac që dështon pa emërtuar gabim mbi burimin lexohej si kompilim i pastër, pra 19 rishkrime ishin regjistruar si «kompilon» mbi skedarë që nuk kompilojnë. Pas ndreqjes, kjo shtojcë dhe Kapitulli 5 raportojnë matjen e re. Vlera e riprodhimit qëndron pikërisht këtu: totalet përkonin, dhe defekti u pa vetëm sepse u krahasua çdo rresht.</w:t>
+        <w:t>Hapi 7, motori mbi korpusin, u riekzekutua më vonë dhe dha të njëjtat totale: po aq vende, po aq rishkrime, po aq refuzime, e njëjta ndarje sipas transformimit dhe sipas arsyes. Krahasimi rresht për rresht nxori megjithatë 21 verdikte kompilimi të ndryshuara, dhe ato çuan te një defekt i vërtetë: një javac që dështon pa emërtuar gabim mbi burimin lexohej si kompilim i pastër, pra 19 rishkrime ishin regjistruar si «kompilon» mbi skedarë që nuk kompilojnë. Pas ndreqjes, kjo shtojcë dhe Kapitulli 5 raportojnë matjen e re. Vlera e riprodhimit qëndron pikërisht këtu: totalet përkonin, dhe defekti u pa vetëm sepse u krahasua çdo rresht.</w:t>
       </w:r>
     </w:p>
     <w:p>
@@ -29543,7 +29751,7 @@
           <w:caps w:val="0"/>
           <w:sz w:val="24"/>
         </w:rPr>
-        <w:t>Kjo llogari bën një parashikim që një matje tjetër e provon në mënyrë të pavarur. Te Blob-i mospërputhjet janë larg pragjeve (mediana mesatare 0.42), ndaj kalibrimi nuk duhet të ndihmojë shumë; te Feature Envy janë afër (0.78), ndaj duhet. Kalibrimi jashtë-fold-it i Nënkapitullit 5.5, i matur veç dhe pa e parë këtë analizë, jep +0.021 MCC për të parin dhe +0.140 për të dytin. Dy erëra nuk provojnë një rregull, por drejtimi është ai që llogaria e klauzolave e priste, dhe kjo e bën atë shpjegim me vlerë parashikuese e jo përshkrim të mëpasshëm.</w:t>
+        <w:t>Kjo llogari bën një parashikim që një matje tjetër e provon në mënyrë të pavarur. Te Blob-i mospërputhjet janë larg pragjeve (mediana mesatare 0.42), ndaj kalibrimi nuk duhet të ndihmojë shumë; te Feature Envy janë afër (0.78), ndaj duhet. Kalibrimi jashtë fold-it i Nënkapitullit 5.5, i matur veç dhe pa e parë këtë analizë, jep +0.021 MCC për të parin dhe +0.140 për të dytin. Dy erëra nuk provojnë një rregull, por drejtimi është ai që llogaria e klauzolave e priste, dhe kjo e bën atë shpjegim me vlerë parashikuese e jo përshkrim të mëpasshëm.</w:t>
       </w:r>
     </w:p>
     <w:p>
@@ -31995,7 +32203,7 @@
           <w:caps w:val="0"/>
           <w:sz w:val="24"/>
         </w:rPr>
-        <w:t>Te strategjia e botuar recall-i ngjitet nga 0.007 te rastet që vetëm një rishikues i quajti të lehta, në 0.159 te ato që dikush i quajti kritike, pra rreth 23 herë më i lartë. Mospërputhja nuk është e rastësishme: strategjia nuk pajton me rishikuesit pikërisht atje ku rishikuesit vetë ishin më pak të bindur.</w:t>
+        <w:t>Te strategjia e botuar recall-i ngjitet nga 0.007 te rastet që vetëm një rishikues i quajti të lehta, në 0.159 te ato që dikush i quajti kritike, pra rreth 23 herë më i lartë. Mospërputhja nuk është e rastësishme: strategjia nuk pajtohet me rishikuesit pikërisht atje ku rishikuesit vetë ishin më pak të bindur.</w:t>
       </w:r>
     </w:p>
     <w:p>
@@ -33542,7 +33750,7 @@
       <w:outlineLvl w:val="0"/>
     </w:pPr>
     <w:rPr>
-      <w:rFonts w:asciiTheme="majorHAnsi" w:eastAsiaTheme="majorEastAsia" w:hAnsiTheme="majorHAnsi" w:cstheme="majorBidi" w:ascii="Times New Roman" w:hAnsi="Times New Roman" w:eastAsia="Times New Roman"/>
+      <w:rFonts w:ascii="Times New Roman" w:hAnsi="Times New Roman" w:eastAsia="Times New Roman"/>
       <w:b/>
       <w:bCs/>
       <w:caps/>
@@ -33567,7 +33775,7 @@
       <w:outlineLvl w:val="1"/>
     </w:pPr>
     <w:rPr>
-      <w:rFonts w:asciiTheme="majorHAnsi" w:eastAsiaTheme="majorEastAsia" w:hAnsiTheme="majorHAnsi" w:cstheme="majorBidi" w:ascii="Times New Roman" w:hAnsi="Times New Roman" w:eastAsia="Times New Roman"/>
+      <w:rFonts w:ascii="Times New Roman" w:hAnsi="Times New Roman" w:eastAsia="Times New Roman"/>
       <w:b/>
       <w:bCs/>
       <w:caps w:val="0"/>

</xml_diff>

<commit_message>
Verifiko referencat dhe ndreq tri atribuime
Murphy-Hill (39 000), Tufano (pa mbijetesën e 2017-ës), kriteri DS1 i Madeyski & Lewowski; Palomba 2018 merr 23(3). Defekti i etiketave të MLCQ-së shënohet te VD-149.
</commit_message>
<xml_diff>
--- a/docs/thesis/Punim_Diplome_Florent_Latifi.docx
+++ b/docs/thesis/Punim_Diplome_Florent_Latifi.docx
@@ -12,7 +12,7 @@
           <w:noProof/>
         </w:rPr>
         <w:drawing>
-          <wp:inline distT="0" distB="0" distL="0" distR="0" wp14:anchorId="4F11E056" wp14:editId="7BD81B94">
+          <wp:inline distT="0" distB="0" distL="0" distR="0" wp14:anchorId="4A9CFF03" wp14:editId="03EFFE52">
             <wp:extent cx="5394960" cy="624376"/>
             <wp:effectExtent l="0" t="0" r="0" b="0"/>
             <wp:docPr id="1" name="Picture 1"/>
@@ -261,7 +261,7 @@
         </w:rPr>
         <w:lastRenderedPageBreak/>
         <w:drawing>
-          <wp:inline distT="0" distB="0" distL="0" distR="0" wp14:anchorId="2CA702E4" wp14:editId="1E269DB3">
+          <wp:inline distT="0" distB="0" distL="0" distR="0" wp14:anchorId="28FC364E" wp14:editId="6EBC0FBF">
             <wp:extent cx="5394960" cy="624376"/>
             <wp:effectExtent l="0" t="0" r="0" b="0"/>
             <wp:docPr id="2" name="Picture 2"/>
@@ -651,7 +651,7 @@
       <w:r>
         <w:fldChar w:fldCharType="separate"/>
       </w:r>
-      <w:hyperlink w:anchor="_Toc242655042" w:history="1">
+      <w:hyperlink w:anchor="_Toc242658748" w:history="1">
         <w:r>
           <w:rPr>
             <w:rStyle w:val="Hyperlink"/>
@@ -679,7 +679,7 @@
             <w:noProof/>
             <w:webHidden/>
           </w:rPr>
-          <w:instrText xml:space="preserve"> PAGEREF _Toc242655042 \h </w:instrText>
+          <w:instrText xml:space="preserve"> PAGEREF _Toc242658748 \h </w:instrText>
         </w:r>
         <w:r>
           <w:rPr>
@@ -723,7 +723,7 @@
           <w:lang w:val="sq-AL" w:eastAsia="sq-AL"/>
         </w:rPr>
       </w:pPr>
-      <w:hyperlink w:anchor="_Toc242655043" w:history="1">
+      <w:hyperlink w:anchor="_Toc242658749" w:history="1">
         <w:r>
           <w:rPr>
             <w:rStyle w:val="Hyperlink"/>
@@ -751,7 +751,7 @@
             <w:noProof/>
             <w:webHidden/>
           </w:rPr>
-          <w:instrText xml:space="preserve"> PAGEREF _Toc242655043 \h </w:instrText>
+          <w:instrText xml:space="preserve"> PAGEREF _Toc242658749 \h </w:instrText>
         </w:r>
         <w:r>
           <w:rPr>
@@ -795,7 +795,7 @@
           <w:lang w:val="sq-AL" w:eastAsia="sq-AL"/>
         </w:rPr>
       </w:pPr>
-      <w:hyperlink w:anchor="_Toc242655044" w:history="1">
+      <w:hyperlink w:anchor="_Toc242658750" w:history="1">
         <w:r>
           <w:rPr>
             <w:rStyle w:val="Hyperlink"/>
@@ -823,7 +823,7 @@
             <w:noProof/>
             <w:webHidden/>
           </w:rPr>
-          <w:instrText xml:space="preserve"> PAGEREF _Toc242655044 \h </w:instrText>
+          <w:instrText xml:space="preserve"> PAGEREF _Toc242658750 \h </w:instrText>
         </w:r>
         <w:r>
           <w:rPr>
@@ -867,7 +867,7 @@
           <w:lang w:val="sq-AL" w:eastAsia="sq-AL"/>
         </w:rPr>
       </w:pPr>
-      <w:hyperlink w:anchor="_Toc242655045" w:history="1">
+      <w:hyperlink w:anchor="_Toc242658751" w:history="1">
         <w:r>
           <w:rPr>
             <w:rStyle w:val="Hyperlink"/>
@@ -895,7 +895,7 @@
             <w:noProof/>
             <w:webHidden/>
           </w:rPr>
-          <w:instrText xml:space="preserve"> PAGEREF _Toc242655045 \h </w:instrText>
+          <w:instrText xml:space="preserve"> PAGEREF _Toc242658751 \h </w:instrText>
         </w:r>
         <w:r>
           <w:rPr>
@@ -939,7 +939,7 @@
           <w:lang w:val="sq-AL" w:eastAsia="sq-AL"/>
         </w:rPr>
       </w:pPr>
-      <w:hyperlink w:anchor="_Toc242655046" w:history="1">
+      <w:hyperlink w:anchor="_Toc242658752" w:history="1">
         <w:r>
           <w:rPr>
             <w:rStyle w:val="Hyperlink"/>
@@ -967,7 +967,7 @@
             <w:noProof/>
             <w:webHidden/>
           </w:rPr>
-          <w:instrText xml:space="preserve"> PAGEREF _Toc242655046 \h </w:instrText>
+          <w:instrText xml:space="preserve"> PAGEREF _Toc242658752 \h </w:instrText>
         </w:r>
         <w:r>
           <w:rPr>
@@ -1011,7 +1011,7 @@
           <w:lang w:val="sq-AL" w:eastAsia="sq-AL"/>
         </w:rPr>
       </w:pPr>
-      <w:hyperlink w:anchor="_Toc242655047" w:history="1">
+      <w:hyperlink w:anchor="_Toc242658753" w:history="1">
         <w:r>
           <w:rPr>
             <w:rStyle w:val="Hyperlink"/>
@@ -1039,7 +1039,7 @@
             <w:noProof/>
             <w:webHidden/>
           </w:rPr>
-          <w:instrText xml:space="preserve"> PAGEREF _Toc242655047 \h </w:instrText>
+          <w:instrText xml:space="preserve"> PAGEREF _Toc242658753 \h </w:instrText>
         </w:r>
         <w:r>
           <w:rPr>
@@ -1083,7 +1083,7 @@
           <w:lang w:val="sq-AL" w:eastAsia="sq-AL"/>
         </w:rPr>
       </w:pPr>
-      <w:hyperlink w:anchor="_Toc242655048" w:history="1">
+      <w:hyperlink w:anchor="_Toc242658754" w:history="1">
         <w:r>
           <w:rPr>
             <w:rStyle w:val="Hyperlink"/>
@@ -1111,7 +1111,7 @@
             <w:noProof/>
             <w:webHidden/>
           </w:rPr>
-          <w:instrText xml:space="preserve"> PAGEREF _Toc242655048 \h </w:instrText>
+          <w:instrText xml:space="preserve"> PAGEREF _Toc242658754 \h </w:instrText>
         </w:r>
         <w:r>
           <w:rPr>
@@ -1155,7 +1155,7 @@
           <w:lang w:val="sq-AL" w:eastAsia="sq-AL"/>
         </w:rPr>
       </w:pPr>
-      <w:hyperlink w:anchor="_Toc242655049" w:history="1">
+      <w:hyperlink w:anchor="_Toc242658755" w:history="1">
         <w:r>
           <w:rPr>
             <w:rStyle w:val="Hyperlink"/>
@@ -1183,7 +1183,7 @@
             <w:noProof/>
             <w:webHidden/>
           </w:rPr>
-          <w:instrText xml:space="preserve"> PAGEREF _Toc242655049 \h </w:instrText>
+          <w:instrText xml:space="preserve"> PAGEREF _Toc242658755 \h </w:instrText>
         </w:r>
         <w:r>
           <w:rPr>
@@ -1227,7 +1227,7 @@
           <w:lang w:val="sq-AL" w:eastAsia="sq-AL"/>
         </w:rPr>
       </w:pPr>
-      <w:hyperlink w:anchor="_Toc242655050" w:history="1">
+      <w:hyperlink w:anchor="_Toc242658756" w:history="1">
         <w:r>
           <w:rPr>
             <w:rStyle w:val="Hyperlink"/>
@@ -1255,7 +1255,7 @@
             <w:noProof/>
             <w:webHidden/>
           </w:rPr>
-          <w:instrText xml:space="preserve"> PAGEREF _Toc242655050 \h </w:instrText>
+          <w:instrText xml:space="preserve"> PAGEREF _Toc242658756 \h </w:instrText>
         </w:r>
         <w:r>
           <w:rPr>
@@ -1299,7 +1299,7 @@
           <w:lang w:val="sq-AL" w:eastAsia="sq-AL"/>
         </w:rPr>
       </w:pPr>
-      <w:hyperlink w:anchor="_Toc242655051" w:history="1">
+      <w:hyperlink w:anchor="_Toc242658757" w:history="1">
         <w:r>
           <w:rPr>
             <w:rStyle w:val="Hyperlink"/>
@@ -1327,7 +1327,7 @@
             <w:noProof/>
             <w:webHidden/>
           </w:rPr>
-          <w:instrText xml:space="preserve"> PAGEREF _Toc242655051 \h </w:instrText>
+          <w:instrText xml:space="preserve"> PAGEREF _Toc242658757 \h </w:instrText>
         </w:r>
         <w:r>
           <w:rPr>
@@ -1371,7 +1371,7 @@
           <w:lang w:val="sq-AL" w:eastAsia="sq-AL"/>
         </w:rPr>
       </w:pPr>
-      <w:hyperlink w:anchor="_Toc242655052" w:history="1">
+      <w:hyperlink w:anchor="_Toc242658758" w:history="1">
         <w:r>
           <w:rPr>
             <w:rStyle w:val="Hyperlink"/>
@@ -1399,7 +1399,7 @@
             <w:noProof/>
             <w:webHidden/>
           </w:rPr>
-          <w:instrText xml:space="preserve"> PAGEREF _Toc242655052 \h </w:instrText>
+          <w:instrText xml:space="preserve"> PAGEREF _Toc242658758 \h </w:instrText>
         </w:r>
         <w:r>
           <w:rPr>
@@ -1443,7 +1443,7 @@
           <w:lang w:val="sq-AL" w:eastAsia="sq-AL"/>
         </w:rPr>
       </w:pPr>
-      <w:hyperlink w:anchor="_Toc242655053" w:history="1">
+      <w:hyperlink w:anchor="_Toc242658759" w:history="1">
         <w:r>
           <w:rPr>
             <w:rStyle w:val="Hyperlink"/>
@@ -1471,7 +1471,7 @@
             <w:noProof/>
             <w:webHidden/>
           </w:rPr>
-          <w:instrText xml:space="preserve"> PAGEREF _Toc242655053 \h </w:instrText>
+          <w:instrText xml:space="preserve"> PAGEREF _Toc242658759 \h </w:instrText>
         </w:r>
         <w:r>
           <w:rPr>
@@ -1515,7 +1515,7 @@
           <w:lang w:val="sq-AL" w:eastAsia="sq-AL"/>
         </w:rPr>
       </w:pPr>
-      <w:hyperlink w:anchor="_Toc242655054" w:history="1">
+      <w:hyperlink w:anchor="_Toc242658760" w:history="1">
         <w:r>
           <w:rPr>
             <w:rStyle w:val="Hyperlink"/>
@@ -1543,7 +1543,7 @@
             <w:noProof/>
             <w:webHidden/>
           </w:rPr>
-          <w:instrText xml:space="preserve"> PAGEREF _Toc242655054 \h </w:instrText>
+          <w:instrText xml:space="preserve"> PAGEREF _Toc242658760 \h </w:instrText>
         </w:r>
         <w:r>
           <w:rPr>
@@ -1587,7 +1587,7 @@
           <w:lang w:val="sq-AL" w:eastAsia="sq-AL"/>
         </w:rPr>
       </w:pPr>
-      <w:hyperlink w:anchor="_Toc242655055" w:history="1">
+      <w:hyperlink w:anchor="_Toc242658761" w:history="1">
         <w:r>
           <w:rPr>
             <w:rStyle w:val="Hyperlink"/>
@@ -1615,7 +1615,7 @@
             <w:noProof/>
             <w:webHidden/>
           </w:rPr>
-          <w:instrText xml:space="preserve"> PAGEREF _Toc242655055 \h </w:instrText>
+          <w:instrText xml:space="preserve"> PAGEREF _Toc242658761 \h </w:instrText>
         </w:r>
         <w:r>
           <w:rPr>
@@ -1659,7 +1659,7 @@
           <w:lang w:val="sq-AL" w:eastAsia="sq-AL"/>
         </w:rPr>
       </w:pPr>
-      <w:hyperlink w:anchor="_Toc242655056" w:history="1">
+      <w:hyperlink w:anchor="_Toc242658762" w:history="1">
         <w:r>
           <w:rPr>
             <w:rStyle w:val="Hyperlink"/>
@@ -1687,7 +1687,7 @@
             <w:noProof/>
             <w:webHidden/>
           </w:rPr>
-          <w:instrText xml:space="preserve"> PAGEREF _Toc242655056 \h </w:instrText>
+          <w:instrText xml:space="preserve"> PAGEREF _Toc242658762 \h </w:instrText>
         </w:r>
         <w:r>
           <w:rPr>
@@ -1731,7 +1731,7 @@
           <w:lang w:val="sq-AL" w:eastAsia="sq-AL"/>
         </w:rPr>
       </w:pPr>
-      <w:hyperlink w:anchor="_Toc242655057" w:history="1">
+      <w:hyperlink w:anchor="_Toc242658763" w:history="1">
         <w:r>
           <w:rPr>
             <w:rStyle w:val="Hyperlink"/>
@@ -1759,7 +1759,7 @@
             <w:noProof/>
             <w:webHidden/>
           </w:rPr>
-          <w:instrText xml:space="preserve"> PAGEREF _Toc242655057 \h </w:instrText>
+          <w:instrText xml:space="preserve"> PAGEREF _Toc242658763 \h </w:instrText>
         </w:r>
         <w:r>
           <w:rPr>
@@ -1803,7 +1803,7 @@
           <w:lang w:val="sq-AL" w:eastAsia="sq-AL"/>
         </w:rPr>
       </w:pPr>
-      <w:hyperlink w:anchor="_Toc242655058" w:history="1">
+      <w:hyperlink w:anchor="_Toc242658764" w:history="1">
         <w:r>
           <w:rPr>
             <w:rStyle w:val="Hyperlink"/>
@@ -1831,7 +1831,7 @@
             <w:noProof/>
             <w:webHidden/>
           </w:rPr>
-          <w:instrText xml:space="preserve"> PAGEREF _Toc242655058 \h </w:instrText>
+          <w:instrText xml:space="preserve"> PAGEREF _Toc242658764 \h </w:instrText>
         </w:r>
         <w:r>
           <w:rPr>
@@ -1875,7 +1875,7 @@
           <w:lang w:val="sq-AL" w:eastAsia="sq-AL"/>
         </w:rPr>
       </w:pPr>
-      <w:hyperlink w:anchor="_Toc242655059" w:history="1">
+      <w:hyperlink w:anchor="_Toc242658765" w:history="1">
         <w:r>
           <w:rPr>
             <w:rStyle w:val="Hyperlink"/>
@@ -1903,7 +1903,7 @@
             <w:noProof/>
             <w:webHidden/>
           </w:rPr>
-          <w:instrText xml:space="preserve"> PAGEREF _Toc242655059 \h </w:instrText>
+          <w:instrText xml:space="preserve"> PAGEREF _Toc242658765 \h </w:instrText>
         </w:r>
         <w:r>
           <w:rPr>
@@ -1947,7 +1947,7 @@
           <w:lang w:val="sq-AL" w:eastAsia="sq-AL"/>
         </w:rPr>
       </w:pPr>
-      <w:hyperlink w:anchor="_Toc242655060" w:history="1">
+      <w:hyperlink w:anchor="_Toc242658766" w:history="1">
         <w:r>
           <w:rPr>
             <w:rStyle w:val="Hyperlink"/>
@@ -1975,7 +1975,7 @@
             <w:noProof/>
             <w:webHidden/>
           </w:rPr>
-          <w:instrText xml:space="preserve"> PAGEREF _Toc242655060 \h </w:instrText>
+          <w:instrText xml:space="preserve"> PAGEREF _Toc242658766 \h </w:instrText>
         </w:r>
         <w:r>
           <w:rPr>
@@ -2019,7 +2019,7 @@
           <w:lang w:val="sq-AL" w:eastAsia="sq-AL"/>
         </w:rPr>
       </w:pPr>
-      <w:hyperlink w:anchor="_Toc242655061" w:history="1">
+      <w:hyperlink w:anchor="_Toc242658767" w:history="1">
         <w:r>
           <w:rPr>
             <w:rStyle w:val="Hyperlink"/>
@@ -2047,7 +2047,7 @@
             <w:noProof/>
             <w:webHidden/>
           </w:rPr>
-          <w:instrText xml:space="preserve"> PAGEREF _Toc242655061 \h </w:instrText>
+          <w:instrText xml:space="preserve"> PAGEREF _Toc242658767 \h </w:instrText>
         </w:r>
         <w:r>
           <w:rPr>
@@ -2091,7 +2091,7 @@
           <w:lang w:val="sq-AL" w:eastAsia="sq-AL"/>
         </w:rPr>
       </w:pPr>
-      <w:hyperlink w:anchor="_Toc242655062" w:history="1">
+      <w:hyperlink w:anchor="_Toc242658768" w:history="1">
         <w:r>
           <w:rPr>
             <w:rStyle w:val="Hyperlink"/>
@@ -2119,7 +2119,7 @@
             <w:noProof/>
             <w:webHidden/>
           </w:rPr>
-          <w:instrText xml:space="preserve"> PAGEREF _Toc242655062 \h </w:instrText>
+          <w:instrText xml:space="preserve"> PAGEREF _Toc242658768 \h </w:instrText>
         </w:r>
         <w:r>
           <w:rPr>
@@ -2163,7 +2163,7 @@
           <w:lang w:val="sq-AL" w:eastAsia="sq-AL"/>
         </w:rPr>
       </w:pPr>
-      <w:hyperlink w:anchor="_Toc242655063" w:history="1">
+      <w:hyperlink w:anchor="_Toc242658769" w:history="1">
         <w:r>
           <w:rPr>
             <w:rStyle w:val="Hyperlink"/>
@@ -2191,7 +2191,7 @@
             <w:noProof/>
             <w:webHidden/>
           </w:rPr>
-          <w:instrText xml:space="preserve"> PAGEREF _Toc242655063 \h </w:instrText>
+          <w:instrText xml:space="preserve"> PAGEREF _Toc242658769 \h </w:instrText>
         </w:r>
         <w:r>
           <w:rPr>
@@ -2235,7 +2235,7 @@
           <w:lang w:val="sq-AL" w:eastAsia="sq-AL"/>
         </w:rPr>
       </w:pPr>
-      <w:hyperlink w:anchor="_Toc242655064" w:history="1">
+      <w:hyperlink w:anchor="_Toc242658770" w:history="1">
         <w:r>
           <w:rPr>
             <w:rStyle w:val="Hyperlink"/>
@@ -2263,7 +2263,7 @@
             <w:noProof/>
             <w:webHidden/>
           </w:rPr>
-          <w:instrText xml:space="preserve"> PAGEREF _Toc242655064 \h </w:instrText>
+          <w:instrText xml:space="preserve"> PAGEREF _Toc242658770 \h </w:instrText>
         </w:r>
         <w:r>
           <w:rPr>
@@ -2307,7 +2307,7 @@
           <w:lang w:val="sq-AL" w:eastAsia="sq-AL"/>
         </w:rPr>
       </w:pPr>
-      <w:hyperlink w:anchor="_Toc242655065" w:history="1">
+      <w:hyperlink w:anchor="_Toc242658771" w:history="1">
         <w:r>
           <w:rPr>
             <w:rStyle w:val="Hyperlink"/>
@@ -2335,7 +2335,7 @@
             <w:noProof/>
             <w:webHidden/>
           </w:rPr>
-          <w:instrText xml:space="preserve"> PAGEREF _Toc242655065 \h </w:instrText>
+          <w:instrText xml:space="preserve"> PAGEREF _Toc242658771 \h </w:instrText>
         </w:r>
         <w:r>
           <w:rPr>
@@ -2379,7 +2379,7 @@
           <w:lang w:val="sq-AL" w:eastAsia="sq-AL"/>
         </w:rPr>
       </w:pPr>
-      <w:hyperlink w:anchor="_Toc242655066" w:history="1">
+      <w:hyperlink w:anchor="_Toc242658772" w:history="1">
         <w:r>
           <w:rPr>
             <w:rStyle w:val="Hyperlink"/>
@@ -2407,7 +2407,7 @@
             <w:noProof/>
             <w:webHidden/>
           </w:rPr>
-          <w:instrText xml:space="preserve"> PAGEREF _Toc242655066 \h </w:instrText>
+          <w:instrText xml:space="preserve"> PAGEREF _Toc242658772 \h </w:instrText>
         </w:r>
         <w:r>
           <w:rPr>
@@ -2451,7 +2451,7 @@
           <w:lang w:val="sq-AL" w:eastAsia="sq-AL"/>
         </w:rPr>
       </w:pPr>
-      <w:hyperlink w:anchor="_Toc242655067" w:history="1">
+      <w:hyperlink w:anchor="_Toc242658773" w:history="1">
         <w:r>
           <w:rPr>
             <w:rStyle w:val="Hyperlink"/>
@@ -2479,7 +2479,7 @@
             <w:noProof/>
             <w:webHidden/>
           </w:rPr>
-          <w:instrText xml:space="preserve"> PAGEREF _Toc242655067 \h </w:instrText>
+          <w:instrText xml:space="preserve"> PAGEREF _Toc242658773 \h </w:instrText>
         </w:r>
         <w:r>
           <w:rPr>
@@ -2523,7 +2523,7 @@
           <w:lang w:val="sq-AL" w:eastAsia="sq-AL"/>
         </w:rPr>
       </w:pPr>
-      <w:hyperlink w:anchor="_Toc242655068" w:history="1">
+      <w:hyperlink w:anchor="_Toc242658774" w:history="1">
         <w:r>
           <w:rPr>
             <w:rStyle w:val="Hyperlink"/>
@@ -2551,7 +2551,7 @@
             <w:noProof/>
             <w:webHidden/>
           </w:rPr>
-          <w:instrText xml:space="preserve"> PAGEREF _Toc242655068 \h </w:instrText>
+          <w:instrText xml:space="preserve"> PAGEREF _Toc242658774 \h </w:instrText>
         </w:r>
         <w:r>
           <w:rPr>
@@ -2595,7 +2595,7 @@
           <w:lang w:val="sq-AL" w:eastAsia="sq-AL"/>
         </w:rPr>
       </w:pPr>
-      <w:hyperlink w:anchor="_Toc242655069" w:history="1">
+      <w:hyperlink w:anchor="_Toc242658775" w:history="1">
         <w:r>
           <w:rPr>
             <w:rStyle w:val="Hyperlink"/>
@@ -2623,7 +2623,7 @@
             <w:noProof/>
             <w:webHidden/>
           </w:rPr>
-          <w:instrText xml:space="preserve"> PAGEREF _Toc242655069 \h </w:instrText>
+          <w:instrText xml:space="preserve"> PAGEREF _Toc242658775 \h </w:instrText>
         </w:r>
         <w:r>
           <w:rPr>
@@ -2667,7 +2667,7 @@
           <w:lang w:val="sq-AL" w:eastAsia="sq-AL"/>
         </w:rPr>
       </w:pPr>
-      <w:hyperlink w:anchor="_Toc242655070" w:history="1">
+      <w:hyperlink w:anchor="_Toc242658776" w:history="1">
         <w:r>
           <w:rPr>
             <w:rStyle w:val="Hyperlink"/>
@@ -2695,7 +2695,7 @@
             <w:noProof/>
             <w:webHidden/>
           </w:rPr>
-          <w:instrText xml:space="preserve"> PAGEREF _Toc242655070 \h </w:instrText>
+          <w:instrText xml:space="preserve"> PAGEREF _Toc242658776 \h </w:instrText>
         </w:r>
         <w:r>
           <w:rPr>
@@ -2739,7 +2739,7 @@
           <w:lang w:val="sq-AL" w:eastAsia="sq-AL"/>
         </w:rPr>
       </w:pPr>
-      <w:hyperlink w:anchor="_Toc242655071" w:history="1">
+      <w:hyperlink w:anchor="_Toc242658777" w:history="1">
         <w:r>
           <w:rPr>
             <w:rStyle w:val="Hyperlink"/>
@@ -2767,7 +2767,7 @@
             <w:noProof/>
             <w:webHidden/>
           </w:rPr>
-          <w:instrText xml:space="preserve"> PAGEREF _Toc242655071 \h </w:instrText>
+          <w:instrText xml:space="preserve"> PAGEREF _Toc242658777 \h </w:instrText>
         </w:r>
         <w:r>
           <w:rPr>
@@ -2811,7 +2811,7 @@
           <w:lang w:val="sq-AL" w:eastAsia="sq-AL"/>
         </w:rPr>
       </w:pPr>
-      <w:hyperlink w:anchor="_Toc242655072" w:history="1">
+      <w:hyperlink w:anchor="_Toc242658778" w:history="1">
         <w:r>
           <w:rPr>
             <w:rStyle w:val="Hyperlink"/>
@@ -2839,7 +2839,7 @@
             <w:noProof/>
             <w:webHidden/>
           </w:rPr>
-          <w:instrText xml:space="preserve"> PAGEREF _Toc242655072 \h </w:instrText>
+          <w:instrText xml:space="preserve"> PAGEREF _Toc242658778 \h </w:instrText>
         </w:r>
         <w:r>
           <w:rPr>
@@ -2883,7 +2883,7 @@
           <w:lang w:val="sq-AL" w:eastAsia="sq-AL"/>
         </w:rPr>
       </w:pPr>
-      <w:hyperlink w:anchor="_Toc242655073" w:history="1">
+      <w:hyperlink w:anchor="_Toc242658779" w:history="1">
         <w:r>
           <w:rPr>
             <w:rStyle w:val="Hyperlink"/>
@@ -2911,7 +2911,7 @@
             <w:noProof/>
             <w:webHidden/>
           </w:rPr>
-          <w:instrText xml:space="preserve"> PAGEREF _Toc242655073 \h </w:instrText>
+          <w:instrText xml:space="preserve"> PAGEREF _Toc242658779 \h </w:instrText>
         </w:r>
         <w:r>
           <w:rPr>
@@ -2955,7 +2955,7 @@
           <w:lang w:val="sq-AL" w:eastAsia="sq-AL"/>
         </w:rPr>
       </w:pPr>
-      <w:hyperlink w:anchor="_Toc242655074" w:history="1">
+      <w:hyperlink w:anchor="_Toc242658780" w:history="1">
         <w:r>
           <w:rPr>
             <w:rStyle w:val="Hyperlink"/>
@@ -2983,7 +2983,7 @@
             <w:noProof/>
             <w:webHidden/>
           </w:rPr>
-          <w:instrText xml:space="preserve"> PAGEREF _Toc242655074 \h </w:instrText>
+          <w:instrText xml:space="preserve"> PAGEREF _Toc242658780 \h </w:instrText>
         </w:r>
         <w:r>
           <w:rPr>
@@ -3027,7 +3027,7 @@
           <w:lang w:val="sq-AL" w:eastAsia="sq-AL"/>
         </w:rPr>
       </w:pPr>
-      <w:hyperlink w:anchor="_Toc242655075" w:history="1">
+      <w:hyperlink w:anchor="_Toc242658781" w:history="1">
         <w:r>
           <w:rPr>
             <w:rStyle w:val="Hyperlink"/>
@@ -3055,7 +3055,7 @@
             <w:noProof/>
             <w:webHidden/>
           </w:rPr>
-          <w:instrText xml:space="preserve"> PAGEREF _Toc242655075 \h </w:instrText>
+          <w:instrText xml:space="preserve"> PAGEREF _Toc242658781 \h </w:instrText>
         </w:r>
         <w:r>
           <w:rPr>
@@ -3099,7 +3099,7 @@
           <w:lang w:val="sq-AL" w:eastAsia="sq-AL"/>
         </w:rPr>
       </w:pPr>
-      <w:hyperlink w:anchor="_Toc242655076" w:history="1">
+      <w:hyperlink w:anchor="_Toc242658782" w:history="1">
         <w:r>
           <w:rPr>
             <w:rStyle w:val="Hyperlink"/>
@@ -3127,7 +3127,7 @@
             <w:noProof/>
             <w:webHidden/>
           </w:rPr>
-          <w:instrText xml:space="preserve"> PAGEREF _Toc242655076 \h </w:instrText>
+          <w:instrText xml:space="preserve"> PAGEREF _Toc242658782 \h </w:instrText>
         </w:r>
         <w:r>
           <w:rPr>
@@ -3171,7 +3171,7 @@
           <w:lang w:val="sq-AL" w:eastAsia="sq-AL"/>
         </w:rPr>
       </w:pPr>
-      <w:hyperlink w:anchor="_Toc242655077" w:history="1">
+      <w:hyperlink w:anchor="_Toc242658783" w:history="1">
         <w:r>
           <w:rPr>
             <w:rStyle w:val="Hyperlink"/>
@@ -3199,7 +3199,7 @@
             <w:noProof/>
             <w:webHidden/>
           </w:rPr>
-          <w:instrText xml:space="preserve"> PAGEREF _Toc242655077 \h </w:instrText>
+          <w:instrText xml:space="preserve"> PAGEREF _Toc242658783 \h </w:instrText>
         </w:r>
         <w:r>
           <w:rPr>
@@ -3243,7 +3243,7 @@
           <w:lang w:val="sq-AL" w:eastAsia="sq-AL"/>
         </w:rPr>
       </w:pPr>
-      <w:hyperlink w:anchor="_Toc242655078" w:history="1">
+      <w:hyperlink w:anchor="_Toc242658784" w:history="1">
         <w:r>
           <w:rPr>
             <w:rStyle w:val="Hyperlink"/>
@@ -3271,7 +3271,7 @@
             <w:noProof/>
             <w:webHidden/>
           </w:rPr>
-          <w:instrText xml:space="preserve"> PAGEREF _Toc242655078 \h </w:instrText>
+          <w:instrText xml:space="preserve"> PAGEREF _Toc242658784 \h </w:instrText>
         </w:r>
         <w:r>
           <w:rPr>
@@ -3315,7 +3315,7 @@
           <w:lang w:val="sq-AL" w:eastAsia="sq-AL"/>
         </w:rPr>
       </w:pPr>
-      <w:hyperlink w:anchor="_Toc242655079" w:history="1">
+      <w:hyperlink w:anchor="_Toc242658785" w:history="1">
         <w:r>
           <w:rPr>
             <w:rStyle w:val="Hyperlink"/>
@@ -3343,7 +3343,7 @@
             <w:noProof/>
             <w:webHidden/>
           </w:rPr>
-          <w:instrText xml:space="preserve"> PAGEREF _Toc242655079 \h </w:instrText>
+          <w:instrText xml:space="preserve"> PAGEREF _Toc242658785 \h </w:instrText>
         </w:r>
         <w:r>
           <w:rPr>
@@ -3387,7 +3387,7 @@
           <w:lang w:val="sq-AL" w:eastAsia="sq-AL"/>
         </w:rPr>
       </w:pPr>
-      <w:hyperlink w:anchor="_Toc242655080" w:history="1">
+      <w:hyperlink w:anchor="_Toc242658786" w:history="1">
         <w:r>
           <w:rPr>
             <w:rStyle w:val="Hyperlink"/>
@@ -3415,7 +3415,7 @@
             <w:noProof/>
             <w:webHidden/>
           </w:rPr>
-          <w:instrText xml:space="preserve"> PAGEREF _Toc242655080 \h </w:instrText>
+          <w:instrText xml:space="preserve"> PAGEREF _Toc242658786 \h </w:instrText>
         </w:r>
         <w:r>
           <w:rPr>
@@ -3459,7 +3459,7 @@
           <w:lang w:val="sq-AL" w:eastAsia="sq-AL"/>
         </w:rPr>
       </w:pPr>
-      <w:hyperlink w:anchor="_Toc242655081" w:history="1">
+      <w:hyperlink w:anchor="_Toc242658787" w:history="1">
         <w:r>
           <w:rPr>
             <w:rStyle w:val="Hyperlink"/>
@@ -3487,7 +3487,7 @@
             <w:noProof/>
             <w:webHidden/>
           </w:rPr>
-          <w:instrText xml:space="preserve"> PAGEREF _Toc242655081 \h </w:instrText>
+          <w:instrText xml:space="preserve"> PAGEREF _Toc242658787 \h </w:instrText>
         </w:r>
         <w:r>
           <w:rPr>
@@ -3531,7 +3531,7 @@
           <w:lang w:val="sq-AL" w:eastAsia="sq-AL"/>
         </w:rPr>
       </w:pPr>
-      <w:hyperlink w:anchor="_Toc242655082" w:history="1">
+      <w:hyperlink w:anchor="_Toc242658788" w:history="1">
         <w:r>
           <w:rPr>
             <w:rStyle w:val="Hyperlink"/>
@@ -3559,7 +3559,7 @@
             <w:noProof/>
             <w:webHidden/>
           </w:rPr>
-          <w:instrText xml:space="preserve"> PAGEREF _Toc242655082 \h </w:instrText>
+          <w:instrText xml:space="preserve"> PAGEREF _Toc242658788 \h </w:instrText>
         </w:r>
         <w:r>
           <w:rPr>
@@ -3603,7 +3603,7 @@
           <w:lang w:val="sq-AL" w:eastAsia="sq-AL"/>
         </w:rPr>
       </w:pPr>
-      <w:hyperlink w:anchor="_Toc242655083" w:history="1">
+      <w:hyperlink w:anchor="_Toc242658789" w:history="1">
         <w:r>
           <w:rPr>
             <w:rStyle w:val="Hyperlink"/>
@@ -3631,7 +3631,7 @@
             <w:noProof/>
             <w:webHidden/>
           </w:rPr>
-          <w:instrText xml:space="preserve"> PAGEREF _Toc242655083 \h </w:instrText>
+          <w:instrText xml:space="preserve"> PAGEREF _Toc242658789 \h </w:instrText>
         </w:r>
         <w:r>
           <w:rPr>
@@ -3675,7 +3675,7 @@
           <w:lang w:val="sq-AL" w:eastAsia="sq-AL"/>
         </w:rPr>
       </w:pPr>
-      <w:hyperlink w:anchor="_Toc242655084" w:history="1">
+      <w:hyperlink w:anchor="_Toc242658790" w:history="1">
         <w:r>
           <w:rPr>
             <w:rStyle w:val="Hyperlink"/>
@@ -3703,7 +3703,7 @@
             <w:noProof/>
             <w:webHidden/>
           </w:rPr>
-          <w:instrText xml:space="preserve"> PAGEREF _Toc242655084 \h </w:instrText>
+          <w:instrText xml:space="preserve"> PAGEREF _Toc242658790 \h </w:instrText>
         </w:r>
         <w:r>
           <w:rPr>
@@ -3747,7 +3747,7 @@
           <w:lang w:val="sq-AL" w:eastAsia="sq-AL"/>
         </w:rPr>
       </w:pPr>
-      <w:hyperlink w:anchor="_Toc242655085" w:history="1">
+      <w:hyperlink w:anchor="_Toc242658791" w:history="1">
         <w:r>
           <w:rPr>
             <w:rStyle w:val="Hyperlink"/>
@@ -3775,7 +3775,7 @@
             <w:noProof/>
             <w:webHidden/>
           </w:rPr>
-          <w:instrText xml:space="preserve"> PAGEREF _Toc242655085 \h </w:instrText>
+          <w:instrText xml:space="preserve"> PAGEREF _Toc242658791 \h </w:instrText>
         </w:r>
         <w:r>
           <w:rPr>
@@ -3819,7 +3819,7 @@
           <w:lang w:val="sq-AL" w:eastAsia="sq-AL"/>
         </w:rPr>
       </w:pPr>
-      <w:hyperlink w:anchor="_Toc242655086" w:history="1">
+      <w:hyperlink w:anchor="_Toc242658792" w:history="1">
         <w:r>
           <w:rPr>
             <w:rStyle w:val="Hyperlink"/>
@@ -3847,7 +3847,7 @@
             <w:noProof/>
             <w:webHidden/>
           </w:rPr>
-          <w:instrText xml:space="preserve"> PAGEREF _Toc242655086 \h </w:instrText>
+          <w:instrText xml:space="preserve"> PAGEREF _Toc242658792 \h </w:instrText>
         </w:r>
         <w:r>
           <w:rPr>
@@ -3891,7 +3891,7 @@
           <w:lang w:val="sq-AL" w:eastAsia="sq-AL"/>
         </w:rPr>
       </w:pPr>
-      <w:hyperlink w:anchor="_Toc242655087" w:history="1">
+      <w:hyperlink w:anchor="_Toc242658793" w:history="1">
         <w:r>
           <w:rPr>
             <w:rStyle w:val="Hyperlink"/>
@@ -3919,7 +3919,7 @@
             <w:noProof/>
             <w:webHidden/>
           </w:rPr>
-          <w:instrText xml:space="preserve"> PAGEREF _Toc242655087 \h </w:instrText>
+          <w:instrText xml:space="preserve"> PAGEREF _Toc242658793 \h </w:instrText>
         </w:r>
         <w:r>
           <w:rPr>
@@ -3963,7 +3963,7 @@
           <w:lang w:val="sq-AL" w:eastAsia="sq-AL"/>
         </w:rPr>
       </w:pPr>
-      <w:hyperlink w:anchor="_Toc242655088" w:history="1">
+      <w:hyperlink w:anchor="_Toc242658794" w:history="1">
         <w:r>
           <w:rPr>
             <w:rStyle w:val="Hyperlink"/>
@@ -3991,7 +3991,7 @@
             <w:noProof/>
             <w:webHidden/>
           </w:rPr>
-          <w:instrText xml:space="preserve"> PAGEREF _Toc242655088 \h </w:instrText>
+          <w:instrText xml:space="preserve"> PAGEREF _Toc242658794 \h </w:instrText>
         </w:r>
         <w:r>
           <w:rPr>
@@ -4035,7 +4035,7 @@
           <w:lang w:val="sq-AL" w:eastAsia="sq-AL"/>
         </w:rPr>
       </w:pPr>
-      <w:hyperlink w:anchor="_Toc242655089" w:history="1">
+      <w:hyperlink w:anchor="_Toc242658795" w:history="1">
         <w:r>
           <w:rPr>
             <w:rStyle w:val="Hyperlink"/>
@@ -4063,7 +4063,7 @@
             <w:noProof/>
             <w:webHidden/>
           </w:rPr>
-          <w:instrText xml:space="preserve"> PAGEREF _Toc242655089 \h </w:instrText>
+          <w:instrText xml:space="preserve"> PAGEREF _Toc242658795 \h </w:instrText>
         </w:r>
         <w:r>
           <w:rPr>
@@ -4107,7 +4107,7 @@
           <w:lang w:val="sq-AL" w:eastAsia="sq-AL"/>
         </w:rPr>
       </w:pPr>
-      <w:hyperlink w:anchor="_Toc242655090" w:history="1">
+      <w:hyperlink w:anchor="_Toc242658796" w:history="1">
         <w:r>
           <w:rPr>
             <w:rStyle w:val="Hyperlink"/>
@@ -4135,7 +4135,7 @@
             <w:noProof/>
             <w:webHidden/>
           </w:rPr>
-          <w:instrText xml:space="preserve"> PAGEREF _Toc242655090 \h </w:instrText>
+          <w:instrText xml:space="preserve"> PAGEREF _Toc242658796 \h </w:instrText>
         </w:r>
         <w:r>
           <w:rPr>
@@ -4179,7 +4179,7 @@
           <w:lang w:val="sq-AL" w:eastAsia="sq-AL"/>
         </w:rPr>
       </w:pPr>
-      <w:hyperlink w:anchor="_Toc242655091" w:history="1">
+      <w:hyperlink w:anchor="_Toc242658797" w:history="1">
         <w:r>
           <w:rPr>
             <w:rStyle w:val="Hyperlink"/>
@@ -4207,7 +4207,7 @@
             <w:noProof/>
             <w:webHidden/>
           </w:rPr>
-          <w:instrText xml:space="preserve"> PAGEREF _Toc242655091 \h </w:instrText>
+          <w:instrText xml:space="preserve"> PAGEREF _Toc242658797 \h </w:instrText>
         </w:r>
         <w:r>
           <w:rPr>
@@ -4251,7 +4251,7 @@
           <w:lang w:val="sq-AL" w:eastAsia="sq-AL"/>
         </w:rPr>
       </w:pPr>
-      <w:hyperlink w:anchor="_Toc242655092" w:history="1">
+      <w:hyperlink w:anchor="_Toc242658798" w:history="1">
         <w:r>
           <w:rPr>
             <w:rStyle w:val="Hyperlink"/>
@@ -4279,7 +4279,7 @@
             <w:noProof/>
             <w:webHidden/>
           </w:rPr>
-          <w:instrText xml:space="preserve"> PAGEREF _Toc242655092 \h </w:instrText>
+          <w:instrText xml:space="preserve"> PAGEREF _Toc242658798 \h </w:instrText>
         </w:r>
         <w:r>
           <w:rPr>
@@ -4323,7 +4323,7 @@
           <w:lang w:val="sq-AL" w:eastAsia="sq-AL"/>
         </w:rPr>
       </w:pPr>
-      <w:hyperlink w:anchor="_Toc242655093" w:history="1">
+      <w:hyperlink w:anchor="_Toc242658799" w:history="1">
         <w:r>
           <w:rPr>
             <w:rStyle w:val="Hyperlink"/>
@@ -4351,7 +4351,7 @@
             <w:noProof/>
             <w:webHidden/>
           </w:rPr>
-          <w:instrText xml:space="preserve"> PAGEREF _Toc242655093 \h </w:instrText>
+          <w:instrText xml:space="preserve"> PAGEREF _Toc242658799 \h </w:instrText>
         </w:r>
         <w:r>
           <w:rPr>
@@ -4395,7 +4395,7 @@
           <w:lang w:val="sq-AL" w:eastAsia="sq-AL"/>
         </w:rPr>
       </w:pPr>
-      <w:hyperlink w:anchor="_Toc242655094" w:history="1">
+      <w:hyperlink w:anchor="_Toc242658800" w:history="1">
         <w:r>
           <w:rPr>
             <w:rStyle w:val="Hyperlink"/>
@@ -4423,7 +4423,7 @@
             <w:noProof/>
             <w:webHidden/>
           </w:rPr>
-          <w:instrText xml:space="preserve"> PAGEREF _Toc242655094 \h </w:instrText>
+          <w:instrText xml:space="preserve"> PAGEREF _Toc242658800 \h </w:instrText>
         </w:r>
         <w:r>
           <w:rPr>
@@ -4467,7 +4467,7 @@
           <w:lang w:val="sq-AL" w:eastAsia="sq-AL"/>
         </w:rPr>
       </w:pPr>
-      <w:hyperlink w:anchor="_Toc242655095" w:history="1">
+      <w:hyperlink w:anchor="_Toc242658801" w:history="1">
         <w:r>
           <w:rPr>
             <w:rStyle w:val="Hyperlink"/>
@@ -4495,7 +4495,7 @@
             <w:noProof/>
             <w:webHidden/>
           </w:rPr>
-          <w:instrText xml:space="preserve"> PAGEREF _Toc242655095 \h </w:instrText>
+          <w:instrText xml:space="preserve"> PAGEREF _Toc242658801 \h </w:instrText>
         </w:r>
         <w:r>
           <w:rPr>
@@ -4539,7 +4539,7 @@
           <w:lang w:val="sq-AL" w:eastAsia="sq-AL"/>
         </w:rPr>
       </w:pPr>
-      <w:hyperlink w:anchor="_Toc242655096" w:history="1">
+      <w:hyperlink w:anchor="_Toc242658802" w:history="1">
         <w:r>
           <w:rPr>
             <w:rStyle w:val="Hyperlink"/>
@@ -4567,7 +4567,7 @@
             <w:noProof/>
             <w:webHidden/>
           </w:rPr>
-          <w:instrText xml:space="preserve"> PAGEREF _Toc242655096 \h </w:instrText>
+          <w:instrText xml:space="preserve"> PAGEREF _Toc242658802 \h </w:instrText>
         </w:r>
         <w:r>
           <w:rPr>
@@ -4611,7 +4611,7 @@
           <w:lang w:val="sq-AL" w:eastAsia="sq-AL"/>
         </w:rPr>
       </w:pPr>
-      <w:hyperlink w:anchor="_Toc242655097" w:history="1">
+      <w:hyperlink w:anchor="_Toc242658803" w:history="1">
         <w:r>
           <w:rPr>
             <w:rStyle w:val="Hyperlink"/>
@@ -4639,7 +4639,7 @@
             <w:noProof/>
             <w:webHidden/>
           </w:rPr>
-          <w:instrText xml:space="preserve"> PAGEREF _Toc242655097 \h </w:instrText>
+          <w:instrText xml:space="preserve"> PAGEREF _Toc242658803 \h </w:instrText>
         </w:r>
         <w:r>
           <w:rPr>
@@ -4683,7 +4683,7 @@
           <w:lang w:val="sq-AL" w:eastAsia="sq-AL"/>
         </w:rPr>
       </w:pPr>
-      <w:hyperlink w:anchor="_Toc242655098" w:history="1">
+      <w:hyperlink w:anchor="_Toc242658804" w:history="1">
         <w:r>
           <w:rPr>
             <w:rStyle w:val="Hyperlink"/>
@@ -4711,7 +4711,7 @@
             <w:noProof/>
             <w:webHidden/>
           </w:rPr>
-          <w:instrText xml:space="preserve"> PAGEREF _Toc242655098 \h </w:instrText>
+          <w:instrText xml:space="preserve"> PAGEREF _Toc242658804 \h </w:instrText>
         </w:r>
         <w:r>
           <w:rPr>
@@ -4755,7 +4755,7 @@
           <w:lang w:val="sq-AL" w:eastAsia="sq-AL"/>
         </w:rPr>
       </w:pPr>
-      <w:hyperlink w:anchor="_Toc242655099" w:history="1">
+      <w:hyperlink w:anchor="_Toc242658805" w:history="1">
         <w:r>
           <w:rPr>
             <w:rStyle w:val="Hyperlink"/>
@@ -4783,7 +4783,7 @@
             <w:noProof/>
             <w:webHidden/>
           </w:rPr>
-          <w:instrText xml:space="preserve"> PAGEREF _Toc242655099 \h </w:instrText>
+          <w:instrText xml:space="preserve"> PAGEREF _Toc242658805 \h </w:instrText>
         </w:r>
         <w:r>
           <w:rPr>
@@ -4827,7 +4827,7 @@
           <w:lang w:val="sq-AL" w:eastAsia="sq-AL"/>
         </w:rPr>
       </w:pPr>
-      <w:hyperlink w:anchor="_Toc242655100" w:history="1">
+      <w:hyperlink w:anchor="_Toc242658806" w:history="1">
         <w:r>
           <w:rPr>
             <w:rStyle w:val="Hyperlink"/>
@@ -4855,7 +4855,7 @@
             <w:noProof/>
             <w:webHidden/>
           </w:rPr>
-          <w:instrText xml:space="preserve"> PAGEREF _Toc242655100 \h </w:instrText>
+          <w:instrText xml:space="preserve"> PAGEREF _Toc242658806 \h </w:instrText>
         </w:r>
         <w:r>
           <w:rPr>
@@ -4896,7 +4896,7 @@
         <w:pStyle w:val="Heading1"/>
         <w:pageBreakBefore/>
       </w:pPr>
-      <w:bookmarkStart w:id="0" w:name="_Toc242655042"/>
+      <w:bookmarkStart w:id="0" w:name="_Toc242658748"/>
       <w:r>
         <w:lastRenderedPageBreak/>
         <w:t>Lista e figurave</w:t>
@@ -5012,7 +5012,7 @@
       <w:pPr>
         <w:pStyle w:val="Heading1"/>
       </w:pPr>
-      <w:bookmarkStart w:id="1" w:name="_Toc242655043"/>
+      <w:bookmarkStart w:id="1" w:name="_Toc242658749"/>
       <w:r>
         <w:t>Lista e tabelave</w:t>
       </w:r>
@@ -5374,7 +5374,7 @@
         <w:pStyle w:val="Heading1"/>
         <w:pageBreakBefore/>
       </w:pPr>
-      <w:bookmarkStart w:id="2" w:name="_Toc242655044"/>
+      <w:bookmarkStart w:id="2" w:name="_Toc242658750"/>
       <w:r>
         <w:lastRenderedPageBreak/>
         <w:t>Fjalori i termave</w:t>
@@ -5784,7 +5784,7 @@
         <w:pStyle w:val="Heading1"/>
         <w:pageBreakBefore/>
       </w:pPr>
-      <w:bookmarkStart w:id="3" w:name="_Toc242655045"/>
+      <w:bookmarkStart w:id="3" w:name="_Toc242658751"/>
       <w:r>
         <w:lastRenderedPageBreak/>
         <w:t>1 Hyrje</w:t>
@@ -5890,7 +5890,7 @@
         <w:pStyle w:val="Heading1"/>
         <w:pageBreakBefore/>
       </w:pPr>
-      <w:bookmarkStart w:id="4" w:name="_Toc242655046"/>
+      <w:bookmarkStart w:id="4" w:name="_Toc242658752"/>
       <w:r>
         <w:lastRenderedPageBreak/>
         <w:t>2 Shqyrtimi i literaturës (historiku)</w:t>
@@ -5915,7 +5915,7 @@
       <w:pPr>
         <w:pStyle w:val="Heading2"/>
       </w:pPr>
-      <w:bookmarkStart w:id="5" w:name="_Toc242655047"/>
+      <w:bookmarkStart w:id="5" w:name="_Toc242658753"/>
       <w:r>
         <w:t>2.1 Code smells dhe ndikimi i ty</w:t>
       </w:r>
@@ -5975,10 +5975,10 @@
         <w:ind w:firstLine="360"/>
       </w:pPr>
       <w:r>
-        <w:t>Tufano et al. (2015) ndoqën historikun e 200 projekteve me burim të hapur për të parë kur lindin erërat. Shumica e tyre futen që kur krijohet klasa ose metoda, jo gradualisht gjatë evolucionit, dhe rreth katër të pestat mbij</w:t>
-      </w:r>
-      <w:r>
-        <w:t>etojnë në sistem. Nëse një erë lind bashkë me kodin, mjeti që e gjen ka më shumë vlerë kur vepron herët, para se kodi të rritet mbi të.</w:t>
+        <w:t>Tufano et al. (2015) ndoqën historikun e 200 projekteve me burim të hapur për të parë kur lindin erërat. Shumica e tyre futen që kur krijohet klasa ose metoda, jo gradualisht gjatë evolucionit. Nëse një erë lind bashkë me ko</w:t>
+      </w:r>
+      <w:r>
+        <w:t>din, mjeti që e gjen ka më shumë vlerë kur vepron herët, para se kodi të rritet mbi të.</w:t>
       </w:r>
     </w:p>
     <w:p>
@@ -5986,20 +5986,17 @@
         <w:ind w:firstLine="360"/>
       </w:pPr>
       <w:r>
-        <w:t>Mbetet pyetja nëse zhvilluesit i shohin erërat si probleme reale. Yamashita &amp; Moonen (2013) anketuan 85 zhvillues profes</w:t>
-      </w:r>
-      <w:r>
-        <w:t xml:space="preserve">ionistë për njohjen, interesin dhe rëndësinë që u japin erërave, duke nisur nga vërejtja se vlera e tyre si koncept i cilësisë mbetej e diskutueshme nga pikëpamja e zhvilluesit. Pyetja ka rëndësi për çdo detektor: ai vlen aq sa zhvilluesi e njeh gjetjen e </w:t>
-      </w:r>
-      <w:r>
-        <w:t>tij si problem.</w:t>
+        <w:t xml:space="preserve">Mbetet pyetja nëse zhvilluesit i shohin erërat si probleme reale. Yamashita &amp; Moonen (2013) anketuan 85 zhvillues profesionistë për njohjen, interesin dhe rëndësinë që </w:t>
+      </w:r>
+      <w:r>
+        <w:t>u japin erërave, duke nisur nga vërejtja se vlera e tyre si koncept i cilësisë mbetej e diskutueshme nga pikëpamja e zhvilluesit. Pyetja ka rëndësi për çdo detektor: ai vlen aq sa zhvilluesi e njeh gjetjen e tij si problem.</w:t>
       </w:r>
     </w:p>
     <w:p>
       <w:pPr>
         <w:pStyle w:val="Heading2"/>
       </w:pPr>
-      <w:bookmarkStart w:id="6" w:name="_Toc242655048"/>
+      <w:bookmarkStart w:id="6" w:name="_Toc242658754"/>
       <w:r>
         <w:t>2.2 Matja e cilësisë së dizajnit</w:t>
       </w:r>
@@ -6010,13 +6007,10 @@
         <w:ind w:firstLine="360"/>
       </w:pPr>
       <w:r>
-        <w:t>Matja sasiore e sistemeve me objekte u bë e mundur me suitën e Chidamber &amp; Kemerer (1994), gjashtë metrika për klasën: WMC, DIT, NOC, CBO, RFC dhe LCOM. WMC e peshon klasën me kompleksitetin e metodave të sa</w:t>
-      </w:r>
-      <w:r>
-        <w:t>j, DIT dhe NOC e vendosin në hierarkinë e trashëgimisë, CBO dhe RFC matin sa varet nga klasat e tjera, dhe LCOM mat sa pak i ndajnë metodat fushat e saj. Kompleksiteti i një metode matet zakonisht me numrin ciklomatik të McCabe (1976), pra me numrin e shti</w:t>
-      </w:r>
-      <w:r>
-        <w:t>gjeve të pavarura në grafin e saj të kontrollit.</w:t>
+        <w:t>Matja sasiore e sistemeve me objekte u bë e mundur me suitën e Chidamber &amp; Kemerer (1994), gjashtë metrika për klasën: WMC, DIT, NOC, CBO, RFC dhe LCOM. WMC e peshon klasën me kompleksitetin e metodave të saj, DIT dhe NOC e vendosin në hierarkinë e trashë</w:t>
+      </w:r>
+      <w:r>
+        <w:t>gimisë, CBO dhe RFC matin sa varet nga klasat e tjera, dhe LCOM mat sa pak i ndajnë metodat fushat e saj. Kompleksiteti i një metode matet zakonisht me numrin ciklomatik të McCabe (1976), pra me numrin e shtigjeve të pavarura në grafin e saj të kontrollit.</w:t>
       </w:r>
     </w:p>
     <w:p>
@@ -6024,10 +6018,10 @@
         <w:ind w:firstLine="360"/>
       </w:pPr>
       <w:r>
-        <w:t>LCOM-i origjinal rritet me katrorin e numrit të metodave dhe nuk krahason dot klasa me madhësi të ndryshme. Henderson-Sellers (1996) propozoi një variant të normalizuar mes 0 dhe 1, ndërsa Bieman &amp; Kang (199</w:t>
-      </w:r>
-      <w:r>
-        <w:t>5) prezantuan TCC-në, që e mat kohezionin me pjesën e çifteve të metodave që ndajnë të paktën një fushë. Mbi këto metrika ndërtohet pothuajse çdo detektim sasior i mëvonshëm.</w:t>
+        <w:t>LCOM-i origjinal rritet me katrorin e numrit të metodave dhe nuk krahason dot klasa me madhësi të ndryshme. Henderson-Sellers (1996) propozoi një variant të normalizuar mes 0 dhe 1, ndërsa Bieman &amp; Kang (1995) prezantuan TCC-në, që e mat kohezionin me pje</w:t>
+      </w:r>
+      <w:r>
+        <w:t>sën e çifteve të metodave që ndajnë të paktën një fushë. Mbi këto metrika ndërtohet pothuajse çdo detektim sasior i mëvonshëm.</w:t>
       </w:r>
     </w:p>
     <w:p>
@@ -6035,17 +6029,17 @@
         <w:ind w:firstLine="360"/>
       </w:pPr>
       <w:r>
-        <w:t>Lanza &amp; Marinescu (2006) i organizojnë metrikat në tri përmasa: madhësinë dhe kom</w:t>
-      </w:r>
-      <w:r>
-        <w:t xml:space="preserve">pleksitetin, lidhjen me klasat e tjera, dhe trashëgiminë. Ata shtuan edhe metrika të reja, si ATFD, LAA dhe FDP, që nuk matin madhësinë e një entiteti por marrëdhënien e tij me të </w:t>
+        <w:t>Lanza &amp; Marinescu (2006) i organizojnë metrikat në tri përmasa: madhësinë dhe kompleksitetin, lidhjen me klasat e tjera, dhe tras</w:t>
+      </w:r>
+      <w:r>
+        <w:t xml:space="preserve">hëgiminë. Ata shtuan edhe metrika të reja, si ATFD, LAA dhe FDP, që nuk matin madhësinë e një entiteti por marrëdhënien e tij me të </w:t>
       </w:r>
       <w:r>
         <w:lastRenderedPageBreak/>
-        <w:t>dhënat e klasave të tjera. Këto janë metrikat që u duhen erërave të bashkëpu</w:t>
-      </w:r>
-      <w:r>
-        <w:t>nimit, si Feature Envy, të cilat nuk i kap dot asnjë metrikë madhësie.</w:t>
+        <w:t>dhënat e klasave të tjera. Këto janë metrikat që u duhen erërave të bashkëpunimit, si Feature Envy, të cilat nuk i kap dot a</w:t>
+      </w:r>
+      <w:r>
+        <w:t>snjë metrikë madhësie.</w:t>
       </w:r>
     </w:p>
     <w:p>
@@ -6053,22 +6047,19 @@
         <w:ind w:firstLine="360"/>
       </w:pPr>
       <w:r>
-        <w:t>Sharma &amp; Spinellis (2018), në një shqyrtim sistematik të fushës, vërejnë se përkufizimet e erërave në literaturë nuk janë konsistente, dhe as rezultatet e metodave të detektimit, pranda</w:t>
-      </w:r>
-      <w:r>
-        <w:t>j mjetet krahasohen me vështirësi. Ata i ndajnë metodat e detektimit në disa familje, ndër të cilat ato që mbështeten te metrikat, te rregullat, te historiku i ndryshimeve dhe te mësimi i makinës; nënkapitujt që vijnë ndjekin këtë ndarje.</w:t>
+        <w:t xml:space="preserve">Sharma &amp; Spinellis (2018), në një shqyrtim sistematik të fushës, vërejnë se përkufizimet e erërave në literaturë nuk janë konsistente, dhe as rezultatet e metodave të detektimit, prandaj mjetet krahasohen me vështirësi. Ata i ndajnë </w:t>
+      </w:r>
+      <w:r>
+        <w:t>metodat e detektimit në disa familje, ndër të cilat ato që mbështeten te metrikat, te rregullat, te historiku i ndryshimeve dhe te mësimi i makinës; nënkapitujt që vijnë ndjekin këtë ndarje.</w:t>
       </w:r>
     </w:p>
     <w:p>
       <w:pPr>
         <w:pStyle w:val="Heading2"/>
       </w:pPr>
-      <w:bookmarkStart w:id="7" w:name="_Toc242655049"/>
-      <w:r>
-        <w:t xml:space="preserve">2.3 Detektimi me </w:t>
-      </w:r>
-      <w:r>
-        <w:t>rregulla mbi metrika</w:t>
+      <w:bookmarkStart w:id="7" w:name="_Toc242658755"/>
+      <w:r>
+        <w:t>2.3 Detektimi me rregulla mbi metrika</w:t>
       </w:r>
       <w:bookmarkEnd w:id="7"/>
     </w:p>
@@ -6077,13 +6068,13 @@
         <w:ind w:firstLine="360"/>
       </w:pPr>
       <w:r>
-        <w:t>Marinescu (2004) prezantoi strategjitë e detektimit: rregulla që kombinojnë disa metrika me pragje, në vend që të mbështeten te një metrikë e vetme. Një strategji filtron fillimisht entitetet që e kalojnë secilin prag dhe pastaj i komb</w:t>
-      </w:r>
-      <w:r>
-        <w:t>inon filtrat me «dhe» dhe «ose», ndaj arsyeja e çdo detektimi mbetet e lexueshme si kusht. Lanza &amp; Marinescu (2006) e zgjeruan idenë në një katalog të plotë, ku çdo erë shprehet si kombinim kushtesh mbi metrika, me pragje të nxjerra statistikisht nga dyzet</w:t>
-      </w:r>
-      <w:r>
-        <w:t xml:space="preserve"> e pesë sisteme Java.</w:t>
+        <w:t xml:space="preserve">Marinescu (2004) prezantoi </w:t>
+      </w:r>
+      <w:r>
+        <w:t xml:space="preserve">strategjitë e detektimit: rregulla që kombinojnë disa metrika me pragje, në vend që të mbështeten te një metrikë e vetme. Një strategji filtron fillimisht entitetet që e kalojnë secilin prag dhe pastaj i kombinon filtrat me «dhe» dhe «ose», ndaj arsyeja e </w:t>
+      </w:r>
+      <w:r>
+        <w:t>çdo detektimi mbetet e lexueshme si kusht. Lanza &amp; Marinescu (2006) e zgjeruan idenë në një katalog të plotë, ku çdo erë shprehet si kombinim kushtesh mbi metrika, me pragje të nxjerra statistikisht nga dyzet e pesë sisteme Java.</w:t>
       </w:r>
     </w:p>
     <w:p>
@@ -6091,10 +6082,13 @@
         <w:ind w:firstLine="360"/>
       </w:pPr>
       <w:r>
-        <w:t>Pragjet e tyre janë dy llojesh. Ato statistikore, si «i lartë» dhe «shumë i lartë», nxirren nga mesatarja dhe devijimi standard i metrikës në korpusin e tyre. Ato me kuptim të zakonshëm, si «pak» ose «një e treta», vijnë nga mënyra si</w:t>
-      </w:r>
-      <w:r>
-        <w:t xml:space="preserve"> njerëzit i përdorin këto fjalë. Të parat varen pra nga korpusi ku u matën, dhe vlefshmëria e tyre në një korpus tjetër mbetet pyetje e hapur.</w:t>
+        <w:t>Pragjet e tyre janë dy llo</w:t>
+      </w:r>
+      <w:r>
+        <w:t xml:space="preserve">jesh. Ato statistikore, si «i lartë» dhe «shumë i lartë», nxirren nga mesatarja dhe devijimi standard i metrikës në korpusin e tyre. Ato me kuptim të zakonshëm, si «pak» ose «një e treta», vijnë nga mënyra si njerëzit i përdorin këto fjalë. Të parat varen </w:t>
+      </w:r>
+      <w:r>
+        <w:t>pra nga korpusi ku u matën, dhe vlefshmëria e tyre në një korpus tjetër mbetet pyetje e hapur.</w:t>
       </w:r>
     </w:p>
     <w:p>
@@ -6102,13 +6096,10 @@
         <w:ind w:firstLine="360"/>
       </w:pPr>
       <w:r>
-        <w:t>Moha et al. (2010) propozuan DECOR-in, një metodë ku erërat përshkruhen në një gjuhë specifikimi dhe detektorët g</w:t>
-      </w:r>
-      <w:r>
-        <w:t xml:space="preserve">jenerohen nga përshkrimet; zbatimi i saj u vlerësua me precizion dhe recall mbi sisteme me burim të hapur. Avantazhi i qasjeve me rregulla është se arsyeja e çdo detektimi lexohet qartë. Dobësia është ndjeshmëria ndaj pragjeve, që kalibrohen me vështirësi </w:t>
-      </w:r>
-      <w:r>
-        <w:t>jashtë korpusit ku u nxorën.</w:t>
+        <w:t>Moha et al. (2010) propozuan DECOR-in, një metodë ku erërat përshkruhen në një gjuhë specifikimi dhe detektorët gjenerohen nga përshkrimet; zbatimi i saj u vlerë</w:t>
+      </w:r>
+      <w:r>
+        <w:t>sua me precizion dhe recall mbi sisteme me burim të hapur. Avantazhi i qasjeve me rregulla është se arsyeja e çdo detektimi lexohet qartë. Dobësia është ndjeshmëria ndaj pragjeve, që kalibrohen me vështirësi jashtë korpusit ku u nxorën.</w:t>
       </w:r>
     </w:p>
     <w:p>
@@ -6116,10 +6107,13 @@
         <w:ind w:firstLine="360"/>
       </w:pPr>
       <w:r>
-        <w:t>Palomba et al. (2015) i detektojnë erërat me HIST nga historiku i ndryshimeve, jo nga një pamje e vetme e kodit. Për pesë erëra, ndër to Blob dhe Feature Envy, ata treguan se historiku kap raste që analiza e kodit nuk i sheh, p</w:t>
-      </w:r>
-      <w:r>
-        <w:t>or qasja kërkon historikun e plotë të depos, që jo çdo projekt e ka dhe jo çdo dataset e ruan.</w:t>
+        <w:t>Palomba et al. (201</w:t>
+      </w:r>
+      <w:r>
+        <w:t xml:space="preserve">5) i detektojnë erërat me HIST nga historiku i ndryshimeve, jo nga një pamje e vetme e kodit. Për pesë erëra, ndër to Blob dhe Feature Envy, ata treguan se historiku kap raste që analiza e kodit nuk i sheh, por qasja kërkon historikun e plotë të depos, që </w:t>
+      </w:r>
+      <w:r>
+        <w:t>jo çdo projekt e ka dhe jo çdo dataset e ruan.</w:t>
       </w:r>
     </w:p>
     <w:p>
@@ -6128,17 +6122,17 @@
       </w:pPr>
       <w:r>
         <w:lastRenderedPageBreak/>
-        <w:t>Mjetet që përdoren në praktikë, si PMD (PMD Team, 2026), zbatojnë kryesisht këtë familje: rregulla me pragje të fiksuara, që zhvilluesi mund t'i ndryshojë por rr</w:t>
-      </w:r>
-      <w:r>
-        <w:t>allë i ndryshon. Rezultati i tyre mbetet pra aq i mirë sa janë pragjet e parazgjedhura për kodin ku zbatohen.</w:t>
+        <w:t xml:space="preserve">Mjetet që përdoren në praktikë, si PMD (PMD Team, 2026), zbatojnë kryesisht këtë familje: rregulla me pragje të fiksuara, që zhvilluesi mund t'i ndryshojë por rrallë i ndryshon. Rezultati i tyre mbetet pra aq </w:t>
+      </w:r>
+      <w:r>
+        <w:t>i mirë sa janë pragjet e parazgjedhura për kodin ku zbatohen.</w:t>
       </w:r>
     </w:p>
     <w:p>
       <w:pPr>
         <w:pStyle w:val="Heading2"/>
       </w:pPr>
-      <w:bookmarkStart w:id="8" w:name="_Toc242655050"/>
+      <w:bookmarkStart w:id="8" w:name="_Toc242658756"/>
       <w:r>
         <w:t>2.4 Detektimi me mësim të makinës</w:t>
       </w:r>
@@ -6149,13 +6143,13 @@
         <w:ind w:firstLine="360"/>
       </w:pPr>
       <w:r>
-        <w:t>Ideja e mësimit të makinës është që pragjet t'i mësojë modeli nga shembuj të etiketuar, në vend që t'i vendosë n</w:t>
-      </w:r>
-      <w:r>
-        <w:t>jeriu. Arcelli Fontana et al. (2016) kryen një nga eksperimentet më të mëdha të këtij lloji: gjashtëmbëdhjetë algoritme mbi katër erëra (Data Class, Large Class, Feature Envy dhe Long Method), me 1986 raste të validuara me dorë nga 74 sisteme. Ata raportua</w:t>
-      </w:r>
-      <w:r>
-        <w:t>n performancë të lartë për shumicën e algoritmeve në validimin e kryqëzuar, me J48 dhe Random Forest si më të mirat dhe makinat me vektorë mbështetës si më të dobëtat. Studimi u bë pikë referimi për shumë punime pasuese.</w:t>
+        <w:t>Ideja e mësimit të makinës është që pragjet t'i mësojë modeli nga shembuj të etiketuar, në vend që t'i vendosë njeriu. Arcelli Fontana et al. (2016) kryen një n</w:t>
+      </w:r>
+      <w:r>
+        <w:t>ga eksperimentet më të mëdha të këtij lloji: gjashtëmbëdhjetë algoritme mbi katër erëra (Data Class, Large Class, Feature Envy dhe Long Method), me 1986 raste të validuara me dorë nga 74 sisteme. Ata raportuan performancë të lartë për shumicën e algoritmev</w:t>
+      </w:r>
+      <w:r>
+        <w:t>e në validimin e kryqëzuar, me J48 dhe Random Forest si më të mirat dhe makinat me vektorë mbështetës si më të dobëtat. Studimi u bë pikë referimi për shumë punime pasuese.</w:t>
       </w:r>
     </w:p>
     <w:p>
@@ -6163,13 +6157,10 @@
         <w:ind w:firstLine="360"/>
       </w:pPr>
       <w:r>
-        <w:t>Di Nucci et al. (2018) vunë re megj</w:t>
-      </w:r>
-      <w:r>
-        <w:t>ithatë se aty çdo dataset kishte raste të një lloji të vetëm ere. Kur e përsëritën eksperimentin me dataset-e ku bashkëjetojnë disa erëra, performanca ra ndjeshëm. Pra shifra e raportuar varet nga mënyra si ndërtohet bashkësia e vlerësimit, jo vetëm nga al</w:t>
-      </w:r>
-      <w:r>
-        <w:t>goritmi.</w:t>
+        <w:t>Di Nucci et al. (2018) vunë re megjithatë se aty çdo dataset kishte raste të një ll</w:t>
+      </w:r>
+      <w:r>
+        <w:t>oji të vetëm ere. Kur e përsëritën eksperimentin me dataset-e ku bashkëjetojnë disa erëra, performanca ra ndjeshëm. Pra shifra e raportuar varet nga mënyra si ndërtohet bashkësia e vlerësimit, jo vetëm nga algoritmi.</w:t>
       </w:r>
     </w:p>
     <w:p>
@@ -6177,10 +6168,13 @@
         <w:ind w:firstLine="360"/>
       </w:pPr>
       <w:r>
-        <w:t xml:space="preserve">E njëjta arsye qëndron pas njërës nga zgjedhjet kryesore të këtij punimi: trajnimi dhe testimi ndahen sipas depos, jo rastësisht sipas rreshtave. Mostrat e një depoje kanë të njëjtët autorë, të njëjtat konvencione e shpesh kod të kopjuar, dhe një </w:t>
-      </w:r>
-      <w:r>
-        <w:t>ndarje e rastësishme i vendos në të dyja anët, duke i fryrë shifrat.</w:t>
+        <w:t>E njëjta arsye qëndron pas njërës nga z</w:t>
+      </w:r>
+      <w:r>
+        <w:t>gjedhjet kryesore të këtij punimi: trajnimi dhe testimi ndahen sipas depos, jo rastësisht sipas rreshtave. Mostrat e një depoje kanë të njëjtët autorë, të njëjtat konvencione e shpesh kod të kopjuar, dhe një ndarje e rastësishme i vendos në të dyja anët, d</w:t>
+      </w:r>
+      <w:r>
+        <w:t>uke i fryrë shifrat.</w:t>
       </w:r>
     </w:p>
     <w:p>
@@ -6188,13 +6182,10 @@
         <w:ind w:firstLine="360"/>
       </w:pPr>
       <w:r>
-        <w:t xml:space="preserve">Azeem et al. (2019), në një shqyrtim sistematik me meta-analizë, gjetën vetëm pesëmbëdhjetë studime që përdorin mësimin e makinës për këtë qëllim, nga mbi dy mijë punime </w:t>
-      </w:r>
-      <w:r>
-        <w:t>fillestare, dhe përfundojnë se fusha ka ende vend për përmirësim. Ata e vendosin mësimin e makinës si përgjigje ndaj tri kufizimeve të detektorëve me rregulla: subjektivitetit të zhvilluesve, pajtimit të ulët mes detektorëve të ndryshëm dhe vështirësisë pë</w:t>
-      </w:r>
-      <w:r>
-        <w:t>r të gjetur pragje të mira.</w:t>
+        <w:t xml:space="preserve">Azeem et al. (2019), në një shqyrtim sistematik me meta-analizë, gjetën vetëm pesëmbëdhjetë studime që përdorin mësimin e makinës për këtë qëllim, nga mbi dy mijë punime fillestare, dhe përfundojnë se fusha ka ende vend për </w:t>
+      </w:r>
+      <w:r>
+        <w:t>përmirësim. Ata e vendosin mësimin e makinës si përgjigje ndaj tri kufizimeve të detektorëve me rregulla: subjektivitetit të zhvilluesve, pajtimit të ulët mes detektorëve të ndryshëm dhe vështirësisë për të gjetur pragje të mira.</w:t>
       </w:r>
     </w:p>
     <w:p>
@@ -6202,14 +6193,17 @@
         <w:ind w:firstLine="360"/>
       </w:pPr>
       <w:r>
-        <w:t>Madeyski &amp; Lewowski (2023) trajnuan klasifikues mbi MLCQ-në, me metrikat e mjeteve të përgjithshme të analizës statike si veçori, dhe raportuan koeficientin e Matthews-</w:t>
+        <w:t>Madeyski &amp; Lewowski (2023)</w:t>
+      </w:r>
+      <w:r>
+        <w:t xml:space="preserve"> trajnuan klasifikues mbi MLCQ-në, me metrikat e mjeteve të përgjithshme të analizës statike si veçori, dhe raportuan koeficientin e Matthews-</w:t>
       </w:r>
       <w:r>
         <w:lastRenderedPageBreak/>
-        <w:t xml:space="preserve">it në vend të saktësisë. Punimi i tyre është krahasimi më i </w:t>
-      </w:r>
-      <w:r>
-        <w:t>afërt me këtë punim, sepse përdor të njëjtën të vërtetë bazë, dhe Kapitulli 6 i vë rezultatet përballë.</w:t>
+        <w:t>it në vend të saktësisë. Punimi i tyre është krahasimi më i afërt me këtë punim, sepse përdor të njëjtën të vërtet</w:t>
+      </w:r>
+      <w:r>
+        <w:t>ë bazë, dhe Kapitulli 6 i vë rezultatet përballë.</w:t>
       </w:r>
     </w:p>
     <w:p>
@@ -6217,17 +6211,17 @@
         <w:ind w:firstLine="360"/>
       </w:pPr>
       <w:r>
-        <w:t>Një kundërshtim i përsëritur ndaj modeleve është se nuk e shpjegojnë vendimin e tyre. Rëndësia e veçorive jep një përgjigje për tërë bashkësinë, por mën</w:t>
-      </w:r>
-      <w:r>
-        <w:t>yra si llogaritet ka rëndësi: Strobl et al. (2007) treguan se rëndësia e bazuar te papastërtia në pyjet e rastësishme anon nga veçoritë me shumë vlera të mundshme, dhe propozuan matje që e shmangin këtë anim.</w:t>
+        <w:t>Një kundërshtim i përsëritur ndaj modeleve është se nuk e shpjegojnë vendimin e tyre. Rëndësia e veçorive jep një përgjigje për tërë bashkësinë, por mënyra si llogaritet ka rëndësi: Strobl et al. (2007) tre</w:t>
+      </w:r>
+      <w:r>
+        <w:t>guan se rëndësia e bazuar te papastërtia në pyjet e rastësishme anon nga veçoritë me shumë vlera të mundshme, dhe propozuan matje që e shmangin këtë anim.</w:t>
       </w:r>
     </w:p>
     <w:p>
       <w:pPr>
         <w:pStyle w:val="Heading2"/>
       </w:pPr>
-      <w:bookmarkStart w:id="9" w:name="_Toc242655051"/>
+      <w:bookmarkStart w:id="9" w:name="_Toc242658757"/>
       <w:r>
         <w:t>2.5 E vërteta bazë dhe subjektiviteti</w:t>
       </w:r>
@@ -6238,13 +6232,13 @@
         <w:ind w:firstLine="360"/>
       </w:pPr>
       <w:r>
-        <w:t>Çdo vlerë</w:t>
-      </w:r>
-      <w:r>
-        <w:t>sim i detektimit ka nevojë për një të vërtetë bazë, dhe këtu del një problem themelor. Mäntylä &amp; Lassenius (2006), në një studim rasti në një kompani finlandeze produktesh softuerike, treguan se vlerësimi i zhvilluesve për praninë e një ere është subjektiv</w:t>
-      </w:r>
-      <w:r>
-        <w:t xml:space="preserve"> dhe se vlerësues të ndryshëm shpesh nuk pajtohen për të njëjtin modul.</w:t>
+        <w:t>Çdo vlerësim i detektimit ka nevojë për një të vërtetë bazë, dh</w:t>
+      </w:r>
+      <w:r>
+        <w:t xml:space="preserve">e këtu del një problem themelor. Mäntylä &amp; Lassenius (2006), në një studim rasti në një kompani finlandeze produktesh softuerike, treguan se vlerësimi i zhvilluesve për praninë e një ere është subjektiv dhe se vlerësues të ndryshëm shpesh nuk pajtohen për </w:t>
+      </w:r>
+      <w:r>
+        <w:t>të njëjtin modul.</w:t>
       </w:r>
     </w:p>
     <w:p>
@@ -6252,20 +6246,20 @@
         <w:ind w:firstLine="360"/>
       </w:pPr>
       <w:r>
-        <w:t xml:space="preserve">Madeyski &amp; Lewowski (2020) ndërtuan MLCQ-në, një bashkësi mostrash Java të etiketuara nga zhvillues profesionistë për katër erëra, me ashpërsi në shkallën </w:t>
-      </w:r>
-      <w:r>
-        <w:t>none/minor/major/critical. Mostrat vijnë nga projekte me burim të hapur të zgjedhura për rëndësi industriale, dhe për çdo rishikues publikohet edhe profili i përvojës së tij, kështu që çdo gjykim mund të lidhet me atë që e dha. Ky punim e përdor MLCQ-në si</w:t>
-      </w:r>
-      <w:r>
-        <w:t xml:space="preserve"> të vërtetë bazë, dhe mospajtimin mes rishikuesve e raporton si të dhënë, në vend që ta pastrojë si zhurmë.</w:t>
+        <w:t xml:space="preserve">Madeyski &amp; Lewowski (2020) ndërtuan MLCQ-në, një bashkësi mostrash Java të etiketuara nga zhvillues profesionistë për katër erëra, me ashpërsi në shkallën none/minor/major/critical. Mostrat vijnë nga projekte me burim të hapur të </w:t>
+      </w:r>
+      <w:r>
+        <w:t>zgjedhura për rëndësi industriale, dhe për çdo rishikues publikohet edhe profili i përvojës së tij, kështu që çdo gjykim mund të lidhet me atë që e dha. Ky punim e përdor MLCQ-në si të vërtetë bazë, dhe mospajtimin mes rishikuesve e raporton si të dhënë, n</w:t>
+      </w:r>
+      <w:r>
+        <w:t>ë vend që ta pastrojë si zhurmë.</w:t>
       </w:r>
     </w:p>
     <w:p>
       <w:pPr>
         <w:pStyle w:val="Heading2"/>
       </w:pPr>
-      <w:bookmarkStart w:id="10" w:name="_Toc242655052"/>
+      <w:bookmarkStart w:id="10" w:name="_Toc242658758"/>
       <w:r>
         <w:t>2.6 Refaktorimi i automatizuar</w:t>
       </w:r>
@@ -6276,10 +6270,10 @@
         <w:ind w:firstLine="360"/>
       </w:pPr>
       <w:r>
-        <w:t>Opdyke (1992), në tezën e doktoratës, e formalizoi refaktorimin me nocionin e parakushteve: një transformim është i s</w:t>
-      </w:r>
-      <w:r>
-        <w:t>igurt vetëm nëse disa kushte vërtetohen para se të aplikohet. Mbi këtë nocion mbështetet çdo motor refaktorimi që pretendon se e ruan sjelljen.</w:t>
+        <w:t>Opdyke (1992), në tezën e doktoratës, e formalizoi refaktorimin me nocionin e parakushteve: një transformim është i sigurt vetëm nëse disa kushte vërtetohen para se të aplikohet. Mbi këtë noci</w:t>
+      </w:r>
+      <w:r>
+        <w:t>on mbështetet çdo motor refaktorimi që pretendon se e ruan sjelljen.</w:t>
       </w:r>
     </w:p>
     <w:p>
@@ -6287,13 +6281,10 @@
         <w:ind w:firstLine="360"/>
       </w:pPr>
       <w:r>
-        <w:t>Mens &amp; Tourwé (2004), në shqyrtimin e tyre të fushës, e ndajnë procesin e refaktorimit në disa veprimtari: gjetj</w:t>
-      </w:r>
-      <w:r>
-        <w:t>a e vendit që duhet refaktoruar, zgjedhja e transformimit, garantimi që sjellja ruhet, aplikimi, vlerësimi i efektit mbi cilësinë, dhe ruajtja e përputhjes me artefaktet e tjera. Mjetet zakonisht mbulojnë vetëm aplikimin; ky punim synon të lidhë gjetjen, a</w:t>
-      </w:r>
-      <w:r>
-        <w:t>plikimin dhe matjen e efektit në një zinxhir të vetëm.</w:t>
+        <w:t>Mens &amp; Tourwé (2004), në shqyrtimin e tyre të fushës, e ndajnë procesin e refaktorimit në disa veprimtari: gjetja e vendit që duhet refaktoruar, zgjedhja e transformimit, garantimi që sje</w:t>
+      </w:r>
+      <w:r>
+        <w:t>llja ruhet, aplikimi, vlerësimi i efektit mbi cilësinë, dhe ruajtja e përputhjes me artefaktet e tjera. Mjetet zakonisht mbulojnë vetëm aplikimin; ky punim synon të lidhë gjetjen, aplikimin dhe matjen e efektit në një zinxhir të vetëm.</w:t>
       </w:r>
     </w:p>
     <w:p>
@@ -6302,10 +6293,10 @@
       </w:pPr>
       <w:r>
         <w:lastRenderedPageBreak/>
-        <w:t>Tsantalis &amp; Chatzigeorgiou (2009) propozuan një metodë për gjetjen e rasteve të Move Method si zgjidhje për Feature Envy. Algoritmi mat distancën mes entiteteve dhe klasave, propozon vetëm lëvizje që k</w:t>
-      </w:r>
-      <w:r>
-        <w:t>alojnë një bashkësi parakushtesh, dhe vendimin e fundit ia lë projektuesit.</w:t>
+        <w:t>Tsantalis &amp; Chatzige</w:t>
+      </w:r>
+      <w:r>
+        <w:t>orgiou (2009) propozuan një metodë për gjetjen e rasteve të Move Method si zgjidhje për Feature Envy. Algoritmi mat distancën mes entiteteve dhe klasave, propozon vetëm lëvizje që kalojnë një bashkësi parakushtesh, dhe vendimin e fundit ia lë projektuesit.</w:t>
       </w:r>
     </w:p>
     <w:p>
@@ -6313,10 +6304,10 @@
         <w:ind w:firstLine="360"/>
       </w:pPr>
       <w:r>
-        <w:t>Murphy-Hill et al. (2012), me të dhëna nga mbi trembëdhjetë mijë zhvillues, gjetën se refaktorimi shpesh përzihet me ndryshime të tjera dhe rrallë përmendet në mesazhet e commit-ev</w:t>
-      </w:r>
-      <w:r>
-        <w:t>e, prandaj matet me vështirësi nga historiku. Silva et al. (2016) i pyetën zhvilluesit pse refaktorojnë dhe gjetën se arsyet janë kryesisht praktike, të lidhura me një ndryshim konkret që duhet bërë.</w:t>
+        <w:t>Murphy-Hill et al. (2012), me të dhëna nga mbi tridhjetë e nëntë mijë zhvillues, gjetën se refaktorimi shpesh përzihet me ndryshime të tjera dhe rrallë përmendet në mesazhet e commit-eve, prandaj matet me vështirësi nga historiku. Silva et al. (2016) i py</w:t>
+      </w:r>
+      <w:r>
+        <w:t>etën zhvilluesit pse refaktorojnë dhe gjetën se arsyet janë kryesisht praktike, të lidhura me një ndryshim konkret që duhet bërë.</w:t>
       </w:r>
     </w:p>
     <w:p>
@@ -6324,20 +6315,20 @@
         <w:ind w:firstLine="360"/>
       </w:pPr>
       <w:r>
-        <w:t>Lidhja mes refaktorimit dhe erërave është më e dobët nga</w:t>
-      </w:r>
-      <w:r>
-        <w:t xml:space="preserve"> sa pritet. Bavota et al. (2015), duke ndjekur refaktorimet në historikun e sistemeve me burim të hapur, gjetën se vetëm 42% e refaktorimeve prekin entitete me erë, dhe vetëm 7% e tyre e heqin erën nga klasa. Refaktorimi që bëjnë zhvilluesit, pra, nuk ësht</w:t>
-      </w:r>
-      <w:r>
-        <w:t>ë në shumicën e rasteve ndreqje e një ere, dhe as ndreqja e një ere nuk është domosdoshmërisht e suksesshme; kjo e bën të nevojshme që çdo rishkrim automatik të matet pas aplikimit.</w:t>
+        <w:t>Lidhja mes refaktorimit dhe erërave është më e dobët nga sa pritet. Bavota et al. (2015), duke ndjekur refaktorimet në histori</w:t>
+      </w:r>
+      <w:r>
+        <w:t>kun e sistemeve me burim të hapur, gjetën se vetëm 42% e refaktorimeve prekin entitete me erë, dhe vetëm 7% e tyre e heqin erën nga klasa. Refaktorimi që bëjnë zhvilluesit, pra, nuk është në shumicën e rasteve ndreqje e një ere, dhe as ndreqja e një ere nu</w:t>
+      </w:r>
+      <w:r>
+        <w:t>k është domosdoshmërisht e suksesshme; kjo e bën të nevojshme që çdo rishkrim automatik të matet pas aplikimit.</w:t>
       </w:r>
     </w:p>
     <w:p>
       <w:pPr>
         <w:pStyle w:val="Heading2"/>
       </w:pPr>
-      <w:bookmarkStart w:id="11" w:name="_Toc242655053"/>
+      <w:bookmarkStart w:id="11" w:name="_Toc242658759"/>
       <w:r>
         <w:t>2.7 Boshllëku në literaturë</w:t>
       </w:r>
@@ -6348,13 +6339,13 @@
         <w:ind w:firstLine="360"/>
       </w:pPr>
       <w:r>
-        <w:t>Nga ky shqyrtim dalin tri vërejtje. Qasja me r</w:t>
-      </w:r>
-      <w:r>
-        <w:t>regulla dhe ajo me mësim makine rrallë vlerësohen mbi të njëjtën të vërtetë bazë dhe me të njëjtat metrika, kështu që krahasimi i drejtpërdrejtë mungon. Jo çdo punim e thotë qartë si e ndan bashkësinë e vlerësimit, edhe pse shifra e raportuar varet drejtpë</w:t>
-      </w:r>
-      <w:r>
-        <w:t>rdrejt prej saj. Detektimi dhe refaktorimi, nga ana tjetër, trajtohen zakonisht veç e veç, dhe mbetet pa përgjigje empirike nëse një erë e gjetur mund të ndreqet edhe automatikisht, dhe nëse ndreqja e heq vërtet.</w:t>
+        <w:t>Nga ky shqyrtim dalin tri vërejtje. Qasja me rregulla dhe ajo me mësim makine rrallë vlerësohen mbi të njëjtën të vë</w:t>
+      </w:r>
+      <w:r>
+        <w:t xml:space="preserve">rtetë bazë dhe me të njëjtat metrika, kështu që krahasimi i drejtpërdrejtë mungon. Jo çdo punim e thotë qartë si e ndan bashkësinë e vlerësimit, edhe pse shifra e raportuar varet drejtpërdrejt prej saj. Detektimi dhe refaktorimi, nga ana tjetër, trajtohen </w:t>
+      </w:r>
+      <w:r>
+        <w:t>zakonisht veç e veç, dhe mbetet pa përgjigje empirike nëse një erë e gjetur mund të ndreqet edhe automatikisht, dhe nëse ndreqja e heq vërtet.</w:t>
       </w:r>
     </w:p>
     <w:p>
@@ -6362,26 +6353,23 @@
         <w:ind w:firstLine="360"/>
       </w:pPr>
       <w:r>
-        <w:t>Ky punim u përgjigjet të triave, dhe pikëri</w:t>
-      </w:r>
-      <w:r>
-        <w:t>sht kjo e dallon nga studimet e përmendura. Ndryshe nga Lanza &amp; Marinescu (2006), pragjet e strategjive nuk merren si të sakta, por maten kundrejt gjykimit të zhvilluesve profesionistë të MLCQ-së. Ndryshe nga Arcelli Fontana et al. (2016), rregullat dhe mo</w:t>
-      </w:r>
-      <w:r>
-        <w:t xml:space="preserve">delet vlerësohen mbi të njëjtat mostra, me të njëjtin kod pikëzimi, dhe ndarja e të dhënave bëhet sipas depos, ndaj shifra nuk fryhet nga mostra të të njëjtit projekt në trajnim dhe në testim. Ndryshe nga Madeyski &amp; Lewowski (2023), që </w:t>
+        <w:t>Ky punim u përgjigjet të triave, dhe pikërisht kjo e dallon nga studimet e përmendura. Ndryshe nga Lanza &amp; Marine</w:t>
+      </w:r>
+      <w:r>
+        <w:t>scu (2006), pragjet e strategjive nuk merren si të sakta, por maten kundrejt gjykimit të zhvilluesve profesionistë të MLCQ-së. Ndryshe nga Arcelli Fontana et al. (2016), rregullat dhe modelet vlerësohen mbi të njëjtat mostra, me të njëjtin kod pikëzimi, dh</w:t>
+      </w:r>
+      <w:r>
+        <w:t xml:space="preserve">e ndarja e të dhënave bëhet sipas depos, ndaj shifra nuk fryhet nga mostra të të njëjtit projekt në trajnim dhe në testim. Ndryshe nga Madeyski &amp; Lewowski (2023), që </w:t>
       </w:r>
       <w:r>
         <w:lastRenderedPageBreak/>
-        <w:t xml:space="preserve">përdorën metrikat e </w:t>
-      </w:r>
-      <w:r>
-        <w:t>mjeteve të përgjithshme të analizës statike, modeli trajnohet mbi metrikat e vetë sistemit, përfshirë ato që lexojnë strategjitë, dhe një ablacion me vetëm metrikat e strategjisë tregon sa nga dallimi vjen nga kufiri i mësuar. Ndryshe nga Tsantalis &amp; Chatz</w:t>
-      </w:r>
-      <w:r>
-        <w:t xml:space="preserve">igeorgiou (2009), që propozojnë një transformim dhe vendimin ia lënë projektuesit, këtu transformimi aplikohet, verifikohet me kompilator dhe matet nëse e hoqi erën, sepse Bavota et al. (2015) treguan se refaktorimi rrallë e heq erën vetvetiu. Kapitulli 3 </w:t>
-      </w:r>
-      <w:r>
-        <w:t>i kthen këto vërejtje në problemin dhe pyetjet e punimit.</w:t>
+        <w:t>përdorën metrikat e mjeteve të përgjithshme të analizës statike, modeli trajnohet mbi metr</w:t>
+      </w:r>
+      <w:r>
+        <w:t>ikat e vetë sistemit, përfshirë ato që lexojnë strategjitë, dhe një ablacion me vetëm metrikat e strategjisë tregon sa nga dallimi vjen nga kufiri i mësuar. Ndryshe nga Tsantalis &amp; Chatzigeorgiou (2009), që propozojnë një transformim dhe vendimin ia lënë p</w:t>
+      </w:r>
+      <w:r>
+        <w:t>rojektuesit, këtu transformimi aplikohet, verifikohet me kompilator dhe matet nëse e hoqi erën, sepse Bavota et al. (2015) treguan se refaktorimi rrallë e heq erën vetvetiu. Kapitulli 3 i kthen këto vërejtje në problemin dhe pyetjet e punimit.</w:t>
       </w:r>
     </w:p>
     <w:p>
@@ -6389,10 +6377,13 @@
         <w:pStyle w:val="Heading1"/>
         <w:pageBreakBefore/>
       </w:pPr>
-      <w:bookmarkStart w:id="12" w:name="_Toc242655054"/>
+      <w:bookmarkStart w:id="12" w:name="_Toc242658760"/>
       <w:r>
         <w:lastRenderedPageBreak/>
-        <w:t>3 Deklarimi i problemit</w:t>
+        <w:t xml:space="preserve">3 Deklarimi </w:t>
+      </w:r>
+      <w:r>
+        <w:t>i problemit</w:t>
       </w:r>
       <w:bookmarkEnd w:id="12"/>
     </w:p>
@@ -6407,10 +6398,10 @@
         <w:t>Situata ideale.</w:t>
       </w:r>
       <w:r>
-        <w:t xml:space="preserve"> Për çdo pjesë të kodit, ekipi do të duhej të dinte nëse ka një problem dizajni, sa i rëndë është, dhe cili transformim e heq pa ndryshuar sjelljen. Ky gjykim </w:t>
-      </w:r>
-      <w:r>
-        <w:t>do të duhej të ishte i përsëritshëm dhe i krahasuar me vlerësimin e zhvilluesve me përvojë.</w:t>
+        <w:t xml:space="preserve"> Për çdo pjesë të kodit, ekipi do të duhej të dinte nëse ka një problem dizajni, sa i rëndë është, dhe cili transformim e heq pa ndryshuar sjelljen. Ky gjykim do të duhej të ishte i përsëritshëm dhe i krahasuar me vlerësimin e zh</w:t>
+      </w:r>
+      <w:r>
+        <w:t>villuesve me përvojë.</w:t>
       </w:r>
     </w:p>
     <w:p>
@@ -6424,10 +6415,10 @@
         <w:t>Realiteti.</w:t>
       </w:r>
       <w:r>
-        <w:t xml:space="preserve"> Identifikimi me dorë nuk shkallëzohet, dhe mjetet ekzistuese zakonisht vetëm njoftojnë, me pragje të kalibruara në projekte të tjera (Kapitulli 1). Studi</w:t>
-      </w:r>
-      <w:r>
-        <w:t>met rrallë i vënë dy qasjet përballë njëra-tjetrës, dhe nuk matin sa nga erërat e gjetura ndreqen dot automatikisht (Nënkapitulli 2.7).</w:t>
+        <w:t xml:space="preserve"> Identifikimi me dorë nuk shkallëzohet, dhe mjetet ekzistuese zakonisht vetëm njoftojnë, me pragje të kalibruara në projekte të tjera (Kapitulli 1). Studimet rrallë i vënë dy qasjet përballë njëra-tjetrës, dhe nuk matin sa n</w:t>
+      </w:r>
+      <w:r>
+        <w:t>ga erërat e gjetura ndreqen dot automatikisht (Nënkapitulli 2.7).</w:t>
       </w:r>
     </w:p>
     <w:p>
@@ -6441,17 +6432,17 @@
         <w:t>Fokusi i punës.</w:t>
       </w:r>
       <w:r>
-        <w:t xml:space="preserve"> Ky punim i krahason dy qasjet e detektimit mbi të njëjtin korpus të etiketuar nga profesionistë, me ndar</w:t>
-      </w:r>
-      <w:r>
-        <w:t>je sipas depos dhe me të njëjtën mënyrë pikëzimi, dhe mat sa nga vendet e detektuara mund të rishkruhen automatikisht pa sjellë gabime të reja kompilimi.</w:t>
+        <w:t xml:space="preserve"> Ky punim i krahason dy qasjet e detektimit mbi të njëjtin korpus të etiketuar nga profesionistë, me ndarje sipas depos dhe me të njëjtën mënyrë pikëzimi, dhe mat sa nga vende</w:t>
+      </w:r>
+      <w:r>
+        <w:t>t e detektuara mund të rishkruhen automatikisht pa sjellë gabime të reja kompilimi.</w:t>
       </w:r>
     </w:p>
     <w:p>
       <w:pPr>
         <w:pStyle w:val="Heading2"/>
       </w:pPr>
-      <w:bookmarkStart w:id="13" w:name="_Toc242655055"/>
+      <w:bookmarkStart w:id="13" w:name="_Toc242658761"/>
       <w:r>
         <w:t>3.1 Pyetjet kërkimore</w:t>
       </w:r>
@@ -6470,10 +6461,10 @@
         <w:pStyle w:val="ListBullet"/>
       </w:pPr>
       <w:r>
-        <w:t>PK1: Sa e saktë është det</w:t>
-      </w:r>
-      <w:r>
-        <w:t>ektimi i bazuar në strategji metrikash, krahasuar me etiketimet manuale të zhvilluesve profesionistë?</w:t>
+        <w:t>PK1: Sa e saktë është detektimi i bazuar në strategji metrikash, krahasuar me etiketimet manual</w:t>
+      </w:r>
+      <w:r>
+        <w:t>e të zhvilluesve profesionistë?</w:t>
       </w:r>
     </w:p>
     <w:p>
@@ -6489,10 +6480,10 @@
         <w:pStyle w:val="ListBullet"/>
       </w:pPr>
       <w:r>
-        <w:t>PK3: A mund të a</w:t>
-      </w:r>
-      <w:r>
-        <w:t>plikohen automatikisht refaktorimet e propozuara pa shtuar gabime të reja kompilimi, dhe a e heqin ato erën për të cilën u propozuan, sipas rimatjes me të njëjtat metrika?</w:t>
+        <w:t>PK3: A mund të aplikohen automatikisht refaktorimet e propozuara pa shtuar gabime të r</w:t>
+      </w:r>
+      <w:r>
+        <w:t>eja kompilimi, dhe a e heqin ato erën për të cilën u propozuan, sipas rimatjes me të njëjtat metrika?</w:t>
       </w:r>
     </w:p>
     <w:p>
@@ -6500,17 +6491,17 @@
         <w:ind w:firstLine="360"/>
       </w:pPr>
       <w:r>
-        <w:t xml:space="preserve">PK1 e vë gjykimin e pragjeve fikse përballë atij njerëzor. PK2 pyet nëse të njëjtat </w:t>
-      </w:r>
-      <w:r>
-        <w:t>metrika, të përdorura ndryshe, japin më shumë. PK3 pyet nëse sistemi mund të shkojë përtej njoftimit pa e prishur kodin.</w:t>
+        <w:t>PK1 e vë gjykimin e pragjeve fikse përballë atij njerëzor. PK2 pyet nëse të njëjtat metrika, të përdorura ndryshe, japin më shumë. PK3 pyet nëse sistemi m</w:t>
+      </w:r>
+      <w:r>
+        <w:t>und të shkojë përtej njoftimit pa e prishur kodin.</w:t>
       </w:r>
     </w:p>
     <w:p>
       <w:pPr>
         <w:pStyle w:val="Heading2"/>
       </w:pPr>
-      <w:bookmarkStart w:id="14" w:name="_Toc242655056"/>
+      <w:bookmarkStart w:id="14" w:name="_Toc242658762"/>
       <w:r>
         <w:lastRenderedPageBreak/>
         <w:t>3.2 Qëllimi dhe objektivat</w:t>
@@ -6522,10 +6513,10 @@
         <w:ind w:firstLine="360"/>
       </w:pPr>
       <w:r>
-        <w:t>Qëllimi i punimit është të projektohet, të implementohet dhe të vlerësohet empirikisht një sistem që gjen co</w:t>
-      </w:r>
-      <w:r>
-        <w:t>de smells në kod Java dhe propozon refaktorime konkrete e të verifikueshme për to. Objektivat janë:</w:t>
+        <w:t>Qëllimi i punimit është të projektohet, të implementohet dhe të vlerësohet empirikisht një sistem që gjen code smells në kod Java dhe propozon refaktorime konkrete e të verifikue</w:t>
+      </w:r>
+      <w:r>
+        <w:t>shme për to. Objektivat janë:</w:t>
       </w:r>
     </w:p>
     <w:p>
@@ -6541,10 +6532,7 @@
         <w:pStyle w:val="ListBullet"/>
       </w:pPr>
       <w:r>
-        <w:t xml:space="preserve">Të ndërtohet një motor analize që mat kodin Java në </w:t>
-      </w:r>
-      <w:r>
-        <w:t>nivel klase dhe metode.</w:t>
+        <w:t>Të ndërtohet një motor analize që mat kodin Java në nivel klase dhe metode.</w:t>
       </w:r>
     </w:p>
     <w:p>
@@ -6552,7 +6540,10 @@
         <w:pStyle w:val="ListBullet"/>
       </w:pPr>
       <w:r>
-        <w:t>Të implementohet detektimi me rregulla, me strategji të publikuara dhe me burimin e çdo pragu të deklaruar.</w:t>
+        <w:t xml:space="preserve">Të implementohet detektimi me rregulla, me </w:t>
+      </w:r>
+      <w:r>
+        <w:t>strategji të publikuara dhe me burimin e çdo pragu të deklaruar.</w:t>
       </w:r>
     </w:p>
     <w:p>
@@ -6568,10 +6559,10 @@
         <w:pStyle w:val="ListBullet"/>
       </w:pPr>
       <w:r>
-        <w:t>Të ndërtohet një motor refaktorimi që i</w:t>
-      </w:r>
-      <w:r>
-        <w:t xml:space="preserve"> aplikon transformimet vetëm kur janë të sigurta dhe e verifikon rezultatin.</w:t>
+        <w:t>Të ndërtohet një motor refaktorimi që i aplikon transformimet vetëm kur janë të sigurta dhe e verifikon re</w:t>
+      </w:r>
+      <w:r>
+        <w:t>zultatin.</w:t>
       </w:r>
     </w:p>
     <w:p>
@@ -6586,7 +6577,7 @@
       <w:pPr>
         <w:pStyle w:val="Heading2"/>
       </w:pPr>
-      <w:bookmarkStart w:id="15" w:name="_Toc242655057"/>
+      <w:bookmarkStart w:id="15" w:name="_Toc242658763"/>
       <w:r>
         <w:t>3.3 Formulimi i matshëm dhe kriteret e suksesit</w:t>
       </w:r>
@@ -6597,10 +6588,10 @@
         <w:ind w:firstLine="360"/>
       </w:pPr>
       <w:r>
-        <w:t>Detektimi trajtohet si klasifikim binar: një klasë os</w:t>
-      </w:r>
-      <w:r>
-        <w:t>e metodë është ose nuk është shembull i një ere të caktuar. E vërteta bazë vjen nga rishikuesit e MLCQ-së, dhe krahasimi bëhet me matricën e konfuzionit dhe shifrat që dalin prej saj.</w:t>
+        <w:t>Detektimi trajtohet si klasifikim binar: një klasë ose metodë është ose nuk është shembull i një ere të caktuar. E vërte</w:t>
+      </w:r>
+      <w:r>
+        <w:t>ta bazë vjen nga rishikuesit e MLCQ-së, dhe krahasimi bëhet me matricën e konfuzionit dhe shifrat që dalin prej saj.</w:t>
       </w:r>
     </w:p>
     <w:p>
@@ -6608,10 +6599,10 @@
         <w:ind w:firstLine="360"/>
       </w:pPr>
       <w:r>
-        <w:t>Refaktorimi nuk është klasifikim, por transformim me parakushte, dhe pye</w:t>
-      </w:r>
-      <w:r>
-        <w:t>tja e matshme është sa shpesh aplikohet pa e prishur kodin. Raportohen vendet e detektuara, ato të transformuara dhe arsyet pse të tjerat u refuzuan. Kriteret e suksesit janë:</w:t>
+        <w:t>Refaktorimi nuk është klasifikim, por transformim me parakushte, dhe pyetja e matshme është sa shpesh aplikohet pa e prishur kodin. Raporto</w:t>
+      </w:r>
+      <w:r>
+        <w:t>hen vendet e detektuara, ato të transformuara dhe arsyet pse të tjerat u refuzuan. Kriteret e suksesit janë:</w:t>
       </w:r>
     </w:p>
     <w:p>
@@ -6619,10 +6610,10 @@
         <w:pStyle w:val="ListBullet"/>
       </w:pPr>
       <w:r>
-        <w:t>Për PK1: shifra për çdo erë mbi një korpus të deklaruar, të riprodhueshme me një</w:t>
-      </w:r>
-      <w:r>
-        <w:t xml:space="preserve"> komandë. Edhe një recall i ulët është përgjigje e vlefshme, për sa kohë nuk fshihet.</w:t>
+        <w:t>Për PK1: shifra për çdo erë mbi një korpus të deklaruar, të riprodhueshme me një komandë. Edhe një recall i ulët është përgjigje e vlefshme, për sa</w:t>
+      </w:r>
+      <w:r>
+        <w:t xml:space="preserve"> kohë nuk fshihet.</w:t>
       </w:r>
     </w:p>
     <w:p>
@@ -6638,17 +6629,17 @@
         <w:pStyle w:val="ListBullet"/>
       </w:pPr>
       <w:r>
-        <w:t>Për PK3: çdo</w:t>
-      </w:r>
-      <w:r>
-        <w:t xml:space="preserve"> rishkrim i aplikuar verifikohet se nuk e prish skedarin, dhe matet nëse era u hoq.</w:t>
+        <w:t>Për PK3: çdo rishkrim i aplikuar verifikohet se nuk e prish skedarin, dhe matet</w:t>
+      </w:r>
+      <w:r>
+        <w:t xml:space="preserve"> nëse era u hoq.</w:t>
       </w:r>
     </w:p>
     <w:p>
       <w:pPr>
         <w:pStyle w:val="Heading2"/>
       </w:pPr>
-      <w:bookmarkStart w:id="16" w:name="_Toc242655058"/>
+      <w:bookmarkStart w:id="16" w:name="_Toc242658764"/>
       <w:r>
         <w:lastRenderedPageBreak/>
         <w:t>3.4 Fushëveprimi dhe kufizimet</w:t>
@@ -6660,10 +6651,10 @@
         <w:ind w:firstLine="360"/>
       </w:pPr>
       <w:r>
-        <w:t>Punimi kufizohet te Java, sepse shumica e literaturës për metrikat e objekteve dhe dataset-et e etiketuara të code smells janë ndërtuar mbi k</w:t>
-      </w:r>
-      <w:r>
-        <w:t>od Java. Vlerësohen vetëm erërat për të cilat ka strategji të publikuara dhe të dhëna të etiketuara. Analiza është statike: programi nuk ekzekutohet, prandaj sjellja gjatë ekzekutimit nuk mbulohet.</w:t>
+        <w:t>Punimi kufizohet te Java, sepse shumica e literaturës për metrikat e objekteve dhe dataset-et e etiketuara të code smells janë ndërtuar mbi kod Java. Vlerësohen vetëm erërat për të cilat ka strategji të publi</w:t>
+      </w:r>
+      <w:r>
+        <w:t>kuara dhe të dhëna të etiketuara. Analiza është statike: programi nuk ekzekutohet, prandaj sjellja gjatë ekzekutimit nuk mbulohet.</w:t>
       </w:r>
     </w:p>
     <w:p>
@@ -6671,16 +6662,13 @@
         <w:ind w:firstLine="360"/>
       </w:pPr>
       <w:r>
-        <w:t>Dy zgjedhje janë bërë me qëllim. E para, analizuesi regjis</w:t>
-      </w:r>
-      <w:r>
-        <w:t xml:space="preserve">tron fakte sintaksore dhe nuk zgjidh simbole. Prandaj një transformim që duhet të gjejë çdo referencë ndaj një emri nuk mund t'i provojë parakushtet e veta, dhe dy nga pesë transformimet e planifikuara mbeten vetëm propozim. Për të njëjtën arsye Introduce </w:t>
-      </w:r>
-      <w:r>
-        <w:t>Parameter Object aplikohet vetëm te metodat «private», thirrjet e të cilave mbeten brenda skedarit. E dyta, refaktorimi bëhet me transformime mbi pemën sintaksore dhe jo me gjenerim teksti, sepse ajo që aplikohet duhet të jetë e saktë. Kur siguria nuk prov</w:t>
-      </w:r>
-      <w:r>
-        <w:t>ohet, refuzimi konsiderohet rezultat i saktë.</w:t>
+        <w:t>Dy zgjedhje janë bërë me qëllim. E para, analizuesi regjistron fakte sintaksore dhe nuk zgjidh simbole. Prandaj një transform</w:t>
+      </w:r>
+      <w:r>
+        <w:t>im që duhet të gjejë çdo referencë ndaj një emri nuk mund t'i provojë parakushtet e veta, dhe dy nga pesë transformimet e planifikuara mbeten vetëm propozim. Për të njëjtën arsye Introduce Parameter Object aplikohet vetëm te metodat «private», thirrjet e t</w:t>
+      </w:r>
+      <w:r>
+        <w:t>ë cilave mbeten brenda skedarit. E dyta, refaktorimi bëhet me transformime mbi pemën sintaksore dhe jo me gjenerim teksti, sepse ajo që aplikohet duhet të jetë e saktë. Kur siguria nuk provohet, refuzimi konsiderohet rezultat i saktë.</w:t>
       </w:r>
     </w:p>
     <w:p>
@@ -6688,10 +6676,13 @@
         <w:ind w:firstLine="360"/>
       </w:pPr>
       <w:r>
-        <w:t>Korpusi mban nga depot e MLCQ-së vetëm skedarët «.java», pa skedarë ndërtimi dhe pa varësi, dhe disa depo nuk gjenden më. Prandaj çdo rishkrim kontrollohet vetëm me kompilator: nëse kompilon, ose të paktën nëse</w:t>
-      </w:r>
-      <w:r>
-        <w:t xml:space="preserve"> nuk shton lloj të ri gabimi. Ruajtja e sjelljes, prandaj, nuk është pjesë e PK3 dhe </w:t>
+        <w:t>Korpusi mban nga depo</w:t>
+      </w:r>
+      <w:r>
+        <w:t>t e MLCQ-së vetëm skedarët «.java», pa skedarë ndërtimi dhe pa varësi, dhe disa depo nuk gjenden më. Prandaj çdo rishkrim kontrollohet vetëm me kompilator: nëse kompilon, ose të paktën nëse nuk shton lloj të ri gabimi. Ruajtja e sjelljes, prandaj, nuk ësht</w:t>
+      </w:r>
+      <w:r>
+        <w:t xml:space="preserve">ë pjesë e PK3 dhe </w:t>
       </w:r>
       <w:r>
         <w:rPr>
@@ -6708,7 +6699,7 @@
         <w:pStyle w:val="Heading1"/>
         <w:pageBreakBefore/>
       </w:pPr>
-      <w:bookmarkStart w:id="17" w:name="_Toc242655059"/>
+      <w:bookmarkStart w:id="17" w:name="_Toc242658765"/>
       <w:r>
         <w:lastRenderedPageBreak/>
         <w:t>4 Metodologjia</w:t>
@@ -6720,13 +6711,13 @@
         <w:ind w:firstLine="360"/>
       </w:pPr>
       <w:r>
-        <w:t>Ky kapitull përshkruan si u</w:t>
-      </w:r>
-      <w:r>
-        <w:t xml:space="preserve"> ndërtua sistemi dhe si u krye eksperimenti, me aq hollësi sa një lexues tjetër ta përsërisë. Radha ndjek rrugën e të dhënave: arkitektura dhe teknologjitë (4.1–4.2), korpusi dhe matja (4.3–4.4), tri qasjet (4.5–4.7), ndërfaqja (4.8), mënyra e vlerësimit (</w:t>
-      </w:r>
-      <w:r>
-        <w:t>4.9), validimi i sistemit (4.10), riprodhueshmëria dhe mjedisi (4.11), etika (4.12) dhe kërcënimet ndaj vlefshmërisë (4.13). Rezultatet nuk jepen këtu; ato janë te Kapitulli 5.</w:t>
+        <w:t>Ky kapitull përshkruan si u ndërtua sistemi dhe si u krye eksperimenti, me aq hollësi sa një l</w:t>
+      </w:r>
+      <w:r>
+        <w:t>exues tjetër ta përsërisë. Radha ndjek rrugën e të dhënave: arkitektura dhe teknologjitë (4.1–4.2), korpusi dhe matja (4.3–4.4), tri qasjet (4.5–4.7), ndërfaqja (4.8), mënyra e vlerësimit (4.9), validimi i sistemit (4.10), riprodhueshmëria dhe mjedisi (4.1</w:t>
+      </w:r>
+      <w:r>
+        <w:t>1), etika (4.12) dhe kërcënimet ndaj vlefshmërisë (4.13). Rezultatet nuk jepen këtu; ato janë te Kapitulli 5.</w:t>
       </w:r>
     </w:p>
     <w:p>
@@ -6858,7 +6849,7 @@
       <w:pPr>
         <w:pStyle w:val="Heading2"/>
       </w:pPr>
-      <w:bookmarkStart w:id="18" w:name="_Toc242655060"/>
+      <w:bookmarkStart w:id="18" w:name="_Toc242658766"/>
       <w:r>
         <w:t>4.1 Arkitektura e sistemit</w:t>
       </w:r>
@@ -6885,7 +6876,7 @@
           <w:noProof/>
         </w:rPr>
         <w:drawing>
-          <wp:inline distT="0" distB="0" distL="0" distR="0" wp14:anchorId="4A7CB0B2" wp14:editId="2C93803F">
+          <wp:inline distT="0" distB="0" distL="0" distR="0" wp14:anchorId="3FB5022E" wp14:editId="1E2178DA">
             <wp:extent cx="5120640" cy="2861392"/>
             <wp:effectExtent l="0" t="0" r="0" b="0"/>
             <wp:docPr id="3" name="Picture 3"/>
@@ -7063,7 +7054,7 @@
       <w:pPr>
         <w:pStyle w:val="Heading2"/>
       </w:pPr>
-      <w:bookmarkStart w:id="19" w:name="_Toc242655061"/>
+      <w:bookmarkStart w:id="19" w:name="_Toc242658767"/>
       <w:r>
         <w:t>4.2 Teknologjitë e përdorura</w:t>
       </w:r>
@@ -7902,7 +7893,7 @@
       <w:pPr>
         <w:pStyle w:val="Heading2"/>
       </w:pPr>
-      <w:bookmarkStart w:id="20" w:name="_Toc242655062"/>
+      <w:bookmarkStart w:id="20" w:name="_Toc242658768"/>
       <w:r>
         <w:t>4.3 Korpusi dhe e vërteta bazë</w:t>
       </w:r>
@@ -8004,7 +7995,7 @@
       <w:pPr>
         <w:pStyle w:val="Heading2"/>
       </w:pPr>
-      <w:bookmarkStart w:id="21" w:name="_Toc242655063"/>
+      <w:bookmarkStart w:id="21" w:name="_Toc242658769"/>
       <w:r>
         <w:t>4.4 Matja e metrikave</w:t>
       </w:r>
@@ -8091,7 +8082,7 @@
       <w:pPr>
         <w:pStyle w:val="Heading2"/>
       </w:pPr>
-      <w:bookmarkStart w:id="22" w:name="_Toc242655064"/>
+      <w:bookmarkStart w:id="22" w:name="_Toc242658770"/>
       <w:r>
         <w:t>4.5 Qasja A: detektimi me rregulla</w:t>
       </w:r>
@@ -8267,7 +8258,7 @@
       <w:pPr>
         <w:pStyle w:val="Heading2"/>
       </w:pPr>
-      <w:bookmarkStart w:id="23" w:name="_Toc242655065"/>
+      <w:bookmarkStart w:id="23" w:name="_Toc242658771"/>
       <w:r>
         <w:t>4.6 Q</w:t>
       </w:r>
@@ -8404,7 +8395,7 @@
       <w:pPr>
         <w:pStyle w:val="Heading2"/>
       </w:pPr>
-      <w:bookmarkStart w:id="24" w:name="_Toc242655066"/>
+      <w:bookmarkStart w:id="24" w:name="_Toc242658772"/>
       <w:r>
         <w:t>4.7 Qasja C:</w:t>
       </w:r>
@@ -8614,7 +8605,7 @@
       <w:pPr>
         <w:pStyle w:val="Heading2"/>
       </w:pPr>
-      <w:bookmarkStart w:id="25" w:name="_Toc242655067"/>
+      <w:bookmarkStart w:id="25" w:name="_Toc242658773"/>
       <w:r>
         <w:t>4.</w:t>
       </w:r>
@@ -8695,7 +8686,7 @@
       <w:pPr>
         <w:pStyle w:val="Heading2"/>
       </w:pPr>
-      <w:bookmarkStart w:id="26" w:name="_Toc242655068"/>
+      <w:bookmarkStart w:id="26" w:name="_Toc242658774"/>
       <w:r>
         <w:t>4.9 Matja e performancës</w:t>
       </w:r>
@@ -8967,7 +8958,7 @@
       <w:pPr>
         <w:pStyle w:val="Heading2"/>
       </w:pPr>
-      <w:bookmarkStart w:id="27" w:name="_Toc242655069"/>
+      <w:bookmarkStart w:id="27" w:name="_Toc242658775"/>
       <w:r>
         <w:t>4.10 Validimi i sistemit</w:t>
       </w:r>
@@ -9052,7 +9043,7 @@
       <w:pPr>
         <w:pStyle w:val="Heading2"/>
       </w:pPr>
-      <w:bookmarkStart w:id="28" w:name="_Toc242655070"/>
+      <w:bookmarkStart w:id="28" w:name="_Toc242658776"/>
       <w:r>
         <w:t>4.11 Riprodhueshmëria dhe mjedisi</w:t>
       </w:r>
@@ -9115,7 +9106,7 @@
       <w:pPr>
         <w:pStyle w:val="Heading2"/>
       </w:pPr>
-      <w:bookmarkStart w:id="29" w:name="_Toc242655071"/>
+      <w:bookmarkStart w:id="29" w:name="_Toc242658777"/>
       <w:r>
         <w:t>4.12 Konsideratat etike</w:t>
       </w:r>
@@ -9162,7 +9153,7 @@
       <w:pPr>
         <w:pStyle w:val="Heading2"/>
       </w:pPr>
-      <w:bookmarkStart w:id="30" w:name="_Toc242655072"/>
+      <w:bookmarkStart w:id="30" w:name="_Toc242658778"/>
       <w:r>
         <w:t>4.13 Kërcënimet ndaj vlefshmërisë</w:t>
       </w:r>
@@ -9259,7 +9250,7 @@
         <w:pStyle w:val="Heading1"/>
         <w:pageBreakBefore/>
       </w:pPr>
-      <w:bookmarkStart w:id="31" w:name="_Toc242655073"/>
+      <w:bookmarkStart w:id="31" w:name="_Toc242658779"/>
       <w:r>
         <w:lastRenderedPageBreak/>
         <w:t>5 Rezultatet</w:t>
@@ -9295,7 +9286,7 @@
           <w:noProof/>
         </w:rPr>
         <w:drawing>
-          <wp:inline distT="0" distB="0" distL="0" distR="0" wp14:anchorId="31ABB3B9" wp14:editId="231A9AF3">
+          <wp:inline distT="0" distB="0" distL="0" distR="0" wp14:anchorId="05260A62" wp14:editId="1F68F425">
             <wp:extent cx="5120640" cy="2523481"/>
             <wp:effectExtent l="0" t="0" r="0" b="0"/>
             <wp:docPr id="4" name="Picture 4"/>
@@ -9375,7 +9366,7 @@
       <w:pPr>
         <w:pStyle w:val="Heading2"/>
       </w:pPr>
-      <w:bookmarkStart w:id="32" w:name="_Toc242655074"/>
+      <w:bookmarkStart w:id="32" w:name="_Toc242658780"/>
       <w:r>
         <w:t>5.1 Qasja A: detektimi me rregulla</w:t>
       </w:r>
@@ -10444,7 +10435,7 @@
         </w:rPr>
         <w:lastRenderedPageBreak/>
         <w:drawing>
-          <wp:inline distT="0" distB="0" distL="0" distR="0" wp14:anchorId="4EB70E7B" wp14:editId="5FB352FB">
+          <wp:inline distT="0" distB="0" distL="0" distR="0" wp14:anchorId="186AFF2B" wp14:editId="5BCBD249">
             <wp:extent cx="5120640" cy="2718364"/>
             <wp:effectExtent l="0" t="0" r="0" b="0"/>
             <wp:docPr id="5" name="Picture 5"/>
@@ -10507,7 +10498,7 @@
       <w:pPr>
         <w:pStyle w:val="Heading2"/>
       </w:pPr>
-      <w:bookmarkStart w:id="33" w:name="_Toc242655075"/>
+      <w:bookmarkStart w:id="33" w:name="_Toc242658781"/>
       <w:r>
         <w:t>5.2 Qasja B: detektimi me mësim makine</w:t>
       </w:r>
@@ -11108,7 +11099,7 @@
           <w:noProof/>
         </w:rPr>
         <w:drawing>
-          <wp:inline distT="0" distB="0" distL="0" distR="0" wp14:anchorId="7D836044" wp14:editId="3410FEEC">
+          <wp:inline distT="0" distB="0" distL="0" distR="0" wp14:anchorId="354F272B" wp14:editId="389E5EA2">
             <wp:extent cx="5120640" cy="4356365"/>
             <wp:effectExtent l="0" t="0" r="0" b="0"/>
             <wp:docPr id="6" name="Picture 6"/>
@@ -12057,7 +12048,7 @@
       <w:pPr>
         <w:pStyle w:val="Heading2"/>
       </w:pPr>
-      <w:bookmarkStart w:id="34" w:name="_Toc242655076"/>
+      <w:bookmarkStart w:id="34" w:name="_Toc242658782"/>
       <w:r>
         <w:t>5.3 Krahasimi i dy qasjeve</w:t>
       </w:r>
@@ -12085,7 +12076,7 @@
         </w:rPr>
         <w:lastRenderedPageBreak/>
         <w:drawing>
-          <wp:inline distT="0" distB="0" distL="0" distR="0" wp14:anchorId="0B108512" wp14:editId="13CDB525">
+          <wp:inline distT="0" distB="0" distL="0" distR="0" wp14:anchorId="2EA147AB" wp14:editId="7C47244A">
             <wp:extent cx="5120640" cy="2900601"/>
             <wp:effectExtent l="0" t="0" r="0" b="0"/>
             <wp:docPr id="7" name="Picture 7"/>
@@ -12714,7 +12705,7 @@
         </w:rPr>
         <w:lastRenderedPageBreak/>
         <w:drawing>
-          <wp:inline distT="0" distB="0" distL="0" distR="0" wp14:anchorId="55AB095B" wp14:editId="1D92DBC0">
+          <wp:inline distT="0" distB="0" distL="0" distR="0" wp14:anchorId="50481B6D" wp14:editId="7950F7D7">
             <wp:extent cx="5120640" cy="2837552"/>
             <wp:effectExtent l="0" t="0" r="0" b="0"/>
             <wp:docPr id="8" name="Picture 8"/>
@@ -13357,7 +13348,7 @@
       <w:pPr>
         <w:pStyle w:val="Heading2"/>
       </w:pPr>
-      <w:bookmarkStart w:id="35" w:name="_Toc242655077"/>
+      <w:bookmarkStart w:id="35" w:name="_Toc242658783"/>
       <w:r>
         <w:lastRenderedPageBreak/>
         <w:t>5.4 Qasja C: refaktorimi</w:t>
@@ -15084,7 +15075,7 @@
         </w:rPr>
         <w:lastRenderedPageBreak/>
         <w:drawing>
-          <wp:inline distT="0" distB="0" distL="0" distR="0" wp14:anchorId="2605199C" wp14:editId="2CB44CBD">
+          <wp:inline distT="0" distB="0" distL="0" distR="0" wp14:anchorId="3240EBBE" wp14:editId="7FA09C94">
             <wp:extent cx="5120640" cy="2137703"/>
             <wp:effectExtent l="0" t="0" r="0" b="0"/>
             <wp:docPr id="9" name="Picture 9"/>
@@ -16035,7 +16026,7 @@
           <w:noProof/>
         </w:rPr>
         <w:drawing>
-          <wp:inline distT="0" distB="0" distL="0" distR="0" wp14:anchorId="1BF0CB0D" wp14:editId="7FAA63C5">
+          <wp:inline distT="0" distB="0" distL="0" distR="0" wp14:anchorId="4FA3E1AF" wp14:editId="5D15E398">
             <wp:extent cx="5120640" cy="2254610"/>
             <wp:effectExtent l="0" t="0" r="0" b="0"/>
             <wp:docPr id="10" name="Picture 10"/>
@@ -17853,7 +17844,7 @@
           <w:noProof/>
         </w:rPr>
         <w:drawing>
-          <wp:inline distT="0" distB="0" distL="0" distR="0" wp14:anchorId="46C289A8" wp14:editId="3027CD12">
+          <wp:inline distT="0" distB="0" distL="0" distR="0" wp14:anchorId="2BC92313" wp14:editId="5E53561C">
             <wp:extent cx="5120640" cy="2702306"/>
             <wp:effectExtent l="0" t="0" r="0" b="0"/>
             <wp:docPr id="11" name="Picture 11"/>
@@ -17937,7 +17928,7 @@
       <w:pPr>
         <w:pStyle w:val="Heading2"/>
       </w:pPr>
-      <w:bookmarkStart w:id="36" w:name="_Toc242655078"/>
+      <w:bookmarkStart w:id="36" w:name="_Toc242658784"/>
       <w:r>
         <w:t>5.5 Ndjeshmëria ndaj pragjeve</w:t>
       </w:r>
@@ -18968,7 +18959,7 @@
         </w:rPr>
         <w:lastRenderedPageBreak/>
         <w:drawing>
-          <wp:inline distT="0" distB="0" distL="0" distR="0" wp14:anchorId="01F2F99E" wp14:editId="615EE036">
+          <wp:inline distT="0" distB="0" distL="0" distR="0" wp14:anchorId="3E1B5194" wp14:editId="391579B3">
             <wp:extent cx="5120640" cy="3172826"/>
             <wp:effectExtent l="0" t="0" r="0" b="0"/>
             <wp:docPr id="12" name="Picture 12"/>
@@ -19622,7 +19613,7 @@
       <w:pPr>
         <w:pStyle w:val="Heading2"/>
       </w:pPr>
-      <w:bookmarkStart w:id="37" w:name="_Toc242655079"/>
+      <w:bookmarkStart w:id="37" w:name="_Toc242658785"/>
       <w:r>
         <w:t>5.6 Krahasimi me një mjet ekzistues</w:t>
       </w:r>
@@ -20226,7 +20217,7 @@
       <w:pPr>
         <w:pStyle w:val="Heading2"/>
       </w:pPr>
-      <w:bookmarkStart w:id="38" w:name="_Toc242655080"/>
+      <w:bookmarkStart w:id="38" w:name="_Toc242658786"/>
       <w:r>
         <w:t>5.7 Intervalet e besimit dhe pajtimi mes rishikuesve</w:t>
       </w:r>
@@ -20731,7 +20722,7 @@
           <w:noProof/>
         </w:rPr>
         <w:drawing>
-          <wp:inline distT="0" distB="0" distL="0" distR="0" wp14:anchorId="0FCC7235" wp14:editId="314605AA">
+          <wp:inline distT="0" distB="0" distL="0" distR="0" wp14:anchorId="07EAA731" wp14:editId="501CAA23">
             <wp:extent cx="5120640" cy="2815697"/>
             <wp:effectExtent l="0" t="0" r="0" b="0"/>
             <wp:docPr id="13" name="Picture 13"/>
@@ -21700,7 +21691,7 @@
       <w:pPr>
         <w:pStyle w:val="Heading2"/>
       </w:pPr>
-      <w:bookmarkStart w:id="39" w:name="_Toc242655081"/>
+      <w:bookmarkStart w:id="39" w:name="_Toc242658787"/>
       <w:r>
         <w:t>5.8 Përmbledhje e rezultateve</w:t>
       </w:r>
@@ -22618,7 +22609,7 @@
         <w:pStyle w:val="Heading1"/>
         <w:pageBreakBefore/>
       </w:pPr>
-      <w:bookmarkStart w:id="40" w:name="_Toc242655082"/>
+      <w:bookmarkStart w:id="40" w:name="_Toc242658788"/>
       <w:r>
         <w:lastRenderedPageBreak/>
         <w:t>6 Diskutime dhe për</w:t>
@@ -22643,7 +22634,7 @@
       <w:pPr>
         <w:pStyle w:val="Heading2"/>
       </w:pPr>
-      <w:bookmarkStart w:id="41" w:name="_Toc242655083"/>
+      <w:bookmarkStart w:id="41" w:name="_Toc242658789"/>
       <w:r>
         <w:t>6.1 Interpretimi i rezultateve</w:t>
       </w:r>
@@ -22903,7 +22894,7 @@
       <w:pPr>
         <w:pStyle w:val="Heading2"/>
       </w:pPr>
-      <w:bookmarkStart w:id="42" w:name="_Toc242655084"/>
+      <w:bookmarkStart w:id="42" w:name="_Toc242658790"/>
       <w:r>
         <w:t>6.2 Çfarë funksionoi dhe çfarë jo</w:t>
       </w:r>
@@ -23024,7 +23015,7 @@
       <w:pPr>
         <w:pStyle w:val="Heading2"/>
       </w:pPr>
-      <w:bookmarkStart w:id="43" w:name="_Toc242655085"/>
+      <w:bookmarkStart w:id="43" w:name="_Toc242658791"/>
       <w:r>
         <w:lastRenderedPageBreak/>
         <w:t>6.3 Krahasimi me literaturën</w:t>
@@ -23039,10 +23030,10 @@
         <w:t>Krahasimi më i drejtpër</w:t>
       </w:r>
       <w:r>
-        <w:t>drejtë është me Madeyski &amp; Lewowski (2023), të cilët trajnuan tetë algoritme mbi të njëjtin dataset MLCQ, me metrikat e PMD-së dhe të CODEBEAT-it si veçori. Konfigurimi i tyre DS1 e quan pozitive një mostër me të njëjtin kriter si ky punim (Nënkapitulli 4.</w:t>
-      </w:r>
-      <w:r>
-        <w:t>9). Tabela vë përballë MCC-në e të dy qasjeve këtu me mesoren më të mirë të MCC-së që raportojnë ata (Tabela 25).</w:t>
+        <w:t>drejtë është me Madeyski &amp; Lewowski (2023), të cilët trajnuan tetë algoritme mbi të njëjtin dataset MLCQ, me metrikat e PMD-së dhe të CODEBEAT-it si veçori. Konfigurimi i tyre DS1 e quan pozitive një mostër kur mesorja e ashpërsive të saj është mbi «none»;</w:t>
+      </w:r>
+      <w:r>
+        <w:t xml:space="preserve"> ky punim përdor mesataren e rrumbullakosur (Nënkapitulli 4.3), dhe të dy kriteret japin të njëjtën etiketë kur mostra ka një ose dy rishikime. Tabela vë përballë MCC-në e të dy qasjeve këtu me mesoren më të mirë të MCC-së që raportojnë ata (Tabela 25).</w:t>
       </w:r>
     </w:p>
     <w:p>
@@ -23228,13 +23219,7 @@
               <w:rPr>
                 <w:sz w:val="22"/>
               </w:rPr>
-              <w:t xml:space="preserve">Data </w:t>
-            </w:r>
-            <w:r>
-              <w:rPr>
-                <w:sz w:val="22"/>
-              </w:rPr>
-              <w:t>Class</w:t>
+              <w:t>Data Class</w:t>
             </w:r>
           </w:p>
         </w:tc>
@@ -23441,16 +23426,16 @@
         <w:ind w:firstLine="360"/>
       </w:pPr>
       <w:r>
-        <w:t xml:space="preserve">Te Blob, Data Class dhe Long Method modelet e këtij punimi dalin pak nën ato të Madeyski &amp; Lewowski-t. Dallimi i validimit e bën këtë të </w:t>
-      </w:r>
-      <w:r>
-        <w:t xml:space="preserve">pritshme: ata e ndajnë bashkësinë me validim të kryqëzuar me pesë folde, të shtresuar sipas klasës por jo të grupuar sipas projektit, ndaj e njëjta depo mund ta ushqejë trajnimin dhe të vlerësohet në të njëjtën kohë, që është rrjedhja që ky punim e shmang </w:t>
-      </w:r>
-      <w:r>
-        <w:t>me GroupKFold. Ata raportojnë edhe mesoren e 120 ekzekutimeve me hiperparametra të optimizuar për MCC, ndërsa këtu modelet kanë parametra të fiksuar dhe një ekzekutim të vetëm jashtë fold-it. Me një ndarje më të rreptë dhe pa optimizim të hiperparametrave,</w:t>
-      </w:r>
-      <w:r>
-        <w:t xml:space="preserve"> rezultatet e këtij punimi janë në të njëjtin brez.</w:t>
+        <w:t xml:space="preserve">Te Blob, </w:t>
+      </w:r>
+      <w:r>
+        <w:t>Data Class dhe Long Method modelet e këtij punimi dalin pak nën ato të Madeyski &amp; Lewowski-t. Dallimi i validimit e bën këtë të pritshme: ata e ndajnë bashkësinë me validim të kryqëzuar me pesë folde, të shtresuar sipas klasës por jo të grupuar sipas proje</w:t>
+      </w:r>
+      <w:r>
+        <w:t xml:space="preserve">ktit, ndaj e njëjta depo mund ta ushqejë trajnimin dhe të vlerësohet në të njëjtën kohë, që është rrjedhja që ky punim e shmang me GroupKFold. Ata raportojnë edhe mesoren e 120 ekzekutimeve me hiperparametra të optimizuar për MCC, ndërsa këtu modelet kanë </w:t>
+      </w:r>
+      <w:r>
+        <w:t>parametra të fiksuar dhe një ekzekutim të vetëm jashtë fold-it. Me një ndarje më të rreptë dhe pa optimizim të hiperparametrave, rezultatet e këtij punimi janë në të njëjtin brez.</w:t>
       </w:r>
     </w:p>
     <w:p>
@@ -23458,10 +23443,13 @@
         <w:ind w:firstLine="360"/>
       </w:pPr>
       <w:r>
-        <w:t>Te Feature Envy drejtimi është i kundërt: 0.70 këtu kundrejt 0.31 atje, ku autorët e quajnë erën më të vështirë. Shpjegimi më i mundshëm janë veçoritë: ky punim mat për çdo metodë ATFD, LAA, FDP dhe rresh</w:t>
-      </w:r>
-      <w:r>
-        <w:t>tat efektivë, ndërsa ata përdorin metrika të mjeteve të përgjithshme. Dy punimet nuk vlerësohen mbi saktësisht të njëjtat mostra, sepse një pjesë e depove sot mungon, prandaj dallimi lexohet si tregues dhe jo si provë.</w:t>
+        <w:t>Te Feature Envy drejtimi është i kundërt: 0.70 këtu kundrejt 0.31 atje, ku s</w:t>
+      </w:r>
+      <w:r>
+        <w:t>ipas autorëve është era me performancën më të ulët. Shpjegimi më i mundshëm janë veçoritë: ky punim mat për çdo metodë ATFD, LAA, FDP dhe rreshtat efektivë, ndërsa ata përdorin metrika të mjeteve të përgjithshme. Dy punimet nuk vlerësohen mbi saktësisht të</w:t>
+      </w:r>
+      <w:r>
+        <w:t xml:space="preserve"> njëjtat mostra, sepse një pjesë e depove sot mungon, prandaj dallimi lexohet si tregues dhe jo si provë.</w:t>
       </w:r>
     </w:p>
     <w:p>
@@ -23469,17 +23457,17 @@
         <w:ind w:firstLine="360"/>
       </w:pPr>
       <w:r>
-        <w:t>Rezultatet janë shumë larg atyre të A</w:t>
-      </w:r>
-      <w:r>
-        <w:t>rcelli Fontana et al. (2016), ku shumica e klasifikuesve kaluan 95% në saktësi dhe F-measure. Di Nucci et al. (2018) treguan se ato vlera vinin nga ndërtimi i dataset-it: me shpërndarje më realiste të metrikave, F-measure ra deri në 90% më poshtë. MLCQ ësh</w:t>
-      </w:r>
-      <w:r>
-        <w:t xml:space="preserve">të ky lloj dataset-i realist, dhe F1-i i këtij punimi, nga 0.61 </w:t>
+        <w:t>Rezultatet janë shumë larg atyre të Arcelli Fontana et al. (2016), ku shumica e klasifikuesve kaluan 95% në saktësi dhe F-measure. Di Nucci et al. (20</w:t>
+      </w:r>
+      <w:r>
+        <w:t xml:space="preserve">18) treguan se ato vlera vinin nga ndërtimi i dataset-it: me shpërndarje më realiste të metrikave, F-measure ra </w:t>
       </w:r>
       <w:r>
         <w:lastRenderedPageBreak/>
-        <w:t>deri në 0.77, e konfirmon drejtimin e Di Nucci et al.: mësimi i makinës ndihmon, por problemi nuk është i zgjidhur.</w:t>
+        <w:t>deri në 90% më poshtë. MLCQ është ky lloj dataset-i realist, dhe F1-i i këtij punimi, nga 0.61 deri në 0.77, e konfirmon drejtimin e Di Nucci et</w:t>
+      </w:r>
+      <w:r>
+        <w:t xml:space="preserve"> al.: mësimi i makinës ndihmon, por problemi nuk është i zgjidhur.</w:t>
       </w:r>
     </w:p>
     <w:p>
@@ -23487,13 +23475,13 @@
         <w:ind w:firstLine="360"/>
       </w:pPr>
       <w:r>
-        <w:t>Mäntylä &amp; Lassenius (2006) gjetën se vlerësimi i erërave nga zhvilluesit ësh</w:t>
-      </w:r>
-      <w:r>
-        <w:t>të subjektiv, dhe ky punim e mat këtë mbi MLCQ: dy rishikues të së njëjtës mostër pajtohen me MCC nga 0.02 deri në 0.24. Etiketa e agreguar është mesatare e disa gjykimeve dhe e zbut zhurmën e secilit, ndaj modelet mund të pajtohen me të më shumë sesa pajt</w:t>
-      </w:r>
-      <w:r>
-        <w:t>ohen dy rishikues mes tyre. Kjo nuk e bën modelin më të mirë se njeriun, por tregon se shifrat e fushës duhen lexuar kundrejt një tavani të ulët.</w:t>
+        <w:t>Mäntylä &amp; Lassenius (2006) gjetën se vlerësimi i erërave nga zhvilluesit është subjektiv, dhe ky punim e mat këtë mbi MLCQ: dy rishikues të së njëjtës mostër pajtohen me MCC nga 0.02 deri n</w:t>
+      </w:r>
+      <w:r>
+        <w:t>ë 0.24. Etiketa e agreguar është mesatare e disa gjykimeve dhe e zbut zhurmën e secilit, ndaj modelet mund të pajtohen me të më shumë sesa pajtohen dy rishikues mes tyre. Kjo nuk e bën modelin më të mirë se njeriun, por tregon se shifrat e fushës duhen lex</w:t>
+      </w:r>
+      <w:r>
+        <w:t>uar kundrejt një tavani të ulët.</w:t>
       </w:r>
     </w:p>
     <w:p>
@@ -23501,16 +23489,13 @@
         <w:ind w:firstLine="360"/>
       </w:pPr>
       <w:r>
-        <w:t>Te rregullat, rezultati përputhet me vërejtjen e Nënkapitullit 2.3 se pragjet e nxjerra nga një korpus nuk tra</w:t>
-      </w:r>
-      <w:r>
-        <w:t>nsferohen lehtë në një tjetër: strategjitë e Lanza &amp; Marinescu (2006) ruajnë precizion të lartë mbi MLCQ, por humbin shumicën e rasteve. PMD-ja, që zbaton të njëjtat strategji me pragjet e veta, nuk del më mirë në asnjë krahasim (Nënkapitulli 5.6), ndaj re</w:t>
-      </w:r>
-      <w:r>
-        <w:t>call-i i ulët nuk është defekt i zbatimit tonë. Te refaktorimi, motori ndjek parimin e Opdyke (1992): transformimi aplikohet vetëm kur parakushtet provohen. Tsantalis &amp; Chatzigeorgiou (2009) ia lënë vendimin përfundimtar projektuesit; ky punim e aplikon ri</w:t>
-      </w:r>
-      <w:r>
-        <w:t>shkrimin, por vetëm pas verifikimit me kompilator dhe vetëm aty ku kthimi është një komandë.</w:t>
+        <w:t>Te rregullat, rezultati përputhet me vërejtjen e Nënkapitullit 2.3 se pragjet e nxjerra nga një korpus nuk transferohen lehtë në një tjetër: strategjitë e Lanza &amp; Marinescu (2006) ruajnë precizion të lartë mbi MLCQ, por hum</w:t>
+      </w:r>
+      <w:r>
+        <w:t>bin shumicën e rasteve. PMD-ja, që zbaton të njëjtat strategji me pragjet e veta, nuk del më mirë në asnjë krahasim (Nënkapitulli 5.6), ndaj recall-i i ulët nuk është defekt i zbatimit tonë. Te refaktorimi, motori ndjek parimin e Opdyke (1992): transformim</w:t>
+      </w:r>
+      <w:r>
+        <w:t>i aplikohet vetëm kur parakushtet provohen. Tsantalis &amp; Chatzigeorgiou (2009) ia lënë vendimin përfundimtar projektuesit; ky punim e aplikon rishkrimin, por vetëm pas verifikimit me kompilator dhe vetëm aty ku kthimi është një komandë.</w:t>
       </w:r>
     </w:p>
     <w:p>
@@ -23518,13 +23503,16 @@
         <w:ind w:firstLine="360"/>
       </w:pPr>
       <w:r>
-        <w:t>Dy gjetje të tjera lidhen me literaturën për ndikimin e erërave. Roli i madhësisë te Blob-i, i diskutuar te Nënkapitulli 6.2, ka një paralel te Sjøberg et al. (201</w:t>
-      </w:r>
-      <w:r>
-        <w:t>3): edhe atje madhësia e kodit peshonte më shumë se erërat vetë në përpjekjen e mirëmbajtjes. Te refaktorimi, Bavota et al. (2015) gjetën se vetëm 7% e refaktorimeve të zhvilluesve e heqin erën nga klasa; motori i këtij punimi e heq atë te 64.8% e rishkrim</w:t>
-      </w:r>
-      <w:r>
-        <w:t>eve që aplikon. Krahasimi nuk është i drejtpërdrejtë, sepse zhvilluesit shpesh refaktorojnë për arsye që nuk kanë lidhje me një erë (Silva et al., 2016), por tregon vlerën e një transformimi që zgjidhet për erën e gjetur dhe matet pas aplikimit.</w:t>
+        <w:t>Dy gjetje të tjera l</w:t>
+      </w:r>
+      <w:r>
+        <w:t>idhen me literaturën për ndikimin e erërave. Roli i madhësisë te Blob-i, i diskutuar te Nënkapitulli 6.2, ka një paralel te Sjøberg et al. (2013): edhe atje madhësia e kodit peshonte më shumë se erërat vetë në përpjekjen e mirëmbajtjes. Te refaktorimi, Bav</w:t>
+      </w:r>
+      <w:r>
+        <w:t>ota et al. (2015) gjetën se vetëm 7% e refaktorimeve të zhvilluesve e heqin erën nga klasa; motori i këtij punimi e heq atë te 64.8% e rishkrimeve që aplikon. Krahasimi nuk është i drejtpërdrejtë, sepse zhvilluesit shpesh refaktorojnë për arsye që nuk kanë</w:t>
+      </w:r>
+      <w:r>
+        <w:t xml:space="preserve"> lidhje me një erë (Silva et al., 2016), por tregon vlerën e një transformimi që zgjidhet për erën e gjetur dhe matet pas aplikimit.</w:t>
       </w:r>
     </w:p>
     <w:p>
@@ -23532,10 +23520,10 @@
         <w:ind w:firstLine="360"/>
       </w:pPr>
       <w:r>
-        <w:t>Krahasimet</w:t>
-      </w:r>
-      <w:r>
-        <w:t xml:space="preserve"> e mësipërme përmblidhen në tabelën e mëposhtme. Kolona e fundit thotë nëse gjetja e këtij punimi e mbështet atë të burimit, e kundërshton apo nuk krahasohet dot drejtpërdrejt me të (Tabela 26).</w:t>
+        <w:t xml:space="preserve">Krahasimet e mësipërme përmblidhen në tabelën e mëposhtme. Kolona e fundit thotë nëse gjetja e këtij punimi e mbështet atë </w:t>
+      </w:r>
+      <w:r>
+        <w:t>të burimit, e kundërshton apo nuk krahasohet dot drejtpërdrejt me të (Tabela 26).</w:t>
       </w:r>
     </w:p>
     <w:p>
@@ -23669,7 +23657,13 @@
               <w:rPr>
                 <w:sz w:val="22"/>
               </w:rPr>
-              <w:t>strategji me pragje nga statistikat e 45 sistemeve</w:t>
+              <w:t xml:space="preserve">strategji me pragje nga statistikat e 45 </w:t>
+            </w:r>
+            <w:r>
+              <w:rPr>
+                <w:sz w:val="22"/>
+              </w:rPr>
+              <w:t>sistemeve</w:t>
             </w:r>
           </w:p>
         </w:tc>
@@ -23773,13 +23767,7 @@
               <w:rPr>
                 <w:sz w:val="22"/>
               </w:rPr>
-              <w:t xml:space="preserve">nuk </w:t>
-            </w:r>
-            <w:r>
-              <w:rPr>
-                <w:sz w:val="22"/>
-              </w:rPr>
-              <w:t>konfirmohet</w:t>
+              <w:t>nuk konfirmohet</w:t>
             </w:r>
           </w:p>
         </w:tc>
@@ -23919,13 +23907,7 @@
               <w:rPr>
                 <w:sz w:val="22"/>
               </w:rPr>
-              <w:t>i njëjti brez, Fe</w:t>
-            </w:r>
-            <w:r>
-              <w:rPr>
-                <w:sz w:val="22"/>
-              </w:rPr>
-              <w:t>ature Envy më lart</w:t>
+              <w:t>i njëjti brez, Feature Envy më lart</w:t>
             </w:r>
           </w:p>
         </w:tc>
@@ -23978,7 +23960,13 @@
               <w:rPr>
                 <w:sz w:val="22"/>
               </w:rPr>
-              <w:t>MCC mes rishikuesve 0.02–0.24</w:t>
+              <w:t>MCC mes</w:t>
+            </w:r>
+            <w:r>
+              <w:rPr>
+                <w:sz w:val="22"/>
+              </w:rPr>
+              <w:t xml:space="preserve"> rishikuesve 0.02–0.24</w:t>
             </w:r>
           </w:p>
         </w:tc>
@@ -24118,7 +24106,13 @@
               <w:rPr>
                 <w:sz w:val="22"/>
               </w:rPr>
-              <w:t>era u hoq te 64.8% e rishkrimeve</w:t>
+              <w:t xml:space="preserve">era u hoq te 64.8% e </w:t>
+            </w:r>
+            <w:r>
+              <w:rPr>
+                <w:sz w:val="22"/>
+              </w:rPr>
+              <w:t>rishkrimeve</w:t>
             </w:r>
           </w:p>
         </w:tc>
@@ -24220,12 +24214,9 @@
       <w:pPr>
         <w:pStyle w:val="Heading2"/>
       </w:pPr>
-      <w:bookmarkStart w:id="44" w:name="_Toc242655086"/>
-      <w:r>
-        <w:t>6.4 Përgjigjet ndaj pyetje</w:t>
-      </w:r>
-      <w:r>
-        <w:t>ve kërkimore</w:t>
+      <w:bookmarkStart w:id="44" w:name="_Toc242658792"/>
+      <w:r>
+        <w:t>6.4 Përgjigjet ndaj pyetjeve kërkimore</w:t>
       </w:r>
       <w:bookmarkEnd w:id="44"/>
     </w:p>
@@ -24240,10 +24231,10 @@
         <w:t>PK1, saktësia e strategjive.</w:t>
       </w:r>
       <w:r>
-        <w:t xml:space="preserve"> Precizioni i tyre e kalon recall-in te çdo erë, dhe MCC-ja kundrejt rishikuesve shkon nga 0.232 deri në 0.580, më e larta te Long Method dhe më e ulëta te Blob. Ashpërsia që derivojnë nuk pajtohet me atë të rishiku</w:t>
-      </w:r>
-      <w:r>
-        <w:t>esve.</w:t>
+        <w:t xml:space="preserve"> Precizioni i tyre e kalon recall-in te çdo erë, dhe MCC-ja</w:t>
+      </w:r>
+      <w:r>
+        <w:t xml:space="preserve"> kundrejt rishikuesve shkon nga 0.232 deri në 0.580, më e larta te Long Method dhe më e ulëta te Blob. Ashpërsia që derivojnë nuk pajtohet me atë të rishikuesve.</w:t>
       </w:r>
     </w:p>
     <w:p>
@@ -24644,7 +24635,7 @@
       <w:pPr>
         <w:pStyle w:val="Heading2"/>
       </w:pPr>
-      <w:bookmarkStart w:id="45" w:name="_Toc242655087"/>
+      <w:bookmarkStart w:id="45" w:name="_Toc242658793"/>
       <w:r>
         <w:t>6.5 Implikimet teorike dhe praktike</w:t>
       </w:r>
@@ -24709,7 +24700,7 @@
       <w:pPr>
         <w:pStyle w:val="Heading2"/>
       </w:pPr>
-      <w:bookmarkStart w:id="46" w:name="_Toc242655088"/>
+      <w:bookmarkStart w:id="46" w:name="_Toc242658794"/>
       <w:r>
         <w:t>6.6 Kufizimet</w:t>
       </w:r>
@@ -24784,7 +24775,7 @@
       <w:pPr>
         <w:pStyle w:val="Heading2"/>
       </w:pPr>
-      <w:bookmarkStart w:id="47" w:name="_Toc242655089"/>
+      <w:bookmarkStart w:id="47" w:name="_Toc242658795"/>
       <w:r>
         <w:t>6.7 Puna e ardhshme</w:t>
       </w:r>
@@ -24862,7 +24853,7 @@
       <w:pPr>
         <w:pStyle w:val="Heading2"/>
       </w:pPr>
-      <w:bookmarkStart w:id="48" w:name="_Toc242655090"/>
+      <w:bookmarkStart w:id="48" w:name="_Toc242658796"/>
       <w:r>
         <w:lastRenderedPageBreak/>
         <w:t>6.8 Përfundim</w:t>
@@ -24924,7 +24915,7 @@
         <w:pStyle w:val="Heading1"/>
         <w:pageBreakBefore/>
       </w:pPr>
-      <w:bookmarkStart w:id="49" w:name="_Toc242655091"/>
+      <w:bookmarkStart w:id="49" w:name="_Toc242658797"/>
       <w:r>
         <w:lastRenderedPageBreak/>
         <w:t>7 Referencat</w:t>
@@ -25363,7 +25354,7 @@
         <w:t>Palomba, F., Bavota, G., Di Penta, M., Fa</w:t>
       </w:r>
       <w:r>
-        <w:t>sano, F., Oliveto, R. &amp; De Lucia, A. 2018. “On the diffuseness and the impact on maintainability of code smells: a large scale empirical investigation.” Empirical Software Engineering, 23, pp. 1188-1221.</w:t>
+        <w:t>sano, F., Oliveto, R. &amp; De Lucia, A. 2018. “On the diffuseness and the impact on maintainability of code smells: a large scale empirical investigation.” Empirical Software Engineering, 23(3), pp. 1188-1221.</w:t>
       </w:r>
     </w:p>
     <w:p>
@@ -25375,10 +25366,10 @@
       </w:r>
       <w:r>
         <w:tab/>
-        <w:t>Palomba, F., Bavota, G., Di Penta, M., Oliveto,</w:t>
-      </w:r>
-      <w:r>
-        <w:t xml:space="preserve"> R., Poshyvanyk, D. &amp; De Lucia, A. 2015. “Mining Version Histories for Detecting Code Smells.” IEEE Transactions on Software Engineering, 41(5), pp. 462-489.</w:t>
+        <w:t>Palomba, F., Bavota, G., Di Penta, M., Olive</w:t>
+      </w:r>
+      <w:r>
+        <w:t>to, R., Poshyvanyk, D. &amp; De Lucia, A. 2015. “Mining Version Histories for Detecting Code Smells.” IEEE Transactions on Software Engineering, 41(5), pp. 462-489.</w:t>
       </w:r>
     </w:p>
     <w:p>
@@ -25390,10 +25381,10 @@
       </w:r>
       <w:r>
         <w:tab/>
-        <w:t>Park, R. E. 1992. Software Size Measurement: A Framework for Counting Source Statements. Tech</w:t>
-      </w:r>
-      <w:r>
-        <w:t>nical Report CMU/SEI-92-TR-020. Pittsburgh: Software Engineering Institute, Carnegie Mellon University.</w:t>
+        <w:t>Park, R. E. 1992. Software Size Measurement: A Framework for Counting Source Statements. T</w:t>
+      </w:r>
+      <w:r>
+        <w:t>echnical Report CMU/SEI-92-TR-020. Pittsburgh: Software Engineering Institute, Carnegie Mellon University.</w:t>
       </w:r>
     </w:p>
     <w:p>
@@ -25405,10 +25396,10 @@
       </w:r>
       <w:r>
         <w:tab/>
-        <w:t>Pedregosa, F., Varoquaux, G., Gramfort, A., Michel, V., Thirion, B., Grisel, O., et al. 2011. “Scikit-learn: Machine Learning in Python.” Journal o</w:t>
-      </w:r>
-      <w:r>
-        <w:t>f Machine Learning Research, 12, pp. 2825-2830.</w:t>
+        <w:t>Pedregosa, F., Varoquaux, G., Gramfort, A., Michel, V., Thirion, B., Grisel, O., et al. 2011. “Scikit-learn: Machine Learning in Python.” Journa</w:t>
+      </w:r>
+      <w:r>
+        <w:t>l of Machine Learning Research, 12, pp. 2825-2830.</w:t>
       </w:r>
     </w:p>
     <w:p>
@@ -25558,7 +25549,7 @@
         <w:pStyle w:val="Heading1"/>
         <w:pageBreakBefore/>
       </w:pPr>
-      <w:bookmarkStart w:id="50" w:name="_Toc242655092"/>
+      <w:bookmarkStart w:id="50" w:name="_Toc242658798"/>
       <w:r>
         <w:lastRenderedPageBreak/>
         <w:t>8 Shtojcat</w:t>
@@ -25569,7 +25560,7 @@
       <w:pPr>
         <w:pStyle w:val="Heading2"/>
       </w:pPr>
-      <w:bookmarkStart w:id="51" w:name="_Toc242655093"/>
+      <w:bookmarkStart w:id="51" w:name="_Toc242658799"/>
       <w:r>
         <w:t>8.1 Strategjitë e detektimit</w:t>
       </w:r>
@@ -26269,7 +26260,7 @@
       <w:pPr>
         <w:pStyle w:val="Heading2"/>
       </w:pPr>
-      <w:bookmarkStart w:id="52" w:name="_Toc242655094"/>
+      <w:bookmarkStart w:id="52" w:name="_Toc242658800"/>
       <w:r>
         <w:lastRenderedPageBreak/>
         <w:t xml:space="preserve">8.2 </w:t>
@@ -27589,7 +27580,7 @@
       <w:pPr>
         <w:pStyle w:val="Heading2"/>
       </w:pPr>
-      <w:bookmarkStart w:id="53" w:name="_Toc242655095"/>
+      <w:bookmarkStart w:id="53" w:name="_Toc242658801"/>
       <w:r>
         <w:t>8.3 Metrikat e matura</w:t>
       </w:r>
@@ -27755,7 +27746,7 @@
       <w:pPr>
         <w:pStyle w:val="Heading2"/>
       </w:pPr>
-      <w:bookmarkStart w:id="54" w:name="_Toc242655096"/>
+      <w:bookmarkStart w:id="54" w:name="_Toc242658802"/>
       <w:r>
         <w:t>8.4 Refaktorimet dhe arsyet e refuzimit</w:t>
       </w:r>
@@ -28732,7 +28723,7 @@
       <w:pPr>
         <w:pStyle w:val="Heading2"/>
       </w:pPr>
-      <w:bookmarkStart w:id="55" w:name="_Toc242655097"/>
+      <w:bookmarkStart w:id="55" w:name="_Toc242658803"/>
       <w:r>
         <w:t>8.5 Riprodhimi i rezultateve</w:t>
       </w:r>
@@ -31218,7 +31209,7 @@
       <w:pPr>
         <w:pStyle w:val="Heading2"/>
       </w:pPr>
-      <w:bookmarkStart w:id="56" w:name="_Toc242655098"/>
+      <w:bookmarkStart w:id="56" w:name="_Toc242658804"/>
       <w:r>
         <w:t>8.6 Pse nuk ndezin strategjitë</w:t>
       </w:r>
@@ -32036,7 +32027,7 @@
       <w:pPr>
         <w:pStyle w:val="Heading2"/>
       </w:pPr>
-      <w:bookmarkStart w:id="57" w:name="_Toc242655099"/>
+      <w:bookmarkStart w:id="57" w:name="_Toc242658805"/>
       <w:r>
         <w:lastRenderedPageBreak/>
         <w:t>8.7 Ashpërsia e derivuar kundrejt gjykimit të rishikuesve</w:t>
@@ -32641,7 +32632,7 @@
         </w:rPr>
         <w:lastRenderedPageBreak/>
         <w:drawing>
-          <wp:inline distT="0" distB="0" distL="0" distR="0" wp14:anchorId="66541D40" wp14:editId="43F31FEE">
+          <wp:inline distT="0" distB="0" distL="0" distR="0" wp14:anchorId="76B7E86A" wp14:editId="085C1356">
             <wp:extent cx="5120640" cy="2809061"/>
             <wp:effectExtent l="0" t="0" r="0" b="0"/>
             <wp:docPr id="14" name="Picture 14"/>
@@ -32710,7 +32701,7 @@
       <w:pPr>
         <w:pStyle w:val="Heading2"/>
       </w:pPr>
-      <w:bookmarkStart w:id="58" w:name="_Toc242655100"/>
+      <w:bookmarkStart w:id="58" w:name="_Toc242658806"/>
       <w:r>
         <w:t>8.8 Çfarë mbetet pa u kapur te Blob-i</w:t>
       </w:r>
@@ -46703,7 +46694,7 @@
     <w:autoRedefine/>
     <w:uiPriority w:val="39"/>
     <w:unhideWhenUsed/>
-    <w:rsid w:val="004E03FD"/>
+    <w:rsid w:val="009B7D55"/>
     <w:pPr>
       <w:spacing w:after="100"/>
     </w:pPr>
@@ -46715,7 +46706,7 @@
     <w:autoRedefine/>
     <w:uiPriority w:val="39"/>
     <w:unhideWhenUsed/>
-    <w:rsid w:val="004E03FD"/>
+    <w:rsid w:val="009B7D55"/>
     <w:pPr>
       <w:spacing w:after="100"/>
       <w:ind w:left="240"/>
@@ -46726,7 +46717,7 @@
     <w:basedOn w:val="DefaultParagraphFont"/>
     <w:uiPriority w:val="99"/>
     <w:unhideWhenUsed/>
-    <w:rsid w:val="004E03FD"/>
+    <w:rsid w:val="009B7D55"/>
     <w:rPr>
       <w:color w:val="0000FF" w:themeColor="hyperlink"/>
       <w:u w:val="single"/>

</xml_diff>